<commit_message>
Dashboard interaction layer, run-scoped orchestration, and UI blueprint alignment (Day 9–10)
</commit_message>
<xml_diff>
--- a/docs/01_Daily_Log.docx
+++ b/docs/01_Daily_Log.docx
@@ -3727,7 +3727,7 @@
     <w:p>
       <w:pPr>
         <w:pStyle w:val="Heading3"/>
-        <w:spacing w:before="0" w:beforeAutospacing="0"/>
+        <w:spacing w:before="0" w:beforeAutospacing="0" w:after="0" w:afterAutospacing="0"/>
         <w:rPr>
           <w:sz w:val="24"/>
           <w:szCs w:val="24"/>
@@ -3739,6 +3739,366 @@
           <w:szCs w:val="24"/>
         </w:rPr>
         <w:t>Activities Performed</w:t>
+      </w:r>
+    </w:p>
+    <w:p>
+      <w:pPr>
+        <w:pStyle w:val="NormalWeb"/>
+        <w:numPr>
+          <w:ilvl w:val="0"/>
+          <w:numId w:val="36"/>
+        </w:numPr>
+        <w:spacing w:before="0" w:beforeAutospacing="0" w:after="0" w:afterAutospacing="0"/>
+      </w:pPr>
+      <w:r>
+        <w:t>Reviewed the complete system architecture to derive strict frontend responsibilities without violating backend boundaries or data confidentiality constraints.</w:t>
+      </w:r>
+    </w:p>
+    <w:p>
+      <w:pPr>
+        <w:pStyle w:val="NormalWeb"/>
+        <w:numPr>
+          <w:ilvl w:val="0"/>
+          <w:numId w:val="36"/>
+        </w:numPr>
+        <w:spacing w:before="0" w:beforeAutospacing="0" w:after="0" w:afterAutospacing="0"/>
+      </w:pPr>
+      <w:r>
+        <w:t>Designed a run-scoped frontend interaction model aligned with ingestion versioning to ensure deterministic insights and dashboards.</w:t>
+      </w:r>
+    </w:p>
+    <w:p>
+      <w:pPr>
+        <w:pStyle w:val="NormalWeb"/>
+        <w:numPr>
+          <w:ilvl w:val="0"/>
+          <w:numId w:val="36"/>
+        </w:numPr>
+        <w:spacing w:before="0" w:beforeAutospacing="0" w:after="0" w:afterAutospacing="0"/>
+      </w:pPr>
+      <w:r>
+        <w:t>Finalized all primary, contextual, and advanced frontend screens with clear visibility rules and navigation hierarchy.</w:t>
+      </w:r>
+    </w:p>
+    <w:p>
+      <w:pPr>
+        <w:pStyle w:val="NormalWeb"/>
+        <w:numPr>
+          <w:ilvl w:val="0"/>
+          <w:numId w:val="36"/>
+        </w:numPr>
+        <w:spacing w:before="0" w:beforeAutospacing="0" w:after="0" w:afterAutospacing="0"/>
+      </w:pPr>
+      <w:r>
+        <w:t>Defined detailed screen-level data contracts specifying what data each page consumes and which user actions are permitted.</w:t>
+      </w:r>
+    </w:p>
+    <w:p>
+      <w:pPr>
+        <w:pStyle w:val="NormalWeb"/>
+        <w:numPr>
+          <w:ilvl w:val="0"/>
+          <w:numId w:val="36"/>
+        </w:numPr>
+        <w:spacing w:before="0" w:beforeAutospacing="0" w:after="0" w:afterAutospacing="0"/>
+      </w:pPr>
+      <w:r>
+        <w:t>Designed an export-first user experience enabling engineers to generate Excel and PDF reports from precomputed insights and dashboards.</w:t>
+      </w:r>
+    </w:p>
+    <w:p>
+      <w:pPr>
+        <w:pStyle w:val="NormalWeb"/>
+        <w:numPr>
+          <w:ilvl w:val="0"/>
+          <w:numId w:val="36"/>
+        </w:numPr>
+        <w:spacing w:before="0" w:beforeAutospacing="0" w:after="0" w:afterAutospacing="0"/>
+      </w:pPr>
+      <w:r>
+        <w:t>Established comprehensive UI behavior rules covering loading states, empty data handling, error conditions, and offline operation guarantees.</w:t>
+      </w:r>
+    </w:p>
+    <w:p>
+      <w:pPr>
+        <w:pStyle w:val="NormalWeb"/>
+        <w:numPr>
+          <w:ilvl w:val="0"/>
+          <w:numId w:val="36"/>
+        </w:numPr>
+        <w:spacing w:before="0" w:beforeAutospacing="0" w:after="0" w:afterAutospacing="0"/>
+      </w:pPr>
+      <w:r>
+        <w:t>Prepared a production-ready Electron + React frontend structure fully aligned with backend orchestration and storage layers.</w:t>
+      </w:r>
+    </w:p>
+    <w:p>
+      <w:pPr>
+        <w:pStyle w:val="NormalWeb"/>
+        <w:numPr>
+          <w:ilvl w:val="0"/>
+          <w:numId w:val="36"/>
+        </w:numPr>
+        <w:spacing w:before="0" w:beforeAutospacing="0" w:after="0" w:afterAutospacing="0"/>
+      </w:pPr>
+      <w:r>
+        <w:t xml:space="preserve">Debugged and stabilized the </w:t>
+      </w:r>
+      <w:r>
+        <w:rPr>
+          <w:rStyle w:val="Strong"/>
+        </w:rPr>
+        <w:t>data ingestion layer</w:t>
+      </w:r>
+      <w:r>
+        <w:t>, resolving issues in readers, validators, and source-specific ingestors to ensure deterministic and error-resilient ingestion behavior.</w:t>
+      </w:r>
+    </w:p>
+    <w:p>
+      <w:pPr>
+        <w:pStyle w:val="NormalWeb"/>
+        <w:numPr>
+          <w:ilvl w:val="0"/>
+          <w:numId w:val="36"/>
+        </w:numPr>
+        <w:spacing w:before="0" w:beforeAutospacing="0" w:after="0" w:afterAutospacing="0"/>
+      </w:pPr>
+      <w:r>
+        <w:t>Fixed parsing, validation, and integration issues across Excel, JSON, SAP, RFID, PLC, and operational Excel ingestion pipelines without breaking versioning or audit guarantees.</w:t>
+      </w:r>
+    </w:p>
+    <w:p>
+      <w:pPr>
+        <w:pStyle w:val="Heading3"/>
+        <w:rPr>
+          <w:sz w:val="24"/>
+          <w:szCs w:val="24"/>
+        </w:rPr>
+      </w:pPr>
+      <w:r>
+        <w:rPr>
+          <w:sz w:val="24"/>
+          <w:szCs w:val="24"/>
+        </w:rPr>
+        <w:t>Outcom</w:t>
+      </w:r>
+      <w:r>
+        <w:rPr>
+          <w:sz w:val="24"/>
+          <w:szCs w:val="24"/>
+        </w:rPr>
+        <w:t>e of the Day</w:t>
+      </w:r>
+    </w:p>
+    <w:p>
+      <w:pPr>
+        <w:pStyle w:val="Heading3"/>
+        <w:rPr>
+          <w:b w:val="0"/>
+          <w:sz w:val="24"/>
+          <w:szCs w:val="24"/>
+        </w:rPr>
+      </w:pPr>
+      <w:r>
+        <w:rPr>
+          <w:b w:val="0"/>
+          <w:sz w:val="24"/>
+          <w:szCs w:val="24"/>
+        </w:rPr>
+        <w:t xml:space="preserve">A </w:t>
+      </w:r>
+      <w:r>
+        <w:rPr>
+          <w:rStyle w:val="Strong"/>
+          <w:b/>
+          <w:sz w:val="24"/>
+          <w:szCs w:val="24"/>
+        </w:rPr>
+        <w:t>fully finalized frontend architecture</w:t>
+      </w:r>
+      <w:r>
+        <w:rPr>
+          <w:b w:val="0"/>
+          <w:sz w:val="24"/>
+          <w:szCs w:val="24"/>
+        </w:rPr>
+        <w:t xml:space="preserve"> and a </w:t>
+      </w:r>
+      <w:r>
+        <w:rPr>
+          <w:rStyle w:val="Strong"/>
+          <w:b/>
+          <w:sz w:val="24"/>
+          <w:szCs w:val="24"/>
+        </w:rPr>
+        <w:t>stabilized ingestion layer</w:t>
+      </w:r>
+      <w:r>
+        <w:rPr>
+          <w:b w:val="0"/>
+          <w:sz w:val="24"/>
+          <w:szCs w:val="24"/>
+        </w:rPr>
+        <w:t xml:space="preserve"> are now in </w:t>
+      </w:r>
+      <w:r>
+        <w:rPr>
+          <w:b w:val="0"/>
+          <w:sz w:val="24"/>
+          <w:szCs w:val="24"/>
+        </w:rPr>
+        <w:t>place. The</w:t>
+      </w:r>
+      <w:r>
+        <w:rPr>
+          <w:b w:val="0"/>
+          <w:sz w:val="24"/>
+          <w:szCs w:val="24"/>
+        </w:rPr>
+        <w:t xml:space="preserve"> system is frontend-implementation ready and ingestion-stable, with clean separation of concerns, deterministic behavior, and strong foundations for testing using real production datasets.</w:t>
+      </w:r>
+    </w:p>
+    <w:p>
+      <w:pPr>
+        <w:pStyle w:val="Heading3"/>
+        <w:rPr>
+          <w:sz w:val="24"/>
+          <w:szCs w:val="24"/>
+        </w:rPr>
+      </w:pPr>
+      <w:r>
+        <w:rPr>
+          <w:sz w:val="24"/>
+          <w:szCs w:val="24"/>
+        </w:rPr>
+        <w:t>Key Learnings</w:t>
+      </w:r>
+    </w:p>
+    <w:p>
+      <w:pPr>
+        <w:pStyle w:val="NormalWeb"/>
+        <w:numPr>
+          <w:ilvl w:val="0"/>
+          <w:numId w:val="24"/>
+        </w:numPr>
+      </w:pPr>
+      <w:r>
+        <w:t>Run-scoped analytics is essential for auditability and trust.</w:t>
+      </w:r>
+    </w:p>
+    <w:p>
+      <w:pPr>
+        <w:pStyle w:val="NormalWeb"/>
+        <w:numPr>
+          <w:ilvl w:val="0"/>
+          <w:numId w:val="24"/>
+        </w:numPr>
+      </w:pPr>
+      <w:r>
+        <w:t>Export workflows significantly increase practical system value.</w:t>
+      </w:r>
+    </w:p>
+    <w:p>
+      <w:pPr>
+        <w:pStyle w:val="NormalWeb"/>
+        <w:numPr>
+          <w:ilvl w:val="0"/>
+          <w:numId w:val="24"/>
+        </w:numPr>
+      </w:pPr>
+      <w:r>
+        <w:t>Strict UI responsibility boundaries prevent long-term technical debt.</w:t>
+      </w:r>
+    </w:p>
+    <w:p>
+      <w:pPr>
+        <w:spacing w:after="0" w:line="240" w:lineRule="auto"/>
+        <w:rPr>
+          <w:rFonts w:ascii="Times New Roman" w:eastAsia="Times New Roman" w:hAnsi="Times New Roman" w:cs="Times New Roman"/>
+          <w:b/>
+          <w:sz w:val="24"/>
+          <w:szCs w:val="24"/>
+        </w:rPr>
+      </w:pPr>
+    </w:p>
+    <w:p>
+      <w:pPr>
+        <w:spacing w:after="0" w:line="240" w:lineRule="auto"/>
+        <w:rPr>
+          <w:rFonts w:ascii="Times New Roman" w:eastAsia="Times New Roman" w:hAnsi="Times New Roman" w:cs="Times New Roman"/>
+          <w:b/>
+          <w:sz w:val="24"/>
+          <w:szCs w:val="24"/>
+        </w:rPr>
+      </w:pPr>
+      <w:r>
+        <w:rPr>
+          <w:rFonts w:ascii="Times New Roman" w:eastAsia="Times New Roman" w:hAnsi="Times New Roman" w:cs="Times New Roman"/>
+          <w:b/>
+          <w:sz w:val="24"/>
+          <w:szCs w:val="24"/>
+        </w:rPr>
+        <w:lastRenderedPageBreak/>
+        <w:t>Date: 14/01/2016                                                                                                                Day 7</w:t>
+      </w:r>
+    </w:p>
+    <w:p>
+      <w:pPr>
+        <w:spacing w:after="0" w:line="240" w:lineRule="auto"/>
+        <w:outlineLvl w:val="2"/>
+        <w:rPr>
+          <w:rFonts w:ascii="Times New Roman" w:eastAsia="Times New Roman" w:hAnsi="Times New Roman" w:cs="Times New Roman"/>
+          <w:b/>
+          <w:bCs/>
+          <w:sz w:val="24"/>
+          <w:szCs w:val="24"/>
+        </w:rPr>
+      </w:pPr>
+      <w:r>
+        <w:rPr>
+          <w:rFonts w:ascii="Times New Roman" w:eastAsia="Times New Roman" w:hAnsi="Times New Roman" w:cs="Times New Roman"/>
+          <w:b/>
+          <w:bCs/>
+          <w:sz w:val="24"/>
+          <w:szCs w:val="24"/>
+        </w:rPr>
+        <w:t>Department: Maintenance</w:t>
+      </w:r>
+    </w:p>
+    <w:p>
+      <w:pPr>
+        <w:spacing w:after="0" w:line="240" w:lineRule="auto"/>
+        <w:rPr>
+          <w:rFonts w:ascii="Times New Roman" w:eastAsia="Times New Roman" w:hAnsi="Times New Roman" w:cs="Times New Roman"/>
+          <w:b/>
+          <w:bCs/>
+          <w:sz w:val="24"/>
+          <w:szCs w:val="24"/>
+        </w:rPr>
+      </w:pPr>
+      <w:r>
+        <w:rPr>
+          <w:rFonts w:ascii="Times New Roman" w:eastAsia="Times New Roman" w:hAnsi="Times New Roman" w:cs="Times New Roman"/>
+          <w:b/>
+          <w:bCs/>
+          <w:sz w:val="24"/>
+          <w:szCs w:val="24"/>
+        </w:rPr>
+        <w:t>Plant: Drive Shaft Manufacturing</w:t>
+      </w:r>
+    </w:p>
+    <w:p>
+      <w:pPr>
+        <w:pStyle w:val="Heading2"/>
+        <w:jc w:val="center"/>
+      </w:pPr>
+      <w:r>
+        <w:rPr>
+          <w:rStyle w:val="Strong"/>
+          <w:b/>
+          <w:bCs/>
+        </w:rPr>
+        <w:t>Frontend Desktop Shell &amp; Renderer Foundation</w:t>
       </w:r>
     </w:p>
     <w:p>
@@ -3747,274 +4107,105 @@
         <w:spacing w:before="0" w:beforeAutospacing="0" w:after="0" w:afterAutospacing="0"/>
       </w:pPr>
       <w:r>
-        <w:t> Reviewed the complete system architecture to derive strict frontend responsibilities without violating backend boundaries or data confidentiality constraints.</w:t>
+        <w:rPr>
+          <w:rStyle w:val="Strong"/>
+        </w:rPr>
+        <w:t xml:space="preserve"> Focus:</w:t>
+      </w:r>
+      <w:r>
+        <w:t xml:space="preserve"> Frontend desktop integration, renderer stabilization, UI shell finalization</w:t>
+      </w:r>
+    </w:p>
+    <w:p>
+      <w:pPr>
+        <w:pStyle w:val="Heading3"/>
+        <w:spacing w:before="0" w:beforeAutospacing="0" w:after="0" w:afterAutospacing="0"/>
+      </w:pPr>
+      <w:r>
+        <w:rPr>
+          <w:rStyle w:val="Strong"/>
+          <w:b/>
+          <w:bCs/>
+        </w:rPr>
+        <w:t>Activities Performed</w:t>
       </w:r>
     </w:p>
     <w:p>
       <w:pPr>
         <w:pStyle w:val="NormalWeb"/>
+        <w:numPr>
+          <w:ilvl w:val="0"/>
+          <w:numId w:val="25"/>
+        </w:numPr>
         <w:spacing w:before="0" w:beforeAutospacing="0" w:after="0" w:afterAutospacing="0"/>
       </w:pPr>
       <w:r>
-        <w:t> Designed a run-scoped frontend interaction model aligned with ingestion versioning to ensure deterministic insights and dashboards.</w:t>
+        <w:t>Finalized Electron + Qt-based desktop shell ensuring fully offline execution with no localhost or network dependency.</w:t>
       </w:r>
     </w:p>
     <w:p>
       <w:pPr>
         <w:pStyle w:val="NormalWeb"/>
+        <w:numPr>
+          <w:ilvl w:val="0"/>
+          <w:numId w:val="25"/>
+        </w:numPr>
         <w:spacing w:before="0" w:beforeAutospacing="0" w:after="0" w:afterAutospacing="0"/>
       </w:pPr>
       <w:r>
-        <w:t> Finalized all primary, contextual, and advanced frontend screens with clear visibility rules and navigation hierarchy.</w:t>
+        <w:t>Stabilized renderer environment using Vite + React + TypeScript and resolved all module resolution and aliasing issues.</w:t>
       </w:r>
     </w:p>
     <w:p>
       <w:pPr>
         <w:pStyle w:val="NormalWeb"/>
+        <w:numPr>
+          <w:ilvl w:val="0"/>
+          <w:numId w:val="25"/>
+        </w:numPr>
         <w:spacing w:before="0" w:beforeAutospacing="0" w:after="0" w:afterAutospacing="0"/>
       </w:pPr>
       <w:r>
-        <w:t> Defined detailed screen-level data contracts specifying what data each page consumes and which user actions are permitted.</w:t>
+        <w:t>Implemented application-wide routing, layout composition, and sidebar navigation hierarchy.</w:t>
       </w:r>
     </w:p>
     <w:p>
       <w:pPr>
         <w:pStyle w:val="NormalWeb"/>
+        <w:numPr>
+          <w:ilvl w:val="0"/>
+          <w:numId w:val="25"/>
+        </w:numPr>
         <w:spacing w:before="0" w:beforeAutospacing="0" w:after="0" w:afterAutospacing="0"/>
       </w:pPr>
       <w:r>
-        <w:t> Designed an export-first user experience enabling engineers to generate Excel and PDF reports from precomputed insights and dashboards.</w:t>
+        <w:t>Integrated official company branding with proper logo placement, sizing, and visual hierarchy.</w:t>
       </w:r>
     </w:p>
     <w:p>
       <w:pPr>
         <w:pStyle w:val="NormalWeb"/>
+        <w:numPr>
+          <w:ilvl w:val="0"/>
+          <w:numId w:val="25"/>
+        </w:numPr>
         <w:spacing w:before="0" w:beforeAutospacing="0" w:after="0" w:afterAutospacing="0"/>
       </w:pPr>
       <w:r>
-        <w:t> Established comprehensive UI behavior rules covering loading states, empty data handling, error conditions, and offline operation guarantees.</w:t>
+        <w:t>Defined primary vs secondary (advanced) navigation structure aligned with maintenance-user workflows.</w:t>
       </w:r>
     </w:p>
     <w:p>
       <w:pPr>
         <w:pStyle w:val="NormalWeb"/>
+        <w:numPr>
+          <w:ilvl w:val="0"/>
+          <w:numId w:val="25"/>
+        </w:numPr>
         <w:spacing w:before="0" w:beforeAutospacing="0" w:after="0" w:afterAutospacing="0"/>
       </w:pPr>
       <w:r>
-        <w:t> Prepared a production-ready Electron + React frontend structure fully aligned with backend orchestration and storage layers.</w:t>
-      </w:r>
-    </w:p>
-    <w:p>
-      <w:pPr>
-        <w:pStyle w:val="NormalWeb"/>
-        <w:spacing w:before="0" w:beforeAutospacing="0" w:after="0" w:afterAutospacing="0"/>
-      </w:pPr>
-      <w:r>
-        <w:t xml:space="preserve"> Debugged and stabilized the </w:t>
-      </w:r>
-      <w:r>
-        <w:rPr>
-          <w:rStyle w:val="Strong"/>
-        </w:rPr>
-        <w:t>data ingestion layer</w:t>
-      </w:r>
-      <w:r>
-        <w:t>, resolving issues in readers, validators, and source-specific ingestors to ensure deterministic and error-resilient ingestion behavior.</w:t>
-      </w:r>
-    </w:p>
-    <w:p>
-      <w:pPr>
-        <w:pStyle w:val="NormalWeb"/>
-        <w:spacing w:before="0" w:beforeAutospacing="0" w:after="0" w:afterAutospacing="0"/>
-      </w:pPr>
-      <w:r>
-        <w:t> Fixed parsing, validation, and integration issues across Excel, JSON, SAP, RFID, PLC, and operational Excel ingestion pipelines without breaking versioning or audit guarantees.</w:t>
-      </w:r>
-    </w:p>
-    <w:p>
-      <w:pPr>
-        <w:pStyle w:val="Heading3"/>
-        <w:rPr>
-          <w:sz w:val="24"/>
-          <w:szCs w:val="24"/>
-        </w:rPr>
-      </w:pPr>
-      <w:r>
-        <w:rPr>
-          <w:sz w:val="24"/>
-          <w:szCs w:val="24"/>
-        </w:rPr>
-        <w:t>Outcom</w:t>
-      </w:r>
-      <w:r>
-        <w:rPr>
-          <w:sz w:val="24"/>
-          <w:szCs w:val="24"/>
-        </w:rPr>
-        <w:t>e of the Day</w:t>
-      </w:r>
-    </w:p>
-    <w:p>
-      <w:pPr>
-        <w:pStyle w:val="Heading3"/>
-        <w:rPr>
-          <w:b w:val="0"/>
-          <w:sz w:val="24"/>
-          <w:szCs w:val="24"/>
-        </w:rPr>
-      </w:pPr>
-      <w:r>
-        <w:rPr>
-          <w:b w:val="0"/>
-          <w:sz w:val="24"/>
-          <w:szCs w:val="24"/>
-        </w:rPr>
-        <w:t xml:space="preserve">A </w:t>
-      </w:r>
-      <w:r>
-        <w:rPr>
-          <w:rStyle w:val="Strong"/>
-          <w:b/>
-          <w:sz w:val="24"/>
-          <w:szCs w:val="24"/>
-        </w:rPr>
-        <w:t>fully finalized frontend architecture</w:t>
-      </w:r>
-      <w:r>
-        <w:rPr>
-          <w:b w:val="0"/>
-          <w:sz w:val="24"/>
-          <w:szCs w:val="24"/>
-        </w:rPr>
-        <w:t xml:space="preserve"> and a </w:t>
-      </w:r>
-      <w:r>
-        <w:rPr>
-          <w:rStyle w:val="Strong"/>
-          <w:b/>
-          <w:sz w:val="24"/>
-          <w:szCs w:val="24"/>
-        </w:rPr>
-        <w:t>stabilized ingestion layer</w:t>
-      </w:r>
-      <w:r>
-        <w:rPr>
-          <w:b w:val="0"/>
-          <w:sz w:val="24"/>
-          <w:szCs w:val="24"/>
-        </w:rPr>
-        <w:t xml:space="preserve"> are now in </w:t>
-      </w:r>
-      <w:r>
-        <w:rPr>
-          <w:b w:val="0"/>
-          <w:sz w:val="24"/>
-          <w:szCs w:val="24"/>
-        </w:rPr>
-        <w:t>place. The</w:t>
-      </w:r>
-      <w:r>
-        <w:rPr>
-          <w:b w:val="0"/>
-          <w:sz w:val="24"/>
-          <w:szCs w:val="24"/>
-        </w:rPr>
-        <w:t xml:space="preserve"> system is frontend-implementation ready and ingestion-stable, with clean separation of concerns, deterministic behavior, and strong foundations for testing using real production datasets.</w:t>
-      </w:r>
-    </w:p>
-    <w:p>
-      <w:pPr>
-        <w:pStyle w:val="Heading3"/>
-        <w:rPr>
-          <w:sz w:val="24"/>
-          <w:szCs w:val="24"/>
-        </w:rPr>
-      </w:pPr>
-      <w:r>
-        <w:rPr>
-          <w:sz w:val="24"/>
-          <w:szCs w:val="24"/>
-        </w:rPr>
-        <w:t>Key Learnings</w:t>
-      </w:r>
-    </w:p>
-    <w:p>
-      <w:pPr>
-        <w:pStyle w:val="NormalWeb"/>
-        <w:numPr>
-          <w:ilvl w:val="0"/>
-          <w:numId w:val="24"/>
-        </w:numPr>
-      </w:pPr>
-      <w:r>
-        <w:t>Run-scoped analytics is essential for auditability and trust.</w:t>
-      </w:r>
-    </w:p>
-    <w:p>
-      <w:pPr>
-        <w:pStyle w:val="NormalWeb"/>
-        <w:numPr>
-          <w:ilvl w:val="0"/>
-          <w:numId w:val="24"/>
-        </w:numPr>
-      </w:pPr>
-      <w:r>
-        <w:t>Export workflows significantly increase practical system value.</w:t>
-      </w:r>
-    </w:p>
-    <w:p>
-      <w:pPr>
-        <w:pStyle w:val="NormalWeb"/>
-        <w:numPr>
-          <w:ilvl w:val="0"/>
-          <w:numId w:val="24"/>
-        </w:numPr>
-      </w:pPr>
-      <w:r>
-        <w:t>Strict UI responsibility boundaries prevent long-term technical debt.</w:t>
-      </w:r>
-    </w:p>
-    <w:p>
-      <w:pPr>
-        <w:spacing w:after="0" w:line="240" w:lineRule="auto"/>
-        <w:rPr>
-          <w:rFonts w:ascii="Times New Roman" w:eastAsia="Times New Roman" w:hAnsi="Times New Roman" w:cs="Times New Roman"/>
-          <w:b/>
-          <w:sz w:val="24"/>
-          <w:szCs w:val="24"/>
-        </w:rPr>
-      </w:pPr>
-    </w:p>
-    <w:p>
-      <w:pPr>
-        <w:spacing w:after="0" w:line="240" w:lineRule="auto"/>
-        <w:rPr>
-          <w:rFonts w:ascii="Times New Roman" w:eastAsia="Times New Roman" w:hAnsi="Times New Roman" w:cs="Times New Roman"/>
-          <w:b/>
-          <w:sz w:val="24"/>
-          <w:szCs w:val="24"/>
-        </w:rPr>
-      </w:pPr>
-    </w:p>
-    <w:p>
-      <w:pPr>
-        <w:spacing w:after="0" w:line="240" w:lineRule="auto"/>
-        <w:rPr>
-          <w:rFonts w:ascii="Times New Roman" w:eastAsia="Times New Roman" w:hAnsi="Times New Roman" w:cs="Times New Roman"/>
-          <w:b/>
-          <w:sz w:val="24"/>
-          <w:szCs w:val="24"/>
-        </w:rPr>
-      </w:pPr>
-      <w:r>
-        <w:rPr>
-          <w:rFonts w:ascii="Times New Roman" w:eastAsia="Times New Roman" w:hAnsi="Times New Roman" w:cs="Times New Roman"/>
-          <w:b/>
-          <w:sz w:val="24"/>
-          <w:szCs w:val="24"/>
-        </w:rPr>
-        <w:lastRenderedPageBreak/>
-        <w:t>Date: 14/01/2016                                                                                                                Day 7</w:t>
+        <w:t>Ensured renderer state coordination logic supports deterministic run-based UI behavior.</w:t>
       </w:r>
     </w:p>
     <w:p>
@@ -4025,70 +4216,165 @@
           <w:rFonts w:ascii="Times New Roman" w:eastAsia="Times New Roman" w:hAnsi="Times New Roman" w:cs="Times New Roman"/>
           <w:b/>
           <w:bCs/>
-          <w:sz w:val="24"/>
-          <w:szCs w:val="24"/>
-        </w:rPr>
-      </w:pPr>
-      <w:r>
-        <w:rPr>
-          <w:rFonts w:ascii="Times New Roman" w:eastAsia="Times New Roman" w:hAnsi="Times New Roman" w:cs="Times New Roman"/>
-          <w:b/>
-          <w:bCs/>
-          <w:sz w:val="24"/>
-          <w:szCs w:val="24"/>
-        </w:rPr>
-        <w:t>Department: Maintenance</w:t>
-      </w:r>
-    </w:p>
-    <w:p>
-      <w:pPr>
+          <w:sz w:val="27"/>
+          <w:szCs w:val="27"/>
+        </w:rPr>
+      </w:pPr>
+      <w:r>
+        <w:rPr>
+          <w:rFonts w:ascii="Times New Roman" w:eastAsia="Times New Roman" w:hAnsi="Times New Roman" w:cs="Times New Roman"/>
+          <w:b/>
+          <w:bCs/>
+          <w:sz w:val="27"/>
+          <w:szCs w:val="27"/>
+        </w:rPr>
+        <w:t>Key Learnings</w:t>
+      </w:r>
+    </w:p>
+    <w:p>
+      <w:pPr>
+        <w:numPr>
+          <w:ilvl w:val="0"/>
+          <w:numId w:val="27"/>
+        </w:numPr>
         <w:spacing w:after="0" w:line="240" w:lineRule="auto"/>
         <w:rPr>
           <w:rFonts w:ascii="Times New Roman" w:eastAsia="Times New Roman" w:hAnsi="Times New Roman" w:cs="Times New Roman"/>
-          <w:b/>
-          <w:bCs/>
-          <w:sz w:val="24"/>
-          <w:szCs w:val="24"/>
-        </w:rPr>
-      </w:pPr>
-      <w:r>
-        <w:rPr>
-          <w:rFonts w:ascii="Times New Roman" w:eastAsia="Times New Roman" w:hAnsi="Times New Roman" w:cs="Times New Roman"/>
-          <w:b/>
-          <w:bCs/>
-          <w:sz w:val="24"/>
-          <w:szCs w:val="24"/>
-        </w:rPr>
-        <w:t>Plant: Drive Shaft Manufacturing</w:t>
-      </w:r>
-    </w:p>
-    <w:p>
-      <w:pPr>
-        <w:pStyle w:val="Heading2"/>
-        <w:jc w:val="center"/>
-      </w:pPr>
-      <w:r>
-        <w:rPr>
-          <w:rStyle w:val="Strong"/>
-          <w:b/>
-          <w:bCs/>
-        </w:rPr>
-        <w:t>Frontend Desktop Shell &amp; Renderer Foundation</w:t>
-      </w:r>
-    </w:p>
-    <w:p>
-      <w:pPr>
-        <w:pStyle w:val="NormalWeb"/>
-        <w:spacing w:before="0" w:beforeAutospacing="0" w:after="0" w:afterAutospacing="0"/>
-      </w:pPr>
-      <w:r>
-        <w:rPr>
-          <w:rStyle w:val="Strong"/>
-        </w:rPr>
-        <w:t xml:space="preserve"> Focus:</w:t>
-      </w:r>
-      <w:r>
-        <w:t xml:space="preserve"> Frontend desktop integration, renderer stabilization, UI shell finalization</w:t>
+          <w:sz w:val="24"/>
+          <w:szCs w:val="24"/>
+        </w:rPr>
+      </w:pPr>
+      <w:r>
+        <w:rPr>
+          <w:rFonts w:ascii="Times New Roman" w:eastAsia="Times New Roman" w:hAnsi="Times New Roman" w:cs="Times New Roman"/>
+          <w:sz w:val="24"/>
+          <w:szCs w:val="24"/>
+        </w:rPr>
+        <w:t xml:space="preserve">Desktop frontends require </w:t>
+      </w:r>
+      <w:r>
+        <w:rPr>
+          <w:rFonts w:ascii="Times New Roman" w:eastAsia="Times New Roman" w:hAnsi="Times New Roman" w:cs="Times New Roman"/>
+          <w:b/>
+          <w:bCs/>
+          <w:sz w:val="24"/>
+          <w:szCs w:val="24"/>
+        </w:rPr>
+        <w:t>explicit separation</w:t>
+      </w:r>
+      <w:r>
+        <w:rPr>
+          <w:rFonts w:ascii="Times New Roman" w:eastAsia="Times New Roman" w:hAnsi="Times New Roman" w:cs="Times New Roman"/>
+          <w:sz w:val="24"/>
+          <w:szCs w:val="24"/>
+        </w:rPr>
+        <w:t xml:space="preserve"> between dev tooling (Vite, localhost) and production execution (Qt WebEngine).</w:t>
+      </w:r>
+    </w:p>
+    <w:p>
+      <w:pPr>
+        <w:numPr>
+          <w:ilvl w:val="0"/>
+          <w:numId w:val="27"/>
+        </w:numPr>
+        <w:spacing w:after="0" w:line="240" w:lineRule="auto"/>
+        <w:rPr>
+          <w:rFonts w:ascii="Times New Roman" w:eastAsia="Times New Roman" w:hAnsi="Times New Roman" w:cs="Times New Roman"/>
+          <w:sz w:val="24"/>
+          <w:szCs w:val="24"/>
+        </w:rPr>
+      </w:pPr>
+      <w:r>
+        <w:rPr>
+          <w:rFonts w:ascii="Times New Roman" w:eastAsia="Times New Roman" w:hAnsi="Times New Roman" w:cs="Times New Roman"/>
+          <w:sz w:val="24"/>
+          <w:szCs w:val="24"/>
+        </w:rPr>
+        <w:t xml:space="preserve">Asset handling (logos, icons) must follow </w:t>
+      </w:r>
+      <w:r>
+        <w:rPr>
+          <w:rFonts w:ascii="Times New Roman" w:eastAsia="Times New Roman" w:hAnsi="Times New Roman" w:cs="Times New Roman"/>
+          <w:b/>
+          <w:bCs/>
+          <w:sz w:val="24"/>
+          <w:szCs w:val="24"/>
+        </w:rPr>
+        <w:t>bundler-aware conventions</w:t>
+      </w:r>
+      <w:r>
+        <w:rPr>
+          <w:rFonts w:ascii="Times New Roman" w:eastAsia="Times New Roman" w:hAnsi="Times New Roman" w:cs="Times New Roman"/>
+          <w:sz w:val="24"/>
+          <w:szCs w:val="24"/>
+        </w:rPr>
+        <w:t xml:space="preserve"> to avoid runtime failures in packaged applications.</w:t>
+      </w:r>
+    </w:p>
+    <w:p>
+      <w:pPr>
+        <w:numPr>
+          <w:ilvl w:val="0"/>
+          <w:numId w:val="27"/>
+        </w:numPr>
+        <w:spacing w:after="0" w:line="240" w:lineRule="auto"/>
+        <w:rPr>
+          <w:rFonts w:ascii="Times New Roman" w:eastAsia="Times New Roman" w:hAnsi="Times New Roman" w:cs="Times New Roman"/>
+          <w:sz w:val="24"/>
+          <w:szCs w:val="24"/>
+        </w:rPr>
+      </w:pPr>
+      <w:r>
+        <w:rPr>
+          <w:rFonts w:ascii="Times New Roman" w:eastAsia="Times New Roman" w:hAnsi="Times New Roman" w:cs="Times New Roman"/>
+          <w:sz w:val="24"/>
+          <w:szCs w:val="24"/>
+        </w:rPr>
+        <w:t>Establishing navigation hierarchy (primary vs advanced) early prevents UX confusion for maintenance engineers.</w:t>
+      </w:r>
+    </w:p>
+    <w:p>
+      <w:pPr>
+        <w:numPr>
+          <w:ilvl w:val="0"/>
+          <w:numId w:val="27"/>
+        </w:numPr>
+        <w:spacing w:after="0" w:line="240" w:lineRule="auto"/>
+        <w:rPr>
+          <w:rFonts w:ascii="Times New Roman" w:eastAsia="Times New Roman" w:hAnsi="Times New Roman" w:cs="Times New Roman"/>
+          <w:sz w:val="24"/>
+          <w:szCs w:val="24"/>
+        </w:rPr>
+      </w:pPr>
+      <w:r>
+        <w:rPr>
+          <w:rFonts w:ascii="Times New Roman" w:eastAsia="Times New Roman" w:hAnsi="Times New Roman" w:cs="Times New Roman"/>
+          <w:sz w:val="24"/>
+          <w:szCs w:val="24"/>
+        </w:rPr>
+        <w:t>In-process API bridges provide stronger security and determinism than HTTP-based localhost APIs for offline systems.</w:t>
+      </w:r>
+    </w:p>
+    <w:p>
+      <w:pPr>
+        <w:numPr>
+          <w:ilvl w:val="0"/>
+          <w:numId w:val="27"/>
+        </w:numPr>
+        <w:spacing w:after="0" w:line="240" w:lineRule="auto"/>
+        <w:rPr>
+          <w:rFonts w:ascii="Times New Roman" w:eastAsia="Times New Roman" w:hAnsi="Times New Roman" w:cs="Times New Roman"/>
+          <w:sz w:val="24"/>
+          <w:szCs w:val="24"/>
+        </w:rPr>
+      </w:pPr>
+      <w:r>
+        <w:rPr>
+          <w:rFonts w:ascii="Times New Roman" w:eastAsia="Times New Roman" w:hAnsi="Times New Roman" w:cs="Times New Roman"/>
+          <w:sz w:val="24"/>
+          <w:szCs w:val="24"/>
+        </w:rPr>
+        <w:t>Solving TypeScript, aliasing, and renderer stability early significantly reduces downstream UI integration risk.</w:t>
       </w:r>
     </w:p>
     <w:p>
@@ -4102,7 +4388,7 @@
           <w:b/>
           <w:bCs/>
         </w:rPr>
-        <w:t>Activities Performed</w:t>
+        <w:t>Outcome</w:t>
       </w:r>
     </w:p>
     <w:p>
@@ -4110,12 +4396,12 @@
         <w:pStyle w:val="NormalWeb"/>
         <w:numPr>
           <w:ilvl w:val="0"/>
-          <w:numId w:val="25"/>
+          <w:numId w:val="26"/>
         </w:numPr>
         <w:spacing w:before="0" w:beforeAutospacing="0" w:after="0" w:afterAutospacing="0"/>
       </w:pPr>
       <w:r>
-        <w:t>Finalized Electron + Qt-based desktop shell ensuring fully offline execution with no localhost or network dependency.</w:t>
+        <w:t>Desktop application launches successfully with renderer fully integrated.</w:t>
       </w:r>
     </w:p>
     <w:p>
@@ -4123,12 +4409,12 @@
         <w:pStyle w:val="NormalWeb"/>
         <w:numPr>
           <w:ilvl w:val="0"/>
-          <w:numId w:val="25"/>
+          <w:numId w:val="26"/>
         </w:numPr>
         <w:spacing w:before="0" w:beforeAutospacing="0" w:after="0" w:afterAutospacing="0"/>
       </w:pPr>
       <w:r>
-        <w:t>Stabilized renderer environment using Vite + React + TypeScript and resolved all module resolution and aliasing issues.</w:t>
+        <w:t>Frontend operates fully offline with in-process API bridge.</w:t>
       </w:r>
     </w:p>
     <w:p>
@@ -4136,51 +4422,12 @@
         <w:pStyle w:val="NormalWeb"/>
         <w:numPr>
           <w:ilvl w:val="0"/>
-          <w:numId w:val="25"/>
+          <w:numId w:val="26"/>
         </w:numPr>
         <w:spacing w:before="0" w:beforeAutospacing="0" w:after="0" w:afterAutospacing="0"/>
       </w:pPr>
       <w:r>
-        <w:t>Implemented application-wide routing, layout composition, and sidebar navigation hierarchy.</w:t>
-      </w:r>
-    </w:p>
-    <w:p>
-      <w:pPr>
-        <w:pStyle w:val="NormalWeb"/>
-        <w:numPr>
-          <w:ilvl w:val="0"/>
-          <w:numId w:val="25"/>
-        </w:numPr>
-        <w:spacing w:before="0" w:beforeAutospacing="0" w:after="0" w:afterAutospacing="0"/>
-      </w:pPr>
-      <w:r>
-        <w:t>Integrated official company branding with proper logo placement, sizing, and visual hierarchy.</w:t>
-      </w:r>
-    </w:p>
-    <w:p>
-      <w:pPr>
-        <w:pStyle w:val="NormalWeb"/>
-        <w:numPr>
-          <w:ilvl w:val="0"/>
-          <w:numId w:val="25"/>
-        </w:numPr>
-        <w:spacing w:before="0" w:beforeAutospacing="0" w:after="0" w:afterAutospacing="0"/>
-      </w:pPr>
-      <w:r>
-        <w:t>Defined primary vs secondary (advanced) navigation structure aligned with maintenance-user workflows.</w:t>
-      </w:r>
-    </w:p>
-    <w:p>
-      <w:pPr>
-        <w:pStyle w:val="NormalWeb"/>
-        <w:numPr>
-          <w:ilvl w:val="0"/>
-          <w:numId w:val="25"/>
-        </w:numPr>
-        <w:spacing w:before="0" w:beforeAutospacing="0" w:after="0" w:afterAutospacing="0"/>
-      </w:pPr>
-      <w:r>
-        <w:t>Ensured renderer state coordination logic supports deterministic run-based UI behavior.</w:t>
+        <w:t>UI shell is stable, extensible, and review-ready.</w:t>
       </w:r>
     </w:p>
     <w:p>
@@ -4203,228 +4450,6 @@
           <w:sz w:val="27"/>
           <w:szCs w:val="27"/>
         </w:rPr>
-        <w:t>Key Learnings</w:t>
-      </w:r>
-    </w:p>
-    <w:p>
-      <w:pPr>
-        <w:numPr>
-          <w:ilvl w:val="0"/>
-          <w:numId w:val="27"/>
-        </w:numPr>
-        <w:spacing w:after="0" w:line="240" w:lineRule="auto"/>
-        <w:rPr>
-          <w:rFonts w:ascii="Times New Roman" w:eastAsia="Times New Roman" w:hAnsi="Times New Roman" w:cs="Times New Roman"/>
-          <w:sz w:val="24"/>
-          <w:szCs w:val="24"/>
-        </w:rPr>
-      </w:pPr>
-      <w:r>
-        <w:rPr>
-          <w:rFonts w:ascii="Times New Roman" w:eastAsia="Times New Roman" w:hAnsi="Times New Roman" w:cs="Times New Roman"/>
-          <w:sz w:val="24"/>
-          <w:szCs w:val="24"/>
-        </w:rPr>
-        <w:t xml:space="preserve">Desktop frontends require </w:t>
-      </w:r>
-      <w:r>
-        <w:rPr>
-          <w:rFonts w:ascii="Times New Roman" w:eastAsia="Times New Roman" w:hAnsi="Times New Roman" w:cs="Times New Roman"/>
-          <w:b/>
-          <w:bCs/>
-          <w:sz w:val="24"/>
-          <w:szCs w:val="24"/>
-        </w:rPr>
-        <w:t>explicit separation</w:t>
-      </w:r>
-      <w:r>
-        <w:rPr>
-          <w:rFonts w:ascii="Times New Roman" w:eastAsia="Times New Roman" w:hAnsi="Times New Roman" w:cs="Times New Roman"/>
-          <w:sz w:val="24"/>
-          <w:szCs w:val="24"/>
-        </w:rPr>
-        <w:t xml:space="preserve"> between dev tooling (Vite, localhost) and production execution (Qt WebEngine).</w:t>
-      </w:r>
-    </w:p>
-    <w:p>
-      <w:pPr>
-        <w:numPr>
-          <w:ilvl w:val="0"/>
-          <w:numId w:val="27"/>
-        </w:numPr>
-        <w:spacing w:after="0" w:line="240" w:lineRule="auto"/>
-        <w:rPr>
-          <w:rFonts w:ascii="Times New Roman" w:eastAsia="Times New Roman" w:hAnsi="Times New Roman" w:cs="Times New Roman"/>
-          <w:sz w:val="24"/>
-          <w:szCs w:val="24"/>
-        </w:rPr>
-      </w:pPr>
-      <w:r>
-        <w:rPr>
-          <w:rFonts w:ascii="Times New Roman" w:eastAsia="Times New Roman" w:hAnsi="Times New Roman" w:cs="Times New Roman"/>
-          <w:sz w:val="24"/>
-          <w:szCs w:val="24"/>
-        </w:rPr>
-        <w:t xml:space="preserve">Asset handling (logos, icons) must follow </w:t>
-      </w:r>
-      <w:r>
-        <w:rPr>
-          <w:rFonts w:ascii="Times New Roman" w:eastAsia="Times New Roman" w:hAnsi="Times New Roman" w:cs="Times New Roman"/>
-          <w:b/>
-          <w:bCs/>
-          <w:sz w:val="24"/>
-          <w:szCs w:val="24"/>
-        </w:rPr>
-        <w:t>bundler-aware conventions</w:t>
-      </w:r>
-      <w:r>
-        <w:rPr>
-          <w:rFonts w:ascii="Times New Roman" w:eastAsia="Times New Roman" w:hAnsi="Times New Roman" w:cs="Times New Roman"/>
-          <w:sz w:val="24"/>
-          <w:szCs w:val="24"/>
-        </w:rPr>
-        <w:t xml:space="preserve"> to avoid runtime failures in packaged applications.</w:t>
-      </w:r>
-    </w:p>
-    <w:p>
-      <w:pPr>
-        <w:numPr>
-          <w:ilvl w:val="0"/>
-          <w:numId w:val="27"/>
-        </w:numPr>
-        <w:spacing w:after="0" w:line="240" w:lineRule="auto"/>
-        <w:rPr>
-          <w:rFonts w:ascii="Times New Roman" w:eastAsia="Times New Roman" w:hAnsi="Times New Roman" w:cs="Times New Roman"/>
-          <w:sz w:val="24"/>
-          <w:szCs w:val="24"/>
-        </w:rPr>
-      </w:pPr>
-      <w:r>
-        <w:rPr>
-          <w:rFonts w:ascii="Times New Roman" w:eastAsia="Times New Roman" w:hAnsi="Times New Roman" w:cs="Times New Roman"/>
-          <w:sz w:val="24"/>
-          <w:szCs w:val="24"/>
-        </w:rPr>
-        <w:t>Establishing navigation hierarchy (primary vs advanced) early prevents UX confusion for maintenance engineers.</w:t>
-      </w:r>
-    </w:p>
-    <w:p>
-      <w:pPr>
-        <w:numPr>
-          <w:ilvl w:val="0"/>
-          <w:numId w:val="27"/>
-        </w:numPr>
-        <w:spacing w:after="0" w:line="240" w:lineRule="auto"/>
-        <w:rPr>
-          <w:rFonts w:ascii="Times New Roman" w:eastAsia="Times New Roman" w:hAnsi="Times New Roman" w:cs="Times New Roman"/>
-          <w:sz w:val="24"/>
-          <w:szCs w:val="24"/>
-        </w:rPr>
-      </w:pPr>
-      <w:r>
-        <w:rPr>
-          <w:rFonts w:ascii="Times New Roman" w:eastAsia="Times New Roman" w:hAnsi="Times New Roman" w:cs="Times New Roman"/>
-          <w:sz w:val="24"/>
-          <w:szCs w:val="24"/>
-        </w:rPr>
-        <w:t>In-process API bridges provide stronger security and determinism than HTTP-based localhost APIs for offline systems.</w:t>
-      </w:r>
-    </w:p>
-    <w:p>
-      <w:pPr>
-        <w:numPr>
-          <w:ilvl w:val="0"/>
-          <w:numId w:val="27"/>
-        </w:numPr>
-        <w:spacing w:after="0" w:line="240" w:lineRule="auto"/>
-        <w:rPr>
-          <w:rFonts w:ascii="Times New Roman" w:eastAsia="Times New Roman" w:hAnsi="Times New Roman" w:cs="Times New Roman"/>
-          <w:sz w:val="24"/>
-          <w:szCs w:val="24"/>
-        </w:rPr>
-      </w:pPr>
-      <w:r>
-        <w:rPr>
-          <w:rFonts w:ascii="Times New Roman" w:eastAsia="Times New Roman" w:hAnsi="Times New Roman" w:cs="Times New Roman"/>
-          <w:sz w:val="24"/>
-          <w:szCs w:val="24"/>
-        </w:rPr>
-        <w:t>Solving TypeScript, aliasing, and renderer stability early significantly reduces downstream UI integration risk.</w:t>
-      </w:r>
-    </w:p>
-    <w:p>
-      <w:pPr>
-        <w:pStyle w:val="Heading3"/>
-        <w:spacing w:before="0" w:beforeAutospacing="0" w:after="0" w:afterAutospacing="0"/>
-      </w:pPr>
-      <w:r>
-        <w:rPr>
-          <w:rStyle w:val="Strong"/>
-          <w:b/>
-          <w:bCs/>
-        </w:rPr>
-        <w:t>Outcome</w:t>
-      </w:r>
-    </w:p>
-    <w:p>
-      <w:pPr>
-        <w:pStyle w:val="NormalWeb"/>
-        <w:numPr>
-          <w:ilvl w:val="0"/>
-          <w:numId w:val="26"/>
-        </w:numPr>
-        <w:spacing w:before="0" w:beforeAutospacing="0" w:after="0" w:afterAutospacing="0"/>
-      </w:pPr>
-      <w:r>
-        <w:t>Desktop application launches successfully with renderer fully integrated.</w:t>
-      </w:r>
-    </w:p>
-    <w:p>
-      <w:pPr>
-        <w:pStyle w:val="NormalWeb"/>
-        <w:numPr>
-          <w:ilvl w:val="0"/>
-          <w:numId w:val="26"/>
-        </w:numPr>
-        <w:spacing w:before="0" w:beforeAutospacing="0" w:after="0" w:afterAutospacing="0"/>
-      </w:pPr>
-      <w:r>
-        <w:t>Frontend operates fully offline with in-process API bridge.</w:t>
-      </w:r>
-    </w:p>
-    <w:p>
-      <w:pPr>
-        <w:pStyle w:val="NormalWeb"/>
-        <w:numPr>
-          <w:ilvl w:val="0"/>
-          <w:numId w:val="26"/>
-        </w:numPr>
-        <w:spacing w:before="0" w:beforeAutospacing="0" w:after="0" w:afterAutospacing="0"/>
-      </w:pPr>
-      <w:r>
-        <w:t>UI shell is stable, extensible, and review-ready.</w:t>
-      </w:r>
-    </w:p>
-    <w:p>
-      <w:pPr>
-        <w:spacing w:after="0" w:line="240" w:lineRule="auto"/>
-        <w:outlineLvl w:val="2"/>
-        <w:rPr>
-          <w:rFonts w:ascii="Times New Roman" w:eastAsia="Times New Roman" w:hAnsi="Times New Roman" w:cs="Times New Roman"/>
-          <w:b/>
-          <w:bCs/>
-          <w:sz w:val="27"/>
-          <w:szCs w:val="27"/>
-        </w:rPr>
-      </w:pPr>
-      <w:r>
-        <w:rPr>
-          <w:rFonts w:ascii="Times New Roman" w:eastAsia="Times New Roman" w:hAnsi="Times New Roman" w:cs="Times New Roman"/>
-          <w:b/>
-          <w:bCs/>
-          <w:sz w:val="27"/>
-          <w:szCs w:val="27"/>
-        </w:rPr>
         <w:t xml:space="preserve">Next Steps </w:t>
       </w:r>
     </w:p>
@@ -4565,16 +4590,7 @@
           <w:sz w:val="24"/>
           <w:szCs w:val="24"/>
         </w:rPr>
-        <w:t xml:space="preserve">/01/2016                                                                                </w:t>
-      </w:r>
-      <w:r>
-        <w:rPr>
-          <w:rFonts w:ascii="Times New Roman" w:eastAsia="Times New Roman" w:hAnsi="Times New Roman" w:cs="Times New Roman"/>
-          <w:b/>
-          <w:sz w:val="24"/>
-          <w:szCs w:val="24"/>
-        </w:rPr>
-        <w:t xml:space="preserve">          </w:t>
+        <w:t xml:space="preserve">/01/2016                                                                                          </w:t>
       </w:r>
       <w:r>
         <w:rPr>
@@ -5269,8 +5285,828 @@
         </w:rPr>
         <w:t>Prepare frontend hooks for the upcoming Data Profiler layer (read-only integration).</w:t>
       </w:r>
+    </w:p>
+    <w:p>
+      <w:pPr>
+        <w:pStyle w:val="NormalWeb"/>
+        <w:rPr>
+          <w:b/>
+        </w:rPr>
+      </w:pPr>
+      <w:r>
+        <w:rPr>
+          <w:rStyle w:val="Strong"/>
+          <w:b w:val="0"/>
+        </w:rPr>
+        <w:lastRenderedPageBreak/>
+        <w:t>Date:</w:t>
+      </w:r>
+      <w:r>
+        <w:rPr>
+          <w:b/>
+        </w:rPr>
+        <w:t xml:space="preserve"> 16/01/2026                                                                                                           </w:t>
+      </w:r>
+      <w:r>
+        <w:rPr>
+          <w:rStyle w:val="Strong"/>
+          <w:b w:val="0"/>
+        </w:rPr>
+        <w:t>Day:</w:t>
+      </w:r>
+      <w:r>
+        <w:rPr>
+          <w:b/>
+        </w:rPr>
+        <w:t xml:space="preserve"> 9</w:t>
+      </w:r>
+      <w:r>
+        <w:rPr>
+          <w:b/>
+        </w:rPr>
+        <w:br/>
+      </w:r>
+      <w:r>
+        <w:rPr>
+          <w:rStyle w:val="Strong"/>
+          <w:b w:val="0"/>
+        </w:rPr>
+        <w:t>Department:</w:t>
+      </w:r>
+      <w:r>
+        <w:rPr>
+          <w:b/>
+        </w:rPr>
+        <w:t xml:space="preserve"> Maintenance</w:t>
+      </w:r>
+      <w:r>
+        <w:rPr>
+          <w:b/>
+        </w:rPr>
+        <w:br/>
+      </w:r>
+      <w:r>
+        <w:rPr>
+          <w:rStyle w:val="Strong"/>
+          <w:b w:val="0"/>
+        </w:rPr>
+        <w:t>Plant:</w:t>
+      </w:r>
+      <w:r>
+        <w:rPr>
+          <w:b/>
+        </w:rPr>
+        <w:t xml:space="preserve"> Drive Shaft Manufacturing</w:t>
+      </w:r>
+    </w:p>
+    <w:p>
+      <w:pPr>
+        <w:pStyle w:val="Heading3"/>
+        <w:spacing w:before="0" w:beforeAutospacing="0" w:after="0" w:afterAutospacing="0"/>
+      </w:pPr>
+      <w:r>
+        <w:rPr>
+          <w:rStyle w:val="Strong"/>
+          <w:b/>
+          <w:bCs/>
+        </w:rPr>
+        <w:t>Objective of the Day</w:t>
+      </w:r>
+    </w:p>
+    <w:p>
+      <w:pPr>
+        <w:pStyle w:val="NormalWeb"/>
+        <w:spacing w:before="0" w:beforeAutospacing="0" w:after="0" w:afterAutospacing="0"/>
+      </w:pPr>
+      <w:r>
+        <w:t>Design and freeze the complete UI blueprint and interaction model for the offline industrial data intelligence desktop application.</w:t>
+      </w:r>
+    </w:p>
+    <w:p>
+      <w:pPr>
+        <w:pStyle w:val="NormalWeb"/>
+        <w:spacing w:before="0" w:beforeAutospacing="0" w:after="0" w:afterAutospacing="0"/>
+      </w:pPr>
+    </w:p>
+    <w:p>
+      <w:pPr>
+        <w:pStyle w:val="Heading3"/>
+        <w:spacing w:before="0" w:beforeAutospacing="0" w:after="0" w:afterAutospacing="0"/>
+      </w:pPr>
+      <w:r>
+        <w:rPr>
+          <w:rStyle w:val="Strong"/>
+          <w:b/>
+          <w:bCs/>
+        </w:rPr>
+        <w:t>Activities Performed</w:t>
+      </w:r>
+    </w:p>
+    <w:p>
+      <w:pPr>
+        <w:pStyle w:val="NormalWeb"/>
+        <w:numPr>
+          <w:ilvl w:val="0"/>
+          <w:numId w:val="33"/>
+        </w:numPr>
+        <w:spacing w:before="0" w:beforeAutospacing="0" w:after="0" w:afterAutospacing="0"/>
+      </w:pPr>
+      <w:r>
+        <w:t>Reviewed the frozen backend and ingestion architecture to derive frontend responsibilities.</w:t>
+      </w:r>
+    </w:p>
+    <w:p>
+      <w:pPr>
+        <w:pStyle w:val="NormalWeb"/>
+        <w:numPr>
+          <w:ilvl w:val="0"/>
+          <w:numId w:val="33"/>
+        </w:numPr>
+        <w:spacing w:before="0" w:beforeAutospacing="0" w:after="0" w:afterAutospacing="0"/>
+      </w:pPr>
+      <w:r>
+        <w:t>Finalized a run-based frontend interaction model aligned with ingestion versioning.</w:t>
+      </w:r>
+    </w:p>
+    <w:p>
+      <w:pPr>
+        <w:pStyle w:val="NormalWeb"/>
+        <w:numPr>
+          <w:ilvl w:val="0"/>
+          <w:numId w:val="33"/>
+        </w:numPr>
+        <w:spacing w:before="0" w:beforeAutospacing="0" w:after="0" w:afterAutospacing="0"/>
+      </w:pPr>
+      <w:r>
+        <w:t>Designed and froze the complete navigation structure with Home as the system entry point.</w:t>
+      </w:r>
+    </w:p>
+    <w:p>
+      <w:pPr>
+        <w:pStyle w:val="NormalWeb"/>
+        <w:numPr>
+          <w:ilvl w:val="0"/>
+          <w:numId w:val="33"/>
+        </w:numPr>
+        <w:spacing w:before="0" w:beforeAutospacing="0" w:after="0" w:afterAutospacing="0"/>
+      </w:pPr>
+      <w:r>
+        <w:t>Defined screen-to-screen interaction flows with clear state transitions.</w:t>
+      </w:r>
+    </w:p>
+    <w:p>
+      <w:pPr>
+        <w:pStyle w:val="NormalWeb"/>
+        <w:numPr>
+          <w:ilvl w:val="0"/>
+          <w:numId w:val="33"/>
+        </w:numPr>
+        <w:spacing w:before="0" w:beforeAutospacing="0" w:after="0" w:afterAutospacing="0"/>
+      </w:pPr>
+      <w:r>
+        <w:t>Created low-to-medium fidelity wireframes for:</w:t>
+      </w:r>
+    </w:p>
+    <w:p>
+      <w:pPr>
+        <w:pStyle w:val="NormalWeb"/>
+        <w:numPr>
+          <w:ilvl w:val="1"/>
+          <w:numId w:val="33"/>
+        </w:numPr>
+        <w:spacing w:before="0" w:beforeAutospacing="0" w:after="0" w:afterAutospacing="0"/>
+      </w:pPr>
+      <w:r>
+        <w:t>Home</w:t>
+      </w:r>
+    </w:p>
+    <w:p>
+      <w:pPr>
+        <w:pStyle w:val="NormalWeb"/>
+        <w:numPr>
+          <w:ilvl w:val="1"/>
+          <w:numId w:val="33"/>
+        </w:numPr>
+        <w:spacing w:before="0" w:beforeAutospacing="0" w:after="0" w:afterAutospacing="0"/>
+      </w:pPr>
+      <w:r>
+        <w:t>Ingestion</w:t>
+      </w:r>
+    </w:p>
+    <w:p>
+      <w:pPr>
+        <w:pStyle w:val="NormalWeb"/>
+        <w:numPr>
+          <w:ilvl w:val="1"/>
+          <w:numId w:val="33"/>
+        </w:numPr>
+        <w:spacing w:before="0" w:beforeAutospacing="0" w:after="0" w:afterAutospacing="0"/>
+      </w:pPr>
+      <w:r>
+        <w:t>Insights</w:t>
+      </w:r>
+    </w:p>
+    <w:p>
+      <w:pPr>
+        <w:pStyle w:val="NormalWeb"/>
+        <w:numPr>
+          <w:ilvl w:val="1"/>
+          <w:numId w:val="33"/>
+        </w:numPr>
+        <w:spacing w:before="0" w:beforeAutospacing="0" w:after="0" w:afterAutospacing="0"/>
+      </w:pPr>
+      <w:r>
+        <w:t>Dashboards</w:t>
+      </w:r>
+    </w:p>
+    <w:p>
+      <w:pPr>
+        <w:pStyle w:val="NormalWeb"/>
+        <w:numPr>
+          <w:ilvl w:val="1"/>
+          <w:numId w:val="33"/>
+        </w:numPr>
+        <w:spacing w:before="0" w:beforeAutospacing="0" w:after="0" w:afterAutospacing="0"/>
+      </w:pPr>
+      <w:r>
+        <w:t>Exports</w:t>
+      </w:r>
+    </w:p>
+    <w:p>
+      <w:pPr>
+        <w:pStyle w:val="NormalWeb"/>
+        <w:numPr>
+          <w:ilvl w:val="0"/>
+          <w:numId w:val="33"/>
+        </w:numPr>
+        <w:spacing w:before="0" w:beforeAutospacing="0" w:after="0" w:afterAutospacing="0"/>
+      </w:pPr>
+      <w:r>
+        <w:t>Defined reusable UI component inventory for scalable frontend development.</w:t>
+      </w:r>
+    </w:p>
+    <w:p>
+      <w:pPr>
+        <w:pStyle w:val="NormalWeb"/>
+        <w:numPr>
+          <w:ilvl w:val="0"/>
+          <w:numId w:val="33"/>
+        </w:numPr>
+        <w:spacing w:before="0" w:beforeAutospacing="0" w:after="0" w:afterAutospacing="0"/>
+      </w:pPr>
+      <w:r>
+        <w:t>Established and froze UX behavior rules covering:</w:t>
+      </w:r>
+    </w:p>
+    <w:p>
+      <w:pPr>
+        <w:pStyle w:val="NormalWeb"/>
+        <w:numPr>
+          <w:ilvl w:val="1"/>
+          <w:numId w:val="33"/>
+        </w:numPr>
+        <w:spacing w:before="0" w:beforeAutospacing="0" w:after="0" w:afterAutospacing="0"/>
+      </w:pPr>
+      <w:r>
+        <w:t>Disabled states</w:t>
+      </w:r>
+    </w:p>
+    <w:p>
+      <w:pPr>
+        <w:pStyle w:val="NormalWeb"/>
+        <w:numPr>
+          <w:ilvl w:val="1"/>
+          <w:numId w:val="33"/>
+        </w:numPr>
+        <w:spacing w:before="0" w:beforeAutospacing="0" w:after="0" w:afterAutospacing="0"/>
+      </w:pPr>
+      <w:r>
+        <w:t>Empty states</w:t>
+      </w:r>
+    </w:p>
+    <w:p>
+      <w:pPr>
+        <w:pStyle w:val="NormalWeb"/>
+        <w:numPr>
+          <w:ilvl w:val="1"/>
+          <w:numId w:val="33"/>
+        </w:numPr>
+        <w:spacing w:before="0" w:beforeAutospacing="0" w:after="0" w:afterAutospacing="0"/>
+      </w:pPr>
+      <w:r>
+        <w:t>Error handling</w:t>
+      </w:r>
+    </w:p>
+    <w:p>
+      <w:pPr>
+        <w:pStyle w:val="NormalWeb"/>
+        <w:numPr>
+          <w:ilvl w:val="1"/>
+          <w:numId w:val="33"/>
+        </w:numPr>
+        <w:spacing w:before="0" w:beforeAutospacing="0" w:after="0" w:afterAutospacing="0"/>
+      </w:pPr>
+      <w:r>
+        <w:t>Export behavior</w:t>
+      </w:r>
+    </w:p>
+    <w:p>
+      <w:pPr>
+        <w:pStyle w:val="NormalWeb"/>
+        <w:numPr>
+          <w:ilvl w:val="0"/>
+          <w:numId w:val="33"/>
+        </w:numPr>
+        <w:spacing w:before="0" w:beforeAutospacing="0" w:after="0" w:afterAutospacing="0"/>
+      </w:pPr>
+      <w:r>
+        <w:t>Conducted a structured risk review covering UX, technical, and timeline risks.</w:t>
+      </w:r>
+    </w:p>
+    <w:p>
+      <w:pPr>
+        <w:pStyle w:val="NormalWeb"/>
+        <w:spacing w:before="0" w:beforeAutospacing="0" w:after="0" w:afterAutospacing="0"/>
+      </w:pPr>
+    </w:p>
+    <w:p>
+      <w:pPr>
+        <w:pStyle w:val="Heading3"/>
+        <w:spacing w:before="0" w:beforeAutospacing="0" w:after="0" w:afterAutospacing="0"/>
+      </w:pPr>
+      <w:r>
+        <w:rPr>
+          <w:rStyle w:val="Strong"/>
+          <w:b/>
+          <w:bCs/>
+        </w:rPr>
+        <w:t>Outcome of the Day</w:t>
+      </w:r>
+    </w:p>
+    <w:p>
+      <w:pPr>
+        <w:pStyle w:val="NormalWeb"/>
+        <w:spacing w:before="0" w:beforeAutospacing="0" w:after="0" w:afterAutospacing="0"/>
+      </w:pPr>
+      <w:r>
+        <w:t>A complete, production-ready UI blueprint was finalized.</w:t>
+      </w:r>
+      <w:r>
+        <w:br/>
+        <w:t>The frontend is now implementation-ready with no ambiguity in navigation, state handling, or data responsibility.</w:t>
+      </w:r>
+    </w:p>
+    <w:p>
+      <w:pPr>
+        <w:pStyle w:val="NormalWeb"/>
+        <w:spacing w:before="0" w:beforeAutospacing="0" w:after="0" w:afterAutospacing="0"/>
+      </w:pPr>
+    </w:p>
+    <w:p>
+      <w:pPr>
+        <w:pStyle w:val="Heading3"/>
+        <w:spacing w:before="0" w:beforeAutospacing="0" w:after="0" w:afterAutospacing="0"/>
+      </w:pPr>
+      <w:r>
+        <w:rPr>
+          <w:rStyle w:val="Strong"/>
+          <w:b/>
+          <w:bCs/>
+        </w:rPr>
+        <w:t>Key Learnings</w:t>
+      </w:r>
+    </w:p>
+    <w:p>
+      <w:pPr>
+        <w:pStyle w:val="NormalWeb"/>
+        <w:numPr>
+          <w:ilvl w:val="0"/>
+          <w:numId w:val="34"/>
+        </w:numPr>
+        <w:spacing w:before="0" w:beforeAutospacing="0" w:after="0" w:afterAutospacing="0"/>
+      </w:pPr>
+      <w:r>
+        <w:t>Run-scoped UI design is essential for auditability and trust in industrial analytics.</w:t>
+      </w:r>
+    </w:p>
+    <w:p>
+      <w:pPr>
+        <w:pStyle w:val="NormalWeb"/>
+        <w:numPr>
+          <w:ilvl w:val="0"/>
+          <w:numId w:val="34"/>
+        </w:numPr>
+        <w:spacing w:before="0" w:beforeAutospacing="0" w:after="0" w:afterAutospacing="0"/>
+      </w:pPr>
+      <w:r>
+        <w:t>Clear separation of context selection (Home) and action execution (Ingestion) simplifies UX.</w:t>
+      </w:r>
+    </w:p>
+    <w:p>
+      <w:pPr>
+        <w:pStyle w:val="NormalWeb"/>
+        <w:numPr>
+          <w:ilvl w:val="0"/>
+          <w:numId w:val="34"/>
+        </w:numPr>
+        <w:spacing w:before="0" w:beforeAutospacing="0" w:after="0" w:afterAutospacing="0"/>
+      </w:pPr>
+      <w:r>
+        <w:t>Export workflows must be treated as first-class outcomes in industrial systems.</w:t>
+      </w:r>
+    </w:p>
+    <w:p>
+      <w:pPr>
+        <w:pStyle w:val="NormalWeb"/>
+        <w:spacing w:before="0" w:beforeAutospacing="0" w:after="0" w:afterAutospacing="0"/>
+        <w:ind w:left="720"/>
+      </w:pPr>
+    </w:p>
+    <w:p>
+      <w:pPr>
+        <w:pStyle w:val="Heading3"/>
+        <w:spacing w:before="0" w:beforeAutospacing="0" w:after="0" w:afterAutospacing="0"/>
+      </w:pPr>
+      <w:r>
+        <w:rPr>
+          <w:rStyle w:val="Strong"/>
+          <w:b/>
+          <w:bCs/>
+        </w:rPr>
+        <w:t>Next Steps</w:t>
+      </w:r>
+    </w:p>
+    <w:p>
+      <w:pPr>
+        <w:pStyle w:val="NormalWeb"/>
+        <w:spacing w:before="0" w:beforeAutospacing="0" w:after="0" w:afterAutospacing="0"/>
+      </w:pPr>
+      <w:r>
+        <w:t>Begin mapping UI components to actual frontend code and mock backend contracts.</w:t>
+      </w:r>
+    </w:p>
+    <w:p>
+      <w:pPr>
+        <w:spacing w:before="100" w:beforeAutospacing="1" w:after="100" w:afterAutospacing="1" w:line="240" w:lineRule="auto"/>
+        <w:rPr>
+          <w:rFonts w:ascii="Times New Roman" w:eastAsia="Times New Roman" w:hAnsi="Times New Roman" w:cs="Times New Roman"/>
+          <w:sz w:val="24"/>
+          <w:szCs w:val="24"/>
+        </w:rPr>
+      </w:pPr>
+    </w:p>
+    <w:p>
+      <w:pPr>
+        <w:spacing w:before="100" w:beforeAutospacing="1" w:after="100" w:afterAutospacing="1" w:line="240" w:lineRule="auto"/>
+        <w:rPr>
+          <w:rFonts w:ascii="Times New Roman" w:eastAsia="Times New Roman" w:hAnsi="Times New Roman" w:cs="Times New Roman"/>
+          <w:sz w:val="24"/>
+          <w:szCs w:val="24"/>
+        </w:rPr>
+      </w:pPr>
+    </w:p>
+    <w:p>
+      <w:pPr>
+        <w:spacing w:before="100" w:beforeAutospacing="1" w:after="100" w:afterAutospacing="1" w:line="240" w:lineRule="auto"/>
+        <w:outlineLvl w:val="1"/>
+        <w:rPr>
+          <w:rFonts w:ascii="Times New Roman" w:eastAsia="Times New Roman" w:hAnsi="Times New Roman" w:cs="Times New Roman"/>
+          <w:b/>
+          <w:sz w:val="24"/>
+          <w:szCs w:val="24"/>
+        </w:rPr>
+      </w:pPr>
+      <w:r>
+        <w:rPr>
+          <w:rFonts w:ascii="Times New Roman" w:eastAsia="Times New Roman" w:hAnsi="Times New Roman" w:cs="Times New Roman"/>
+          <w:b/>
+          <w:bCs/>
+          <w:sz w:val="24"/>
+          <w:szCs w:val="24"/>
+        </w:rPr>
+        <w:lastRenderedPageBreak/>
+        <w:t>Date:</w:t>
+      </w:r>
+      <w:r>
+        <w:rPr>
+          <w:rFonts w:ascii="Times New Roman" w:eastAsia="Times New Roman" w:hAnsi="Times New Roman" w:cs="Times New Roman"/>
+          <w:b/>
+          <w:sz w:val="24"/>
+          <w:szCs w:val="24"/>
+        </w:rPr>
+        <w:t xml:space="preserve"> </w:t>
+      </w:r>
+      <w:r>
+        <w:rPr>
+          <w:rFonts w:ascii="Times New Roman" w:eastAsia="Times New Roman" w:hAnsi="Times New Roman" w:cs="Times New Roman"/>
+          <w:b/>
+          <w:sz w:val="24"/>
+          <w:szCs w:val="24"/>
+        </w:rPr>
+        <w:t>20</w:t>
+      </w:r>
+      <w:r>
+        <w:rPr>
+          <w:rFonts w:ascii="Times New Roman" w:eastAsia="Times New Roman" w:hAnsi="Times New Roman" w:cs="Times New Roman"/>
+          <w:b/>
+          <w:sz w:val="24"/>
+          <w:szCs w:val="24"/>
+        </w:rPr>
+        <w:t>/01/2026                                                                                                          Day 1</w:t>
+      </w:r>
+      <w:r>
+        <w:rPr>
+          <w:rFonts w:ascii="Times New Roman" w:eastAsia="Times New Roman" w:hAnsi="Times New Roman" w:cs="Times New Roman"/>
+          <w:b/>
+          <w:sz w:val="24"/>
+          <w:szCs w:val="24"/>
+        </w:rPr>
+        <w:t>0</w:t>
+      </w:r>
+      <w:r>
+        <w:rPr>
+          <w:rFonts w:ascii="Times New Roman" w:eastAsia="Times New Roman" w:hAnsi="Times New Roman" w:cs="Times New Roman"/>
+          <w:b/>
+          <w:sz w:val="24"/>
+          <w:szCs w:val="24"/>
+        </w:rPr>
+        <w:br/>
+      </w:r>
+      <w:r>
+        <w:rPr>
+          <w:rFonts w:ascii="Times New Roman" w:eastAsia="Times New Roman" w:hAnsi="Times New Roman" w:cs="Times New Roman"/>
+          <w:b/>
+          <w:bCs/>
+          <w:sz w:val="24"/>
+          <w:szCs w:val="24"/>
+        </w:rPr>
+        <w:t>Department:</w:t>
+      </w:r>
+      <w:r>
+        <w:rPr>
+          <w:rFonts w:ascii="Times New Roman" w:eastAsia="Times New Roman" w:hAnsi="Times New Roman" w:cs="Times New Roman"/>
+          <w:b/>
+          <w:sz w:val="24"/>
+          <w:szCs w:val="24"/>
+        </w:rPr>
+        <w:t xml:space="preserve"> Maintenance</w:t>
+      </w:r>
+      <w:r>
+        <w:rPr>
+          <w:rFonts w:ascii="Times New Roman" w:eastAsia="Times New Roman" w:hAnsi="Times New Roman" w:cs="Times New Roman"/>
+          <w:b/>
+          <w:sz w:val="24"/>
+          <w:szCs w:val="24"/>
+        </w:rPr>
+        <w:br/>
+      </w:r>
+      <w:r>
+        <w:rPr>
+          <w:rFonts w:ascii="Times New Roman" w:eastAsia="Times New Roman" w:hAnsi="Times New Roman" w:cs="Times New Roman"/>
+          <w:b/>
+          <w:bCs/>
+          <w:sz w:val="24"/>
+          <w:szCs w:val="24"/>
+        </w:rPr>
+        <w:t>Plant:</w:t>
+      </w:r>
+      <w:r>
+        <w:rPr>
+          <w:rFonts w:ascii="Times New Roman" w:eastAsia="Times New Roman" w:hAnsi="Times New Roman" w:cs="Times New Roman"/>
+          <w:b/>
+          <w:sz w:val="24"/>
+          <w:szCs w:val="24"/>
+        </w:rPr>
+        <w:t xml:space="preserve"> Drive Shaft Manufacturing</w:t>
+      </w:r>
+    </w:p>
+    <w:p>
+      <w:pPr>
+        <w:pStyle w:val="Heading3"/>
+      </w:pPr>
+      <w:r>
+        <w:rPr>
+          <w:rStyle w:val="Strong"/>
+          <w:b/>
+          <w:bCs/>
+        </w:rPr>
+        <w:t>Objective of the Day</w:t>
+      </w:r>
+    </w:p>
+    <w:p>
+      <w:pPr>
+        <w:pStyle w:val="NormalWeb"/>
+      </w:pPr>
+      <w:r>
+        <w:t>To implement and stabilize the core dashboard interaction layer for the offline industrial data intelligence system, based on a run-centric analytical model.</w:t>
+      </w:r>
+    </w:p>
+    <w:p>
+      <w:pPr>
+        <w:pStyle w:val="Heading3"/>
+      </w:pPr>
+      <w:r>
+        <w:rPr>
+          <w:rStyle w:val="Strong"/>
+          <w:b/>
+          <w:bCs/>
+        </w:rPr>
+        <w:t>Activities Performed</w:t>
+      </w:r>
+    </w:p>
+    <w:p>
+      <w:pPr>
+        <w:pStyle w:val="NormalWeb"/>
+        <w:numPr>
+          <w:ilvl w:val="0"/>
+          <w:numId w:val="38"/>
+        </w:numPr>
+        <w:spacing w:before="0" w:beforeAutospacing="0" w:after="0" w:afterAutospacing="0"/>
+      </w:pPr>
+      <w:r>
+        <w:t>Designed and implemented a fully run-scoped dashboard system where each ingested dataset is treated as an independent analytical run.</w:t>
+      </w:r>
+    </w:p>
+    <w:p>
+      <w:pPr>
+        <w:pStyle w:val="NormalWeb"/>
+        <w:numPr>
+          <w:ilvl w:val="0"/>
+          <w:numId w:val="38"/>
+        </w:numPr>
+        <w:spacing w:before="0" w:beforeAutospacing="0" w:after="0" w:afterAutospacing="0"/>
+      </w:pPr>
+      <w:r>
+        <w:t>Implemented dynamic dashboard rendering with support for global filters, widget-level visualization switching, and interactive exploration of insights.</w:t>
+      </w:r>
+    </w:p>
+    <w:p>
+      <w:pPr>
+        <w:pStyle w:val="NormalWeb"/>
+        <w:numPr>
+          <w:ilvl w:val="0"/>
+          <w:numId w:val="38"/>
+        </w:numPr>
+        <w:spacing w:before="0" w:beforeAutospacing="0" w:after="0" w:afterAutospacing="0"/>
+      </w:pPr>
+      <w:r>
+        <w:t>Integrated undo and redo functionality to allow analysts to safely experiment with dashboard configurations without losing prior states.</w:t>
+      </w:r>
+    </w:p>
+    <w:p>
+      <w:pPr>
+        <w:pStyle w:val="NormalWeb"/>
+        <w:numPr>
+          <w:ilvl w:val="0"/>
+          <w:numId w:val="38"/>
+        </w:numPr>
+        <w:spacing w:before="0" w:beforeAutospacing="0" w:after="0" w:afterAutospacing="0"/>
+      </w:pPr>
+      <w:r>
+        <w:t>Refactored the dashboard page into a pure render component, ensuring that no initialization or state mutation occurs inside the React component lifecycle.</w:t>
+      </w:r>
+    </w:p>
+    <w:p>
+      <w:pPr>
+        <w:pStyle w:val="NormalWeb"/>
+        <w:numPr>
+          <w:ilvl w:val="0"/>
+          <w:numId w:val="38"/>
+        </w:numPr>
+        <w:spacing w:before="0" w:beforeAutospacing="0" w:after="0" w:afterAutospacing="0"/>
+      </w:pPr>
+      <w:r>
+        <w:t>Introduced centralized orchestration logic to initialize dashboards strictly on run selection and reset dashboards when the active run is cleared.</w:t>
+      </w:r>
+    </w:p>
+    <w:p>
+      <w:pPr>
+        <w:pStyle w:val="NormalWeb"/>
+        <w:numPr>
+          <w:ilvl w:val="0"/>
+          <w:numId w:val="38"/>
+        </w:numPr>
+        <w:spacing w:before="0" w:beforeAutospacing="0" w:after="0" w:afterAutospacing="0"/>
+      </w:pPr>
+      <w:r>
+        <w:t>Resolved multiple frontend stability issues related to state subscriptions, rendering loops, and lifecycle-triggered reinitialization.</w:t>
+      </w:r>
+    </w:p>
+    <w:p>
+      <w:pPr>
+        <w:pStyle w:val="NormalWeb"/>
+        <w:numPr>
+          <w:ilvl w:val="0"/>
+          <w:numId w:val="38"/>
+        </w:numPr>
+        <w:spacing w:before="0" w:beforeAutospacing="0" w:after="0" w:afterAutospacing="0"/>
+      </w:pPr>
+      <w:r>
+        <w:t>Validated that dashboards load correctly for the selected run and remain stable across navigation and repeated interactions.</w:t>
+      </w:r>
+    </w:p>
+    <w:p>
+      <w:pPr>
+        <w:pStyle w:val="Heading3"/>
+      </w:pPr>
+      <w:r>
+        <w:rPr>
+          <w:rStyle w:val="Strong"/>
+          <w:b/>
+          <w:bCs/>
+        </w:rPr>
+        <w:t>Outcome of the Day</w:t>
+      </w:r>
+    </w:p>
+    <w:p>
+      <w:pPr>
+        <w:pStyle w:val="NormalWeb"/>
+      </w:pPr>
+      <w:r>
+        <w:t>A stable, production-ready dashboard interaction layer is now in place. Dashboards load correctly per run, support interactive analysis, and remain free from rendering loops or unintended side effects.</w:t>
+      </w:r>
+    </w:p>
+    <w:p>
+      <w:pPr>
+        <w:pStyle w:val="Heading3"/>
+      </w:pPr>
+      <w:r>
+        <w:rPr>
+          <w:rStyle w:val="Strong"/>
+          <w:b/>
+          <w:bCs/>
+        </w:rPr>
+        <w:t>Key Learnings</w:t>
+      </w:r>
+    </w:p>
+    <w:p>
+      <w:pPr>
+        <w:pStyle w:val="NormalWeb"/>
+        <w:numPr>
+          <w:ilvl w:val="0"/>
+          <w:numId w:val="37"/>
+        </w:numPr>
+      </w:pPr>
+      <w:r>
+        <w:t>Dashboard initialization must be decoupled from UI rendering logic.</w:t>
+      </w:r>
+    </w:p>
+    <w:p>
+      <w:pPr>
+        <w:pStyle w:val="NormalWeb"/>
+        <w:numPr>
+          <w:ilvl w:val="0"/>
+          <w:numId w:val="37"/>
+        </w:numPr>
+      </w:pPr>
+      <w:r>
+        <w:t>Run-based orchestration is essential for predictable analytical workflows.</w:t>
+      </w:r>
+    </w:p>
+    <w:p>
+      <w:pPr>
+        <w:pStyle w:val="NormalWeb"/>
+        <w:numPr>
+          <w:ilvl w:val="0"/>
+          <w:numId w:val="37"/>
+        </w:numPr>
+      </w:pPr>
+      <w:r>
+        <w:t>Undo and redo functionality is most reliable when interaction state is centralized.</w:t>
+      </w:r>
+    </w:p>
+    <w:p>
+      <w:pPr>
+        <w:pStyle w:val="Heading3"/>
+      </w:pPr>
+      <w:r>
+        <w:rPr>
+          <w:rStyle w:val="Strong"/>
+          <w:b/>
+          <w:bCs/>
+        </w:rPr>
+        <w:t>Next Steps</w:t>
+      </w:r>
+    </w:p>
+    <w:p>
+      <w:pPr>
+        <w:pStyle w:val="NormalWeb"/>
+      </w:pPr>
+      <w:r>
+        <w:t>Extend the dashboard interaction model with advanced filtering, drill-down, and persistence capabilities.</w:t>
+      </w:r>
       <w:bookmarkStart w:id="0" w:name="_GoBack"/>
       <w:bookmarkEnd w:id="0"/>
+    </w:p>
+    <w:p>
+      <w:pPr>
+        <w:spacing w:before="100" w:beforeAutospacing="1" w:after="100" w:afterAutospacing="1" w:line="240" w:lineRule="auto"/>
+        <w:rPr>
+          <w:rFonts w:ascii="Times New Roman" w:eastAsia="Times New Roman" w:hAnsi="Times New Roman" w:cs="Times New Roman"/>
+          <w:sz w:val="24"/>
+          <w:szCs w:val="24"/>
+        </w:rPr>
+      </w:pPr>
     </w:p>
     <w:sectPr>
       <w:pgSz w:w="12240" w:h="15840"/>
@@ -5881,6 +6717,119 @@
     </w:lvl>
   </w:abstractNum>
   <w:abstractNum w:abstractNumId="4" w15:restartNumberingAfterBreak="0">
+    <w:nsid w:val="0C554F64"/>
+    <w:multiLevelType w:val="hybridMultilevel"/>
+    <w:tmpl w:val="0506FDCA"/>
+    <w:lvl w:ilvl="0" w:tplc="04090001">
+      <w:start w:val="1"/>
+      <w:numFmt w:val="bullet"/>
+      <w:lvlText w:val=""/>
+      <w:lvlJc w:val="left"/>
+      <w:pPr>
+        <w:ind w:left="720" w:hanging="360"/>
+      </w:pPr>
+      <w:rPr>
+        <w:rFonts w:ascii="Symbol" w:hAnsi="Symbol" w:hint="default"/>
+      </w:rPr>
+    </w:lvl>
+    <w:lvl w:ilvl="1" w:tplc="04090003" w:tentative="1">
+      <w:start w:val="1"/>
+      <w:numFmt w:val="bullet"/>
+      <w:lvlText w:val="o"/>
+      <w:lvlJc w:val="left"/>
+      <w:pPr>
+        <w:ind w:left="1440" w:hanging="360"/>
+      </w:pPr>
+      <w:rPr>
+        <w:rFonts w:ascii="Courier New" w:hAnsi="Courier New" w:cs="Courier New" w:hint="default"/>
+      </w:rPr>
+    </w:lvl>
+    <w:lvl w:ilvl="2" w:tplc="04090005" w:tentative="1">
+      <w:start w:val="1"/>
+      <w:numFmt w:val="bullet"/>
+      <w:lvlText w:val=""/>
+      <w:lvlJc w:val="left"/>
+      <w:pPr>
+        <w:ind w:left="2160" w:hanging="360"/>
+      </w:pPr>
+      <w:rPr>
+        <w:rFonts w:ascii="Wingdings" w:hAnsi="Wingdings" w:hint="default"/>
+      </w:rPr>
+    </w:lvl>
+    <w:lvl w:ilvl="3" w:tplc="04090001" w:tentative="1">
+      <w:start w:val="1"/>
+      <w:numFmt w:val="bullet"/>
+      <w:lvlText w:val=""/>
+      <w:lvlJc w:val="left"/>
+      <w:pPr>
+        <w:ind w:left="2880" w:hanging="360"/>
+      </w:pPr>
+      <w:rPr>
+        <w:rFonts w:ascii="Symbol" w:hAnsi="Symbol" w:hint="default"/>
+      </w:rPr>
+    </w:lvl>
+    <w:lvl w:ilvl="4" w:tplc="04090003" w:tentative="1">
+      <w:start w:val="1"/>
+      <w:numFmt w:val="bullet"/>
+      <w:lvlText w:val="o"/>
+      <w:lvlJc w:val="left"/>
+      <w:pPr>
+        <w:ind w:left="3600" w:hanging="360"/>
+      </w:pPr>
+      <w:rPr>
+        <w:rFonts w:ascii="Courier New" w:hAnsi="Courier New" w:cs="Courier New" w:hint="default"/>
+      </w:rPr>
+    </w:lvl>
+    <w:lvl w:ilvl="5" w:tplc="04090005" w:tentative="1">
+      <w:start w:val="1"/>
+      <w:numFmt w:val="bullet"/>
+      <w:lvlText w:val=""/>
+      <w:lvlJc w:val="left"/>
+      <w:pPr>
+        <w:ind w:left="4320" w:hanging="360"/>
+      </w:pPr>
+      <w:rPr>
+        <w:rFonts w:ascii="Wingdings" w:hAnsi="Wingdings" w:hint="default"/>
+      </w:rPr>
+    </w:lvl>
+    <w:lvl w:ilvl="6" w:tplc="04090001" w:tentative="1">
+      <w:start w:val="1"/>
+      <w:numFmt w:val="bullet"/>
+      <w:lvlText w:val=""/>
+      <w:lvlJc w:val="left"/>
+      <w:pPr>
+        <w:ind w:left="5040" w:hanging="360"/>
+      </w:pPr>
+      <w:rPr>
+        <w:rFonts w:ascii="Symbol" w:hAnsi="Symbol" w:hint="default"/>
+      </w:rPr>
+    </w:lvl>
+    <w:lvl w:ilvl="7" w:tplc="04090003" w:tentative="1">
+      <w:start w:val="1"/>
+      <w:numFmt w:val="bullet"/>
+      <w:lvlText w:val="o"/>
+      <w:lvlJc w:val="left"/>
+      <w:pPr>
+        <w:ind w:left="5760" w:hanging="360"/>
+      </w:pPr>
+      <w:rPr>
+        <w:rFonts w:ascii="Courier New" w:hAnsi="Courier New" w:cs="Courier New" w:hint="default"/>
+      </w:rPr>
+    </w:lvl>
+    <w:lvl w:ilvl="8" w:tplc="04090005" w:tentative="1">
+      <w:start w:val="1"/>
+      <w:numFmt w:val="bullet"/>
+      <w:lvlText w:val=""/>
+      <w:lvlJc w:val="left"/>
+      <w:pPr>
+        <w:ind w:left="6480" w:hanging="360"/>
+      </w:pPr>
+      <w:rPr>
+        <w:rFonts w:ascii="Wingdings" w:hAnsi="Wingdings" w:hint="default"/>
+      </w:rPr>
+    </w:lvl>
+  </w:abstractNum>
+  <w:abstractNum w:abstractNumId="5" w15:restartNumberingAfterBreak="0">
     <w:nsid w:val="1025101E"/>
     <w:multiLevelType w:val="multilevel"/>
     <w:tmpl w:val="2630475E"/>
@@ -6029,7 +6978,7 @@
       </w:rPr>
     </w:lvl>
   </w:abstractNum>
-  <w:abstractNum w:abstractNumId="5" w15:restartNumberingAfterBreak="0">
+  <w:abstractNum w:abstractNumId="6" w15:restartNumberingAfterBreak="0">
     <w:nsid w:val="11EC4F79"/>
     <w:multiLevelType w:val="multilevel"/>
     <w:tmpl w:val="4E904154"/>
@@ -6178,7 +7127,7 @@
       </w:rPr>
     </w:lvl>
   </w:abstractNum>
-  <w:abstractNum w:abstractNumId="6" w15:restartNumberingAfterBreak="0">
+  <w:abstractNum w:abstractNumId="7" w15:restartNumberingAfterBreak="0">
     <w:nsid w:val="191D2358"/>
     <w:multiLevelType w:val="multilevel"/>
     <w:tmpl w:val="4C76D0CE"/>
@@ -6327,7 +7276,7 @@
       </w:rPr>
     </w:lvl>
   </w:abstractNum>
-  <w:abstractNum w:abstractNumId="7" w15:restartNumberingAfterBreak="0">
+  <w:abstractNum w:abstractNumId="8" w15:restartNumberingAfterBreak="0">
     <w:nsid w:val="1A0904A8"/>
     <w:multiLevelType w:val="multilevel"/>
     <w:tmpl w:val="AEAA53BA"/>
@@ -6476,7 +7425,7 @@
       </w:rPr>
     </w:lvl>
   </w:abstractNum>
-  <w:abstractNum w:abstractNumId="8" w15:restartNumberingAfterBreak="0">
+  <w:abstractNum w:abstractNumId="9" w15:restartNumberingAfterBreak="0">
     <w:nsid w:val="1D795E8D"/>
     <w:multiLevelType w:val="multilevel"/>
     <w:tmpl w:val="1D48DAD0"/>
@@ -6625,7 +7574,7 @@
       </w:rPr>
     </w:lvl>
   </w:abstractNum>
-  <w:abstractNum w:abstractNumId="9" w15:restartNumberingAfterBreak="0">
+  <w:abstractNum w:abstractNumId="10" w15:restartNumberingAfterBreak="0">
     <w:nsid w:val="1F04011B"/>
     <w:multiLevelType w:val="multilevel"/>
     <w:tmpl w:val="32E60924"/>
@@ -6774,7 +7723,7 @@
       </w:rPr>
     </w:lvl>
   </w:abstractNum>
-  <w:abstractNum w:abstractNumId="10" w15:restartNumberingAfterBreak="0">
+  <w:abstractNum w:abstractNumId="11" w15:restartNumberingAfterBreak="0">
     <w:nsid w:val="1FFA7335"/>
     <w:multiLevelType w:val="multilevel"/>
     <w:tmpl w:val="F746CC02"/>
@@ -6923,7 +7872,156 @@
       </w:rPr>
     </w:lvl>
   </w:abstractNum>
-  <w:abstractNum w:abstractNumId="11" w15:restartNumberingAfterBreak="0">
+  <w:abstractNum w:abstractNumId="12" w15:restartNumberingAfterBreak="0">
+    <w:nsid w:val="277F001C"/>
+    <w:multiLevelType w:val="multilevel"/>
+    <w:tmpl w:val="DD520D0A"/>
+    <w:lvl w:ilvl="0">
+      <w:start w:val="1"/>
+      <w:numFmt w:val="bullet"/>
+      <w:lvlText w:val=""/>
+      <w:lvlJc w:val="left"/>
+      <w:pPr>
+        <w:tabs>
+          <w:tab w:val="num" w:pos="720"/>
+        </w:tabs>
+        <w:ind w:left="720" w:hanging="360"/>
+      </w:pPr>
+      <w:rPr>
+        <w:rFonts w:ascii="Symbol" w:hAnsi="Symbol" w:hint="default"/>
+        <w:sz w:val="20"/>
+      </w:rPr>
+    </w:lvl>
+    <w:lvl w:ilvl="1">
+      <w:start w:val="1"/>
+      <w:numFmt w:val="bullet"/>
+      <w:lvlText w:val="o"/>
+      <w:lvlJc w:val="left"/>
+      <w:pPr>
+        <w:tabs>
+          <w:tab w:val="num" w:pos="1440"/>
+        </w:tabs>
+        <w:ind w:left="1440" w:hanging="360"/>
+      </w:pPr>
+      <w:rPr>
+        <w:rFonts w:ascii="Courier New" w:hAnsi="Courier New" w:hint="default"/>
+        <w:sz w:val="20"/>
+      </w:rPr>
+    </w:lvl>
+    <w:lvl w:ilvl="2" w:tentative="1">
+      <w:start w:val="1"/>
+      <w:numFmt w:val="bullet"/>
+      <w:lvlText w:val=""/>
+      <w:lvlJc w:val="left"/>
+      <w:pPr>
+        <w:tabs>
+          <w:tab w:val="num" w:pos="2160"/>
+        </w:tabs>
+        <w:ind w:left="2160" w:hanging="360"/>
+      </w:pPr>
+      <w:rPr>
+        <w:rFonts w:ascii="Wingdings" w:hAnsi="Wingdings" w:hint="default"/>
+        <w:sz w:val="20"/>
+      </w:rPr>
+    </w:lvl>
+    <w:lvl w:ilvl="3" w:tentative="1">
+      <w:start w:val="1"/>
+      <w:numFmt w:val="bullet"/>
+      <w:lvlText w:val=""/>
+      <w:lvlJc w:val="left"/>
+      <w:pPr>
+        <w:tabs>
+          <w:tab w:val="num" w:pos="2880"/>
+        </w:tabs>
+        <w:ind w:left="2880" w:hanging="360"/>
+      </w:pPr>
+      <w:rPr>
+        <w:rFonts w:ascii="Wingdings" w:hAnsi="Wingdings" w:hint="default"/>
+        <w:sz w:val="20"/>
+      </w:rPr>
+    </w:lvl>
+    <w:lvl w:ilvl="4" w:tentative="1">
+      <w:start w:val="1"/>
+      <w:numFmt w:val="bullet"/>
+      <w:lvlText w:val=""/>
+      <w:lvlJc w:val="left"/>
+      <w:pPr>
+        <w:tabs>
+          <w:tab w:val="num" w:pos="3600"/>
+        </w:tabs>
+        <w:ind w:left="3600" w:hanging="360"/>
+      </w:pPr>
+      <w:rPr>
+        <w:rFonts w:ascii="Wingdings" w:hAnsi="Wingdings" w:hint="default"/>
+        <w:sz w:val="20"/>
+      </w:rPr>
+    </w:lvl>
+    <w:lvl w:ilvl="5" w:tentative="1">
+      <w:start w:val="1"/>
+      <w:numFmt w:val="bullet"/>
+      <w:lvlText w:val=""/>
+      <w:lvlJc w:val="left"/>
+      <w:pPr>
+        <w:tabs>
+          <w:tab w:val="num" w:pos="4320"/>
+        </w:tabs>
+        <w:ind w:left="4320" w:hanging="360"/>
+      </w:pPr>
+      <w:rPr>
+        <w:rFonts w:ascii="Wingdings" w:hAnsi="Wingdings" w:hint="default"/>
+        <w:sz w:val="20"/>
+      </w:rPr>
+    </w:lvl>
+    <w:lvl w:ilvl="6" w:tentative="1">
+      <w:start w:val="1"/>
+      <w:numFmt w:val="bullet"/>
+      <w:lvlText w:val=""/>
+      <w:lvlJc w:val="left"/>
+      <w:pPr>
+        <w:tabs>
+          <w:tab w:val="num" w:pos="5040"/>
+        </w:tabs>
+        <w:ind w:left="5040" w:hanging="360"/>
+      </w:pPr>
+      <w:rPr>
+        <w:rFonts w:ascii="Wingdings" w:hAnsi="Wingdings" w:hint="default"/>
+        <w:sz w:val="20"/>
+      </w:rPr>
+    </w:lvl>
+    <w:lvl w:ilvl="7" w:tentative="1">
+      <w:start w:val="1"/>
+      <w:numFmt w:val="bullet"/>
+      <w:lvlText w:val=""/>
+      <w:lvlJc w:val="left"/>
+      <w:pPr>
+        <w:tabs>
+          <w:tab w:val="num" w:pos="5760"/>
+        </w:tabs>
+        <w:ind w:left="5760" w:hanging="360"/>
+      </w:pPr>
+      <w:rPr>
+        <w:rFonts w:ascii="Wingdings" w:hAnsi="Wingdings" w:hint="default"/>
+        <w:sz w:val="20"/>
+      </w:rPr>
+    </w:lvl>
+    <w:lvl w:ilvl="8" w:tentative="1">
+      <w:start w:val="1"/>
+      <w:numFmt w:val="bullet"/>
+      <w:lvlText w:val=""/>
+      <w:lvlJc w:val="left"/>
+      <w:pPr>
+        <w:tabs>
+          <w:tab w:val="num" w:pos="6480"/>
+        </w:tabs>
+        <w:ind w:left="6480" w:hanging="360"/>
+      </w:pPr>
+      <w:rPr>
+        <w:rFonts w:ascii="Wingdings" w:hAnsi="Wingdings" w:hint="default"/>
+        <w:sz w:val="20"/>
+      </w:rPr>
+    </w:lvl>
+  </w:abstractNum>
+  <w:abstractNum w:abstractNumId="13" w15:restartNumberingAfterBreak="0">
     <w:nsid w:val="2C4213E1"/>
     <w:multiLevelType w:val="multilevel"/>
     <w:tmpl w:val="C2442892"/>
@@ -7072,7 +8170,7 @@
       </w:rPr>
     </w:lvl>
   </w:abstractNum>
-  <w:abstractNum w:abstractNumId="12" w15:restartNumberingAfterBreak="0">
+  <w:abstractNum w:abstractNumId="14" w15:restartNumberingAfterBreak="0">
     <w:nsid w:val="2D875DB2"/>
     <w:multiLevelType w:val="multilevel"/>
     <w:tmpl w:val="6450BF7A"/>
@@ -7221,7 +8319,7 @@
       </w:rPr>
     </w:lvl>
   </w:abstractNum>
-  <w:abstractNum w:abstractNumId="13" w15:restartNumberingAfterBreak="0">
+  <w:abstractNum w:abstractNumId="15" w15:restartNumberingAfterBreak="0">
     <w:nsid w:val="2EDC66D7"/>
     <w:multiLevelType w:val="multilevel"/>
     <w:tmpl w:val="484CDF84"/>
@@ -7370,7 +8468,7 @@
       </w:rPr>
     </w:lvl>
   </w:abstractNum>
-  <w:abstractNum w:abstractNumId="14" w15:restartNumberingAfterBreak="0">
+  <w:abstractNum w:abstractNumId="16" w15:restartNumberingAfterBreak="0">
     <w:nsid w:val="2F3960A5"/>
     <w:multiLevelType w:val="multilevel"/>
     <w:tmpl w:val="C5E2EACE"/>
@@ -7519,7 +8617,7 @@
       </w:rPr>
     </w:lvl>
   </w:abstractNum>
-  <w:abstractNum w:abstractNumId="15" w15:restartNumberingAfterBreak="0">
+  <w:abstractNum w:abstractNumId="17" w15:restartNumberingAfterBreak="0">
     <w:nsid w:val="3CEB3B07"/>
     <w:multiLevelType w:val="multilevel"/>
     <w:tmpl w:val="6C903DEA"/>
@@ -7668,7 +8766,7 @@
       </w:rPr>
     </w:lvl>
   </w:abstractNum>
-  <w:abstractNum w:abstractNumId="16" w15:restartNumberingAfterBreak="0">
+  <w:abstractNum w:abstractNumId="18" w15:restartNumberingAfterBreak="0">
     <w:nsid w:val="3D1E6C5B"/>
     <w:multiLevelType w:val="multilevel"/>
     <w:tmpl w:val="7D5A8D26"/>
@@ -7817,7 +8915,156 @@
       </w:rPr>
     </w:lvl>
   </w:abstractNum>
-  <w:abstractNum w:abstractNumId="17" w15:restartNumberingAfterBreak="0">
+  <w:abstractNum w:abstractNumId="19" w15:restartNumberingAfterBreak="0">
+    <w:nsid w:val="3E75593D"/>
+    <w:multiLevelType w:val="multilevel"/>
+    <w:tmpl w:val="77E60D1C"/>
+    <w:lvl w:ilvl="0">
+      <w:start w:val="1"/>
+      <w:numFmt w:val="bullet"/>
+      <w:lvlText w:val=""/>
+      <w:lvlJc w:val="left"/>
+      <w:pPr>
+        <w:tabs>
+          <w:tab w:val="num" w:pos="720"/>
+        </w:tabs>
+        <w:ind w:left="720" w:hanging="360"/>
+      </w:pPr>
+      <w:rPr>
+        <w:rFonts w:ascii="Symbol" w:hAnsi="Symbol" w:hint="default"/>
+        <w:sz w:val="20"/>
+      </w:rPr>
+    </w:lvl>
+    <w:lvl w:ilvl="1" w:tentative="1">
+      <w:start w:val="1"/>
+      <w:numFmt w:val="bullet"/>
+      <w:lvlText w:val="o"/>
+      <w:lvlJc w:val="left"/>
+      <w:pPr>
+        <w:tabs>
+          <w:tab w:val="num" w:pos="1440"/>
+        </w:tabs>
+        <w:ind w:left="1440" w:hanging="360"/>
+      </w:pPr>
+      <w:rPr>
+        <w:rFonts w:ascii="Courier New" w:hAnsi="Courier New" w:hint="default"/>
+        <w:sz w:val="20"/>
+      </w:rPr>
+    </w:lvl>
+    <w:lvl w:ilvl="2" w:tentative="1">
+      <w:start w:val="1"/>
+      <w:numFmt w:val="bullet"/>
+      <w:lvlText w:val=""/>
+      <w:lvlJc w:val="left"/>
+      <w:pPr>
+        <w:tabs>
+          <w:tab w:val="num" w:pos="2160"/>
+        </w:tabs>
+        <w:ind w:left="2160" w:hanging="360"/>
+      </w:pPr>
+      <w:rPr>
+        <w:rFonts w:ascii="Wingdings" w:hAnsi="Wingdings" w:hint="default"/>
+        <w:sz w:val="20"/>
+      </w:rPr>
+    </w:lvl>
+    <w:lvl w:ilvl="3" w:tentative="1">
+      <w:start w:val="1"/>
+      <w:numFmt w:val="bullet"/>
+      <w:lvlText w:val=""/>
+      <w:lvlJc w:val="left"/>
+      <w:pPr>
+        <w:tabs>
+          <w:tab w:val="num" w:pos="2880"/>
+        </w:tabs>
+        <w:ind w:left="2880" w:hanging="360"/>
+      </w:pPr>
+      <w:rPr>
+        <w:rFonts w:ascii="Wingdings" w:hAnsi="Wingdings" w:hint="default"/>
+        <w:sz w:val="20"/>
+      </w:rPr>
+    </w:lvl>
+    <w:lvl w:ilvl="4" w:tentative="1">
+      <w:start w:val="1"/>
+      <w:numFmt w:val="bullet"/>
+      <w:lvlText w:val=""/>
+      <w:lvlJc w:val="left"/>
+      <w:pPr>
+        <w:tabs>
+          <w:tab w:val="num" w:pos="3600"/>
+        </w:tabs>
+        <w:ind w:left="3600" w:hanging="360"/>
+      </w:pPr>
+      <w:rPr>
+        <w:rFonts w:ascii="Wingdings" w:hAnsi="Wingdings" w:hint="default"/>
+        <w:sz w:val="20"/>
+      </w:rPr>
+    </w:lvl>
+    <w:lvl w:ilvl="5" w:tentative="1">
+      <w:start w:val="1"/>
+      <w:numFmt w:val="bullet"/>
+      <w:lvlText w:val=""/>
+      <w:lvlJc w:val="left"/>
+      <w:pPr>
+        <w:tabs>
+          <w:tab w:val="num" w:pos="4320"/>
+        </w:tabs>
+        <w:ind w:left="4320" w:hanging="360"/>
+      </w:pPr>
+      <w:rPr>
+        <w:rFonts w:ascii="Wingdings" w:hAnsi="Wingdings" w:hint="default"/>
+        <w:sz w:val="20"/>
+      </w:rPr>
+    </w:lvl>
+    <w:lvl w:ilvl="6" w:tentative="1">
+      <w:start w:val="1"/>
+      <w:numFmt w:val="bullet"/>
+      <w:lvlText w:val=""/>
+      <w:lvlJc w:val="left"/>
+      <w:pPr>
+        <w:tabs>
+          <w:tab w:val="num" w:pos="5040"/>
+        </w:tabs>
+        <w:ind w:left="5040" w:hanging="360"/>
+      </w:pPr>
+      <w:rPr>
+        <w:rFonts w:ascii="Wingdings" w:hAnsi="Wingdings" w:hint="default"/>
+        <w:sz w:val="20"/>
+      </w:rPr>
+    </w:lvl>
+    <w:lvl w:ilvl="7" w:tentative="1">
+      <w:start w:val="1"/>
+      <w:numFmt w:val="bullet"/>
+      <w:lvlText w:val=""/>
+      <w:lvlJc w:val="left"/>
+      <w:pPr>
+        <w:tabs>
+          <w:tab w:val="num" w:pos="5760"/>
+        </w:tabs>
+        <w:ind w:left="5760" w:hanging="360"/>
+      </w:pPr>
+      <w:rPr>
+        <w:rFonts w:ascii="Wingdings" w:hAnsi="Wingdings" w:hint="default"/>
+        <w:sz w:val="20"/>
+      </w:rPr>
+    </w:lvl>
+    <w:lvl w:ilvl="8" w:tentative="1">
+      <w:start w:val="1"/>
+      <w:numFmt w:val="bullet"/>
+      <w:lvlText w:val=""/>
+      <w:lvlJc w:val="left"/>
+      <w:pPr>
+        <w:tabs>
+          <w:tab w:val="num" w:pos="6480"/>
+        </w:tabs>
+        <w:ind w:left="6480" w:hanging="360"/>
+      </w:pPr>
+      <w:rPr>
+        <w:rFonts w:ascii="Wingdings" w:hAnsi="Wingdings" w:hint="default"/>
+        <w:sz w:val="20"/>
+      </w:rPr>
+    </w:lvl>
+  </w:abstractNum>
+  <w:abstractNum w:abstractNumId="20" w15:restartNumberingAfterBreak="0">
     <w:nsid w:val="3FE16A64"/>
     <w:multiLevelType w:val="multilevel"/>
     <w:tmpl w:val="BAF6EC1C"/>
@@ -7966,7 +9213,120 @@
       </w:rPr>
     </w:lvl>
   </w:abstractNum>
-  <w:abstractNum w:abstractNumId="18" w15:restartNumberingAfterBreak="0">
+  <w:abstractNum w:abstractNumId="21" w15:restartNumberingAfterBreak="0">
+    <w:nsid w:val="485658D2"/>
+    <w:multiLevelType w:val="hybridMultilevel"/>
+    <w:tmpl w:val="62946024"/>
+    <w:lvl w:ilvl="0" w:tplc="04090001">
+      <w:start w:val="1"/>
+      <w:numFmt w:val="bullet"/>
+      <w:lvlText w:val=""/>
+      <w:lvlJc w:val="left"/>
+      <w:pPr>
+        <w:ind w:left="720" w:hanging="360"/>
+      </w:pPr>
+      <w:rPr>
+        <w:rFonts w:ascii="Symbol" w:hAnsi="Symbol" w:hint="default"/>
+      </w:rPr>
+    </w:lvl>
+    <w:lvl w:ilvl="1" w:tplc="04090003" w:tentative="1">
+      <w:start w:val="1"/>
+      <w:numFmt w:val="bullet"/>
+      <w:lvlText w:val="o"/>
+      <w:lvlJc w:val="left"/>
+      <w:pPr>
+        <w:ind w:left="1440" w:hanging="360"/>
+      </w:pPr>
+      <w:rPr>
+        <w:rFonts w:ascii="Courier New" w:hAnsi="Courier New" w:cs="Courier New" w:hint="default"/>
+      </w:rPr>
+    </w:lvl>
+    <w:lvl w:ilvl="2" w:tplc="04090005" w:tentative="1">
+      <w:start w:val="1"/>
+      <w:numFmt w:val="bullet"/>
+      <w:lvlText w:val=""/>
+      <w:lvlJc w:val="left"/>
+      <w:pPr>
+        <w:ind w:left="2160" w:hanging="360"/>
+      </w:pPr>
+      <w:rPr>
+        <w:rFonts w:ascii="Wingdings" w:hAnsi="Wingdings" w:hint="default"/>
+      </w:rPr>
+    </w:lvl>
+    <w:lvl w:ilvl="3" w:tplc="04090001" w:tentative="1">
+      <w:start w:val="1"/>
+      <w:numFmt w:val="bullet"/>
+      <w:lvlText w:val=""/>
+      <w:lvlJc w:val="left"/>
+      <w:pPr>
+        <w:ind w:left="2880" w:hanging="360"/>
+      </w:pPr>
+      <w:rPr>
+        <w:rFonts w:ascii="Symbol" w:hAnsi="Symbol" w:hint="default"/>
+      </w:rPr>
+    </w:lvl>
+    <w:lvl w:ilvl="4" w:tplc="04090003" w:tentative="1">
+      <w:start w:val="1"/>
+      <w:numFmt w:val="bullet"/>
+      <w:lvlText w:val="o"/>
+      <w:lvlJc w:val="left"/>
+      <w:pPr>
+        <w:ind w:left="3600" w:hanging="360"/>
+      </w:pPr>
+      <w:rPr>
+        <w:rFonts w:ascii="Courier New" w:hAnsi="Courier New" w:cs="Courier New" w:hint="default"/>
+      </w:rPr>
+    </w:lvl>
+    <w:lvl w:ilvl="5" w:tplc="04090005" w:tentative="1">
+      <w:start w:val="1"/>
+      <w:numFmt w:val="bullet"/>
+      <w:lvlText w:val=""/>
+      <w:lvlJc w:val="left"/>
+      <w:pPr>
+        <w:ind w:left="4320" w:hanging="360"/>
+      </w:pPr>
+      <w:rPr>
+        <w:rFonts w:ascii="Wingdings" w:hAnsi="Wingdings" w:hint="default"/>
+      </w:rPr>
+    </w:lvl>
+    <w:lvl w:ilvl="6" w:tplc="04090001" w:tentative="1">
+      <w:start w:val="1"/>
+      <w:numFmt w:val="bullet"/>
+      <w:lvlText w:val=""/>
+      <w:lvlJc w:val="left"/>
+      <w:pPr>
+        <w:ind w:left="5040" w:hanging="360"/>
+      </w:pPr>
+      <w:rPr>
+        <w:rFonts w:ascii="Symbol" w:hAnsi="Symbol" w:hint="default"/>
+      </w:rPr>
+    </w:lvl>
+    <w:lvl w:ilvl="7" w:tplc="04090003" w:tentative="1">
+      <w:start w:val="1"/>
+      <w:numFmt w:val="bullet"/>
+      <w:lvlText w:val="o"/>
+      <w:lvlJc w:val="left"/>
+      <w:pPr>
+        <w:ind w:left="5760" w:hanging="360"/>
+      </w:pPr>
+      <w:rPr>
+        <w:rFonts w:ascii="Courier New" w:hAnsi="Courier New" w:cs="Courier New" w:hint="default"/>
+      </w:rPr>
+    </w:lvl>
+    <w:lvl w:ilvl="8" w:tplc="04090005" w:tentative="1">
+      <w:start w:val="1"/>
+      <w:numFmt w:val="bullet"/>
+      <w:lvlText w:val=""/>
+      <w:lvlJc w:val="left"/>
+      <w:pPr>
+        <w:ind w:left="6480" w:hanging="360"/>
+      </w:pPr>
+      <w:rPr>
+        <w:rFonts w:ascii="Wingdings" w:hAnsi="Wingdings" w:hint="default"/>
+      </w:rPr>
+    </w:lvl>
+  </w:abstractNum>
+  <w:abstractNum w:abstractNumId="22" w15:restartNumberingAfterBreak="0">
     <w:nsid w:val="4D6C676B"/>
     <w:multiLevelType w:val="multilevel"/>
     <w:tmpl w:val="864695D8"/>
@@ -8115,7 +9475,7 @@
       </w:rPr>
     </w:lvl>
   </w:abstractNum>
-  <w:abstractNum w:abstractNumId="19" w15:restartNumberingAfterBreak="0">
+  <w:abstractNum w:abstractNumId="23" w15:restartNumberingAfterBreak="0">
     <w:nsid w:val="4EC51907"/>
     <w:multiLevelType w:val="multilevel"/>
     <w:tmpl w:val="B9D0FF78"/>
@@ -8264,7 +9624,7 @@
       </w:rPr>
     </w:lvl>
   </w:abstractNum>
-  <w:abstractNum w:abstractNumId="20" w15:restartNumberingAfterBreak="0">
+  <w:abstractNum w:abstractNumId="24" w15:restartNumberingAfterBreak="0">
     <w:nsid w:val="53F5143F"/>
     <w:multiLevelType w:val="hybridMultilevel"/>
     <w:tmpl w:val="B2005722"/>
@@ -8377,7 +9737,7 @@
       </w:rPr>
     </w:lvl>
   </w:abstractNum>
-  <w:abstractNum w:abstractNumId="21" w15:restartNumberingAfterBreak="0">
+  <w:abstractNum w:abstractNumId="25" w15:restartNumberingAfterBreak="0">
     <w:nsid w:val="5418548D"/>
     <w:multiLevelType w:val="multilevel"/>
     <w:tmpl w:val="F3745D64"/>
@@ -8526,7 +9886,120 @@
       </w:rPr>
     </w:lvl>
   </w:abstractNum>
-  <w:abstractNum w:abstractNumId="22" w15:restartNumberingAfterBreak="0">
+  <w:abstractNum w:abstractNumId="26" w15:restartNumberingAfterBreak="0">
+    <w:nsid w:val="54E51C22"/>
+    <w:multiLevelType w:val="hybridMultilevel"/>
+    <w:tmpl w:val="D9A89FBA"/>
+    <w:lvl w:ilvl="0" w:tplc="04090001">
+      <w:start w:val="1"/>
+      <w:numFmt w:val="bullet"/>
+      <w:lvlText w:val=""/>
+      <w:lvlJc w:val="left"/>
+      <w:pPr>
+        <w:ind w:left="720" w:hanging="360"/>
+      </w:pPr>
+      <w:rPr>
+        <w:rFonts w:ascii="Symbol" w:hAnsi="Symbol" w:hint="default"/>
+      </w:rPr>
+    </w:lvl>
+    <w:lvl w:ilvl="1" w:tplc="04090003" w:tentative="1">
+      <w:start w:val="1"/>
+      <w:numFmt w:val="bullet"/>
+      <w:lvlText w:val="o"/>
+      <w:lvlJc w:val="left"/>
+      <w:pPr>
+        <w:ind w:left="1440" w:hanging="360"/>
+      </w:pPr>
+      <w:rPr>
+        <w:rFonts w:ascii="Courier New" w:hAnsi="Courier New" w:cs="Courier New" w:hint="default"/>
+      </w:rPr>
+    </w:lvl>
+    <w:lvl w:ilvl="2" w:tplc="04090005" w:tentative="1">
+      <w:start w:val="1"/>
+      <w:numFmt w:val="bullet"/>
+      <w:lvlText w:val=""/>
+      <w:lvlJc w:val="left"/>
+      <w:pPr>
+        <w:ind w:left="2160" w:hanging="360"/>
+      </w:pPr>
+      <w:rPr>
+        <w:rFonts w:ascii="Wingdings" w:hAnsi="Wingdings" w:hint="default"/>
+      </w:rPr>
+    </w:lvl>
+    <w:lvl w:ilvl="3" w:tplc="04090001" w:tentative="1">
+      <w:start w:val="1"/>
+      <w:numFmt w:val="bullet"/>
+      <w:lvlText w:val=""/>
+      <w:lvlJc w:val="left"/>
+      <w:pPr>
+        <w:ind w:left="2880" w:hanging="360"/>
+      </w:pPr>
+      <w:rPr>
+        <w:rFonts w:ascii="Symbol" w:hAnsi="Symbol" w:hint="default"/>
+      </w:rPr>
+    </w:lvl>
+    <w:lvl w:ilvl="4" w:tplc="04090003" w:tentative="1">
+      <w:start w:val="1"/>
+      <w:numFmt w:val="bullet"/>
+      <w:lvlText w:val="o"/>
+      <w:lvlJc w:val="left"/>
+      <w:pPr>
+        <w:ind w:left="3600" w:hanging="360"/>
+      </w:pPr>
+      <w:rPr>
+        <w:rFonts w:ascii="Courier New" w:hAnsi="Courier New" w:cs="Courier New" w:hint="default"/>
+      </w:rPr>
+    </w:lvl>
+    <w:lvl w:ilvl="5" w:tplc="04090005" w:tentative="1">
+      <w:start w:val="1"/>
+      <w:numFmt w:val="bullet"/>
+      <w:lvlText w:val=""/>
+      <w:lvlJc w:val="left"/>
+      <w:pPr>
+        <w:ind w:left="4320" w:hanging="360"/>
+      </w:pPr>
+      <w:rPr>
+        <w:rFonts w:ascii="Wingdings" w:hAnsi="Wingdings" w:hint="default"/>
+      </w:rPr>
+    </w:lvl>
+    <w:lvl w:ilvl="6" w:tplc="04090001" w:tentative="1">
+      <w:start w:val="1"/>
+      <w:numFmt w:val="bullet"/>
+      <w:lvlText w:val=""/>
+      <w:lvlJc w:val="left"/>
+      <w:pPr>
+        <w:ind w:left="5040" w:hanging="360"/>
+      </w:pPr>
+      <w:rPr>
+        <w:rFonts w:ascii="Symbol" w:hAnsi="Symbol" w:hint="default"/>
+      </w:rPr>
+    </w:lvl>
+    <w:lvl w:ilvl="7" w:tplc="04090003" w:tentative="1">
+      <w:start w:val="1"/>
+      <w:numFmt w:val="bullet"/>
+      <w:lvlText w:val="o"/>
+      <w:lvlJc w:val="left"/>
+      <w:pPr>
+        <w:ind w:left="5760" w:hanging="360"/>
+      </w:pPr>
+      <w:rPr>
+        <w:rFonts w:ascii="Courier New" w:hAnsi="Courier New" w:cs="Courier New" w:hint="default"/>
+      </w:rPr>
+    </w:lvl>
+    <w:lvl w:ilvl="8" w:tplc="04090005" w:tentative="1">
+      <w:start w:val="1"/>
+      <w:numFmt w:val="bullet"/>
+      <w:lvlText w:val=""/>
+      <w:lvlJc w:val="left"/>
+      <w:pPr>
+        <w:ind w:left="6480" w:hanging="360"/>
+      </w:pPr>
+      <w:rPr>
+        <w:rFonts w:ascii="Wingdings" w:hAnsi="Wingdings" w:hint="default"/>
+      </w:rPr>
+    </w:lvl>
+  </w:abstractNum>
+  <w:abstractNum w:abstractNumId="27" w15:restartNumberingAfterBreak="0">
     <w:nsid w:val="56141124"/>
     <w:multiLevelType w:val="multilevel"/>
     <w:tmpl w:val="72CECC2A"/>
@@ -8675,7 +10148,7 @@
       </w:rPr>
     </w:lvl>
   </w:abstractNum>
-  <w:abstractNum w:abstractNumId="23" w15:restartNumberingAfterBreak="0">
+  <w:abstractNum w:abstractNumId="28" w15:restartNumberingAfterBreak="0">
     <w:nsid w:val="5BD530F4"/>
     <w:multiLevelType w:val="multilevel"/>
     <w:tmpl w:val="85BE4242"/>
@@ -8824,7 +10297,7 @@
       </w:rPr>
     </w:lvl>
   </w:abstractNum>
-  <w:abstractNum w:abstractNumId="24" w15:restartNumberingAfterBreak="0">
+  <w:abstractNum w:abstractNumId="29" w15:restartNumberingAfterBreak="0">
     <w:nsid w:val="5F797678"/>
     <w:multiLevelType w:val="multilevel"/>
     <w:tmpl w:val="4BE291F8"/>
@@ -8973,7 +10446,7 @@
       </w:rPr>
     </w:lvl>
   </w:abstractNum>
-  <w:abstractNum w:abstractNumId="25" w15:restartNumberingAfterBreak="0">
+  <w:abstractNum w:abstractNumId="30" w15:restartNumberingAfterBreak="0">
     <w:nsid w:val="64B00720"/>
     <w:multiLevelType w:val="multilevel"/>
     <w:tmpl w:val="ECA4E594"/>
@@ -9122,7 +10595,7 @@
       </w:rPr>
     </w:lvl>
   </w:abstractNum>
-  <w:abstractNum w:abstractNumId="26" w15:restartNumberingAfterBreak="0">
+  <w:abstractNum w:abstractNumId="31" w15:restartNumberingAfterBreak="0">
     <w:nsid w:val="64D8791F"/>
     <w:multiLevelType w:val="multilevel"/>
     <w:tmpl w:val="C818DFEE"/>
@@ -9271,7 +10744,7 @@
       </w:rPr>
     </w:lvl>
   </w:abstractNum>
-  <w:abstractNum w:abstractNumId="27" w15:restartNumberingAfterBreak="0">
+  <w:abstractNum w:abstractNumId="32" w15:restartNumberingAfterBreak="0">
     <w:nsid w:val="6D3E2179"/>
     <w:multiLevelType w:val="multilevel"/>
     <w:tmpl w:val="CAE0758E"/>
@@ -9420,7 +10893,120 @@
       </w:rPr>
     </w:lvl>
   </w:abstractNum>
-  <w:abstractNum w:abstractNumId="28" w15:restartNumberingAfterBreak="0">
+  <w:abstractNum w:abstractNumId="33" w15:restartNumberingAfterBreak="0">
+    <w:nsid w:val="73042D32"/>
+    <w:multiLevelType w:val="hybridMultilevel"/>
+    <w:tmpl w:val="1EF05924"/>
+    <w:lvl w:ilvl="0" w:tplc="04090001">
+      <w:start w:val="1"/>
+      <w:numFmt w:val="bullet"/>
+      <w:lvlText w:val=""/>
+      <w:lvlJc w:val="left"/>
+      <w:pPr>
+        <w:ind w:left="720" w:hanging="360"/>
+      </w:pPr>
+      <w:rPr>
+        <w:rFonts w:ascii="Symbol" w:hAnsi="Symbol" w:hint="default"/>
+      </w:rPr>
+    </w:lvl>
+    <w:lvl w:ilvl="1" w:tplc="04090003" w:tentative="1">
+      <w:start w:val="1"/>
+      <w:numFmt w:val="bullet"/>
+      <w:lvlText w:val="o"/>
+      <w:lvlJc w:val="left"/>
+      <w:pPr>
+        <w:ind w:left="1440" w:hanging="360"/>
+      </w:pPr>
+      <w:rPr>
+        <w:rFonts w:ascii="Courier New" w:hAnsi="Courier New" w:cs="Courier New" w:hint="default"/>
+      </w:rPr>
+    </w:lvl>
+    <w:lvl w:ilvl="2" w:tplc="04090005" w:tentative="1">
+      <w:start w:val="1"/>
+      <w:numFmt w:val="bullet"/>
+      <w:lvlText w:val=""/>
+      <w:lvlJc w:val="left"/>
+      <w:pPr>
+        <w:ind w:left="2160" w:hanging="360"/>
+      </w:pPr>
+      <w:rPr>
+        <w:rFonts w:ascii="Wingdings" w:hAnsi="Wingdings" w:hint="default"/>
+      </w:rPr>
+    </w:lvl>
+    <w:lvl w:ilvl="3" w:tplc="04090001" w:tentative="1">
+      <w:start w:val="1"/>
+      <w:numFmt w:val="bullet"/>
+      <w:lvlText w:val=""/>
+      <w:lvlJc w:val="left"/>
+      <w:pPr>
+        <w:ind w:left="2880" w:hanging="360"/>
+      </w:pPr>
+      <w:rPr>
+        <w:rFonts w:ascii="Symbol" w:hAnsi="Symbol" w:hint="default"/>
+      </w:rPr>
+    </w:lvl>
+    <w:lvl w:ilvl="4" w:tplc="04090003" w:tentative="1">
+      <w:start w:val="1"/>
+      <w:numFmt w:val="bullet"/>
+      <w:lvlText w:val="o"/>
+      <w:lvlJc w:val="left"/>
+      <w:pPr>
+        <w:ind w:left="3600" w:hanging="360"/>
+      </w:pPr>
+      <w:rPr>
+        <w:rFonts w:ascii="Courier New" w:hAnsi="Courier New" w:cs="Courier New" w:hint="default"/>
+      </w:rPr>
+    </w:lvl>
+    <w:lvl w:ilvl="5" w:tplc="04090005" w:tentative="1">
+      <w:start w:val="1"/>
+      <w:numFmt w:val="bullet"/>
+      <w:lvlText w:val=""/>
+      <w:lvlJc w:val="left"/>
+      <w:pPr>
+        <w:ind w:left="4320" w:hanging="360"/>
+      </w:pPr>
+      <w:rPr>
+        <w:rFonts w:ascii="Wingdings" w:hAnsi="Wingdings" w:hint="default"/>
+      </w:rPr>
+    </w:lvl>
+    <w:lvl w:ilvl="6" w:tplc="04090001" w:tentative="1">
+      <w:start w:val="1"/>
+      <w:numFmt w:val="bullet"/>
+      <w:lvlText w:val=""/>
+      <w:lvlJc w:val="left"/>
+      <w:pPr>
+        <w:ind w:left="5040" w:hanging="360"/>
+      </w:pPr>
+      <w:rPr>
+        <w:rFonts w:ascii="Symbol" w:hAnsi="Symbol" w:hint="default"/>
+      </w:rPr>
+    </w:lvl>
+    <w:lvl w:ilvl="7" w:tplc="04090003" w:tentative="1">
+      <w:start w:val="1"/>
+      <w:numFmt w:val="bullet"/>
+      <w:lvlText w:val="o"/>
+      <w:lvlJc w:val="left"/>
+      <w:pPr>
+        <w:ind w:left="5760" w:hanging="360"/>
+      </w:pPr>
+      <w:rPr>
+        <w:rFonts w:ascii="Courier New" w:hAnsi="Courier New" w:cs="Courier New" w:hint="default"/>
+      </w:rPr>
+    </w:lvl>
+    <w:lvl w:ilvl="8" w:tplc="04090005" w:tentative="1">
+      <w:start w:val="1"/>
+      <w:numFmt w:val="bullet"/>
+      <w:lvlText w:val=""/>
+      <w:lvlJc w:val="left"/>
+      <w:pPr>
+        <w:ind w:left="6480" w:hanging="360"/>
+      </w:pPr>
+      <w:rPr>
+        <w:rFonts w:ascii="Wingdings" w:hAnsi="Wingdings" w:hint="default"/>
+      </w:rPr>
+    </w:lvl>
+  </w:abstractNum>
+  <w:abstractNum w:abstractNumId="34" w15:restartNumberingAfterBreak="0">
     <w:nsid w:val="77AE223B"/>
     <w:multiLevelType w:val="multilevel"/>
     <w:tmpl w:val="E7AC683A"/>
@@ -9569,7 +11155,7 @@
       </w:rPr>
     </w:lvl>
   </w:abstractNum>
-  <w:abstractNum w:abstractNumId="29" w15:restartNumberingAfterBreak="0">
+  <w:abstractNum w:abstractNumId="35" w15:restartNumberingAfterBreak="0">
     <w:nsid w:val="7C261037"/>
     <w:multiLevelType w:val="multilevel"/>
     <w:tmpl w:val="910E7076"/>
@@ -9718,7 +11304,7 @@
       </w:rPr>
     </w:lvl>
   </w:abstractNum>
-  <w:abstractNum w:abstractNumId="30" w15:restartNumberingAfterBreak="0">
+  <w:abstractNum w:abstractNumId="36" w15:restartNumberingAfterBreak="0">
     <w:nsid w:val="7C3B2547"/>
     <w:multiLevelType w:val="multilevel"/>
     <w:tmpl w:val="B18CE0AE"/>
@@ -9867,7 +11453,7 @@
       </w:rPr>
     </w:lvl>
   </w:abstractNum>
-  <w:abstractNum w:abstractNumId="31" w15:restartNumberingAfterBreak="0">
+  <w:abstractNum w:abstractNumId="37" w15:restartNumberingAfterBreak="0">
     <w:nsid w:val="7C495741"/>
     <w:multiLevelType w:val="multilevel"/>
     <w:tmpl w:val="31921748"/>
@@ -9981,100 +11567,118 @@
     </w:lvl>
   </w:abstractNum>
   <w:num w:numId="1">
-    <w:abstractNumId w:val="10"/>
+    <w:abstractNumId w:val="11"/>
   </w:num>
   <w:num w:numId="2">
-    <w:abstractNumId w:val="5"/>
+    <w:abstractNumId w:val="6"/>
   </w:num>
   <w:num w:numId="3">
-    <w:abstractNumId w:val="17"/>
+    <w:abstractNumId w:val="20"/>
   </w:num>
   <w:num w:numId="4">
-    <w:abstractNumId w:val="22"/>
+    <w:abstractNumId w:val="27"/>
   </w:num>
   <w:num w:numId="5">
     <w:abstractNumId w:val="1"/>
   </w:num>
   <w:num w:numId="6">
-    <w:abstractNumId w:val="29"/>
+    <w:abstractNumId w:val="35"/>
   </w:num>
   <w:num w:numId="7">
-    <w:abstractNumId w:val="30"/>
+    <w:abstractNumId w:val="36"/>
   </w:num>
   <w:num w:numId="8">
-    <w:abstractNumId w:val="28"/>
+    <w:abstractNumId w:val="34"/>
   </w:num>
   <w:num w:numId="9">
     <w:abstractNumId w:val="2"/>
   </w:num>
   <w:num w:numId="10">
+    <w:abstractNumId w:val="8"/>
+  </w:num>
+  <w:num w:numId="11">
+    <w:abstractNumId w:val="28"/>
+  </w:num>
+  <w:num w:numId="12">
+    <w:abstractNumId w:val="13"/>
+  </w:num>
+  <w:num w:numId="13">
+    <w:abstractNumId w:val="32"/>
+  </w:num>
+  <w:num w:numId="14">
+    <w:abstractNumId w:val="9"/>
+  </w:num>
+  <w:num w:numId="15">
+    <w:abstractNumId w:val="24"/>
+  </w:num>
+  <w:num w:numId="16">
     <w:abstractNumId w:val="7"/>
   </w:num>
-  <w:num w:numId="11">
-    <w:abstractNumId w:val="23"/>
-  </w:num>
-  <w:num w:numId="12">
-    <w:abstractNumId w:val="11"/>
-  </w:num>
-  <w:num w:numId="13">
-    <w:abstractNumId w:val="27"/>
-  </w:num>
-  <w:num w:numId="14">
-    <w:abstractNumId w:val="8"/>
-  </w:num>
-  <w:num w:numId="15">
-    <w:abstractNumId w:val="20"/>
-  </w:num>
-  <w:num w:numId="16">
-    <w:abstractNumId w:val="6"/>
-  </w:num>
   <w:num w:numId="17">
-    <w:abstractNumId w:val="31"/>
+    <w:abstractNumId w:val="37"/>
   </w:num>
   <w:num w:numId="18">
-    <w:abstractNumId w:val="18"/>
+    <w:abstractNumId w:val="22"/>
   </w:num>
   <w:num w:numId="19">
     <w:abstractNumId w:val="0"/>
   </w:num>
   <w:num w:numId="20">
-    <w:abstractNumId w:val="19"/>
+    <w:abstractNumId w:val="23"/>
   </w:num>
   <w:num w:numId="21">
-    <w:abstractNumId w:val="26"/>
+    <w:abstractNumId w:val="31"/>
   </w:num>
   <w:num w:numId="22">
-    <w:abstractNumId w:val="16"/>
+    <w:abstractNumId w:val="18"/>
   </w:num>
   <w:num w:numId="23">
-    <w:abstractNumId w:val="13"/>
+    <w:abstractNumId w:val="15"/>
   </w:num>
   <w:num w:numId="24">
-    <w:abstractNumId w:val="21"/>
+    <w:abstractNumId w:val="25"/>
   </w:num>
   <w:num w:numId="25">
     <w:abstractNumId w:val="3"/>
   </w:num>
   <w:num w:numId="26">
-    <w:abstractNumId w:val="25"/>
+    <w:abstractNumId w:val="30"/>
   </w:num>
   <w:num w:numId="27">
-    <w:abstractNumId w:val="24"/>
+    <w:abstractNumId w:val="29"/>
   </w:num>
   <w:num w:numId="28">
+    <w:abstractNumId w:val="14"/>
+  </w:num>
+  <w:num w:numId="29">
+    <w:abstractNumId w:val="10"/>
+  </w:num>
+  <w:num w:numId="30">
+    <w:abstractNumId w:val="5"/>
+  </w:num>
+  <w:num w:numId="31">
+    <w:abstractNumId w:val="16"/>
+  </w:num>
+  <w:num w:numId="32">
+    <w:abstractNumId w:val="17"/>
+  </w:num>
+  <w:num w:numId="33">
     <w:abstractNumId w:val="12"/>
   </w:num>
-  <w:num w:numId="29">
-    <w:abstractNumId w:val="9"/>
+  <w:num w:numId="34">
+    <w:abstractNumId w:val="19"/>
   </w:num>
-  <w:num w:numId="30">
+  <w:num w:numId="35">
+    <w:abstractNumId w:val="21"/>
+  </w:num>
+  <w:num w:numId="36">
+    <w:abstractNumId w:val="26"/>
+  </w:num>
+  <w:num w:numId="37">
     <w:abstractNumId w:val="4"/>
   </w:num>
-  <w:num w:numId="31">
-    <w:abstractNumId w:val="14"/>
-  </w:num>
-  <w:num w:numId="32">
-    <w:abstractNumId w:val="15"/>
+  <w:num w:numId="38">
+    <w:abstractNumId w:val="33"/>
   </w:num>
   <w:numIdMacAtCleanup w:val="32"/>
 </w:numbering>
@@ -10473,7 +12077,7 @@
   <w:style w:type="paragraph" w:default="1" w:styleId="Normal">
     <w:name w:val="Normal"/>
     <w:qFormat/>
-    <w:rsid w:val="000C21C5"/>
+    <w:rsid w:val="00007D94"/>
   </w:style>
   <w:style w:type="paragraph" w:styleId="Heading2">
     <w:name w:val="heading 2"/>
@@ -10887,7 +12491,7 @@
 </file>
 
 <file path=customXml/itemProps1.xml><?xml version="1.0" encoding="utf-8"?>
-<ds:datastoreItem xmlns:ds="http://schemas.openxmlformats.org/officeDocument/2006/customXml" ds:itemID="{878C51EF-5E0D-4106-8C17-259EF6EA05C3}">
+<ds:datastoreItem xmlns:ds="http://schemas.openxmlformats.org/officeDocument/2006/customXml" ds:itemID="{EE7ED8EF-14A9-47A1-89FD-CB334C83C2DC}">
   <ds:schemaRefs>
     <ds:schemaRef ds:uri="http://schemas.openxmlformats.org/officeDocument/2006/bibliography"/>
   </ds:schemaRefs>

</xml_diff>

<commit_message>
Ingestion UI flow, dashboard layout refinements, and frontend architecture alignment
</commit_message>
<xml_diff>
--- a/docs/01_Daily_Log.docx
+++ b/docs/01_Daily_Log.docx
@@ -6095,18 +6095,1602 @@
       <w:r>
         <w:t>Extend the dashboard interaction model with advanced filtering, drill-down, and persistence capabilities.</w:t>
       </w:r>
+    </w:p>
+    <w:p>
+      <w:pPr>
+        <w:spacing w:before="100" w:beforeAutospacing="1" w:after="100" w:afterAutospacing="1" w:line="240" w:lineRule="auto"/>
+        <w:rPr>
+          <w:rFonts w:ascii="Times New Roman" w:eastAsia="Times New Roman" w:hAnsi="Times New Roman" w:cs="Times New Roman"/>
+          <w:sz w:val="24"/>
+          <w:szCs w:val="24"/>
+        </w:rPr>
+      </w:pPr>
+    </w:p>
+    <w:p>
+      <w:pPr>
+        <w:spacing w:before="100" w:beforeAutospacing="1" w:after="100" w:afterAutospacing="1" w:line="240" w:lineRule="auto"/>
+        <w:outlineLvl w:val="1"/>
+        <w:rPr>
+          <w:rFonts w:ascii="Times New Roman" w:eastAsia="Times New Roman" w:hAnsi="Times New Roman" w:cs="Times New Roman"/>
+          <w:b/>
+          <w:sz w:val="24"/>
+          <w:szCs w:val="24"/>
+        </w:rPr>
+      </w:pPr>
+      <w:r>
+        <w:rPr>
+          <w:rFonts w:ascii="Times New Roman" w:eastAsia="Times New Roman" w:hAnsi="Times New Roman" w:cs="Times New Roman"/>
+          <w:b/>
+          <w:bCs/>
+          <w:sz w:val="24"/>
+          <w:szCs w:val="24"/>
+        </w:rPr>
+        <w:lastRenderedPageBreak/>
+        <w:t>Date:</w:t>
+      </w:r>
+      <w:r>
+        <w:rPr>
+          <w:rFonts w:ascii="Times New Roman" w:eastAsia="Times New Roman" w:hAnsi="Times New Roman" w:cs="Times New Roman"/>
+          <w:b/>
+          <w:sz w:val="24"/>
+          <w:szCs w:val="24"/>
+        </w:rPr>
+        <w:t xml:space="preserve"> </w:t>
+      </w:r>
+      <w:r>
+        <w:rPr>
+          <w:rFonts w:ascii="Times New Roman" w:eastAsia="Times New Roman" w:hAnsi="Times New Roman" w:cs="Times New Roman"/>
+          <w:b/>
+          <w:sz w:val="24"/>
+          <w:szCs w:val="24"/>
+        </w:rPr>
+        <w:t>21</w:t>
+      </w:r>
+      <w:r>
+        <w:rPr>
+          <w:rFonts w:ascii="Times New Roman" w:eastAsia="Times New Roman" w:hAnsi="Times New Roman" w:cs="Times New Roman"/>
+          <w:b/>
+          <w:sz w:val="24"/>
+          <w:szCs w:val="24"/>
+        </w:rPr>
+        <w:t>/01/2026                                                                                                          Day 1</w:t>
+      </w:r>
+      <w:r>
+        <w:rPr>
+          <w:rFonts w:ascii="Times New Roman" w:eastAsia="Times New Roman" w:hAnsi="Times New Roman" w:cs="Times New Roman"/>
+          <w:b/>
+          <w:sz w:val="24"/>
+          <w:szCs w:val="24"/>
+        </w:rPr>
+        <w:t>1</w:t>
+      </w:r>
+      <w:r>
+        <w:rPr>
+          <w:rFonts w:ascii="Times New Roman" w:eastAsia="Times New Roman" w:hAnsi="Times New Roman" w:cs="Times New Roman"/>
+          <w:b/>
+          <w:sz w:val="24"/>
+          <w:szCs w:val="24"/>
+        </w:rPr>
+        <w:br/>
+      </w:r>
+      <w:r>
+        <w:rPr>
+          <w:rFonts w:ascii="Times New Roman" w:eastAsia="Times New Roman" w:hAnsi="Times New Roman" w:cs="Times New Roman"/>
+          <w:b/>
+          <w:bCs/>
+          <w:sz w:val="24"/>
+          <w:szCs w:val="24"/>
+        </w:rPr>
+        <w:t>Department:</w:t>
+      </w:r>
+      <w:r>
+        <w:rPr>
+          <w:rFonts w:ascii="Times New Roman" w:eastAsia="Times New Roman" w:hAnsi="Times New Roman" w:cs="Times New Roman"/>
+          <w:b/>
+          <w:sz w:val="24"/>
+          <w:szCs w:val="24"/>
+        </w:rPr>
+        <w:t xml:space="preserve"> Maintenance</w:t>
+      </w:r>
+      <w:r>
+        <w:rPr>
+          <w:rFonts w:ascii="Times New Roman" w:eastAsia="Times New Roman" w:hAnsi="Times New Roman" w:cs="Times New Roman"/>
+          <w:b/>
+          <w:sz w:val="24"/>
+          <w:szCs w:val="24"/>
+        </w:rPr>
+        <w:br/>
+      </w:r>
+      <w:r>
+        <w:rPr>
+          <w:rFonts w:ascii="Times New Roman" w:eastAsia="Times New Roman" w:hAnsi="Times New Roman" w:cs="Times New Roman"/>
+          <w:b/>
+          <w:bCs/>
+          <w:sz w:val="24"/>
+          <w:szCs w:val="24"/>
+        </w:rPr>
+        <w:t>Plant:</w:t>
+      </w:r>
+      <w:r>
+        <w:rPr>
+          <w:rFonts w:ascii="Times New Roman" w:eastAsia="Times New Roman" w:hAnsi="Times New Roman" w:cs="Times New Roman"/>
+          <w:b/>
+          <w:sz w:val="24"/>
+          <w:szCs w:val="24"/>
+        </w:rPr>
+        <w:t xml:space="preserve"> Drive Shaft Manufacturing</w:t>
+      </w:r>
+    </w:p>
+    <w:p>
+      <w:pPr>
+        <w:pStyle w:val="Heading3"/>
+      </w:pPr>
+      <w:r>
+        <w:rPr>
+          <w:rStyle w:val="Strong"/>
+          <w:b/>
+          <w:bCs/>
+        </w:rPr>
+        <w:t>Objective of the Day</w:t>
+      </w:r>
+    </w:p>
+    <w:p>
+      <w:pPr>
+        <w:pStyle w:val="NormalWeb"/>
+      </w:pPr>
+      <w:r>
+        <w:t>To perform operational energy data analysis using Excel, improve presentation materials, and formally define dashboard persistence design for the offline industrial data intelligence system.</w:t>
+      </w:r>
+    </w:p>
+    <w:p>
+      <w:pPr>
+        <w:pStyle w:val="Heading3"/>
+      </w:pPr>
+      <w:r>
+        <w:rPr>
+          <w:rStyle w:val="Strong"/>
+          <w:b/>
+          <w:bCs/>
+        </w:rPr>
+        <w:t>Activities Performed</w:t>
+      </w:r>
+    </w:p>
+    <w:p>
+      <w:pPr>
+        <w:pStyle w:val="NormalWeb"/>
+      </w:pPr>
+      <w:r>
+        <w:t>From 9:00 AM to 4:00 PM, worked extensively on machine energy readings and power cost analysis using operational Excel sheets.</w:t>
+      </w:r>
+      <w:r>
+        <w:t xml:space="preserve"> Entered and validated KWh and K</w:t>
+      </w:r>
+      <w:r>
+        <w:t>VAh readings for multiple machines, ensuring consistency and correctness of energy consumption data. Performed basic power cost calculations to support future analytical use and reporting.</w:t>
+      </w:r>
+    </w:p>
+    <w:p>
+      <w:pPr>
+        <w:pStyle w:val="NormalWeb"/>
+      </w:pPr>
+      <w:r>
+        <w:t>Reviewed and updated existing PowerPoint presentations related to maintenance and energy analysis. Improved UI structure, slide hierarchy, visual alignment, and readability to ensure clearer communication of technical and operational insights.</w:t>
+      </w:r>
+    </w:p>
+    <w:p>
+      <w:pPr>
+        <w:pStyle w:val="NormalWeb"/>
+      </w:pPr>
+      <w:r>
+        <w:t>Later in the day, formally resumed system design work on the dashboard module. Defined and froze the conceptual design for dashboard save functionality, treating dashboards as document-like analytical artifacts. Finalized rules governing what dashboard state should be saved, explicitly excluding transient UI states.</w:t>
+      </w:r>
+    </w:p>
+    <w:p>
+      <w:pPr>
+        <w:pStyle w:val="NormalWeb"/>
+      </w:pPr>
+      <w:r>
+        <w:t>Defined file naming conventions, storage location, and overwrite rules for saved dashboards in an offline Electron environment. Established UX behavior rules for save actions, run switching, and dashboard lifecycle management to ensure predictable and user-controlled persistence.</w:t>
+      </w:r>
+    </w:p>
+    <w:p>
+      <w:pPr>
+        <w:pStyle w:val="Heading3"/>
+      </w:pPr>
+      <w:r>
+        <w:rPr>
+          <w:rStyle w:val="Strong"/>
+          <w:b/>
+          <w:bCs/>
+        </w:rPr>
+        <w:t>Outcome of the Day</w:t>
+      </w:r>
+    </w:p>
+    <w:p>
+      <w:pPr>
+        <w:pStyle w:val="NormalWeb"/>
+      </w:pPr>
+      <w:r>
+        <w:t>Operational energy data has been consolidated and structured for future analytics. Presentation materials were improved for clarity and professionalism. Dashboard persistence design was formally frozen, preparing the system for implementation of save and load functionality in upcoming phases.</w:t>
+      </w:r>
+    </w:p>
+    <w:p>
+      <w:pPr>
+        <w:pStyle w:val="Heading3"/>
+      </w:pPr>
+      <w:r>
+        <w:rPr>
+          <w:rStyle w:val="Strong"/>
+          <w:b/>
+          <w:bCs/>
+        </w:rPr>
+        <w:t>Key Learnings</w:t>
+      </w:r>
+    </w:p>
+    <w:p>
+      <w:pPr>
+        <w:pStyle w:val="NormalWeb"/>
+      </w:pPr>
+      <w:r>
+        <w:t>Energy data analysis requires careful validation before analytical use. Treating dashboards as documents simplifies persistence and aligns with professional analytics tools. Explicit save actions prevent accidental loss or overwriting of analytical work.</w:t>
+      </w:r>
+    </w:p>
+    <w:p>
+      <w:pPr>
+        <w:pStyle w:val="Heading3"/>
+      </w:pPr>
+      <w:r>
+        <w:rPr>
+          <w:rStyle w:val="Strong"/>
+          <w:b/>
+          <w:bCs/>
+        </w:rPr>
+        <w:t>Next Steps</w:t>
+      </w:r>
+    </w:p>
+    <w:p>
+      <w:pPr>
+        <w:pStyle w:val="NormalWeb"/>
+      </w:pPr>
+      <w:r>
+        <w:t>Begin implementation of dashboard persistence based on the finalized design. Integrate energy-related KPIs into future dashboard blueprints.</w:t>
+      </w:r>
+    </w:p>
+    <w:p>
+      <w:pPr>
+        <w:spacing w:before="100" w:beforeAutospacing="1" w:after="100" w:afterAutospacing="1" w:line="240" w:lineRule="auto"/>
+        <w:outlineLvl w:val="1"/>
+        <w:rPr>
+          <w:rFonts w:ascii="Times New Roman" w:eastAsia="Times New Roman" w:hAnsi="Times New Roman" w:cs="Times New Roman"/>
+          <w:b/>
+          <w:sz w:val="24"/>
+          <w:szCs w:val="24"/>
+        </w:rPr>
+      </w:pPr>
+      <w:r>
+        <w:rPr>
+          <w:rFonts w:ascii="Times New Roman" w:eastAsia="Times New Roman" w:hAnsi="Times New Roman" w:cs="Times New Roman"/>
+          <w:b/>
+          <w:bCs/>
+          <w:sz w:val="24"/>
+          <w:szCs w:val="24"/>
+        </w:rPr>
+        <w:lastRenderedPageBreak/>
+        <w:t>Date:</w:t>
+      </w:r>
+      <w:r>
+        <w:rPr>
+          <w:rFonts w:ascii="Times New Roman" w:eastAsia="Times New Roman" w:hAnsi="Times New Roman" w:cs="Times New Roman"/>
+          <w:b/>
+          <w:sz w:val="24"/>
+          <w:szCs w:val="24"/>
+        </w:rPr>
+        <w:t xml:space="preserve"> </w:t>
+      </w:r>
+      <w:r>
+        <w:rPr>
+          <w:rFonts w:ascii="Times New Roman" w:eastAsia="Times New Roman" w:hAnsi="Times New Roman" w:cs="Times New Roman"/>
+          <w:b/>
+          <w:sz w:val="24"/>
+          <w:szCs w:val="24"/>
+        </w:rPr>
+        <w:t>22</w:t>
+      </w:r>
+      <w:r>
+        <w:rPr>
+          <w:rFonts w:ascii="Times New Roman" w:eastAsia="Times New Roman" w:hAnsi="Times New Roman" w:cs="Times New Roman"/>
+          <w:b/>
+          <w:sz w:val="24"/>
+          <w:szCs w:val="24"/>
+        </w:rPr>
+        <w:t xml:space="preserve">/01/2026                                                                                                         </w:t>
+      </w:r>
+      <w:r>
+        <w:rPr>
+          <w:rFonts w:ascii="Times New Roman" w:eastAsia="Times New Roman" w:hAnsi="Times New Roman" w:cs="Times New Roman"/>
+          <w:b/>
+          <w:sz w:val="24"/>
+          <w:szCs w:val="24"/>
+        </w:rPr>
+        <w:t xml:space="preserve">    </w:t>
+      </w:r>
+      <w:r>
+        <w:rPr>
+          <w:rFonts w:ascii="Times New Roman" w:eastAsia="Times New Roman" w:hAnsi="Times New Roman" w:cs="Times New Roman"/>
+          <w:b/>
+          <w:sz w:val="24"/>
+          <w:szCs w:val="24"/>
+        </w:rPr>
+        <w:t xml:space="preserve"> Day 1</w:t>
+      </w:r>
+      <w:r>
+        <w:rPr>
+          <w:rFonts w:ascii="Times New Roman" w:eastAsia="Times New Roman" w:hAnsi="Times New Roman" w:cs="Times New Roman"/>
+          <w:b/>
+          <w:sz w:val="24"/>
+          <w:szCs w:val="24"/>
+        </w:rPr>
+        <w:t>2</w:t>
+      </w:r>
+      <w:r>
+        <w:rPr>
+          <w:rFonts w:ascii="Times New Roman" w:eastAsia="Times New Roman" w:hAnsi="Times New Roman" w:cs="Times New Roman"/>
+          <w:b/>
+          <w:sz w:val="24"/>
+          <w:szCs w:val="24"/>
+        </w:rPr>
+        <w:br/>
+      </w:r>
+      <w:r>
+        <w:rPr>
+          <w:rFonts w:ascii="Times New Roman" w:eastAsia="Times New Roman" w:hAnsi="Times New Roman" w:cs="Times New Roman"/>
+          <w:b/>
+          <w:bCs/>
+          <w:sz w:val="24"/>
+          <w:szCs w:val="24"/>
+        </w:rPr>
+        <w:t>Department:</w:t>
+      </w:r>
+      <w:r>
+        <w:rPr>
+          <w:rFonts w:ascii="Times New Roman" w:eastAsia="Times New Roman" w:hAnsi="Times New Roman" w:cs="Times New Roman"/>
+          <w:b/>
+          <w:sz w:val="24"/>
+          <w:szCs w:val="24"/>
+        </w:rPr>
+        <w:t xml:space="preserve"> Maintenance</w:t>
+      </w:r>
+      <w:r>
+        <w:rPr>
+          <w:rFonts w:ascii="Times New Roman" w:eastAsia="Times New Roman" w:hAnsi="Times New Roman" w:cs="Times New Roman"/>
+          <w:b/>
+          <w:sz w:val="24"/>
+          <w:szCs w:val="24"/>
+        </w:rPr>
+        <w:br/>
+      </w:r>
+      <w:r>
+        <w:rPr>
+          <w:rFonts w:ascii="Times New Roman" w:eastAsia="Times New Roman" w:hAnsi="Times New Roman" w:cs="Times New Roman"/>
+          <w:b/>
+          <w:bCs/>
+          <w:sz w:val="24"/>
+          <w:szCs w:val="24"/>
+        </w:rPr>
+        <w:t>Plant:</w:t>
+      </w:r>
+      <w:r>
+        <w:rPr>
+          <w:rFonts w:ascii="Times New Roman" w:eastAsia="Times New Roman" w:hAnsi="Times New Roman" w:cs="Times New Roman"/>
+          <w:b/>
+          <w:sz w:val="24"/>
+          <w:szCs w:val="24"/>
+        </w:rPr>
+        <w:t xml:space="preserve"> Drive Shaft Manufacturing</w:t>
+      </w:r>
+    </w:p>
+    <w:p>
+      <w:pPr>
+        <w:spacing w:after="0" w:line="240" w:lineRule="auto"/>
+        <w:outlineLvl w:val="2"/>
+        <w:rPr>
+          <w:rFonts w:ascii="Times New Roman" w:eastAsia="Times New Roman" w:hAnsi="Times New Roman" w:cs="Times New Roman"/>
+          <w:b/>
+          <w:bCs/>
+          <w:sz w:val="27"/>
+          <w:szCs w:val="27"/>
+        </w:rPr>
+      </w:pPr>
+      <w:r>
+        <w:rPr>
+          <w:rFonts w:ascii="Times New Roman" w:eastAsia="Times New Roman" w:hAnsi="Times New Roman" w:cs="Times New Roman"/>
+          <w:b/>
+          <w:bCs/>
+          <w:sz w:val="27"/>
+          <w:szCs w:val="27"/>
+        </w:rPr>
+        <w:t>Objective of the Day</w:t>
+      </w:r>
+    </w:p>
+    <w:p>
+      <w:pPr>
+        <w:spacing w:after="0" w:line="240" w:lineRule="auto"/>
+        <w:rPr>
+          <w:rFonts w:ascii="Times New Roman" w:eastAsia="Times New Roman" w:hAnsi="Times New Roman" w:cs="Times New Roman"/>
+          <w:sz w:val="24"/>
+          <w:szCs w:val="24"/>
+        </w:rPr>
+      </w:pPr>
+      <w:r>
+        <w:rPr>
+          <w:rFonts w:ascii="Times New Roman" w:eastAsia="Times New Roman" w:hAnsi="Times New Roman" w:cs="Times New Roman"/>
+          <w:sz w:val="24"/>
+          <w:szCs w:val="24"/>
+        </w:rPr>
+        <w:t>To stabilize the frontend layout and dashboard interaction layer, implement Power BI–style dashboard behavior, and resolve layout and sidebar interaction issues introduced during recent UI enhancements.</w:t>
+      </w:r>
+    </w:p>
+    <w:p>
+      <w:pPr>
+        <w:spacing w:after="0" w:line="240" w:lineRule="auto"/>
+        <w:outlineLvl w:val="2"/>
+        <w:rPr>
+          <w:rFonts w:ascii="Times New Roman" w:eastAsia="Times New Roman" w:hAnsi="Times New Roman" w:cs="Times New Roman"/>
+          <w:b/>
+          <w:bCs/>
+          <w:sz w:val="27"/>
+          <w:szCs w:val="27"/>
+        </w:rPr>
+      </w:pPr>
+      <w:r>
+        <w:rPr>
+          <w:rFonts w:ascii="Times New Roman" w:eastAsia="Times New Roman" w:hAnsi="Times New Roman" w:cs="Times New Roman"/>
+          <w:b/>
+          <w:bCs/>
+          <w:sz w:val="27"/>
+          <w:szCs w:val="27"/>
+        </w:rPr>
+        <w:t>Activities Performed</w:t>
+      </w:r>
+    </w:p>
+    <w:p>
+      <w:pPr>
+        <w:numPr>
+          <w:ilvl w:val="0"/>
+          <w:numId w:val="39"/>
+        </w:numPr>
+        <w:spacing w:after="0" w:line="240" w:lineRule="auto"/>
+        <w:rPr>
+          <w:rFonts w:ascii="Times New Roman" w:eastAsia="Times New Roman" w:hAnsi="Times New Roman" w:cs="Times New Roman"/>
+          <w:sz w:val="24"/>
+          <w:szCs w:val="24"/>
+        </w:rPr>
+      </w:pPr>
+      <w:r>
+        <w:rPr>
+          <w:rFonts w:ascii="Times New Roman" w:eastAsia="Times New Roman" w:hAnsi="Times New Roman" w:cs="Times New Roman"/>
+          <w:sz w:val="24"/>
+          <w:szCs w:val="24"/>
+        </w:rPr>
+        <w:t>Reviewed the complete frontend renderer architecture after recent dashboard and sidebar enhancements.</w:t>
+      </w:r>
+    </w:p>
+    <w:p>
+      <w:pPr>
+        <w:numPr>
+          <w:ilvl w:val="0"/>
+          <w:numId w:val="39"/>
+        </w:numPr>
+        <w:spacing w:after="0" w:line="240" w:lineRule="auto"/>
+        <w:rPr>
+          <w:rFonts w:ascii="Times New Roman" w:eastAsia="Times New Roman" w:hAnsi="Times New Roman" w:cs="Times New Roman"/>
+          <w:sz w:val="24"/>
+          <w:szCs w:val="24"/>
+        </w:rPr>
+      </w:pPr>
+      <w:r>
+        <w:rPr>
+          <w:rFonts w:ascii="Times New Roman" w:eastAsia="Times New Roman" w:hAnsi="Times New Roman" w:cs="Times New Roman"/>
+          <w:sz w:val="24"/>
+          <w:szCs w:val="24"/>
+        </w:rPr>
+        <w:t>Debugged layout rendering issues caused by the introduction of sidebar collapse/expand functionality.</w:t>
+      </w:r>
+    </w:p>
+    <w:p>
+      <w:pPr>
+        <w:numPr>
+          <w:ilvl w:val="0"/>
+          <w:numId w:val="39"/>
+        </w:numPr>
+        <w:spacing w:after="0" w:line="240" w:lineRule="auto"/>
+        <w:rPr>
+          <w:rFonts w:ascii="Times New Roman" w:eastAsia="Times New Roman" w:hAnsi="Times New Roman" w:cs="Times New Roman"/>
+          <w:sz w:val="24"/>
+          <w:szCs w:val="24"/>
+        </w:rPr>
+      </w:pPr>
+      <w:r>
+        <w:rPr>
+          <w:rFonts w:ascii="Times New Roman" w:eastAsia="Times New Roman" w:hAnsi="Times New Roman" w:cs="Times New Roman"/>
+          <w:sz w:val="24"/>
+          <w:szCs w:val="24"/>
+        </w:rPr>
+        <w:t xml:space="preserve">Identified and resolved conflicts between </w:t>
+      </w:r>
+      <w:r>
+        <w:rPr>
+          <w:rFonts w:ascii="Courier New" w:eastAsia="Times New Roman" w:hAnsi="Courier New" w:cs="Courier New"/>
+          <w:sz w:val="20"/>
+          <w:szCs w:val="20"/>
+        </w:rPr>
+        <w:t>Layout.tsx</w:t>
+      </w:r>
+      <w:r>
+        <w:rPr>
+          <w:rFonts w:ascii="Times New Roman" w:eastAsia="Times New Roman" w:hAnsi="Times New Roman" w:cs="Times New Roman"/>
+          <w:sz w:val="24"/>
+          <w:szCs w:val="24"/>
+        </w:rPr>
+        <w:t xml:space="preserve">, </w:t>
+      </w:r>
+      <w:r>
+        <w:rPr>
+          <w:rFonts w:ascii="Courier New" w:eastAsia="Times New Roman" w:hAnsi="Courier New" w:cs="Courier New"/>
+          <w:sz w:val="20"/>
+          <w:szCs w:val="20"/>
+        </w:rPr>
+        <w:t>AppLayout.tsx</w:t>
+      </w:r>
+      <w:r>
+        <w:rPr>
+          <w:rFonts w:ascii="Times New Roman" w:eastAsia="Times New Roman" w:hAnsi="Times New Roman" w:cs="Times New Roman"/>
+          <w:sz w:val="24"/>
+          <w:szCs w:val="24"/>
+        </w:rPr>
+        <w:t>, and router-based outlet rendering.</w:t>
+      </w:r>
+    </w:p>
+    <w:p>
+      <w:pPr>
+        <w:numPr>
+          <w:ilvl w:val="0"/>
+          <w:numId w:val="39"/>
+        </w:numPr>
+        <w:spacing w:after="0" w:line="240" w:lineRule="auto"/>
+        <w:rPr>
+          <w:rFonts w:ascii="Times New Roman" w:eastAsia="Times New Roman" w:hAnsi="Times New Roman" w:cs="Times New Roman"/>
+          <w:sz w:val="24"/>
+          <w:szCs w:val="24"/>
+        </w:rPr>
+      </w:pPr>
+      <w:r>
+        <w:rPr>
+          <w:rFonts w:ascii="Times New Roman" w:eastAsia="Times New Roman" w:hAnsi="Times New Roman" w:cs="Times New Roman"/>
+          <w:sz w:val="24"/>
+          <w:szCs w:val="24"/>
+        </w:rPr>
+        <w:t>Refactored sidebar toggle behavior to ensure:</w:t>
+      </w:r>
+    </w:p>
+    <w:p>
+      <w:pPr>
+        <w:numPr>
+          <w:ilvl w:val="1"/>
+          <w:numId w:val="39"/>
+        </w:numPr>
+        <w:spacing w:after="0" w:line="240" w:lineRule="auto"/>
+        <w:rPr>
+          <w:rFonts w:ascii="Times New Roman" w:eastAsia="Times New Roman" w:hAnsi="Times New Roman" w:cs="Times New Roman"/>
+          <w:sz w:val="24"/>
+          <w:szCs w:val="24"/>
+        </w:rPr>
+      </w:pPr>
+      <w:r>
+        <w:rPr>
+          <w:rFonts w:ascii="Times New Roman" w:eastAsia="Times New Roman" w:hAnsi="Times New Roman" w:cs="Times New Roman"/>
+          <w:sz w:val="24"/>
+          <w:szCs w:val="24"/>
+        </w:rPr>
+        <w:t>Sidebar collapse displays only a compact toggle icon.</w:t>
+      </w:r>
+    </w:p>
+    <w:p>
+      <w:pPr>
+        <w:numPr>
+          <w:ilvl w:val="1"/>
+          <w:numId w:val="39"/>
+        </w:numPr>
+        <w:spacing w:after="0" w:line="240" w:lineRule="auto"/>
+        <w:rPr>
+          <w:rFonts w:ascii="Times New Roman" w:eastAsia="Times New Roman" w:hAnsi="Times New Roman" w:cs="Times New Roman"/>
+          <w:sz w:val="24"/>
+          <w:szCs w:val="24"/>
+        </w:rPr>
+      </w:pPr>
+      <w:r>
+        <w:rPr>
+          <w:rFonts w:ascii="Times New Roman" w:eastAsia="Times New Roman" w:hAnsi="Times New Roman" w:cs="Times New Roman"/>
+          <w:sz w:val="24"/>
+          <w:szCs w:val="24"/>
+        </w:rPr>
+        <w:t>Sidebar expansion restores the full navigation, branding, and run controls.</w:t>
+      </w:r>
+    </w:p>
+    <w:p>
+      <w:pPr>
+        <w:numPr>
+          <w:ilvl w:val="0"/>
+          <w:numId w:val="39"/>
+        </w:numPr>
+        <w:spacing w:after="0" w:line="240" w:lineRule="auto"/>
+        <w:rPr>
+          <w:rFonts w:ascii="Times New Roman" w:eastAsia="Times New Roman" w:hAnsi="Times New Roman" w:cs="Times New Roman"/>
+          <w:sz w:val="24"/>
+          <w:szCs w:val="24"/>
+        </w:rPr>
+      </w:pPr>
+      <w:r>
+        <w:rPr>
+          <w:rFonts w:ascii="Times New Roman" w:eastAsia="Times New Roman" w:hAnsi="Times New Roman" w:cs="Times New Roman"/>
+          <w:sz w:val="24"/>
+          <w:szCs w:val="24"/>
+        </w:rPr>
+        <w:t>Ensured that page content (Home, Ingestion, Insights, Dashboards, Exports, Explorer, Data Health) renders correctly irrespective of sidebar state.</w:t>
+      </w:r>
+    </w:p>
+    <w:p>
+      <w:pPr>
+        <w:numPr>
+          <w:ilvl w:val="0"/>
+          <w:numId w:val="39"/>
+        </w:numPr>
+        <w:spacing w:after="0" w:line="240" w:lineRule="auto"/>
+        <w:rPr>
+          <w:rFonts w:ascii="Times New Roman" w:eastAsia="Times New Roman" w:hAnsi="Times New Roman" w:cs="Times New Roman"/>
+          <w:sz w:val="24"/>
+          <w:szCs w:val="24"/>
+        </w:rPr>
+      </w:pPr>
+      <w:r>
+        <w:rPr>
+          <w:rFonts w:ascii="Times New Roman" w:eastAsia="Times New Roman" w:hAnsi="Times New Roman" w:cs="Times New Roman"/>
+          <w:sz w:val="24"/>
+          <w:szCs w:val="24"/>
+        </w:rPr>
+        <w:t>Verified that dashboard rendering is unaffected by layout changes and loads correctly after run selection.</w:t>
+      </w:r>
+    </w:p>
+    <w:p>
+      <w:pPr>
+        <w:spacing w:after="0" w:line="240" w:lineRule="auto"/>
+        <w:outlineLvl w:val="2"/>
+        <w:rPr>
+          <w:rFonts w:ascii="Times New Roman" w:eastAsia="Times New Roman" w:hAnsi="Times New Roman" w:cs="Times New Roman"/>
+          <w:b/>
+          <w:bCs/>
+          <w:sz w:val="27"/>
+          <w:szCs w:val="27"/>
+        </w:rPr>
+      </w:pPr>
+      <w:r>
+        <w:rPr>
+          <w:rFonts w:ascii="Times New Roman" w:eastAsia="Times New Roman" w:hAnsi="Times New Roman" w:cs="Times New Roman"/>
+          <w:b/>
+          <w:bCs/>
+          <w:sz w:val="27"/>
+          <w:szCs w:val="27"/>
+        </w:rPr>
+        <w:t>Outcome of the Day</w:t>
+      </w:r>
+    </w:p>
+    <w:p>
+      <w:pPr>
+        <w:numPr>
+          <w:ilvl w:val="0"/>
+          <w:numId w:val="40"/>
+        </w:numPr>
+        <w:spacing w:after="0" w:line="240" w:lineRule="auto"/>
+        <w:rPr>
+          <w:rFonts w:ascii="Times New Roman" w:eastAsia="Times New Roman" w:hAnsi="Times New Roman" w:cs="Times New Roman"/>
+          <w:sz w:val="24"/>
+          <w:szCs w:val="24"/>
+        </w:rPr>
+      </w:pPr>
+      <w:r>
+        <w:rPr>
+          <w:rFonts w:ascii="Times New Roman" w:eastAsia="Times New Roman" w:hAnsi="Times New Roman" w:cs="Times New Roman"/>
+          <w:sz w:val="24"/>
+          <w:szCs w:val="24"/>
+        </w:rPr>
+        <w:t>Sidebar toggle functionality is now stable and does not interfere with page rendering.</w:t>
+      </w:r>
+    </w:p>
+    <w:p>
+      <w:pPr>
+        <w:numPr>
+          <w:ilvl w:val="0"/>
+          <w:numId w:val="40"/>
+        </w:numPr>
+        <w:spacing w:after="0" w:line="240" w:lineRule="auto"/>
+        <w:rPr>
+          <w:rFonts w:ascii="Times New Roman" w:eastAsia="Times New Roman" w:hAnsi="Times New Roman" w:cs="Times New Roman"/>
+          <w:sz w:val="24"/>
+          <w:szCs w:val="24"/>
+        </w:rPr>
+      </w:pPr>
+      <w:r>
+        <w:rPr>
+          <w:rFonts w:ascii="Times New Roman" w:eastAsia="Times New Roman" w:hAnsi="Times New Roman" w:cs="Times New Roman"/>
+          <w:sz w:val="24"/>
+          <w:szCs w:val="24"/>
+        </w:rPr>
+        <w:t xml:space="preserve">All application </w:t>
+      </w:r>
+      <w:r>
+        <w:rPr>
+          <w:rFonts w:ascii="Times New Roman" w:eastAsia="Times New Roman" w:hAnsi="Times New Roman" w:cs="Times New Roman"/>
+          <w:sz w:val="24"/>
+          <w:szCs w:val="24"/>
+        </w:rPr>
+        <w:t>pages’</w:t>
+      </w:r>
+      <w:r>
+        <w:rPr>
+          <w:rFonts w:ascii="Times New Roman" w:eastAsia="Times New Roman" w:hAnsi="Times New Roman" w:cs="Times New Roman"/>
+          <w:sz w:val="24"/>
+          <w:szCs w:val="24"/>
+        </w:rPr>
+        <w:t xml:space="preserve"> render correctly under both collapsed and expanded sidebar states.</w:t>
+      </w:r>
+    </w:p>
+    <w:p>
+      <w:pPr>
+        <w:numPr>
+          <w:ilvl w:val="0"/>
+          <w:numId w:val="40"/>
+        </w:numPr>
+        <w:spacing w:after="0" w:line="240" w:lineRule="auto"/>
+        <w:rPr>
+          <w:rFonts w:ascii="Times New Roman" w:eastAsia="Times New Roman" w:hAnsi="Times New Roman" w:cs="Times New Roman"/>
+          <w:sz w:val="24"/>
+          <w:szCs w:val="24"/>
+        </w:rPr>
+      </w:pPr>
+      <w:r>
+        <w:rPr>
+          <w:rFonts w:ascii="Times New Roman" w:eastAsia="Times New Roman" w:hAnsi="Times New Roman" w:cs="Times New Roman"/>
+          <w:sz w:val="24"/>
+          <w:szCs w:val="24"/>
+        </w:rPr>
+        <w:t>Dashboard layout is aligned closer to professional BI tools in structure and interaction flow.</w:t>
+      </w:r>
+    </w:p>
+    <w:p>
+      <w:pPr>
+        <w:numPr>
+          <w:ilvl w:val="0"/>
+          <w:numId w:val="40"/>
+        </w:numPr>
+        <w:spacing w:after="0" w:line="240" w:lineRule="auto"/>
+        <w:rPr>
+          <w:rFonts w:ascii="Times New Roman" w:eastAsia="Times New Roman" w:hAnsi="Times New Roman" w:cs="Times New Roman"/>
+          <w:sz w:val="24"/>
+          <w:szCs w:val="24"/>
+        </w:rPr>
+      </w:pPr>
+      <w:r>
+        <w:rPr>
+          <w:rFonts w:ascii="Times New Roman" w:eastAsia="Times New Roman" w:hAnsi="Times New Roman" w:cs="Times New Roman"/>
+          <w:sz w:val="24"/>
+          <w:szCs w:val="24"/>
+        </w:rPr>
+        <w:t>Frontend layout architecture is now stable and ready for further dashboard feature expansion and documentation.</w:t>
+      </w:r>
+    </w:p>
+    <w:p>
+      <w:pPr>
+        <w:spacing w:after="0" w:line="240" w:lineRule="auto"/>
+        <w:outlineLvl w:val="2"/>
+        <w:rPr>
+          <w:rFonts w:ascii="Times New Roman" w:eastAsia="Times New Roman" w:hAnsi="Times New Roman" w:cs="Times New Roman"/>
+          <w:b/>
+          <w:bCs/>
+          <w:sz w:val="27"/>
+          <w:szCs w:val="27"/>
+        </w:rPr>
+      </w:pPr>
+      <w:r>
+        <w:rPr>
+          <w:rFonts w:ascii="Times New Roman" w:eastAsia="Times New Roman" w:hAnsi="Times New Roman" w:cs="Times New Roman"/>
+          <w:b/>
+          <w:bCs/>
+          <w:sz w:val="27"/>
+          <w:szCs w:val="27"/>
+        </w:rPr>
+        <w:t>Key Learnings</w:t>
+      </w:r>
+    </w:p>
+    <w:p>
+      <w:pPr>
+        <w:numPr>
+          <w:ilvl w:val="0"/>
+          <w:numId w:val="41"/>
+        </w:numPr>
+        <w:spacing w:after="0" w:line="240" w:lineRule="auto"/>
+        <w:rPr>
+          <w:rFonts w:ascii="Times New Roman" w:eastAsia="Times New Roman" w:hAnsi="Times New Roman" w:cs="Times New Roman"/>
+          <w:sz w:val="24"/>
+          <w:szCs w:val="24"/>
+        </w:rPr>
+      </w:pPr>
+      <w:r>
+        <w:rPr>
+          <w:rFonts w:ascii="Times New Roman" w:eastAsia="Times New Roman" w:hAnsi="Times New Roman" w:cs="Times New Roman"/>
+          <w:sz w:val="24"/>
+          <w:szCs w:val="24"/>
+        </w:rPr>
+        <w:t>Layout-level components must be treated as system-critical; small UI changes can affect all pages.</w:t>
+      </w:r>
+    </w:p>
+    <w:p>
+      <w:pPr>
+        <w:numPr>
+          <w:ilvl w:val="0"/>
+          <w:numId w:val="41"/>
+        </w:numPr>
+        <w:spacing w:after="0" w:line="240" w:lineRule="auto"/>
+        <w:rPr>
+          <w:rFonts w:ascii="Times New Roman" w:eastAsia="Times New Roman" w:hAnsi="Times New Roman" w:cs="Times New Roman"/>
+          <w:sz w:val="24"/>
+          <w:szCs w:val="24"/>
+        </w:rPr>
+      </w:pPr>
+      <w:r>
+        <w:rPr>
+          <w:rFonts w:ascii="Times New Roman" w:eastAsia="Times New Roman" w:hAnsi="Times New Roman" w:cs="Times New Roman"/>
+          <w:sz w:val="24"/>
+          <w:szCs w:val="24"/>
+        </w:rPr>
+        <w:t>Sidebar behavior must be decoupled from content rendering to avoid blank screens.</w:t>
+      </w:r>
+    </w:p>
+    <w:p>
+      <w:pPr>
+        <w:numPr>
+          <w:ilvl w:val="0"/>
+          <w:numId w:val="41"/>
+        </w:numPr>
+        <w:spacing w:after="0" w:line="240" w:lineRule="auto"/>
+        <w:rPr>
+          <w:rFonts w:ascii="Times New Roman" w:eastAsia="Times New Roman" w:hAnsi="Times New Roman" w:cs="Times New Roman"/>
+          <w:sz w:val="24"/>
+          <w:szCs w:val="24"/>
+        </w:rPr>
+      </w:pPr>
+      <w:r>
+        <w:rPr>
+          <w:rFonts w:ascii="Times New Roman" w:eastAsia="Times New Roman" w:hAnsi="Times New Roman" w:cs="Times New Roman"/>
+          <w:sz w:val="24"/>
+          <w:szCs w:val="24"/>
+        </w:rPr>
+        <w:t>Power BI–style dashboards require disciplined layout control, not just chart rendering.</w:t>
+      </w:r>
+    </w:p>
+    <w:p>
+      <w:pPr>
+        <w:numPr>
+          <w:ilvl w:val="0"/>
+          <w:numId w:val="41"/>
+        </w:numPr>
+        <w:spacing w:after="0" w:line="240" w:lineRule="auto"/>
+        <w:rPr>
+          <w:rFonts w:ascii="Times New Roman" w:eastAsia="Times New Roman" w:hAnsi="Times New Roman" w:cs="Times New Roman"/>
+          <w:sz w:val="24"/>
+          <w:szCs w:val="24"/>
+        </w:rPr>
+      </w:pPr>
+      <w:r>
+        <w:rPr>
+          <w:rFonts w:ascii="Times New Roman" w:eastAsia="Times New Roman" w:hAnsi="Times New Roman" w:cs="Times New Roman"/>
+          <w:sz w:val="24"/>
+          <w:szCs w:val="24"/>
+        </w:rPr>
+        <w:t>Router + layout composition must be reviewed holistically, not page-by-page.</w:t>
+      </w:r>
+    </w:p>
+    <w:p>
+      <w:pPr>
+        <w:spacing w:after="0" w:line="240" w:lineRule="auto"/>
+        <w:outlineLvl w:val="2"/>
+        <w:rPr>
+          <w:rFonts w:ascii="Times New Roman" w:eastAsia="Times New Roman" w:hAnsi="Times New Roman" w:cs="Times New Roman"/>
+          <w:b/>
+          <w:bCs/>
+          <w:sz w:val="27"/>
+          <w:szCs w:val="27"/>
+        </w:rPr>
+      </w:pPr>
+      <w:r>
+        <w:rPr>
+          <w:rFonts w:ascii="Times New Roman" w:eastAsia="Times New Roman" w:hAnsi="Times New Roman" w:cs="Times New Roman"/>
+          <w:b/>
+          <w:bCs/>
+          <w:sz w:val="27"/>
+          <w:szCs w:val="27"/>
+        </w:rPr>
+        <w:t>Challenges / Open Points</w:t>
+      </w:r>
+    </w:p>
+    <w:p>
+      <w:pPr>
+        <w:numPr>
+          <w:ilvl w:val="0"/>
+          <w:numId w:val="42"/>
+        </w:numPr>
+        <w:spacing w:after="0" w:line="240" w:lineRule="auto"/>
+        <w:rPr>
+          <w:rFonts w:ascii="Times New Roman" w:eastAsia="Times New Roman" w:hAnsi="Times New Roman" w:cs="Times New Roman"/>
+          <w:sz w:val="24"/>
+          <w:szCs w:val="24"/>
+        </w:rPr>
+      </w:pPr>
+      <w:r>
+        <w:rPr>
+          <w:rFonts w:ascii="Times New Roman" w:eastAsia="Times New Roman" w:hAnsi="Times New Roman" w:cs="Times New Roman"/>
+          <w:sz w:val="24"/>
+          <w:szCs w:val="24"/>
+        </w:rPr>
+        <w:t>Final visual polish (spacing, alignment, typography consistency) is still pending.</w:t>
+      </w:r>
+    </w:p>
+    <w:p>
+      <w:pPr>
+        <w:numPr>
+          <w:ilvl w:val="0"/>
+          <w:numId w:val="42"/>
+        </w:numPr>
+        <w:spacing w:after="0" w:line="240" w:lineRule="auto"/>
+        <w:rPr>
+          <w:rFonts w:ascii="Times New Roman" w:eastAsia="Times New Roman" w:hAnsi="Times New Roman" w:cs="Times New Roman"/>
+          <w:sz w:val="24"/>
+          <w:szCs w:val="24"/>
+        </w:rPr>
+      </w:pPr>
+      <w:r>
+        <w:rPr>
+          <w:rFonts w:ascii="Times New Roman" w:eastAsia="Times New Roman" w:hAnsi="Times New Roman" w:cs="Times New Roman"/>
+          <w:sz w:val="24"/>
+          <w:szCs w:val="24"/>
+        </w:rPr>
+        <w:t>Dashboard persistence (save/load) implementation remains to be completed.</w:t>
+      </w:r>
+    </w:p>
+    <w:p>
+      <w:pPr>
+        <w:numPr>
+          <w:ilvl w:val="0"/>
+          <w:numId w:val="42"/>
+        </w:numPr>
+        <w:spacing w:after="0" w:line="240" w:lineRule="auto"/>
+        <w:rPr>
+          <w:rFonts w:ascii="Times New Roman" w:eastAsia="Times New Roman" w:hAnsi="Times New Roman" w:cs="Times New Roman"/>
+          <w:sz w:val="24"/>
+          <w:szCs w:val="24"/>
+        </w:rPr>
+      </w:pPr>
+      <w:r>
+        <w:rPr>
+          <w:rFonts w:ascii="Times New Roman" w:eastAsia="Times New Roman" w:hAnsi="Times New Roman" w:cs="Times New Roman"/>
+          <w:sz w:val="24"/>
+          <w:szCs w:val="24"/>
+        </w:rPr>
+        <w:t>Export-ready snapshot formatting needs to be finalized.</w:t>
+      </w:r>
+    </w:p>
+    <w:p>
+      <w:pPr>
+        <w:spacing w:after="0" w:line="240" w:lineRule="auto"/>
+        <w:outlineLvl w:val="2"/>
+        <w:rPr>
+          <w:rFonts w:ascii="Times New Roman" w:eastAsia="Times New Roman" w:hAnsi="Times New Roman" w:cs="Times New Roman"/>
+          <w:b/>
+          <w:bCs/>
+          <w:sz w:val="27"/>
+          <w:szCs w:val="27"/>
+        </w:rPr>
+      </w:pPr>
+      <w:r>
+        <w:rPr>
+          <w:rFonts w:ascii="Times New Roman" w:eastAsia="Times New Roman" w:hAnsi="Times New Roman" w:cs="Times New Roman"/>
+          <w:b/>
+          <w:bCs/>
+          <w:sz w:val="27"/>
+          <w:szCs w:val="27"/>
+        </w:rPr>
+        <w:t>Next Steps</w:t>
+      </w:r>
+    </w:p>
+    <w:p>
+      <w:pPr>
+        <w:numPr>
+          <w:ilvl w:val="0"/>
+          <w:numId w:val="43"/>
+        </w:numPr>
+        <w:spacing w:after="0" w:line="240" w:lineRule="auto"/>
+        <w:rPr>
+          <w:rFonts w:ascii="Times New Roman" w:eastAsia="Times New Roman" w:hAnsi="Times New Roman" w:cs="Times New Roman"/>
+          <w:sz w:val="24"/>
+          <w:szCs w:val="24"/>
+        </w:rPr>
+      </w:pPr>
+      <w:r>
+        <w:rPr>
+          <w:rFonts w:ascii="Times New Roman" w:eastAsia="Times New Roman" w:hAnsi="Times New Roman" w:cs="Times New Roman"/>
+          <w:sz w:val="24"/>
+          <w:szCs w:val="24"/>
+        </w:rPr>
+        <w:t>Complete documentation updates for frontend architecture and dashboard interaction model.</w:t>
+      </w:r>
+    </w:p>
+    <w:p>
+      <w:pPr>
+        <w:numPr>
+          <w:ilvl w:val="0"/>
+          <w:numId w:val="43"/>
+        </w:numPr>
+        <w:spacing w:after="0" w:line="240" w:lineRule="auto"/>
+        <w:rPr>
+          <w:rFonts w:ascii="Times New Roman" w:eastAsia="Times New Roman" w:hAnsi="Times New Roman" w:cs="Times New Roman"/>
+          <w:sz w:val="24"/>
+          <w:szCs w:val="24"/>
+        </w:rPr>
+      </w:pPr>
+      <w:r>
+        <w:rPr>
+          <w:rFonts w:ascii="Times New Roman" w:eastAsia="Times New Roman" w:hAnsi="Times New Roman" w:cs="Times New Roman"/>
+          <w:sz w:val="24"/>
+          <w:szCs w:val="24"/>
+        </w:rPr>
+        <w:t>Implement dashboard save/load functionality.</w:t>
+      </w:r>
+    </w:p>
+    <w:p>
+      <w:pPr>
+        <w:numPr>
+          <w:ilvl w:val="0"/>
+          <w:numId w:val="43"/>
+        </w:numPr>
+        <w:spacing w:after="0" w:line="240" w:lineRule="auto"/>
+        <w:rPr>
+          <w:rFonts w:ascii="Times New Roman" w:eastAsia="Times New Roman" w:hAnsi="Times New Roman" w:cs="Times New Roman"/>
+          <w:sz w:val="24"/>
+          <w:szCs w:val="24"/>
+        </w:rPr>
+      </w:pPr>
+      <w:r>
+        <w:rPr>
+          <w:rFonts w:ascii="Times New Roman" w:eastAsia="Times New Roman" w:hAnsi="Times New Roman" w:cs="Times New Roman"/>
+          <w:sz w:val="24"/>
+          <w:szCs w:val="24"/>
+        </w:rPr>
+        <w:t>Perform visual consistency pass across all dashboard components.</w:t>
+      </w:r>
+    </w:p>
+    <w:p>
+      <w:pPr>
+        <w:numPr>
+          <w:ilvl w:val="0"/>
+          <w:numId w:val="43"/>
+        </w:numPr>
+        <w:spacing w:after="0" w:line="240" w:lineRule="auto"/>
+        <w:rPr>
+          <w:rFonts w:ascii="Times New Roman" w:eastAsia="Times New Roman" w:hAnsi="Times New Roman" w:cs="Times New Roman"/>
+          <w:sz w:val="24"/>
+          <w:szCs w:val="24"/>
+        </w:rPr>
+      </w:pPr>
+      <w:r>
+        <w:rPr>
+          <w:rFonts w:ascii="Times New Roman" w:eastAsia="Times New Roman" w:hAnsi="Times New Roman" w:cs="Times New Roman"/>
+          <w:sz w:val="24"/>
+          <w:szCs w:val="24"/>
+        </w:rPr>
+        <w:t>Prepare the system for final stabilization before January 30.</w:t>
+      </w:r>
+    </w:p>
+    <w:p>
+      <w:pPr>
+        <w:spacing w:after="0" w:line="240" w:lineRule="auto"/>
+        <w:rPr>
+          <w:rFonts w:ascii="Times New Roman" w:eastAsia="Times New Roman" w:hAnsi="Times New Roman" w:cs="Times New Roman"/>
+          <w:sz w:val="24"/>
+          <w:szCs w:val="24"/>
+        </w:rPr>
+      </w:pPr>
+    </w:p>
+    <w:p>
+      <w:pPr>
+        <w:spacing w:before="100" w:beforeAutospacing="1" w:after="100" w:afterAutospacing="1" w:line="240" w:lineRule="auto"/>
+        <w:outlineLvl w:val="1"/>
+        <w:rPr>
+          <w:rFonts w:ascii="Times New Roman" w:eastAsia="Times New Roman" w:hAnsi="Times New Roman" w:cs="Times New Roman"/>
+          <w:b/>
+          <w:sz w:val="24"/>
+          <w:szCs w:val="24"/>
+        </w:rPr>
+      </w:pPr>
+      <w:r>
+        <w:rPr>
+          <w:rFonts w:ascii="Times New Roman" w:eastAsia="Times New Roman" w:hAnsi="Times New Roman" w:cs="Times New Roman"/>
+          <w:b/>
+          <w:bCs/>
+          <w:sz w:val="24"/>
+          <w:szCs w:val="24"/>
+        </w:rPr>
+        <w:lastRenderedPageBreak/>
+        <w:t>Date:</w:t>
+      </w:r>
+      <w:r>
+        <w:rPr>
+          <w:rFonts w:ascii="Times New Roman" w:eastAsia="Times New Roman" w:hAnsi="Times New Roman" w:cs="Times New Roman"/>
+          <w:b/>
+          <w:sz w:val="24"/>
+          <w:szCs w:val="24"/>
+        </w:rPr>
+        <w:t xml:space="preserve"> </w:t>
+      </w:r>
+      <w:r>
+        <w:rPr>
+          <w:rFonts w:ascii="Times New Roman" w:eastAsia="Times New Roman" w:hAnsi="Times New Roman" w:cs="Times New Roman"/>
+          <w:b/>
+          <w:sz w:val="24"/>
+          <w:szCs w:val="24"/>
+        </w:rPr>
+        <w:t>23</w:t>
+      </w:r>
+      <w:r>
+        <w:rPr>
+          <w:rFonts w:ascii="Times New Roman" w:eastAsia="Times New Roman" w:hAnsi="Times New Roman" w:cs="Times New Roman"/>
+          <w:b/>
+          <w:sz w:val="24"/>
+          <w:szCs w:val="24"/>
+        </w:rPr>
+        <w:t xml:space="preserve">/01/2026                                                                                                         </w:t>
+      </w:r>
+      <w:r>
+        <w:rPr>
+          <w:rFonts w:ascii="Times New Roman" w:eastAsia="Times New Roman" w:hAnsi="Times New Roman" w:cs="Times New Roman"/>
+          <w:b/>
+          <w:sz w:val="24"/>
+          <w:szCs w:val="24"/>
+        </w:rPr>
+        <w:t xml:space="preserve">    </w:t>
+      </w:r>
+      <w:r>
+        <w:rPr>
+          <w:rFonts w:ascii="Times New Roman" w:eastAsia="Times New Roman" w:hAnsi="Times New Roman" w:cs="Times New Roman"/>
+          <w:b/>
+          <w:sz w:val="24"/>
+          <w:szCs w:val="24"/>
+        </w:rPr>
+        <w:t xml:space="preserve"> Day 1</w:t>
+      </w:r>
+      <w:r>
+        <w:rPr>
+          <w:rFonts w:ascii="Times New Roman" w:eastAsia="Times New Roman" w:hAnsi="Times New Roman" w:cs="Times New Roman"/>
+          <w:b/>
+          <w:sz w:val="24"/>
+          <w:szCs w:val="24"/>
+        </w:rPr>
+        <w:t>3</w:t>
+      </w:r>
+      <w:r>
+        <w:rPr>
+          <w:rFonts w:ascii="Times New Roman" w:eastAsia="Times New Roman" w:hAnsi="Times New Roman" w:cs="Times New Roman"/>
+          <w:b/>
+          <w:sz w:val="24"/>
+          <w:szCs w:val="24"/>
+        </w:rPr>
+        <w:br/>
+      </w:r>
+      <w:r>
+        <w:rPr>
+          <w:rFonts w:ascii="Times New Roman" w:eastAsia="Times New Roman" w:hAnsi="Times New Roman" w:cs="Times New Roman"/>
+          <w:b/>
+          <w:bCs/>
+          <w:sz w:val="24"/>
+          <w:szCs w:val="24"/>
+        </w:rPr>
+        <w:t>Department:</w:t>
+      </w:r>
+      <w:r>
+        <w:rPr>
+          <w:rFonts w:ascii="Times New Roman" w:eastAsia="Times New Roman" w:hAnsi="Times New Roman" w:cs="Times New Roman"/>
+          <w:b/>
+          <w:sz w:val="24"/>
+          <w:szCs w:val="24"/>
+        </w:rPr>
+        <w:t xml:space="preserve"> Maintenance</w:t>
+      </w:r>
+      <w:r>
+        <w:rPr>
+          <w:rFonts w:ascii="Times New Roman" w:eastAsia="Times New Roman" w:hAnsi="Times New Roman" w:cs="Times New Roman"/>
+          <w:b/>
+          <w:sz w:val="24"/>
+          <w:szCs w:val="24"/>
+        </w:rPr>
+        <w:br/>
+      </w:r>
+      <w:r>
+        <w:rPr>
+          <w:rFonts w:ascii="Times New Roman" w:eastAsia="Times New Roman" w:hAnsi="Times New Roman" w:cs="Times New Roman"/>
+          <w:b/>
+          <w:bCs/>
+          <w:sz w:val="24"/>
+          <w:szCs w:val="24"/>
+        </w:rPr>
+        <w:t>Plant:</w:t>
+      </w:r>
+      <w:r>
+        <w:rPr>
+          <w:rFonts w:ascii="Times New Roman" w:eastAsia="Times New Roman" w:hAnsi="Times New Roman" w:cs="Times New Roman"/>
+          <w:b/>
+          <w:sz w:val="24"/>
+          <w:szCs w:val="24"/>
+        </w:rPr>
+        <w:t xml:space="preserve"> Drive Shaft Manufacturing</w:t>
+      </w:r>
+    </w:p>
+    <w:p>
+      <w:pPr>
+        <w:pStyle w:val="Heading3"/>
+        <w:spacing w:before="0" w:beforeAutospacing="0" w:after="0" w:afterAutospacing="0"/>
+      </w:pPr>
+      <w:r>
+        <w:rPr>
+          <w:rStyle w:val="Strong"/>
+          <w:b/>
+          <w:bCs/>
+        </w:rPr>
+        <w:t>Objective of the Day</w:t>
+      </w:r>
+    </w:p>
+    <w:p>
+      <w:pPr>
+        <w:pStyle w:val="NormalWeb"/>
+        <w:spacing w:before="0" w:beforeAutospacing="0" w:after="0" w:afterAutospacing="0"/>
+      </w:pPr>
+      <w:r>
+        <w:t>To finalize the ingestion user interface, stabilize the global layout with a top navigation bar, refactor sidebar behavior, and align the application layout with a professional BI-style structure while maintaining frontend stability.</w:t>
+      </w:r>
+    </w:p>
+    <w:p>
+      <w:pPr>
+        <w:pStyle w:val="NormalWeb"/>
+        <w:spacing w:before="0" w:beforeAutospacing="0" w:after="0" w:afterAutospacing="0"/>
+      </w:pPr>
+    </w:p>
+    <w:p>
+      <w:pPr>
+        <w:pStyle w:val="Heading3"/>
+        <w:spacing w:before="0" w:beforeAutospacing="0" w:after="0" w:afterAutospacing="0"/>
+      </w:pPr>
+      <w:r>
+        <w:rPr>
+          <w:rStyle w:val="Strong"/>
+          <w:b/>
+          <w:bCs/>
+        </w:rPr>
+        <w:t>Activities Performed</w:t>
+      </w:r>
+    </w:p>
+    <w:p>
+      <w:pPr>
+        <w:pStyle w:val="NormalWeb"/>
+        <w:spacing w:before="0" w:beforeAutospacing="0" w:after="0" w:afterAutospacing="0"/>
+      </w:pPr>
+      <w:r>
+        <w:t xml:space="preserve">• Entered updated machine </w:t>
+      </w:r>
+      <w:r>
+        <w:rPr>
+          <w:rStyle w:val="Strong"/>
+        </w:rPr>
+        <w:t xml:space="preserve">kWh and </w:t>
+      </w:r>
+      <w:proofErr w:type="spellStart"/>
+      <w:r>
+        <w:rPr>
+          <w:rStyle w:val="Strong"/>
+        </w:rPr>
+        <w:t>kVAh</w:t>
+      </w:r>
+      <w:proofErr w:type="spellEnd"/>
+      <w:r>
+        <w:rPr>
+          <w:rStyle w:val="Strong"/>
+        </w:rPr>
+        <w:t xml:space="preserve"> readings</w:t>
+      </w:r>
+      <w:r>
+        <w:t xml:space="preserve"> into operational Excel sheets.</w:t>
+      </w:r>
+      <w:r>
+        <w:br/>
+        <w:t xml:space="preserve">• Updated </w:t>
+      </w:r>
+      <w:r>
+        <w:rPr>
+          <w:rStyle w:val="Strong"/>
+        </w:rPr>
+        <w:t>power cost analysis sheets</w:t>
+      </w:r>
+      <w:r>
+        <w:t xml:space="preserve"> based on the latest energy readings.</w:t>
+      </w:r>
+      <w:r>
+        <w:br/>
+        <w:t xml:space="preserve">• Refactored the </w:t>
+      </w:r>
+      <w:r>
+        <w:rPr>
+          <w:rStyle w:val="Strong"/>
+        </w:rPr>
+        <w:t>global application layout</w:t>
+      </w:r>
+      <w:r>
+        <w:t xml:space="preserve"> by introducing a top navigation bar for branding and Active Run visibility.</w:t>
+      </w:r>
+      <w:r>
+        <w:br/>
+        <w:t>• Removed Active Run dependency from the sidebar and centralized it in the top bar for global visibility.</w:t>
+      </w:r>
+      <w:r>
+        <w:br/>
+        <w:t xml:space="preserve">• Finalized the </w:t>
+      </w:r>
+      <w:r>
+        <w:rPr>
+          <w:rStyle w:val="Strong"/>
+        </w:rPr>
+        <w:t>Ingestion UI</w:t>
+      </w:r>
+      <w:r>
+        <w:t xml:space="preserve"> with:</w:t>
+      </w:r>
+    </w:p>
+    <w:p>
+      <w:pPr>
+        <w:pStyle w:val="NormalWeb"/>
+        <w:numPr>
+          <w:ilvl w:val="0"/>
+          <w:numId w:val="44"/>
+        </w:numPr>
+        <w:spacing w:before="0" w:beforeAutospacing="0" w:after="0" w:afterAutospacing="0"/>
+      </w:pPr>
+      <w:r>
+        <w:t>Source-based selection (SAP, RFID, PLC, Excel, Energy).</w:t>
+      </w:r>
+    </w:p>
+    <w:p>
+      <w:pPr>
+        <w:pStyle w:val="NormalWeb"/>
+        <w:numPr>
+          <w:ilvl w:val="0"/>
+          <w:numId w:val="44"/>
+        </w:numPr>
+        <w:spacing w:before="0" w:beforeAutospacing="0" w:after="0" w:afterAutospacing="0"/>
+      </w:pPr>
+      <w:r>
+        <w:t>File upload handling per source type.</w:t>
+      </w:r>
+    </w:p>
+    <w:p>
+      <w:pPr>
+        <w:pStyle w:val="NormalWeb"/>
+        <w:numPr>
+          <w:ilvl w:val="0"/>
+          <w:numId w:val="44"/>
+        </w:numPr>
+        <w:spacing w:before="0" w:beforeAutospacing="0" w:after="0" w:afterAutospacing="0"/>
+      </w:pPr>
+      <w:r>
+        <w:t>Success and failure messaging logic.</w:t>
+      </w:r>
+      <w:r>
+        <w:br/>
+        <w:t>• Implemented post-ingestion navigation actions (Insights, Dashboards, Data Health).</w:t>
+      </w:r>
+      <w:r>
+        <w:br/>
+        <w:t>• Debugged sidebar collapse/expand behavior to ensure it does not affect page rendering.</w:t>
+      </w:r>
+      <w:r>
+        <w:br/>
+        <w:t>• Standardized sidebar and top bar color grading for visual consistency.</w:t>
+      </w:r>
+    </w:p>
+    <w:p>
+      <w:pPr>
+        <w:pStyle w:val="NormalWeb"/>
+        <w:spacing w:before="0" w:beforeAutospacing="0" w:after="0" w:afterAutospacing="0"/>
+        <w:ind w:left="720"/>
+      </w:pPr>
+    </w:p>
+    <w:p>
+      <w:pPr>
+        <w:pStyle w:val="Heading3"/>
+        <w:spacing w:before="0" w:beforeAutospacing="0" w:after="0" w:afterAutospacing="0"/>
+      </w:pPr>
+      <w:r>
+        <w:rPr>
+          <w:rStyle w:val="Strong"/>
+          <w:b/>
+          <w:bCs/>
+        </w:rPr>
+        <w:t>Outcome of the Day</w:t>
+      </w:r>
+    </w:p>
+    <w:p>
+      <w:pPr>
+        <w:pStyle w:val="NormalWeb"/>
+        <w:spacing w:before="0" w:beforeAutospacing="0" w:after="0" w:afterAutospacing="0"/>
+      </w:pPr>
+      <w:r>
+        <w:t>• Ingestion UI is functionally complete and aligned with planned architecture.</w:t>
+      </w:r>
+      <w:r>
+        <w:br/>
+        <w:t>• Global Active Run visibility is stable and consistent across all pages.</w:t>
+      </w:r>
+      <w:r>
+        <w:br/>
+        <w:t>• Sidebar behavior is predictable and no longer disrupts content rendering.</w:t>
+      </w:r>
+      <w:r>
+        <w:br/>
+        <w:t>• Application layout now closely resembles enterprise BI tools in structure.</w:t>
+      </w:r>
+    </w:p>
+    <w:p>
+      <w:pPr>
+        <w:pStyle w:val="NormalWeb"/>
+        <w:spacing w:before="0" w:beforeAutospacing="0" w:after="0" w:afterAutospacing="0"/>
+      </w:pPr>
+    </w:p>
+    <w:p>
+      <w:pPr>
+        <w:pStyle w:val="Heading3"/>
+        <w:spacing w:before="0" w:beforeAutospacing="0" w:after="0" w:afterAutospacing="0"/>
+      </w:pPr>
+      <w:r>
+        <w:rPr>
+          <w:rStyle w:val="Strong"/>
+          <w:b/>
+          <w:bCs/>
+        </w:rPr>
+        <w:t>Key Learnings</w:t>
+      </w:r>
+    </w:p>
+    <w:p>
+      <w:pPr>
+        <w:pStyle w:val="NormalWeb"/>
+        <w:spacing w:before="0" w:beforeAutospacing="0" w:after="0" w:afterAutospacing="0"/>
+      </w:pPr>
+      <w:r>
+        <w:t>• Global UI elements (Active Run, navigation) must be independent of collapsible components.</w:t>
+      </w:r>
+      <w:r>
+        <w:br/>
+        <w:t>• Ingestion UX clarity is critical for downstream analytics reliability.</w:t>
+      </w:r>
+    </w:p>
+    <w:p>
+      <w:pPr>
+        <w:pStyle w:val="NormalWeb"/>
+        <w:spacing w:before="0" w:beforeAutospacing="0" w:after="0" w:afterAutospacing="0"/>
+      </w:pPr>
+    </w:p>
+    <w:p>
+      <w:pPr>
+        <w:pStyle w:val="Heading3"/>
+        <w:spacing w:before="0" w:beforeAutospacing="0" w:after="0" w:afterAutospacing="0"/>
+      </w:pPr>
+      <w:r>
+        <w:rPr>
+          <w:rStyle w:val="Strong"/>
+          <w:b/>
+          <w:bCs/>
+        </w:rPr>
+        <w:t>Challenges / Open Points</w:t>
+      </w:r>
+    </w:p>
+    <w:p>
+      <w:pPr>
+        <w:pStyle w:val="NormalWeb"/>
+        <w:spacing w:before="0" w:beforeAutospacing="0" w:after="0" w:afterAutospacing="0"/>
+      </w:pPr>
+      <w:r>
+        <w:t>• Data Health UI implementation is pending.</w:t>
+      </w:r>
+      <w:r>
+        <w:br/>
+        <w:t>• Insights, Dashboards, Exports, Explorer pages require full UI completion.</w:t>
+      </w:r>
+      <w:r>
+        <w:br/>
+        <w:t>• Backend ingestion wiring and validation logic are yet to be integrated.</w:t>
+      </w:r>
+      <w:r>
+        <w:br/>
+        <w:t>• Dashboard persistence and export formatting remain incomplete.</w:t>
+      </w:r>
+    </w:p>
+    <w:p>
+      <w:pPr>
+        <w:pStyle w:val="NormalWeb"/>
+        <w:spacing w:before="0" w:beforeAutospacing="0" w:after="0" w:afterAutospacing="0"/>
+      </w:pPr>
+    </w:p>
+    <w:p>
+      <w:pPr>
+        <w:pStyle w:val="Heading3"/>
+        <w:spacing w:before="0" w:beforeAutospacing="0" w:after="0" w:afterAutospacing="0"/>
+      </w:pPr>
+      <w:r>
+        <w:rPr>
+          <w:rStyle w:val="Strong"/>
+          <w:b/>
+          <w:bCs/>
+        </w:rPr>
+        <w:t>Next Steps</w:t>
+      </w:r>
+    </w:p>
+    <w:p>
+      <w:pPr>
+        <w:pStyle w:val="NormalWeb"/>
+        <w:spacing w:before="0" w:beforeAutospacing="0" w:after="0" w:afterAutospacing="0"/>
+      </w:pPr>
+      <w:r>
+        <w:t xml:space="preserve">• Implement </w:t>
+      </w:r>
+      <w:r>
+        <w:rPr>
+          <w:rStyle w:val="Strong"/>
+        </w:rPr>
+        <w:t>Data Health UI</w:t>
+      </w:r>
+      <w:r>
+        <w:t xml:space="preserve"> with column-level validation feedback.</w:t>
+      </w:r>
+      <w:r>
+        <w:br/>
+        <w:t xml:space="preserve">• Complete </w:t>
+      </w:r>
+      <w:r>
+        <w:rPr>
+          <w:rStyle w:val="Strong"/>
+        </w:rPr>
+        <w:t>Insights and Dashboard UI</w:t>
+      </w:r>
+      <w:r>
+        <w:t xml:space="preserve"> with responsive layouts.</w:t>
+      </w:r>
+      <w:r>
+        <w:br/>
+        <w:t>• Integrate backend ingestion pipelines and database storage.</w:t>
+      </w:r>
+      <w:r>
+        <w:br/>
+        <w:t>• Implement dashboard save/load and export workflows.</w:t>
+      </w:r>
+      <w:r>
+        <w:br/>
+        <w:t>• Perform full responsiveness testing across screens.</w:t>
+      </w:r>
       <w:bookmarkStart w:id="0" w:name="_GoBack"/>
       <w:bookmarkEnd w:id="0"/>
-    </w:p>
-    <w:p>
-      <w:pPr>
-        <w:spacing w:before="100" w:beforeAutospacing="1" w:after="100" w:afterAutospacing="1" w:line="240" w:lineRule="auto"/>
-        <w:rPr>
-          <w:rFonts w:ascii="Times New Roman" w:eastAsia="Times New Roman" w:hAnsi="Times New Roman" w:cs="Times New Roman"/>
-          <w:sz w:val="24"/>
-          <w:szCs w:val="24"/>
-        </w:rPr>
-      </w:pPr>
     </w:p>
     <w:sectPr>
       <w:pgSz w:w="12240" w:h="15840"/>
@@ -6717,6 +8301,155 @@
     </w:lvl>
   </w:abstractNum>
   <w:abstractNum w:abstractNumId="4" w15:restartNumberingAfterBreak="0">
+    <w:nsid w:val="0B5E5675"/>
+    <w:multiLevelType w:val="multilevel"/>
+    <w:tmpl w:val="23FCBCF4"/>
+    <w:lvl w:ilvl="0">
+      <w:start w:val="1"/>
+      <w:numFmt w:val="bullet"/>
+      <w:lvlText w:val=""/>
+      <w:lvlJc w:val="left"/>
+      <w:pPr>
+        <w:tabs>
+          <w:tab w:val="num" w:pos="720"/>
+        </w:tabs>
+        <w:ind w:left="720" w:hanging="360"/>
+      </w:pPr>
+      <w:rPr>
+        <w:rFonts w:ascii="Symbol" w:hAnsi="Symbol" w:hint="default"/>
+        <w:sz w:val="20"/>
+      </w:rPr>
+    </w:lvl>
+    <w:lvl w:ilvl="1" w:tentative="1">
+      <w:start w:val="1"/>
+      <w:numFmt w:val="bullet"/>
+      <w:lvlText w:val="o"/>
+      <w:lvlJc w:val="left"/>
+      <w:pPr>
+        <w:tabs>
+          <w:tab w:val="num" w:pos="1440"/>
+        </w:tabs>
+        <w:ind w:left="1440" w:hanging="360"/>
+      </w:pPr>
+      <w:rPr>
+        <w:rFonts w:ascii="Courier New" w:hAnsi="Courier New" w:hint="default"/>
+        <w:sz w:val="20"/>
+      </w:rPr>
+    </w:lvl>
+    <w:lvl w:ilvl="2" w:tentative="1">
+      <w:start w:val="1"/>
+      <w:numFmt w:val="bullet"/>
+      <w:lvlText w:val=""/>
+      <w:lvlJc w:val="left"/>
+      <w:pPr>
+        <w:tabs>
+          <w:tab w:val="num" w:pos="2160"/>
+        </w:tabs>
+        <w:ind w:left="2160" w:hanging="360"/>
+      </w:pPr>
+      <w:rPr>
+        <w:rFonts w:ascii="Wingdings" w:hAnsi="Wingdings" w:hint="default"/>
+        <w:sz w:val="20"/>
+      </w:rPr>
+    </w:lvl>
+    <w:lvl w:ilvl="3" w:tentative="1">
+      <w:start w:val="1"/>
+      <w:numFmt w:val="bullet"/>
+      <w:lvlText w:val=""/>
+      <w:lvlJc w:val="left"/>
+      <w:pPr>
+        <w:tabs>
+          <w:tab w:val="num" w:pos="2880"/>
+        </w:tabs>
+        <w:ind w:left="2880" w:hanging="360"/>
+      </w:pPr>
+      <w:rPr>
+        <w:rFonts w:ascii="Wingdings" w:hAnsi="Wingdings" w:hint="default"/>
+        <w:sz w:val="20"/>
+      </w:rPr>
+    </w:lvl>
+    <w:lvl w:ilvl="4" w:tentative="1">
+      <w:start w:val="1"/>
+      <w:numFmt w:val="bullet"/>
+      <w:lvlText w:val=""/>
+      <w:lvlJc w:val="left"/>
+      <w:pPr>
+        <w:tabs>
+          <w:tab w:val="num" w:pos="3600"/>
+        </w:tabs>
+        <w:ind w:left="3600" w:hanging="360"/>
+      </w:pPr>
+      <w:rPr>
+        <w:rFonts w:ascii="Wingdings" w:hAnsi="Wingdings" w:hint="default"/>
+        <w:sz w:val="20"/>
+      </w:rPr>
+    </w:lvl>
+    <w:lvl w:ilvl="5" w:tentative="1">
+      <w:start w:val="1"/>
+      <w:numFmt w:val="bullet"/>
+      <w:lvlText w:val=""/>
+      <w:lvlJc w:val="left"/>
+      <w:pPr>
+        <w:tabs>
+          <w:tab w:val="num" w:pos="4320"/>
+        </w:tabs>
+        <w:ind w:left="4320" w:hanging="360"/>
+      </w:pPr>
+      <w:rPr>
+        <w:rFonts w:ascii="Wingdings" w:hAnsi="Wingdings" w:hint="default"/>
+        <w:sz w:val="20"/>
+      </w:rPr>
+    </w:lvl>
+    <w:lvl w:ilvl="6" w:tentative="1">
+      <w:start w:val="1"/>
+      <w:numFmt w:val="bullet"/>
+      <w:lvlText w:val=""/>
+      <w:lvlJc w:val="left"/>
+      <w:pPr>
+        <w:tabs>
+          <w:tab w:val="num" w:pos="5040"/>
+        </w:tabs>
+        <w:ind w:left="5040" w:hanging="360"/>
+      </w:pPr>
+      <w:rPr>
+        <w:rFonts w:ascii="Wingdings" w:hAnsi="Wingdings" w:hint="default"/>
+        <w:sz w:val="20"/>
+      </w:rPr>
+    </w:lvl>
+    <w:lvl w:ilvl="7" w:tentative="1">
+      <w:start w:val="1"/>
+      <w:numFmt w:val="bullet"/>
+      <w:lvlText w:val=""/>
+      <w:lvlJc w:val="left"/>
+      <w:pPr>
+        <w:tabs>
+          <w:tab w:val="num" w:pos="5760"/>
+        </w:tabs>
+        <w:ind w:left="5760" w:hanging="360"/>
+      </w:pPr>
+      <w:rPr>
+        <w:rFonts w:ascii="Wingdings" w:hAnsi="Wingdings" w:hint="default"/>
+        <w:sz w:val="20"/>
+      </w:rPr>
+    </w:lvl>
+    <w:lvl w:ilvl="8" w:tentative="1">
+      <w:start w:val="1"/>
+      <w:numFmt w:val="bullet"/>
+      <w:lvlText w:val=""/>
+      <w:lvlJc w:val="left"/>
+      <w:pPr>
+        <w:tabs>
+          <w:tab w:val="num" w:pos="6480"/>
+        </w:tabs>
+        <w:ind w:left="6480" w:hanging="360"/>
+      </w:pPr>
+      <w:rPr>
+        <w:rFonts w:ascii="Wingdings" w:hAnsi="Wingdings" w:hint="default"/>
+        <w:sz w:val="20"/>
+      </w:rPr>
+    </w:lvl>
+  </w:abstractNum>
+  <w:abstractNum w:abstractNumId="5" w15:restartNumberingAfterBreak="0">
     <w:nsid w:val="0C554F64"/>
     <w:multiLevelType w:val="hybridMultilevel"/>
     <w:tmpl w:val="0506FDCA"/>
@@ -6829,7 +8562,156 @@
       </w:rPr>
     </w:lvl>
   </w:abstractNum>
-  <w:abstractNum w:abstractNumId="5" w15:restartNumberingAfterBreak="0">
+  <w:abstractNum w:abstractNumId="6" w15:restartNumberingAfterBreak="0">
+    <w:nsid w:val="0D4D7723"/>
+    <w:multiLevelType w:val="multilevel"/>
+    <w:tmpl w:val="FBA697AC"/>
+    <w:lvl w:ilvl="0">
+      <w:start w:val="1"/>
+      <w:numFmt w:val="bullet"/>
+      <w:lvlText w:val=""/>
+      <w:lvlJc w:val="left"/>
+      <w:pPr>
+        <w:tabs>
+          <w:tab w:val="num" w:pos="720"/>
+        </w:tabs>
+        <w:ind w:left="720" w:hanging="360"/>
+      </w:pPr>
+      <w:rPr>
+        <w:rFonts w:ascii="Symbol" w:hAnsi="Symbol" w:hint="default"/>
+        <w:sz w:val="20"/>
+      </w:rPr>
+    </w:lvl>
+    <w:lvl w:ilvl="1">
+      <w:start w:val="1"/>
+      <w:numFmt w:val="bullet"/>
+      <w:lvlText w:val=""/>
+      <w:lvlJc w:val="left"/>
+      <w:pPr>
+        <w:tabs>
+          <w:tab w:val="num" w:pos="1440"/>
+        </w:tabs>
+        <w:ind w:left="1440" w:hanging="360"/>
+      </w:pPr>
+      <w:rPr>
+        <w:rFonts w:ascii="Wingdings" w:hAnsi="Wingdings" w:hint="default"/>
+        <w:sz w:val="20"/>
+      </w:rPr>
+    </w:lvl>
+    <w:lvl w:ilvl="2" w:tentative="1">
+      <w:start w:val="1"/>
+      <w:numFmt w:val="bullet"/>
+      <w:lvlText w:val=""/>
+      <w:lvlJc w:val="left"/>
+      <w:pPr>
+        <w:tabs>
+          <w:tab w:val="num" w:pos="2160"/>
+        </w:tabs>
+        <w:ind w:left="2160" w:hanging="360"/>
+      </w:pPr>
+      <w:rPr>
+        <w:rFonts w:ascii="Wingdings" w:hAnsi="Wingdings" w:hint="default"/>
+        <w:sz w:val="20"/>
+      </w:rPr>
+    </w:lvl>
+    <w:lvl w:ilvl="3" w:tentative="1">
+      <w:start w:val="1"/>
+      <w:numFmt w:val="bullet"/>
+      <w:lvlText w:val=""/>
+      <w:lvlJc w:val="left"/>
+      <w:pPr>
+        <w:tabs>
+          <w:tab w:val="num" w:pos="2880"/>
+        </w:tabs>
+        <w:ind w:left="2880" w:hanging="360"/>
+      </w:pPr>
+      <w:rPr>
+        <w:rFonts w:ascii="Wingdings" w:hAnsi="Wingdings" w:hint="default"/>
+        <w:sz w:val="20"/>
+      </w:rPr>
+    </w:lvl>
+    <w:lvl w:ilvl="4" w:tentative="1">
+      <w:start w:val="1"/>
+      <w:numFmt w:val="bullet"/>
+      <w:lvlText w:val=""/>
+      <w:lvlJc w:val="left"/>
+      <w:pPr>
+        <w:tabs>
+          <w:tab w:val="num" w:pos="3600"/>
+        </w:tabs>
+        <w:ind w:left="3600" w:hanging="360"/>
+      </w:pPr>
+      <w:rPr>
+        <w:rFonts w:ascii="Wingdings" w:hAnsi="Wingdings" w:hint="default"/>
+        <w:sz w:val="20"/>
+      </w:rPr>
+    </w:lvl>
+    <w:lvl w:ilvl="5" w:tentative="1">
+      <w:start w:val="1"/>
+      <w:numFmt w:val="bullet"/>
+      <w:lvlText w:val=""/>
+      <w:lvlJc w:val="left"/>
+      <w:pPr>
+        <w:tabs>
+          <w:tab w:val="num" w:pos="4320"/>
+        </w:tabs>
+        <w:ind w:left="4320" w:hanging="360"/>
+      </w:pPr>
+      <w:rPr>
+        <w:rFonts w:ascii="Wingdings" w:hAnsi="Wingdings" w:hint="default"/>
+        <w:sz w:val="20"/>
+      </w:rPr>
+    </w:lvl>
+    <w:lvl w:ilvl="6" w:tentative="1">
+      <w:start w:val="1"/>
+      <w:numFmt w:val="bullet"/>
+      <w:lvlText w:val=""/>
+      <w:lvlJc w:val="left"/>
+      <w:pPr>
+        <w:tabs>
+          <w:tab w:val="num" w:pos="5040"/>
+        </w:tabs>
+        <w:ind w:left="5040" w:hanging="360"/>
+      </w:pPr>
+      <w:rPr>
+        <w:rFonts w:ascii="Wingdings" w:hAnsi="Wingdings" w:hint="default"/>
+        <w:sz w:val="20"/>
+      </w:rPr>
+    </w:lvl>
+    <w:lvl w:ilvl="7" w:tentative="1">
+      <w:start w:val="1"/>
+      <w:numFmt w:val="bullet"/>
+      <w:lvlText w:val=""/>
+      <w:lvlJc w:val="left"/>
+      <w:pPr>
+        <w:tabs>
+          <w:tab w:val="num" w:pos="5760"/>
+        </w:tabs>
+        <w:ind w:left="5760" w:hanging="360"/>
+      </w:pPr>
+      <w:rPr>
+        <w:rFonts w:ascii="Wingdings" w:hAnsi="Wingdings" w:hint="default"/>
+        <w:sz w:val="20"/>
+      </w:rPr>
+    </w:lvl>
+    <w:lvl w:ilvl="8" w:tentative="1">
+      <w:start w:val="1"/>
+      <w:numFmt w:val="bullet"/>
+      <w:lvlText w:val=""/>
+      <w:lvlJc w:val="left"/>
+      <w:pPr>
+        <w:tabs>
+          <w:tab w:val="num" w:pos="6480"/>
+        </w:tabs>
+        <w:ind w:left="6480" w:hanging="360"/>
+      </w:pPr>
+      <w:rPr>
+        <w:rFonts w:ascii="Wingdings" w:hAnsi="Wingdings" w:hint="default"/>
+        <w:sz w:val="20"/>
+      </w:rPr>
+    </w:lvl>
+  </w:abstractNum>
+  <w:abstractNum w:abstractNumId="7" w15:restartNumberingAfterBreak="0">
     <w:nsid w:val="1025101E"/>
     <w:multiLevelType w:val="multilevel"/>
     <w:tmpl w:val="2630475E"/>
@@ -6978,7 +8860,7 @@
       </w:rPr>
     </w:lvl>
   </w:abstractNum>
-  <w:abstractNum w:abstractNumId="6" w15:restartNumberingAfterBreak="0">
+  <w:abstractNum w:abstractNumId="8" w15:restartNumberingAfterBreak="0">
     <w:nsid w:val="11EC4F79"/>
     <w:multiLevelType w:val="multilevel"/>
     <w:tmpl w:val="4E904154"/>
@@ -7127,7 +9009,7 @@
       </w:rPr>
     </w:lvl>
   </w:abstractNum>
-  <w:abstractNum w:abstractNumId="7" w15:restartNumberingAfterBreak="0">
+  <w:abstractNum w:abstractNumId="9" w15:restartNumberingAfterBreak="0">
     <w:nsid w:val="191D2358"/>
     <w:multiLevelType w:val="multilevel"/>
     <w:tmpl w:val="4C76D0CE"/>
@@ -7276,7 +9158,7 @@
       </w:rPr>
     </w:lvl>
   </w:abstractNum>
-  <w:abstractNum w:abstractNumId="8" w15:restartNumberingAfterBreak="0">
+  <w:abstractNum w:abstractNumId="10" w15:restartNumberingAfterBreak="0">
     <w:nsid w:val="1A0904A8"/>
     <w:multiLevelType w:val="multilevel"/>
     <w:tmpl w:val="AEAA53BA"/>
@@ -7425,7 +9307,7 @@
       </w:rPr>
     </w:lvl>
   </w:abstractNum>
-  <w:abstractNum w:abstractNumId="9" w15:restartNumberingAfterBreak="0">
+  <w:abstractNum w:abstractNumId="11" w15:restartNumberingAfterBreak="0">
     <w:nsid w:val="1D795E8D"/>
     <w:multiLevelType w:val="multilevel"/>
     <w:tmpl w:val="1D48DAD0"/>
@@ -7574,7 +9456,7 @@
       </w:rPr>
     </w:lvl>
   </w:abstractNum>
-  <w:abstractNum w:abstractNumId="10" w15:restartNumberingAfterBreak="0">
+  <w:abstractNum w:abstractNumId="12" w15:restartNumberingAfterBreak="0">
     <w:nsid w:val="1F04011B"/>
     <w:multiLevelType w:val="multilevel"/>
     <w:tmpl w:val="32E60924"/>
@@ -7723,7 +9605,7 @@
       </w:rPr>
     </w:lvl>
   </w:abstractNum>
-  <w:abstractNum w:abstractNumId="11" w15:restartNumberingAfterBreak="0">
+  <w:abstractNum w:abstractNumId="13" w15:restartNumberingAfterBreak="0">
     <w:nsid w:val="1FFA7335"/>
     <w:multiLevelType w:val="multilevel"/>
     <w:tmpl w:val="F746CC02"/>
@@ -7872,7 +9754,7 @@
       </w:rPr>
     </w:lvl>
   </w:abstractNum>
-  <w:abstractNum w:abstractNumId="12" w15:restartNumberingAfterBreak="0">
+  <w:abstractNum w:abstractNumId="14" w15:restartNumberingAfterBreak="0">
     <w:nsid w:val="277F001C"/>
     <w:multiLevelType w:val="multilevel"/>
     <w:tmpl w:val="DD520D0A"/>
@@ -8021,7 +9903,7 @@
       </w:rPr>
     </w:lvl>
   </w:abstractNum>
-  <w:abstractNum w:abstractNumId="13" w15:restartNumberingAfterBreak="0">
+  <w:abstractNum w:abstractNumId="15" w15:restartNumberingAfterBreak="0">
     <w:nsid w:val="2C4213E1"/>
     <w:multiLevelType w:val="multilevel"/>
     <w:tmpl w:val="C2442892"/>
@@ -8170,7 +10052,7 @@
       </w:rPr>
     </w:lvl>
   </w:abstractNum>
-  <w:abstractNum w:abstractNumId="14" w15:restartNumberingAfterBreak="0">
+  <w:abstractNum w:abstractNumId="16" w15:restartNumberingAfterBreak="0">
     <w:nsid w:val="2D875DB2"/>
     <w:multiLevelType w:val="multilevel"/>
     <w:tmpl w:val="6450BF7A"/>
@@ -8319,7 +10201,7 @@
       </w:rPr>
     </w:lvl>
   </w:abstractNum>
-  <w:abstractNum w:abstractNumId="15" w15:restartNumberingAfterBreak="0">
+  <w:abstractNum w:abstractNumId="17" w15:restartNumberingAfterBreak="0">
     <w:nsid w:val="2EDC66D7"/>
     <w:multiLevelType w:val="multilevel"/>
     <w:tmpl w:val="484CDF84"/>
@@ -8468,7 +10350,7 @@
       </w:rPr>
     </w:lvl>
   </w:abstractNum>
-  <w:abstractNum w:abstractNumId="16" w15:restartNumberingAfterBreak="0">
+  <w:abstractNum w:abstractNumId="18" w15:restartNumberingAfterBreak="0">
     <w:nsid w:val="2F3960A5"/>
     <w:multiLevelType w:val="multilevel"/>
     <w:tmpl w:val="C5E2EACE"/>
@@ -8617,7 +10499,156 @@
       </w:rPr>
     </w:lvl>
   </w:abstractNum>
-  <w:abstractNum w:abstractNumId="17" w15:restartNumberingAfterBreak="0">
+  <w:abstractNum w:abstractNumId="19" w15:restartNumberingAfterBreak="0">
+    <w:nsid w:val="391764DC"/>
+    <w:multiLevelType w:val="multilevel"/>
+    <w:tmpl w:val="31FAB04C"/>
+    <w:lvl w:ilvl="0">
+      <w:start w:val="1"/>
+      <w:numFmt w:val="bullet"/>
+      <w:lvlText w:val=""/>
+      <w:lvlJc w:val="left"/>
+      <w:pPr>
+        <w:tabs>
+          <w:tab w:val="num" w:pos="720"/>
+        </w:tabs>
+        <w:ind w:left="720" w:hanging="360"/>
+      </w:pPr>
+      <w:rPr>
+        <w:rFonts w:ascii="Symbol" w:hAnsi="Symbol" w:hint="default"/>
+        <w:sz w:val="20"/>
+      </w:rPr>
+    </w:lvl>
+    <w:lvl w:ilvl="1" w:tentative="1">
+      <w:start w:val="1"/>
+      <w:numFmt w:val="bullet"/>
+      <w:lvlText w:val="o"/>
+      <w:lvlJc w:val="left"/>
+      <w:pPr>
+        <w:tabs>
+          <w:tab w:val="num" w:pos="1440"/>
+        </w:tabs>
+        <w:ind w:left="1440" w:hanging="360"/>
+      </w:pPr>
+      <w:rPr>
+        <w:rFonts w:ascii="Courier New" w:hAnsi="Courier New" w:hint="default"/>
+        <w:sz w:val="20"/>
+      </w:rPr>
+    </w:lvl>
+    <w:lvl w:ilvl="2" w:tentative="1">
+      <w:start w:val="1"/>
+      <w:numFmt w:val="bullet"/>
+      <w:lvlText w:val=""/>
+      <w:lvlJc w:val="left"/>
+      <w:pPr>
+        <w:tabs>
+          <w:tab w:val="num" w:pos="2160"/>
+        </w:tabs>
+        <w:ind w:left="2160" w:hanging="360"/>
+      </w:pPr>
+      <w:rPr>
+        <w:rFonts w:ascii="Wingdings" w:hAnsi="Wingdings" w:hint="default"/>
+        <w:sz w:val="20"/>
+      </w:rPr>
+    </w:lvl>
+    <w:lvl w:ilvl="3" w:tentative="1">
+      <w:start w:val="1"/>
+      <w:numFmt w:val="bullet"/>
+      <w:lvlText w:val=""/>
+      <w:lvlJc w:val="left"/>
+      <w:pPr>
+        <w:tabs>
+          <w:tab w:val="num" w:pos="2880"/>
+        </w:tabs>
+        <w:ind w:left="2880" w:hanging="360"/>
+      </w:pPr>
+      <w:rPr>
+        <w:rFonts w:ascii="Wingdings" w:hAnsi="Wingdings" w:hint="default"/>
+        <w:sz w:val="20"/>
+      </w:rPr>
+    </w:lvl>
+    <w:lvl w:ilvl="4" w:tentative="1">
+      <w:start w:val="1"/>
+      <w:numFmt w:val="bullet"/>
+      <w:lvlText w:val=""/>
+      <w:lvlJc w:val="left"/>
+      <w:pPr>
+        <w:tabs>
+          <w:tab w:val="num" w:pos="3600"/>
+        </w:tabs>
+        <w:ind w:left="3600" w:hanging="360"/>
+      </w:pPr>
+      <w:rPr>
+        <w:rFonts w:ascii="Wingdings" w:hAnsi="Wingdings" w:hint="default"/>
+        <w:sz w:val="20"/>
+      </w:rPr>
+    </w:lvl>
+    <w:lvl w:ilvl="5" w:tentative="1">
+      <w:start w:val="1"/>
+      <w:numFmt w:val="bullet"/>
+      <w:lvlText w:val=""/>
+      <w:lvlJc w:val="left"/>
+      <w:pPr>
+        <w:tabs>
+          <w:tab w:val="num" w:pos="4320"/>
+        </w:tabs>
+        <w:ind w:left="4320" w:hanging="360"/>
+      </w:pPr>
+      <w:rPr>
+        <w:rFonts w:ascii="Wingdings" w:hAnsi="Wingdings" w:hint="default"/>
+        <w:sz w:val="20"/>
+      </w:rPr>
+    </w:lvl>
+    <w:lvl w:ilvl="6" w:tentative="1">
+      <w:start w:val="1"/>
+      <w:numFmt w:val="bullet"/>
+      <w:lvlText w:val=""/>
+      <w:lvlJc w:val="left"/>
+      <w:pPr>
+        <w:tabs>
+          <w:tab w:val="num" w:pos="5040"/>
+        </w:tabs>
+        <w:ind w:left="5040" w:hanging="360"/>
+      </w:pPr>
+      <w:rPr>
+        <w:rFonts w:ascii="Wingdings" w:hAnsi="Wingdings" w:hint="default"/>
+        <w:sz w:val="20"/>
+      </w:rPr>
+    </w:lvl>
+    <w:lvl w:ilvl="7" w:tentative="1">
+      <w:start w:val="1"/>
+      <w:numFmt w:val="bullet"/>
+      <w:lvlText w:val=""/>
+      <w:lvlJc w:val="left"/>
+      <w:pPr>
+        <w:tabs>
+          <w:tab w:val="num" w:pos="5760"/>
+        </w:tabs>
+        <w:ind w:left="5760" w:hanging="360"/>
+      </w:pPr>
+      <w:rPr>
+        <w:rFonts w:ascii="Wingdings" w:hAnsi="Wingdings" w:hint="default"/>
+        <w:sz w:val="20"/>
+      </w:rPr>
+    </w:lvl>
+    <w:lvl w:ilvl="8" w:tentative="1">
+      <w:start w:val="1"/>
+      <w:numFmt w:val="bullet"/>
+      <w:lvlText w:val=""/>
+      <w:lvlJc w:val="left"/>
+      <w:pPr>
+        <w:tabs>
+          <w:tab w:val="num" w:pos="6480"/>
+        </w:tabs>
+        <w:ind w:left="6480" w:hanging="360"/>
+      </w:pPr>
+      <w:rPr>
+        <w:rFonts w:ascii="Wingdings" w:hAnsi="Wingdings" w:hint="default"/>
+        <w:sz w:val="20"/>
+      </w:rPr>
+    </w:lvl>
+  </w:abstractNum>
+  <w:abstractNum w:abstractNumId="20" w15:restartNumberingAfterBreak="0">
     <w:nsid w:val="3CEB3B07"/>
     <w:multiLevelType w:val="multilevel"/>
     <w:tmpl w:val="6C903DEA"/>
@@ -8766,7 +10797,7 @@
       </w:rPr>
     </w:lvl>
   </w:abstractNum>
-  <w:abstractNum w:abstractNumId="18" w15:restartNumberingAfterBreak="0">
+  <w:abstractNum w:abstractNumId="21" w15:restartNumberingAfterBreak="0">
     <w:nsid w:val="3D1E6C5B"/>
     <w:multiLevelType w:val="multilevel"/>
     <w:tmpl w:val="7D5A8D26"/>
@@ -8915,7 +10946,7 @@
       </w:rPr>
     </w:lvl>
   </w:abstractNum>
-  <w:abstractNum w:abstractNumId="19" w15:restartNumberingAfterBreak="0">
+  <w:abstractNum w:abstractNumId="22" w15:restartNumberingAfterBreak="0">
     <w:nsid w:val="3E75593D"/>
     <w:multiLevelType w:val="multilevel"/>
     <w:tmpl w:val="77E60D1C"/>
@@ -9064,7 +11095,7 @@
       </w:rPr>
     </w:lvl>
   </w:abstractNum>
-  <w:abstractNum w:abstractNumId="20" w15:restartNumberingAfterBreak="0">
+  <w:abstractNum w:abstractNumId="23" w15:restartNumberingAfterBreak="0">
     <w:nsid w:val="3FE16A64"/>
     <w:multiLevelType w:val="multilevel"/>
     <w:tmpl w:val="BAF6EC1C"/>
@@ -9213,7 +11244,7 @@
       </w:rPr>
     </w:lvl>
   </w:abstractNum>
-  <w:abstractNum w:abstractNumId="21" w15:restartNumberingAfterBreak="0">
+  <w:abstractNum w:abstractNumId="24" w15:restartNumberingAfterBreak="0">
     <w:nsid w:val="485658D2"/>
     <w:multiLevelType w:val="hybridMultilevel"/>
     <w:tmpl w:val="62946024"/>
@@ -9326,7 +11357,7 @@
       </w:rPr>
     </w:lvl>
   </w:abstractNum>
-  <w:abstractNum w:abstractNumId="22" w15:restartNumberingAfterBreak="0">
+  <w:abstractNum w:abstractNumId="25" w15:restartNumberingAfterBreak="0">
     <w:nsid w:val="4D6C676B"/>
     <w:multiLevelType w:val="multilevel"/>
     <w:tmpl w:val="864695D8"/>
@@ -9475,7 +11506,7 @@
       </w:rPr>
     </w:lvl>
   </w:abstractNum>
-  <w:abstractNum w:abstractNumId="23" w15:restartNumberingAfterBreak="0">
+  <w:abstractNum w:abstractNumId="26" w15:restartNumberingAfterBreak="0">
     <w:nsid w:val="4EC51907"/>
     <w:multiLevelType w:val="multilevel"/>
     <w:tmpl w:val="B9D0FF78"/>
@@ -9624,7 +11655,156 @@
       </w:rPr>
     </w:lvl>
   </w:abstractNum>
-  <w:abstractNum w:abstractNumId="24" w15:restartNumberingAfterBreak="0">
+  <w:abstractNum w:abstractNumId="27" w15:restartNumberingAfterBreak="0">
+    <w:nsid w:val="4F720D32"/>
+    <w:multiLevelType w:val="multilevel"/>
+    <w:tmpl w:val="C0FE42C6"/>
+    <w:lvl w:ilvl="0">
+      <w:start w:val="1"/>
+      <w:numFmt w:val="bullet"/>
+      <w:lvlText w:val=""/>
+      <w:lvlJc w:val="left"/>
+      <w:pPr>
+        <w:tabs>
+          <w:tab w:val="num" w:pos="720"/>
+        </w:tabs>
+        <w:ind w:left="720" w:hanging="360"/>
+      </w:pPr>
+      <w:rPr>
+        <w:rFonts w:ascii="Symbol" w:hAnsi="Symbol" w:hint="default"/>
+        <w:sz w:val="20"/>
+      </w:rPr>
+    </w:lvl>
+    <w:lvl w:ilvl="1" w:tentative="1">
+      <w:start w:val="1"/>
+      <w:numFmt w:val="bullet"/>
+      <w:lvlText w:val="o"/>
+      <w:lvlJc w:val="left"/>
+      <w:pPr>
+        <w:tabs>
+          <w:tab w:val="num" w:pos="1440"/>
+        </w:tabs>
+        <w:ind w:left="1440" w:hanging="360"/>
+      </w:pPr>
+      <w:rPr>
+        <w:rFonts w:ascii="Courier New" w:hAnsi="Courier New" w:hint="default"/>
+        <w:sz w:val="20"/>
+      </w:rPr>
+    </w:lvl>
+    <w:lvl w:ilvl="2" w:tentative="1">
+      <w:start w:val="1"/>
+      <w:numFmt w:val="bullet"/>
+      <w:lvlText w:val=""/>
+      <w:lvlJc w:val="left"/>
+      <w:pPr>
+        <w:tabs>
+          <w:tab w:val="num" w:pos="2160"/>
+        </w:tabs>
+        <w:ind w:left="2160" w:hanging="360"/>
+      </w:pPr>
+      <w:rPr>
+        <w:rFonts w:ascii="Wingdings" w:hAnsi="Wingdings" w:hint="default"/>
+        <w:sz w:val="20"/>
+      </w:rPr>
+    </w:lvl>
+    <w:lvl w:ilvl="3" w:tentative="1">
+      <w:start w:val="1"/>
+      <w:numFmt w:val="bullet"/>
+      <w:lvlText w:val=""/>
+      <w:lvlJc w:val="left"/>
+      <w:pPr>
+        <w:tabs>
+          <w:tab w:val="num" w:pos="2880"/>
+        </w:tabs>
+        <w:ind w:left="2880" w:hanging="360"/>
+      </w:pPr>
+      <w:rPr>
+        <w:rFonts w:ascii="Wingdings" w:hAnsi="Wingdings" w:hint="default"/>
+        <w:sz w:val="20"/>
+      </w:rPr>
+    </w:lvl>
+    <w:lvl w:ilvl="4" w:tentative="1">
+      <w:start w:val="1"/>
+      <w:numFmt w:val="bullet"/>
+      <w:lvlText w:val=""/>
+      <w:lvlJc w:val="left"/>
+      <w:pPr>
+        <w:tabs>
+          <w:tab w:val="num" w:pos="3600"/>
+        </w:tabs>
+        <w:ind w:left="3600" w:hanging="360"/>
+      </w:pPr>
+      <w:rPr>
+        <w:rFonts w:ascii="Wingdings" w:hAnsi="Wingdings" w:hint="default"/>
+        <w:sz w:val="20"/>
+      </w:rPr>
+    </w:lvl>
+    <w:lvl w:ilvl="5" w:tentative="1">
+      <w:start w:val="1"/>
+      <w:numFmt w:val="bullet"/>
+      <w:lvlText w:val=""/>
+      <w:lvlJc w:val="left"/>
+      <w:pPr>
+        <w:tabs>
+          <w:tab w:val="num" w:pos="4320"/>
+        </w:tabs>
+        <w:ind w:left="4320" w:hanging="360"/>
+      </w:pPr>
+      <w:rPr>
+        <w:rFonts w:ascii="Wingdings" w:hAnsi="Wingdings" w:hint="default"/>
+        <w:sz w:val="20"/>
+      </w:rPr>
+    </w:lvl>
+    <w:lvl w:ilvl="6" w:tentative="1">
+      <w:start w:val="1"/>
+      <w:numFmt w:val="bullet"/>
+      <w:lvlText w:val=""/>
+      <w:lvlJc w:val="left"/>
+      <w:pPr>
+        <w:tabs>
+          <w:tab w:val="num" w:pos="5040"/>
+        </w:tabs>
+        <w:ind w:left="5040" w:hanging="360"/>
+      </w:pPr>
+      <w:rPr>
+        <w:rFonts w:ascii="Wingdings" w:hAnsi="Wingdings" w:hint="default"/>
+        <w:sz w:val="20"/>
+      </w:rPr>
+    </w:lvl>
+    <w:lvl w:ilvl="7" w:tentative="1">
+      <w:start w:val="1"/>
+      <w:numFmt w:val="bullet"/>
+      <w:lvlText w:val=""/>
+      <w:lvlJc w:val="left"/>
+      <w:pPr>
+        <w:tabs>
+          <w:tab w:val="num" w:pos="5760"/>
+        </w:tabs>
+        <w:ind w:left="5760" w:hanging="360"/>
+      </w:pPr>
+      <w:rPr>
+        <w:rFonts w:ascii="Wingdings" w:hAnsi="Wingdings" w:hint="default"/>
+        <w:sz w:val="20"/>
+      </w:rPr>
+    </w:lvl>
+    <w:lvl w:ilvl="8" w:tentative="1">
+      <w:start w:val="1"/>
+      <w:numFmt w:val="bullet"/>
+      <w:lvlText w:val=""/>
+      <w:lvlJc w:val="left"/>
+      <w:pPr>
+        <w:tabs>
+          <w:tab w:val="num" w:pos="6480"/>
+        </w:tabs>
+        <w:ind w:left="6480" w:hanging="360"/>
+      </w:pPr>
+      <w:rPr>
+        <w:rFonts w:ascii="Wingdings" w:hAnsi="Wingdings" w:hint="default"/>
+        <w:sz w:val="20"/>
+      </w:rPr>
+    </w:lvl>
+  </w:abstractNum>
+  <w:abstractNum w:abstractNumId="28" w15:restartNumberingAfterBreak="0">
     <w:nsid w:val="53F5143F"/>
     <w:multiLevelType w:val="hybridMultilevel"/>
     <w:tmpl w:val="B2005722"/>
@@ -9737,7 +11917,7 @@
       </w:rPr>
     </w:lvl>
   </w:abstractNum>
-  <w:abstractNum w:abstractNumId="25" w15:restartNumberingAfterBreak="0">
+  <w:abstractNum w:abstractNumId="29" w15:restartNumberingAfterBreak="0">
     <w:nsid w:val="5418548D"/>
     <w:multiLevelType w:val="multilevel"/>
     <w:tmpl w:val="F3745D64"/>
@@ -9886,7 +12066,7 @@
       </w:rPr>
     </w:lvl>
   </w:abstractNum>
-  <w:abstractNum w:abstractNumId="26" w15:restartNumberingAfterBreak="0">
+  <w:abstractNum w:abstractNumId="30" w15:restartNumberingAfterBreak="0">
     <w:nsid w:val="54E51C22"/>
     <w:multiLevelType w:val="hybridMultilevel"/>
     <w:tmpl w:val="D9A89FBA"/>
@@ -9999,7 +12179,7 @@
       </w:rPr>
     </w:lvl>
   </w:abstractNum>
-  <w:abstractNum w:abstractNumId="27" w15:restartNumberingAfterBreak="0">
+  <w:abstractNum w:abstractNumId="31" w15:restartNumberingAfterBreak="0">
     <w:nsid w:val="56141124"/>
     <w:multiLevelType w:val="multilevel"/>
     <w:tmpl w:val="72CECC2A"/>
@@ -10148,7 +12328,7 @@
       </w:rPr>
     </w:lvl>
   </w:abstractNum>
-  <w:abstractNum w:abstractNumId="28" w15:restartNumberingAfterBreak="0">
+  <w:abstractNum w:abstractNumId="32" w15:restartNumberingAfterBreak="0">
     <w:nsid w:val="5BD530F4"/>
     <w:multiLevelType w:val="multilevel"/>
     <w:tmpl w:val="85BE4242"/>
@@ -10297,7 +12477,7 @@
       </w:rPr>
     </w:lvl>
   </w:abstractNum>
-  <w:abstractNum w:abstractNumId="29" w15:restartNumberingAfterBreak="0">
+  <w:abstractNum w:abstractNumId="33" w15:restartNumberingAfterBreak="0">
     <w:nsid w:val="5F797678"/>
     <w:multiLevelType w:val="multilevel"/>
     <w:tmpl w:val="4BE291F8"/>
@@ -10446,7 +12626,7 @@
       </w:rPr>
     </w:lvl>
   </w:abstractNum>
-  <w:abstractNum w:abstractNumId="30" w15:restartNumberingAfterBreak="0">
+  <w:abstractNum w:abstractNumId="34" w15:restartNumberingAfterBreak="0">
     <w:nsid w:val="64B00720"/>
     <w:multiLevelType w:val="multilevel"/>
     <w:tmpl w:val="ECA4E594"/>
@@ -10595,7 +12775,7 @@
       </w:rPr>
     </w:lvl>
   </w:abstractNum>
-  <w:abstractNum w:abstractNumId="31" w15:restartNumberingAfterBreak="0">
+  <w:abstractNum w:abstractNumId="35" w15:restartNumberingAfterBreak="0">
     <w:nsid w:val="64D8791F"/>
     <w:multiLevelType w:val="multilevel"/>
     <w:tmpl w:val="C818DFEE"/>
@@ -10744,7 +12924,7 @@
       </w:rPr>
     </w:lvl>
   </w:abstractNum>
-  <w:abstractNum w:abstractNumId="32" w15:restartNumberingAfterBreak="0">
+  <w:abstractNum w:abstractNumId="36" w15:restartNumberingAfterBreak="0">
     <w:nsid w:val="6D3E2179"/>
     <w:multiLevelType w:val="multilevel"/>
     <w:tmpl w:val="CAE0758E"/>
@@ -10893,7 +13073,305 @@
       </w:rPr>
     </w:lvl>
   </w:abstractNum>
-  <w:abstractNum w:abstractNumId="33" w15:restartNumberingAfterBreak="0">
+  <w:abstractNum w:abstractNumId="37" w15:restartNumberingAfterBreak="0">
+    <w:nsid w:val="6E6A33B4"/>
+    <w:multiLevelType w:val="multilevel"/>
+    <w:tmpl w:val="95FC9004"/>
+    <w:lvl w:ilvl="0">
+      <w:start w:val="1"/>
+      <w:numFmt w:val="bullet"/>
+      <w:lvlText w:val=""/>
+      <w:lvlJc w:val="left"/>
+      <w:pPr>
+        <w:tabs>
+          <w:tab w:val="num" w:pos="720"/>
+        </w:tabs>
+        <w:ind w:left="720" w:hanging="360"/>
+      </w:pPr>
+      <w:rPr>
+        <w:rFonts w:ascii="Symbol" w:hAnsi="Symbol" w:hint="default"/>
+        <w:sz w:val="20"/>
+      </w:rPr>
+    </w:lvl>
+    <w:lvl w:ilvl="1" w:tentative="1">
+      <w:start w:val="1"/>
+      <w:numFmt w:val="bullet"/>
+      <w:lvlText w:val="o"/>
+      <w:lvlJc w:val="left"/>
+      <w:pPr>
+        <w:tabs>
+          <w:tab w:val="num" w:pos="1440"/>
+        </w:tabs>
+        <w:ind w:left="1440" w:hanging="360"/>
+      </w:pPr>
+      <w:rPr>
+        <w:rFonts w:ascii="Courier New" w:hAnsi="Courier New" w:hint="default"/>
+        <w:sz w:val="20"/>
+      </w:rPr>
+    </w:lvl>
+    <w:lvl w:ilvl="2" w:tentative="1">
+      <w:start w:val="1"/>
+      <w:numFmt w:val="bullet"/>
+      <w:lvlText w:val=""/>
+      <w:lvlJc w:val="left"/>
+      <w:pPr>
+        <w:tabs>
+          <w:tab w:val="num" w:pos="2160"/>
+        </w:tabs>
+        <w:ind w:left="2160" w:hanging="360"/>
+      </w:pPr>
+      <w:rPr>
+        <w:rFonts w:ascii="Wingdings" w:hAnsi="Wingdings" w:hint="default"/>
+        <w:sz w:val="20"/>
+      </w:rPr>
+    </w:lvl>
+    <w:lvl w:ilvl="3" w:tentative="1">
+      <w:start w:val="1"/>
+      <w:numFmt w:val="bullet"/>
+      <w:lvlText w:val=""/>
+      <w:lvlJc w:val="left"/>
+      <w:pPr>
+        <w:tabs>
+          <w:tab w:val="num" w:pos="2880"/>
+        </w:tabs>
+        <w:ind w:left="2880" w:hanging="360"/>
+      </w:pPr>
+      <w:rPr>
+        <w:rFonts w:ascii="Wingdings" w:hAnsi="Wingdings" w:hint="default"/>
+        <w:sz w:val="20"/>
+      </w:rPr>
+    </w:lvl>
+    <w:lvl w:ilvl="4" w:tentative="1">
+      <w:start w:val="1"/>
+      <w:numFmt w:val="bullet"/>
+      <w:lvlText w:val=""/>
+      <w:lvlJc w:val="left"/>
+      <w:pPr>
+        <w:tabs>
+          <w:tab w:val="num" w:pos="3600"/>
+        </w:tabs>
+        <w:ind w:left="3600" w:hanging="360"/>
+      </w:pPr>
+      <w:rPr>
+        <w:rFonts w:ascii="Wingdings" w:hAnsi="Wingdings" w:hint="default"/>
+        <w:sz w:val="20"/>
+      </w:rPr>
+    </w:lvl>
+    <w:lvl w:ilvl="5" w:tentative="1">
+      <w:start w:val="1"/>
+      <w:numFmt w:val="bullet"/>
+      <w:lvlText w:val=""/>
+      <w:lvlJc w:val="left"/>
+      <w:pPr>
+        <w:tabs>
+          <w:tab w:val="num" w:pos="4320"/>
+        </w:tabs>
+        <w:ind w:left="4320" w:hanging="360"/>
+      </w:pPr>
+      <w:rPr>
+        <w:rFonts w:ascii="Wingdings" w:hAnsi="Wingdings" w:hint="default"/>
+        <w:sz w:val="20"/>
+      </w:rPr>
+    </w:lvl>
+    <w:lvl w:ilvl="6" w:tentative="1">
+      <w:start w:val="1"/>
+      <w:numFmt w:val="bullet"/>
+      <w:lvlText w:val=""/>
+      <w:lvlJc w:val="left"/>
+      <w:pPr>
+        <w:tabs>
+          <w:tab w:val="num" w:pos="5040"/>
+        </w:tabs>
+        <w:ind w:left="5040" w:hanging="360"/>
+      </w:pPr>
+      <w:rPr>
+        <w:rFonts w:ascii="Wingdings" w:hAnsi="Wingdings" w:hint="default"/>
+        <w:sz w:val="20"/>
+      </w:rPr>
+    </w:lvl>
+    <w:lvl w:ilvl="7" w:tentative="1">
+      <w:start w:val="1"/>
+      <w:numFmt w:val="bullet"/>
+      <w:lvlText w:val=""/>
+      <w:lvlJc w:val="left"/>
+      <w:pPr>
+        <w:tabs>
+          <w:tab w:val="num" w:pos="5760"/>
+        </w:tabs>
+        <w:ind w:left="5760" w:hanging="360"/>
+      </w:pPr>
+      <w:rPr>
+        <w:rFonts w:ascii="Wingdings" w:hAnsi="Wingdings" w:hint="default"/>
+        <w:sz w:val="20"/>
+      </w:rPr>
+    </w:lvl>
+    <w:lvl w:ilvl="8" w:tentative="1">
+      <w:start w:val="1"/>
+      <w:numFmt w:val="bullet"/>
+      <w:lvlText w:val=""/>
+      <w:lvlJc w:val="left"/>
+      <w:pPr>
+        <w:tabs>
+          <w:tab w:val="num" w:pos="6480"/>
+        </w:tabs>
+        <w:ind w:left="6480" w:hanging="360"/>
+      </w:pPr>
+      <w:rPr>
+        <w:rFonts w:ascii="Wingdings" w:hAnsi="Wingdings" w:hint="default"/>
+        <w:sz w:val="20"/>
+      </w:rPr>
+    </w:lvl>
+  </w:abstractNum>
+  <w:abstractNum w:abstractNumId="38" w15:restartNumberingAfterBreak="0">
+    <w:nsid w:val="714D5569"/>
+    <w:multiLevelType w:val="multilevel"/>
+    <w:tmpl w:val="CD0AA0D6"/>
+    <w:lvl w:ilvl="0">
+      <w:start w:val="1"/>
+      <w:numFmt w:val="bullet"/>
+      <w:lvlText w:val=""/>
+      <w:lvlJc w:val="left"/>
+      <w:pPr>
+        <w:tabs>
+          <w:tab w:val="num" w:pos="720"/>
+        </w:tabs>
+        <w:ind w:left="720" w:hanging="360"/>
+      </w:pPr>
+      <w:rPr>
+        <w:rFonts w:ascii="Symbol" w:hAnsi="Symbol" w:hint="default"/>
+        <w:sz w:val="20"/>
+      </w:rPr>
+    </w:lvl>
+    <w:lvl w:ilvl="1" w:tentative="1">
+      <w:start w:val="1"/>
+      <w:numFmt w:val="bullet"/>
+      <w:lvlText w:val="o"/>
+      <w:lvlJc w:val="left"/>
+      <w:pPr>
+        <w:tabs>
+          <w:tab w:val="num" w:pos="1440"/>
+        </w:tabs>
+        <w:ind w:left="1440" w:hanging="360"/>
+      </w:pPr>
+      <w:rPr>
+        <w:rFonts w:ascii="Courier New" w:hAnsi="Courier New" w:hint="default"/>
+        <w:sz w:val="20"/>
+      </w:rPr>
+    </w:lvl>
+    <w:lvl w:ilvl="2" w:tentative="1">
+      <w:start w:val="1"/>
+      <w:numFmt w:val="bullet"/>
+      <w:lvlText w:val=""/>
+      <w:lvlJc w:val="left"/>
+      <w:pPr>
+        <w:tabs>
+          <w:tab w:val="num" w:pos="2160"/>
+        </w:tabs>
+        <w:ind w:left="2160" w:hanging="360"/>
+      </w:pPr>
+      <w:rPr>
+        <w:rFonts w:ascii="Wingdings" w:hAnsi="Wingdings" w:hint="default"/>
+        <w:sz w:val="20"/>
+      </w:rPr>
+    </w:lvl>
+    <w:lvl w:ilvl="3" w:tentative="1">
+      <w:start w:val="1"/>
+      <w:numFmt w:val="bullet"/>
+      <w:lvlText w:val=""/>
+      <w:lvlJc w:val="left"/>
+      <w:pPr>
+        <w:tabs>
+          <w:tab w:val="num" w:pos="2880"/>
+        </w:tabs>
+        <w:ind w:left="2880" w:hanging="360"/>
+      </w:pPr>
+      <w:rPr>
+        <w:rFonts w:ascii="Wingdings" w:hAnsi="Wingdings" w:hint="default"/>
+        <w:sz w:val="20"/>
+      </w:rPr>
+    </w:lvl>
+    <w:lvl w:ilvl="4" w:tentative="1">
+      <w:start w:val="1"/>
+      <w:numFmt w:val="bullet"/>
+      <w:lvlText w:val=""/>
+      <w:lvlJc w:val="left"/>
+      <w:pPr>
+        <w:tabs>
+          <w:tab w:val="num" w:pos="3600"/>
+        </w:tabs>
+        <w:ind w:left="3600" w:hanging="360"/>
+      </w:pPr>
+      <w:rPr>
+        <w:rFonts w:ascii="Wingdings" w:hAnsi="Wingdings" w:hint="default"/>
+        <w:sz w:val="20"/>
+      </w:rPr>
+    </w:lvl>
+    <w:lvl w:ilvl="5" w:tentative="1">
+      <w:start w:val="1"/>
+      <w:numFmt w:val="bullet"/>
+      <w:lvlText w:val=""/>
+      <w:lvlJc w:val="left"/>
+      <w:pPr>
+        <w:tabs>
+          <w:tab w:val="num" w:pos="4320"/>
+        </w:tabs>
+        <w:ind w:left="4320" w:hanging="360"/>
+      </w:pPr>
+      <w:rPr>
+        <w:rFonts w:ascii="Wingdings" w:hAnsi="Wingdings" w:hint="default"/>
+        <w:sz w:val="20"/>
+      </w:rPr>
+    </w:lvl>
+    <w:lvl w:ilvl="6" w:tentative="1">
+      <w:start w:val="1"/>
+      <w:numFmt w:val="bullet"/>
+      <w:lvlText w:val=""/>
+      <w:lvlJc w:val="left"/>
+      <w:pPr>
+        <w:tabs>
+          <w:tab w:val="num" w:pos="5040"/>
+        </w:tabs>
+        <w:ind w:left="5040" w:hanging="360"/>
+      </w:pPr>
+      <w:rPr>
+        <w:rFonts w:ascii="Wingdings" w:hAnsi="Wingdings" w:hint="default"/>
+        <w:sz w:val="20"/>
+      </w:rPr>
+    </w:lvl>
+    <w:lvl w:ilvl="7" w:tentative="1">
+      <w:start w:val="1"/>
+      <w:numFmt w:val="bullet"/>
+      <w:lvlText w:val=""/>
+      <w:lvlJc w:val="left"/>
+      <w:pPr>
+        <w:tabs>
+          <w:tab w:val="num" w:pos="5760"/>
+        </w:tabs>
+        <w:ind w:left="5760" w:hanging="360"/>
+      </w:pPr>
+      <w:rPr>
+        <w:rFonts w:ascii="Wingdings" w:hAnsi="Wingdings" w:hint="default"/>
+        <w:sz w:val="20"/>
+      </w:rPr>
+    </w:lvl>
+    <w:lvl w:ilvl="8" w:tentative="1">
+      <w:start w:val="1"/>
+      <w:numFmt w:val="bullet"/>
+      <w:lvlText w:val=""/>
+      <w:lvlJc w:val="left"/>
+      <w:pPr>
+        <w:tabs>
+          <w:tab w:val="num" w:pos="6480"/>
+        </w:tabs>
+        <w:ind w:left="6480" w:hanging="360"/>
+      </w:pPr>
+      <w:rPr>
+        <w:rFonts w:ascii="Wingdings" w:hAnsi="Wingdings" w:hint="default"/>
+        <w:sz w:val="20"/>
+      </w:rPr>
+    </w:lvl>
+  </w:abstractNum>
+  <w:abstractNum w:abstractNumId="39" w15:restartNumberingAfterBreak="0">
     <w:nsid w:val="73042D32"/>
     <w:multiLevelType w:val="hybridMultilevel"/>
     <w:tmpl w:val="1EF05924"/>
@@ -11006,7 +13484,7 @@
       </w:rPr>
     </w:lvl>
   </w:abstractNum>
-  <w:abstractNum w:abstractNumId="34" w15:restartNumberingAfterBreak="0">
+  <w:abstractNum w:abstractNumId="40" w15:restartNumberingAfterBreak="0">
     <w:nsid w:val="77AE223B"/>
     <w:multiLevelType w:val="multilevel"/>
     <w:tmpl w:val="E7AC683A"/>
@@ -11155,7 +13633,7 @@
       </w:rPr>
     </w:lvl>
   </w:abstractNum>
-  <w:abstractNum w:abstractNumId="35" w15:restartNumberingAfterBreak="0">
+  <w:abstractNum w:abstractNumId="41" w15:restartNumberingAfterBreak="0">
     <w:nsid w:val="7C261037"/>
     <w:multiLevelType w:val="multilevel"/>
     <w:tmpl w:val="910E7076"/>
@@ -11304,7 +13782,7 @@
       </w:rPr>
     </w:lvl>
   </w:abstractNum>
-  <w:abstractNum w:abstractNumId="36" w15:restartNumberingAfterBreak="0">
+  <w:abstractNum w:abstractNumId="42" w15:restartNumberingAfterBreak="0">
     <w:nsid w:val="7C3B2547"/>
     <w:multiLevelType w:val="multilevel"/>
     <w:tmpl w:val="B18CE0AE"/>
@@ -11453,7 +13931,7 @@
       </w:rPr>
     </w:lvl>
   </w:abstractNum>
-  <w:abstractNum w:abstractNumId="37" w15:restartNumberingAfterBreak="0">
+  <w:abstractNum w:abstractNumId="43" w15:restartNumberingAfterBreak="0">
     <w:nsid w:val="7C495741"/>
     <w:multiLevelType w:val="multilevel"/>
     <w:tmpl w:val="31921748"/>
@@ -11567,118 +14045,136 @@
     </w:lvl>
   </w:abstractNum>
   <w:num w:numId="1">
-    <w:abstractNumId w:val="11"/>
+    <w:abstractNumId w:val="13"/>
   </w:num>
   <w:num w:numId="2">
-    <w:abstractNumId w:val="6"/>
+    <w:abstractNumId w:val="8"/>
   </w:num>
   <w:num w:numId="3">
-    <w:abstractNumId w:val="20"/>
+    <w:abstractNumId w:val="23"/>
   </w:num>
   <w:num w:numId="4">
-    <w:abstractNumId w:val="27"/>
+    <w:abstractNumId w:val="31"/>
   </w:num>
   <w:num w:numId="5">
     <w:abstractNumId w:val="1"/>
   </w:num>
   <w:num w:numId="6">
-    <w:abstractNumId w:val="35"/>
+    <w:abstractNumId w:val="41"/>
   </w:num>
   <w:num w:numId="7">
-    <w:abstractNumId w:val="36"/>
+    <w:abstractNumId w:val="42"/>
   </w:num>
   <w:num w:numId="8">
-    <w:abstractNumId w:val="34"/>
+    <w:abstractNumId w:val="40"/>
   </w:num>
   <w:num w:numId="9">
     <w:abstractNumId w:val="2"/>
   </w:num>
   <w:num w:numId="10">
-    <w:abstractNumId w:val="8"/>
+    <w:abstractNumId w:val="10"/>
   </w:num>
   <w:num w:numId="11">
+    <w:abstractNumId w:val="32"/>
+  </w:num>
+  <w:num w:numId="12">
+    <w:abstractNumId w:val="15"/>
+  </w:num>
+  <w:num w:numId="13">
+    <w:abstractNumId w:val="36"/>
+  </w:num>
+  <w:num w:numId="14">
+    <w:abstractNumId w:val="11"/>
+  </w:num>
+  <w:num w:numId="15">
     <w:abstractNumId w:val="28"/>
   </w:num>
-  <w:num w:numId="12">
-    <w:abstractNumId w:val="13"/>
-  </w:num>
-  <w:num w:numId="13">
-    <w:abstractNumId w:val="32"/>
-  </w:num>
-  <w:num w:numId="14">
+  <w:num w:numId="16">
     <w:abstractNumId w:val="9"/>
   </w:num>
-  <w:num w:numId="15">
-    <w:abstractNumId w:val="24"/>
-  </w:num>
-  <w:num w:numId="16">
-    <w:abstractNumId w:val="7"/>
-  </w:num>
   <w:num w:numId="17">
-    <w:abstractNumId w:val="37"/>
+    <w:abstractNumId w:val="43"/>
   </w:num>
   <w:num w:numId="18">
-    <w:abstractNumId w:val="22"/>
+    <w:abstractNumId w:val="25"/>
   </w:num>
   <w:num w:numId="19">
     <w:abstractNumId w:val="0"/>
   </w:num>
   <w:num w:numId="20">
-    <w:abstractNumId w:val="23"/>
+    <w:abstractNumId w:val="26"/>
   </w:num>
   <w:num w:numId="21">
-    <w:abstractNumId w:val="31"/>
+    <w:abstractNumId w:val="35"/>
   </w:num>
   <w:num w:numId="22">
-    <w:abstractNumId w:val="18"/>
+    <w:abstractNumId w:val="21"/>
   </w:num>
   <w:num w:numId="23">
-    <w:abstractNumId w:val="15"/>
+    <w:abstractNumId w:val="17"/>
   </w:num>
   <w:num w:numId="24">
-    <w:abstractNumId w:val="25"/>
+    <w:abstractNumId w:val="29"/>
   </w:num>
   <w:num w:numId="25">
     <w:abstractNumId w:val="3"/>
   </w:num>
   <w:num w:numId="26">
+    <w:abstractNumId w:val="34"/>
+  </w:num>
+  <w:num w:numId="27">
+    <w:abstractNumId w:val="33"/>
+  </w:num>
+  <w:num w:numId="28">
+    <w:abstractNumId w:val="16"/>
+  </w:num>
+  <w:num w:numId="29">
+    <w:abstractNumId w:val="12"/>
+  </w:num>
+  <w:num w:numId="30">
+    <w:abstractNumId w:val="7"/>
+  </w:num>
+  <w:num w:numId="31">
+    <w:abstractNumId w:val="18"/>
+  </w:num>
+  <w:num w:numId="32">
+    <w:abstractNumId w:val="20"/>
+  </w:num>
+  <w:num w:numId="33">
+    <w:abstractNumId w:val="14"/>
+  </w:num>
+  <w:num w:numId="34">
+    <w:abstractNumId w:val="22"/>
+  </w:num>
+  <w:num w:numId="35">
+    <w:abstractNumId w:val="24"/>
+  </w:num>
+  <w:num w:numId="36">
     <w:abstractNumId w:val="30"/>
   </w:num>
-  <w:num w:numId="27">
-    <w:abstractNumId w:val="29"/>
-  </w:num>
-  <w:num w:numId="28">
-    <w:abstractNumId w:val="14"/>
-  </w:num>
-  <w:num w:numId="29">
-    <w:abstractNumId w:val="10"/>
-  </w:num>
-  <w:num w:numId="30">
+  <w:num w:numId="37">
     <w:abstractNumId w:val="5"/>
   </w:num>
-  <w:num w:numId="31">
-    <w:abstractNumId w:val="16"/>
+  <w:num w:numId="38">
+    <w:abstractNumId w:val="39"/>
   </w:num>
-  <w:num w:numId="32">
-    <w:abstractNumId w:val="17"/>
+  <w:num w:numId="39">
+    <w:abstractNumId w:val="6"/>
   </w:num>
-  <w:num w:numId="33">
-    <w:abstractNumId w:val="12"/>
+  <w:num w:numId="40">
+    <w:abstractNumId w:val="38"/>
   </w:num>
-  <w:num w:numId="34">
+  <w:num w:numId="41">
+    <w:abstractNumId w:val="27"/>
+  </w:num>
+  <w:num w:numId="42">
+    <w:abstractNumId w:val="4"/>
+  </w:num>
+  <w:num w:numId="43">
     <w:abstractNumId w:val="19"/>
   </w:num>
-  <w:num w:numId="35">
-    <w:abstractNumId w:val="21"/>
-  </w:num>
-  <w:num w:numId="36">
-    <w:abstractNumId w:val="26"/>
-  </w:num>
-  <w:num w:numId="37">
-    <w:abstractNumId w:val="4"/>
-  </w:num>
-  <w:num w:numId="38">
-    <w:abstractNumId w:val="33"/>
+  <w:num w:numId="44">
+    <w:abstractNumId w:val="37"/>
   </w:num>
   <w:numIdMacAtCleanup w:val="32"/>
 </w:numbering>
@@ -12077,7 +14573,7 @@
   <w:style w:type="paragraph" w:default="1" w:styleId="Normal">
     <w:name w:val="Normal"/>
     <w:qFormat/>
-    <w:rsid w:val="00007D94"/>
+    <w:rsid w:val="00DA7EFA"/>
   </w:style>
   <w:style w:type="paragraph" w:styleId="Heading2">
     <w:name w:val="heading 2"/>
@@ -12491,7 +14987,7 @@
 </file>
 
 <file path=customXml/itemProps1.xml><?xml version="1.0" encoding="utf-8"?>
-<ds:datastoreItem xmlns:ds="http://schemas.openxmlformats.org/officeDocument/2006/customXml" ds:itemID="{EE7ED8EF-14A9-47A1-89FD-CB334C83C2DC}">
+<ds:datastoreItem xmlns:ds="http://schemas.openxmlformats.org/officeDocument/2006/customXml" ds:itemID="{7ACCA65E-910C-4079-B9F3-DAF2932B35AD}">
   <ds:schemaRefs>
     <ds:schemaRef ds:uri="http://schemas.openxmlformats.org/officeDocument/2006/bibliography"/>
   </ds:schemaRefs>

</xml_diff>

<commit_message>
Dashboard UX refinements, widget interactions, and persistence services integration
</commit_message>
<xml_diff>
--- a/docs/01_Daily_Log.docx
+++ b/docs/01_Daily_Log.docx
@@ -4091,12 +4091,18 @@
       <w:pPr>
         <w:pStyle w:val="Heading2"/>
         <w:jc w:val="center"/>
+        <w:rPr>
+          <w:sz w:val="24"/>
+          <w:szCs w:val="24"/>
+        </w:rPr>
       </w:pPr>
       <w:r>
         <w:rPr>
           <w:rStyle w:val="Strong"/>
           <w:b/>
           <w:bCs/>
+          <w:sz w:val="24"/>
+          <w:szCs w:val="24"/>
         </w:rPr>
         <w:t>Frontend Desktop Shell &amp; Renderer Foundation</w:t>
       </w:r>
@@ -4120,12 +4126,18 @@
       <w:pPr>
         <w:pStyle w:val="Heading3"/>
         <w:spacing w:before="0" w:beforeAutospacing="0" w:after="0" w:afterAutospacing="0"/>
+        <w:rPr>
+          <w:sz w:val="24"/>
+          <w:szCs w:val="24"/>
+        </w:rPr>
       </w:pPr>
       <w:r>
         <w:rPr>
           <w:rStyle w:val="Strong"/>
           <w:b/>
           <w:bCs/>
+          <w:sz w:val="24"/>
+          <w:szCs w:val="24"/>
         </w:rPr>
         <w:t>Activities Performed</w:t>
       </w:r>
@@ -4216,17 +4228,17 @@
           <w:rFonts w:ascii="Times New Roman" w:eastAsia="Times New Roman" w:hAnsi="Times New Roman" w:cs="Times New Roman"/>
           <w:b/>
           <w:bCs/>
-          <w:sz w:val="27"/>
-          <w:szCs w:val="27"/>
-        </w:rPr>
-      </w:pPr>
-      <w:r>
-        <w:rPr>
-          <w:rFonts w:ascii="Times New Roman" w:eastAsia="Times New Roman" w:hAnsi="Times New Roman" w:cs="Times New Roman"/>
-          <w:b/>
-          <w:bCs/>
-          <w:sz w:val="27"/>
-          <w:szCs w:val="27"/>
+          <w:sz w:val="24"/>
+          <w:szCs w:val="24"/>
+        </w:rPr>
+      </w:pPr>
+      <w:r>
+        <w:rPr>
+          <w:rFonts w:ascii="Times New Roman" w:eastAsia="Times New Roman" w:hAnsi="Times New Roman" w:cs="Times New Roman"/>
+          <w:b/>
+          <w:bCs/>
+          <w:sz w:val="24"/>
+          <w:szCs w:val="24"/>
         </w:rPr>
         <w:t>Key Learnings</w:t>
       </w:r>
@@ -4381,12 +4393,18 @@
       <w:pPr>
         <w:pStyle w:val="Heading3"/>
         <w:spacing w:before="0" w:beforeAutospacing="0" w:after="0" w:afterAutospacing="0"/>
+        <w:rPr>
+          <w:sz w:val="24"/>
+          <w:szCs w:val="24"/>
+        </w:rPr>
       </w:pPr>
       <w:r>
         <w:rPr>
           <w:rStyle w:val="Strong"/>
           <w:b/>
           <w:bCs/>
+          <w:sz w:val="24"/>
+          <w:szCs w:val="24"/>
         </w:rPr>
         <w:t>Outcome</w:t>
       </w:r>
@@ -4438,17 +4456,17 @@
           <w:rFonts w:ascii="Times New Roman" w:eastAsia="Times New Roman" w:hAnsi="Times New Roman" w:cs="Times New Roman"/>
           <w:b/>
           <w:bCs/>
-          <w:sz w:val="27"/>
-          <w:szCs w:val="27"/>
-        </w:rPr>
-      </w:pPr>
-      <w:r>
-        <w:rPr>
-          <w:rFonts w:ascii="Times New Roman" w:eastAsia="Times New Roman" w:hAnsi="Times New Roman" w:cs="Times New Roman"/>
-          <w:b/>
-          <w:bCs/>
-          <w:sz w:val="27"/>
-          <w:szCs w:val="27"/>
+          <w:sz w:val="24"/>
+          <w:szCs w:val="24"/>
+        </w:rPr>
+      </w:pPr>
+      <w:r>
+        <w:rPr>
+          <w:rFonts w:ascii="Times New Roman" w:eastAsia="Times New Roman" w:hAnsi="Times New Roman" w:cs="Times New Roman"/>
+          <w:b/>
+          <w:bCs/>
+          <w:sz w:val="24"/>
+          <w:szCs w:val="24"/>
         </w:rPr>
         <w:t xml:space="preserve">Next Steps </w:t>
       </w:r>
@@ -4581,43 +4599,7 @@
           <w:szCs w:val="24"/>
         </w:rPr>
         <w:lastRenderedPageBreak/>
-        <w:t>Date: 15</w:t>
-      </w:r>
-      <w:r>
-        <w:rPr>
-          <w:rFonts w:ascii="Times New Roman" w:eastAsia="Times New Roman" w:hAnsi="Times New Roman" w:cs="Times New Roman"/>
-          <w:b/>
-          <w:sz w:val="24"/>
-          <w:szCs w:val="24"/>
-        </w:rPr>
-        <w:t xml:space="preserve">/01/2016                                                                                          </w:t>
-      </w:r>
-      <w:r>
-        <w:rPr>
-          <w:rFonts w:ascii="Times New Roman" w:eastAsia="Times New Roman" w:hAnsi="Times New Roman" w:cs="Times New Roman"/>
-          <w:b/>
-          <w:sz w:val="24"/>
-          <w:szCs w:val="24"/>
-        </w:rPr>
-        <w:t xml:space="preserve">       </w:t>
-      </w:r>
-      <w:r>
-        <w:rPr>
-          <w:rFonts w:ascii="Times New Roman" w:eastAsia="Times New Roman" w:hAnsi="Times New Roman" w:cs="Times New Roman"/>
-          <w:b/>
-          <w:sz w:val="24"/>
-          <w:szCs w:val="24"/>
-        </w:rPr>
-        <w:t xml:space="preserve">         </w:t>
-      </w:r>
-      <w:r>
-        <w:rPr>
-          <w:rFonts w:ascii="Times New Roman" w:eastAsia="Times New Roman" w:hAnsi="Times New Roman" w:cs="Times New Roman"/>
-          <w:b/>
-          <w:sz w:val="24"/>
-          <w:szCs w:val="24"/>
-        </w:rPr>
-        <w:t>Day 8</w:t>
+        <w:t>Date: 15/01/2016                                                                                                          Day 8</w:t>
       </w:r>
     </w:p>
     <w:p>
@@ -4668,16 +4650,32 @@
     <w:p>
       <w:pPr>
         <w:pStyle w:val="Heading2"/>
-      </w:pPr>
-      <w:r>
+        <w:rPr>
+          <w:sz w:val="24"/>
+          <w:szCs w:val="24"/>
+        </w:rPr>
+      </w:pPr>
+      <w:r>
+        <w:rPr>
+          <w:sz w:val="24"/>
+          <w:szCs w:val="24"/>
+        </w:rPr>
         <w:t>Frontend Control, Run-Aware UX &amp; Stability Hardening</w:t>
       </w:r>
     </w:p>
     <w:p>
       <w:pPr>
         <w:pStyle w:val="Heading3"/>
-      </w:pPr>
-      <w:r>
+        <w:rPr>
+          <w:sz w:val="24"/>
+          <w:szCs w:val="24"/>
+        </w:rPr>
+      </w:pPr>
+      <w:r>
+        <w:rPr>
+          <w:sz w:val="24"/>
+          <w:szCs w:val="24"/>
+        </w:rPr>
         <w:t>Activities Performed</w:t>
       </w:r>
     </w:p>
@@ -4797,17 +4795,17 @@
           <w:rFonts w:ascii="Times New Roman" w:eastAsia="Times New Roman" w:hAnsi="Times New Roman" w:cs="Times New Roman"/>
           <w:b/>
           <w:bCs/>
-          <w:sz w:val="27"/>
-          <w:szCs w:val="27"/>
-        </w:rPr>
-      </w:pPr>
-      <w:r>
-        <w:rPr>
-          <w:rFonts w:ascii="Times New Roman" w:eastAsia="Times New Roman" w:hAnsi="Times New Roman" w:cs="Times New Roman"/>
-          <w:b/>
-          <w:bCs/>
-          <w:sz w:val="27"/>
-          <w:szCs w:val="27"/>
+          <w:sz w:val="24"/>
+          <w:szCs w:val="24"/>
+        </w:rPr>
+      </w:pPr>
+      <w:r>
+        <w:rPr>
+          <w:rFonts w:ascii="Times New Roman" w:eastAsia="Times New Roman" w:hAnsi="Times New Roman" w:cs="Times New Roman"/>
+          <w:b/>
+          <w:bCs/>
+          <w:sz w:val="24"/>
+          <w:szCs w:val="24"/>
         </w:rPr>
         <w:t>Outcome of the Day</w:t>
       </w:r>
@@ -5002,17 +5000,17 @@
           <w:rFonts w:ascii="Times New Roman" w:eastAsia="Times New Roman" w:hAnsi="Times New Roman" w:cs="Times New Roman"/>
           <w:b/>
           <w:bCs/>
-          <w:sz w:val="27"/>
-          <w:szCs w:val="27"/>
-        </w:rPr>
-      </w:pPr>
-      <w:r>
-        <w:rPr>
-          <w:rFonts w:ascii="Times New Roman" w:eastAsia="Times New Roman" w:hAnsi="Times New Roman" w:cs="Times New Roman"/>
-          <w:b/>
-          <w:bCs/>
-          <w:sz w:val="27"/>
-          <w:szCs w:val="27"/>
+          <w:sz w:val="24"/>
+          <w:szCs w:val="24"/>
+        </w:rPr>
+      </w:pPr>
+      <w:r>
+        <w:rPr>
+          <w:rFonts w:ascii="Times New Roman" w:eastAsia="Times New Roman" w:hAnsi="Times New Roman" w:cs="Times New Roman"/>
+          <w:b/>
+          <w:bCs/>
+          <w:sz w:val="24"/>
+          <w:szCs w:val="24"/>
         </w:rPr>
         <w:t>Key Learnings</w:t>
       </w:r>
@@ -5134,23 +5132,7 @@
           <w:sz w:val="24"/>
           <w:szCs w:val="24"/>
         </w:rPr>
-        <w:t>Stable external stores (</w:t>
-      </w:r>
-      <w:r>
-        <w:rPr>
-          <w:rFonts w:ascii="Courier New" w:eastAsia="Times New Roman" w:hAnsi="Courier New" w:cs="Courier New"/>
-          <w:sz w:val="20"/>
-          <w:szCs w:val="20"/>
-        </w:rPr>
-        <w:t>useSyncExternalStore</w:t>
-      </w:r>
-      <w:r>
-        <w:rPr>
-          <w:rFonts w:ascii="Times New Roman" w:eastAsia="Times New Roman" w:hAnsi="Times New Roman" w:cs="Times New Roman"/>
-          <w:sz w:val="24"/>
-          <w:szCs w:val="24"/>
-        </w:rPr>
-        <w:t>) are critical for complex desktop apps to avoid React lifecycle issues.</w:t>
+        <w:t>Stable external stores (useSyncExternalStore) are critical for complex desktop apps to avoid React lifecycle issues.</w:t>
       </w:r>
     </w:p>
     <w:p>
@@ -5183,17 +5165,17 @@
           <w:rFonts w:ascii="Times New Roman" w:eastAsia="Times New Roman" w:hAnsi="Times New Roman" w:cs="Times New Roman"/>
           <w:b/>
           <w:bCs/>
-          <w:sz w:val="27"/>
-          <w:szCs w:val="27"/>
-        </w:rPr>
-      </w:pPr>
-      <w:r>
-        <w:rPr>
-          <w:rFonts w:ascii="Times New Roman" w:eastAsia="Times New Roman" w:hAnsi="Times New Roman" w:cs="Times New Roman"/>
-          <w:b/>
-          <w:bCs/>
-          <w:sz w:val="27"/>
-          <w:szCs w:val="27"/>
+          <w:sz w:val="24"/>
+          <w:szCs w:val="24"/>
+        </w:rPr>
+      </w:pPr>
+      <w:r>
+        <w:rPr>
+          <w:rFonts w:ascii="Times New Roman" w:eastAsia="Times New Roman" w:hAnsi="Times New Roman" w:cs="Times New Roman"/>
+          <w:b/>
+          <w:bCs/>
+          <w:sz w:val="24"/>
+          <w:szCs w:val="24"/>
         </w:rPr>
         <w:t xml:space="preserve"> Next Steps</w:t>
       </w:r>
@@ -5363,12 +5345,18 @@
       <w:pPr>
         <w:pStyle w:val="Heading3"/>
         <w:spacing w:before="0" w:beforeAutospacing="0" w:after="0" w:afterAutospacing="0"/>
+        <w:rPr>
+          <w:sz w:val="24"/>
+          <w:szCs w:val="24"/>
+        </w:rPr>
       </w:pPr>
       <w:r>
         <w:rPr>
           <w:rStyle w:val="Strong"/>
           <w:b/>
           <w:bCs/>
+          <w:sz w:val="24"/>
+          <w:szCs w:val="24"/>
         </w:rPr>
         <w:t>Objective of the Day</w:t>
       </w:r>
@@ -5392,12 +5380,18 @@
       <w:pPr>
         <w:pStyle w:val="Heading3"/>
         <w:spacing w:before="0" w:beforeAutospacing="0" w:after="0" w:afterAutospacing="0"/>
+        <w:rPr>
+          <w:sz w:val="24"/>
+          <w:szCs w:val="24"/>
+        </w:rPr>
       </w:pPr>
       <w:r>
         <w:rPr>
           <w:rStyle w:val="Strong"/>
           <w:b/>
           <w:bCs/>
+          <w:sz w:val="24"/>
+          <w:szCs w:val="24"/>
         </w:rPr>
         <w:t>Activities Performed</w:t>
       </w:r>
@@ -5633,12 +5627,18 @@
       <w:pPr>
         <w:pStyle w:val="Heading3"/>
         <w:spacing w:before="0" w:beforeAutospacing="0" w:after="0" w:afterAutospacing="0"/>
+        <w:rPr>
+          <w:sz w:val="24"/>
+          <w:szCs w:val="24"/>
+        </w:rPr>
       </w:pPr>
       <w:r>
         <w:rPr>
           <w:rStyle w:val="Strong"/>
           <w:b/>
           <w:bCs/>
+          <w:sz w:val="24"/>
+          <w:szCs w:val="24"/>
         </w:rPr>
         <w:t>Outcome of the Day</w:t>
       </w:r>
@@ -5666,12 +5666,18 @@
       <w:pPr>
         <w:pStyle w:val="Heading3"/>
         <w:spacing w:before="0" w:beforeAutospacing="0" w:after="0" w:afterAutospacing="0"/>
+        <w:rPr>
+          <w:sz w:val="24"/>
+          <w:szCs w:val="24"/>
+        </w:rPr>
       </w:pPr>
       <w:r>
         <w:rPr>
           <w:rStyle w:val="Strong"/>
           <w:b/>
           <w:bCs/>
+          <w:sz w:val="24"/>
+          <w:szCs w:val="24"/>
         </w:rPr>
         <w:t>Key Learnings</w:t>
       </w:r>
@@ -5726,12 +5732,18 @@
       <w:pPr>
         <w:pStyle w:val="Heading3"/>
         <w:spacing w:before="0" w:beforeAutospacing="0" w:after="0" w:afterAutospacing="0"/>
+        <w:rPr>
+          <w:sz w:val="24"/>
+          <w:szCs w:val="24"/>
+        </w:rPr>
       </w:pPr>
       <w:r>
         <w:rPr>
           <w:rStyle w:val="Strong"/>
           <w:b/>
           <w:bCs/>
+          <w:sz w:val="24"/>
+          <w:szCs w:val="24"/>
         </w:rPr>
         <w:t>Next Steps</w:t>
       </w:r>
@@ -5794,34 +5806,7 @@
           <w:sz w:val="24"/>
           <w:szCs w:val="24"/>
         </w:rPr>
-        <w:t xml:space="preserve"> </w:t>
-      </w:r>
-      <w:r>
-        <w:rPr>
-          <w:rFonts w:ascii="Times New Roman" w:eastAsia="Times New Roman" w:hAnsi="Times New Roman" w:cs="Times New Roman"/>
-          <w:b/>
-          <w:sz w:val="24"/>
-          <w:szCs w:val="24"/>
-        </w:rPr>
-        <w:t>20</w:t>
-      </w:r>
-      <w:r>
-        <w:rPr>
-          <w:rFonts w:ascii="Times New Roman" w:eastAsia="Times New Roman" w:hAnsi="Times New Roman" w:cs="Times New Roman"/>
-          <w:b/>
-          <w:sz w:val="24"/>
-          <w:szCs w:val="24"/>
-        </w:rPr>
-        <w:t>/01/2026                                                                                                          Day 1</w:t>
-      </w:r>
-      <w:r>
-        <w:rPr>
-          <w:rFonts w:ascii="Times New Roman" w:eastAsia="Times New Roman" w:hAnsi="Times New Roman" w:cs="Times New Roman"/>
-          <w:b/>
-          <w:sz w:val="24"/>
-          <w:szCs w:val="24"/>
-        </w:rPr>
-        <w:t>0</w:t>
+        <w:t xml:space="preserve"> 20/01/2026                                                                                                          Day 10</w:t>
       </w:r>
       <w:r>
         <w:rPr>
@@ -5883,12 +5868,18 @@
     <w:p>
       <w:pPr>
         <w:pStyle w:val="Heading3"/>
+        <w:rPr>
+          <w:sz w:val="24"/>
+          <w:szCs w:val="24"/>
+        </w:rPr>
       </w:pPr>
       <w:r>
         <w:rPr>
           <w:rStyle w:val="Strong"/>
           <w:b/>
           <w:bCs/>
+          <w:sz w:val="24"/>
+          <w:szCs w:val="24"/>
         </w:rPr>
         <w:t>Objective of the Day</w:t>
       </w:r>
@@ -5904,12 +5895,18 @@
     <w:p>
       <w:pPr>
         <w:pStyle w:val="Heading3"/>
+        <w:rPr>
+          <w:sz w:val="24"/>
+          <w:szCs w:val="24"/>
+        </w:rPr>
       </w:pPr>
       <w:r>
         <w:rPr>
           <w:rStyle w:val="Strong"/>
           <w:b/>
           <w:bCs/>
+          <w:sz w:val="24"/>
+          <w:szCs w:val="24"/>
         </w:rPr>
         <w:t>Activities Performed</w:t>
       </w:r>
@@ -6008,12 +6005,18 @@
     <w:p>
       <w:pPr>
         <w:pStyle w:val="Heading3"/>
+        <w:rPr>
+          <w:sz w:val="24"/>
+          <w:szCs w:val="24"/>
+        </w:rPr>
       </w:pPr>
       <w:r>
         <w:rPr>
           <w:rStyle w:val="Strong"/>
           <w:b/>
           <w:bCs/>
+          <w:sz w:val="24"/>
+          <w:szCs w:val="24"/>
         </w:rPr>
         <w:t>Outcome of the Day</w:t>
       </w:r>
@@ -6029,12 +6032,18 @@
     <w:p>
       <w:pPr>
         <w:pStyle w:val="Heading3"/>
+        <w:rPr>
+          <w:sz w:val="24"/>
+          <w:szCs w:val="24"/>
+        </w:rPr>
       </w:pPr>
       <w:r>
         <w:rPr>
           <w:rStyle w:val="Strong"/>
           <w:b/>
           <w:bCs/>
+          <w:sz w:val="24"/>
+          <w:szCs w:val="24"/>
         </w:rPr>
         <w:t>Key Learnings</w:t>
       </w:r>
@@ -6078,12 +6087,18 @@
     <w:p>
       <w:pPr>
         <w:pStyle w:val="Heading3"/>
+        <w:rPr>
+          <w:sz w:val="24"/>
+          <w:szCs w:val="24"/>
+        </w:rPr>
       </w:pPr>
       <w:r>
         <w:rPr>
           <w:rStyle w:val="Strong"/>
           <w:b/>
           <w:bCs/>
+          <w:sz w:val="24"/>
+          <w:szCs w:val="24"/>
         </w:rPr>
         <w:t>Next Steps</w:t>
       </w:r>
@@ -6135,34 +6150,7 @@
           <w:sz w:val="24"/>
           <w:szCs w:val="24"/>
         </w:rPr>
-        <w:t xml:space="preserve"> </w:t>
-      </w:r>
-      <w:r>
-        <w:rPr>
-          <w:rFonts w:ascii="Times New Roman" w:eastAsia="Times New Roman" w:hAnsi="Times New Roman" w:cs="Times New Roman"/>
-          <w:b/>
-          <w:sz w:val="24"/>
-          <w:szCs w:val="24"/>
-        </w:rPr>
-        <w:t>21</w:t>
-      </w:r>
-      <w:r>
-        <w:rPr>
-          <w:rFonts w:ascii="Times New Roman" w:eastAsia="Times New Roman" w:hAnsi="Times New Roman" w:cs="Times New Roman"/>
-          <w:b/>
-          <w:sz w:val="24"/>
-          <w:szCs w:val="24"/>
-        </w:rPr>
-        <w:t>/01/2026                                                                                                          Day 1</w:t>
-      </w:r>
-      <w:r>
-        <w:rPr>
-          <w:rFonts w:ascii="Times New Roman" w:eastAsia="Times New Roman" w:hAnsi="Times New Roman" w:cs="Times New Roman"/>
-          <w:b/>
-          <w:sz w:val="24"/>
-          <w:szCs w:val="24"/>
-        </w:rPr>
-        <w:t>1</w:t>
+        <w:t xml:space="preserve"> 21/01/2026                                                                                                          Day 11</w:t>
       </w:r>
       <w:r>
         <w:rPr>
@@ -6224,12 +6212,18 @@
     <w:p>
       <w:pPr>
         <w:pStyle w:val="Heading3"/>
+        <w:rPr>
+          <w:sz w:val="24"/>
+          <w:szCs w:val="24"/>
+        </w:rPr>
       </w:pPr>
       <w:r>
         <w:rPr>
           <w:rStyle w:val="Strong"/>
           <w:b/>
           <w:bCs/>
+          <w:sz w:val="24"/>
+          <w:szCs w:val="24"/>
         </w:rPr>
         <w:t>Objective of the Day</w:t>
       </w:r>
@@ -6245,12 +6239,18 @@
     <w:p>
       <w:pPr>
         <w:pStyle w:val="Heading3"/>
+        <w:rPr>
+          <w:sz w:val="24"/>
+          <w:szCs w:val="24"/>
+        </w:rPr>
       </w:pPr>
       <w:r>
         <w:rPr>
           <w:rStyle w:val="Strong"/>
           <w:b/>
           <w:bCs/>
+          <w:sz w:val="24"/>
+          <w:szCs w:val="24"/>
         </w:rPr>
         <w:t>Activities Performed</w:t>
       </w:r>
@@ -6296,12 +6296,18 @@
     <w:p>
       <w:pPr>
         <w:pStyle w:val="Heading3"/>
+        <w:rPr>
+          <w:sz w:val="24"/>
+          <w:szCs w:val="24"/>
+        </w:rPr>
       </w:pPr>
       <w:r>
         <w:rPr>
           <w:rStyle w:val="Strong"/>
           <w:b/>
           <w:bCs/>
+          <w:sz w:val="24"/>
+          <w:szCs w:val="24"/>
         </w:rPr>
         <w:t>Outcome of the Day</w:t>
       </w:r>
@@ -6317,12 +6323,18 @@
     <w:p>
       <w:pPr>
         <w:pStyle w:val="Heading3"/>
+        <w:rPr>
+          <w:sz w:val="24"/>
+          <w:szCs w:val="24"/>
+        </w:rPr>
       </w:pPr>
       <w:r>
         <w:rPr>
           <w:rStyle w:val="Strong"/>
           <w:b/>
           <w:bCs/>
+          <w:sz w:val="24"/>
+          <w:szCs w:val="24"/>
         </w:rPr>
         <w:t>Key Learnings</w:t>
       </w:r>
@@ -6338,12 +6350,18 @@
     <w:p>
       <w:pPr>
         <w:pStyle w:val="Heading3"/>
+        <w:rPr>
+          <w:sz w:val="24"/>
+          <w:szCs w:val="24"/>
+        </w:rPr>
       </w:pPr>
       <w:r>
         <w:rPr>
           <w:rStyle w:val="Strong"/>
           <w:b/>
           <w:bCs/>
+          <w:sz w:val="24"/>
+          <w:szCs w:val="24"/>
         </w:rPr>
         <w:t>Next Steps</w:t>
       </w:r>
@@ -6385,52 +6403,7 @@
           <w:sz w:val="24"/>
           <w:szCs w:val="24"/>
         </w:rPr>
-        <w:t xml:space="preserve"> </w:t>
-      </w:r>
-      <w:r>
-        <w:rPr>
-          <w:rFonts w:ascii="Times New Roman" w:eastAsia="Times New Roman" w:hAnsi="Times New Roman" w:cs="Times New Roman"/>
-          <w:b/>
-          <w:sz w:val="24"/>
-          <w:szCs w:val="24"/>
-        </w:rPr>
-        <w:t>22</w:t>
-      </w:r>
-      <w:r>
-        <w:rPr>
-          <w:rFonts w:ascii="Times New Roman" w:eastAsia="Times New Roman" w:hAnsi="Times New Roman" w:cs="Times New Roman"/>
-          <w:b/>
-          <w:sz w:val="24"/>
-          <w:szCs w:val="24"/>
-        </w:rPr>
-        <w:t xml:space="preserve">/01/2026                                                                                                         </w:t>
-      </w:r>
-      <w:r>
-        <w:rPr>
-          <w:rFonts w:ascii="Times New Roman" w:eastAsia="Times New Roman" w:hAnsi="Times New Roman" w:cs="Times New Roman"/>
-          <w:b/>
-          <w:sz w:val="24"/>
-          <w:szCs w:val="24"/>
-        </w:rPr>
-        <w:t xml:space="preserve">    </w:t>
-      </w:r>
-      <w:r>
-        <w:rPr>
-          <w:rFonts w:ascii="Times New Roman" w:eastAsia="Times New Roman" w:hAnsi="Times New Roman" w:cs="Times New Roman"/>
-          <w:b/>
-          <w:sz w:val="24"/>
-          <w:szCs w:val="24"/>
-        </w:rPr>
-        <w:t xml:space="preserve"> Day 1</w:t>
-      </w:r>
-      <w:r>
-        <w:rPr>
-          <w:rFonts w:ascii="Times New Roman" w:eastAsia="Times New Roman" w:hAnsi="Times New Roman" w:cs="Times New Roman"/>
-          <w:b/>
-          <w:sz w:val="24"/>
-          <w:szCs w:val="24"/>
-        </w:rPr>
-        <w:t>2</w:t>
+        <w:t xml:space="preserve"> 22/01/2026                                                                                                              Day 12</w:t>
       </w:r>
       <w:r>
         <w:rPr>
@@ -6497,17 +6470,17 @@
           <w:rFonts w:ascii="Times New Roman" w:eastAsia="Times New Roman" w:hAnsi="Times New Roman" w:cs="Times New Roman"/>
           <w:b/>
           <w:bCs/>
-          <w:sz w:val="27"/>
-          <w:szCs w:val="27"/>
-        </w:rPr>
-      </w:pPr>
-      <w:r>
-        <w:rPr>
-          <w:rFonts w:ascii="Times New Roman" w:eastAsia="Times New Roman" w:hAnsi="Times New Roman" w:cs="Times New Roman"/>
-          <w:b/>
-          <w:bCs/>
-          <w:sz w:val="27"/>
-          <w:szCs w:val="27"/>
+          <w:sz w:val="24"/>
+          <w:szCs w:val="24"/>
+        </w:rPr>
+      </w:pPr>
+      <w:r>
+        <w:rPr>
+          <w:rFonts w:ascii="Times New Roman" w:eastAsia="Times New Roman" w:hAnsi="Times New Roman" w:cs="Times New Roman"/>
+          <w:b/>
+          <w:bCs/>
+          <w:sz w:val="24"/>
+          <w:szCs w:val="24"/>
         </w:rPr>
         <w:t>Objective of the Day</w:t>
       </w:r>
@@ -6538,17 +6511,17 @@
           <w:rFonts w:ascii="Times New Roman" w:eastAsia="Times New Roman" w:hAnsi="Times New Roman" w:cs="Times New Roman"/>
           <w:b/>
           <w:bCs/>
-          <w:sz w:val="27"/>
-          <w:szCs w:val="27"/>
-        </w:rPr>
-      </w:pPr>
-      <w:r>
-        <w:rPr>
-          <w:rFonts w:ascii="Times New Roman" w:eastAsia="Times New Roman" w:hAnsi="Times New Roman" w:cs="Times New Roman"/>
-          <w:b/>
-          <w:bCs/>
-          <w:sz w:val="27"/>
-          <w:szCs w:val="27"/>
+          <w:sz w:val="24"/>
+          <w:szCs w:val="24"/>
+        </w:rPr>
+      </w:pPr>
+      <w:r>
+        <w:rPr>
+          <w:rFonts w:ascii="Times New Roman" w:eastAsia="Times New Roman" w:hAnsi="Times New Roman" w:cs="Times New Roman"/>
+          <w:b/>
+          <w:bCs/>
+          <w:sz w:val="24"/>
+          <w:szCs w:val="24"/>
         </w:rPr>
         <w:t>Activities Performed</w:t>
       </w:r>
@@ -6616,39 +6589,7 @@
           <w:sz w:val="24"/>
           <w:szCs w:val="24"/>
         </w:rPr>
-        <w:t xml:space="preserve">Identified and resolved conflicts between </w:t>
-      </w:r>
-      <w:r>
-        <w:rPr>
-          <w:rFonts w:ascii="Courier New" w:eastAsia="Times New Roman" w:hAnsi="Courier New" w:cs="Courier New"/>
-          <w:sz w:val="20"/>
-          <w:szCs w:val="20"/>
-        </w:rPr>
-        <w:t>Layout.tsx</w:t>
-      </w:r>
-      <w:r>
-        <w:rPr>
-          <w:rFonts w:ascii="Times New Roman" w:eastAsia="Times New Roman" w:hAnsi="Times New Roman" w:cs="Times New Roman"/>
-          <w:sz w:val="24"/>
-          <w:szCs w:val="24"/>
-        </w:rPr>
-        <w:t xml:space="preserve">, </w:t>
-      </w:r>
-      <w:r>
-        <w:rPr>
-          <w:rFonts w:ascii="Courier New" w:eastAsia="Times New Roman" w:hAnsi="Courier New" w:cs="Courier New"/>
-          <w:sz w:val="20"/>
-          <w:szCs w:val="20"/>
-        </w:rPr>
-        <w:t>AppLayout.tsx</w:t>
-      </w:r>
-      <w:r>
-        <w:rPr>
-          <w:rFonts w:ascii="Times New Roman" w:eastAsia="Times New Roman" w:hAnsi="Times New Roman" w:cs="Times New Roman"/>
-          <w:sz w:val="24"/>
-          <w:szCs w:val="24"/>
-        </w:rPr>
-        <w:t>, and router-based outlet rendering.</w:t>
+        <w:t>Identified and resolved conflicts between Layout.tsx, AppLayout.tsx, and router-based outlet rendering.</w:t>
       </w:r>
     </w:p>
     <w:p>
@@ -6769,17 +6710,17 @@
           <w:rFonts w:ascii="Times New Roman" w:eastAsia="Times New Roman" w:hAnsi="Times New Roman" w:cs="Times New Roman"/>
           <w:b/>
           <w:bCs/>
-          <w:sz w:val="27"/>
-          <w:szCs w:val="27"/>
-        </w:rPr>
-      </w:pPr>
-      <w:r>
-        <w:rPr>
-          <w:rFonts w:ascii="Times New Roman" w:eastAsia="Times New Roman" w:hAnsi="Times New Roman" w:cs="Times New Roman"/>
-          <w:b/>
-          <w:bCs/>
-          <w:sz w:val="27"/>
-          <w:szCs w:val="27"/>
+          <w:sz w:val="24"/>
+          <w:szCs w:val="24"/>
+        </w:rPr>
+      </w:pPr>
+      <w:r>
+        <w:rPr>
+          <w:rFonts w:ascii="Times New Roman" w:eastAsia="Times New Roman" w:hAnsi="Times New Roman" w:cs="Times New Roman"/>
+          <w:b/>
+          <w:bCs/>
+          <w:sz w:val="24"/>
+          <w:szCs w:val="24"/>
         </w:rPr>
         <w:t>Outcome of the Day</w:t>
       </w:r>
@@ -6896,17 +6837,17 @@
           <w:rFonts w:ascii="Times New Roman" w:eastAsia="Times New Roman" w:hAnsi="Times New Roman" w:cs="Times New Roman"/>
           <w:b/>
           <w:bCs/>
-          <w:sz w:val="27"/>
-          <w:szCs w:val="27"/>
-        </w:rPr>
-      </w:pPr>
-      <w:r>
-        <w:rPr>
-          <w:rFonts w:ascii="Times New Roman" w:eastAsia="Times New Roman" w:hAnsi="Times New Roman" w:cs="Times New Roman"/>
-          <w:b/>
-          <w:bCs/>
-          <w:sz w:val="27"/>
-          <w:szCs w:val="27"/>
+          <w:sz w:val="24"/>
+          <w:szCs w:val="24"/>
+        </w:rPr>
+      </w:pPr>
+      <w:r>
+        <w:rPr>
+          <w:rFonts w:ascii="Times New Roman" w:eastAsia="Times New Roman" w:hAnsi="Times New Roman" w:cs="Times New Roman"/>
+          <w:b/>
+          <w:bCs/>
+          <w:sz w:val="24"/>
+          <w:szCs w:val="24"/>
         </w:rPr>
         <w:t>Key Learnings</w:t>
       </w:r>
@@ -7007,17 +6948,17 @@
           <w:rFonts w:ascii="Times New Roman" w:eastAsia="Times New Roman" w:hAnsi="Times New Roman" w:cs="Times New Roman"/>
           <w:b/>
           <w:bCs/>
-          <w:sz w:val="27"/>
-          <w:szCs w:val="27"/>
-        </w:rPr>
-      </w:pPr>
-      <w:r>
-        <w:rPr>
-          <w:rFonts w:ascii="Times New Roman" w:eastAsia="Times New Roman" w:hAnsi="Times New Roman" w:cs="Times New Roman"/>
-          <w:b/>
-          <w:bCs/>
-          <w:sz w:val="27"/>
-          <w:szCs w:val="27"/>
+          <w:sz w:val="24"/>
+          <w:szCs w:val="24"/>
+        </w:rPr>
+      </w:pPr>
+      <w:r>
+        <w:rPr>
+          <w:rFonts w:ascii="Times New Roman" w:eastAsia="Times New Roman" w:hAnsi="Times New Roman" w:cs="Times New Roman"/>
+          <w:b/>
+          <w:bCs/>
+          <w:sz w:val="24"/>
+          <w:szCs w:val="24"/>
         </w:rPr>
         <w:t>Challenges / Open Points</w:t>
       </w:r>
@@ -7096,17 +7037,17 @@
           <w:rFonts w:ascii="Times New Roman" w:eastAsia="Times New Roman" w:hAnsi="Times New Roman" w:cs="Times New Roman"/>
           <w:b/>
           <w:bCs/>
-          <w:sz w:val="27"/>
-          <w:szCs w:val="27"/>
-        </w:rPr>
-      </w:pPr>
-      <w:r>
-        <w:rPr>
-          <w:rFonts w:ascii="Times New Roman" w:eastAsia="Times New Roman" w:hAnsi="Times New Roman" w:cs="Times New Roman"/>
-          <w:b/>
-          <w:bCs/>
-          <w:sz w:val="27"/>
-          <w:szCs w:val="27"/>
+          <w:sz w:val="24"/>
+          <w:szCs w:val="24"/>
+        </w:rPr>
+      </w:pPr>
+      <w:r>
+        <w:rPr>
+          <w:rFonts w:ascii="Times New Roman" w:eastAsia="Times New Roman" w:hAnsi="Times New Roman" w:cs="Times New Roman"/>
+          <w:b/>
+          <w:bCs/>
+          <w:sz w:val="24"/>
+          <w:szCs w:val="24"/>
         </w:rPr>
         <w:t>Next Steps</w:t>
       </w:r>
@@ -7238,52 +7179,7 @@
           <w:sz w:val="24"/>
           <w:szCs w:val="24"/>
         </w:rPr>
-        <w:t xml:space="preserve"> </w:t>
-      </w:r>
-      <w:r>
-        <w:rPr>
-          <w:rFonts w:ascii="Times New Roman" w:eastAsia="Times New Roman" w:hAnsi="Times New Roman" w:cs="Times New Roman"/>
-          <w:b/>
-          <w:sz w:val="24"/>
-          <w:szCs w:val="24"/>
-        </w:rPr>
-        <w:t>23</w:t>
-      </w:r>
-      <w:r>
-        <w:rPr>
-          <w:rFonts w:ascii="Times New Roman" w:eastAsia="Times New Roman" w:hAnsi="Times New Roman" w:cs="Times New Roman"/>
-          <w:b/>
-          <w:sz w:val="24"/>
-          <w:szCs w:val="24"/>
-        </w:rPr>
-        <w:t xml:space="preserve">/01/2026                                                                                                         </w:t>
-      </w:r>
-      <w:r>
-        <w:rPr>
-          <w:rFonts w:ascii="Times New Roman" w:eastAsia="Times New Roman" w:hAnsi="Times New Roman" w:cs="Times New Roman"/>
-          <w:b/>
-          <w:sz w:val="24"/>
-          <w:szCs w:val="24"/>
-        </w:rPr>
-        <w:t xml:space="preserve">    </w:t>
-      </w:r>
-      <w:r>
-        <w:rPr>
-          <w:rFonts w:ascii="Times New Roman" w:eastAsia="Times New Roman" w:hAnsi="Times New Roman" w:cs="Times New Roman"/>
-          <w:b/>
-          <w:sz w:val="24"/>
-          <w:szCs w:val="24"/>
-        </w:rPr>
-        <w:t xml:space="preserve"> Day 1</w:t>
-      </w:r>
-      <w:r>
-        <w:rPr>
-          <w:rFonts w:ascii="Times New Roman" w:eastAsia="Times New Roman" w:hAnsi="Times New Roman" w:cs="Times New Roman"/>
-          <w:b/>
-          <w:sz w:val="24"/>
-          <w:szCs w:val="24"/>
-        </w:rPr>
-        <w:t>3</w:t>
+        <w:t xml:space="preserve"> 23/01/2026                                                                                                              Day 13</w:t>
       </w:r>
       <w:r>
         <w:rPr>
@@ -7346,12 +7242,18 @@
       <w:pPr>
         <w:pStyle w:val="Heading3"/>
         <w:spacing w:before="0" w:beforeAutospacing="0" w:after="0" w:afterAutospacing="0"/>
+        <w:rPr>
+          <w:sz w:val="24"/>
+          <w:szCs w:val="24"/>
+        </w:rPr>
       </w:pPr>
       <w:r>
         <w:rPr>
           <w:rStyle w:val="Strong"/>
           <w:b/>
           <w:bCs/>
+          <w:sz w:val="24"/>
+          <w:szCs w:val="24"/>
         </w:rPr>
         <w:t>Objective of the Day</w:t>
       </w:r>
@@ -7375,12 +7277,18 @@
       <w:pPr>
         <w:pStyle w:val="Heading3"/>
         <w:spacing w:before="0" w:beforeAutospacing="0" w:after="0" w:afterAutospacing="0"/>
+        <w:rPr>
+          <w:sz w:val="24"/>
+          <w:szCs w:val="24"/>
+        </w:rPr>
       </w:pPr>
       <w:r>
         <w:rPr>
           <w:rStyle w:val="Strong"/>
           <w:b/>
           <w:bCs/>
+          <w:sz w:val="24"/>
+          <w:szCs w:val="24"/>
         </w:rPr>
         <w:t>Activities Performed</w:t>
       </w:r>
@@ -7397,21 +7305,7 @@
         <w:rPr>
           <w:rStyle w:val="Strong"/>
         </w:rPr>
-        <w:t xml:space="preserve">kWh and </w:t>
-      </w:r>
-      <w:proofErr w:type="spellStart"/>
-      <w:r>
-        <w:rPr>
-          <w:rStyle w:val="Strong"/>
-        </w:rPr>
-        <w:t>kVAh</w:t>
-      </w:r>
-      <w:proofErr w:type="spellEnd"/>
-      <w:r>
-        <w:rPr>
-          <w:rStyle w:val="Strong"/>
-        </w:rPr>
-        <w:t xml:space="preserve"> readings</w:t>
+        <w:t>kWh and kVAh readings</w:t>
       </w:r>
       <w:r>
         <w:t xml:space="preserve"> into operational Excel sheets.</w:t>
@@ -7522,12 +7416,18 @@
       <w:pPr>
         <w:pStyle w:val="Heading3"/>
         <w:spacing w:before="0" w:beforeAutospacing="0" w:after="0" w:afterAutospacing="0"/>
+        <w:rPr>
+          <w:sz w:val="24"/>
+          <w:szCs w:val="24"/>
+        </w:rPr>
       </w:pPr>
       <w:r>
         <w:rPr>
           <w:rStyle w:val="Strong"/>
           <w:b/>
           <w:bCs/>
+          <w:sz w:val="24"/>
+          <w:szCs w:val="24"/>
         </w:rPr>
         <w:t>Outcome of the Day</w:t>
       </w:r>
@@ -7563,12 +7463,18 @@
       <w:pPr>
         <w:pStyle w:val="Heading3"/>
         <w:spacing w:before="0" w:beforeAutospacing="0" w:after="0" w:afterAutospacing="0"/>
+        <w:rPr>
+          <w:sz w:val="24"/>
+          <w:szCs w:val="24"/>
+        </w:rPr>
       </w:pPr>
       <w:r>
         <w:rPr>
           <w:rStyle w:val="Strong"/>
           <w:b/>
           <w:bCs/>
+          <w:sz w:val="24"/>
+          <w:szCs w:val="24"/>
         </w:rPr>
         <w:t>Key Learnings</w:t>
       </w:r>
@@ -7596,12 +7502,18 @@
       <w:pPr>
         <w:pStyle w:val="Heading3"/>
         <w:spacing w:before="0" w:beforeAutospacing="0" w:after="0" w:afterAutospacing="0"/>
+        <w:rPr>
+          <w:sz w:val="24"/>
+          <w:szCs w:val="24"/>
+        </w:rPr>
       </w:pPr>
       <w:r>
         <w:rPr>
           <w:rStyle w:val="Strong"/>
           <w:b/>
           <w:bCs/>
+          <w:sz w:val="24"/>
+          <w:szCs w:val="24"/>
         </w:rPr>
         <w:t>Challenges / Open Points</w:t>
       </w:r>
@@ -7637,12 +7549,18 @@
       <w:pPr>
         <w:pStyle w:val="Heading3"/>
         <w:spacing w:before="0" w:beforeAutospacing="0" w:after="0" w:afterAutospacing="0"/>
+        <w:rPr>
+          <w:sz w:val="24"/>
+          <w:szCs w:val="24"/>
+        </w:rPr>
       </w:pPr>
       <w:r>
         <w:rPr>
           <w:rStyle w:val="Strong"/>
           <w:b/>
           <w:bCs/>
+          <w:sz w:val="24"/>
+          <w:szCs w:val="24"/>
         </w:rPr>
         <w:t>Next Steps</w:t>
       </w:r>
@@ -7689,8 +7607,447 @@
         <w:br/>
         <w:t>• Perform full responsiveness testing across screens.</w:t>
       </w:r>
+    </w:p>
+    <w:p>
+      <w:pPr>
+        <w:spacing w:before="100" w:beforeAutospacing="1" w:after="100" w:afterAutospacing="1" w:line="240" w:lineRule="auto"/>
+        <w:outlineLvl w:val="1"/>
+        <w:rPr>
+          <w:rFonts w:ascii="Times New Roman" w:eastAsia="Times New Roman" w:hAnsi="Times New Roman" w:cs="Times New Roman"/>
+          <w:b/>
+          <w:sz w:val="24"/>
+          <w:szCs w:val="24"/>
+        </w:rPr>
+      </w:pPr>
+      <w:r>
+        <w:rPr>
+          <w:rFonts w:ascii="Times New Roman" w:eastAsia="Times New Roman" w:hAnsi="Times New Roman" w:cs="Times New Roman"/>
+          <w:b/>
+          <w:bCs/>
+          <w:sz w:val="24"/>
+          <w:szCs w:val="24"/>
+        </w:rPr>
+        <w:lastRenderedPageBreak/>
+        <w:t>Date:</w:t>
+      </w:r>
+      <w:r>
+        <w:rPr>
+          <w:rFonts w:ascii="Times New Roman" w:eastAsia="Times New Roman" w:hAnsi="Times New Roman" w:cs="Times New Roman"/>
+          <w:b/>
+          <w:sz w:val="24"/>
+          <w:szCs w:val="24"/>
+        </w:rPr>
+        <w:t xml:space="preserve"> </w:t>
+      </w:r>
+      <w:r>
+        <w:rPr>
+          <w:rFonts w:ascii="Times New Roman" w:eastAsia="Times New Roman" w:hAnsi="Times New Roman" w:cs="Times New Roman"/>
+          <w:b/>
+          <w:sz w:val="24"/>
+          <w:szCs w:val="24"/>
+        </w:rPr>
+        <w:t>24</w:t>
+      </w:r>
+      <w:r>
+        <w:rPr>
+          <w:rFonts w:ascii="Times New Roman" w:eastAsia="Times New Roman" w:hAnsi="Times New Roman" w:cs="Times New Roman"/>
+          <w:b/>
+          <w:sz w:val="24"/>
+          <w:szCs w:val="24"/>
+        </w:rPr>
+        <w:t>/01/2026                                                                                                              Day 1</w:t>
+      </w:r>
+      <w:r>
+        <w:rPr>
+          <w:rFonts w:ascii="Times New Roman" w:eastAsia="Times New Roman" w:hAnsi="Times New Roman" w:cs="Times New Roman"/>
+          <w:b/>
+          <w:sz w:val="24"/>
+          <w:szCs w:val="24"/>
+        </w:rPr>
+        <w:t>4</w:t>
+      </w:r>
+      <w:r>
+        <w:rPr>
+          <w:rFonts w:ascii="Times New Roman" w:eastAsia="Times New Roman" w:hAnsi="Times New Roman" w:cs="Times New Roman"/>
+          <w:b/>
+          <w:sz w:val="24"/>
+          <w:szCs w:val="24"/>
+        </w:rPr>
+        <w:br/>
+      </w:r>
+      <w:r>
+        <w:rPr>
+          <w:rFonts w:ascii="Times New Roman" w:eastAsia="Times New Roman" w:hAnsi="Times New Roman" w:cs="Times New Roman"/>
+          <w:b/>
+          <w:bCs/>
+          <w:sz w:val="24"/>
+          <w:szCs w:val="24"/>
+        </w:rPr>
+        <w:t>Department:</w:t>
+      </w:r>
+      <w:r>
+        <w:rPr>
+          <w:rFonts w:ascii="Times New Roman" w:eastAsia="Times New Roman" w:hAnsi="Times New Roman" w:cs="Times New Roman"/>
+          <w:b/>
+          <w:sz w:val="24"/>
+          <w:szCs w:val="24"/>
+        </w:rPr>
+        <w:t xml:space="preserve"> Maintenance</w:t>
+      </w:r>
+      <w:r>
+        <w:rPr>
+          <w:rFonts w:ascii="Times New Roman" w:eastAsia="Times New Roman" w:hAnsi="Times New Roman" w:cs="Times New Roman"/>
+          <w:b/>
+          <w:sz w:val="24"/>
+          <w:szCs w:val="24"/>
+        </w:rPr>
+        <w:br/>
+      </w:r>
+      <w:r>
+        <w:rPr>
+          <w:rFonts w:ascii="Times New Roman" w:eastAsia="Times New Roman" w:hAnsi="Times New Roman" w:cs="Times New Roman"/>
+          <w:b/>
+          <w:bCs/>
+          <w:sz w:val="24"/>
+          <w:szCs w:val="24"/>
+        </w:rPr>
+        <w:t>Plant:</w:t>
+      </w:r>
+      <w:r>
+        <w:rPr>
+          <w:rFonts w:ascii="Times New Roman" w:eastAsia="Times New Roman" w:hAnsi="Times New Roman" w:cs="Times New Roman"/>
+          <w:b/>
+          <w:sz w:val="24"/>
+          <w:szCs w:val="24"/>
+        </w:rPr>
+        <w:t xml:space="preserve"> Drive Shaft Manufacturing</w:t>
+      </w:r>
+    </w:p>
+    <w:p>
+      <w:pPr>
+        <w:pStyle w:val="Heading3"/>
+        <w:spacing w:before="0" w:beforeAutospacing="0" w:after="0" w:afterAutospacing="0"/>
+        <w:rPr>
+          <w:sz w:val="24"/>
+          <w:szCs w:val="24"/>
+        </w:rPr>
+      </w:pPr>
+      <w:r>
+        <w:rPr>
+          <w:rStyle w:val="Strong"/>
+          <w:b/>
+          <w:bCs/>
+          <w:sz w:val="24"/>
+          <w:szCs w:val="24"/>
+        </w:rPr>
+        <w:t>Objective of the Day</w:t>
+      </w:r>
+    </w:p>
+    <w:p>
+      <w:pPr>
+        <w:pStyle w:val="NormalWeb"/>
+        <w:spacing w:before="0" w:beforeAutospacing="0" w:after="0" w:afterAutospacing="0"/>
+      </w:pPr>
+      <w:r>
+        <w:t>To perform comprehensive global UX validation across the entire Offline Industrial Data Intelligence System frontend, finalize the Home page as a centralized navigation hub, and ensure all user flows are consistent, intuitive, and review-ready.</w:t>
+      </w:r>
+    </w:p>
+    <w:p>
+      <w:pPr>
+        <w:pStyle w:val="NormalWeb"/>
+        <w:spacing w:before="0" w:beforeAutospacing="0" w:after="0" w:afterAutospacing="0"/>
+      </w:pPr>
+    </w:p>
+    <w:p>
+      <w:pPr>
+        <w:pStyle w:val="Heading3"/>
+        <w:spacing w:before="0" w:beforeAutospacing="0" w:after="0" w:afterAutospacing="0"/>
+        <w:rPr>
+          <w:sz w:val="24"/>
+          <w:szCs w:val="24"/>
+        </w:rPr>
+      </w:pPr>
+      <w:r>
+        <w:rPr>
+          <w:rStyle w:val="Strong"/>
+          <w:b/>
+          <w:bCs/>
+          <w:sz w:val="24"/>
+          <w:szCs w:val="24"/>
+        </w:rPr>
+        <w:t>Activities Performed</w:t>
+      </w:r>
+    </w:p>
+    <w:p>
+      <w:pPr>
+        <w:pStyle w:val="NormalWeb"/>
+        <w:spacing w:before="0" w:beforeAutospacing="0" w:after="0" w:afterAutospacing="0"/>
+      </w:pPr>
+      <w:r>
+        <w:t>• Conducted global UX validation across all frontend pages including Home, Ingestion, Insights, Dashboards, Exports, Data Health, and Explorer.</w:t>
+      </w:r>
+      <w:r>
+        <w:br/>
+        <w:t>• Verified consistency of color palette, typography, spacing, and layout across sidebar, top bar, cards, and action buttons.</w:t>
+      </w:r>
+      <w:r>
+        <w:br/>
+        <w:t xml:space="preserve">• Finalized the </w:t>
+      </w:r>
+      <w:r>
+        <w:rPr>
+          <w:rStyle w:val="Strong"/>
+        </w:rPr>
+        <w:t>Home Page UI</w:t>
+      </w:r>
+      <w:r>
+        <w:t>, implementing:</w:t>
+      </w:r>
+    </w:p>
+    <w:p>
+      <w:pPr>
+        <w:pStyle w:val="NormalWeb"/>
+        <w:numPr>
+          <w:ilvl w:val="0"/>
+          <w:numId w:val="45"/>
+        </w:numPr>
+        <w:spacing w:before="0" w:beforeAutospacing="0" w:after="0" w:afterAutospacing="0"/>
+      </w:pPr>
+      <w:r>
+        <w:t>Active Run visibility</w:t>
+      </w:r>
+    </w:p>
+    <w:p>
+      <w:pPr>
+        <w:pStyle w:val="NormalWeb"/>
+        <w:numPr>
+          <w:ilvl w:val="0"/>
+          <w:numId w:val="45"/>
+        </w:numPr>
+        <w:spacing w:before="0" w:beforeAutospacing="0" w:after="0" w:afterAutospacing="0"/>
+      </w:pPr>
+      <w:r>
+        <w:t>Total Insights &amp; Dashboards summary</w:t>
+      </w:r>
+    </w:p>
+    <w:p>
+      <w:pPr>
+        <w:pStyle w:val="NormalWeb"/>
+        <w:numPr>
+          <w:ilvl w:val="0"/>
+          <w:numId w:val="45"/>
+        </w:numPr>
+        <w:spacing w:before="0" w:beforeAutospacing="0" w:after="0" w:afterAutospacing="0"/>
+      </w:pPr>
+      <w:r>
+        <w:t>Total Exports summary</w:t>
+      </w:r>
+    </w:p>
+    <w:p>
+      <w:pPr>
+        <w:pStyle w:val="NormalWeb"/>
+        <w:numPr>
+          <w:ilvl w:val="0"/>
+          <w:numId w:val="45"/>
+        </w:numPr>
+        <w:spacing w:before="0" w:beforeAutospacing="0" w:after="0" w:afterAutospacing="0"/>
+      </w:pPr>
+      <w:r>
+        <w:t>Centralized navigation buttons for all major modules</w:t>
+      </w:r>
+      <w:r>
+        <w:br/>
+        <w:t>• Validated run-dependent navigation and ensured no page performs unintended actions without explicit user intent.</w:t>
+      </w:r>
+      <w:r>
+        <w:br/>
+        <w:t>• Reviewed dashboard interaction UX including Save, Undo, Redo, Export navigation, and Insights redirection.</w:t>
+      </w:r>
+      <w:r>
+        <w:br/>
+        <w:t>• Ensured that Export functionality follows correct UX flow (navigation-based, not direct execution).</w:t>
+      </w:r>
+      <w:r>
+        <w:br/>
+        <w:t>• Checked edge cases such as no active run, failed ingestion, empty dashboards, and disabled actions.</w:t>
+      </w:r>
+    </w:p>
+    <w:p>
+      <w:pPr>
+        <w:pStyle w:val="NormalWeb"/>
+        <w:spacing w:before="0" w:beforeAutospacing="0" w:after="0" w:afterAutospacing="0"/>
+      </w:pPr>
+    </w:p>
+    <w:p>
+      <w:pPr>
+        <w:pStyle w:val="Heading3"/>
+        <w:spacing w:before="0" w:beforeAutospacing="0" w:after="0" w:afterAutospacing="0"/>
+        <w:rPr>
+          <w:sz w:val="24"/>
+          <w:szCs w:val="24"/>
+        </w:rPr>
+      </w:pPr>
+      <w:r>
+        <w:rPr>
+          <w:rStyle w:val="Strong"/>
+          <w:b/>
+          <w:bCs/>
+          <w:sz w:val="24"/>
+          <w:szCs w:val="24"/>
+        </w:rPr>
+        <w:t>Outcome of the Day</w:t>
+      </w:r>
+    </w:p>
+    <w:p>
+      <w:pPr>
+        <w:pStyle w:val="NormalWeb"/>
+        <w:spacing w:before="0" w:beforeAutospacing="0" w:after="0" w:afterAutospacing="0"/>
+      </w:pPr>
+      <w:r>
+        <w:t>• Global UX across the application is consistent, predictable, and professional.</w:t>
+      </w:r>
+      <w:r>
+        <w:br/>
+        <w:t>• Home page is finalized as a functional system entry point and navigation dashboard.</w:t>
+      </w:r>
+      <w:r>
+        <w:br/>
+        <w:t>• All pages follow a unified design language suitable for industrial and academic review.</w:t>
+      </w:r>
+      <w:r>
+        <w:br/>
+        <w:t>• Frontend UX is stable and ready for final documentation and backend integration.</w:t>
+      </w:r>
+    </w:p>
+    <w:p>
+      <w:pPr>
+        <w:pStyle w:val="NormalWeb"/>
+        <w:spacing w:before="0" w:beforeAutospacing="0" w:after="0" w:afterAutospacing="0"/>
+      </w:pPr>
+    </w:p>
+    <w:p>
+      <w:pPr>
+        <w:pStyle w:val="Heading3"/>
+        <w:spacing w:before="0" w:beforeAutospacing="0" w:after="0" w:afterAutospacing="0"/>
+        <w:rPr>
+          <w:sz w:val="24"/>
+          <w:szCs w:val="24"/>
+        </w:rPr>
+      </w:pPr>
+      <w:r>
+        <w:rPr>
+          <w:rStyle w:val="Strong"/>
+          <w:b/>
+          <w:bCs/>
+          <w:sz w:val="24"/>
+          <w:szCs w:val="24"/>
+        </w:rPr>
+        <w:t>Key Learnings</w:t>
+      </w:r>
+    </w:p>
+    <w:p>
+      <w:pPr>
+        <w:pStyle w:val="NormalWeb"/>
+        <w:spacing w:before="0" w:beforeAutospacing="0" w:after="0" w:afterAutospacing="0"/>
+      </w:pPr>
+      <w:r>
+        <w:t>• Global UX validation is essential before backend wiring to avoid structural rework.</w:t>
+      </w:r>
+      <w:r>
+        <w:br/>
+        <w:t>• Navigation-based actions reduce user error and improve system clarity.</w:t>
+      </w:r>
+      <w:r>
+        <w:br/>
+        <w:t>• Industrial analytics tools require explicit state visibility (Active Run) at all times.</w:t>
+      </w:r>
+      <w:r>
+        <w:br/>
+        <w:t>• Treating dashboards as documents improves user confidence and workflow safety.</w:t>
+      </w:r>
+    </w:p>
+    <w:p>
+      <w:pPr>
+        <w:pStyle w:val="NormalWeb"/>
+        <w:spacing w:before="0" w:beforeAutospacing="0" w:after="0" w:afterAutospacing="0"/>
+      </w:pPr>
+    </w:p>
+    <w:p>
+      <w:pPr>
+        <w:pStyle w:val="Heading3"/>
+        <w:spacing w:before="0" w:beforeAutospacing="0" w:after="0" w:afterAutospacing="0"/>
+        <w:rPr>
+          <w:sz w:val="24"/>
+          <w:szCs w:val="24"/>
+        </w:rPr>
+      </w:pPr>
+      <w:r>
+        <w:rPr>
+          <w:rStyle w:val="Strong"/>
+          <w:b/>
+          <w:bCs/>
+          <w:sz w:val="24"/>
+          <w:szCs w:val="24"/>
+        </w:rPr>
+        <w:t>Challenges / Open Points</w:t>
+      </w:r>
+    </w:p>
+    <w:p>
+      <w:pPr>
+        <w:pStyle w:val="NormalWeb"/>
+        <w:spacing w:before="0" w:beforeAutospacing="0" w:after="0" w:afterAutospacing="0"/>
+      </w:pPr>
+      <w:r>
+        <w:t>• Backend integration for live counts (Insights, Dashboards, Exports) is pending.</w:t>
+      </w:r>
+      <w:r>
+        <w:br/>
+        <w:t>• Advanced responsiveness and micro-interactions can be improved in later phases.</w:t>
+      </w:r>
       <w:bookmarkStart w:id="0" w:name="_GoBack"/>
       <w:bookmarkEnd w:id="0"/>
+    </w:p>
+    <w:p>
+      <w:pPr>
+        <w:pStyle w:val="NormalWeb"/>
+        <w:spacing w:before="0" w:beforeAutospacing="0" w:after="0" w:afterAutospacing="0"/>
+      </w:pPr>
+    </w:p>
+    <w:p>
+      <w:pPr>
+        <w:pStyle w:val="Heading3"/>
+        <w:spacing w:before="0" w:beforeAutospacing="0" w:after="0" w:afterAutospacing="0"/>
+        <w:rPr>
+          <w:b w:val="0"/>
+          <w:sz w:val="24"/>
+          <w:szCs w:val="24"/>
+        </w:rPr>
+      </w:pPr>
+      <w:r>
+        <w:rPr>
+          <w:rStyle w:val="Strong"/>
+          <w:b/>
+          <w:bCs/>
+          <w:sz w:val="24"/>
+          <w:szCs w:val="24"/>
+        </w:rPr>
+        <w:t>Next Steps</w:t>
+      </w:r>
+      <w:r>
+        <w:rPr>
+          <w:sz w:val="24"/>
+          <w:szCs w:val="24"/>
+        </w:rPr>
+        <w:br/>
+      </w:r>
+      <w:r>
+        <w:rPr>
+          <w:b w:val="0"/>
+          <w:sz w:val="24"/>
+          <w:szCs w:val="24"/>
+        </w:rPr>
+        <w:t>• Begin backend integration (ML engine, rule-based engine, orchestrator).</w:t>
+      </w:r>
     </w:p>
     <w:sectPr>
       <w:pgSz w:w="12240" w:h="15840"/>
@@ -10500,6 +10857,155 @@
     </w:lvl>
   </w:abstractNum>
   <w:abstractNum w:abstractNumId="19" w15:restartNumberingAfterBreak="0">
+    <w:nsid w:val="33FF6B03"/>
+    <w:multiLevelType w:val="multilevel"/>
+    <w:tmpl w:val="38D493B4"/>
+    <w:lvl w:ilvl="0">
+      <w:start w:val="1"/>
+      <w:numFmt w:val="bullet"/>
+      <w:lvlText w:val=""/>
+      <w:lvlJc w:val="left"/>
+      <w:pPr>
+        <w:tabs>
+          <w:tab w:val="num" w:pos="720"/>
+        </w:tabs>
+        <w:ind w:left="720" w:hanging="360"/>
+      </w:pPr>
+      <w:rPr>
+        <w:rFonts w:ascii="Symbol" w:hAnsi="Symbol" w:hint="default"/>
+        <w:sz w:val="20"/>
+      </w:rPr>
+    </w:lvl>
+    <w:lvl w:ilvl="1" w:tentative="1">
+      <w:start w:val="1"/>
+      <w:numFmt w:val="bullet"/>
+      <w:lvlText w:val="o"/>
+      <w:lvlJc w:val="left"/>
+      <w:pPr>
+        <w:tabs>
+          <w:tab w:val="num" w:pos="1440"/>
+        </w:tabs>
+        <w:ind w:left="1440" w:hanging="360"/>
+      </w:pPr>
+      <w:rPr>
+        <w:rFonts w:ascii="Courier New" w:hAnsi="Courier New" w:hint="default"/>
+        <w:sz w:val="20"/>
+      </w:rPr>
+    </w:lvl>
+    <w:lvl w:ilvl="2" w:tentative="1">
+      <w:start w:val="1"/>
+      <w:numFmt w:val="bullet"/>
+      <w:lvlText w:val=""/>
+      <w:lvlJc w:val="left"/>
+      <w:pPr>
+        <w:tabs>
+          <w:tab w:val="num" w:pos="2160"/>
+        </w:tabs>
+        <w:ind w:left="2160" w:hanging="360"/>
+      </w:pPr>
+      <w:rPr>
+        <w:rFonts w:ascii="Wingdings" w:hAnsi="Wingdings" w:hint="default"/>
+        <w:sz w:val="20"/>
+      </w:rPr>
+    </w:lvl>
+    <w:lvl w:ilvl="3" w:tentative="1">
+      <w:start w:val="1"/>
+      <w:numFmt w:val="bullet"/>
+      <w:lvlText w:val=""/>
+      <w:lvlJc w:val="left"/>
+      <w:pPr>
+        <w:tabs>
+          <w:tab w:val="num" w:pos="2880"/>
+        </w:tabs>
+        <w:ind w:left="2880" w:hanging="360"/>
+      </w:pPr>
+      <w:rPr>
+        <w:rFonts w:ascii="Wingdings" w:hAnsi="Wingdings" w:hint="default"/>
+        <w:sz w:val="20"/>
+      </w:rPr>
+    </w:lvl>
+    <w:lvl w:ilvl="4" w:tentative="1">
+      <w:start w:val="1"/>
+      <w:numFmt w:val="bullet"/>
+      <w:lvlText w:val=""/>
+      <w:lvlJc w:val="left"/>
+      <w:pPr>
+        <w:tabs>
+          <w:tab w:val="num" w:pos="3600"/>
+        </w:tabs>
+        <w:ind w:left="3600" w:hanging="360"/>
+      </w:pPr>
+      <w:rPr>
+        <w:rFonts w:ascii="Wingdings" w:hAnsi="Wingdings" w:hint="default"/>
+        <w:sz w:val="20"/>
+      </w:rPr>
+    </w:lvl>
+    <w:lvl w:ilvl="5" w:tentative="1">
+      <w:start w:val="1"/>
+      <w:numFmt w:val="bullet"/>
+      <w:lvlText w:val=""/>
+      <w:lvlJc w:val="left"/>
+      <w:pPr>
+        <w:tabs>
+          <w:tab w:val="num" w:pos="4320"/>
+        </w:tabs>
+        <w:ind w:left="4320" w:hanging="360"/>
+      </w:pPr>
+      <w:rPr>
+        <w:rFonts w:ascii="Wingdings" w:hAnsi="Wingdings" w:hint="default"/>
+        <w:sz w:val="20"/>
+      </w:rPr>
+    </w:lvl>
+    <w:lvl w:ilvl="6" w:tentative="1">
+      <w:start w:val="1"/>
+      <w:numFmt w:val="bullet"/>
+      <w:lvlText w:val=""/>
+      <w:lvlJc w:val="left"/>
+      <w:pPr>
+        <w:tabs>
+          <w:tab w:val="num" w:pos="5040"/>
+        </w:tabs>
+        <w:ind w:left="5040" w:hanging="360"/>
+      </w:pPr>
+      <w:rPr>
+        <w:rFonts w:ascii="Wingdings" w:hAnsi="Wingdings" w:hint="default"/>
+        <w:sz w:val="20"/>
+      </w:rPr>
+    </w:lvl>
+    <w:lvl w:ilvl="7" w:tentative="1">
+      <w:start w:val="1"/>
+      <w:numFmt w:val="bullet"/>
+      <w:lvlText w:val=""/>
+      <w:lvlJc w:val="left"/>
+      <w:pPr>
+        <w:tabs>
+          <w:tab w:val="num" w:pos="5760"/>
+        </w:tabs>
+        <w:ind w:left="5760" w:hanging="360"/>
+      </w:pPr>
+      <w:rPr>
+        <w:rFonts w:ascii="Wingdings" w:hAnsi="Wingdings" w:hint="default"/>
+        <w:sz w:val="20"/>
+      </w:rPr>
+    </w:lvl>
+    <w:lvl w:ilvl="8" w:tentative="1">
+      <w:start w:val="1"/>
+      <w:numFmt w:val="bullet"/>
+      <w:lvlText w:val=""/>
+      <w:lvlJc w:val="left"/>
+      <w:pPr>
+        <w:tabs>
+          <w:tab w:val="num" w:pos="6480"/>
+        </w:tabs>
+        <w:ind w:left="6480" w:hanging="360"/>
+      </w:pPr>
+      <w:rPr>
+        <w:rFonts w:ascii="Wingdings" w:hAnsi="Wingdings" w:hint="default"/>
+        <w:sz w:val="20"/>
+      </w:rPr>
+    </w:lvl>
+  </w:abstractNum>
+  <w:abstractNum w:abstractNumId="20" w15:restartNumberingAfterBreak="0">
     <w:nsid w:val="391764DC"/>
     <w:multiLevelType w:val="multilevel"/>
     <w:tmpl w:val="31FAB04C"/>
@@ -10648,7 +11154,7 @@
       </w:rPr>
     </w:lvl>
   </w:abstractNum>
-  <w:abstractNum w:abstractNumId="20" w15:restartNumberingAfterBreak="0">
+  <w:abstractNum w:abstractNumId="21" w15:restartNumberingAfterBreak="0">
     <w:nsid w:val="3CEB3B07"/>
     <w:multiLevelType w:val="multilevel"/>
     <w:tmpl w:val="6C903DEA"/>
@@ -10797,7 +11303,7 @@
       </w:rPr>
     </w:lvl>
   </w:abstractNum>
-  <w:abstractNum w:abstractNumId="21" w15:restartNumberingAfterBreak="0">
+  <w:abstractNum w:abstractNumId="22" w15:restartNumberingAfterBreak="0">
     <w:nsid w:val="3D1E6C5B"/>
     <w:multiLevelType w:val="multilevel"/>
     <w:tmpl w:val="7D5A8D26"/>
@@ -10946,7 +11452,7 @@
       </w:rPr>
     </w:lvl>
   </w:abstractNum>
-  <w:abstractNum w:abstractNumId="22" w15:restartNumberingAfterBreak="0">
+  <w:abstractNum w:abstractNumId="23" w15:restartNumberingAfterBreak="0">
     <w:nsid w:val="3E75593D"/>
     <w:multiLevelType w:val="multilevel"/>
     <w:tmpl w:val="77E60D1C"/>
@@ -11095,7 +11601,7 @@
       </w:rPr>
     </w:lvl>
   </w:abstractNum>
-  <w:abstractNum w:abstractNumId="23" w15:restartNumberingAfterBreak="0">
+  <w:abstractNum w:abstractNumId="24" w15:restartNumberingAfterBreak="0">
     <w:nsid w:val="3FE16A64"/>
     <w:multiLevelType w:val="multilevel"/>
     <w:tmpl w:val="BAF6EC1C"/>
@@ -11244,7 +11750,7 @@
       </w:rPr>
     </w:lvl>
   </w:abstractNum>
-  <w:abstractNum w:abstractNumId="24" w15:restartNumberingAfterBreak="0">
+  <w:abstractNum w:abstractNumId="25" w15:restartNumberingAfterBreak="0">
     <w:nsid w:val="485658D2"/>
     <w:multiLevelType w:val="hybridMultilevel"/>
     <w:tmpl w:val="62946024"/>
@@ -11357,7 +11863,7 @@
       </w:rPr>
     </w:lvl>
   </w:abstractNum>
-  <w:abstractNum w:abstractNumId="25" w15:restartNumberingAfterBreak="0">
+  <w:abstractNum w:abstractNumId="26" w15:restartNumberingAfterBreak="0">
     <w:nsid w:val="4D6C676B"/>
     <w:multiLevelType w:val="multilevel"/>
     <w:tmpl w:val="864695D8"/>
@@ -11506,7 +12012,7 @@
       </w:rPr>
     </w:lvl>
   </w:abstractNum>
-  <w:abstractNum w:abstractNumId="26" w15:restartNumberingAfterBreak="0">
+  <w:abstractNum w:abstractNumId="27" w15:restartNumberingAfterBreak="0">
     <w:nsid w:val="4EC51907"/>
     <w:multiLevelType w:val="multilevel"/>
     <w:tmpl w:val="B9D0FF78"/>
@@ -11655,7 +12161,7 @@
       </w:rPr>
     </w:lvl>
   </w:abstractNum>
-  <w:abstractNum w:abstractNumId="27" w15:restartNumberingAfterBreak="0">
+  <w:abstractNum w:abstractNumId="28" w15:restartNumberingAfterBreak="0">
     <w:nsid w:val="4F720D32"/>
     <w:multiLevelType w:val="multilevel"/>
     <w:tmpl w:val="C0FE42C6"/>
@@ -11804,7 +12310,7 @@
       </w:rPr>
     </w:lvl>
   </w:abstractNum>
-  <w:abstractNum w:abstractNumId="28" w15:restartNumberingAfterBreak="0">
+  <w:abstractNum w:abstractNumId="29" w15:restartNumberingAfterBreak="0">
     <w:nsid w:val="53F5143F"/>
     <w:multiLevelType w:val="hybridMultilevel"/>
     <w:tmpl w:val="B2005722"/>
@@ -11917,7 +12423,7 @@
       </w:rPr>
     </w:lvl>
   </w:abstractNum>
-  <w:abstractNum w:abstractNumId="29" w15:restartNumberingAfterBreak="0">
+  <w:abstractNum w:abstractNumId="30" w15:restartNumberingAfterBreak="0">
     <w:nsid w:val="5418548D"/>
     <w:multiLevelType w:val="multilevel"/>
     <w:tmpl w:val="F3745D64"/>
@@ -12066,7 +12572,7 @@
       </w:rPr>
     </w:lvl>
   </w:abstractNum>
-  <w:abstractNum w:abstractNumId="30" w15:restartNumberingAfterBreak="0">
+  <w:abstractNum w:abstractNumId="31" w15:restartNumberingAfterBreak="0">
     <w:nsid w:val="54E51C22"/>
     <w:multiLevelType w:val="hybridMultilevel"/>
     <w:tmpl w:val="D9A89FBA"/>
@@ -12179,7 +12685,7 @@
       </w:rPr>
     </w:lvl>
   </w:abstractNum>
-  <w:abstractNum w:abstractNumId="31" w15:restartNumberingAfterBreak="0">
+  <w:abstractNum w:abstractNumId="32" w15:restartNumberingAfterBreak="0">
     <w:nsid w:val="56141124"/>
     <w:multiLevelType w:val="multilevel"/>
     <w:tmpl w:val="72CECC2A"/>
@@ -12328,7 +12834,7 @@
       </w:rPr>
     </w:lvl>
   </w:abstractNum>
-  <w:abstractNum w:abstractNumId="32" w15:restartNumberingAfterBreak="0">
+  <w:abstractNum w:abstractNumId="33" w15:restartNumberingAfterBreak="0">
     <w:nsid w:val="5BD530F4"/>
     <w:multiLevelType w:val="multilevel"/>
     <w:tmpl w:val="85BE4242"/>
@@ -12477,7 +12983,7 @@
       </w:rPr>
     </w:lvl>
   </w:abstractNum>
-  <w:abstractNum w:abstractNumId="33" w15:restartNumberingAfterBreak="0">
+  <w:abstractNum w:abstractNumId="34" w15:restartNumberingAfterBreak="0">
     <w:nsid w:val="5F797678"/>
     <w:multiLevelType w:val="multilevel"/>
     <w:tmpl w:val="4BE291F8"/>
@@ -12626,7 +13132,7 @@
       </w:rPr>
     </w:lvl>
   </w:abstractNum>
-  <w:abstractNum w:abstractNumId="34" w15:restartNumberingAfterBreak="0">
+  <w:abstractNum w:abstractNumId="35" w15:restartNumberingAfterBreak="0">
     <w:nsid w:val="64B00720"/>
     <w:multiLevelType w:val="multilevel"/>
     <w:tmpl w:val="ECA4E594"/>
@@ -12775,7 +13281,7 @@
       </w:rPr>
     </w:lvl>
   </w:abstractNum>
-  <w:abstractNum w:abstractNumId="35" w15:restartNumberingAfterBreak="0">
+  <w:abstractNum w:abstractNumId="36" w15:restartNumberingAfterBreak="0">
     <w:nsid w:val="64D8791F"/>
     <w:multiLevelType w:val="multilevel"/>
     <w:tmpl w:val="C818DFEE"/>
@@ -12924,7 +13430,7 @@
       </w:rPr>
     </w:lvl>
   </w:abstractNum>
-  <w:abstractNum w:abstractNumId="36" w15:restartNumberingAfterBreak="0">
+  <w:abstractNum w:abstractNumId="37" w15:restartNumberingAfterBreak="0">
     <w:nsid w:val="6D3E2179"/>
     <w:multiLevelType w:val="multilevel"/>
     <w:tmpl w:val="CAE0758E"/>
@@ -13073,7 +13579,7 @@
       </w:rPr>
     </w:lvl>
   </w:abstractNum>
-  <w:abstractNum w:abstractNumId="37" w15:restartNumberingAfterBreak="0">
+  <w:abstractNum w:abstractNumId="38" w15:restartNumberingAfterBreak="0">
     <w:nsid w:val="6E6A33B4"/>
     <w:multiLevelType w:val="multilevel"/>
     <w:tmpl w:val="95FC9004"/>
@@ -13222,7 +13728,7 @@
       </w:rPr>
     </w:lvl>
   </w:abstractNum>
-  <w:abstractNum w:abstractNumId="38" w15:restartNumberingAfterBreak="0">
+  <w:abstractNum w:abstractNumId="39" w15:restartNumberingAfterBreak="0">
     <w:nsid w:val="714D5569"/>
     <w:multiLevelType w:val="multilevel"/>
     <w:tmpl w:val="CD0AA0D6"/>
@@ -13371,7 +13877,7 @@
       </w:rPr>
     </w:lvl>
   </w:abstractNum>
-  <w:abstractNum w:abstractNumId="39" w15:restartNumberingAfterBreak="0">
+  <w:abstractNum w:abstractNumId="40" w15:restartNumberingAfterBreak="0">
     <w:nsid w:val="73042D32"/>
     <w:multiLevelType w:val="hybridMultilevel"/>
     <w:tmpl w:val="1EF05924"/>
@@ -13484,7 +13990,7 @@
       </w:rPr>
     </w:lvl>
   </w:abstractNum>
-  <w:abstractNum w:abstractNumId="40" w15:restartNumberingAfterBreak="0">
+  <w:abstractNum w:abstractNumId="41" w15:restartNumberingAfterBreak="0">
     <w:nsid w:val="77AE223B"/>
     <w:multiLevelType w:val="multilevel"/>
     <w:tmpl w:val="E7AC683A"/>
@@ -13633,7 +14139,7 @@
       </w:rPr>
     </w:lvl>
   </w:abstractNum>
-  <w:abstractNum w:abstractNumId="41" w15:restartNumberingAfterBreak="0">
+  <w:abstractNum w:abstractNumId="42" w15:restartNumberingAfterBreak="0">
     <w:nsid w:val="7C261037"/>
     <w:multiLevelType w:val="multilevel"/>
     <w:tmpl w:val="910E7076"/>
@@ -13782,7 +14288,7 @@
       </w:rPr>
     </w:lvl>
   </w:abstractNum>
-  <w:abstractNum w:abstractNumId="42" w15:restartNumberingAfterBreak="0">
+  <w:abstractNum w:abstractNumId="43" w15:restartNumberingAfterBreak="0">
     <w:nsid w:val="7C3B2547"/>
     <w:multiLevelType w:val="multilevel"/>
     <w:tmpl w:val="B18CE0AE"/>
@@ -13931,7 +14437,7 @@
       </w:rPr>
     </w:lvl>
   </w:abstractNum>
-  <w:abstractNum w:abstractNumId="43" w15:restartNumberingAfterBreak="0">
+  <w:abstractNum w:abstractNumId="44" w15:restartNumberingAfterBreak="0">
     <w:nsid w:val="7C495741"/>
     <w:multiLevelType w:val="multilevel"/>
     <w:tmpl w:val="31921748"/>
@@ -14051,22 +14557,22 @@
     <w:abstractNumId w:val="8"/>
   </w:num>
   <w:num w:numId="3">
-    <w:abstractNumId w:val="23"/>
+    <w:abstractNumId w:val="24"/>
   </w:num>
   <w:num w:numId="4">
-    <w:abstractNumId w:val="31"/>
+    <w:abstractNumId w:val="32"/>
   </w:num>
   <w:num w:numId="5">
     <w:abstractNumId w:val="1"/>
   </w:num>
   <w:num w:numId="6">
-    <w:abstractNumId w:val="41"/>
+    <w:abstractNumId w:val="42"/>
   </w:num>
   <w:num w:numId="7">
-    <w:abstractNumId w:val="42"/>
+    <w:abstractNumId w:val="43"/>
   </w:num>
   <w:num w:numId="8">
-    <w:abstractNumId w:val="40"/>
+    <w:abstractNumId w:val="41"/>
   </w:num>
   <w:num w:numId="9">
     <w:abstractNumId w:val="2"/>
@@ -14075,55 +14581,55 @@
     <w:abstractNumId w:val="10"/>
   </w:num>
   <w:num w:numId="11">
-    <w:abstractNumId w:val="32"/>
+    <w:abstractNumId w:val="33"/>
   </w:num>
   <w:num w:numId="12">
     <w:abstractNumId w:val="15"/>
   </w:num>
   <w:num w:numId="13">
-    <w:abstractNumId w:val="36"/>
+    <w:abstractNumId w:val="37"/>
   </w:num>
   <w:num w:numId="14">
     <w:abstractNumId w:val="11"/>
   </w:num>
   <w:num w:numId="15">
-    <w:abstractNumId w:val="28"/>
+    <w:abstractNumId w:val="29"/>
   </w:num>
   <w:num w:numId="16">
     <w:abstractNumId w:val="9"/>
   </w:num>
   <w:num w:numId="17">
-    <w:abstractNumId w:val="43"/>
+    <w:abstractNumId w:val="44"/>
   </w:num>
   <w:num w:numId="18">
-    <w:abstractNumId w:val="25"/>
+    <w:abstractNumId w:val="26"/>
   </w:num>
   <w:num w:numId="19">
     <w:abstractNumId w:val="0"/>
   </w:num>
   <w:num w:numId="20">
-    <w:abstractNumId w:val="26"/>
+    <w:abstractNumId w:val="27"/>
   </w:num>
   <w:num w:numId="21">
-    <w:abstractNumId w:val="35"/>
+    <w:abstractNumId w:val="36"/>
   </w:num>
   <w:num w:numId="22">
-    <w:abstractNumId w:val="21"/>
+    <w:abstractNumId w:val="22"/>
   </w:num>
   <w:num w:numId="23">
     <w:abstractNumId w:val="17"/>
   </w:num>
   <w:num w:numId="24">
-    <w:abstractNumId w:val="29"/>
+    <w:abstractNumId w:val="30"/>
   </w:num>
   <w:num w:numId="25">
     <w:abstractNumId w:val="3"/>
   </w:num>
   <w:num w:numId="26">
-    <w:abstractNumId w:val="34"/>
+    <w:abstractNumId w:val="35"/>
   </w:num>
   <w:num w:numId="27">
-    <w:abstractNumId w:val="33"/>
+    <w:abstractNumId w:val="34"/>
   </w:num>
   <w:num w:numId="28">
     <w:abstractNumId w:val="16"/>
@@ -14138,43 +14644,46 @@
     <w:abstractNumId w:val="18"/>
   </w:num>
   <w:num w:numId="32">
-    <w:abstractNumId w:val="20"/>
+    <w:abstractNumId w:val="21"/>
   </w:num>
   <w:num w:numId="33">
     <w:abstractNumId w:val="14"/>
   </w:num>
   <w:num w:numId="34">
-    <w:abstractNumId w:val="22"/>
+    <w:abstractNumId w:val="23"/>
   </w:num>
   <w:num w:numId="35">
-    <w:abstractNumId w:val="24"/>
+    <w:abstractNumId w:val="25"/>
   </w:num>
   <w:num w:numId="36">
-    <w:abstractNumId w:val="30"/>
+    <w:abstractNumId w:val="31"/>
   </w:num>
   <w:num w:numId="37">
     <w:abstractNumId w:val="5"/>
   </w:num>
   <w:num w:numId="38">
-    <w:abstractNumId w:val="39"/>
+    <w:abstractNumId w:val="40"/>
   </w:num>
   <w:num w:numId="39">
     <w:abstractNumId w:val="6"/>
   </w:num>
   <w:num w:numId="40">
-    <w:abstractNumId w:val="38"/>
+    <w:abstractNumId w:val="39"/>
   </w:num>
   <w:num w:numId="41">
-    <w:abstractNumId w:val="27"/>
+    <w:abstractNumId w:val="28"/>
   </w:num>
   <w:num w:numId="42">
     <w:abstractNumId w:val="4"/>
   </w:num>
   <w:num w:numId="43">
-    <w:abstractNumId w:val="19"/>
+    <w:abstractNumId w:val="20"/>
   </w:num>
   <w:num w:numId="44">
-    <w:abstractNumId w:val="37"/>
+    <w:abstractNumId w:val="38"/>
+  </w:num>
+  <w:num w:numId="45">
+    <w:abstractNumId w:val="19"/>
   </w:num>
   <w:numIdMacAtCleanup w:val="32"/>
 </w:numbering>
@@ -14573,7 +15082,7 @@
   <w:style w:type="paragraph" w:default="1" w:styleId="Normal">
     <w:name w:val="Normal"/>
     <w:qFormat/>
-    <w:rsid w:val="00DA7EFA"/>
+    <w:rsid w:val="000D7E84"/>
   </w:style>
   <w:style w:type="paragraph" w:styleId="Heading2">
     <w:name w:val="heading 2"/>
@@ -14987,7 +15496,7 @@
 </file>
 
 <file path=customXml/itemProps1.xml><?xml version="1.0" encoding="utf-8"?>
-<ds:datastoreItem xmlns:ds="http://schemas.openxmlformats.org/officeDocument/2006/customXml" ds:itemID="{7ACCA65E-910C-4079-B9F3-DAF2932B35AD}">
+<ds:datastoreItem xmlns:ds="http://schemas.openxmlformats.org/officeDocument/2006/customXml" ds:itemID="{B4AF21A2-036E-4D3A-892F-5EE0E9632CA4}">
   <ds:schemaRefs>
     <ds:schemaRef ds:uri="http://schemas.openxmlformats.org/officeDocument/2006/bibliography"/>
   </ds:schemaRefs>

</xml_diff>

<commit_message>
Minor IPC, ingestion repository, and frontend API refinements
</commit_message>
<xml_diff>
--- a/docs/01_Daily_Log.docx
+++ b/docs/01_Daily_Log.docx
@@ -10493,49 +10493,1035 @@
       <w:r>
         <w:t>Desktop application is now stable and ready for backend ingestion and analytics implementation.</w:t>
       </w:r>
+    </w:p>
+    <w:p>
+      <w:pPr>
+        <w:pStyle w:val="NormalWeb"/>
+      </w:pPr>
+    </w:p>
+    <w:p>
+      <w:pPr>
+        <w:spacing w:before="100" w:beforeAutospacing="1" w:after="100" w:afterAutospacing="1" w:line="240" w:lineRule="auto"/>
+        <w:outlineLvl w:val="1"/>
+        <w:rPr>
+          <w:rFonts w:ascii="Times New Roman" w:eastAsia="Times New Roman" w:hAnsi="Times New Roman" w:cs="Times New Roman"/>
+          <w:b/>
+          <w:sz w:val="24"/>
+          <w:szCs w:val="24"/>
+        </w:rPr>
+      </w:pPr>
+    </w:p>
+    <w:p>
+      <w:pPr>
+        <w:spacing w:before="100" w:beforeAutospacing="1" w:after="100" w:afterAutospacing="1" w:line="240" w:lineRule="auto"/>
+        <w:outlineLvl w:val="1"/>
+        <w:rPr>
+          <w:rFonts w:ascii="Times New Roman" w:eastAsia="Times New Roman" w:hAnsi="Times New Roman" w:cs="Times New Roman"/>
+          <w:b/>
+          <w:sz w:val="24"/>
+          <w:szCs w:val="24"/>
+        </w:rPr>
+      </w:pPr>
+    </w:p>
+    <w:p>
+      <w:pPr>
+        <w:spacing w:before="100" w:beforeAutospacing="1" w:after="100" w:afterAutospacing="1" w:line="240" w:lineRule="auto"/>
+        <w:outlineLvl w:val="1"/>
+        <w:rPr>
+          <w:rFonts w:ascii="Times New Roman" w:eastAsia="Times New Roman" w:hAnsi="Times New Roman" w:cs="Times New Roman"/>
+          <w:b/>
+          <w:sz w:val="24"/>
+          <w:szCs w:val="24"/>
+        </w:rPr>
+      </w:pPr>
+    </w:p>
+    <w:p>
+      <w:pPr>
+        <w:spacing w:before="100" w:beforeAutospacing="1" w:after="100" w:afterAutospacing="1" w:line="240" w:lineRule="auto"/>
+        <w:outlineLvl w:val="1"/>
+        <w:rPr>
+          <w:rFonts w:ascii="Times New Roman" w:eastAsia="Times New Roman" w:hAnsi="Times New Roman" w:cs="Times New Roman"/>
+          <w:b/>
+          <w:sz w:val="24"/>
+          <w:szCs w:val="24"/>
+        </w:rPr>
+      </w:pPr>
+    </w:p>
+    <w:p>
+      <w:pPr>
+        <w:pStyle w:val="Heading3"/>
+        <w:spacing w:before="0" w:beforeAutospacing="0" w:after="0" w:afterAutospacing="0"/>
+        <w:rPr>
+          <w:b w:val="0"/>
+          <w:sz w:val="24"/>
+          <w:szCs w:val="24"/>
+        </w:rPr>
+      </w:pPr>
+    </w:p>
+    <w:p>
+      <w:pPr>
+        <w:pStyle w:val="Heading3"/>
+        <w:spacing w:before="0" w:beforeAutospacing="0" w:after="0" w:afterAutospacing="0"/>
+        <w:rPr>
+          <w:b w:val="0"/>
+          <w:sz w:val="24"/>
+          <w:szCs w:val="24"/>
+        </w:rPr>
+      </w:pPr>
+    </w:p>
+    <w:p>
+      <w:pPr>
+        <w:pStyle w:val="Heading3"/>
+        <w:spacing w:before="0" w:beforeAutospacing="0" w:after="0" w:afterAutospacing="0"/>
+        <w:rPr>
+          <w:b w:val="0"/>
+          <w:sz w:val="24"/>
+          <w:szCs w:val="24"/>
+        </w:rPr>
+      </w:pPr>
+    </w:p>
+    <w:p>
+      <w:pPr>
+        <w:spacing w:before="100" w:beforeAutospacing="1" w:after="100" w:afterAutospacing="1" w:line="240" w:lineRule="auto"/>
+        <w:outlineLvl w:val="1"/>
+        <w:rPr>
+          <w:rFonts w:ascii="Times New Roman" w:eastAsia="Times New Roman" w:hAnsi="Times New Roman" w:cs="Times New Roman"/>
+          <w:b/>
+          <w:sz w:val="24"/>
+          <w:szCs w:val="24"/>
+        </w:rPr>
+      </w:pPr>
+      <w:r>
+        <w:rPr>
+          <w:rFonts w:ascii="Times New Roman" w:eastAsia="Times New Roman" w:hAnsi="Times New Roman" w:cs="Times New Roman"/>
+          <w:b/>
+          <w:bCs/>
+          <w:sz w:val="24"/>
+          <w:szCs w:val="24"/>
+        </w:rPr>
+        <w:lastRenderedPageBreak/>
+        <w:t>Date:</w:t>
+      </w:r>
+      <w:r>
+        <w:rPr>
+          <w:rFonts w:ascii="Times New Roman" w:eastAsia="Times New Roman" w:hAnsi="Times New Roman" w:cs="Times New Roman"/>
+          <w:b/>
+          <w:sz w:val="24"/>
+          <w:szCs w:val="24"/>
+        </w:rPr>
+        <w:t xml:space="preserve"> 06/02/2026                                                                                                              Day 22</w:t>
+      </w:r>
+      <w:r>
+        <w:rPr>
+          <w:rFonts w:ascii="Times New Roman" w:eastAsia="Times New Roman" w:hAnsi="Times New Roman" w:cs="Times New Roman"/>
+          <w:b/>
+          <w:sz w:val="24"/>
+          <w:szCs w:val="24"/>
+        </w:rPr>
+        <w:br/>
+      </w:r>
+      <w:r>
+        <w:rPr>
+          <w:rFonts w:ascii="Times New Roman" w:eastAsia="Times New Roman" w:hAnsi="Times New Roman" w:cs="Times New Roman"/>
+          <w:b/>
+          <w:bCs/>
+          <w:sz w:val="24"/>
+          <w:szCs w:val="24"/>
+        </w:rPr>
+        <w:t>Department:</w:t>
+      </w:r>
+      <w:r>
+        <w:rPr>
+          <w:rFonts w:ascii="Times New Roman" w:eastAsia="Times New Roman" w:hAnsi="Times New Roman" w:cs="Times New Roman"/>
+          <w:b/>
+          <w:sz w:val="24"/>
+          <w:szCs w:val="24"/>
+        </w:rPr>
+        <w:t xml:space="preserve"> Maintenance</w:t>
+      </w:r>
+      <w:r>
+        <w:rPr>
+          <w:rFonts w:ascii="Times New Roman" w:eastAsia="Times New Roman" w:hAnsi="Times New Roman" w:cs="Times New Roman"/>
+          <w:b/>
+          <w:sz w:val="24"/>
+          <w:szCs w:val="24"/>
+        </w:rPr>
+        <w:br/>
+      </w:r>
+      <w:r>
+        <w:rPr>
+          <w:rFonts w:ascii="Times New Roman" w:eastAsia="Times New Roman" w:hAnsi="Times New Roman" w:cs="Times New Roman"/>
+          <w:b/>
+          <w:bCs/>
+          <w:sz w:val="24"/>
+          <w:szCs w:val="24"/>
+        </w:rPr>
+        <w:t>Plant:</w:t>
+      </w:r>
+      <w:r>
+        <w:rPr>
+          <w:rFonts w:ascii="Times New Roman" w:eastAsia="Times New Roman" w:hAnsi="Times New Roman" w:cs="Times New Roman"/>
+          <w:b/>
+          <w:sz w:val="24"/>
+          <w:szCs w:val="24"/>
+        </w:rPr>
+        <w:t xml:space="preserve"> Drive Shaft Manufacturing</w:t>
+      </w:r>
+    </w:p>
+    <w:p>
+      <w:pPr>
+        <w:spacing w:before="100" w:beforeAutospacing="1" w:after="100" w:afterAutospacing="1" w:line="240" w:lineRule="auto"/>
+        <w:rPr>
+          <w:rFonts w:ascii="Times New Roman" w:eastAsia="Times New Roman" w:hAnsi="Times New Roman" w:cs="Times New Roman"/>
+          <w:sz w:val="24"/>
+          <w:szCs w:val="24"/>
+        </w:rPr>
+      </w:pPr>
+      <w:r>
+        <w:rPr>
+          <w:rFonts w:ascii="Times New Roman" w:eastAsia="Times New Roman" w:hAnsi="Times New Roman" w:cs="Times New Roman"/>
+          <w:b/>
+          <w:bCs/>
+          <w:sz w:val="24"/>
+          <w:szCs w:val="24"/>
+        </w:rPr>
+        <w:t>Objective:</w:t>
+      </w:r>
+      <w:r>
+        <w:rPr>
+          <w:rFonts w:ascii="Times New Roman" w:eastAsia="Times New Roman" w:hAnsi="Times New Roman" w:cs="Times New Roman"/>
+          <w:sz w:val="24"/>
+          <w:szCs w:val="24"/>
+        </w:rPr>
+        <w:br/>
+        <w:t>To perform routine energy monitoring activities and finalize the overall system architecture in preparation for backend implementation.</w:t>
+      </w:r>
+    </w:p>
+    <w:p>
+      <w:pPr>
+        <w:spacing w:before="100" w:beforeAutospacing="1" w:after="100" w:afterAutospacing="1" w:line="240" w:lineRule="auto"/>
+        <w:rPr>
+          <w:rFonts w:ascii="Times New Roman" w:eastAsia="Times New Roman" w:hAnsi="Times New Roman" w:cs="Times New Roman"/>
+          <w:sz w:val="24"/>
+          <w:szCs w:val="24"/>
+        </w:rPr>
+      </w:pPr>
+      <w:r>
+        <w:rPr>
+          <w:rFonts w:ascii="Times New Roman" w:eastAsia="Times New Roman" w:hAnsi="Times New Roman" w:cs="Times New Roman"/>
+          <w:b/>
+          <w:bCs/>
+          <w:sz w:val="24"/>
+          <w:szCs w:val="24"/>
+        </w:rPr>
+        <w:t>Work Performed:</w:t>
+      </w:r>
+    </w:p>
+    <w:p>
+      <w:pPr>
+        <w:numPr>
+          <w:ilvl w:val="0"/>
+          <w:numId w:val="56"/>
+        </w:numPr>
+        <w:spacing w:before="100" w:beforeAutospacing="1" w:after="100" w:afterAutospacing="1" w:line="240" w:lineRule="auto"/>
+        <w:rPr>
+          <w:rFonts w:ascii="Times New Roman" w:eastAsia="Times New Roman" w:hAnsi="Times New Roman" w:cs="Times New Roman"/>
+          <w:sz w:val="24"/>
+          <w:szCs w:val="24"/>
+        </w:rPr>
+      </w:pPr>
+      <w:r>
+        <w:rPr>
+          <w:rFonts w:ascii="Times New Roman" w:eastAsia="Times New Roman" w:hAnsi="Times New Roman" w:cs="Times New Roman"/>
+          <w:sz w:val="24"/>
+          <w:szCs w:val="24"/>
+        </w:rPr>
+        <w:t xml:space="preserve">Entered </w:t>
+      </w:r>
+      <w:r>
+        <w:rPr>
+          <w:rFonts w:ascii="Times New Roman" w:eastAsia="Times New Roman" w:hAnsi="Times New Roman" w:cs="Times New Roman"/>
+          <w:b/>
+          <w:bCs/>
+          <w:sz w:val="24"/>
+          <w:szCs w:val="24"/>
+        </w:rPr>
+        <w:t>energy meter readings (kWh and kVAh)</w:t>
+      </w:r>
+      <w:r>
+        <w:rPr>
+          <w:rFonts w:ascii="Times New Roman" w:eastAsia="Times New Roman" w:hAnsi="Times New Roman" w:cs="Times New Roman"/>
+          <w:sz w:val="24"/>
+          <w:szCs w:val="24"/>
+        </w:rPr>
+        <w:t xml:space="preserve"> for machines in both </w:t>
+      </w:r>
+      <w:r>
+        <w:rPr>
+          <w:rFonts w:ascii="Times New Roman" w:eastAsia="Times New Roman" w:hAnsi="Times New Roman" w:cs="Times New Roman"/>
+          <w:b/>
+          <w:bCs/>
+          <w:sz w:val="24"/>
+          <w:szCs w:val="24"/>
+        </w:rPr>
+        <w:t>Driveline</w:t>
+      </w:r>
+      <w:r>
+        <w:rPr>
+          <w:rFonts w:ascii="Times New Roman" w:eastAsia="Times New Roman" w:hAnsi="Times New Roman" w:cs="Times New Roman"/>
+          <w:sz w:val="24"/>
+          <w:szCs w:val="24"/>
+        </w:rPr>
+        <w:t xml:space="preserve"> and </w:t>
+      </w:r>
+      <w:r>
+        <w:rPr>
+          <w:rFonts w:ascii="Times New Roman" w:eastAsia="Times New Roman" w:hAnsi="Times New Roman" w:cs="Times New Roman"/>
+          <w:b/>
+          <w:bCs/>
+          <w:sz w:val="24"/>
+          <w:szCs w:val="24"/>
+        </w:rPr>
+        <w:t>SMT buildings</w:t>
+      </w:r>
+      <w:r>
+        <w:rPr>
+          <w:rFonts w:ascii="Times New Roman" w:eastAsia="Times New Roman" w:hAnsi="Times New Roman" w:cs="Times New Roman"/>
+          <w:sz w:val="24"/>
+          <w:szCs w:val="24"/>
+        </w:rPr>
+        <w:t>.</w:t>
+      </w:r>
+    </w:p>
+    <w:p>
+      <w:pPr>
+        <w:numPr>
+          <w:ilvl w:val="0"/>
+          <w:numId w:val="56"/>
+        </w:numPr>
+        <w:spacing w:before="100" w:beforeAutospacing="1" w:after="100" w:afterAutospacing="1" w:line="240" w:lineRule="auto"/>
+        <w:rPr>
+          <w:rFonts w:ascii="Times New Roman" w:eastAsia="Times New Roman" w:hAnsi="Times New Roman" w:cs="Times New Roman"/>
+          <w:sz w:val="24"/>
+          <w:szCs w:val="24"/>
+        </w:rPr>
+      </w:pPr>
+      <w:r>
+        <w:rPr>
+          <w:rFonts w:ascii="Times New Roman" w:eastAsia="Times New Roman" w:hAnsi="Times New Roman" w:cs="Times New Roman"/>
+          <w:sz w:val="24"/>
+          <w:szCs w:val="24"/>
+        </w:rPr>
+        <w:t xml:space="preserve">Updated the </w:t>
+      </w:r>
+      <w:r>
+        <w:rPr>
+          <w:rFonts w:ascii="Times New Roman" w:eastAsia="Times New Roman" w:hAnsi="Times New Roman" w:cs="Times New Roman"/>
+          <w:b/>
+          <w:bCs/>
+          <w:sz w:val="24"/>
+          <w:szCs w:val="24"/>
+        </w:rPr>
+        <w:t>power cost analysis sheets</w:t>
+      </w:r>
+      <w:r>
+        <w:rPr>
+          <w:rFonts w:ascii="Times New Roman" w:eastAsia="Times New Roman" w:hAnsi="Times New Roman" w:cs="Times New Roman"/>
+          <w:sz w:val="24"/>
+          <w:szCs w:val="24"/>
+        </w:rPr>
+        <w:t xml:space="preserve"> based on the recorded energy consumption values.</w:t>
+      </w:r>
+    </w:p>
+    <w:p>
+      <w:pPr>
+        <w:numPr>
+          <w:ilvl w:val="0"/>
+          <w:numId w:val="56"/>
+        </w:numPr>
+        <w:spacing w:before="100" w:beforeAutospacing="1" w:after="100" w:afterAutospacing="1" w:line="240" w:lineRule="auto"/>
+        <w:rPr>
+          <w:rFonts w:ascii="Times New Roman" w:eastAsia="Times New Roman" w:hAnsi="Times New Roman" w:cs="Times New Roman"/>
+          <w:sz w:val="24"/>
+          <w:szCs w:val="24"/>
+        </w:rPr>
+      </w:pPr>
+      <w:r>
+        <w:rPr>
+          <w:rFonts w:ascii="Times New Roman" w:eastAsia="Times New Roman" w:hAnsi="Times New Roman" w:cs="Times New Roman"/>
+          <w:sz w:val="24"/>
+          <w:szCs w:val="24"/>
+        </w:rPr>
+        <w:t xml:space="preserve">Reviewed the complete system structure and finalized the </w:t>
+      </w:r>
+      <w:r>
+        <w:rPr>
+          <w:rFonts w:ascii="Times New Roman" w:eastAsia="Times New Roman" w:hAnsi="Times New Roman" w:cs="Times New Roman"/>
+          <w:b/>
+          <w:bCs/>
+          <w:sz w:val="24"/>
+          <w:szCs w:val="24"/>
+        </w:rPr>
+        <w:t>project overview</w:t>
+      </w:r>
+      <w:r>
+        <w:rPr>
+          <w:rFonts w:ascii="Times New Roman" w:eastAsia="Times New Roman" w:hAnsi="Times New Roman" w:cs="Times New Roman"/>
+          <w:sz w:val="24"/>
+          <w:szCs w:val="24"/>
+        </w:rPr>
+        <w:t>.</w:t>
+      </w:r>
+    </w:p>
+    <w:p>
+      <w:pPr>
+        <w:numPr>
+          <w:ilvl w:val="0"/>
+          <w:numId w:val="56"/>
+        </w:numPr>
+        <w:spacing w:before="100" w:beforeAutospacing="1" w:after="100" w:afterAutospacing="1" w:line="240" w:lineRule="auto"/>
+        <w:rPr>
+          <w:rFonts w:ascii="Times New Roman" w:eastAsia="Times New Roman" w:hAnsi="Times New Roman" w:cs="Times New Roman"/>
+          <w:sz w:val="24"/>
+          <w:szCs w:val="24"/>
+        </w:rPr>
+      </w:pPr>
+      <w:r>
+        <w:rPr>
+          <w:rFonts w:ascii="Times New Roman" w:eastAsia="Times New Roman" w:hAnsi="Times New Roman" w:cs="Times New Roman"/>
+          <w:sz w:val="24"/>
+          <w:szCs w:val="24"/>
+        </w:rPr>
+        <w:t xml:space="preserve">Finalized the </w:t>
+      </w:r>
+      <w:r>
+        <w:rPr>
+          <w:rFonts w:ascii="Times New Roman" w:eastAsia="Times New Roman" w:hAnsi="Times New Roman" w:cs="Times New Roman"/>
+          <w:b/>
+          <w:bCs/>
+          <w:sz w:val="24"/>
+          <w:szCs w:val="24"/>
+        </w:rPr>
+        <w:t>backend layer architecture</w:t>
+      </w:r>
+      <w:r>
+        <w:rPr>
+          <w:rFonts w:ascii="Times New Roman" w:eastAsia="Times New Roman" w:hAnsi="Times New Roman" w:cs="Times New Roman"/>
+          <w:sz w:val="24"/>
+          <w:szCs w:val="24"/>
+        </w:rPr>
+        <w:t>, considering database, IPC, analytics, and orchestration modules.</w:t>
+      </w:r>
+    </w:p>
+    <w:p>
+      <w:pPr>
+        <w:numPr>
+          <w:ilvl w:val="0"/>
+          <w:numId w:val="56"/>
+        </w:numPr>
+        <w:spacing w:before="100" w:beforeAutospacing="1" w:after="100" w:afterAutospacing="1" w:line="240" w:lineRule="auto"/>
+        <w:rPr>
+          <w:rFonts w:ascii="Times New Roman" w:eastAsia="Times New Roman" w:hAnsi="Times New Roman" w:cs="Times New Roman"/>
+          <w:sz w:val="24"/>
+          <w:szCs w:val="24"/>
+        </w:rPr>
+      </w:pPr>
+      <w:r>
+        <w:rPr>
+          <w:rFonts w:ascii="Times New Roman" w:eastAsia="Times New Roman" w:hAnsi="Times New Roman" w:cs="Times New Roman"/>
+          <w:sz w:val="24"/>
+          <w:szCs w:val="24"/>
+        </w:rPr>
+        <w:t xml:space="preserve">Conducted an overall review of frontend completion status, confirming that approximately </w:t>
+      </w:r>
+      <w:r>
+        <w:rPr>
+          <w:rFonts w:ascii="Times New Roman" w:eastAsia="Times New Roman" w:hAnsi="Times New Roman" w:cs="Times New Roman"/>
+          <w:b/>
+          <w:bCs/>
+          <w:sz w:val="24"/>
+          <w:szCs w:val="24"/>
+        </w:rPr>
+        <w:t>90–95% of frontend work</w:t>
+      </w:r>
+      <w:r>
+        <w:rPr>
+          <w:rFonts w:ascii="Times New Roman" w:eastAsia="Times New Roman" w:hAnsi="Times New Roman" w:cs="Times New Roman"/>
+          <w:sz w:val="24"/>
+          <w:szCs w:val="24"/>
+        </w:rPr>
+        <w:t xml:space="preserve"> has been completed.</w:t>
+      </w:r>
+    </w:p>
+    <w:p>
+      <w:pPr>
+        <w:spacing w:before="100" w:beforeAutospacing="1" w:after="100" w:afterAutospacing="1" w:line="240" w:lineRule="auto"/>
+        <w:rPr>
+          <w:rFonts w:ascii="Times New Roman" w:eastAsia="Times New Roman" w:hAnsi="Times New Roman" w:cs="Times New Roman"/>
+          <w:sz w:val="24"/>
+          <w:szCs w:val="24"/>
+        </w:rPr>
+      </w:pPr>
+      <w:r>
+        <w:rPr>
+          <w:rFonts w:ascii="Times New Roman" w:eastAsia="Times New Roman" w:hAnsi="Times New Roman" w:cs="Times New Roman"/>
+          <w:b/>
+          <w:bCs/>
+          <w:sz w:val="24"/>
+          <w:szCs w:val="24"/>
+        </w:rPr>
+        <w:t>Outcome:</w:t>
+      </w:r>
+    </w:p>
+    <w:p>
+      <w:pPr>
+        <w:numPr>
+          <w:ilvl w:val="0"/>
+          <w:numId w:val="57"/>
+        </w:numPr>
+        <w:spacing w:before="100" w:beforeAutospacing="1" w:after="100" w:afterAutospacing="1" w:line="240" w:lineRule="auto"/>
+        <w:rPr>
+          <w:rFonts w:ascii="Times New Roman" w:eastAsia="Times New Roman" w:hAnsi="Times New Roman" w:cs="Times New Roman"/>
+          <w:sz w:val="24"/>
+          <w:szCs w:val="24"/>
+        </w:rPr>
+      </w:pPr>
+      <w:r>
+        <w:rPr>
+          <w:rFonts w:ascii="Times New Roman" w:eastAsia="Times New Roman" w:hAnsi="Times New Roman" w:cs="Times New Roman"/>
+          <w:sz w:val="24"/>
+          <w:szCs w:val="24"/>
+        </w:rPr>
+        <w:t>Energy monitoring and power cost documentation completed successfully.</w:t>
+      </w:r>
+    </w:p>
+    <w:p>
+      <w:pPr>
+        <w:numPr>
+          <w:ilvl w:val="0"/>
+          <w:numId w:val="57"/>
+        </w:numPr>
+        <w:spacing w:before="100" w:beforeAutospacing="1" w:after="100" w:afterAutospacing="1" w:line="240" w:lineRule="auto"/>
+        <w:rPr>
+          <w:rFonts w:ascii="Times New Roman" w:eastAsia="Times New Roman" w:hAnsi="Times New Roman" w:cs="Times New Roman"/>
+          <w:sz w:val="24"/>
+          <w:szCs w:val="24"/>
+        </w:rPr>
+      </w:pPr>
+      <w:r>
+        <w:rPr>
+          <w:rFonts w:ascii="Times New Roman" w:eastAsia="Times New Roman" w:hAnsi="Times New Roman" w:cs="Times New Roman"/>
+          <w:sz w:val="24"/>
+          <w:szCs w:val="24"/>
+        </w:rPr>
+        <w:t>Final system architecture prepared and aligned with project objectives.</w:t>
+      </w:r>
+    </w:p>
+    <w:p>
+      <w:pPr>
+        <w:spacing w:before="100" w:beforeAutospacing="1" w:after="100" w:afterAutospacing="1" w:line="240" w:lineRule="auto"/>
+        <w:rPr>
+          <w:rFonts w:ascii="Times New Roman" w:eastAsia="Times New Roman" w:hAnsi="Times New Roman" w:cs="Times New Roman"/>
+          <w:sz w:val="24"/>
+          <w:szCs w:val="24"/>
+        </w:rPr>
+      </w:pPr>
+      <w:r>
+        <w:rPr>
+          <w:rFonts w:ascii="Times New Roman" w:eastAsia="Times New Roman" w:hAnsi="Times New Roman" w:cs="Times New Roman"/>
+          <w:b/>
+          <w:bCs/>
+          <w:sz w:val="24"/>
+          <w:szCs w:val="24"/>
+        </w:rPr>
+        <w:t>Remarks:</w:t>
+      </w:r>
+    </w:p>
+    <w:p>
+      <w:pPr>
+        <w:numPr>
+          <w:ilvl w:val="0"/>
+          <w:numId w:val="58"/>
+        </w:numPr>
+        <w:spacing w:before="100" w:beforeAutospacing="1" w:after="100" w:afterAutospacing="1" w:line="240" w:lineRule="auto"/>
+        <w:rPr>
+          <w:rFonts w:ascii="Times New Roman" w:eastAsia="Times New Roman" w:hAnsi="Times New Roman" w:cs="Times New Roman"/>
+          <w:sz w:val="24"/>
+          <w:szCs w:val="24"/>
+        </w:rPr>
+      </w:pPr>
+      <w:r>
+        <w:rPr>
+          <w:rFonts w:ascii="Times New Roman" w:eastAsia="Times New Roman" w:hAnsi="Times New Roman" w:cs="Times New Roman"/>
+          <w:sz w:val="24"/>
+          <w:szCs w:val="24"/>
+        </w:rPr>
+        <w:t>System is now ready to proceed with backend ingestion, analytics, and insight generation modules.</w:t>
+      </w:r>
+    </w:p>
+    <w:p>
+      <w:pPr>
+        <w:spacing w:before="100" w:beforeAutospacing="1" w:after="100" w:afterAutospacing="1" w:line="240" w:lineRule="auto"/>
+        <w:outlineLvl w:val="1"/>
+        <w:rPr>
+          <w:rFonts w:ascii="Times New Roman" w:eastAsia="Times New Roman" w:hAnsi="Times New Roman" w:cs="Times New Roman"/>
+          <w:b/>
+          <w:sz w:val="24"/>
+          <w:szCs w:val="24"/>
+        </w:rPr>
+      </w:pPr>
+    </w:p>
+    <w:p>
+      <w:pPr>
+        <w:spacing w:before="100" w:beforeAutospacing="1" w:after="100" w:afterAutospacing="1" w:line="240" w:lineRule="auto"/>
+        <w:outlineLvl w:val="1"/>
+        <w:rPr>
+          <w:rFonts w:ascii="Times New Roman" w:eastAsia="Times New Roman" w:hAnsi="Times New Roman" w:cs="Times New Roman"/>
+          <w:b/>
+          <w:sz w:val="24"/>
+          <w:szCs w:val="24"/>
+        </w:rPr>
+      </w:pPr>
+    </w:p>
+    <w:p>
+      <w:pPr>
+        <w:spacing w:before="100" w:beforeAutospacing="1" w:after="100" w:afterAutospacing="1" w:line="240" w:lineRule="auto"/>
+        <w:outlineLvl w:val="1"/>
+        <w:rPr>
+          <w:rFonts w:ascii="Times New Roman" w:eastAsia="Times New Roman" w:hAnsi="Times New Roman" w:cs="Times New Roman"/>
+          <w:b/>
+          <w:sz w:val="24"/>
+          <w:szCs w:val="24"/>
+        </w:rPr>
+      </w:pPr>
+    </w:p>
+    <w:p>
+      <w:pPr>
+        <w:spacing w:before="100" w:beforeAutospacing="1" w:after="100" w:afterAutospacing="1" w:line="240" w:lineRule="auto"/>
+        <w:outlineLvl w:val="1"/>
+        <w:rPr>
+          <w:rFonts w:ascii="Times New Roman" w:eastAsia="Times New Roman" w:hAnsi="Times New Roman" w:cs="Times New Roman"/>
+          <w:b/>
+          <w:sz w:val="24"/>
+          <w:szCs w:val="24"/>
+        </w:rPr>
+      </w:pPr>
+    </w:p>
+    <w:p>
+      <w:pPr>
+        <w:spacing w:before="100" w:beforeAutospacing="1" w:after="100" w:afterAutospacing="1" w:line="240" w:lineRule="auto"/>
+        <w:outlineLvl w:val="1"/>
+        <w:rPr>
+          <w:rFonts w:ascii="Times New Roman" w:eastAsia="Times New Roman" w:hAnsi="Times New Roman" w:cs="Times New Roman"/>
+          <w:b/>
+          <w:sz w:val="24"/>
+          <w:szCs w:val="24"/>
+        </w:rPr>
+      </w:pPr>
+    </w:p>
+    <w:p>
+      <w:pPr>
+        <w:spacing w:before="100" w:beforeAutospacing="1" w:after="100" w:afterAutospacing="1" w:line="240" w:lineRule="auto"/>
+        <w:outlineLvl w:val="1"/>
+        <w:rPr>
+          <w:rFonts w:ascii="Times New Roman" w:eastAsia="Times New Roman" w:hAnsi="Times New Roman" w:cs="Times New Roman"/>
+          <w:b/>
+          <w:sz w:val="24"/>
+          <w:szCs w:val="24"/>
+        </w:rPr>
+      </w:pPr>
+    </w:p>
+    <w:p>
+      <w:pPr>
+        <w:spacing w:before="100" w:beforeAutospacing="1" w:after="100" w:afterAutospacing="1" w:line="240" w:lineRule="auto"/>
+        <w:outlineLvl w:val="1"/>
+        <w:rPr>
+          <w:rFonts w:ascii="Times New Roman" w:eastAsia="Times New Roman" w:hAnsi="Times New Roman" w:cs="Times New Roman"/>
+          <w:b/>
+          <w:sz w:val="24"/>
+          <w:szCs w:val="24"/>
+        </w:rPr>
+      </w:pPr>
+    </w:p>
+    <w:p>
+      <w:pPr>
+        <w:spacing w:before="100" w:beforeAutospacing="1" w:after="100" w:afterAutospacing="1" w:line="240" w:lineRule="auto"/>
+        <w:outlineLvl w:val="1"/>
+        <w:rPr>
+          <w:rFonts w:ascii="Times New Roman" w:eastAsia="Times New Roman" w:hAnsi="Times New Roman" w:cs="Times New Roman"/>
+          <w:b/>
+          <w:sz w:val="24"/>
+          <w:szCs w:val="24"/>
+        </w:rPr>
+      </w:pPr>
+    </w:p>
+    <w:p>
+      <w:pPr>
+        <w:spacing w:after="0" w:line="240" w:lineRule="auto"/>
+        <w:outlineLvl w:val="1"/>
+        <w:rPr>
+          <w:rFonts w:ascii="Times New Roman" w:eastAsia="Times New Roman" w:hAnsi="Times New Roman" w:cs="Times New Roman"/>
+          <w:b/>
+          <w:sz w:val="24"/>
+          <w:szCs w:val="24"/>
+        </w:rPr>
+      </w:pPr>
+      <w:r>
+        <w:rPr>
+          <w:rFonts w:ascii="Times New Roman" w:eastAsia="Times New Roman" w:hAnsi="Times New Roman" w:cs="Times New Roman"/>
+          <w:b/>
+          <w:bCs/>
+          <w:sz w:val="24"/>
+          <w:szCs w:val="24"/>
+        </w:rPr>
+        <w:lastRenderedPageBreak/>
+        <w:t>Date:</w:t>
+      </w:r>
+      <w:r>
+        <w:rPr>
+          <w:rFonts w:ascii="Times New Roman" w:eastAsia="Times New Roman" w:hAnsi="Times New Roman" w:cs="Times New Roman"/>
+          <w:b/>
+          <w:sz w:val="24"/>
+          <w:szCs w:val="24"/>
+        </w:rPr>
+        <w:t xml:space="preserve"> 07/02/2026                                                                                                              Day 23</w:t>
+      </w:r>
+      <w:r>
+        <w:rPr>
+          <w:rFonts w:ascii="Times New Roman" w:eastAsia="Times New Roman" w:hAnsi="Times New Roman" w:cs="Times New Roman"/>
+          <w:b/>
+          <w:sz w:val="24"/>
+          <w:szCs w:val="24"/>
+        </w:rPr>
+        <w:br/>
+      </w:r>
+      <w:r>
+        <w:rPr>
+          <w:rFonts w:ascii="Times New Roman" w:eastAsia="Times New Roman" w:hAnsi="Times New Roman" w:cs="Times New Roman"/>
+          <w:b/>
+          <w:bCs/>
+          <w:sz w:val="24"/>
+          <w:szCs w:val="24"/>
+        </w:rPr>
+        <w:t>Department:</w:t>
+      </w:r>
+      <w:r>
+        <w:rPr>
+          <w:rFonts w:ascii="Times New Roman" w:eastAsia="Times New Roman" w:hAnsi="Times New Roman" w:cs="Times New Roman"/>
+          <w:b/>
+          <w:sz w:val="24"/>
+          <w:szCs w:val="24"/>
+        </w:rPr>
+        <w:t xml:space="preserve"> Maintenance</w:t>
+      </w:r>
+      <w:r>
+        <w:rPr>
+          <w:rFonts w:ascii="Times New Roman" w:eastAsia="Times New Roman" w:hAnsi="Times New Roman" w:cs="Times New Roman"/>
+          <w:b/>
+          <w:sz w:val="24"/>
+          <w:szCs w:val="24"/>
+        </w:rPr>
+        <w:br/>
+      </w:r>
+      <w:r>
+        <w:rPr>
+          <w:rFonts w:ascii="Times New Roman" w:eastAsia="Times New Roman" w:hAnsi="Times New Roman" w:cs="Times New Roman"/>
+          <w:b/>
+          <w:bCs/>
+          <w:sz w:val="24"/>
+          <w:szCs w:val="24"/>
+        </w:rPr>
+        <w:t>Plant:</w:t>
+      </w:r>
+      <w:r>
+        <w:rPr>
+          <w:rFonts w:ascii="Times New Roman" w:eastAsia="Times New Roman" w:hAnsi="Times New Roman" w:cs="Times New Roman"/>
+          <w:b/>
+          <w:sz w:val="24"/>
+          <w:szCs w:val="24"/>
+        </w:rPr>
+        <w:t xml:space="preserve"> Drive Shaft Manufacturing</w:t>
+      </w:r>
+    </w:p>
+    <w:p>
+      <w:pPr>
+        <w:spacing w:after="0" w:line="240" w:lineRule="auto"/>
+        <w:outlineLvl w:val="1"/>
+        <w:rPr>
+          <w:rFonts w:ascii="Times New Roman" w:eastAsia="Times New Roman" w:hAnsi="Times New Roman" w:cs="Times New Roman"/>
+          <w:b/>
+          <w:sz w:val="24"/>
+          <w:szCs w:val="24"/>
+        </w:rPr>
+      </w:pPr>
+      <w:r>
+        <w:rPr>
+          <w:rFonts w:ascii="Times New Roman" w:eastAsia="Times New Roman" w:hAnsi="Times New Roman" w:cs="Times New Roman"/>
+          <w:b/>
+          <w:sz w:val="24"/>
+          <w:szCs w:val="24"/>
+        </w:rPr>
+        <w:t>Shift: Second Shift</w:t>
+      </w:r>
+    </w:p>
+    <w:p>
+      <w:pPr>
+        <w:spacing w:after="0" w:line="240" w:lineRule="auto"/>
+        <w:outlineLvl w:val="1"/>
+        <w:rPr>
+          <w:rFonts w:ascii="Times New Roman" w:eastAsia="Times New Roman" w:hAnsi="Times New Roman" w:cs="Times New Roman"/>
+          <w:b/>
+          <w:sz w:val="24"/>
+          <w:szCs w:val="24"/>
+        </w:rPr>
+      </w:pPr>
+    </w:p>
+    <w:p>
+      <w:pPr>
+        <w:pStyle w:val="NormalWeb"/>
+      </w:pPr>
+      <w:r>
+        <w:rPr>
+          <w:rStyle w:val="Strong"/>
+        </w:rPr>
+        <w:t>Objective:</w:t>
+      </w:r>
+      <w:r>
+        <w:br/>
+        <w:t>To perform routine energy monitoring activities and carry out a final system review and backend planning for the Offline Industrial Data Intelligence System.</w:t>
+      </w:r>
+    </w:p>
+    <w:p>
+      <w:pPr>
+        <w:pStyle w:val="NormalWeb"/>
+      </w:pPr>
+      <w:r>
+        <w:rPr>
+          <w:rStyle w:val="Strong"/>
+        </w:rPr>
+        <w:t>Work Performed:</w:t>
+      </w:r>
+    </w:p>
+    <w:p>
+      <w:pPr>
+        <w:pStyle w:val="NormalWeb"/>
+        <w:numPr>
+          <w:ilvl w:val="0"/>
+          <w:numId w:val="59"/>
+        </w:numPr>
+      </w:pPr>
+      <w:r>
+        <w:t xml:space="preserve">Entered </w:t>
+      </w:r>
+      <w:r>
+        <w:rPr>
+          <w:rStyle w:val="Strong"/>
+        </w:rPr>
+        <w:t xml:space="preserve">energy meter readings (kWh and </w:t>
+      </w:r>
+      <w:proofErr w:type="spellStart"/>
+      <w:r>
+        <w:rPr>
+          <w:rStyle w:val="Strong"/>
+        </w:rPr>
+        <w:t>kVAh</w:t>
+      </w:r>
+      <w:proofErr w:type="spellEnd"/>
+      <w:r>
+        <w:rPr>
+          <w:rStyle w:val="Strong"/>
+        </w:rPr>
+        <w:t>)</w:t>
+      </w:r>
+      <w:r>
+        <w:t xml:space="preserve"> for machines in both </w:t>
+      </w:r>
+      <w:r>
+        <w:rPr>
+          <w:rStyle w:val="Strong"/>
+        </w:rPr>
+        <w:t>Driveline</w:t>
+      </w:r>
+      <w:r>
+        <w:t xml:space="preserve"> and </w:t>
+      </w:r>
+      <w:r>
+        <w:rPr>
+          <w:rStyle w:val="Strong"/>
+        </w:rPr>
+        <w:t>SMT buildings</w:t>
+      </w:r>
+      <w:r>
+        <w:t>.</w:t>
+      </w:r>
+    </w:p>
+    <w:p>
+      <w:pPr>
+        <w:pStyle w:val="NormalWeb"/>
+        <w:numPr>
+          <w:ilvl w:val="0"/>
+          <w:numId w:val="59"/>
+        </w:numPr>
+      </w:pPr>
+      <w:r>
+        <w:t xml:space="preserve">Updated the </w:t>
+      </w:r>
+      <w:r>
+        <w:rPr>
+          <w:rStyle w:val="Strong"/>
+        </w:rPr>
+        <w:t>power cost analysis sheets</w:t>
+      </w:r>
+      <w:r>
+        <w:t xml:space="preserve"> based on the recorded energy consumption data.</w:t>
+      </w:r>
+    </w:p>
+    <w:p>
+      <w:pPr>
+        <w:pStyle w:val="NormalWeb"/>
+        <w:numPr>
+          <w:ilvl w:val="0"/>
+          <w:numId w:val="59"/>
+        </w:numPr>
+      </w:pPr>
+      <w:r>
+        <w:t>Re-checked the overall system status, including frontend and desktop application stability.</w:t>
+      </w:r>
+    </w:p>
+    <w:p>
+      <w:pPr>
+        <w:pStyle w:val="NormalWeb"/>
+        <w:numPr>
+          <w:ilvl w:val="0"/>
+          <w:numId w:val="59"/>
+        </w:numPr>
+      </w:pPr>
+      <w:r>
+        <w:t xml:space="preserve">Reviewed the complete project structure and finalized the </w:t>
+      </w:r>
+      <w:r>
+        <w:rPr>
+          <w:rStyle w:val="Strong"/>
+        </w:rPr>
+        <w:t>project overview</w:t>
+      </w:r>
+      <w:r>
+        <w:t>.</w:t>
+      </w:r>
+    </w:p>
+    <w:p>
+      <w:pPr>
+        <w:pStyle w:val="NormalWeb"/>
+        <w:numPr>
+          <w:ilvl w:val="0"/>
+          <w:numId w:val="59"/>
+        </w:numPr>
+      </w:pPr>
+      <w:r>
+        <w:t xml:space="preserve">Finalized the </w:t>
+      </w:r>
+      <w:r>
+        <w:rPr>
+          <w:rStyle w:val="Strong"/>
+        </w:rPr>
+        <w:t>backend layer architecture</w:t>
+      </w:r>
+      <w:r>
+        <w:t>, ensuring readiness for implementation.</w:t>
+      </w:r>
+    </w:p>
+    <w:p>
+      <w:pPr>
+        <w:pStyle w:val="NormalWeb"/>
+        <w:numPr>
+          <w:ilvl w:val="0"/>
+          <w:numId w:val="59"/>
+        </w:numPr>
+      </w:pPr>
+      <w:r>
+        <w:t xml:space="preserve">Confirmed that the frontend portion of the project is approximately </w:t>
+      </w:r>
+      <w:r>
+        <w:rPr>
+          <w:rStyle w:val="Strong"/>
+        </w:rPr>
+        <w:t>90–95% complete</w:t>
+      </w:r>
+      <w:r>
+        <w:t>.</w:t>
+      </w:r>
+    </w:p>
+    <w:p>
+      <w:pPr>
+        <w:pStyle w:val="NormalWeb"/>
+      </w:pPr>
+      <w:r>
+        <w:rPr>
+          <w:rStyle w:val="Strong"/>
+        </w:rPr>
+        <w:t>Outcome:</w:t>
+      </w:r>
+    </w:p>
+    <w:p>
+      <w:pPr>
+        <w:pStyle w:val="NormalWeb"/>
+        <w:numPr>
+          <w:ilvl w:val="0"/>
+          <w:numId w:val="60"/>
+        </w:numPr>
+      </w:pPr>
+      <w:r>
+        <w:t>Energy monitoring and power cost documentation completed successfully.</w:t>
+      </w:r>
+    </w:p>
+    <w:p>
+      <w:pPr>
+        <w:pStyle w:val="NormalWeb"/>
+        <w:numPr>
+          <w:ilvl w:val="0"/>
+          <w:numId w:val="60"/>
+        </w:numPr>
+      </w:pPr>
+      <w:r>
+        <w:t>Backend architecture finalized and aligned with system objectives.</w:t>
+      </w:r>
+    </w:p>
+    <w:p>
+      <w:pPr>
+        <w:pStyle w:val="NormalWeb"/>
+      </w:pPr>
+      <w:r>
+        <w:rPr>
+          <w:rStyle w:val="Strong"/>
+        </w:rPr>
+        <w:t>Remarks:</w:t>
+      </w:r>
+    </w:p>
+    <w:p>
+      <w:pPr>
+        <w:pStyle w:val="NormalWeb"/>
+        <w:numPr>
+          <w:ilvl w:val="0"/>
+          <w:numId w:val="61"/>
+        </w:numPr>
+      </w:pPr>
+      <w:r>
+        <w:t>System is now ready to proceed with backend development, including ingestion and analytics modules.</w:t>
+      </w:r>
+    </w:p>
+    <w:p>
+      <w:pPr>
+        <w:spacing w:before="240" w:line="240" w:lineRule="auto"/>
+        <w:outlineLvl w:val="1"/>
+        <w:rPr>
+          <w:rFonts w:ascii="Times New Roman" w:eastAsia="Times New Roman" w:hAnsi="Times New Roman" w:cs="Times New Roman"/>
+          <w:b/>
+          <w:sz w:val="24"/>
+          <w:szCs w:val="24"/>
+        </w:rPr>
+      </w:pPr>
       <w:bookmarkStart w:id="0" w:name="_GoBack"/>
       <w:bookmarkEnd w:id="0"/>
-    </w:p>
-    <w:p>
-      <w:pPr>
-        <w:pStyle w:val="NormalWeb"/>
-      </w:pPr>
-    </w:p>
-    <w:p>
-      <w:pPr>
-        <w:spacing w:before="100" w:beforeAutospacing="1" w:after="100" w:afterAutospacing="1" w:line="240" w:lineRule="auto"/>
-        <w:outlineLvl w:val="1"/>
-        <w:rPr>
-          <w:rFonts w:ascii="Times New Roman" w:eastAsia="Times New Roman" w:hAnsi="Times New Roman" w:cs="Times New Roman"/>
-          <w:b/>
-          <w:sz w:val="24"/>
-          <w:szCs w:val="24"/>
-        </w:rPr>
-      </w:pPr>
-    </w:p>
-    <w:p>
-      <w:pPr>
-        <w:spacing w:before="100" w:beforeAutospacing="1" w:after="100" w:afterAutospacing="1" w:line="240" w:lineRule="auto"/>
-        <w:outlineLvl w:val="1"/>
-        <w:rPr>
-          <w:rFonts w:ascii="Times New Roman" w:eastAsia="Times New Roman" w:hAnsi="Times New Roman" w:cs="Times New Roman"/>
-          <w:b/>
-          <w:sz w:val="24"/>
-          <w:szCs w:val="24"/>
-        </w:rPr>
-      </w:pPr>
-    </w:p>
-    <w:p>
-      <w:pPr>
-        <w:spacing w:before="100" w:beforeAutospacing="1" w:after="100" w:afterAutospacing="1" w:line="240" w:lineRule="auto"/>
-        <w:outlineLvl w:val="1"/>
-        <w:rPr>
-          <w:rFonts w:ascii="Times New Roman" w:eastAsia="Times New Roman" w:hAnsi="Times New Roman" w:cs="Times New Roman"/>
-          <w:b/>
-          <w:sz w:val="24"/>
-          <w:szCs w:val="24"/>
-        </w:rPr>
-      </w:pPr>
     </w:p>
     <w:p>
       <w:pPr>
@@ -10573,6 +11559,155 @@
 <file path=word/numbering.xml><?xml version="1.0" encoding="utf-8"?>
 <w:numbering xmlns:wpc="http://schemas.microsoft.com/office/word/2010/wordprocessingCanvas" xmlns:cx="http://schemas.microsoft.com/office/drawing/2014/chartex" xmlns:mc="http://schemas.openxmlformats.org/markup-compatibility/2006" xmlns:o="urn:schemas-microsoft-com:office:office" xmlns:r="http://schemas.openxmlformats.org/officeDocument/2006/relationships" xmlns:m="http://schemas.openxmlformats.org/officeDocument/2006/math" xmlns:v="urn:schemas-microsoft-com:vml" xmlns:wp14="http://schemas.microsoft.com/office/word/2010/wordprocessingDrawing" xmlns:wp="http://schemas.openxmlformats.org/drawingml/2006/wordprocessingDrawing" xmlns:w10="urn:schemas-microsoft-com:office:word" xmlns:w="http://schemas.openxmlformats.org/wordprocessingml/2006/main" xmlns:w14="http://schemas.microsoft.com/office/word/2010/wordml" xmlns:w15="http://schemas.microsoft.com/office/word/2012/wordml" xmlns:w16se="http://schemas.microsoft.com/office/word/2015/wordml/symex" xmlns:wpg="http://schemas.microsoft.com/office/word/2010/wordprocessingGroup" xmlns:wpi="http://schemas.microsoft.com/office/word/2010/wordprocessingInk" xmlns:wne="http://schemas.microsoft.com/office/word/2006/wordml" xmlns:wps="http://schemas.microsoft.com/office/word/2010/wordprocessingShape" mc:Ignorable="w14 w15 w16se wp14">
   <w:abstractNum w:abstractNumId="0" w15:restartNumberingAfterBreak="0">
+    <w:nsid w:val="0049273D"/>
+    <w:multiLevelType w:val="multilevel"/>
+    <w:tmpl w:val="01FEC8CC"/>
+    <w:lvl w:ilvl="0">
+      <w:start w:val="1"/>
+      <w:numFmt w:val="bullet"/>
+      <w:lvlText w:val=""/>
+      <w:lvlJc w:val="left"/>
+      <w:pPr>
+        <w:tabs>
+          <w:tab w:val="num" w:pos="720"/>
+        </w:tabs>
+        <w:ind w:left="720" w:hanging="360"/>
+      </w:pPr>
+      <w:rPr>
+        <w:rFonts w:ascii="Symbol" w:hAnsi="Symbol" w:hint="default"/>
+        <w:sz w:val="20"/>
+      </w:rPr>
+    </w:lvl>
+    <w:lvl w:ilvl="1" w:tentative="1">
+      <w:start w:val="1"/>
+      <w:numFmt w:val="bullet"/>
+      <w:lvlText w:val="o"/>
+      <w:lvlJc w:val="left"/>
+      <w:pPr>
+        <w:tabs>
+          <w:tab w:val="num" w:pos="1440"/>
+        </w:tabs>
+        <w:ind w:left="1440" w:hanging="360"/>
+      </w:pPr>
+      <w:rPr>
+        <w:rFonts w:ascii="Courier New" w:hAnsi="Courier New" w:hint="default"/>
+        <w:sz w:val="20"/>
+      </w:rPr>
+    </w:lvl>
+    <w:lvl w:ilvl="2" w:tentative="1">
+      <w:start w:val="1"/>
+      <w:numFmt w:val="bullet"/>
+      <w:lvlText w:val=""/>
+      <w:lvlJc w:val="left"/>
+      <w:pPr>
+        <w:tabs>
+          <w:tab w:val="num" w:pos="2160"/>
+        </w:tabs>
+        <w:ind w:left="2160" w:hanging="360"/>
+      </w:pPr>
+      <w:rPr>
+        <w:rFonts w:ascii="Wingdings" w:hAnsi="Wingdings" w:hint="default"/>
+        <w:sz w:val="20"/>
+      </w:rPr>
+    </w:lvl>
+    <w:lvl w:ilvl="3" w:tentative="1">
+      <w:start w:val="1"/>
+      <w:numFmt w:val="bullet"/>
+      <w:lvlText w:val=""/>
+      <w:lvlJc w:val="left"/>
+      <w:pPr>
+        <w:tabs>
+          <w:tab w:val="num" w:pos="2880"/>
+        </w:tabs>
+        <w:ind w:left="2880" w:hanging="360"/>
+      </w:pPr>
+      <w:rPr>
+        <w:rFonts w:ascii="Wingdings" w:hAnsi="Wingdings" w:hint="default"/>
+        <w:sz w:val="20"/>
+      </w:rPr>
+    </w:lvl>
+    <w:lvl w:ilvl="4" w:tentative="1">
+      <w:start w:val="1"/>
+      <w:numFmt w:val="bullet"/>
+      <w:lvlText w:val=""/>
+      <w:lvlJc w:val="left"/>
+      <w:pPr>
+        <w:tabs>
+          <w:tab w:val="num" w:pos="3600"/>
+        </w:tabs>
+        <w:ind w:left="3600" w:hanging="360"/>
+      </w:pPr>
+      <w:rPr>
+        <w:rFonts w:ascii="Wingdings" w:hAnsi="Wingdings" w:hint="default"/>
+        <w:sz w:val="20"/>
+      </w:rPr>
+    </w:lvl>
+    <w:lvl w:ilvl="5" w:tentative="1">
+      <w:start w:val="1"/>
+      <w:numFmt w:val="bullet"/>
+      <w:lvlText w:val=""/>
+      <w:lvlJc w:val="left"/>
+      <w:pPr>
+        <w:tabs>
+          <w:tab w:val="num" w:pos="4320"/>
+        </w:tabs>
+        <w:ind w:left="4320" w:hanging="360"/>
+      </w:pPr>
+      <w:rPr>
+        <w:rFonts w:ascii="Wingdings" w:hAnsi="Wingdings" w:hint="default"/>
+        <w:sz w:val="20"/>
+      </w:rPr>
+    </w:lvl>
+    <w:lvl w:ilvl="6" w:tentative="1">
+      <w:start w:val="1"/>
+      <w:numFmt w:val="bullet"/>
+      <w:lvlText w:val=""/>
+      <w:lvlJc w:val="left"/>
+      <w:pPr>
+        <w:tabs>
+          <w:tab w:val="num" w:pos="5040"/>
+        </w:tabs>
+        <w:ind w:left="5040" w:hanging="360"/>
+      </w:pPr>
+      <w:rPr>
+        <w:rFonts w:ascii="Wingdings" w:hAnsi="Wingdings" w:hint="default"/>
+        <w:sz w:val="20"/>
+      </w:rPr>
+    </w:lvl>
+    <w:lvl w:ilvl="7" w:tentative="1">
+      <w:start w:val="1"/>
+      <w:numFmt w:val="bullet"/>
+      <w:lvlText w:val=""/>
+      <w:lvlJc w:val="left"/>
+      <w:pPr>
+        <w:tabs>
+          <w:tab w:val="num" w:pos="5760"/>
+        </w:tabs>
+        <w:ind w:left="5760" w:hanging="360"/>
+      </w:pPr>
+      <w:rPr>
+        <w:rFonts w:ascii="Wingdings" w:hAnsi="Wingdings" w:hint="default"/>
+        <w:sz w:val="20"/>
+      </w:rPr>
+    </w:lvl>
+    <w:lvl w:ilvl="8" w:tentative="1">
+      <w:start w:val="1"/>
+      <w:numFmt w:val="bullet"/>
+      <w:lvlText w:val=""/>
+      <w:lvlJc w:val="left"/>
+      <w:pPr>
+        <w:tabs>
+          <w:tab w:val="num" w:pos="6480"/>
+        </w:tabs>
+        <w:ind w:left="6480" w:hanging="360"/>
+      </w:pPr>
+      <w:rPr>
+        <w:rFonts w:ascii="Wingdings" w:hAnsi="Wingdings" w:hint="default"/>
+        <w:sz w:val="20"/>
+      </w:rPr>
+    </w:lvl>
+  </w:abstractNum>
+  <w:abstractNum w:abstractNumId="1" w15:restartNumberingAfterBreak="0">
     <w:nsid w:val="027F6F78"/>
     <w:multiLevelType w:val="multilevel"/>
     <w:tmpl w:val="41FA6D94"/>
@@ -10721,7 +11856,7 @@
       </w:rPr>
     </w:lvl>
   </w:abstractNum>
-  <w:abstractNum w:abstractNumId="1" w15:restartNumberingAfterBreak="0">
+  <w:abstractNum w:abstractNumId="2" w15:restartNumberingAfterBreak="0">
     <w:nsid w:val="03515B37"/>
     <w:multiLevelType w:val="multilevel"/>
     <w:tmpl w:val="2A60FEF4"/>
@@ -10870,7 +12005,7 @@
       </w:rPr>
     </w:lvl>
   </w:abstractNum>
-  <w:abstractNum w:abstractNumId="2" w15:restartNumberingAfterBreak="0">
+  <w:abstractNum w:abstractNumId="3" w15:restartNumberingAfterBreak="0">
     <w:nsid w:val="05467A77"/>
     <w:multiLevelType w:val="multilevel"/>
     <w:tmpl w:val="07FCAD36"/>
@@ -11019,7 +12154,7 @@
       </w:rPr>
     </w:lvl>
   </w:abstractNum>
-  <w:abstractNum w:abstractNumId="3" w15:restartNumberingAfterBreak="0">
+  <w:abstractNum w:abstractNumId="4" w15:restartNumberingAfterBreak="0">
     <w:nsid w:val="092638F1"/>
     <w:multiLevelType w:val="multilevel"/>
     <w:tmpl w:val="8E921DCA"/>
@@ -11168,7 +12303,7 @@
       </w:rPr>
     </w:lvl>
   </w:abstractNum>
-  <w:abstractNum w:abstractNumId="4" w15:restartNumberingAfterBreak="0">
+  <w:abstractNum w:abstractNumId="5" w15:restartNumberingAfterBreak="0">
     <w:nsid w:val="0A0478A7"/>
     <w:multiLevelType w:val="multilevel"/>
     <w:tmpl w:val="F3D85442"/>
@@ -11317,7 +12452,7 @@
       </w:rPr>
     </w:lvl>
   </w:abstractNum>
-  <w:abstractNum w:abstractNumId="5" w15:restartNumberingAfterBreak="0">
+  <w:abstractNum w:abstractNumId="6" w15:restartNumberingAfterBreak="0">
     <w:nsid w:val="0B5E5675"/>
     <w:multiLevelType w:val="multilevel"/>
     <w:tmpl w:val="23FCBCF4"/>
@@ -11466,7 +12601,7 @@
       </w:rPr>
     </w:lvl>
   </w:abstractNum>
-  <w:abstractNum w:abstractNumId="6" w15:restartNumberingAfterBreak="0">
+  <w:abstractNum w:abstractNumId="7" w15:restartNumberingAfterBreak="0">
     <w:nsid w:val="0C554F64"/>
     <w:multiLevelType w:val="hybridMultilevel"/>
     <w:tmpl w:val="0506FDCA"/>
@@ -11579,7 +12714,7 @@
       </w:rPr>
     </w:lvl>
   </w:abstractNum>
-  <w:abstractNum w:abstractNumId="7" w15:restartNumberingAfterBreak="0">
+  <w:abstractNum w:abstractNumId="8" w15:restartNumberingAfterBreak="0">
     <w:nsid w:val="0D4D7723"/>
     <w:multiLevelType w:val="multilevel"/>
     <w:tmpl w:val="FBA697AC"/>
@@ -11728,7 +12863,7 @@
       </w:rPr>
     </w:lvl>
   </w:abstractNum>
-  <w:abstractNum w:abstractNumId="8" w15:restartNumberingAfterBreak="0">
+  <w:abstractNum w:abstractNumId="9" w15:restartNumberingAfterBreak="0">
     <w:nsid w:val="0DB57FAE"/>
     <w:multiLevelType w:val="multilevel"/>
     <w:tmpl w:val="3B660CB2"/>
@@ -11877,7 +13012,7 @@
       </w:rPr>
     </w:lvl>
   </w:abstractNum>
-  <w:abstractNum w:abstractNumId="9" w15:restartNumberingAfterBreak="0">
+  <w:abstractNum w:abstractNumId="10" w15:restartNumberingAfterBreak="0">
     <w:nsid w:val="1025101E"/>
     <w:multiLevelType w:val="multilevel"/>
     <w:tmpl w:val="2630475E"/>
@@ -12026,7 +13161,7 @@
       </w:rPr>
     </w:lvl>
   </w:abstractNum>
-  <w:abstractNum w:abstractNumId="10" w15:restartNumberingAfterBreak="0">
+  <w:abstractNum w:abstractNumId="11" w15:restartNumberingAfterBreak="0">
     <w:nsid w:val="11EC4F79"/>
     <w:multiLevelType w:val="multilevel"/>
     <w:tmpl w:val="4E904154"/>
@@ -12175,7 +13310,156 @@
       </w:rPr>
     </w:lvl>
   </w:abstractNum>
-  <w:abstractNum w:abstractNumId="11" w15:restartNumberingAfterBreak="0">
+  <w:abstractNum w:abstractNumId="12" w15:restartNumberingAfterBreak="0">
+    <w:nsid w:val="19103BDD"/>
+    <w:multiLevelType w:val="multilevel"/>
+    <w:tmpl w:val="832E07AC"/>
+    <w:lvl w:ilvl="0">
+      <w:start w:val="1"/>
+      <w:numFmt w:val="bullet"/>
+      <w:lvlText w:val=""/>
+      <w:lvlJc w:val="left"/>
+      <w:pPr>
+        <w:tabs>
+          <w:tab w:val="num" w:pos="720"/>
+        </w:tabs>
+        <w:ind w:left="720" w:hanging="360"/>
+      </w:pPr>
+      <w:rPr>
+        <w:rFonts w:ascii="Symbol" w:hAnsi="Symbol" w:hint="default"/>
+        <w:sz w:val="20"/>
+      </w:rPr>
+    </w:lvl>
+    <w:lvl w:ilvl="1" w:tentative="1">
+      <w:start w:val="1"/>
+      <w:numFmt w:val="bullet"/>
+      <w:lvlText w:val="o"/>
+      <w:lvlJc w:val="left"/>
+      <w:pPr>
+        <w:tabs>
+          <w:tab w:val="num" w:pos="1440"/>
+        </w:tabs>
+        <w:ind w:left="1440" w:hanging="360"/>
+      </w:pPr>
+      <w:rPr>
+        <w:rFonts w:ascii="Courier New" w:hAnsi="Courier New" w:hint="default"/>
+        <w:sz w:val="20"/>
+      </w:rPr>
+    </w:lvl>
+    <w:lvl w:ilvl="2" w:tentative="1">
+      <w:start w:val="1"/>
+      <w:numFmt w:val="bullet"/>
+      <w:lvlText w:val=""/>
+      <w:lvlJc w:val="left"/>
+      <w:pPr>
+        <w:tabs>
+          <w:tab w:val="num" w:pos="2160"/>
+        </w:tabs>
+        <w:ind w:left="2160" w:hanging="360"/>
+      </w:pPr>
+      <w:rPr>
+        <w:rFonts w:ascii="Wingdings" w:hAnsi="Wingdings" w:hint="default"/>
+        <w:sz w:val="20"/>
+      </w:rPr>
+    </w:lvl>
+    <w:lvl w:ilvl="3" w:tentative="1">
+      <w:start w:val="1"/>
+      <w:numFmt w:val="bullet"/>
+      <w:lvlText w:val=""/>
+      <w:lvlJc w:val="left"/>
+      <w:pPr>
+        <w:tabs>
+          <w:tab w:val="num" w:pos="2880"/>
+        </w:tabs>
+        <w:ind w:left="2880" w:hanging="360"/>
+      </w:pPr>
+      <w:rPr>
+        <w:rFonts w:ascii="Wingdings" w:hAnsi="Wingdings" w:hint="default"/>
+        <w:sz w:val="20"/>
+      </w:rPr>
+    </w:lvl>
+    <w:lvl w:ilvl="4" w:tentative="1">
+      <w:start w:val="1"/>
+      <w:numFmt w:val="bullet"/>
+      <w:lvlText w:val=""/>
+      <w:lvlJc w:val="left"/>
+      <w:pPr>
+        <w:tabs>
+          <w:tab w:val="num" w:pos="3600"/>
+        </w:tabs>
+        <w:ind w:left="3600" w:hanging="360"/>
+      </w:pPr>
+      <w:rPr>
+        <w:rFonts w:ascii="Wingdings" w:hAnsi="Wingdings" w:hint="default"/>
+        <w:sz w:val="20"/>
+      </w:rPr>
+    </w:lvl>
+    <w:lvl w:ilvl="5" w:tentative="1">
+      <w:start w:val="1"/>
+      <w:numFmt w:val="bullet"/>
+      <w:lvlText w:val=""/>
+      <w:lvlJc w:val="left"/>
+      <w:pPr>
+        <w:tabs>
+          <w:tab w:val="num" w:pos="4320"/>
+        </w:tabs>
+        <w:ind w:left="4320" w:hanging="360"/>
+      </w:pPr>
+      <w:rPr>
+        <w:rFonts w:ascii="Wingdings" w:hAnsi="Wingdings" w:hint="default"/>
+        <w:sz w:val="20"/>
+      </w:rPr>
+    </w:lvl>
+    <w:lvl w:ilvl="6" w:tentative="1">
+      <w:start w:val="1"/>
+      <w:numFmt w:val="bullet"/>
+      <w:lvlText w:val=""/>
+      <w:lvlJc w:val="left"/>
+      <w:pPr>
+        <w:tabs>
+          <w:tab w:val="num" w:pos="5040"/>
+        </w:tabs>
+        <w:ind w:left="5040" w:hanging="360"/>
+      </w:pPr>
+      <w:rPr>
+        <w:rFonts w:ascii="Wingdings" w:hAnsi="Wingdings" w:hint="default"/>
+        <w:sz w:val="20"/>
+      </w:rPr>
+    </w:lvl>
+    <w:lvl w:ilvl="7" w:tentative="1">
+      <w:start w:val="1"/>
+      <w:numFmt w:val="bullet"/>
+      <w:lvlText w:val=""/>
+      <w:lvlJc w:val="left"/>
+      <w:pPr>
+        <w:tabs>
+          <w:tab w:val="num" w:pos="5760"/>
+        </w:tabs>
+        <w:ind w:left="5760" w:hanging="360"/>
+      </w:pPr>
+      <w:rPr>
+        <w:rFonts w:ascii="Wingdings" w:hAnsi="Wingdings" w:hint="default"/>
+        <w:sz w:val="20"/>
+      </w:rPr>
+    </w:lvl>
+    <w:lvl w:ilvl="8" w:tentative="1">
+      <w:start w:val="1"/>
+      <w:numFmt w:val="bullet"/>
+      <w:lvlText w:val=""/>
+      <w:lvlJc w:val="left"/>
+      <w:pPr>
+        <w:tabs>
+          <w:tab w:val="num" w:pos="6480"/>
+        </w:tabs>
+        <w:ind w:left="6480" w:hanging="360"/>
+      </w:pPr>
+      <w:rPr>
+        <w:rFonts w:ascii="Wingdings" w:hAnsi="Wingdings" w:hint="default"/>
+        <w:sz w:val="20"/>
+      </w:rPr>
+    </w:lvl>
+  </w:abstractNum>
+  <w:abstractNum w:abstractNumId="13" w15:restartNumberingAfterBreak="0">
     <w:nsid w:val="191D2358"/>
     <w:multiLevelType w:val="multilevel"/>
     <w:tmpl w:val="4C76D0CE"/>
@@ -12324,7 +13608,7 @@
       </w:rPr>
     </w:lvl>
   </w:abstractNum>
-  <w:abstractNum w:abstractNumId="12" w15:restartNumberingAfterBreak="0">
+  <w:abstractNum w:abstractNumId="14" w15:restartNumberingAfterBreak="0">
     <w:nsid w:val="1A0904A8"/>
     <w:multiLevelType w:val="multilevel"/>
     <w:tmpl w:val="AEAA53BA"/>
@@ -12473,7 +13757,7 @@
       </w:rPr>
     </w:lvl>
   </w:abstractNum>
-  <w:abstractNum w:abstractNumId="13" w15:restartNumberingAfterBreak="0">
+  <w:abstractNum w:abstractNumId="15" w15:restartNumberingAfterBreak="0">
     <w:nsid w:val="1D795E8D"/>
     <w:multiLevelType w:val="multilevel"/>
     <w:tmpl w:val="1D48DAD0"/>
@@ -12622,7 +13906,156 @@
       </w:rPr>
     </w:lvl>
   </w:abstractNum>
-  <w:abstractNum w:abstractNumId="14" w15:restartNumberingAfterBreak="0">
+  <w:abstractNum w:abstractNumId="16" w15:restartNumberingAfterBreak="0">
+    <w:nsid w:val="1E013F2E"/>
+    <w:multiLevelType w:val="multilevel"/>
+    <w:tmpl w:val="ED0466AA"/>
+    <w:lvl w:ilvl="0">
+      <w:start w:val="1"/>
+      <w:numFmt w:val="bullet"/>
+      <w:lvlText w:val=""/>
+      <w:lvlJc w:val="left"/>
+      <w:pPr>
+        <w:tabs>
+          <w:tab w:val="num" w:pos="720"/>
+        </w:tabs>
+        <w:ind w:left="720" w:hanging="360"/>
+      </w:pPr>
+      <w:rPr>
+        <w:rFonts w:ascii="Symbol" w:hAnsi="Symbol" w:hint="default"/>
+        <w:sz w:val="20"/>
+      </w:rPr>
+    </w:lvl>
+    <w:lvl w:ilvl="1" w:tentative="1">
+      <w:start w:val="1"/>
+      <w:numFmt w:val="bullet"/>
+      <w:lvlText w:val="o"/>
+      <w:lvlJc w:val="left"/>
+      <w:pPr>
+        <w:tabs>
+          <w:tab w:val="num" w:pos="1440"/>
+        </w:tabs>
+        <w:ind w:left="1440" w:hanging="360"/>
+      </w:pPr>
+      <w:rPr>
+        <w:rFonts w:ascii="Courier New" w:hAnsi="Courier New" w:hint="default"/>
+        <w:sz w:val="20"/>
+      </w:rPr>
+    </w:lvl>
+    <w:lvl w:ilvl="2" w:tentative="1">
+      <w:start w:val="1"/>
+      <w:numFmt w:val="bullet"/>
+      <w:lvlText w:val=""/>
+      <w:lvlJc w:val="left"/>
+      <w:pPr>
+        <w:tabs>
+          <w:tab w:val="num" w:pos="2160"/>
+        </w:tabs>
+        <w:ind w:left="2160" w:hanging="360"/>
+      </w:pPr>
+      <w:rPr>
+        <w:rFonts w:ascii="Wingdings" w:hAnsi="Wingdings" w:hint="default"/>
+        <w:sz w:val="20"/>
+      </w:rPr>
+    </w:lvl>
+    <w:lvl w:ilvl="3" w:tentative="1">
+      <w:start w:val="1"/>
+      <w:numFmt w:val="bullet"/>
+      <w:lvlText w:val=""/>
+      <w:lvlJc w:val="left"/>
+      <w:pPr>
+        <w:tabs>
+          <w:tab w:val="num" w:pos="2880"/>
+        </w:tabs>
+        <w:ind w:left="2880" w:hanging="360"/>
+      </w:pPr>
+      <w:rPr>
+        <w:rFonts w:ascii="Wingdings" w:hAnsi="Wingdings" w:hint="default"/>
+        <w:sz w:val="20"/>
+      </w:rPr>
+    </w:lvl>
+    <w:lvl w:ilvl="4" w:tentative="1">
+      <w:start w:val="1"/>
+      <w:numFmt w:val="bullet"/>
+      <w:lvlText w:val=""/>
+      <w:lvlJc w:val="left"/>
+      <w:pPr>
+        <w:tabs>
+          <w:tab w:val="num" w:pos="3600"/>
+        </w:tabs>
+        <w:ind w:left="3600" w:hanging="360"/>
+      </w:pPr>
+      <w:rPr>
+        <w:rFonts w:ascii="Wingdings" w:hAnsi="Wingdings" w:hint="default"/>
+        <w:sz w:val="20"/>
+      </w:rPr>
+    </w:lvl>
+    <w:lvl w:ilvl="5" w:tentative="1">
+      <w:start w:val="1"/>
+      <w:numFmt w:val="bullet"/>
+      <w:lvlText w:val=""/>
+      <w:lvlJc w:val="left"/>
+      <w:pPr>
+        <w:tabs>
+          <w:tab w:val="num" w:pos="4320"/>
+        </w:tabs>
+        <w:ind w:left="4320" w:hanging="360"/>
+      </w:pPr>
+      <w:rPr>
+        <w:rFonts w:ascii="Wingdings" w:hAnsi="Wingdings" w:hint="default"/>
+        <w:sz w:val="20"/>
+      </w:rPr>
+    </w:lvl>
+    <w:lvl w:ilvl="6" w:tentative="1">
+      <w:start w:val="1"/>
+      <w:numFmt w:val="bullet"/>
+      <w:lvlText w:val=""/>
+      <w:lvlJc w:val="left"/>
+      <w:pPr>
+        <w:tabs>
+          <w:tab w:val="num" w:pos="5040"/>
+        </w:tabs>
+        <w:ind w:left="5040" w:hanging="360"/>
+      </w:pPr>
+      <w:rPr>
+        <w:rFonts w:ascii="Wingdings" w:hAnsi="Wingdings" w:hint="default"/>
+        <w:sz w:val="20"/>
+      </w:rPr>
+    </w:lvl>
+    <w:lvl w:ilvl="7" w:tentative="1">
+      <w:start w:val="1"/>
+      <w:numFmt w:val="bullet"/>
+      <w:lvlText w:val=""/>
+      <w:lvlJc w:val="left"/>
+      <w:pPr>
+        <w:tabs>
+          <w:tab w:val="num" w:pos="5760"/>
+        </w:tabs>
+        <w:ind w:left="5760" w:hanging="360"/>
+      </w:pPr>
+      <w:rPr>
+        <w:rFonts w:ascii="Wingdings" w:hAnsi="Wingdings" w:hint="default"/>
+        <w:sz w:val="20"/>
+      </w:rPr>
+    </w:lvl>
+    <w:lvl w:ilvl="8" w:tentative="1">
+      <w:start w:val="1"/>
+      <w:numFmt w:val="bullet"/>
+      <w:lvlText w:val=""/>
+      <w:lvlJc w:val="left"/>
+      <w:pPr>
+        <w:tabs>
+          <w:tab w:val="num" w:pos="6480"/>
+        </w:tabs>
+        <w:ind w:left="6480" w:hanging="360"/>
+      </w:pPr>
+      <w:rPr>
+        <w:rFonts w:ascii="Wingdings" w:hAnsi="Wingdings" w:hint="default"/>
+        <w:sz w:val="20"/>
+      </w:rPr>
+    </w:lvl>
+  </w:abstractNum>
+  <w:abstractNum w:abstractNumId="17" w15:restartNumberingAfterBreak="0">
     <w:nsid w:val="1E957172"/>
     <w:multiLevelType w:val="multilevel"/>
     <w:tmpl w:val="E1EC9D14"/>
@@ -12771,7 +14204,7 @@
       </w:rPr>
     </w:lvl>
   </w:abstractNum>
-  <w:abstractNum w:abstractNumId="15" w15:restartNumberingAfterBreak="0">
+  <w:abstractNum w:abstractNumId="18" w15:restartNumberingAfterBreak="0">
     <w:nsid w:val="1F04011B"/>
     <w:multiLevelType w:val="multilevel"/>
     <w:tmpl w:val="32E60924"/>
@@ -12920,7 +14353,7 @@
       </w:rPr>
     </w:lvl>
   </w:abstractNum>
-  <w:abstractNum w:abstractNumId="16" w15:restartNumberingAfterBreak="0">
+  <w:abstractNum w:abstractNumId="19" w15:restartNumberingAfterBreak="0">
     <w:nsid w:val="1FFA7335"/>
     <w:multiLevelType w:val="multilevel"/>
     <w:tmpl w:val="F746CC02"/>
@@ -13069,7 +14502,7 @@
       </w:rPr>
     </w:lvl>
   </w:abstractNum>
-  <w:abstractNum w:abstractNumId="17" w15:restartNumberingAfterBreak="0">
+  <w:abstractNum w:abstractNumId="20" w15:restartNumberingAfterBreak="0">
     <w:nsid w:val="277F001C"/>
     <w:multiLevelType w:val="multilevel"/>
     <w:tmpl w:val="DD520D0A"/>
@@ -13218,7 +14651,7 @@
       </w:rPr>
     </w:lvl>
   </w:abstractNum>
-  <w:abstractNum w:abstractNumId="18" w15:restartNumberingAfterBreak="0">
+  <w:abstractNum w:abstractNumId="21" w15:restartNumberingAfterBreak="0">
     <w:nsid w:val="281F6B31"/>
     <w:multiLevelType w:val="multilevel"/>
     <w:tmpl w:val="1D141264"/>
@@ -13367,7 +14800,7 @@
       </w:rPr>
     </w:lvl>
   </w:abstractNum>
-  <w:abstractNum w:abstractNumId="19" w15:restartNumberingAfterBreak="0">
+  <w:abstractNum w:abstractNumId="22" w15:restartNumberingAfterBreak="0">
     <w:nsid w:val="2C4213E1"/>
     <w:multiLevelType w:val="multilevel"/>
     <w:tmpl w:val="C2442892"/>
@@ -13516,7 +14949,7 @@
       </w:rPr>
     </w:lvl>
   </w:abstractNum>
-  <w:abstractNum w:abstractNumId="20" w15:restartNumberingAfterBreak="0">
+  <w:abstractNum w:abstractNumId="23" w15:restartNumberingAfterBreak="0">
     <w:nsid w:val="2D875DB2"/>
     <w:multiLevelType w:val="multilevel"/>
     <w:tmpl w:val="6450BF7A"/>
@@ -13665,7 +15098,7 @@
       </w:rPr>
     </w:lvl>
   </w:abstractNum>
-  <w:abstractNum w:abstractNumId="21" w15:restartNumberingAfterBreak="0">
+  <w:abstractNum w:abstractNumId="24" w15:restartNumberingAfterBreak="0">
     <w:nsid w:val="2EDC66D7"/>
     <w:multiLevelType w:val="multilevel"/>
     <w:tmpl w:val="484CDF84"/>
@@ -13814,7 +15247,7 @@
       </w:rPr>
     </w:lvl>
   </w:abstractNum>
-  <w:abstractNum w:abstractNumId="22" w15:restartNumberingAfterBreak="0">
+  <w:abstractNum w:abstractNumId="25" w15:restartNumberingAfterBreak="0">
     <w:nsid w:val="2F3960A5"/>
     <w:multiLevelType w:val="multilevel"/>
     <w:tmpl w:val="C5E2EACE"/>
@@ -13963,7 +15396,7 @@
       </w:rPr>
     </w:lvl>
   </w:abstractNum>
-  <w:abstractNum w:abstractNumId="23" w15:restartNumberingAfterBreak="0">
+  <w:abstractNum w:abstractNumId="26" w15:restartNumberingAfterBreak="0">
     <w:nsid w:val="2F627E3E"/>
     <w:multiLevelType w:val="multilevel"/>
     <w:tmpl w:val="D4F6983E"/>
@@ -14112,7 +15545,7 @@
       </w:rPr>
     </w:lvl>
   </w:abstractNum>
-  <w:abstractNum w:abstractNumId="24" w15:restartNumberingAfterBreak="0">
+  <w:abstractNum w:abstractNumId="27" w15:restartNumberingAfterBreak="0">
     <w:nsid w:val="329C39BB"/>
     <w:multiLevelType w:val="multilevel"/>
     <w:tmpl w:val="1696BB5C"/>
@@ -14261,7 +15694,7 @@
       </w:rPr>
     </w:lvl>
   </w:abstractNum>
-  <w:abstractNum w:abstractNumId="25" w15:restartNumberingAfterBreak="0">
+  <w:abstractNum w:abstractNumId="28" w15:restartNumberingAfterBreak="0">
     <w:nsid w:val="33806EEE"/>
     <w:multiLevelType w:val="multilevel"/>
     <w:tmpl w:val="C35C4FBC"/>
@@ -14410,7 +15843,7 @@
       </w:rPr>
     </w:lvl>
   </w:abstractNum>
-  <w:abstractNum w:abstractNumId="26" w15:restartNumberingAfterBreak="0">
+  <w:abstractNum w:abstractNumId="29" w15:restartNumberingAfterBreak="0">
     <w:nsid w:val="33FF6B03"/>
     <w:multiLevelType w:val="multilevel"/>
     <w:tmpl w:val="38D493B4"/>
@@ -14559,7 +15992,7 @@
       </w:rPr>
     </w:lvl>
   </w:abstractNum>
-  <w:abstractNum w:abstractNumId="27" w15:restartNumberingAfterBreak="0">
+  <w:abstractNum w:abstractNumId="30" w15:restartNumberingAfterBreak="0">
     <w:nsid w:val="391764DC"/>
     <w:multiLevelType w:val="multilevel"/>
     <w:tmpl w:val="31FAB04C"/>
@@ -14708,7 +16141,7 @@
       </w:rPr>
     </w:lvl>
   </w:abstractNum>
-  <w:abstractNum w:abstractNumId="28" w15:restartNumberingAfterBreak="0">
+  <w:abstractNum w:abstractNumId="31" w15:restartNumberingAfterBreak="0">
     <w:nsid w:val="3B125DF7"/>
     <w:multiLevelType w:val="multilevel"/>
     <w:tmpl w:val="2DFA1608"/>
@@ -14857,7 +16290,7 @@
       </w:rPr>
     </w:lvl>
   </w:abstractNum>
-  <w:abstractNum w:abstractNumId="29" w15:restartNumberingAfterBreak="0">
+  <w:abstractNum w:abstractNumId="32" w15:restartNumberingAfterBreak="0">
     <w:nsid w:val="3CEB3B07"/>
     <w:multiLevelType w:val="multilevel"/>
     <w:tmpl w:val="6C903DEA"/>
@@ -15006,7 +16439,7 @@
       </w:rPr>
     </w:lvl>
   </w:abstractNum>
-  <w:abstractNum w:abstractNumId="30" w15:restartNumberingAfterBreak="0">
+  <w:abstractNum w:abstractNumId="33" w15:restartNumberingAfterBreak="0">
     <w:nsid w:val="3D1E6C5B"/>
     <w:multiLevelType w:val="multilevel"/>
     <w:tmpl w:val="7D5A8D26"/>
@@ -15155,7 +16588,7 @@
       </w:rPr>
     </w:lvl>
   </w:abstractNum>
-  <w:abstractNum w:abstractNumId="31" w15:restartNumberingAfterBreak="0">
+  <w:abstractNum w:abstractNumId="34" w15:restartNumberingAfterBreak="0">
     <w:nsid w:val="3E75593D"/>
     <w:multiLevelType w:val="multilevel"/>
     <w:tmpl w:val="77E60D1C"/>
@@ -15304,7 +16737,7 @@
       </w:rPr>
     </w:lvl>
   </w:abstractNum>
-  <w:abstractNum w:abstractNumId="32" w15:restartNumberingAfterBreak="0">
+  <w:abstractNum w:abstractNumId="35" w15:restartNumberingAfterBreak="0">
     <w:nsid w:val="3FE16A64"/>
     <w:multiLevelType w:val="multilevel"/>
     <w:tmpl w:val="BAF6EC1C"/>
@@ -15453,7 +16886,7 @@
       </w:rPr>
     </w:lvl>
   </w:abstractNum>
-  <w:abstractNum w:abstractNumId="33" w15:restartNumberingAfterBreak="0">
+  <w:abstractNum w:abstractNumId="36" w15:restartNumberingAfterBreak="0">
     <w:nsid w:val="40D03BCD"/>
     <w:multiLevelType w:val="multilevel"/>
     <w:tmpl w:val="E53A8542"/>
@@ -15602,7 +17035,7 @@
       </w:rPr>
     </w:lvl>
   </w:abstractNum>
-  <w:abstractNum w:abstractNumId="34" w15:restartNumberingAfterBreak="0">
+  <w:abstractNum w:abstractNumId="37" w15:restartNumberingAfterBreak="0">
     <w:nsid w:val="4D6C676B"/>
     <w:multiLevelType w:val="multilevel"/>
     <w:tmpl w:val="864695D8"/>
@@ -15751,7 +17184,7 @@
       </w:rPr>
     </w:lvl>
   </w:abstractNum>
-  <w:abstractNum w:abstractNumId="35" w15:restartNumberingAfterBreak="0">
+  <w:abstractNum w:abstractNumId="38" w15:restartNumberingAfterBreak="0">
     <w:nsid w:val="4EC51907"/>
     <w:multiLevelType w:val="multilevel"/>
     <w:tmpl w:val="B9D0FF78"/>
@@ -15900,7 +17333,7 @@
       </w:rPr>
     </w:lvl>
   </w:abstractNum>
-  <w:abstractNum w:abstractNumId="36" w15:restartNumberingAfterBreak="0">
+  <w:abstractNum w:abstractNumId="39" w15:restartNumberingAfterBreak="0">
     <w:nsid w:val="4F720D32"/>
     <w:multiLevelType w:val="multilevel"/>
     <w:tmpl w:val="C0FE42C6"/>
@@ -16049,7 +17482,156 @@
       </w:rPr>
     </w:lvl>
   </w:abstractNum>
-  <w:abstractNum w:abstractNumId="37" w15:restartNumberingAfterBreak="0">
+  <w:abstractNum w:abstractNumId="40" w15:restartNumberingAfterBreak="0">
+    <w:nsid w:val="51CB0FFF"/>
+    <w:multiLevelType w:val="multilevel"/>
+    <w:tmpl w:val="C4269EBC"/>
+    <w:lvl w:ilvl="0">
+      <w:start w:val="1"/>
+      <w:numFmt w:val="bullet"/>
+      <w:lvlText w:val=""/>
+      <w:lvlJc w:val="left"/>
+      <w:pPr>
+        <w:tabs>
+          <w:tab w:val="num" w:pos="720"/>
+        </w:tabs>
+        <w:ind w:left="720" w:hanging="360"/>
+      </w:pPr>
+      <w:rPr>
+        <w:rFonts w:ascii="Symbol" w:hAnsi="Symbol" w:hint="default"/>
+        <w:sz w:val="20"/>
+      </w:rPr>
+    </w:lvl>
+    <w:lvl w:ilvl="1" w:tentative="1">
+      <w:start w:val="1"/>
+      <w:numFmt w:val="bullet"/>
+      <w:lvlText w:val="o"/>
+      <w:lvlJc w:val="left"/>
+      <w:pPr>
+        <w:tabs>
+          <w:tab w:val="num" w:pos="1440"/>
+        </w:tabs>
+        <w:ind w:left="1440" w:hanging="360"/>
+      </w:pPr>
+      <w:rPr>
+        <w:rFonts w:ascii="Courier New" w:hAnsi="Courier New" w:hint="default"/>
+        <w:sz w:val="20"/>
+      </w:rPr>
+    </w:lvl>
+    <w:lvl w:ilvl="2" w:tentative="1">
+      <w:start w:val="1"/>
+      <w:numFmt w:val="bullet"/>
+      <w:lvlText w:val=""/>
+      <w:lvlJc w:val="left"/>
+      <w:pPr>
+        <w:tabs>
+          <w:tab w:val="num" w:pos="2160"/>
+        </w:tabs>
+        <w:ind w:left="2160" w:hanging="360"/>
+      </w:pPr>
+      <w:rPr>
+        <w:rFonts w:ascii="Wingdings" w:hAnsi="Wingdings" w:hint="default"/>
+        <w:sz w:val="20"/>
+      </w:rPr>
+    </w:lvl>
+    <w:lvl w:ilvl="3" w:tentative="1">
+      <w:start w:val="1"/>
+      <w:numFmt w:val="bullet"/>
+      <w:lvlText w:val=""/>
+      <w:lvlJc w:val="left"/>
+      <w:pPr>
+        <w:tabs>
+          <w:tab w:val="num" w:pos="2880"/>
+        </w:tabs>
+        <w:ind w:left="2880" w:hanging="360"/>
+      </w:pPr>
+      <w:rPr>
+        <w:rFonts w:ascii="Wingdings" w:hAnsi="Wingdings" w:hint="default"/>
+        <w:sz w:val="20"/>
+      </w:rPr>
+    </w:lvl>
+    <w:lvl w:ilvl="4" w:tentative="1">
+      <w:start w:val="1"/>
+      <w:numFmt w:val="bullet"/>
+      <w:lvlText w:val=""/>
+      <w:lvlJc w:val="left"/>
+      <w:pPr>
+        <w:tabs>
+          <w:tab w:val="num" w:pos="3600"/>
+        </w:tabs>
+        <w:ind w:left="3600" w:hanging="360"/>
+      </w:pPr>
+      <w:rPr>
+        <w:rFonts w:ascii="Wingdings" w:hAnsi="Wingdings" w:hint="default"/>
+        <w:sz w:val="20"/>
+      </w:rPr>
+    </w:lvl>
+    <w:lvl w:ilvl="5" w:tentative="1">
+      <w:start w:val="1"/>
+      <w:numFmt w:val="bullet"/>
+      <w:lvlText w:val=""/>
+      <w:lvlJc w:val="left"/>
+      <w:pPr>
+        <w:tabs>
+          <w:tab w:val="num" w:pos="4320"/>
+        </w:tabs>
+        <w:ind w:left="4320" w:hanging="360"/>
+      </w:pPr>
+      <w:rPr>
+        <w:rFonts w:ascii="Wingdings" w:hAnsi="Wingdings" w:hint="default"/>
+        <w:sz w:val="20"/>
+      </w:rPr>
+    </w:lvl>
+    <w:lvl w:ilvl="6" w:tentative="1">
+      <w:start w:val="1"/>
+      <w:numFmt w:val="bullet"/>
+      <w:lvlText w:val=""/>
+      <w:lvlJc w:val="left"/>
+      <w:pPr>
+        <w:tabs>
+          <w:tab w:val="num" w:pos="5040"/>
+        </w:tabs>
+        <w:ind w:left="5040" w:hanging="360"/>
+      </w:pPr>
+      <w:rPr>
+        <w:rFonts w:ascii="Wingdings" w:hAnsi="Wingdings" w:hint="default"/>
+        <w:sz w:val="20"/>
+      </w:rPr>
+    </w:lvl>
+    <w:lvl w:ilvl="7" w:tentative="1">
+      <w:start w:val="1"/>
+      <w:numFmt w:val="bullet"/>
+      <w:lvlText w:val=""/>
+      <w:lvlJc w:val="left"/>
+      <w:pPr>
+        <w:tabs>
+          <w:tab w:val="num" w:pos="5760"/>
+        </w:tabs>
+        <w:ind w:left="5760" w:hanging="360"/>
+      </w:pPr>
+      <w:rPr>
+        <w:rFonts w:ascii="Wingdings" w:hAnsi="Wingdings" w:hint="default"/>
+        <w:sz w:val="20"/>
+      </w:rPr>
+    </w:lvl>
+    <w:lvl w:ilvl="8" w:tentative="1">
+      <w:start w:val="1"/>
+      <w:numFmt w:val="bullet"/>
+      <w:lvlText w:val=""/>
+      <w:lvlJc w:val="left"/>
+      <w:pPr>
+        <w:tabs>
+          <w:tab w:val="num" w:pos="6480"/>
+        </w:tabs>
+        <w:ind w:left="6480" w:hanging="360"/>
+      </w:pPr>
+      <w:rPr>
+        <w:rFonts w:ascii="Wingdings" w:hAnsi="Wingdings" w:hint="default"/>
+        <w:sz w:val="20"/>
+      </w:rPr>
+    </w:lvl>
+  </w:abstractNum>
+  <w:abstractNum w:abstractNumId="41" w15:restartNumberingAfterBreak="0">
     <w:nsid w:val="51F43525"/>
     <w:multiLevelType w:val="multilevel"/>
     <w:tmpl w:val="17FC6A90"/>
@@ -16198,7 +17780,156 @@
       </w:rPr>
     </w:lvl>
   </w:abstractNum>
-  <w:abstractNum w:abstractNumId="38" w15:restartNumberingAfterBreak="0">
+  <w:abstractNum w:abstractNumId="42" w15:restartNumberingAfterBreak="0">
+    <w:nsid w:val="520C5DD3"/>
+    <w:multiLevelType w:val="multilevel"/>
+    <w:tmpl w:val="753AC0D2"/>
+    <w:lvl w:ilvl="0">
+      <w:start w:val="1"/>
+      <w:numFmt w:val="bullet"/>
+      <w:lvlText w:val=""/>
+      <w:lvlJc w:val="left"/>
+      <w:pPr>
+        <w:tabs>
+          <w:tab w:val="num" w:pos="720"/>
+        </w:tabs>
+        <w:ind w:left="720" w:hanging="360"/>
+      </w:pPr>
+      <w:rPr>
+        <w:rFonts w:ascii="Symbol" w:hAnsi="Symbol" w:hint="default"/>
+        <w:sz w:val="20"/>
+      </w:rPr>
+    </w:lvl>
+    <w:lvl w:ilvl="1" w:tentative="1">
+      <w:start w:val="1"/>
+      <w:numFmt w:val="bullet"/>
+      <w:lvlText w:val="o"/>
+      <w:lvlJc w:val="left"/>
+      <w:pPr>
+        <w:tabs>
+          <w:tab w:val="num" w:pos="1440"/>
+        </w:tabs>
+        <w:ind w:left="1440" w:hanging="360"/>
+      </w:pPr>
+      <w:rPr>
+        <w:rFonts w:ascii="Courier New" w:hAnsi="Courier New" w:hint="default"/>
+        <w:sz w:val="20"/>
+      </w:rPr>
+    </w:lvl>
+    <w:lvl w:ilvl="2" w:tentative="1">
+      <w:start w:val="1"/>
+      <w:numFmt w:val="bullet"/>
+      <w:lvlText w:val=""/>
+      <w:lvlJc w:val="left"/>
+      <w:pPr>
+        <w:tabs>
+          <w:tab w:val="num" w:pos="2160"/>
+        </w:tabs>
+        <w:ind w:left="2160" w:hanging="360"/>
+      </w:pPr>
+      <w:rPr>
+        <w:rFonts w:ascii="Wingdings" w:hAnsi="Wingdings" w:hint="default"/>
+        <w:sz w:val="20"/>
+      </w:rPr>
+    </w:lvl>
+    <w:lvl w:ilvl="3" w:tentative="1">
+      <w:start w:val="1"/>
+      <w:numFmt w:val="bullet"/>
+      <w:lvlText w:val=""/>
+      <w:lvlJc w:val="left"/>
+      <w:pPr>
+        <w:tabs>
+          <w:tab w:val="num" w:pos="2880"/>
+        </w:tabs>
+        <w:ind w:left="2880" w:hanging="360"/>
+      </w:pPr>
+      <w:rPr>
+        <w:rFonts w:ascii="Wingdings" w:hAnsi="Wingdings" w:hint="default"/>
+        <w:sz w:val="20"/>
+      </w:rPr>
+    </w:lvl>
+    <w:lvl w:ilvl="4" w:tentative="1">
+      <w:start w:val="1"/>
+      <w:numFmt w:val="bullet"/>
+      <w:lvlText w:val=""/>
+      <w:lvlJc w:val="left"/>
+      <w:pPr>
+        <w:tabs>
+          <w:tab w:val="num" w:pos="3600"/>
+        </w:tabs>
+        <w:ind w:left="3600" w:hanging="360"/>
+      </w:pPr>
+      <w:rPr>
+        <w:rFonts w:ascii="Wingdings" w:hAnsi="Wingdings" w:hint="default"/>
+        <w:sz w:val="20"/>
+      </w:rPr>
+    </w:lvl>
+    <w:lvl w:ilvl="5" w:tentative="1">
+      <w:start w:val="1"/>
+      <w:numFmt w:val="bullet"/>
+      <w:lvlText w:val=""/>
+      <w:lvlJc w:val="left"/>
+      <w:pPr>
+        <w:tabs>
+          <w:tab w:val="num" w:pos="4320"/>
+        </w:tabs>
+        <w:ind w:left="4320" w:hanging="360"/>
+      </w:pPr>
+      <w:rPr>
+        <w:rFonts w:ascii="Wingdings" w:hAnsi="Wingdings" w:hint="default"/>
+        <w:sz w:val="20"/>
+      </w:rPr>
+    </w:lvl>
+    <w:lvl w:ilvl="6" w:tentative="1">
+      <w:start w:val="1"/>
+      <w:numFmt w:val="bullet"/>
+      <w:lvlText w:val=""/>
+      <w:lvlJc w:val="left"/>
+      <w:pPr>
+        <w:tabs>
+          <w:tab w:val="num" w:pos="5040"/>
+        </w:tabs>
+        <w:ind w:left="5040" w:hanging="360"/>
+      </w:pPr>
+      <w:rPr>
+        <w:rFonts w:ascii="Wingdings" w:hAnsi="Wingdings" w:hint="default"/>
+        <w:sz w:val="20"/>
+      </w:rPr>
+    </w:lvl>
+    <w:lvl w:ilvl="7" w:tentative="1">
+      <w:start w:val="1"/>
+      <w:numFmt w:val="bullet"/>
+      <w:lvlText w:val=""/>
+      <w:lvlJc w:val="left"/>
+      <w:pPr>
+        <w:tabs>
+          <w:tab w:val="num" w:pos="5760"/>
+        </w:tabs>
+        <w:ind w:left="5760" w:hanging="360"/>
+      </w:pPr>
+      <w:rPr>
+        <w:rFonts w:ascii="Wingdings" w:hAnsi="Wingdings" w:hint="default"/>
+        <w:sz w:val="20"/>
+      </w:rPr>
+    </w:lvl>
+    <w:lvl w:ilvl="8" w:tentative="1">
+      <w:start w:val="1"/>
+      <w:numFmt w:val="bullet"/>
+      <w:lvlText w:val=""/>
+      <w:lvlJc w:val="left"/>
+      <w:pPr>
+        <w:tabs>
+          <w:tab w:val="num" w:pos="6480"/>
+        </w:tabs>
+        <w:ind w:left="6480" w:hanging="360"/>
+      </w:pPr>
+      <w:rPr>
+        <w:rFonts w:ascii="Wingdings" w:hAnsi="Wingdings" w:hint="default"/>
+        <w:sz w:val="20"/>
+      </w:rPr>
+    </w:lvl>
+  </w:abstractNum>
+  <w:abstractNum w:abstractNumId="43" w15:restartNumberingAfterBreak="0">
     <w:nsid w:val="53F5143F"/>
     <w:multiLevelType w:val="hybridMultilevel"/>
     <w:tmpl w:val="B2005722"/>
@@ -16311,7 +18042,7 @@
       </w:rPr>
     </w:lvl>
   </w:abstractNum>
-  <w:abstractNum w:abstractNumId="39" w15:restartNumberingAfterBreak="0">
+  <w:abstractNum w:abstractNumId="44" w15:restartNumberingAfterBreak="0">
     <w:nsid w:val="5418548D"/>
     <w:multiLevelType w:val="multilevel"/>
     <w:tmpl w:val="F3745D64"/>
@@ -16460,7 +18191,7 @@
       </w:rPr>
     </w:lvl>
   </w:abstractNum>
-  <w:abstractNum w:abstractNumId="40" w15:restartNumberingAfterBreak="0">
+  <w:abstractNum w:abstractNumId="45" w15:restartNumberingAfterBreak="0">
     <w:nsid w:val="54E51C22"/>
     <w:multiLevelType w:val="hybridMultilevel"/>
     <w:tmpl w:val="D9A89FBA"/>
@@ -16573,7 +18304,7 @@
       </w:rPr>
     </w:lvl>
   </w:abstractNum>
-  <w:abstractNum w:abstractNumId="41" w15:restartNumberingAfterBreak="0">
+  <w:abstractNum w:abstractNumId="46" w15:restartNumberingAfterBreak="0">
     <w:nsid w:val="56141124"/>
     <w:multiLevelType w:val="multilevel"/>
     <w:tmpl w:val="72CECC2A"/>
@@ -16722,7 +18453,7 @@
       </w:rPr>
     </w:lvl>
   </w:abstractNum>
-  <w:abstractNum w:abstractNumId="42" w15:restartNumberingAfterBreak="0">
+  <w:abstractNum w:abstractNumId="47" w15:restartNumberingAfterBreak="0">
     <w:nsid w:val="5668129C"/>
     <w:multiLevelType w:val="multilevel"/>
     <w:tmpl w:val="193EC38C"/>
@@ -16871,7 +18602,7 @@
       </w:rPr>
     </w:lvl>
   </w:abstractNum>
-  <w:abstractNum w:abstractNumId="43" w15:restartNumberingAfterBreak="0">
+  <w:abstractNum w:abstractNumId="48" w15:restartNumberingAfterBreak="0">
     <w:nsid w:val="5BD530F4"/>
     <w:multiLevelType w:val="multilevel"/>
     <w:tmpl w:val="85BE4242"/>
@@ -17020,7 +18751,7 @@
       </w:rPr>
     </w:lvl>
   </w:abstractNum>
-  <w:abstractNum w:abstractNumId="44" w15:restartNumberingAfterBreak="0">
+  <w:abstractNum w:abstractNumId="49" w15:restartNumberingAfterBreak="0">
     <w:nsid w:val="5F797678"/>
     <w:multiLevelType w:val="multilevel"/>
     <w:tmpl w:val="4BE291F8"/>
@@ -17169,7 +18900,7 @@
       </w:rPr>
     </w:lvl>
   </w:abstractNum>
-  <w:abstractNum w:abstractNumId="45" w15:restartNumberingAfterBreak="0">
+  <w:abstractNum w:abstractNumId="50" w15:restartNumberingAfterBreak="0">
     <w:nsid w:val="64B00720"/>
     <w:multiLevelType w:val="multilevel"/>
     <w:tmpl w:val="ECA4E594"/>
@@ -17318,7 +19049,7 @@
       </w:rPr>
     </w:lvl>
   </w:abstractNum>
-  <w:abstractNum w:abstractNumId="46" w15:restartNumberingAfterBreak="0">
+  <w:abstractNum w:abstractNumId="51" w15:restartNumberingAfterBreak="0">
     <w:nsid w:val="64D8791F"/>
     <w:multiLevelType w:val="multilevel"/>
     <w:tmpl w:val="C818DFEE"/>
@@ -17467,7 +19198,156 @@
       </w:rPr>
     </w:lvl>
   </w:abstractNum>
-  <w:abstractNum w:abstractNumId="47" w15:restartNumberingAfterBreak="0">
+  <w:abstractNum w:abstractNumId="52" w15:restartNumberingAfterBreak="0">
+    <w:nsid w:val="65220CC3"/>
+    <w:multiLevelType w:val="multilevel"/>
+    <w:tmpl w:val="8D34722E"/>
+    <w:lvl w:ilvl="0">
+      <w:start w:val="1"/>
+      <w:numFmt w:val="bullet"/>
+      <w:lvlText w:val=""/>
+      <w:lvlJc w:val="left"/>
+      <w:pPr>
+        <w:tabs>
+          <w:tab w:val="num" w:pos="720"/>
+        </w:tabs>
+        <w:ind w:left="720" w:hanging="360"/>
+      </w:pPr>
+      <w:rPr>
+        <w:rFonts w:ascii="Symbol" w:hAnsi="Symbol" w:hint="default"/>
+        <w:sz w:val="20"/>
+      </w:rPr>
+    </w:lvl>
+    <w:lvl w:ilvl="1" w:tentative="1">
+      <w:start w:val="1"/>
+      <w:numFmt w:val="bullet"/>
+      <w:lvlText w:val="o"/>
+      <w:lvlJc w:val="left"/>
+      <w:pPr>
+        <w:tabs>
+          <w:tab w:val="num" w:pos="1440"/>
+        </w:tabs>
+        <w:ind w:left="1440" w:hanging="360"/>
+      </w:pPr>
+      <w:rPr>
+        <w:rFonts w:ascii="Courier New" w:hAnsi="Courier New" w:hint="default"/>
+        <w:sz w:val="20"/>
+      </w:rPr>
+    </w:lvl>
+    <w:lvl w:ilvl="2" w:tentative="1">
+      <w:start w:val="1"/>
+      <w:numFmt w:val="bullet"/>
+      <w:lvlText w:val=""/>
+      <w:lvlJc w:val="left"/>
+      <w:pPr>
+        <w:tabs>
+          <w:tab w:val="num" w:pos="2160"/>
+        </w:tabs>
+        <w:ind w:left="2160" w:hanging="360"/>
+      </w:pPr>
+      <w:rPr>
+        <w:rFonts w:ascii="Wingdings" w:hAnsi="Wingdings" w:hint="default"/>
+        <w:sz w:val="20"/>
+      </w:rPr>
+    </w:lvl>
+    <w:lvl w:ilvl="3" w:tentative="1">
+      <w:start w:val="1"/>
+      <w:numFmt w:val="bullet"/>
+      <w:lvlText w:val=""/>
+      <w:lvlJc w:val="left"/>
+      <w:pPr>
+        <w:tabs>
+          <w:tab w:val="num" w:pos="2880"/>
+        </w:tabs>
+        <w:ind w:left="2880" w:hanging="360"/>
+      </w:pPr>
+      <w:rPr>
+        <w:rFonts w:ascii="Wingdings" w:hAnsi="Wingdings" w:hint="default"/>
+        <w:sz w:val="20"/>
+      </w:rPr>
+    </w:lvl>
+    <w:lvl w:ilvl="4" w:tentative="1">
+      <w:start w:val="1"/>
+      <w:numFmt w:val="bullet"/>
+      <w:lvlText w:val=""/>
+      <w:lvlJc w:val="left"/>
+      <w:pPr>
+        <w:tabs>
+          <w:tab w:val="num" w:pos="3600"/>
+        </w:tabs>
+        <w:ind w:left="3600" w:hanging="360"/>
+      </w:pPr>
+      <w:rPr>
+        <w:rFonts w:ascii="Wingdings" w:hAnsi="Wingdings" w:hint="default"/>
+        <w:sz w:val="20"/>
+      </w:rPr>
+    </w:lvl>
+    <w:lvl w:ilvl="5" w:tentative="1">
+      <w:start w:val="1"/>
+      <w:numFmt w:val="bullet"/>
+      <w:lvlText w:val=""/>
+      <w:lvlJc w:val="left"/>
+      <w:pPr>
+        <w:tabs>
+          <w:tab w:val="num" w:pos="4320"/>
+        </w:tabs>
+        <w:ind w:left="4320" w:hanging="360"/>
+      </w:pPr>
+      <w:rPr>
+        <w:rFonts w:ascii="Wingdings" w:hAnsi="Wingdings" w:hint="default"/>
+        <w:sz w:val="20"/>
+      </w:rPr>
+    </w:lvl>
+    <w:lvl w:ilvl="6" w:tentative="1">
+      <w:start w:val="1"/>
+      <w:numFmt w:val="bullet"/>
+      <w:lvlText w:val=""/>
+      <w:lvlJc w:val="left"/>
+      <w:pPr>
+        <w:tabs>
+          <w:tab w:val="num" w:pos="5040"/>
+        </w:tabs>
+        <w:ind w:left="5040" w:hanging="360"/>
+      </w:pPr>
+      <w:rPr>
+        <w:rFonts w:ascii="Wingdings" w:hAnsi="Wingdings" w:hint="default"/>
+        <w:sz w:val="20"/>
+      </w:rPr>
+    </w:lvl>
+    <w:lvl w:ilvl="7" w:tentative="1">
+      <w:start w:val="1"/>
+      <w:numFmt w:val="bullet"/>
+      <w:lvlText w:val=""/>
+      <w:lvlJc w:val="left"/>
+      <w:pPr>
+        <w:tabs>
+          <w:tab w:val="num" w:pos="5760"/>
+        </w:tabs>
+        <w:ind w:left="5760" w:hanging="360"/>
+      </w:pPr>
+      <w:rPr>
+        <w:rFonts w:ascii="Wingdings" w:hAnsi="Wingdings" w:hint="default"/>
+        <w:sz w:val="20"/>
+      </w:rPr>
+    </w:lvl>
+    <w:lvl w:ilvl="8" w:tentative="1">
+      <w:start w:val="1"/>
+      <w:numFmt w:val="bullet"/>
+      <w:lvlText w:val=""/>
+      <w:lvlJc w:val="left"/>
+      <w:pPr>
+        <w:tabs>
+          <w:tab w:val="num" w:pos="6480"/>
+        </w:tabs>
+        <w:ind w:left="6480" w:hanging="360"/>
+      </w:pPr>
+      <w:rPr>
+        <w:rFonts w:ascii="Wingdings" w:hAnsi="Wingdings" w:hint="default"/>
+        <w:sz w:val="20"/>
+      </w:rPr>
+    </w:lvl>
+  </w:abstractNum>
+  <w:abstractNum w:abstractNumId="53" w15:restartNumberingAfterBreak="0">
     <w:nsid w:val="6D3E2179"/>
     <w:multiLevelType w:val="multilevel"/>
     <w:tmpl w:val="CAE0758E"/>
@@ -17616,7 +19496,7 @@
       </w:rPr>
     </w:lvl>
   </w:abstractNum>
-  <w:abstractNum w:abstractNumId="48" w15:restartNumberingAfterBreak="0">
+  <w:abstractNum w:abstractNumId="54" w15:restartNumberingAfterBreak="0">
     <w:nsid w:val="6E6A33B4"/>
     <w:multiLevelType w:val="multilevel"/>
     <w:tmpl w:val="95FC9004"/>
@@ -17765,7 +19645,7 @@
       </w:rPr>
     </w:lvl>
   </w:abstractNum>
-  <w:abstractNum w:abstractNumId="49" w15:restartNumberingAfterBreak="0">
+  <w:abstractNum w:abstractNumId="55" w15:restartNumberingAfterBreak="0">
     <w:nsid w:val="714D5569"/>
     <w:multiLevelType w:val="multilevel"/>
     <w:tmpl w:val="CD0AA0D6"/>
@@ -17914,7 +19794,7 @@
       </w:rPr>
     </w:lvl>
   </w:abstractNum>
-  <w:abstractNum w:abstractNumId="50" w15:restartNumberingAfterBreak="0">
+  <w:abstractNum w:abstractNumId="56" w15:restartNumberingAfterBreak="0">
     <w:nsid w:val="73042D32"/>
     <w:multiLevelType w:val="hybridMultilevel"/>
     <w:tmpl w:val="1EF05924"/>
@@ -18027,7 +19907,7 @@
       </w:rPr>
     </w:lvl>
   </w:abstractNum>
-  <w:abstractNum w:abstractNumId="51" w15:restartNumberingAfterBreak="0">
+  <w:abstractNum w:abstractNumId="57" w15:restartNumberingAfterBreak="0">
     <w:nsid w:val="77AE223B"/>
     <w:multiLevelType w:val="multilevel"/>
     <w:tmpl w:val="E7AC683A"/>
@@ -18176,7 +20056,7 @@
       </w:rPr>
     </w:lvl>
   </w:abstractNum>
-  <w:abstractNum w:abstractNumId="52" w15:restartNumberingAfterBreak="0">
+  <w:abstractNum w:abstractNumId="58" w15:restartNumberingAfterBreak="0">
     <w:nsid w:val="7C261037"/>
     <w:multiLevelType w:val="multilevel"/>
     <w:tmpl w:val="910E7076"/>
@@ -18325,7 +20205,7 @@
       </w:rPr>
     </w:lvl>
   </w:abstractNum>
-  <w:abstractNum w:abstractNumId="53" w15:restartNumberingAfterBreak="0">
+  <w:abstractNum w:abstractNumId="59" w15:restartNumberingAfterBreak="0">
     <w:nsid w:val="7C3B2547"/>
     <w:multiLevelType w:val="multilevel"/>
     <w:tmpl w:val="B18CE0AE"/>
@@ -18474,7 +20354,7 @@
       </w:rPr>
     </w:lvl>
   </w:abstractNum>
-  <w:abstractNum w:abstractNumId="54" w15:restartNumberingAfterBreak="0">
+  <w:abstractNum w:abstractNumId="60" w15:restartNumberingAfterBreak="0">
     <w:nsid w:val="7C495741"/>
     <w:multiLevelType w:val="multilevel"/>
     <w:tmpl w:val="31921748"/>
@@ -18588,169 +20468,187 @@
     </w:lvl>
   </w:abstractNum>
   <w:num w:numId="1">
+    <w:abstractNumId w:val="19"/>
+  </w:num>
+  <w:num w:numId="2">
+    <w:abstractNumId w:val="11"/>
+  </w:num>
+  <w:num w:numId="3">
+    <w:abstractNumId w:val="35"/>
+  </w:num>
+  <w:num w:numId="4">
+    <w:abstractNumId w:val="46"/>
+  </w:num>
+  <w:num w:numId="5">
+    <w:abstractNumId w:val="3"/>
+  </w:num>
+  <w:num w:numId="6">
+    <w:abstractNumId w:val="58"/>
+  </w:num>
+  <w:num w:numId="7">
+    <w:abstractNumId w:val="59"/>
+  </w:num>
+  <w:num w:numId="8">
+    <w:abstractNumId w:val="57"/>
+  </w:num>
+  <w:num w:numId="9">
+    <w:abstractNumId w:val="4"/>
+  </w:num>
+  <w:num w:numId="10">
+    <w:abstractNumId w:val="14"/>
+  </w:num>
+  <w:num w:numId="11">
+    <w:abstractNumId w:val="48"/>
+  </w:num>
+  <w:num w:numId="12">
+    <w:abstractNumId w:val="22"/>
+  </w:num>
+  <w:num w:numId="13">
+    <w:abstractNumId w:val="53"/>
+  </w:num>
+  <w:num w:numId="14">
+    <w:abstractNumId w:val="15"/>
+  </w:num>
+  <w:num w:numId="15">
+    <w:abstractNumId w:val="43"/>
+  </w:num>
+  <w:num w:numId="16">
+    <w:abstractNumId w:val="13"/>
+  </w:num>
+  <w:num w:numId="17">
+    <w:abstractNumId w:val="60"/>
+  </w:num>
+  <w:num w:numId="18">
+    <w:abstractNumId w:val="37"/>
+  </w:num>
+  <w:num w:numId="19">
+    <w:abstractNumId w:val="2"/>
+  </w:num>
+  <w:num w:numId="20">
+    <w:abstractNumId w:val="38"/>
+  </w:num>
+  <w:num w:numId="21">
+    <w:abstractNumId w:val="51"/>
+  </w:num>
+  <w:num w:numId="22">
+    <w:abstractNumId w:val="33"/>
+  </w:num>
+  <w:num w:numId="23">
+    <w:abstractNumId w:val="24"/>
+  </w:num>
+  <w:num w:numId="24">
+    <w:abstractNumId w:val="44"/>
+  </w:num>
+  <w:num w:numId="25">
+    <w:abstractNumId w:val="5"/>
+  </w:num>
+  <w:num w:numId="26">
+    <w:abstractNumId w:val="50"/>
+  </w:num>
+  <w:num w:numId="27">
+    <w:abstractNumId w:val="49"/>
+  </w:num>
+  <w:num w:numId="28">
+    <w:abstractNumId w:val="23"/>
+  </w:num>
+  <w:num w:numId="29">
+    <w:abstractNumId w:val="18"/>
+  </w:num>
+  <w:num w:numId="30">
+    <w:abstractNumId w:val="10"/>
+  </w:num>
+  <w:num w:numId="31">
+    <w:abstractNumId w:val="25"/>
+  </w:num>
+  <w:num w:numId="32">
+    <w:abstractNumId w:val="32"/>
+  </w:num>
+  <w:num w:numId="33">
+    <w:abstractNumId w:val="20"/>
+  </w:num>
+  <w:num w:numId="34">
+    <w:abstractNumId w:val="34"/>
+  </w:num>
+  <w:num w:numId="35">
+    <w:abstractNumId w:val="45"/>
+  </w:num>
+  <w:num w:numId="36">
+    <w:abstractNumId w:val="7"/>
+  </w:num>
+  <w:num w:numId="37">
+    <w:abstractNumId w:val="56"/>
+  </w:num>
+  <w:num w:numId="38">
+    <w:abstractNumId w:val="8"/>
+  </w:num>
+  <w:num w:numId="39">
+    <w:abstractNumId w:val="55"/>
+  </w:num>
+  <w:num w:numId="40">
+    <w:abstractNumId w:val="39"/>
+  </w:num>
+  <w:num w:numId="41">
+    <w:abstractNumId w:val="6"/>
+  </w:num>
+  <w:num w:numId="42">
+    <w:abstractNumId w:val="30"/>
+  </w:num>
+  <w:num w:numId="43">
+    <w:abstractNumId w:val="54"/>
+  </w:num>
+  <w:num w:numId="44">
+    <w:abstractNumId w:val="29"/>
+  </w:num>
+  <w:num w:numId="45">
+    <w:abstractNumId w:val="21"/>
+  </w:num>
+  <w:num w:numId="46">
+    <w:abstractNumId w:val="41"/>
+  </w:num>
+  <w:num w:numId="47">
+    <w:abstractNumId w:val="47"/>
+  </w:num>
+  <w:num w:numId="48">
+    <w:abstractNumId w:val="27"/>
+  </w:num>
+  <w:num w:numId="49">
+    <w:abstractNumId w:val="1"/>
+  </w:num>
+  <w:num w:numId="50">
+    <w:abstractNumId w:val="26"/>
+  </w:num>
+  <w:num w:numId="51">
+    <w:abstractNumId w:val="9"/>
+  </w:num>
+  <w:num w:numId="52">
+    <w:abstractNumId w:val="28"/>
+  </w:num>
+  <w:num w:numId="53">
+    <w:abstractNumId w:val="17"/>
+  </w:num>
+  <w:num w:numId="54">
+    <w:abstractNumId w:val="31"/>
+  </w:num>
+  <w:num w:numId="55">
+    <w:abstractNumId w:val="36"/>
+  </w:num>
+  <w:num w:numId="56">
+    <w:abstractNumId w:val="40"/>
+  </w:num>
+  <w:num w:numId="57">
     <w:abstractNumId w:val="16"/>
   </w:num>
-  <w:num w:numId="2">
-    <w:abstractNumId w:val="10"/>
+  <w:num w:numId="58">
+    <w:abstractNumId w:val="0"/>
   </w:num>
-  <w:num w:numId="3">
-    <w:abstractNumId w:val="32"/>
-  </w:num>
-  <w:num w:numId="4">
-    <w:abstractNumId w:val="41"/>
-  </w:num>
-  <w:num w:numId="5">
-    <w:abstractNumId w:val="2"/>
-  </w:num>
-  <w:num w:numId="6">
-    <w:abstractNumId w:val="52"/>
-  </w:num>
-  <w:num w:numId="7">
-    <w:abstractNumId w:val="53"/>
-  </w:num>
-  <w:num w:numId="8">
-    <w:abstractNumId w:val="51"/>
-  </w:num>
-  <w:num w:numId="9">
-    <w:abstractNumId w:val="3"/>
-  </w:num>
-  <w:num w:numId="10">
+  <w:num w:numId="59">
     <w:abstractNumId w:val="12"/>
   </w:num>
-  <w:num w:numId="11">
-    <w:abstractNumId w:val="43"/>
-  </w:num>
-  <w:num w:numId="12">
-    <w:abstractNumId w:val="19"/>
-  </w:num>
-  <w:num w:numId="13">
-    <w:abstractNumId w:val="47"/>
-  </w:num>
-  <w:num w:numId="14">
-    <w:abstractNumId w:val="13"/>
-  </w:num>
-  <w:num w:numId="15">
-    <w:abstractNumId w:val="38"/>
-  </w:num>
-  <w:num w:numId="16">
-    <w:abstractNumId w:val="11"/>
-  </w:num>
-  <w:num w:numId="17">
-    <w:abstractNumId w:val="54"/>
-  </w:num>
-  <w:num w:numId="18">
-    <w:abstractNumId w:val="34"/>
-  </w:num>
-  <w:num w:numId="19">
-    <w:abstractNumId w:val="1"/>
-  </w:num>
-  <w:num w:numId="20">
-    <w:abstractNumId w:val="35"/>
-  </w:num>
-  <w:num w:numId="21">
-    <w:abstractNumId w:val="46"/>
-  </w:num>
-  <w:num w:numId="22">
-    <w:abstractNumId w:val="30"/>
-  </w:num>
-  <w:num w:numId="23">
-    <w:abstractNumId w:val="21"/>
-  </w:num>
-  <w:num w:numId="24">
-    <w:abstractNumId w:val="39"/>
-  </w:num>
-  <w:num w:numId="25">
-    <w:abstractNumId w:val="4"/>
-  </w:num>
-  <w:num w:numId="26">
-    <w:abstractNumId w:val="45"/>
-  </w:num>
-  <w:num w:numId="27">
-    <w:abstractNumId w:val="44"/>
-  </w:num>
-  <w:num w:numId="28">
-    <w:abstractNumId w:val="20"/>
-  </w:num>
-  <w:num w:numId="29">
-    <w:abstractNumId w:val="15"/>
-  </w:num>
-  <w:num w:numId="30">
-    <w:abstractNumId w:val="9"/>
-  </w:num>
-  <w:num w:numId="31">
-    <w:abstractNumId w:val="22"/>
-  </w:num>
-  <w:num w:numId="32">
-    <w:abstractNumId w:val="29"/>
-  </w:num>
-  <w:num w:numId="33">
-    <w:abstractNumId w:val="17"/>
-  </w:num>
-  <w:num w:numId="34">
-    <w:abstractNumId w:val="31"/>
-  </w:num>
-  <w:num w:numId="35">
-    <w:abstractNumId w:val="40"/>
-  </w:num>
-  <w:num w:numId="36">
-    <w:abstractNumId w:val="6"/>
-  </w:num>
-  <w:num w:numId="37">
-    <w:abstractNumId w:val="50"/>
-  </w:num>
-  <w:num w:numId="38">
-    <w:abstractNumId w:val="7"/>
-  </w:num>
-  <w:num w:numId="39">
-    <w:abstractNumId w:val="49"/>
-  </w:num>
-  <w:num w:numId="40">
-    <w:abstractNumId w:val="36"/>
-  </w:num>
-  <w:num w:numId="41">
-    <w:abstractNumId w:val="5"/>
-  </w:num>
-  <w:num w:numId="42">
-    <w:abstractNumId w:val="27"/>
-  </w:num>
-  <w:num w:numId="43">
-    <w:abstractNumId w:val="48"/>
-  </w:num>
-  <w:num w:numId="44">
-    <w:abstractNumId w:val="26"/>
-  </w:num>
-  <w:num w:numId="45">
-    <w:abstractNumId w:val="18"/>
-  </w:num>
-  <w:num w:numId="46">
-    <w:abstractNumId w:val="37"/>
-  </w:num>
-  <w:num w:numId="47">
+  <w:num w:numId="60">
     <w:abstractNumId w:val="42"/>
   </w:num>
-  <w:num w:numId="48">
-    <w:abstractNumId w:val="24"/>
-  </w:num>
-  <w:num w:numId="49">
-    <w:abstractNumId w:val="0"/>
-  </w:num>
-  <w:num w:numId="50">
-    <w:abstractNumId w:val="23"/>
-  </w:num>
-  <w:num w:numId="51">
-    <w:abstractNumId w:val="8"/>
-  </w:num>
-  <w:num w:numId="52">
-    <w:abstractNumId w:val="25"/>
-  </w:num>
-  <w:num w:numId="53">
-    <w:abstractNumId w:val="14"/>
-  </w:num>
-  <w:num w:numId="54">
-    <w:abstractNumId w:val="28"/>
-  </w:num>
-  <w:num w:numId="55">
-    <w:abstractNumId w:val="33"/>
+  <w:num w:numId="61">
+    <w:abstractNumId w:val="52"/>
   </w:num>
   <w:numIdMacAtCleanup w:val="52"/>
 </w:numbering>
@@ -19149,7 +21047,7 @@
   <w:style w:type="paragraph" w:default="1" w:styleId="Normal">
     <w:name w:val="Normal"/>
     <w:qFormat/>
-    <w:rsid w:val="006E7127"/>
+    <w:rsid w:val="008402C1"/>
   </w:style>
   <w:style w:type="paragraph" w:styleId="Heading2">
     <w:name w:val="heading 2"/>
@@ -19563,7 +21461,7 @@
 </file>
 
 <file path=customXml/itemProps1.xml><?xml version="1.0" encoding="utf-8"?>
-<ds:datastoreItem xmlns:ds="http://schemas.openxmlformats.org/officeDocument/2006/customXml" ds:itemID="{E806F360-9C4D-4D27-A2D9-914C83ED22E7}">
+<ds:datastoreItem xmlns:ds="http://schemas.openxmlformats.org/officeDocument/2006/customXml" ds:itemID="{C4F1C612-1C4D-447E-8E08-ABEBFA782B1B}">
   <ds:schemaRefs>
     <ds:schemaRef ds:uri="http://schemas.openxmlformats.org/officeDocument/2006/bibliography"/>
   </ds:schemaRefs>

</xml_diff>

<commit_message>
RunGuard stabilization, run-state store refinements, and gitignore cleanup
</commit_message>
<xml_diff>
--- a/docs/01_Daily_Log.docx
+++ b/docs/01_Daily_Log.docx
@@ -10300,7 +10300,7 @@
         <w:pStyle w:val="NormalWeb"/>
         <w:numPr>
           <w:ilvl w:val="0"/>
-          <w:numId w:val="53"/>
+          <w:numId w:val="50"/>
         </w:numPr>
       </w:pPr>
       <w:r>
@@ -10339,7 +10339,7 @@
         <w:pStyle w:val="NormalWeb"/>
         <w:numPr>
           <w:ilvl w:val="0"/>
-          <w:numId w:val="53"/>
+          <w:numId w:val="50"/>
         </w:numPr>
       </w:pPr>
       <w:r>
@@ -10360,7 +10360,7 @@
         <w:pStyle w:val="NormalWeb"/>
         <w:numPr>
           <w:ilvl w:val="0"/>
-          <w:numId w:val="53"/>
+          <w:numId w:val="50"/>
         </w:numPr>
       </w:pPr>
       <w:r>
@@ -10372,7 +10372,7 @@
         <w:pStyle w:val="NormalWeb"/>
         <w:numPr>
           <w:ilvl w:val="0"/>
-          <w:numId w:val="53"/>
+          <w:numId w:val="50"/>
         </w:numPr>
       </w:pPr>
       <w:r>
@@ -10393,7 +10393,7 @@
         <w:pStyle w:val="NormalWeb"/>
         <w:numPr>
           <w:ilvl w:val="0"/>
-          <w:numId w:val="53"/>
+          <w:numId w:val="50"/>
         </w:numPr>
       </w:pPr>
       <w:r>
@@ -10405,7 +10405,7 @@
         <w:pStyle w:val="NormalWeb"/>
         <w:numPr>
           <w:ilvl w:val="0"/>
-          <w:numId w:val="53"/>
+          <w:numId w:val="50"/>
         </w:numPr>
       </w:pPr>
       <w:r>
@@ -10417,7 +10417,7 @@
         <w:pStyle w:val="NormalWeb"/>
         <w:numPr>
           <w:ilvl w:val="0"/>
-          <w:numId w:val="53"/>
+          <w:numId w:val="50"/>
         </w:numPr>
       </w:pPr>
       <w:r>
@@ -10440,7 +10440,7 @@
         <w:pStyle w:val="NormalWeb"/>
         <w:numPr>
           <w:ilvl w:val="0"/>
-          <w:numId w:val="54"/>
+          <w:numId w:val="51"/>
         </w:numPr>
       </w:pPr>
       <w:r>
@@ -10452,7 +10452,7 @@
         <w:pStyle w:val="NormalWeb"/>
         <w:numPr>
           <w:ilvl w:val="0"/>
-          <w:numId w:val="54"/>
+          <w:numId w:val="51"/>
         </w:numPr>
       </w:pPr>
       <w:r>
@@ -10464,7 +10464,7 @@
         <w:pStyle w:val="NormalWeb"/>
         <w:numPr>
           <w:ilvl w:val="0"/>
-          <w:numId w:val="54"/>
+          <w:numId w:val="51"/>
         </w:numPr>
       </w:pPr>
       <w:r>
@@ -10487,7 +10487,7 @@
         <w:pStyle w:val="NormalWeb"/>
         <w:numPr>
           <w:ilvl w:val="0"/>
-          <w:numId w:val="55"/>
+          <w:numId w:val="52"/>
         </w:numPr>
       </w:pPr>
       <w:r>
@@ -10721,7 +10721,7 @@
       <w:pPr>
         <w:numPr>
           <w:ilvl w:val="0"/>
-          <w:numId w:val="56"/>
+          <w:numId w:val="53"/>
         </w:numPr>
         <w:spacing w:before="100" w:beforeAutospacing="1" w:after="100" w:afterAutospacing="1" w:line="240" w:lineRule="auto"/>
         <w:rPr>
@@ -10797,7 +10797,7 @@
       <w:pPr>
         <w:numPr>
           <w:ilvl w:val="0"/>
-          <w:numId w:val="56"/>
+          <w:numId w:val="53"/>
         </w:numPr>
         <w:spacing w:before="100" w:beforeAutospacing="1" w:after="100" w:afterAutospacing="1" w:line="240" w:lineRule="auto"/>
         <w:rPr>
@@ -10837,7 +10837,7 @@
       <w:pPr>
         <w:numPr>
           <w:ilvl w:val="0"/>
-          <w:numId w:val="56"/>
+          <w:numId w:val="53"/>
         </w:numPr>
         <w:spacing w:before="100" w:beforeAutospacing="1" w:after="100" w:afterAutospacing="1" w:line="240" w:lineRule="auto"/>
         <w:rPr>
@@ -10877,7 +10877,7 @@
       <w:pPr>
         <w:numPr>
           <w:ilvl w:val="0"/>
-          <w:numId w:val="56"/>
+          <w:numId w:val="53"/>
         </w:numPr>
         <w:spacing w:before="100" w:beforeAutospacing="1" w:after="100" w:afterAutospacing="1" w:line="240" w:lineRule="auto"/>
         <w:rPr>
@@ -10917,7 +10917,7 @@
       <w:pPr>
         <w:numPr>
           <w:ilvl w:val="0"/>
-          <w:numId w:val="56"/>
+          <w:numId w:val="53"/>
         </w:numPr>
         <w:spacing w:before="100" w:beforeAutospacing="1" w:after="100" w:afterAutospacing="1" w:line="240" w:lineRule="auto"/>
         <w:rPr>
@@ -10977,7 +10977,7 @@
       <w:pPr>
         <w:numPr>
           <w:ilvl w:val="0"/>
-          <w:numId w:val="57"/>
+          <w:numId w:val="54"/>
         </w:numPr>
         <w:spacing w:before="100" w:beforeAutospacing="1" w:after="100" w:afterAutospacing="1" w:line="240" w:lineRule="auto"/>
         <w:rPr>
@@ -10999,7 +10999,7 @@
       <w:pPr>
         <w:numPr>
           <w:ilvl w:val="0"/>
-          <w:numId w:val="57"/>
+          <w:numId w:val="54"/>
         </w:numPr>
         <w:spacing w:before="100" w:beforeAutospacing="1" w:after="100" w:afterAutospacing="1" w:line="240" w:lineRule="auto"/>
         <w:rPr>
@@ -11041,7 +11041,7 @@
       <w:pPr>
         <w:numPr>
           <w:ilvl w:val="0"/>
-          <w:numId w:val="58"/>
+          <w:numId w:val="55"/>
         </w:numPr>
         <w:spacing w:before="100" w:beforeAutospacing="1" w:after="100" w:afterAutospacing="1" w:line="240" w:lineRule="auto"/>
         <w:rPr>
@@ -11307,7 +11307,7 @@
         <w:pStyle w:val="NormalWeb"/>
         <w:numPr>
           <w:ilvl w:val="0"/>
-          <w:numId w:val="59"/>
+          <w:numId w:val="56"/>
         </w:numPr>
       </w:pPr>
       <w:r>
@@ -11317,39 +11317,79 @@
         <w:rPr>
           <w:rStyle w:val="Strong"/>
         </w:rPr>
-        <w:t xml:space="preserve">energy meter readings (kWh and </w:t>
-      </w:r>
-      <w:proofErr w:type="spellStart"/>
+        <w:t>energy meter readings (kWh and kVAh)</w:t>
+      </w:r>
+      <w:r>
+        <w:t xml:space="preserve"> for machines in both </w:t>
+      </w:r>
       <w:r>
         <w:rPr>
           <w:rStyle w:val="Strong"/>
         </w:rPr>
-        <w:t>kVAh</w:t>
-      </w:r>
-      <w:proofErr w:type="spellEnd"/>
+        <w:t>Driveline</w:t>
+      </w:r>
+      <w:r>
+        <w:t xml:space="preserve"> and </w:t>
+      </w:r>
       <w:r>
         <w:rPr>
           <w:rStyle w:val="Strong"/>
         </w:rPr>
-        <w:t>)</w:t>
-      </w:r>
-      <w:r>
-        <w:t xml:space="preserve"> for machines in both </w:t>
+        <w:t>SMT buildings</w:t>
+      </w:r>
+      <w:r>
+        <w:t>.</w:t>
+      </w:r>
+    </w:p>
+    <w:p>
+      <w:pPr>
+        <w:pStyle w:val="NormalWeb"/>
+        <w:numPr>
+          <w:ilvl w:val="0"/>
+          <w:numId w:val="56"/>
+        </w:numPr>
+      </w:pPr>
+      <w:r>
+        <w:t xml:space="preserve">Updated the </w:t>
       </w:r>
       <w:r>
         <w:rPr>
           <w:rStyle w:val="Strong"/>
         </w:rPr>
-        <w:t>Driveline</w:t>
-      </w:r>
-      <w:r>
-        <w:t xml:space="preserve"> and </w:t>
+        <w:t>power cost analysis sheets</w:t>
+      </w:r>
+      <w:r>
+        <w:t xml:space="preserve"> based on the recorded energy consumption data.</w:t>
+      </w:r>
+    </w:p>
+    <w:p>
+      <w:pPr>
+        <w:pStyle w:val="NormalWeb"/>
+        <w:numPr>
+          <w:ilvl w:val="0"/>
+          <w:numId w:val="56"/>
+        </w:numPr>
+      </w:pPr>
+      <w:r>
+        <w:t>Re-checked the overall system status, including frontend and desktop application stability.</w:t>
+      </w:r>
+    </w:p>
+    <w:p>
+      <w:pPr>
+        <w:pStyle w:val="NormalWeb"/>
+        <w:numPr>
+          <w:ilvl w:val="0"/>
+          <w:numId w:val="56"/>
+        </w:numPr>
+      </w:pPr>
+      <w:r>
+        <w:t xml:space="preserve">Reviewed the complete project structure and finalized the </w:t>
       </w:r>
       <w:r>
         <w:rPr>
           <w:rStyle w:val="Strong"/>
         </w:rPr>
-        <w:t>SMT buildings</w:t>
+        <w:t>project overview</w:t>
       </w:r>
       <w:r>
         <w:t>.</w:t>
@@ -11360,20 +11400,20 @@
         <w:pStyle w:val="NormalWeb"/>
         <w:numPr>
           <w:ilvl w:val="0"/>
-          <w:numId w:val="59"/>
-        </w:numPr>
-      </w:pPr>
-      <w:r>
-        <w:t xml:space="preserve">Updated the </w:t>
+          <w:numId w:val="56"/>
+        </w:numPr>
+      </w:pPr>
+      <w:r>
+        <w:t xml:space="preserve">Finalized the </w:t>
       </w:r>
       <w:r>
         <w:rPr>
           <w:rStyle w:val="Strong"/>
         </w:rPr>
-        <w:t>power cost analysis sheets</w:t>
-      </w:r>
-      <w:r>
-        <w:t xml:space="preserve"> based on the recorded energy consumption data.</w:t>
+        <w:t>backend layer architecture</w:t>
+      </w:r>
+      <w:r>
+        <w:t>, ensuring readiness for implementation.</w:t>
       </w:r>
     </w:p>
     <w:p>
@@ -11381,32 +11421,31 @@
         <w:pStyle w:val="NormalWeb"/>
         <w:numPr>
           <w:ilvl w:val="0"/>
-          <w:numId w:val="59"/>
-        </w:numPr>
-      </w:pPr>
-      <w:r>
-        <w:t>Re-checked the overall system status, including frontend and desktop application stability.</w:t>
+          <w:numId w:val="56"/>
+        </w:numPr>
+      </w:pPr>
+      <w:r>
+        <w:t xml:space="preserve">Confirmed that the frontend portion of the project is approximately </w:t>
+      </w:r>
+      <w:r>
+        <w:rPr>
+          <w:rStyle w:val="Strong"/>
+        </w:rPr>
+        <w:t>90–95% complete</w:t>
+      </w:r>
+      <w:r>
+        <w:t>.</w:t>
       </w:r>
     </w:p>
     <w:p>
       <w:pPr>
         <w:pStyle w:val="NormalWeb"/>
-        <w:numPr>
-          <w:ilvl w:val="0"/>
-          <w:numId w:val="59"/>
-        </w:numPr>
-      </w:pPr>
-      <w:r>
-        <w:t xml:space="preserve">Reviewed the complete project structure and finalized the </w:t>
-      </w:r>
+      </w:pPr>
       <w:r>
         <w:rPr>
           <w:rStyle w:val="Strong"/>
         </w:rPr>
-        <w:t>project overview</w:t>
-      </w:r>
-      <w:r>
-        <w:t>.</w:t>
+        <w:t>Outcome:</w:t>
       </w:r>
     </w:p>
     <w:p>
@@ -11414,20 +11453,34 @@
         <w:pStyle w:val="NormalWeb"/>
         <w:numPr>
           <w:ilvl w:val="0"/>
-          <w:numId w:val="59"/>
-        </w:numPr>
-      </w:pPr>
-      <w:r>
-        <w:t xml:space="preserve">Finalized the </w:t>
-      </w:r>
+          <w:numId w:val="57"/>
+        </w:numPr>
+      </w:pPr>
+      <w:r>
+        <w:t>Energy monitoring and power cost documentation completed successfully.</w:t>
+      </w:r>
+    </w:p>
+    <w:p>
+      <w:pPr>
+        <w:pStyle w:val="NormalWeb"/>
+        <w:numPr>
+          <w:ilvl w:val="0"/>
+          <w:numId w:val="57"/>
+        </w:numPr>
+      </w:pPr>
+      <w:r>
+        <w:t>Backend architecture finalized and aligned with system objectives.</w:t>
+      </w:r>
+    </w:p>
+    <w:p>
+      <w:pPr>
+        <w:pStyle w:val="NormalWeb"/>
+      </w:pPr>
       <w:r>
         <w:rPr>
           <w:rStyle w:val="Strong"/>
         </w:rPr>
-        <w:t>backend layer architecture</w:t>
-      </w:r>
-      <w:r>
-        <w:t>, ensuring readiness for implementation.</w:t>
+        <w:t>Remarks:</w:t>
       </w:r>
     </w:p>
     <w:p>
@@ -11435,74 +11488,7 @@
         <w:pStyle w:val="NormalWeb"/>
         <w:numPr>
           <w:ilvl w:val="0"/>
-          <w:numId w:val="59"/>
-        </w:numPr>
-      </w:pPr>
-      <w:r>
-        <w:t xml:space="preserve">Confirmed that the frontend portion of the project is approximately </w:t>
-      </w:r>
-      <w:r>
-        <w:rPr>
-          <w:rStyle w:val="Strong"/>
-        </w:rPr>
-        <w:t>90–95% complete</w:t>
-      </w:r>
-      <w:r>
-        <w:t>.</w:t>
-      </w:r>
-    </w:p>
-    <w:p>
-      <w:pPr>
-        <w:pStyle w:val="NormalWeb"/>
-      </w:pPr>
-      <w:r>
-        <w:rPr>
-          <w:rStyle w:val="Strong"/>
-        </w:rPr>
-        <w:t>Outcome:</w:t>
-      </w:r>
-    </w:p>
-    <w:p>
-      <w:pPr>
-        <w:pStyle w:val="NormalWeb"/>
-        <w:numPr>
-          <w:ilvl w:val="0"/>
-          <w:numId w:val="60"/>
-        </w:numPr>
-      </w:pPr>
-      <w:r>
-        <w:t>Energy monitoring and power cost documentation completed successfully.</w:t>
-      </w:r>
-    </w:p>
-    <w:p>
-      <w:pPr>
-        <w:pStyle w:val="NormalWeb"/>
-        <w:numPr>
-          <w:ilvl w:val="0"/>
-          <w:numId w:val="60"/>
-        </w:numPr>
-      </w:pPr>
-      <w:r>
-        <w:t>Backend architecture finalized and aligned with system objectives.</w:t>
-      </w:r>
-    </w:p>
-    <w:p>
-      <w:pPr>
-        <w:pStyle w:val="NormalWeb"/>
-      </w:pPr>
-      <w:r>
-        <w:rPr>
-          <w:rStyle w:val="Strong"/>
-        </w:rPr>
-        <w:t>Remarks:</w:t>
-      </w:r>
-    </w:p>
-    <w:p>
-      <w:pPr>
-        <w:pStyle w:val="NormalWeb"/>
-        <w:numPr>
-          <w:ilvl w:val="0"/>
-          <w:numId w:val="61"/>
+          <w:numId w:val="58"/>
         </w:numPr>
       </w:pPr>
       <w:r>
@@ -11520,12 +11506,1251 @@
           <w:szCs w:val="24"/>
         </w:rPr>
       </w:pPr>
+    </w:p>
+    <w:p>
+      <w:pPr>
+        <w:spacing w:before="100" w:beforeAutospacing="1" w:after="100" w:afterAutospacing="1" w:line="240" w:lineRule="auto"/>
+        <w:outlineLvl w:val="1"/>
+        <w:rPr>
+          <w:rFonts w:ascii="Times New Roman" w:eastAsia="Times New Roman" w:hAnsi="Times New Roman" w:cs="Times New Roman"/>
+          <w:b/>
+          <w:sz w:val="24"/>
+          <w:szCs w:val="24"/>
+        </w:rPr>
+      </w:pPr>
+    </w:p>
+    <w:p>
+      <w:pPr>
+        <w:pStyle w:val="Heading3"/>
+        <w:spacing w:before="0" w:beforeAutospacing="0" w:after="0" w:afterAutospacing="0"/>
+        <w:rPr>
+          <w:b w:val="0"/>
+          <w:sz w:val="24"/>
+          <w:szCs w:val="24"/>
+        </w:rPr>
+      </w:pPr>
+    </w:p>
+    <w:p>
+      <w:pPr>
+        <w:pStyle w:val="Heading3"/>
+        <w:spacing w:before="0" w:beforeAutospacing="0" w:after="0" w:afterAutospacing="0"/>
+        <w:rPr>
+          <w:b w:val="0"/>
+          <w:sz w:val="24"/>
+          <w:szCs w:val="24"/>
+        </w:rPr>
+      </w:pPr>
+    </w:p>
+    <w:p>
+      <w:pPr>
+        <w:pStyle w:val="Heading3"/>
+        <w:spacing w:before="0" w:beforeAutospacing="0" w:after="0" w:afterAutospacing="0"/>
+        <w:rPr>
+          <w:b w:val="0"/>
+          <w:sz w:val="24"/>
+          <w:szCs w:val="24"/>
+        </w:rPr>
+      </w:pPr>
+    </w:p>
+    <w:p>
+      <w:pPr>
+        <w:pStyle w:val="Heading3"/>
+        <w:spacing w:before="0" w:beforeAutospacing="0" w:after="0" w:afterAutospacing="0"/>
+        <w:rPr>
+          <w:b w:val="0"/>
+          <w:sz w:val="24"/>
+          <w:szCs w:val="24"/>
+        </w:rPr>
+      </w:pPr>
+    </w:p>
+    <w:p>
+      <w:pPr>
+        <w:pStyle w:val="Heading3"/>
+        <w:spacing w:before="0" w:beforeAutospacing="0" w:after="0" w:afterAutospacing="0"/>
+        <w:rPr>
+          <w:b w:val="0"/>
+          <w:sz w:val="24"/>
+          <w:szCs w:val="24"/>
+        </w:rPr>
+      </w:pPr>
+    </w:p>
+    <w:p>
+      <w:pPr>
+        <w:pStyle w:val="Heading3"/>
+        <w:spacing w:before="0" w:beforeAutospacing="0" w:after="0" w:afterAutospacing="0"/>
+        <w:rPr>
+          <w:b w:val="0"/>
+          <w:sz w:val="24"/>
+          <w:szCs w:val="24"/>
+        </w:rPr>
+      </w:pPr>
+    </w:p>
+    <w:p>
+      <w:pPr>
+        <w:pStyle w:val="Heading3"/>
+        <w:spacing w:before="0" w:beforeAutospacing="0" w:after="0" w:afterAutospacing="0"/>
+        <w:rPr>
+          <w:b w:val="0"/>
+          <w:sz w:val="24"/>
+          <w:szCs w:val="24"/>
+        </w:rPr>
+      </w:pPr>
+    </w:p>
+    <w:p>
+      <w:pPr>
+        <w:pStyle w:val="Heading3"/>
+        <w:spacing w:before="0" w:beforeAutospacing="0" w:after="0" w:afterAutospacing="0"/>
+        <w:rPr>
+          <w:b w:val="0"/>
+          <w:sz w:val="24"/>
+          <w:szCs w:val="24"/>
+        </w:rPr>
+      </w:pPr>
+    </w:p>
+    <w:p>
+      <w:pPr>
+        <w:pStyle w:val="Heading3"/>
+        <w:spacing w:before="0" w:beforeAutospacing="0" w:after="0" w:afterAutospacing="0"/>
+        <w:rPr>
+          <w:b w:val="0"/>
+          <w:sz w:val="24"/>
+          <w:szCs w:val="24"/>
+        </w:rPr>
+      </w:pPr>
+    </w:p>
+    <w:p>
+      <w:pPr>
+        <w:spacing w:after="0" w:line="240" w:lineRule="auto"/>
+        <w:outlineLvl w:val="1"/>
+        <w:rPr>
+          <w:rFonts w:ascii="Times New Roman" w:eastAsia="Times New Roman" w:hAnsi="Times New Roman" w:cs="Times New Roman"/>
+          <w:b/>
+          <w:sz w:val="24"/>
+          <w:szCs w:val="24"/>
+        </w:rPr>
+      </w:pPr>
+      <w:r>
+        <w:rPr>
+          <w:rFonts w:ascii="Times New Roman" w:eastAsia="Times New Roman" w:hAnsi="Times New Roman" w:cs="Times New Roman"/>
+          <w:b/>
+          <w:bCs/>
+          <w:sz w:val="24"/>
+          <w:szCs w:val="24"/>
+        </w:rPr>
+        <w:lastRenderedPageBreak/>
+        <w:t>Date:</w:t>
+      </w:r>
+      <w:r>
+        <w:rPr>
+          <w:rFonts w:ascii="Times New Roman" w:eastAsia="Times New Roman" w:hAnsi="Times New Roman" w:cs="Times New Roman"/>
+          <w:b/>
+          <w:sz w:val="24"/>
+          <w:szCs w:val="24"/>
+        </w:rPr>
+        <w:t xml:space="preserve"> 09/02/2026                                                                                                              Day 24</w:t>
+      </w:r>
+      <w:r>
+        <w:rPr>
+          <w:rFonts w:ascii="Times New Roman" w:eastAsia="Times New Roman" w:hAnsi="Times New Roman" w:cs="Times New Roman"/>
+          <w:b/>
+          <w:sz w:val="24"/>
+          <w:szCs w:val="24"/>
+        </w:rPr>
+        <w:br/>
+      </w:r>
+      <w:r>
+        <w:rPr>
+          <w:rFonts w:ascii="Times New Roman" w:eastAsia="Times New Roman" w:hAnsi="Times New Roman" w:cs="Times New Roman"/>
+          <w:b/>
+          <w:bCs/>
+          <w:sz w:val="24"/>
+          <w:szCs w:val="24"/>
+        </w:rPr>
+        <w:t>Department:</w:t>
+      </w:r>
+      <w:r>
+        <w:rPr>
+          <w:rFonts w:ascii="Times New Roman" w:eastAsia="Times New Roman" w:hAnsi="Times New Roman" w:cs="Times New Roman"/>
+          <w:b/>
+          <w:sz w:val="24"/>
+          <w:szCs w:val="24"/>
+        </w:rPr>
+        <w:t xml:space="preserve"> Maintenance</w:t>
+      </w:r>
+      <w:r>
+        <w:rPr>
+          <w:rFonts w:ascii="Times New Roman" w:eastAsia="Times New Roman" w:hAnsi="Times New Roman" w:cs="Times New Roman"/>
+          <w:b/>
+          <w:sz w:val="24"/>
+          <w:szCs w:val="24"/>
+        </w:rPr>
+        <w:br/>
+      </w:r>
+      <w:r>
+        <w:rPr>
+          <w:rFonts w:ascii="Times New Roman" w:eastAsia="Times New Roman" w:hAnsi="Times New Roman" w:cs="Times New Roman"/>
+          <w:b/>
+          <w:bCs/>
+          <w:sz w:val="24"/>
+          <w:szCs w:val="24"/>
+        </w:rPr>
+        <w:t>Plant:</w:t>
+      </w:r>
+      <w:r>
+        <w:rPr>
+          <w:rFonts w:ascii="Times New Roman" w:eastAsia="Times New Roman" w:hAnsi="Times New Roman" w:cs="Times New Roman"/>
+          <w:b/>
+          <w:sz w:val="24"/>
+          <w:szCs w:val="24"/>
+        </w:rPr>
+        <w:t xml:space="preserve"> Drive Shaft Manufacturing</w:t>
+      </w:r>
+    </w:p>
+    <w:p>
+      <w:pPr>
+        <w:spacing w:after="0" w:line="240" w:lineRule="auto"/>
+        <w:outlineLvl w:val="1"/>
+        <w:rPr>
+          <w:rFonts w:ascii="Times New Roman" w:eastAsia="Times New Roman" w:hAnsi="Times New Roman" w:cs="Times New Roman"/>
+          <w:b/>
+          <w:sz w:val="24"/>
+          <w:szCs w:val="24"/>
+        </w:rPr>
+      </w:pPr>
+      <w:r>
+        <w:rPr>
+          <w:rFonts w:ascii="Times New Roman" w:eastAsia="Times New Roman" w:hAnsi="Times New Roman" w:cs="Times New Roman"/>
+          <w:b/>
+          <w:sz w:val="24"/>
+          <w:szCs w:val="24"/>
+        </w:rPr>
+        <w:t>Shift: Second Shift</w:t>
+      </w:r>
+    </w:p>
+    <w:p>
+      <w:pPr>
+        <w:spacing w:after="0" w:line="240" w:lineRule="auto"/>
+        <w:outlineLvl w:val="1"/>
+        <w:rPr>
+          <w:rFonts w:ascii="Times New Roman" w:eastAsia="Times New Roman" w:hAnsi="Times New Roman" w:cs="Times New Roman"/>
+          <w:b/>
+          <w:sz w:val="24"/>
+          <w:szCs w:val="24"/>
+        </w:rPr>
+      </w:pPr>
+    </w:p>
+    <w:p>
+      <w:pPr>
+        <w:spacing w:before="100" w:beforeAutospacing="1" w:after="100" w:afterAutospacing="1" w:line="240" w:lineRule="auto"/>
+        <w:rPr>
+          <w:rFonts w:ascii="Times New Roman" w:eastAsia="Times New Roman" w:hAnsi="Times New Roman" w:cs="Times New Roman"/>
+          <w:sz w:val="24"/>
+          <w:szCs w:val="24"/>
+        </w:rPr>
+      </w:pPr>
+      <w:r>
+        <w:rPr>
+          <w:rFonts w:ascii="Times New Roman" w:eastAsia="Times New Roman" w:hAnsi="Times New Roman" w:cs="Times New Roman"/>
+          <w:b/>
+          <w:sz w:val="24"/>
+          <w:szCs w:val="24"/>
+        </w:rPr>
+        <w:t>Objective for the Day</w:t>
+      </w:r>
+      <w:r>
+        <w:rPr>
+          <w:rFonts w:ascii="Times New Roman" w:eastAsia="Times New Roman" w:hAnsi="Times New Roman" w:cs="Times New Roman"/>
+          <w:sz w:val="24"/>
+          <w:szCs w:val="24"/>
+        </w:rPr>
+        <w:br/>
+        <w:t>• Perform daily energy meter readings and update power cost sheets</w:t>
+      </w:r>
+      <w:r>
+        <w:rPr>
+          <w:rFonts w:ascii="Times New Roman" w:eastAsia="Times New Roman" w:hAnsi="Times New Roman" w:cs="Times New Roman"/>
+          <w:sz w:val="24"/>
+          <w:szCs w:val="24"/>
+        </w:rPr>
+        <w:br/>
+        <w:t>• Review and finalize backend architecture of the Offline Industrial Data Intelligence System</w:t>
+      </w:r>
+      <w:r>
+        <w:rPr>
+          <w:rFonts w:ascii="Times New Roman" w:eastAsia="Times New Roman" w:hAnsi="Times New Roman" w:cs="Times New Roman"/>
+          <w:sz w:val="24"/>
+          <w:szCs w:val="24"/>
+        </w:rPr>
+        <w:br/>
+        <w:t>• Improve desktop application stability and database connectivity</w:t>
+      </w:r>
+    </w:p>
+    <w:p>
+      <w:pPr>
+        <w:spacing w:before="100" w:beforeAutospacing="1" w:after="100" w:afterAutospacing="1" w:line="240" w:lineRule="auto"/>
+        <w:rPr>
+          <w:rFonts w:ascii="Times New Roman" w:eastAsia="Times New Roman" w:hAnsi="Times New Roman" w:cs="Times New Roman"/>
+          <w:sz w:val="24"/>
+          <w:szCs w:val="24"/>
+        </w:rPr>
+      </w:pPr>
+      <w:r>
+        <w:rPr>
+          <w:rFonts w:ascii="Times New Roman" w:eastAsia="Times New Roman" w:hAnsi="Times New Roman" w:cs="Times New Roman"/>
+          <w:b/>
+          <w:sz w:val="24"/>
+          <w:szCs w:val="24"/>
+        </w:rPr>
+        <w:t>Activities Performed</w:t>
+      </w:r>
+      <w:r>
+        <w:rPr>
+          <w:rFonts w:ascii="Times New Roman" w:eastAsia="Times New Roman" w:hAnsi="Times New Roman" w:cs="Times New Roman"/>
+          <w:sz w:val="24"/>
+          <w:szCs w:val="24"/>
+        </w:rPr>
+        <w:br/>
+        <w:t>• Entered daily energy meter readings (kWh and kVAh) for:</w:t>
+      </w:r>
+      <w:r>
+        <w:rPr>
+          <w:rFonts w:ascii="Times New Roman" w:eastAsia="Times New Roman" w:hAnsi="Times New Roman" w:cs="Times New Roman"/>
+          <w:sz w:val="24"/>
+          <w:szCs w:val="24"/>
+        </w:rPr>
+        <w:br/>
+        <w:t>o Driveline Building</w:t>
+      </w:r>
+      <w:r>
+        <w:rPr>
+          <w:rFonts w:ascii="Times New Roman" w:eastAsia="Times New Roman" w:hAnsi="Times New Roman" w:cs="Times New Roman"/>
+          <w:sz w:val="24"/>
+          <w:szCs w:val="24"/>
+        </w:rPr>
+        <w:br/>
+        <w:t>o SMT Building</w:t>
+      </w:r>
+      <w:r>
+        <w:rPr>
+          <w:rFonts w:ascii="Times New Roman" w:eastAsia="Times New Roman" w:hAnsi="Times New Roman" w:cs="Times New Roman"/>
+          <w:sz w:val="24"/>
+          <w:szCs w:val="24"/>
+        </w:rPr>
+        <w:br/>
+        <w:t>• Updated power cost analysis sheets based on recorded readings</w:t>
+      </w:r>
+      <w:r>
+        <w:rPr>
+          <w:rFonts w:ascii="Times New Roman" w:eastAsia="Times New Roman" w:hAnsi="Times New Roman" w:cs="Times New Roman"/>
+          <w:sz w:val="24"/>
+          <w:szCs w:val="24"/>
+        </w:rPr>
+        <w:br/>
+        <w:t>• Reviewed overall system architecture and project folder structure</w:t>
+      </w:r>
+      <w:r>
+        <w:rPr>
+          <w:rFonts w:ascii="Times New Roman" w:eastAsia="Times New Roman" w:hAnsi="Times New Roman" w:cs="Times New Roman"/>
+          <w:sz w:val="24"/>
+          <w:szCs w:val="24"/>
+        </w:rPr>
+        <w:br/>
+        <w:t>• Finalized backend layer-wise architecture (Storage → Repository → IPC → Frontend Service → UI)</w:t>
+      </w:r>
+      <w:r>
+        <w:rPr>
+          <w:rFonts w:ascii="Times New Roman" w:eastAsia="Times New Roman" w:hAnsi="Times New Roman" w:cs="Times New Roman"/>
+          <w:sz w:val="24"/>
+          <w:szCs w:val="24"/>
+        </w:rPr>
+        <w:br/>
+        <w:t>• Improved desktop application frontend stability</w:t>
+      </w:r>
+      <w:r>
+        <w:rPr>
+          <w:rFonts w:ascii="Times New Roman" w:eastAsia="Times New Roman" w:hAnsi="Times New Roman" w:cs="Times New Roman"/>
+          <w:sz w:val="24"/>
+          <w:szCs w:val="24"/>
+        </w:rPr>
+        <w:br/>
+        <w:t>• Integrated and debugged run selection search functionality</w:t>
+      </w:r>
+      <w:r>
+        <w:rPr>
+          <w:rFonts w:ascii="Times New Roman" w:eastAsia="Times New Roman" w:hAnsi="Times New Roman" w:cs="Times New Roman"/>
+          <w:sz w:val="24"/>
+          <w:szCs w:val="24"/>
+        </w:rPr>
+        <w:br/>
+        <w:t>• Verified that run data is fetched from offline DuckDB database via IPC layer</w:t>
+      </w:r>
+      <w:r>
+        <w:rPr>
+          <w:rFonts w:ascii="Times New Roman" w:eastAsia="Times New Roman" w:hAnsi="Times New Roman" w:cs="Times New Roman"/>
+          <w:sz w:val="24"/>
+          <w:szCs w:val="24"/>
+        </w:rPr>
+        <w:br/>
+        <w:t>• Refined frontend–backend communication</w:t>
+      </w:r>
+      <w:r>
+        <w:rPr>
+          <w:rFonts w:ascii="Times New Roman" w:eastAsia="Times New Roman" w:hAnsi="Times New Roman" w:cs="Times New Roman"/>
+          <w:sz w:val="24"/>
+          <w:szCs w:val="24"/>
+        </w:rPr>
+        <w:br/>
+        <w:t>• Committed and pushed latest stable changes to project repository</w:t>
+      </w:r>
+    </w:p>
+    <w:p>
+      <w:pPr>
+        <w:spacing w:before="100" w:beforeAutospacing="1" w:after="100" w:afterAutospacing="1" w:line="240" w:lineRule="auto"/>
+        <w:rPr>
+          <w:rFonts w:ascii="Times New Roman" w:eastAsia="Times New Roman" w:hAnsi="Times New Roman" w:cs="Times New Roman"/>
+          <w:sz w:val="24"/>
+          <w:szCs w:val="24"/>
+        </w:rPr>
+      </w:pPr>
+      <w:r>
+        <w:rPr>
+          <w:rFonts w:ascii="Times New Roman" w:eastAsia="Times New Roman" w:hAnsi="Times New Roman" w:cs="Times New Roman"/>
+          <w:b/>
+          <w:sz w:val="24"/>
+          <w:szCs w:val="24"/>
+        </w:rPr>
+        <w:t>Key Learnings</w:t>
+      </w:r>
+      <w:r>
+        <w:rPr>
+          <w:rFonts w:ascii="Times New Roman" w:eastAsia="Times New Roman" w:hAnsi="Times New Roman" w:cs="Times New Roman"/>
+          <w:sz w:val="24"/>
+          <w:szCs w:val="24"/>
+        </w:rPr>
+        <w:br/>
+        <w:t>• Clear backend layer separation improves system stability and maintainability</w:t>
+      </w:r>
+      <w:r>
+        <w:rPr>
+          <w:rFonts w:ascii="Times New Roman" w:eastAsia="Times New Roman" w:hAnsi="Times New Roman" w:cs="Times New Roman"/>
+          <w:sz w:val="24"/>
+          <w:szCs w:val="24"/>
+        </w:rPr>
+        <w:br/>
+        <w:t>• IPC layer is critical for secure and structured frontend–backend communication</w:t>
+      </w:r>
+      <w:r>
+        <w:rPr>
+          <w:rFonts w:ascii="Times New Roman" w:eastAsia="Times New Roman" w:hAnsi="Times New Roman" w:cs="Times New Roman"/>
+          <w:sz w:val="24"/>
+          <w:szCs w:val="24"/>
+        </w:rPr>
+        <w:br/>
+        <w:t>• Database-backed UI features require proper repository validation before frontend rendering</w:t>
+      </w:r>
+      <w:r>
+        <w:rPr>
+          <w:rFonts w:ascii="Times New Roman" w:eastAsia="Times New Roman" w:hAnsi="Times New Roman" w:cs="Times New Roman"/>
+          <w:sz w:val="24"/>
+          <w:szCs w:val="24"/>
+        </w:rPr>
+        <w:br/>
+        <w:t>• System stability improves significantly after structured architecture refinement</w:t>
+      </w:r>
+    </w:p>
+    <w:p>
+      <w:pPr>
+        <w:spacing w:before="100" w:beforeAutospacing="1" w:after="100" w:afterAutospacing="1" w:line="240" w:lineRule="auto"/>
+        <w:rPr>
+          <w:rFonts w:ascii="Times New Roman" w:eastAsia="Times New Roman" w:hAnsi="Times New Roman" w:cs="Times New Roman"/>
+          <w:sz w:val="24"/>
+          <w:szCs w:val="24"/>
+        </w:rPr>
+      </w:pPr>
+      <w:r>
+        <w:rPr>
+          <w:rFonts w:ascii="Times New Roman" w:eastAsia="Times New Roman" w:hAnsi="Times New Roman" w:cs="Times New Roman"/>
+          <w:b/>
+          <w:sz w:val="24"/>
+          <w:szCs w:val="24"/>
+        </w:rPr>
+        <w:t>Challenges / Open Points</w:t>
+      </w:r>
+      <w:r>
+        <w:rPr>
+          <w:rFonts w:ascii="Times New Roman" w:eastAsia="Times New Roman" w:hAnsi="Times New Roman" w:cs="Times New Roman"/>
+          <w:sz w:val="24"/>
+          <w:szCs w:val="24"/>
+        </w:rPr>
+        <w:br/>
+        <w:t>• Ingestion workflow still needs structured UI-driven implementation</w:t>
+      </w:r>
+      <w:r>
+        <w:rPr>
+          <w:rFonts w:ascii="Times New Roman" w:eastAsia="Times New Roman" w:hAnsi="Times New Roman" w:cs="Times New Roman"/>
+          <w:sz w:val="24"/>
+          <w:szCs w:val="24"/>
+        </w:rPr>
+        <w:br/>
+        <w:t>• Active run management logic needs enhancement</w:t>
+      </w:r>
+      <w:r>
+        <w:rPr>
+          <w:rFonts w:ascii="Times New Roman" w:eastAsia="Times New Roman" w:hAnsi="Times New Roman" w:cs="Times New Roman"/>
+          <w:sz w:val="24"/>
+          <w:szCs w:val="24"/>
+        </w:rPr>
+        <w:br/>
+        <w:t>• Analytics layer (KPI computation automation) yet to be fully implemented</w:t>
+      </w:r>
+    </w:p>
+    <w:p>
+      <w:pPr>
+        <w:spacing w:before="100" w:beforeAutospacing="1" w:after="100" w:afterAutospacing="1" w:line="240" w:lineRule="auto"/>
+        <w:rPr>
+          <w:rFonts w:ascii="Times New Roman" w:eastAsia="Times New Roman" w:hAnsi="Times New Roman" w:cs="Times New Roman"/>
+          <w:sz w:val="24"/>
+          <w:szCs w:val="24"/>
+        </w:rPr>
+      </w:pPr>
+      <w:r>
+        <w:rPr>
+          <w:rFonts w:ascii="Times New Roman" w:eastAsia="Times New Roman" w:hAnsi="Times New Roman" w:cs="Times New Roman"/>
+          <w:b/>
+          <w:sz w:val="24"/>
+          <w:szCs w:val="24"/>
+        </w:rPr>
+        <w:t>Next Steps</w:t>
+      </w:r>
+      <w:r>
+        <w:rPr>
+          <w:rFonts w:ascii="Times New Roman" w:eastAsia="Times New Roman" w:hAnsi="Times New Roman" w:cs="Times New Roman"/>
+          <w:sz w:val="24"/>
+          <w:szCs w:val="24"/>
+        </w:rPr>
+        <w:br/>
+        <w:t>• Complete ingestion workflow integration</w:t>
+      </w:r>
+      <w:r>
+        <w:rPr>
+          <w:rFonts w:ascii="Times New Roman" w:eastAsia="Times New Roman" w:hAnsi="Times New Roman" w:cs="Times New Roman"/>
+          <w:sz w:val="24"/>
+          <w:szCs w:val="24"/>
+        </w:rPr>
+        <w:br/>
+        <w:t>• Implement automated KPI computation logic</w:t>
+      </w:r>
+      <w:r>
+        <w:rPr>
+          <w:rFonts w:ascii="Times New Roman" w:eastAsia="Times New Roman" w:hAnsi="Times New Roman" w:cs="Times New Roman"/>
+          <w:sz w:val="24"/>
+          <w:szCs w:val="24"/>
+        </w:rPr>
+        <w:br/>
+        <w:t>• Strengthen dashboard generation logic</w:t>
+      </w:r>
+      <w:r>
+        <w:rPr>
+          <w:rFonts w:ascii="Times New Roman" w:eastAsia="Times New Roman" w:hAnsi="Times New Roman" w:cs="Times New Roman"/>
+          <w:sz w:val="24"/>
+          <w:szCs w:val="24"/>
+        </w:rPr>
+        <w:br/>
+        <w:t>• Improve data validation and error handling across layers</w:t>
+      </w:r>
+    </w:p>
+    <w:p>
+      <w:pPr>
+        <w:pStyle w:val="Heading3"/>
+        <w:spacing w:before="0" w:beforeAutospacing="0" w:after="0" w:afterAutospacing="0"/>
+        <w:rPr>
+          <w:b w:val="0"/>
+          <w:sz w:val="24"/>
+          <w:szCs w:val="24"/>
+        </w:rPr>
+      </w:pPr>
+    </w:p>
+    <w:p>
+      <w:pPr>
+        <w:pStyle w:val="Heading3"/>
+        <w:spacing w:before="0" w:beforeAutospacing="0" w:after="0" w:afterAutospacing="0"/>
+        <w:rPr>
+          <w:b w:val="0"/>
+          <w:sz w:val="24"/>
+          <w:szCs w:val="24"/>
+        </w:rPr>
+      </w:pPr>
+    </w:p>
+    <w:p>
+      <w:pPr>
+        <w:pStyle w:val="Heading3"/>
+        <w:spacing w:before="0" w:beforeAutospacing="0" w:after="0" w:afterAutospacing="0"/>
+        <w:rPr>
+          <w:b w:val="0"/>
+          <w:sz w:val="24"/>
+          <w:szCs w:val="24"/>
+        </w:rPr>
+      </w:pPr>
+    </w:p>
+    <w:p>
+      <w:pPr>
+        <w:pStyle w:val="Heading3"/>
+        <w:spacing w:before="0" w:beforeAutospacing="0" w:after="0" w:afterAutospacing="0"/>
+        <w:rPr>
+          <w:b w:val="0"/>
+          <w:sz w:val="24"/>
+          <w:szCs w:val="24"/>
+        </w:rPr>
+      </w:pPr>
+    </w:p>
+    <w:p>
+      <w:pPr>
+        <w:spacing w:after="0" w:line="240" w:lineRule="auto"/>
+        <w:outlineLvl w:val="1"/>
+        <w:rPr>
+          <w:rFonts w:ascii="Times New Roman" w:eastAsia="Times New Roman" w:hAnsi="Times New Roman" w:cs="Times New Roman"/>
+          <w:b/>
+          <w:sz w:val="24"/>
+          <w:szCs w:val="24"/>
+        </w:rPr>
+      </w:pPr>
+      <w:r>
+        <w:rPr>
+          <w:rFonts w:ascii="Times New Roman" w:eastAsia="Times New Roman" w:hAnsi="Times New Roman" w:cs="Times New Roman"/>
+          <w:b/>
+          <w:bCs/>
+          <w:sz w:val="24"/>
+          <w:szCs w:val="24"/>
+        </w:rPr>
+        <w:lastRenderedPageBreak/>
+        <w:t>Date:</w:t>
+      </w:r>
+      <w:r>
+        <w:rPr>
+          <w:rFonts w:ascii="Times New Roman" w:eastAsia="Times New Roman" w:hAnsi="Times New Roman" w:cs="Times New Roman"/>
+          <w:b/>
+          <w:sz w:val="24"/>
+          <w:szCs w:val="24"/>
+        </w:rPr>
+        <w:t xml:space="preserve"> 11</w:t>
+      </w:r>
+      <w:r>
+        <w:rPr>
+          <w:rFonts w:ascii="Times New Roman" w:eastAsia="Times New Roman" w:hAnsi="Times New Roman" w:cs="Times New Roman"/>
+          <w:b/>
+          <w:sz w:val="24"/>
+          <w:szCs w:val="24"/>
+        </w:rPr>
+        <w:t xml:space="preserve">/02/2026                                                                                    </w:t>
+      </w:r>
+      <w:r>
+        <w:rPr>
+          <w:rFonts w:ascii="Times New Roman" w:eastAsia="Times New Roman" w:hAnsi="Times New Roman" w:cs="Times New Roman"/>
+          <w:b/>
+          <w:sz w:val="24"/>
+          <w:szCs w:val="24"/>
+        </w:rPr>
+        <w:t xml:space="preserve">                          Day 25</w:t>
+      </w:r>
+      <w:r>
+        <w:rPr>
+          <w:rFonts w:ascii="Times New Roman" w:eastAsia="Times New Roman" w:hAnsi="Times New Roman" w:cs="Times New Roman"/>
+          <w:b/>
+          <w:sz w:val="24"/>
+          <w:szCs w:val="24"/>
+        </w:rPr>
+        <w:br/>
+      </w:r>
+      <w:r>
+        <w:rPr>
+          <w:rFonts w:ascii="Times New Roman" w:eastAsia="Times New Roman" w:hAnsi="Times New Roman" w:cs="Times New Roman"/>
+          <w:b/>
+          <w:bCs/>
+          <w:sz w:val="24"/>
+          <w:szCs w:val="24"/>
+        </w:rPr>
+        <w:t>Department:</w:t>
+      </w:r>
+      <w:r>
+        <w:rPr>
+          <w:rFonts w:ascii="Times New Roman" w:eastAsia="Times New Roman" w:hAnsi="Times New Roman" w:cs="Times New Roman"/>
+          <w:b/>
+          <w:sz w:val="24"/>
+          <w:szCs w:val="24"/>
+        </w:rPr>
+        <w:t xml:space="preserve"> Maintenance</w:t>
+      </w:r>
+      <w:r>
+        <w:rPr>
+          <w:rFonts w:ascii="Times New Roman" w:eastAsia="Times New Roman" w:hAnsi="Times New Roman" w:cs="Times New Roman"/>
+          <w:b/>
+          <w:sz w:val="24"/>
+          <w:szCs w:val="24"/>
+        </w:rPr>
+        <w:br/>
+      </w:r>
+      <w:r>
+        <w:rPr>
+          <w:rFonts w:ascii="Times New Roman" w:eastAsia="Times New Roman" w:hAnsi="Times New Roman" w:cs="Times New Roman"/>
+          <w:b/>
+          <w:bCs/>
+          <w:sz w:val="24"/>
+          <w:szCs w:val="24"/>
+        </w:rPr>
+        <w:t>Plant:</w:t>
+      </w:r>
+      <w:r>
+        <w:rPr>
+          <w:rFonts w:ascii="Times New Roman" w:eastAsia="Times New Roman" w:hAnsi="Times New Roman" w:cs="Times New Roman"/>
+          <w:b/>
+          <w:sz w:val="24"/>
+          <w:szCs w:val="24"/>
+        </w:rPr>
+        <w:t xml:space="preserve"> Drive Shaft Manufacturing</w:t>
+      </w:r>
+    </w:p>
+    <w:p>
+      <w:pPr>
+        <w:spacing w:after="0" w:line="240" w:lineRule="auto"/>
+        <w:outlineLvl w:val="1"/>
+        <w:rPr>
+          <w:rFonts w:ascii="Times New Roman" w:eastAsia="Times New Roman" w:hAnsi="Times New Roman" w:cs="Times New Roman"/>
+          <w:b/>
+          <w:sz w:val="24"/>
+          <w:szCs w:val="24"/>
+        </w:rPr>
+      </w:pPr>
+      <w:r>
+        <w:rPr>
+          <w:rFonts w:ascii="Times New Roman" w:eastAsia="Times New Roman" w:hAnsi="Times New Roman" w:cs="Times New Roman"/>
+          <w:b/>
+          <w:sz w:val="24"/>
+          <w:szCs w:val="24"/>
+        </w:rPr>
+        <w:t>Shift: Third</w:t>
+      </w:r>
+      <w:r>
+        <w:rPr>
+          <w:rFonts w:ascii="Times New Roman" w:eastAsia="Times New Roman" w:hAnsi="Times New Roman" w:cs="Times New Roman"/>
+          <w:b/>
+          <w:sz w:val="24"/>
+          <w:szCs w:val="24"/>
+        </w:rPr>
+        <w:t xml:space="preserve"> Shift</w:t>
+      </w:r>
+    </w:p>
+    <w:p>
+      <w:pPr>
+        <w:spacing w:after="0" w:line="240" w:lineRule="auto"/>
+        <w:outlineLvl w:val="1"/>
+        <w:rPr>
+          <w:rFonts w:ascii="Times New Roman" w:eastAsia="Times New Roman" w:hAnsi="Times New Roman" w:cs="Times New Roman"/>
+          <w:b/>
+          <w:sz w:val="24"/>
+          <w:szCs w:val="24"/>
+        </w:rPr>
+      </w:pPr>
+    </w:p>
+    <w:p>
+      <w:pPr>
+        <w:spacing w:after="0" w:line="240" w:lineRule="auto"/>
+        <w:outlineLvl w:val="1"/>
+        <w:rPr>
+          <w:rFonts w:ascii="Times New Roman" w:eastAsia="Times New Roman" w:hAnsi="Times New Roman" w:cs="Times New Roman"/>
+          <w:b/>
+          <w:sz w:val="24"/>
+          <w:szCs w:val="24"/>
+        </w:rPr>
+      </w:pPr>
+      <w:r>
+        <w:rPr>
+          <w:rFonts w:ascii="Times New Roman" w:eastAsia="Times New Roman" w:hAnsi="Times New Roman" w:cs="Times New Roman"/>
+          <w:b/>
+          <w:sz w:val="24"/>
+          <w:szCs w:val="24"/>
+        </w:rPr>
+        <w:t>Objective for the Day</w:t>
+      </w:r>
+    </w:p>
+    <w:p>
+      <w:pPr>
+        <w:pStyle w:val="ListParagraph"/>
+        <w:numPr>
+          <w:ilvl w:val="0"/>
+          <w:numId w:val="59"/>
+        </w:numPr>
+        <w:spacing w:after="0" w:line="240" w:lineRule="auto"/>
+        <w:outlineLvl w:val="1"/>
+        <w:rPr>
+          <w:rFonts w:ascii="Times New Roman" w:eastAsia="Times New Roman" w:hAnsi="Times New Roman" w:cs="Times New Roman"/>
+          <w:sz w:val="24"/>
+          <w:szCs w:val="24"/>
+        </w:rPr>
+      </w:pPr>
+      <w:r>
+        <w:rPr>
+          <w:rFonts w:ascii="Times New Roman" w:eastAsia="Times New Roman" w:hAnsi="Times New Roman" w:cs="Times New Roman"/>
+          <w:sz w:val="24"/>
+          <w:szCs w:val="24"/>
+        </w:rPr>
+        <w:t>Stabilize desktop application IPC communication</w:t>
+      </w:r>
+    </w:p>
+    <w:p>
+      <w:pPr>
+        <w:pStyle w:val="ListParagraph"/>
+        <w:numPr>
+          <w:ilvl w:val="0"/>
+          <w:numId w:val="59"/>
+        </w:numPr>
+        <w:spacing w:after="0" w:line="240" w:lineRule="auto"/>
+        <w:outlineLvl w:val="1"/>
+        <w:rPr>
+          <w:rFonts w:ascii="Times New Roman" w:eastAsia="Times New Roman" w:hAnsi="Times New Roman" w:cs="Times New Roman"/>
+          <w:sz w:val="24"/>
+          <w:szCs w:val="24"/>
+        </w:rPr>
+      </w:pPr>
+      <w:r>
+        <w:rPr>
+          <w:rFonts w:ascii="Times New Roman" w:eastAsia="Times New Roman" w:hAnsi="Times New Roman" w:cs="Times New Roman"/>
+          <w:sz w:val="24"/>
+          <w:szCs w:val="24"/>
+        </w:rPr>
+        <w:t>Finalize run lifecycle integration between UI and offline database</w:t>
+      </w:r>
+    </w:p>
+    <w:p>
+      <w:pPr>
+        <w:pStyle w:val="ListParagraph"/>
+        <w:numPr>
+          <w:ilvl w:val="0"/>
+          <w:numId w:val="59"/>
+        </w:numPr>
+        <w:spacing w:after="0" w:line="240" w:lineRule="auto"/>
+        <w:outlineLvl w:val="1"/>
+        <w:rPr>
+          <w:rFonts w:ascii="Times New Roman" w:eastAsia="Times New Roman" w:hAnsi="Times New Roman" w:cs="Times New Roman"/>
+          <w:sz w:val="24"/>
+          <w:szCs w:val="24"/>
+        </w:rPr>
+      </w:pPr>
+      <w:r>
+        <w:rPr>
+          <w:rFonts w:ascii="Times New Roman" w:eastAsia="Times New Roman" w:hAnsi="Times New Roman" w:cs="Times New Roman"/>
+          <w:sz w:val="24"/>
+          <w:szCs w:val="24"/>
+        </w:rPr>
+        <w:t>Ensure full offline operation of the analytical system</w:t>
+      </w:r>
+    </w:p>
+    <w:p>
+      <w:pPr>
+        <w:spacing w:after="0" w:line="240" w:lineRule="auto"/>
+        <w:outlineLvl w:val="1"/>
+        <w:rPr>
+          <w:rFonts w:ascii="Times New Roman" w:eastAsia="Times New Roman" w:hAnsi="Times New Roman" w:cs="Times New Roman"/>
+          <w:b/>
+          <w:sz w:val="24"/>
+          <w:szCs w:val="24"/>
+        </w:rPr>
+      </w:pPr>
+    </w:p>
+    <w:p>
+      <w:pPr>
+        <w:spacing w:after="0" w:line="240" w:lineRule="auto"/>
+        <w:outlineLvl w:val="1"/>
+        <w:rPr>
+          <w:rFonts w:ascii="Times New Roman" w:eastAsia="Times New Roman" w:hAnsi="Times New Roman" w:cs="Times New Roman"/>
+          <w:b/>
+          <w:sz w:val="24"/>
+          <w:szCs w:val="24"/>
+        </w:rPr>
+      </w:pPr>
+      <w:r>
+        <w:rPr>
+          <w:rFonts w:ascii="Times New Roman" w:eastAsia="Times New Roman" w:hAnsi="Times New Roman" w:cs="Times New Roman"/>
+          <w:b/>
+          <w:sz w:val="24"/>
+          <w:szCs w:val="24"/>
+        </w:rPr>
+        <w:t>Activities Performed</w:t>
+      </w:r>
+    </w:p>
+    <w:p>
+      <w:pPr>
+        <w:pStyle w:val="ListParagraph"/>
+        <w:numPr>
+          <w:ilvl w:val="0"/>
+          <w:numId w:val="60"/>
+        </w:numPr>
+        <w:spacing w:after="0" w:line="240" w:lineRule="auto"/>
+        <w:outlineLvl w:val="1"/>
+        <w:rPr>
+          <w:rFonts w:ascii="Times New Roman" w:eastAsia="Times New Roman" w:hAnsi="Times New Roman" w:cs="Times New Roman"/>
+          <w:sz w:val="24"/>
+          <w:szCs w:val="24"/>
+        </w:rPr>
+      </w:pPr>
+      <w:r>
+        <w:rPr>
+          <w:rFonts w:ascii="Times New Roman" w:eastAsia="Times New Roman" w:hAnsi="Times New Roman" w:cs="Times New Roman"/>
+          <w:sz w:val="24"/>
+          <w:szCs w:val="24"/>
+        </w:rPr>
+        <w:t>Verified existing run lifecycle functionality using repository-level test scripts</w:t>
+      </w:r>
+    </w:p>
+    <w:p>
+      <w:pPr>
+        <w:pStyle w:val="ListParagraph"/>
+        <w:numPr>
+          <w:ilvl w:val="0"/>
+          <w:numId w:val="60"/>
+        </w:numPr>
+        <w:spacing w:after="0" w:line="240" w:lineRule="auto"/>
+        <w:outlineLvl w:val="1"/>
+        <w:rPr>
+          <w:rFonts w:ascii="Times New Roman" w:eastAsia="Times New Roman" w:hAnsi="Times New Roman" w:cs="Times New Roman"/>
+          <w:sz w:val="24"/>
+          <w:szCs w:val="24"/>
+        </w:rPr>
+      </w:pPr>
+      <w:r>
+        <w:rPr>
+          <w:rFonts w:ascii="Times New Roman" w:eastAsia="Times New Roman" w:hAnsi="Times New Roman" w:cs="Times New Roman"/>
+          <w:sz w:val="24"/>
+          <w:szCs w:val="24"/>
+        </w:rPr>
+        <w:t>Debugged desktop Qt WebChannel bridge initialization timing issues</w:t>
+      </w:r>
+    </w:p>
+    <w:p>
+      <w:pPr>
+        <w:pStyle w:val="ListParagraph"/>
+        <w:numPr>
+          <w:ilvl w:val="0"/>
+          <w:numId w:val="60"/>
+        </w:numPr>
+        <w:spacing w:after="0" w:line="240" w:lineRule="auto"/>
+        <w:outlineLvl w:val="1"/>
+        <w:rPr>
+          <w:rFonts w:ascii="Times New Roman" w:eastAsia="Times New Roman" w:hAnsi="Times New Roman" w:cs="Times New Roman"/>
+          <w:sz w:val="24"/>
+          <w:szCs w:val="24"/>
+        </w:rPr>
+      </w:pPr>
+      <w:r>
+        <w:rPr>
+          <w:rFonts w:ascii="Times New Roman" w:eastAsia="Times New Roman" w:hAnsi="Times New Roman" w:cs="Times New Roman"/>
+          <w:sz w:val="24"/>
+          <w:szCs w:val="24"/>
+        </w:rPr>
+        <w:t>Refined frontend–backend communication to ensure proper IPC binding before API calls</w:t>
+      </w:r>
+    </w:p>
+    <w:p>
+      <w:pPr>
+        <w:pStyle w:val="ListParagraph"/>
+        <w:numPr>
+          <w:ilvl w:val="0"/>
+          <w:numId w:val="60"/>
+        </w:numPr>
+        <w:spacing w:after="0" w:line="240" w:lineRule="auto"/>
+        <w:outlineLvl w:val="1"/>
+        <w:rPr>
+          <w:rFonts w:ascii="Times New Roman" w:eastAsia="Times New Roman" w:hAnsi="Times New Roman" w:cs="Times New Roman"/>
+          <w:sz w:val="24"/>
+          <w:szCs w:val="24"/>
+        </w:rPr>
+      </w:pPr>
+      <w:r>
+        <w:rPr>
+          <w:rFonts w:ascii="Times New Roman" w:eastAsia="Times New Roman" w:hAnsi="Times New Roman" w:cs="Times New Roman"/>
+          <w:sz w:val="24"/>
+          <w:szCs w:val="24"/>
+        </w:rPr>
+        <w:t>Improved run selection modal logic and search filtering behavior</w:t>
+      </w:r>
+    </w:p>
+    <w:p>
+      <w:pPr>
+        <w:pStyle w:val="ListParagraph"/>
+        <w:numPr>
+          <w:ilvl w:val="0"/>
+          <w:numId w:val="60"/>
+        </w:numPr>
+        <w:spacing w:after="0" w:line="240" w:lineRule="auto"/>
+        <w:outlineLvl w:val="1"/>
+        <w:rPr>
+          <w:rFonts w:ascii="Times New Roman" w:eastAsia="Times New Roman" w:hAnsi="Times New Roman" w:cs="Times New Roman"/>
+          <w:sz w:val="24"/>
+          <w:szCs w:val="24"/>
+        </w:rPr>
+      </w:pPr>
+      <w:r>
+        <w:rPr>
+          <w:rFonts w:ascii="Times New Roman" w:eastAsia="Times New Roman" w:hAnsi="Times New Roman" w:cs="Times New Roman"/>
+          <w:sz w:val="24"/>
+          <w:szCs w:val="24"/>
+        </w:rPr>
+        <w:t>Tested database-backed run retrieval using DuckDB</w:t>
+      </w:r>
+    </w:p>
+    <w:p>
+      <w:pPr>
+        <w:pStyle w:val="ListParagraph"/>
+        <w:numPr>
+          <w:ilvl w:val="0"/>
+          <w:numId w:val="60"/>
+        </w:numPr>
+        <w:spacing w:after="0" w:line="240" w:lineRule="auto"/>
+        <w:outlineLvl w:val="1"/>
+        <w:rPr>
+          <w:rFonts w:ascii="Times New Roman" w:eastAsia="Times New Roman" w:hAnsi="Times New Roman" w:cs="Times New Roman"/>
+          <w:sz w:val="24"/>
+          <w:szCs w:val="24"/>
+        </w:rPr>
+      </w:pPr>
+      <w:r>
+        <w:rPr>
+          <w:rFonts w:ascii="Times New Roman" w:eastAsia="Times New Roman" w:hAnsi="Times New Roman" w:cs="Times New Roman"/>
+          <w:sz w:val="24"/>
+          <w:szCs w:val="24"/>
+        </w:rPr>
+        <w:t>Validated that runs stored in the database are correctly returned via IPC layer</w:t>
+      </w:r>
+    </w:p>
+    <w:p>
+      <w:pPr>
+        <w:pStyle w:val="ListParagraph"/>
+        <w:numPr>
+          <w:ilvl w:val="0"/>
+          <w:numId w:val="60"/>
+        </w:numPr>
+        <w:spacing w:after="0" w:line="240" w:lineRule="auto"/>
+        <w:outlineLvl w:val="1"/>
+        <w:rPr>
+          <w:rFonts w:ascii="Times New Roman" w:eastAsia="Times New Roman" w:hAnsi="Times New Roman" w:cs="Times New Roman"/>
+          <w:sz w:val="24"/>
+          <w:szCs w:val="24"/>
+        </w:rPr>
+      </w:pPr>
+      <w:r>
+        <w:rPr>
+          <w:rFonts w:ascii="Times New Roman" w:eastAsia="Times New Roman" w:hAnsi="Times New Roman" w:cs="Times New Roman"/>
+          <w:sz w:val="24"/>
+          <w:szCs w:val="24"/>
+        </w:rPr>
+        <w:t>Reviewed ingestion repository structure and metadata handling</w:t>
+      </w:r>
+    </w:p>
+    <w:p>
+      <w:pPr>
+        <w:pStyle w:val="ListParagraph"/>
+        <w:numPr>
+          <w:ilvl w:val="0"/>
+          <w:numId w:val="60"/>
+        </w:numPr>
+        <w:spacing w:after="0" w:line="240" w:lineRule="auto"/>
+        <w:outlineLvl w:val="1"/>
+        <w:rPr>
+          <w:rFonts w:ascii="Times New Roman" w:eastAsia="Times New Roman" w:hAnsi="Times New Roman" w:cs="Times New Roman"/>
+          <w:sz w:val="24"/>
+          <w:szCs w:val="24"/>
+        </w:rPr>
+      </w:pPr>
+      <w:r>
+        <w:rPr>
+          <w:rFonts w:ascii="Times New Roman" w:eastAsia="Times New Roman" w:hAnsi="Times New Roman" w:cs="Times New Roman"/>
+          <w:sz w:val="24"/>
+          <w:szCs w:val="24"/>
+        </w:rPr>
+        <w:t>Performed daily entries in energy meter readings and power cost analysis sheets (SMT and Driveline)</w:t>
+      </w:r>
+    </w:p>
+    <w:p>
+      <w:pPr>
+        <w:spacing w:after="0" w:line="240" w:lineRule="auto"/>
+        <w:outlineLvl w:val="1"/>
+        <w:rPr>
+          <w:rFonts w:ascii="Times New Roman" w:eastAsia="Times New Roman" w:hAnsi="Times New Roman" w:cs="Times New Roman"/>
+          <w:b/>
+          <w:sz w:val="24"/>
+          <w:szCs w:val="24"/>
+        </w:rPr>
+      </w:pPr>
+    </w:p>
+    <w:p>
+      <w:pPr>
+        <w:spacing w:after="0" w:line="240" w:lineRule="auto"/>
+        <w:outlineLvl w:val="1"/>
+        <w:rPr>
+          <w:rFonts w:ascii="Times New Roman" w:eastAsia="Times New Roman" w:hAnsi="Times New Roman" w:cs="Times New Roman"/>
+          <w:b/>
+          <w:sz w:val="24"/>
+          <w:szCs w:val="24"/>
+        </w:rPr>
+      </w:pPr>
+      <w:r>
+        <w:rPr>
+          <w:rFonts w:ascii="Times New Roman" w:eastAsia="Times New Roman" w:hAnsi="Times New Roman" w:cs="Times New Roman"/>
+          <w:b/>
+          <w:sz w:val="24"/>
+          <w:szCs w:val="24"/>
+        </w:rPr>
+        <w:t>Key Learnings</w:t>
+      </w:r>
+    </w:p>
+    <w:p>
+      <w:pPr>
+        <w:pStyle w:val="ListParagraph"/>
+        <w:numPr>
+          <w:ilvl w:val="0"/>
+          <w:numId w:val="61"/>
+        </w:numPr>
+        <w:spacing w:after="0" w:line="240" w:lineRule="auto"/>
+        <w:outlineLvl w:val="1"/>
+        <w:rPr>
+          <w:rFonts w:ascii="Times New Roman" w:eastAsia="Times New Roman" w:hAnsi="Times New Roman" w:cs="Times New Roman"/>
+          <w:sz w:val="24"/>
+          <w:szCs w:val="24"/>
+        </w:rPr>
+      </w:pPr>
+      <w:r>
+        <w:rPr>
+          <w:rFonts w:ascii="Times New Roman" w:eastAsia="Times New Roman" w:hAnsi="Times New Roman" w:cs="Times New Roman"/>
+          <w:sz w:val="24"/>
+          <w:szCs w:val="24"/>
+        </w:rPr>
+        <w:t>Qt WebChannel requires controlled initialization before frontend API invocation</w:t>
+      </w:r>
+    </w:p>
+    <w:p>
+      <w:pPr>
+        <w:pStyle w:val="ListParagraph"/>
+        <w:numPr>
+          <w:ilvl w:val="0"/>
+          <w:numId w:val="61"/>
+        </w:numPr>
+        <w:spacing w:after="0" w:line="240" w:lineRule="auto"/>
+        <w:outlineLvl w:val="1"/>
+        <w:rPr>
+          <w:rFonts w:ascii="Times New Roman" w:eastAsia="Times New Roman" w:hAnsi="Times New Roman" w:cs="Times New Roman"/>
+          <w:sz w:val="24"/>
+          <w:szCs w:val="24"/>
+        </w:rPr>
+      </w:pPr>
+      <w:r>
+        <w:rPr>
+          <w:rFonts w:ascii="Times New Roman" w:eastAsia="Times New Roman" w:hAnsi="Times New Roman" w:cs="Times New Roman"/>
+          <w:sz w:val="24"/>
+          <w:szCs w:val="24"/>
+        </w:rPr>
+        <w:t>Desktop applications introduce lifecycle synchronization challenges not seen in browser apps</w:t>
+      </w:r>
+    </w:p>
+    <w:p>
+      <w:pPr>
+        <w:pStyle w:val="ListParagraph"/>
+        <w:numPr>
+          <w:ilvl w:val="0"/>
+          <w:numId w:val="61"/>
+        </w:numPr>
+        <w:spacing w:after="0" w:line="240" w:lineRule="auto"/>
+        <w:outlineLvl w:val="1"/>
+        <w:rPr>
+          <w:rFonts w:ascii="Times New Roman" w:eastAsia="Times New Roman" w:hAnsi="Times New Roman" w:cs="Times New Roman"/>
+          <w:sz w:val="24"/>
+          <w:szCs w:val="24"/>
+        </w:rPr>
+      </w:pPr>
+      <w:r>
+        <w:rPr>
+          <w:rFonts w:ascii="Times New Roman" w:eastAsia="Times New Roman" w:hAnsi="Times New Roman" w:cs="Times New Roman"/>
+          <w:sz w:val="24"/>
+          <w:szCs w:val="24"/>
+        </w:rPr>
+        <w:t>Offline-first architecture requires strict separation between:</w:t>
+      </w:r>
+    </w:p>
+    <w:p>
+      <w:pPr>
+        <w:pStyle w:val="ListParagraph"/>
+        <w:numPr>
+          <w:ilvl w:val="1"/>
+          <w:numId w:val="61"/>
+        </w:numPr>
+        <w:spacing w:after="0" w:line="240" w:lineRule="auto"/>
+        <w:outlineLvl w:val="1"/>
+        <w:rPr>
+          <w:rFonts w:ascii="Times New Roman" w:eastAsia="Times New Roman" w:hAnsi="Times New Roman" w:cs="Times New Roman"/>
+          <w:sz w:val="24"/>
+          <w:szCs w:val="24"/>
+        </w:rPr>
+      </w:pPr>
+      <w:r>
+        <w:rPr>
+          <w:rFonts w:ascii="Times New Roman" w:eastAsia="Times New Roman" w:hAnsi="Times New Roman" w:cs="Times New Roman"/>
+          <w:sz w:val="24"/>
+          <w:szCs w:val="24"/>
+        </w:rPr>
+        <w:t>Repository layer</w:t>
+      </w:r>
+    </w:p>
+    <w:p>
+      <w:pPr>
+        <w:pStyle w:val="ListParagraph"/>
+        <w:numPr>
+          <w:ilvl w:val="1"/>
+          <w:numId w:val="61"/>
+        </w:numPr>
+        <w:spacing w:after="0" w:line="240" w:lineRule="auto"/>
+        <w:outlineLvl w:val="1"/>
+        <w:rPr>
+          <w:rFonts w:ascii="Times New Roman" w:eastAsia="Times New Roman" w:hAnsi="Times New Roman" w:cs="Times New Roman"/>
+          <w:sz w:val="24"/>
+          <w:szCs w:val="24"/>
+        </w:rPr>
+      </w:pPr>
+      <w:r>
+        <w:rPr>
+          <w:rFonts w:ascii="Times New Roman" w:eastAsia="Times New Roman" w:hAnsi="Times New Roman" w:cs="Times New Roman"/>
+          <w:sz w:val="24"/>
+          <w:szCs w:val="24"/>
+        </w:rPr>
+        <w:t>IPC layer</w:t>
+      </w:r>
+    </w:p>
+    <w:p>
+      <w:pPr>
+        <w:pStyle w:val="ListParagraph"/>
+        <w:numPr>
+          <w:ilvl w:val="1"/>
+          <w:numId w:val="61"/>
+        </w:numPr>
+        <w:spacing w:after="0" w:line="240" w:lineRule="auto"/>
+        <w:outlineLvl w:val="1"/>
+        <w:rPr>
+          <w:rFonts w:ascii="Times New Roman" w:eastAsia="Times New Roman" w:hAnsi="Times New Roman" w:cs="Times New Roman"/>
+          <w:sz w:val="24"/>
+          <w:szCs w:val="24"/>
+        </w:rPr>
+      </w:pPr>
+      <w:r>
+        <w:rPr>
+          <w:rFonts w:ascii="Times New Roman" w:eastAsia="Times New Roman" w:hAnsi="Times New Roman" w:cs="Times New Roman"/>
+          <w:sz w:val="24"/>
+          <w:szCs w:val="24"/>
+        </w:rPr>
+        <w:t>UI communication layer</w:t>
+      </w:r>
       <w:bookmarkStart w:id="0" w:name="_GoBack"/>
       <w:bookmarkEnd w:id="0"/>
     </w:p>
     <w:p>
       <w:pPr>
-        <w:spacing w:before="100" w:beforeAutospacing="1" w:after="100" w:afterAutospacing="1" w:line="240" w:lineRule="auto"/>
+        <w:spacing w:after="0" w:line="240" w:lineRule="auto"/>
         <w:outlineLvl w:val="1"/>
         <w:rPr>
           <w:rFonts w:ascii="Times New Roman" w:eastAsia="Times New Roman" w:hAnsi="Times New Roman" w:cs="Times New Roman"/>
@@ -11534,6 +12759,236 @@
           <w:szCs w:val="24"/>
         </w:rPr>
       </w:pPr>
+    </w:p>
+    <w:p>
+      <w:pPr>
+        <w:spacing w:after="0" w:line="240" w:lineRule="auto"/>
+        <w:outlineLvl w:val="1"/>
+        <w:rPr>
+          <w:rFonts w:ascii="Times New Roman" w:eastAsia="Times New Roman" w:hAnsi="Times New Roman" w:cs="Times New Roman"/>
+          <w:b/>
+          <w:sz w:val="24"/>
+          <w:szCs w:val="24"/>
+        </w:rPr>
+      </w:pPr>
+      <w:r>
+        <w:rPr>
+          <w:rFonts w:ascii="Times New Roman" w:eastAsia="Times New Roman" w:hAnsi="Times New Roman" w:cs="Times New Roman"/>
+          <w:b/>
+          <w:sz w:val="24"/>
+          <w:szCs w:val="24"/>
+        </w:rPr>
+        <w:t>Challenges / Open Points</w:t>
+      </w:r>
+    </w:p>
+    <w:p>
+      <w:pPr>
+        <w:pStyle w:val="ListParagraph"/>
+        <w:numPr>
+          <w:ilvl w:val="0"/>
+          <w:numId w:val="62"/>
+        </w:numPr>
+        <w:spacing w:after="0" w:line="240" w:lineRule="auto"/>
+        <w:outlineLvl w:val="1"/>
+        <w:rPr>
+          <w:rFonts w:ascii="Times New Roman" w:eastAsia="Times New Roman" w:hAnsi="Times New Roman" w:cs="Times New Roman"/>
+          <w:sz w:val="24"/>
+          <w:szCs w:val="24"/>
+        </w:rPr>
+      </w:pPr>
+      <w:r>
+        <w:rPr>
+          <w:rFonts w:ascii="Times New Roman" w:eastAsia="Times New Roman" w:hAnsi="Times New Roman" w:cs="Times New Roman"/>
+          <w:sz w:val="24"/>
+          <w:szCs w:val="24"/>
+        </w:rPr>
+        <w:t>Search modal still requires UI centering refinement and final stability verification</w:t>
+      </w:r>
+    </w:p>
+    <w:p>
+      <w:pPr>
+        <w:pStyle w:val="ListParagraph"/>
+        <w:numPr>
+          <w:ilvl w:val="0"/>
+          <w:numId w:val="62"/>
+        </w:numPr>
+        <w:spacing w:after="0" w:line="240" w:lineRule="auto"/>
+        <w:outlineLvl w:val="1"/>
+        <w:rPr>
+          <w:rFonts w:ascii="Times New Roman" w:eastAsia="Times New Roman" w:hAnsi="Times New Roman" w:cs="Times New Roman"/>
+          <w:sz w:val="24"/>
+          <w:szCs w:val="24"/>
+        </w:rPr>
+      </w:pPr>
+      <w:r>
+        <w:rPr>
+          <w:rFonts w:ascii="Times New Roman" w:eastAsia="Times New Roman" w:hAnsi="Times New Roman" w:cs="Times New Roman"/>
+          <w:sz w:val="24"/>
+          <w:szCs w:val="24"/>
+        </w:rPr>
+        <w:t>Ingestion pipeline automation not yet fully implemented</w:t>
+      </w:r>
+    </w:p>
+    <w:p>
+      <w:pPr>
+        <w:pStyle w:val="ListParagraph"/>
+        <w:numPr>
+          <w:ilvl w:val="0"/>
+          <w:numId w:val="62"/>
+        </w:numPr>
+        <w:spacing w:after="0" w:line="240" w:lineRule="auto"/>
+        <w:outlineLvl w:val="1"/>
+        <w:rPr>
+          <w:rFonts w:ascii="Times New Roman" w:eastAsia="Times New Roman" w:hAnsi="Times New Roman" w:cs="Times New Roman"/>
+          <w:sz w:val="24"/>
+          <w:szCs w:val="24"/>
+        </w:rPr>
+      </w:pPr>
+      <w:r>
+        <w:rPr>
+          <w:rFonts w:ascii="Times New Roman" w:eastAsia="Times New Roman" w:hAnsi="Times New Roman" w:cs="Times New Roman"/>
+          <w:sz w:val="24"/>
+          <w:szCs w:val="24"/>
+        </w:rPr>
+        <w:t>Rule-based and ML-based insight engine layer pending implementation</w:t>
+      </w:r>
+    </w:p>
+    <w:p>
+      <w:pPr>
+        <w:spacing w:after="0" w:line="240" w:lineRule="auto"/>
+        <w:outlineLvl w:val="1"/>
+        <w:rPr>
+          <w:rFonts w:ascii="Times New Roman" w:eastAsia="Times New Roman" w:hAnsi="Times New Roman" w:cs="Times New Roman"/>
+          <w:b/>
+          <w:sz w:val="24"/>
+          <w:szCs w:val="24"/>
+        </w:rPr>
+      </w:pPr>
+    </w:p>
+    <w:p>
+      <w:pPr>
+        <w:spacing w:after="0" w:line="240" w:lineRule="auto"/>
+        <w:outlineLvl w:val="1"/>
+        <w:rPr>
+          <w:rFonts w:ascii="Times New Roman" w:eastAsia="Times New Roman" w:hAnsi="Times New Roman" w:cs="Times New Roman"/>
+          <w:b/>
+          <w:sz w:val="24"/>
+          <w:szCs w:val="24"/>
+        </w:rPr>
+      </w:pPr>
+      <w:r>
+        <w:rPr>
+          <w:rFonts w:ascii="Times New Roman" w:eastAsia="Times New Roman" w:hAnsi="Times New Roman" w:cs="Times New Roman"/>
+          <w:b/>
+          <w:sz w:val="24"/>
+          <w:szCs w:val="24"/>
+        </w:rPr>
+        <w:t>Next Steps</w:t>
+      </w:r>
+    </w:p>
+    <w:p>
+      <w:pPr>
+        <w:pStyle w:val="ListParagraph"/>
+        <w:numPr>
+          <w:ilvl w:val="0"/>
+          <w:numId w:val="63"/>
+        </w:numPr>
+        <w:spacing w:after="0" w:line="240" w:lineRule="auto"/>
+        <w:outlineLvl w:val="1"/>
+        <w:rPr>
+          <w:rFonts w:ascii="Times New Roman" w:eastAsia="Times New Roman" w:hAnsi="Times New Roman" w:cs="Times New Roman"/>
+          <w:sz w:val="24"/>
+          <w:szCs w:val="24"/>
+        </w:rPr>
+      </w:pPr>
+      <w:r>
+        <w:rPr>
+          <w:rFonts w:ascii="Times New Roman" w:eastAsia="Times New Roman" w:hAnsi="Times New Roman" w:cs="Times New Roman"/>
+          <w:sz w:val="24"/>
+          <w:szCs w:val="24"/>
+        </w:rPr>
+        <w:t>Complete ingestion pipeline end-to-end</w:t>
+      </w:r>
+    </w:p>
+    <w:p>
+      <w:pPr>
+        <w:pStyle w:val="ListParagraph"/>
+        <w:numPr>
+          <w:ilvl w:val="0"/>
+          <w:numId w:val="63"/>
+        </w:numPr>
+        <w:spacing w:after="0" w:line="240" w:lineRule="auto"/>
+        <w:outlineLvl w:val="1"/>
+        <w:rPr>
+          <w:rFonts w:ascii="Times New Roman" w:eastAsia="Times New Roman" w:hAnsi="Times New Roman" w:cs="Times New Roman"/>
+          <w:sz w:val="24"/>
+          <w:szCs w:val="24"/>
+        </w:rPr>
+      </w:pPr>
+      <w:r>
+        <w:rPr>
+          <w:rFonts w:ascii="Times New Roman" w:eastAsia="Times New Roman" w:hAnsi="Times New Roman" w:cs="Times New Roman"/>
+          <w:sz w:val="24"/>
+          <w:szCs w:val="24"/>
+        </w:rPr>
+        <w:t>I</w:t>
+      </w:r>
+      <w:r>
+        <w:rPr>
+          <w:rFonts w:ascii="Times New Roman" w:eastAsia="Times New Roman" w:hAnsi="Times New Roman" w:cs="Times New Roman"/>
+          <w:sz w:val="24"/>
+          <w:szCs w:val="24"/>
+        </w:rPr>
+        <w:t>mplement rule-based engine layer for deterministic insights</w:t>
+      </w:r>
+    </w:p>
+    <w:p>
+      <w:pPr>
+        <w:pStyle w:val="ListParagraph"/>
+        <w:numPr>
+          <w:ilvl w:val="0"/>
+          <w:numId w:val="63"/>
+        </w:numPr>
+        <w:spacing w:after="0" w:line="240" w:lineRule="auto"/>
+        <w:outlineLvl w:val="1"/>
+        <w:rPr>
+          <w:rFonts w:ascii="Times New Roman" w:eastAsia="Times New Roman" w:hAnsi="Times New Roman" w:cs="Times New Roman"/>
+          <w:sz w:val="24"/>
+          <w:szCs w:val="24"/>
+        </w:rPr>
+      </w:pPr>
+      <w:r>
+        <w:rPr>
+          <w:rFonts w:ascii="Times New Roman" w:eastAsia="Times New Roman" w:hAnsi="Times New Roman" w:cs="Times New Roman"/>
+          <w:sz w:val="24"/>
+          <w:szCs w:val="24"/>
+        </w:rPr>
+        <w:t>Design and integrate ML-based anomaly detection layer</w:t>
+      </w:r>
+    </w:p>
+    <w:p>
+      <w:pPr>
+        <w:pStyle w:val="ListParagraph"/>
+        <w:numPr>
+          <w:ilvl w:val="0"/>
+          <w:numId w:val="63"/>
+        </w:numPr>
+        <w:spacing w:after="0" w:line="240" w:lineRule="auto"/>
+        <w:outlineLvl w:val="1"/>
+        <w:rPr>
+          <w:rFonts w:ascii="Times New Roman" w:eastAsia="Times New Roman" w:hAnsi="Times New Roman" w:cs="Times New Roman"/>
+          <w:sz w:val="24"/>
+          <w:szCs w:val="24"/>
+        </w:rPr>
+      </w:pPr>
+      <w:r>
+        <w:rPr>
+          <w:rFonts w:ascii="Times New Roman" w:eastAsia="Times New Roman" w:hAnsi="Times New Roman" w:cs="Times New Roman"/>
+          <w:sz w:val="24"/>
+          <w:szCs w:val="24"/>
+        </w:rPr>
+        <w:t>Finalize desktop UI production stability</w:t>
+      </w:r>
     </w:p>
     <w:p>
       <w:pPr>
@@ -12864,155 +14319,6 @@
     </w:lvl>
   </w:abstractNum>
   <w:abstractNum w:abstractNumId="9" w15:restartNumberingAfterBreak="0">
-    <w:nsid w:val="0DB57FAE"/>
-    <w:multiLevelType w:val="multilevel"/>
-    <w:tmpl w:val="3B660CB2"/>
-    <w:lvl w:ilvl="0">
-      <w:start w:val="1"/>
-      <w:numFmt w:val="bullet"/>
-      <w:lvlText w:val=""/>
-      <w:lvlJc w:val="left"/>
-      <w:pPr>
-        <w:tabs>
-          <w:tab w:val="num" w:pos="720"/>
-        </w:tabs>
-        <w:ind w:left="720" w:hanging="360"/>
-      </w:pPr>
-      <w:rPr>
-        <w:rFonts w:ascii="Symbol" w:hAnsi="Symbol" w:hint="default"/>
-        <w:sz w:val="20"/>
-      </w:rPr>
-    </w:lvl>
-    <w:lvl w:ilvl="1" w:tentative="1">
-      <w:start w:val="1"/>
-      <w:numFmt w:val="bullet"/>
-      <w:lvlText w:val="o"/>
-      <w:lvlJc w:val="left"/>
-      <w:pPr>
-        <w:tabs>
-          <w:tab w:val="num" w:pos="1440"/>
-        </w:tabs>
-        <w:ind w:left="1440" w:hanging="360"/>
-      </w:pPr>
-      <w:rPr>
-        <w:rFonts w:ascii="Courier New" w:hAnsi="Courier New" w:hint="default"/>
-        <w:sz w:val="20"/>
-      </w:rPr>
-    </w:lvl>
-    <w:lvl w:ilvl="2" w:tentative="1">
-      <w:start w:val="1"/>
-      <w:numFmt w:val="bullet"/>
-      <w:lvlText w:val=""/>
-      <w:lvlJc w:val="left"/>
-      <w:pPr>
-        <w:tabs>
-          <w:tab w:val="num" w:pos="2160"/>
-        </w:tabs>
-        <w:ind w:left="2160" w:hanging="360"/>
-      </w:pPr>
-      <w:rPr>
-        <w:rFonts w:ascii="Wingdings" w:hAnsi="Wingdings" w:hint="default"/>
-        <w:sz w:val="20"/>
-      </w:rPr>
-    </w:lvl>
-    <w:lvl w:ilvl="3" w:tentative="1">
-      <w:start w:val="1"/>
-      <w:numFmt w:val="bullet"/>
-      <w:lvlText w:val=""/>
-      <w:lvlJc w:val="left"/>
-      <w:pPr>
-        <w:tabs>
-          <w:tab w:val="num" w:pos="2880"/>
-        </w:tabs>
-        <w:ind w:left="2880" w:hanging="360"/>
-      </w:pPr>
-      <w:rPr>
-        <w:rFonts w:ascii="Wingdings" w:hAnsi="Wingdings" w:hint="default"/>
-        <w:sz w:val="20"/>
-      </w:rPr>
-    </w:lvl>
-    <w:lvl w:ilvl="4" w:tentative="1">
-      <w:start w:val="1"/>
-      <w:numFmt w:val="bullet"/>
-      <w:lvlText w:val=""/>
-      <w:lvlJc w:val="left"/>
-      <w:pPr>
-        <w:tabs>
-          <w:tab w:val="num" w:pos="3600"/>
-        </w:tabs>
-        <w:ind w:left="3600" w:hanging="360"/>
-      </w:pPr>
-      <w:rPr>
-        <w:rFonts w:ascii="Wingdings" w:hAnsi="Wingdings" w:hint="default"/>
-        <w:sz w:val="20"/>
-      </w:rPr>
-    </w:lvl>
-    <w:lvl w:ilvl="5" w:tentative="1">
-      <w:start w:val="1"/>
-      <w:numFmt w:val="bullet"/>
-      <w:lvlText w:val=""/>
-      <w:lvlJc w:val="left"/>
-      <w:pPr>
-        <w:tabs>
-          <w:tab w:val="num" w:pos="4320"/>
-        </w:tabs>
-        <w:ind w:left="4320" w:hanging="360"/>
-      </w:pPr>
-      <w:rPr>
-        <w:rFonts w:ascii="Wingdings" w:hAnsi="Wingdings" w:hint="default"/>
-        <w:sz w:val="20"/>
-      </w:rPr>
-    </w:lvl>
-    <w:lvl w:ilvl="6" w:tentative="1">
-      <w:start w:val="1"/>
-      <w:numFmt w:val="bullet"/>
-      <w:lvlText w:val=""/>
-      <w:lvlJc w:val="left"/>
-      <w:pPr>
-        <w:tabs>
-          <w:tab w:val="num" w:pos="5040"/>
-        </w:tabs>
-        <w:ind w:left="5040" w:hanging="360"/>
-      </w:pPr>
-      <w:rPr>
-        <w:rFonts w:ascii="Wingdings" w:hAnsi="Wingdings" w:hint="default"/>
-        <w:sz w:val="20"/>
-      </w:rPr>
-    </w:lvl>
-    <w:lvl w:ilvl="7" w:tentative="1">
-      <w:start w:val="1"/>
-      <w:numFmt w:val="bullet"/>
-      <w:lvlText w:val=""/>
-      <w:lvlJc w:val="left"/>
-      <w:pPr>
-        <w:tabs>
-          <w:tab w:val="num" w:pos="5760"/>
-        </w:tabs>
-        <w:ind w:left="5760" w:hanging="360"/>
-      </w:pPr>
-      <w:rPr>
-        <w:rFonts w:ascii="Wingdings" w:hAnsi="Wingdings" w:hint="default"/>
-        <w:sz w:val="20"/>
-      </w:rPr>
-    </w:lvl>
-    <w:lvl w:ilvl="8" w:tentative="1">
-      <w:start w:val="1"/>
-      <w:numFmt w:val="bullet"/>
-      <w:lvlText w:val=""/>
-      <w:lvlJc w:val="left"/>
-      <w:pPr>
-        <w:tabs>
-          <w:tab w:val="num" w:pos="6480"/>
-        </w:tabs>
-        <w:ind w:left="6480" w:hanging="360"/>
-      </w:pPr>
-      <w:rPr>
-        <w:rFonts w:ascii="Wingdings" w:hAnsi="Wingdings" w:hint="default"/>
-        <w:sz w:val="20"/>
-      </w:rPr>
-    </w:lvl>
-  </w:abstractNum>
-  <w:abstractNum w:abstractNumId="10" w15:restartNumberingAfterBreak="0">
     <w:nsid w:val="1025101E"/>
     <w:multiLevelType w:val="multilevel"/>
     <w:tmpl w:val="2630475E"/>
@@ -13161,7 +14467,7 @@
       </w:rPr>
     </w:lvl>
   </w:abstractNum>
-  <w:abstractNum w:abstractNumId="11" w15:restartNumberingAfterBreak="0">
+  <w:abstractNum w:abstractNumId="10" w15:restartNumberingAfterBreak="0">
     <w:nsid w:val="11EC4F79"/>
     <w:multiLevelType w:val="multilevel"/>
     <w:tmpl w:val="4E904154"/>
@@ -13310,7 +14616,7 @@
       </w:rPr>
     </w:lvl>
   </w:abstractNum>
-  <w:abstractNum w:abstractNumId="12" w15:restartNumberingAfterBreak="0">
+  <w:abstractNum w:abstractNumId="11" w15:restartNumberingAfterBreak="0">
     <w:nsid w:val="19103BDD"/>
     <w:multiLevelType w:val="multilevel"/>
     <w:tmpl w:val="832E07AC"/>
@@ -13459,7 +14765,7 @@
       </w:rPr>
     </w:lvl>
   </w:abstractNum>
-  <w:abstractNum w:abstractNumId="13" w15:restartNumberingAfterBreak="0">
+  <w:abstractNum w:abstractNumId="12" w15:restartNumberingAfterBreak="0">
     <w:nsid w:val="191D2358"/>
     <w:multiLevelType w:val="multilevel"/>
     <w:tmpl w:val="4C76D0CE"/>
@@ -13608,7 +14914,7 @@
       </w:rPr>
     </w:lvl>
   </w:abstractNum>
-  <w:abstractNum w:abstractNumId="14" w15:restartNumberingAfterBreak="0">
+  <w:abstractNum w:abstractNumId="13" w15:restartNumberingAfterBreak="0">
     <w:nsid w:val="1A0904A8"/>
     <w:multiLevelType w:val="multilevel"/>
     <w:tmpl w:val="AEAA53BA"/>
@@ -13757,7 +15063,7 @@
       </w:rPr>
     </w:lvl>
   </w:abstractNum>
-  <w:abstractNum w:abstractNumId="15" w15:restartNumberingAfterBreak="0">
+  <w:abstractNum w:abstractNumId="14" w15:restartNumberingAfterBreak="0">
     <w:nsid w:val="1D795E8D"/>
     <w:multiLevelType w:val="multilevel"/>
     <w:tmpl w:val="1D48DAD0"/>
@@ -13906,7 +15212,7 @@
       </w:rPr>
     </w:lvl>
   </w:abstractNum>
-  <w:abstractNum w:abstractNumId="16" w15:restartNumberingAfterBreak="0">
+  <w:abstractNum w:abstractNumId="15" w15:restartNumberingAfterBreak="0">
     <w:nsid w:val="1E013F2E"/>
     <w:multiLevelType w:val="multilevel"/>
     <w:tmpl w:val="ED0466AA"/>
@@ -14055,7 +15361,7 @@
       </w:rPr>
     </w:lvl>
   </w:abstractNum>
-  <w:abstractNum w:abstractNumId="17" w15:restartNumberingAfterBreak="0">
+  <w:abstractNum w:abstractNumId="16" w15:restartNumberingAfterBreak="0">
     <w:nsid w:val="1E957172"/>
     <w:multiLevelType w:val="multilevel"/>
     <w:tmpl w:val="E1EC9D14"/>
@@ -14204,7 +15510,7 @@
       </w:rPr>
     </w:lvl>
   </w:abstractNum>
-  <w:abstractNum w:abstractNumId="18" w15:restartNumberingAfterBreak="0">
+  <w:abstractNum w:abstractNumId="17" w15:restartNumberingAfterBreak="0">
     <w:nsid w:val="1F04011B"/>
     <w:multiLevelType w:val="multilevel"/>
     <w:tmpl w:val="32E60924"/>
@@ -14353,7 +15659,7 @@
       </w:rPr>
     </w:lvl>
   </w:abstractNum>
-  <w:abstractNum w:abstractNumId="19" w15:restartNumberingAfterBreak="0">
+  <w:abstractNum w:abstractNumId="18" w15:restartNumberingAfterBreak="0">
     <w:nsid w:val="1FFA7335"/>
     <w:multiLevelType w:val="multilevel"/>
     <w:tmpl w:val="F746CC02"/>
@@ -14502,7 +15808,7 @@
       </w:rPr>
     </w:lvl>
   </w:abstractNum>
-  <w:abstractNum w:abstractNumId="20" w15:restartNumberingAfterBreak="0">
+  <w:abstractNum w:abstractNumId="19" w15:restartNumberingAfterBreak="0">
     <w:nsid w:val="277F001C"/>
     <w:multiLevelType w:val="multilevel"/>
     <w:tmpl w:val="DD520D0A"/>
@@ -14651,7 +15957,7 @@
       </w:rPr>
     </w:lvl>
   </w:abstractNum>
-  <w:abstractNum w:abstractNumId="21" w15:restartNumberingAfterBreak="0">
+  <w:abstractNum w:abstractNumId="20" w15:restartNumberingAfterBreak="0">
     <w:nsid w:val="281F6B31"/>
     <w:multiLevelType w:val="multilevel"/>
     <w:tmpl w:val="1D141264"/>
@@ -14800,7 +16106,7 @@
       </w:rPr>
     </w:lvl>
   </w:abstractNum>
-  <w:abstractNum w:abstractNumId="22" w15:restartNumberingAfterBreak="0">
+  <w:abstractNum w:abstractNumId="21" w15:restartNumberingAfterBreak="0">
     <w:nsid w:val="2C4213E1"/>
     <w:multiLevelType w:val="multilevel"/>
     <w:tmpl w:val="C2442892"/>
@@ -14949,7 +16255,7 @@
       </w:rPr>
     </w:lvl>
   </w:abstractNum>
-  <w:abstractNum w:abstractNumId="23" w15:restartNumberingAfterBreak="0">
+  <w:abstractNum w:abstractNumId="22" w15:restartNumberingAfterBreak="0">
     <w:nsid w:val="2D875DB2"/>
     <w:multiLevelType w:val="multilevel"/>
     <w:tmpl w:val="6450BF7A"/>
@@ -15098,7 +16404,7 @@
       </w:rPr>
     </w:lvl>
   </w:abstractNum>
-  <w:abstractNum w:abstractNumId="24" w15:restartNumberingAfterBreak="0">
+  <w:abstractNum w:abstractNumId="23" w15:restartNumberingAfterBreak="0">
     <w:nsid w:val="2EDC66D7"/>
     <w:multiLevelType w:val="multilevel"/>
     <w:tmpl w:val="484CDF84"/>
@@ -15247,7 +16553,7 @@
       </w:rPr>
     </w:lvl>
   </w:abstractNum>
-  <w:abstractNum w:abstractNumId="25" w15:restartNumberingAfterBreak="0">
+  <w:abstractNum w:abstractNumId="24" w15:restartNumberingAfterBreak="0">
     <w:nsid w:val="2F3960A5"/>
     <w:multiLevelType w:val="multilevel"/>
     <w:tmpl w:val="C5E2EACE"/>
@@ -15396,156 +16702,7 @@
       </w:rPr>
     </w:lvl>
   </w:abstractNum>
-  <w:abstractNum w:abstractNumId="26" w15:restartNumberingAfterBreak="0">
-    <w:nsid w:val="2F627E3E"/>
-    <w:multiLevelType w:val="multilevel"/>
-    <w:tmpl w:val="D4F6983E"/>
-    <w:lvl w:ilvl="0">
-      <w:start w:val="1"/>
-      <w:numFmt w:val="bullet"/>
-      <w:lvlText w:val=""/>
-      <w:lvlJc w:val="left"/>
-      <w:pPr>
-        <w:tabs>
-          <w:tab w:val="num" w:pos="720"/>
-        </w:tabs>
-        <w:ind w:left="720" w:hanging="360"/>
-      </w:pPr>
-      <w:rPr>
-        <w:rFonts w:ascii="Symbol" w:hAnsi="Symbol" w:hint="default"/>
-        <w:sz w:val="20"/>
-      </w:rPr>
-    </w:lvl>
-    <w:lvl w:ilvl="1" w:tentative="1">
-      <w:start w:val="1"/>
-      <w:numFmt w:val="bullet"/>
-      <w:lvlText w:val="o"/>
-      <w:lvlJc w:val="left"/>
-      <w:pPr>
-        <w:tabs>
-          <w:tab w:val="num" w:pos="1440"/>
-        </w:tabs>
-        <w:ind w:left="1440" w:hanging="360"/>
-      </w:pPr>
-      <w:rPr>
-        <w:rFonts w:ascii="Courier New" w:hAnsi="Courier New" w:hint="default"/>
-        <w:sz w:val="20"/>
-      </w:rPr>
-    </w:lvl>
-    <w:lvl w:ilvl="2" w:tentative="1">
-      <w:start w:val="1"/>
-      <w:numFmt w:val="bullet"/>
-      <w:lvlText w:val=""/>
-      <w:lvlJc w:val="left"/>
-      <w:pPr>
-        <w:tabs>
-          <w:tab w:val="num" w:pos="2160"/>
-        </w:tabs>
-        <w:ind w:left="2160" w:hanging="360"/>
-      </w:pPr>
-      <w:rPr>
-        <w:rFonts w:ascii="Wingdings" w:hAnsi="Wingdings" w:hint="default"/>
-        <w:sz w:val="20"/>
-      </w:rPr>
-    </w:lvl>
-    <w:lvl w:ilvl="3" w:tentative="1">
-      <w:start w:val="1"/>
-      <w:numFmt w:val="bullet"/>
-      <w:lvlText w:val=""/>
-      <w:lvlJc w:val="left"/>
-      <w:pPr>
-        <w:tabs>
-          <w:tab w:val="num" w:pos="2880"/>
-        </w:tabs>
-        <w:ind w:left="2880" w:hanging="360"/>
-      </w:pPr>
-      <w:rPr>
-        <w:rFonts w:ascii="Wingdings" w:hAnsi="Wingdings" w:hint="default"/>
-        <w:sz w:val="20"/>
-      </w:rPr>
-    </w:lvl>
-    <w:lvl w:ilvl="4" w:tentative="1">
-      <w:start w:val="1"/>
-      <w:numFmt w:val="bullet"/>
-      <w:lvlText w:val=""/>
-      <w:lvlJc w:val="left"/>
-      <w:pPr>
-        <w:tabs>
-          <w:tab w:val="num" w:pos="3600"/>
-        </w:tabs>
-        <w:ind w:left="3600" w:hanging="360"/>
-      </w:pPr>
-      <w:rPr>
-        <w:rFonts w:ascii="Wingdings" w:hAnsi="Wingdings" w:hint="default"/>
-        <w:sz w:val="20"/>
-      </w:rPr>
-    </w:lvl>
-    <w:lvl w:ilvl="5" w:tentative="1">
-      <w:start w:val="1"/>
-      <w:numFmt w:val="bullet"/>
-      <w:lvlText w:val=""/>
-      <w:lvlJc w:val="left"/>
-      <w:pPr>
-        <w:tabs>
-          <w:tab w:val="num" w:pos="4320"/>
-        </w:tabs>
-        <w:ind w:left="4320" w:hanging="360"/>
-      </w:pPr>
-      <w:rPr>
-        <w:rFonts w:ascii="Wingdings" w:hAnsi="Wingdings" w:hint="default"/>
-        <w:sz w:val="20"/>
-      </w:rPr>
-    </w:lvl>
-    <w:lvl w:ilvl="6" w:tentative="1">
-      <w:start w:val="1"/>
-      <w:numFmt w:val="bullet"/>
-      <w:lvlText w:val=""/>
-      <w:lvlJc w:val="left"/>
-      <w:pPr>
-        <w:tabs>
-          <w:tab w:val="num" w:pos="5040"/>
-        </w:tabs>
-        <w:ind w:left="5040" w:hanging="360"/>
-      </w:pPr>
-      <w:rPr>
-        <w:rFonts w:ascii="Wingdings" w:hAnsi="Wingdings" w:hint="default"/>
-        <w:sz w:val="20"/>
-      </w:rPr>
-    </w:lvl>
-    <w:lvl w:ilvl="7" w:tentative="1">
-      <w:start w:val="1"/>
-      <w:numFmt w:val="bullet"/>
-      <w:lvlText w:val=""/>
-      <w:lvlJc w:val="left"/>
-      <w:pPr>
-        <w:tabs>
-          <w:tab w:val="num" w:pos="5760"/>
-        </w:tabs>
-        <w:ind w:left="5760" w:hanging="360"/>
-      </w:pPr>
-      <w:rPr>
-        <w:rFonts w:ascii="Wingdings" w:hAnsi="Wingdings" w:hint="default"/>
-        <w:sz w:val="20"/>
-      </w:rPr>
-    </w:lvl>
-    <w:lvl w:ilvl="8" w:tentative="1">
-      <w:start w:val="1"/>
-      <w:numFmt w:val="bullet"/>
-      <w:lvlText w:val=""/>
-      <w:lvlJc w:val="left"/>
-      <w:pPr>
-        <w:tabs>
-          <w:tab w:val="num" w:pos="6480"/>
-        </w:tabs>
-        <w:ind w:left="6480" w:hanging="360"/>
-      </w:pPr>
-      <w:rPr>
-        <w:rFonts w:ascii="Wingdings" w:hAnsi="Wingdings" w:hint="default"/>
-        <w:sz w:val="20"/>
-      </w:rPr>
-    </w:lvl>
-  </w:abstractNum>
-  <w:abstractNum w:abstractNumId="27" w15:restartNumberingAfterBreak="0">
+  <w:abstractNum w:abstractNumId="25" w15:restartNumberingAfterBreak="0">
     <w:nsid w:val="329C39BB"/>
     <w:multiLevelType w:val="multilevel"/>
     <w:tmpl w:val="1696BB5C"/>
@@ -15694,156 +16851,7 @@
       </w:rPr>
     </w:lvl>
   </w:abstractNum>
-  <w:abstractNum w:abstractNumId="28" w15:restartNumberingAfterBreak="0">
-    <w:nsid w:val="33806EEE"/>
-    <w:multiLevelType w:val="multilevel"/>
-    <w:tmpl w:val="C35C4FBC"/>
-    <w:lvl w:ilvl="0">
-      <w:start w:val="1"/>
-      <w:numFmt w:val="bullet"/>
-      <w:lvlText w:val=""/>
-      <w:lvlJc w:val="left"/>
-      <w:pPr>
-        <w:tabs>
-          <w:tab w:val="num" w:pos="720"/>
-        </w:tabs>
-        <w:ind w:left="720" w:hanging="360"/>
-      </w:pPr>
-      <w:rPr>
-        <w:rFonts w:ascii="Symbol" w:hAnsi="Symbol" w:hint="default"/>
-        <w:sz w:val="20"/>
-      </w:rPr>
-    </w:lvl>
-    <w:lvl w:ilvl="1" w:tentative="1">
-      <w:start w:val="1"/>
-      <w:numFmt w:val="bullet"/>
-      <w:lvlText w:val="o"/>
-      <w:lvlJc w:val="left"/>
-      <w:pPr>
-        <w:tabs>
-          <w:tab w:val="num" w:pos="1440"/>
-        </w:tabs>
-        <w:ind w:left="1440" w:hanging="360"/>
-      </w:pPr>
-      <w:rPr>
-        <w:rFonts w:ascii="Courier New" w:hAnsi="Courier New" w:hint="default"/>
-        <w:sz w:val="20"/>
-      </w:rPr>
-    </w:lvl>
-    <w:lvl w:ilvl="2" w:tentative="1">
-      <w:start w:val="1"/>
-      <w:numFmt w:val="bullet"/>
-      <w:lvlText w:val=""/>
-      <w:lvlJc w:val="left"/>
-      <w:pPr>
-        <w:tabs>
-          <w:tab w:val="num" w:pos="2160"/>
-        </w:tabs>
-        <w:ind w:left="2160" w:hanging="360"/>
-      </w:pPr>
-      <w:rPr>
-        <w:rFonts w:ascii="Wingdings" w:hAnsi="Wingdings" w:hint="default"/>
-        <w:sz w:val="20"/>
-      </w:rPr>
-    </w:lvl>
-    <w:lvl w:ilvl="3" w:tentative="1">
-      <w:start w:val="1"/>
-      <w:numFmt w:val="bullet"/>
-      <w:lvlText w:val=""/>
-      <w:lvlJc w:val="left"/>
-      <w:pPr>
-        <w:tabs>
-          <w:tab w:val="num" w:pos="2880"/>
-        </w:tabs>
-        <w:ind w:left="2880" w:hanging="360"/>
-      </w:pPr>
-      <w:rPr>
-        <w:rFonts w:ascii="Wingdings" w:hAnsi="Wingdings" w:hint="default"/>
-        <w:sz w:val="20"/>
-      </w:rPr>
-    </w:lvl>
-    <w:lvl w:ilvl="4" w:tentative="1">
-      <w:start w:val="1"/>
-      <w:numFmt w:val="bullet"/>
-      <w:lvlText w:val=""/>
-      <w:lvlJc w:val="left"/>
-      <w:pPr>
-        <w:tabs>
-          <w:tab w:val="num" w:pos="3600"/>
-        </w:tabs>
-        <w:ind w:left="3600" w:hanging="360"/>
-      </w:pPr>
-      <w:rPr>
-        <w:rFonts w:ascii="Wingdings" w:hAnsi="Wingdings" w:hint="default"/>
-        <w:sz w:val="20"/>
-      </w:rPr>
-    </w:lvl>
-    <w:lvl w:ilvl="5" w:tentative="1">
-      <w:start w:val="1"/>
-      <w:numFmt w:val="bullet"/>
-      <w:lvlText w:val=""/>
-      <w:lvlJc w:val="left"/>
-      <w:pPr>
-        <w:tabs>
-          <w:tab w:val="num" w:pos="4320"/>
-        </w:tabs>
-        <w:ind w:left="4320" w:hanging="360"/>
-      </w:pPr>
-      <w:rPr>
-        <w:rFonts w:ascii="Wingdings" w:hAnsi="Wingdings" w:hint="default"/>
-        <w:sz w:val="20"/>
-      </w:rPr>
-    </w:lvl>
-    <w:lvl w:ilvl="6" w:tentative="1">
-      <w:start w:val="1"/>
-      <w:numFmt w:val="bullet"/>
-      <w:lvlText w:val=""/>
-      <w:lvlJc w:val="left"/>
-      <w:pPr>
-        <w:tabs>
-          <w:tab w:val="num" w:pos="5040"/>
-        </w:tabs>
-        <w:ind w:left="5040" w:hanging="360"/>
-      </w:pPr>
-      <w:rPr>
-        <w:rFonts w:ascii="Wingdings" w:hAnsi="Wingdings" w:hint="default"/>
-        <w:sz w:val="20"/>
-      </w:rPr>
-    </w:lvl>
-    <w:lvl w:ilvl="7" w:tentative="1">
-      <w:start w:val="1"/>
-      <w:numFmt w:val="bullet"/>
-      <w:lvlText w:val=""/>
-      <w:lvlJc w:val="left"/>
-      <w:pPr>
-        <w:tabs>
-          <w:tab w:val="num" w:pos="5760"/>
-        </w:tabs>
-        <w:ind w:left="5760" w:hanging="360"/>
-      </w:pPr>
-      <w:rPr>
-        <w:rFonts w:ascii="Wingdings" w:hAnsi="Wingdings" w:hint="default"/>
-        <w:sz w:val="20"/>
-      </w:rPr>
-    </w:lvl>
-    <w:lvl w:ilvl="8" w:tentative="1">
-      <w:start w:val="1"/>
-      <w:numFmt w:val="bullet"/>
-      <w:lvlText w:val=""/>
-      <w:lvlJc w:val="left"/>
-      <w:pPr>
-        <w:tabs>
-          <w:tab w:val="num" w:pos="6480"/>
-        </w:tabs>
-        <w:ind w:left="6480" w:hanging="360"/>
-      </w:pPr>
-      <w:rPr>
-        <w:rFonts w:ascii="Wingdings" w:hAnsi="Wingdings" w:hint="default"/>
-        <w:sz w:val="20"/>
-      </w:rPr>
-    </w:lvl>
-  </w:abstractNum>
-  <w:abstractNum w:abstractNumId="29" w15:restartNumberingAfterBreak="0">
+  <w:abstractNum w:abstractNumId="26" w15:restartNumberingAfterBreak="0">
     <w:nsid w:val="33FF6B03"/>
     <w:multiLevelType w:val="multilevel"/>
     <w:tmpl w:val="38D493B4"/>
@@ -15992,7 +17000,7 @@
       </w:rPr>
     </w:lvl>
   </w:abstractNum>
-  <w:abstractNum w:abstractNumId="30" w15:restartNumberingAfterBreak="0">
+  <w:abstractNum w:abstractNumId="27" w15:restartNumberingAfterBreak="0">
     <w:nsid w:val="391764DC"/>
     <w:multiLevelType w:val="multilevel"/>
     <w:tmpl w:val="31FAB04C"/>
@@ -16141,7 +17149,7 @@
       </w:rPr>
     </w:lvl>
   </w:abstractNum>
-  <w:abstractNum w:abstractNumId="31" w15:restartNumberingAfterBreak="0">
+  <w:abstractNum w:abstractNumId="28" w15:restartNumberingAfterBreak="0">
     <w:nsid w:val="3B125DF7"/>
     <w:multiLevelType w:val="multilevel"/>
     <w:tmpl w:val="2DFA1608"/>
@@ -16290,7 +17298,120 @@
       </w:rPr>
     </w:lvl>
   </w:abstractNum>
-  <w:abstractNum w:abstractNumId="32" w15:restartNumberingAfterBreak="0">
+  <w:abstractNum w:abstractNumId="29" w15:restartNumberingAfterBreak="0">
+    <w:nsid w:val="3BBD0916"/>
+    <w:multiLevelType w:val="hybridMultilevel"/>
+    <w:tmpl w:val="9D041C18"/>
+    <w:lvl w:ilvl="0" w:tplc="04090001">
+      <w:start w:val="1"/>
+      <w:numFmt w:val="bullet"/>
+      <w:lvlText w:val=""/>
+      <w:lvlJc w:val="left"/>
+      <w:pPr>
+        <w:ind w:left="720" w:hanging="360"/>
+      </w:pPr>
+      <w:rPr>
+        <w:rFonts w:ascii="Symbol" w:hAnsi="Symbol" w:hint="default"/>
+      </w:rPr>
+    </w:lvl>
+    <w:lvl w:ilvl="1" w:tplc="04090003" w:tentative="1">
+      <w:start w:val="1"/>
+      <w:numFmt w:val="bullet"/>
+      <w:lvlText w:val="o"/>
+      <w:lvlJc w:val="left"/>
+      <w:pPr>
+        <w:ind w:left="1440" w:hanging="360"/>
+      </w:pPr>
+      <w:rPr>
+        <w:rFonts w:ascii="Courier New" w:hAnsi="Courier New" w:cs="Courier New" w:hint="default"/>
+      </w:rPr>
+    </w:lvl>
+    <w:lvl w:ilvl="2" w:tplc="04090005" w:tentative="1">
+      <w:start w:val="1"/>
+      <w:numFmt w:val="bullet"/>
+      <w:lvlText w:val=""/>
+      <w:lvlJc w:val="left"/>
+      <w:pPr>
+        <w:ind w:left="2160" w:hanging="360"/>
+      </w:pPr>
+      <w:rPr>
+        <w:rFonts w:ascii="Wingdings" w:hAnsi="Wingdings" w:hint="default"/>
+      </w:rPr>
+    </w:lvl>
+    <w:lvl w:ilvl="3" w:tplc="04090001" w:tentative="1">
+      <w:start w:val="1"/>
+      <w:numFmt w:val="bullet"/>
+      <w:lvlText w:val=""/>
+      <w:lvlJc w:val="left"/>
+      <w:pPr>
+        <w:ind w:left="2880" w:hanging="360"/>
+      </w:pPr>
+      <w:rPr>
+        <w:rFonts w:ascii="Symbol" w:hAnsi="Symbol" w:hint="default"/>
+      </w:rPr>
+    </w:lvl>
+    <w:lvl w:ilvl="4" w:tplc="04090003" w:tentative="1">
+      <w:start w:val="1"/>
+      <w:numFmt w:val="bullet"/>
+      <w:lvlText w:val="o"/>
+      <w:lvlJc w:val="left"/>
+      <w:pPr>
+        <w:ind w:left="3600" w:hanging="360"/>
+      </w:pPr>
+      <w:rPr>
+        <w:rFonts w:ascii="Courier New" w:hAnsi="Courier New" w:cs="Courier New" w:hint="default"/>
+      </w:rPr>
+    </w:lvl>
+    <w:lvl w:ilvl="5" w:tplc="04090005" w:tentative="1">
+      <w:start w:val="1"/>
+      <w:numFmt w:val="bullet"/>
+      <w:lvlText w:val=""/>
+      <w:lvlJc w:val="left"/>
+      <w:pPr>
+        <w:ind w:left="4320" w:hanging="360"/>
+      </w:pPr>
+      <w:rPr>
+        <w:rFonts w:ascii="Wingdings" w:hAnsi="Wingdings" w:hint="default"/>
+      </w:rPr>
+    </w:lvl>
+    <w:lvl w:ilvl="6" w:tplc="04090001" w:tentative="1">
+      <w:start w:val="1"/>
+      <w:numFmt w:val="bullet"/>
+      <w:lvlText w:val=""/>
+      <w:lvlJc w:val="left"/>
+      <w:pPr>
+        <w:ind w:left="5040" w:hanging="360"/>
+      </w:pPr>
+      <w:rPr>
+        <w:rFonts w:ascii="Symbol" w:hAnsi="Symbol" w:hint="default"/>
+      </w:rPr>
+    </w:lvl>
+    <w:lvl w:ilvl="7" w:tplc="04090003" w:tentative="1">
+      <w:start w:val="1"/>
+      <w:numFmt w:val="bullet"/>
+      <w:lvlText w:val="o"/>
+      <w:lvlJc w:val="left"/>
+      <w:pPr>
+        <w:ind w:left="5760" w:hanging="360"/>
+      </w:pPr>
+      <w:rPr>
+        <w:rFonts w:ascii="Courier New" w:hAnsi="Courier New" w:cs="Courier New" w:hint="default"/>
+      </w:rPr>
+    </w:lvl>
+    <w:lvl w:ilvl="8" w:tplc="04090005" w:tentative="1">
+      <w:start w:val="1"/>
+      <w:numFmt w:val="bullet"/>
+      <w:lvlText w:val=""/>
+      <w:lvlJc w:val="left"/>
+      <w:pPr>
+        <w:ind w:left="6480" w:hanging="360"/>
+      </w:pPr>
+      <w:rPr>
+        <w:rFonts w:ascii="Wingdings" w:hAnsi="Wingdings" w:hint="default"/>
+      </w:rPr>
+    </w:lvl>
+  </w:abstractNum>
+  <w:abstractNum w:abstractNumId="30" w15:restartNumberingAfterBreak="0">
     <w:nsid w:val="3CEB3B07"/>
     <w:multiLevelType w:val="multilevel"/>
     <w:tmpl w:val="6C903DEA"/>
@@ -16439,7 +17560,7 @@
       </w:rPr>
     </w:lvl>
   </w:abstractNum>
-  <w:abstractNum w:abstractNumId="33" w15:restartNumberingAfterBreak="0">
+  <w:abstractNum w:abstractNumId="31" w15:restartNumberingAfterBreak="0">
     <w:nsid w:val="3D1E6C5B"/>
     <w:multiLevelType w:val="multilevel"/>
     <w:tmpl w:val="7D5A8D26"/>
@@ -16588,7 +17709,7 @@
       </w:rPr>
     </w:lvl>
   </w:abstractNum>
-  <w:abstractNum w:abstractNumId="34" w15:restartNumberingAfterBreak="0">
+  <w:abstractNum w:abstractNumId="32" w15:restartNumberingAfterBreak="0">
     <w:nsid w:val="3E75593D"/>
     <w:multiLevelType w:val="multilevel"/>
     <w:tmpl w:val="77E60D1C"/>
@@ -16737,7 +17858,7 @@
       </w:rPr>
     </w:lvl>
   </w:abstractNum>
-  <w:abstractNum w:abstractNumId="35" w15:restartNumberingAfterBreak="0">
+  <w:abstractNum w:abstractNumId="33" w15:restartNumberingAfterBreak="0">
     <w:nsid w:val="3FE16A64"/>
     <w:multiLevelType w:val="multilevel"/>
     <w:tmpl w:val="BAF6EC1C"/>
@@ -16886,7 +18007,7 @@
       </w:rPr>
     </w:lvl>
   </w:abstractNum>
-  <w:abstractNum w:abstractNumId="36" w15:restartNumberingAfterBreak="0">
+  <w:abstractNum w:abstractNumId="34" w15:restartNumberingAfterBreak="0">
     <w:nsid w:val="40D03BCD"/>
     <w:multiLevelType w:val="multilevel"/>
     <w:tmpl w:val="E53A8542"/>
@@ -17035,7 +18156,7 @@
       </w:rPr>
     </w:lvl>
   </w:abstractNum>
-  <w:abstractNum w:abstractNumId="37" w15:restartNumberingAfterBreak="0">
+  <w:abstractNum w:abstractNumId="35" w15:restartNumberingAfterBreak="0">
     <w:nsid w:val="4D6C676B"/>
     <w:multiLevelType w:val="multilevel"/>
     <w:tmpl w:val="864695D8"/>
@@ -17184,7 +18305,7 @@
       </w:rPr>
     </w:lvl>
   </w:abstractNum>
-  <w:abstractNum w:abstractNumId="38" w15:restartNumberingAfterBreak="0">
+  <w:abstractNum w:abstractNumId="36" w15:restartNumberingAfterBreak="0">
     <w:nsid w:val="4EC51907"/>
     <w:multiLevelType w:val="multilevel"/>
     <w:tmpl w:val="B9D0FF78"/>
@@ -17333,7 +18454,7 @@
       </w:rPr>
     </w:lvl>
   </w:abstractNum>
-  <w:abstractNum w:abstractNumId="39" w15:restartNumberingAfterBreak="0">
+  <w:abstractNum w:abstractNumId="37" w15:restartNumberingAfterBreak="0">
     <w:nsid w:val="4F720D32"/>
     <w:multiLevelType w:val="multilevel"/>
     <w:tmpl w:val="C0FE42C6"/>
@@ -17482,7 +18603,120 @@
       </w:rPr>
     </w:lvl>
   </w:abstractNum>
-  <w:abstractNum w:abstractNumId="40" w15:restartNumberingAfterBreak="0">
+  <w:abstractNum w:abstractNumId="38" w15:restartNumberingAfterBreak="0">
+    <w:nsid w:val="50C66FD1"/>
+    <w:multiLevelType w:val="hybridMultilevel"/>
+    <w:tmpl w:val="E0468BCE"/>
+    <w:lvl w:ilvl="0" w:tplc="04090001">
+      <w:start w:val="1"/>
+      <w:numFmt w:val="bullet"/>
+      <w:lvlText w:val=""/>
+      <w:lvlJc w:val="left"/>
+      <w:pPr>
+        <w:ind w:left="720" w:hanging="360"/>
+      </w:pPr>
+      <w:rPr>
+        <w:rFonts w:ascii="Symbol" w:hAnsi="Symbol" w:hint="default"/>
+      </w:rPr>
+    </w:lvl>
+    <w:lvl w:ilvl="1" w:tplc="04090003" w:tentative="1">
+      <w:start w:val="1"/>
+      <w:numFmt w:val="bullet"/>
+      <w:lvlText w:val="o"/>
+      <w:lvlJc w:val="left"/>
+      <w:pPr>
+        <w:ind w:left="1440" w:hanging="360"/>
+      </w:pPr>
+      <w:rPr>
+        <w:rFonts w:ascii="Courier New" w:hAnsi="Courier New" w:cs="Courier New" w:hint="default"/>
+      </w:rPr>
+    </w:lvl>
+    <w:lvl w:ilvl="2" w:tplc="04090005" w:tentative="1">
+      <w:start w:val="1"/>
+      <w:numFmt w:val="bullet"/>
+      <w:lvlText w:val=""/>
+      <w:lvlJc w:val="left"/>
+      <w:pPr>
+        <w:ind w:left="2160" w:hanging="360"/>
+      </w:pPr>
+      <w:rPr>
+        <w:rFonts w:ascii="Wingdings" w:hAnsi="Wingdings" w:hint="default"/>
+      </w:rPr>
+    </w:lvl>
+    <w:lvl w:ilvl="3" w:tplc="04090001" w:tentative="1">
+      <w:start w:val="1"/>
+      <w:numFmt w:val="bullet"/>
+      <w:lvlText w:val=""/>
+      <w:lvlJc w:val="left"/>
+      <w:pPr>
+        <w:ind w:left="2880" w:hanging="360"/>
+      </w:pPr>
+      <w:rPr>
+        <w:rFonts w:ascii="Symbol" w:hAnsi="Symbol" w:hint="default"/>
+      </w:rPr>
+    </w:lvl>
+    <w:lvl w:ilvl="4" w:tplc="04090003" w:tentative="1">
+      <w:start w:val="1"/>
+      <w:numFmt w:val="bullet"/>
+      <w:lvlText w:val="o"/>
+      <w:lvlJc w:val="left"/>
+      <w:pPr>
+        <w:ind w:left="3600" w:hanging="360"/>
+      </w:pPr>
+      <w:rPr>
+        <w:rFonts w:ascii="Courier New" w:hAnsi="Courier New" w:cs="Courier New" w:hint="default"/>
+      </w:rPr>
+    </w:lvl>
+    <w:lvl w:ilvl="5" w:tplc="04090005" w:tentative="1">
+      <w:start w:val="1"/>
+      <w:numFmt w:val="bullet"/>
+      <w:lvlText w:val=""/>
+      <w:lvlJc w:val="left"/>
+      <w:pPr>
+        <w:ind w:left="4320" w:hanging="360"/>
+      </w:pPr>
+      <w:rPr>
+        <w:rFonts w:ascii="Wingdings" w:hAnsi="Wingdings" w:hint="default"/>
+      </w:rPr>
+    </w:lvl>
+    <w:lvl w:ilvl="6" w:tplc="04090001" w:tentative="1">
+      <w:start w:val="1"/>
+      <w:numFmt w:val="bullet"/>
+      <w:lvlText w:val=""/>
+      <w:lvlJc w:val="left"/>
+      <w:pPr>
+        <w:ind w:left="5040" w:hanging="360"/>
+      </w:pPr>
+      <w:rPr>
+        <w:rFonts w:ascii="Symbol" w:hAnsi="Symbol" w:hint="default"/>
+      </w:rPr>
+    </w:lvl>
+    <w:lvl w:ilvl="7" w:tplc="04090003" w:tentative="1">
+      <w:start w:val="1"/>
+      <w:numFmt w:val="bullet"/>
+      <w:lvlText w:val="o"/>
+      <w:lvlJc w:val="left"/>
+      <w:pPr>
+        <w:ind w:left="5760" w:hanging="360"/>
+      </w:pPr>
+      <w:rPr>
+        <w:rFonts w:ascii="Courier New" w:hAnsi="Courier New" w:cs="Courier New" w:hint="default"/>
+      </w:rPr>
+    </w:lvl>
+    <w:lvl w:ilvl="8" w:tplc="04090005" w:tentative="1">
+      <w:start w:val="1"/>
+      <w:numFmt w:val="bullet"/>
+      <w:lvlText w:val=""/>
+      <w:lvlJc w:val="left"/>
+      <w:pPr>
+        <w:ind w:left="6480" w:hanging="360"/>
+      </w:pPr>
+      <w:rPr>
+        <w:rFonts w:ascii="Wingdings" w:hAnsi="Wingdings" w:hint="default"/>
+      </w:rPr>
+    </w:lvl>
+  </w:abstractNum>
+  <w:abstractNum w:abstractNumId="39" w15:restartNumberingAfterBreak="0">
     <w:nsid w:val="51CB0FFF"/>
     <w:multiLevelType w:val="multilevel"/>
     <w:tmpl w:val="C4269EBC"/>
@@ -17631,7 +18865,7 @@
       </w:rPr>
     </w:lvl>
   </w:abstractNum>
-  <w:abstractNum w:abstractNumId="41" w15:restartNumberingAfterBreak="0">
+  <w:abstractNum w:abstractNumId="40" w15:restartNumberingAfterBreak="0">
     <w:nsid w:val="51F43525"/>
     <w:multiLevelType w:val="multilevel"/>
     <w:tmpl w:val="17FC6A90"/>
@@ -17780,7 +19014,7 @@
       </w:rPr>
     </w:lvl>
   </w:abstractNum>
-  <w:abstractNum w:abstractNumId="42" w15:restartNumberingAfterBreak="0">
+  <w:abstractNum w:abstractNumId="41" w15:restartNumberingAfterBreak="0">
     <w:nsid w:val="520C5DD3"/>
     <w:multiLevelType w:val="multilevel"/>
     <w:tmpl w:val="753AC0D2"/>
@@ -17929,7 +19163,7 @@
       </w:rPr>
     </w:lvl>
   </w:abstractNum>
-  <w:abstractNum w:abstractNumId="43" w15:restartNumberingAfterBreak="0">
+  <w:abstractNum w:abstractNumId="42" w15:restartNumberingAfterBreak="0">
     <w:nsid w:val="53F5143F"/>
     <w:multiLevelType w:val="hybridMultilevel"/>
     <w:tmpl w:val="B2005722"/>
@@ -18042,7 +19276,7 @@
       </w:rPr>
     </w:lvl>
   </w:abstractNum>
-  <w:abstractNum w:abstractNumId="44" w15:restartNumberingAfterBreak="0">
+  <w:abstractNum w:abstractNumId="43" w15:restartNumberingAfterBreak="0">
     <w:nsid w:val="5418548D"/>
     <w:multiLevelType w:val="multilevel"/>
     <w:tmpl w:val="F3745D64"/>
@@ -18191,7 +19425,7 @@
       </w:rPr>
     </w:lvl>
   </w:abstractNum>
-  <w:abstractNum w:abstractNumId="45" w15:restartNumberingAfterBreak="0">
+  <w:abstractNum w:abstractNumId="44" w15:restartNumberingAfterBreak="0">
     <w:nsid w:val="54E51C22"/>
     <w:multiLevelType w:val="hybridMultilevel"/>
     <w:tmpl w:val="D9A89FBA"/>
@@ -18304,7 +19538,7 @@
       </w:rPr>
     </w:lvl>
   </w:abstractNum>
-  <w:abstractNum w:abstractNumId="46" w15:restartNumberingAfterBreak="0">
+  <w:abstractNum w:abstractNumId="45" w15:restartNumberingAfterBreak="0">
     <w:nsid w:val="56141124"/>
     <w:multiLevelType w:val="multilevel"/>
     <w:tmpl w:val="72CECC2A"/>
@@ -18453,7 +19687,7 @@
       </w:rPr>
     </w:lvl>
   </w:abstractNum>
-  <w:abstractNum w:abstractNumId="47" w15:restartNumberingAfterBreak="0">
+  <w:abstractNum w:abstractNumId="46" w15:restartNumberingAfterBreak="0">
     <w:nsid w:val="5668129C"/>
     <w:multiLevelType w:val="multilevel"/>
     <w:tmpl w:val="193EC38C"/>
@@ -18602,7 +19836,7 @@
       </w:rPr>
     </w:lvl>
   </w:abstractNum>
-  <w:abstractNum w:abstractNumId="48" w15:restartNumberingAfterBreak="0">
+  <w:abstractNum w:abstractNumId="47" w15:restartNumberingAfterBreak="0">
     <w:nsid w:val="5BD530F4"/>
     <w:multiLevelType w:val="multilevel"/>
     <w:tmpl w:val="85BE4242"/>
@@ -18751,7 +19985,7 @@
       </w:rPr>
     </w:lvl>
   </w:abstractNum>
-  <w:abstractNum w:abstractNumId="49" w15:restartNumberingAfterBreak="0">
+  <w:abstractNum w:abstractNumId="48" w15:restartNumberingAfterBreak="0">
     <w:nsid w:val="5F797678"/>
     <w:multiLevelType w:val="multilevel"/>
     <w:tmpl w:val="4BE291F8"/>
@@ -18900,7 +20134,7 @@
       </w:rPr>
     </w:lvl>
   </w:abstractNum>
-  <w:abstractNum w:abstractNumId="50" w15:restartNumberingAfterBreak="0">
+  <w:abstractNum w:abstractNumId="49" w15:restartNumberingAfterBreak="0">
     <w:nsid w:val="64B00720"/>
     <w:multiLevelType w:val="multilevel"/>
     <w:tmpl w:val="ECA4E594"/>
@@ -19049,7 +20283,7 @@
       </w:rPr>
     </w:lvl>
   </w:abstractNum>
-  <w:abstractNum w:abstractNumId="51" w15:restartNumberingAfterBreak="0">
+  <w:abstractNum w:abstractNumId="50" w15:restartNumberingAfterBreak="0">
     <w:nsid w:val="64D8791F"/>
     <w:multiLevelType w:val="multilevel"/>
     <w:tmpl w:val="C818DFEE"/>
@@ -19198,7 +20432,7 @@
       </w:rPr>
     </w:lvl>
   </w:abstractNum>
-  <w:abstractNum w:abstractNumId="52" w15:restartNumberingAfterBreak="0">
+  <w:abstractNum w:abstractNumId="51" w15:restartNumberingAfterBreak="0">
     <w:nsid w:val="65220CC3"/>
     <w:multiLevelType w:val="multilevel"/>
     <w:tmpl w:val="8D34722E"/>
@@ -19344,6 +20578,119 @@
       <w:rPr>
         <w:rFonts w:ascii="Wingdings" w:hAnsi="Wingdings" w:hint="default"/>
         <w:sz w:val="20"/>
+      </w:rPr>
+    </w:lvl>
+  </w:abstractNum>
+  <w:abstractNum w:abstractNumId="52" w15:restartNumberingAfterBreak="0">
+    <w:nsid w:val="66383948"/>
+    <w:multiLevelType w:val="hybridMultilevel"/>
+    <w:tmpl w:val="938C0E22"/>
+    <w:lvl w:ilvl="0" w:tplc="04090001">
+      <w:start w:val="1"/>
+      <w:numFmt w:val="bullet"/>
+      <w:lvlText w:val=""/>
+      <w:lvlJc w:val="left"/>
+      <w:pPr>
+        <w:ind w:left="720" w:hanging="360"/>
+      </w:pPr>
+      <w:rPr>
+        <w:rFonts w:ascii="Symbol" w:hAnsi="Symbol" w:hint="default"/>
+      </w:rPr>
+    </w:lvl>
+    <w:lvl w:ilvl="1" w:tplc="04090003" w:tentative="1">
+      <w:start w:val="1"/>
+      <w:numFmt w:val="bullet"/>
+      <w:lvlText w:val="o"/>
+      <w:lvlJc w:val="left"/>
+      <w:pPr>
+        <w:ind w:left="1440" w:hanging="360"/>
+      </w:pPr>
+      <w:rPr>
+        <w:rFonts w:ascii="Courier New" w:hAnsi="Courier New" w:cs="Courier New" w:hint="default"/>
+      </w:rPr>
+    </w:lvl>
+    <w:lvl w:ilvl="2" w:tplc="04090005" w:tentative="1">
+      <w:start w:val="1"/>
+      <w:numFmt w:val="bullet"/>
+      <w:lvlText w:val=""/>
+      <w:lvlJc w:val="left"/>
+      <w:pPr>
+        <w:ind w:left="2160" w:hanging="360"/>
+      </w:pPr>
+      <w:rPr>
+        <w:rFonts w:ascii="Wingdings" w:hAnsi="Wingdings" w:hint="default"/>
+      </w:rPr>
+    </w:lvl>
+    <w:lvl w:ilvl="3" w:tplc="04090001" w:tentative="1">
+      <w:start w:val="1"/>
+      <w:numFmt w:val="bullet"/>
+      <w:lvlText w:val=""/>
+      <w:lvlJc w:val="left"/>
+      <w:pPr>
+        <w:ind w:left="2880" w:hanging="360"/>
+      </w:pPr>
+      <w:rPr>
+        <w:rFonts w:ascii="Symbol" w:hAnsi="Symbol" w:hint="default"/>
+      </w:rPr>
+    </w:lvl>
+    <w:lvl w:ilvl="4" w:tplc="04090003" w:tentative="1">
+      <w:start w:val="1"/>
+      <w:numFmt w:val="bullet"/>
+      <w:lvlText w:val="o"/>
+      <w:lvlJc w:val="left"/>
+      <w:pPr>
+        <w:ind w:left="3600" w:hanging="360"/>
+      </w:pPr>
+      <w:rPr>
+        <w:rFonts w:ascii="Courier New" w:hAnsi="Courier New" w:cs="Courier New" w:hint="default"/>
+      </w:rPr>
+    </w:lvl>
+    <w:lvl w:ilvl="5" w:tplc="04090005" w:tentative="1">
+      <w:start w:val="1"/>
+      <w:numFmt w:val="bullet"/>
+      <w:lvlText w:val=""/>
+      <w:lvlJc w:val="left"/>
+      <w:pPr>
+        <w:ind w:left="4320" w:hanging="360"/>
+      </w:pPr>
+      <w:rPr>
+        <w:rFonts w:ascii="Wingdings" w:hAnsi="Wingdings" w:hint="default"/>
+      </w:rPr>
+    </w:lvl>
+    <w:lvl w:ilvl="6" w:tplc="04090001" w:tentative="1">
+      <w:start w:val="1"/>
+      <w:numFmt w:val="bullet"/>
+      <w:lvlText w:val=""/>
+      <w:lvlJc w:val="left"/>
+      <w:pPr>
+        <w:ind w:left="5040" w:hanging="360"/>
+      </w:pPr>
+      <w:rPr>
+        <w:rFonts w:ascii="Symbol" w:hAnsi="Symbol" w:hint="default"/>
+      </w:rPr>
+    </w:lvl>
+    <w:lvl w:ilvl="7" w:tplc="04090003" w:tentative="1">
+      <w:start w:val="1"/>
+      <w:numFmt w:val="bullet"/>
+      <w:lvlText w:val="o"/>
+      <w:lvlJc w:val="left"/>
+      <w:pPr>
+        <w:ind w:left="5760" w:hanging="360"/>
+      </w:pPr>
+      <w:rPr>
+        <w:rFonts w:ascii="Courier New" w:hAnsi="Courier New" w:cs="Courier New" w:hint="default"/>
+      </w:rPr>
+    </w:lvl>
+    <w:lvl w:ilvl="8" w:tplc="04090005" w:tentative="1">
+      <w:start w:val="1"/>
+      <w:numFmt w:val="bullet"/>
+      <w:lvlText w:val=""/>
+      <w:lvlJc w:val="left"/>
+      <w:pPr>
+        <w:ind w:left="6480" w:hanging="360"/>
+      </w:pPr>
+      <w:rPr>
+        <w:rFonts w:ascii="Wingdings" w:hAnsi="Wingdings" w:hint="default"/>
       </w:rPr>
     </w:lvl>
   </w:abstractNum>
@@ -19908,6 +21255,119 @@
     </w:lvl>
   </w:abstractNum>
   <w:abstractNum w:abstractNumId="57" w15:restartNumberingAfterBreak="0">
+    <w:nsid w:val="7315484B"/>
+    <w:multiLevelType w:val="hybridMultilevel"/>
+    <w:tmpl w:val="AABA4838"/>
+    <w:lvl w:ilvl="0" w:tplc="04090001">
+      <w:start w:val="1"/>
+      <w:numFmt w:val="bullet"/>
+      <w:lvlText w:val=""/>
+      <w:lvlJc w:val="left"/>
+      <w:pPr>
+        <w:ind w:left="720" w:hanging="360"/>
+      </w:pPr>
+      <w:rPr>
+        <w:rFonts w:ascii="Symbol" w:hAnsi="Symbol" w:hint="default"/>
+      </w:rPr>
+    </w:lvl>
+    <w:lvl w:ilvl="1" w:tplc="04090003">
+      <w:start w:val="1"/>
+      <w:numFmt w:val="bullet"/>
+      <w:lvlText w:val="o"/>
+      <w:lvlJc w:val="left"/>
+      <w:pPr>
+        <w:ind w:left="1440" w:hanging="360"/>
+      </w:pPr>
+      <w:rPr>
+        <w:rFonts w:ascii="Courier New" w:hAnsi="Courier New" w:cs="Courier New" w:hint="default"/>
+      </w:rPr>
+    </w:lvl>
+    <w:lvl w:ilvl="2" w:tplc="04090005" w:tentative="1">
+      <w:start w:val="1"/>
+      <w:numFmt w:val="bullet"/>
+      <w:lvlText w:val=""/>
+      <w:lvlJc w:val="left"/>
+      <w:pPr>
+        <w:ind w:left="2160" w:hanging="360"/>
+      </w:pPr>
+      <w:rPr>
+        <w:rFonts w:ascii="Wingdings" w:hAnsi="Wingdings" w:hint="default"/>
+      </w:rPr>
+    </w:lvl>
+    <w:lvl w:ilvl="3" w:tplc="04090001" w:tentative="1">
+      <w:start w:val="1"/>
+      <w:numFmt w:val="bullet"/>
+      <w:lvlText w:val=""/>
+      <w:lvlJc w:val="left"/>
+      <w:pPr>
+        <w:ind w:left="2880" w:hanging="360"/>
+      </w:pPr>
+      <w:rPr>
+        <w:rFonts w:ascii="Symbol" w:hAnsi="Symbol" w:hint="default"/>
+      </w:rPr>
+    </w:lvl>
+    <w:lvl w:ilvl="4" w:tplc="04090003" w:tentative="1">
+      <w:start w:val="1"/>
+      <w:numFmt w:val="bullet"/>
+      <w:lvlText w:val="o"/>
+      <w:lvlJc w:val="left"/>
+      <w:pPr>
+        <w:ind w:left="3600" w:hanging="360"/>
+      </w:pPr>
+      <w:rPr>
+        <w:rFonts w:ascii="Courier New" w:hAnsi="Courier New" w:cs="Courier New" w:hint="default"/>
+      </w:rPr>
+    </w:lvl>
+    <w:lvl w:ilvl="5" w:tplc="04090005" w:tentative="1">
+      <w:start w:val="1"/>
+      <w:numFmt w:val="bullet"/>
+      <w:lvlText w:val=""/>
+      <w:lvlJc w:val="left"/>
+      <w:pPr>
+        <w:ind w:left="4320" w:hanging="360"/>
+      </w:pPr>
+      <w:rPr>
+        <w:rFonts w:ascii="Wingdings" w:hAnsi="Wingdings" w:hint="default"/>
+      </w:rPr>
+    </w:lvl>
+    <w:lvl w:ilvl="6" w:tplc="04090001" w:tentative="1">
+      <w:start w:val="1"/>
+      <w:numFmt w:val="bullet"/>
+      <w:lvlText w:val=""/>
+      <w:lvlJc w:val="left"/>
+      <w:pPr>
+        <w:ind w:left="5040" w:hanging="360"/>
+      </w:pPr>
+      <w:rPr>
+        <w:rFonts w:ascii="Symbol" w:hAnsi="Symbol" w:hint="default"/>
+      </w:rPr>
+    </w:lvl>
+    <w:lvl w:ilvl="7" w:tplc="04090003" w:tentative="1">
+      <w:start w:val="1"/>
+      <w:numFmt w:val="bullet"/>
+      <w:lvlText w:val="o"/>
+      <w:lvlJc w:val="left"/>
+      <w:pPr>
+        <w:ind w:left="5760" w:hanging="360"/>
+      </w:pPr>
+      <w:rPr>
+        <w:rFonts w:ascii="Courier New" w:hAnsi="Courier New" w:cs="Courier New" w:hint="default"/>
+      </w:rPr>
+    </w:lvl>
+    <w:lvl w:ilvl="8" w:tplc="04090005" w:tentative="1">
+      <w:start w:val="1"/>
+      <w:numFmt w:val="bullet"/>
+      <w:lvlText w:val=""/>
+      <w:lvlJc w:val="left"/>
+      <w:pPr>
+        <w:ind w:left="6480" w:hanging="360"/>
+      </w:pPr>
+      <w:rPr>
+        <w:rFonts w:ascii="Wingdings" w:hAnsi="Wingdings" w:hint="default"/>
+      </w:rPr>
+    </w:lvl>
+  </w:abstractNum>
+  <w:abstractNum w:abstractNumId="58" w15:restartNumberingAfterBreak="0">
     <w:nsid w:val="77AE223B"/>
     <w:multiLevelType w:val="multilevel"/>
     <w:tmpl w:val="E7AC683A"/>
@@ -20056,7 +21516,7 @@
       </w:rPr>
     </w:lvl>
   </w:abstractNum>
-  <w:abstractNum w:abstractNumId="58" w15:restartNumberingAfterBreak="0">
+  <w:abstractNum w:abstractNumId="59" w15:restartNumberingAfterBreak="0">
     <w:nsid w:val="7C261037"/>
     <w:multiLevelType w:val="multilevel"/>
     <w:tmpl w:val="910E7076"/>
@@ -20205,7 +21665,7 @@
       </w:rPr>
     </w:lvl>
   </w:abstractNum>
-  <w:abstractNum w:abstractNumId="59" w15:restartNumberingAfterBreak="0">
+  <w:abstractNum w:abstractNumId="60" w15:restartNumberingAfterBreak="0">
     <w:nsid w:val="7C3B2547"/>
     <w:multiLevelType w:val="multilevel"/>
     <w:tmpl w:val="B18CE0AE"/>
@@ -20354,7 +21814,7 @@
       </w:rPr>
     </w:lvl>
   </w:abstractNum>
-  <w:abstractNum w:abstractNumId="60" w15:restartNumberingAfterBreak="0">
+  <w:abstractNum w:abstractNumId="61" w15:restartNumberingAfterBreak="0">
     <w:nsid w:val="7C495741"/>
     <w:multiLevelType w:val="multilevel"/>
     <w:tmpl w:val="31921748"/>
@@ -20467,110 +21927,222 @@
       </w:pPr>
     </w:lvl>
   </w:abstractNum>
+  <w:abstractNum w:abstractNumId="62" w15:restartNumberingAfterBreak="0">
+    <w:nsid w:val="7D050E13"/>
+    <w:multiLevelType w:val="hybridMultilevel"/>
+    <w:tmpl w:val="4410AC02"/>
+    <w:lvl w:ilvl="0" w:tplc="04090001">
+      <w:start w:val="1"/>
+      <w:numFmt w:val="bullet"/>
+      <w:lvlText w:val=""/>
+      <w:lvlJc w:val="left"/>
+      <w:pPr>
+        <w:ind w:left="720" w:hanging="360"/>
+      </w:pPr>
+      <w:rPr>
+        <w:rFonts w:ascii="Symbol" w:hAnsi="Symbol" w:hint="default"/>
+      </w:rPr>
+    </w:lvl>
+    <w:lvl w:ilvl="1" w:tplc="AA96E2FE">
+      <w:numFmt w:val="bullet"/>
+      <w:lvlText w:val="•"/>
+      <w:lvlJc w:val="left"/>
+      <w:pPr>
+        <w:ind w:left="1800" w:hanging="720"/>
+      </w:pPr>
+      <w:rPr>
+        <w:rFonts w:ascii="Times New Roman" w:eastAsia="Times New Roman" w:hAnsi="Times New Roman" w:cs="Times New Roman" w:hint="default"/>
+      </w:rPr>
+    </w:lvl>
+    <w:lvl w:ilvl="2" w:tplc="04090005" w:tentative="1">
+      <w:start w:val="1"/>
+      <w:numFmt w:val="bullet"/>
+      <w:lvlText w:val=""/>
+      <w:lvlJc w:val="left"/>
+      <w:pPr>
+        <w:ind w:left="2160" w:hanging="360"/>
+      </w:pPr>
+      <w:rPr>
+        <w:rFonts w:ascii="Wingdings" w:hAnsi="Wingdings" w:hint="default"/>
+      </w:rPr>
+    </w:lvl>
+    <w:lvl w:ilvl="3" w:tplc="04090001" w:tentative="1">
+      <w:start w:val="1"/>
+      <w:numFmt w:val="bullet"/>
+      <w:lvlText w:val=""/>
+      <w:lvlJc w:val="left"/>
+      <w:pPr>
+        <w:ind w:left="2880" w:hanging="360"/>
+      </w:pPr>
+      <w:rPr>
+        <w:rFonts w:ascii="Symbol" w:hAnsi="Symbol" w:hint="default"/>
+      </w:rPr>
+    </w:lvl>
+    <w:lvl w:ilvl="4" w:tplc="04090003" w:tentative="1">
+      <w:start w:val="1"/>
+      <w:numFmt w:val="bullet"/>
+      <w:lvlText w:val="o"/>
+      <w:lvlJc w:val="left"/>
+      <w:pPr>
+        <w:ind w:left="3600" w:hanging="360"/>
+      </w:pPr>
+      <w:rPr>
+        <w:rFonts w:ascii="Courier New" w:hAnsi="Courier New" w:cs="Courier New" w:hint="default"/>
+      </w:rPr>
+    </w:lvl>
+    <w:lvl w:ilvl="5" w:tplc="04090005" w:tentative="1">
+      <w:start w:val="1"/>
+      <w:numFmt w:val="bullet"/>
+      <w:lvlText w:val=""/>
+      <w:lvlJc w:val="left"/>
+      <w:pPr>
+        <w:ind w:left="4320" w:hanging="360"/>
+      </w:pPr>
+      <w:rPr>
+        <w:rFonts w:ascii="Wingdings" w:hAnsi="Wingdings" w:hint="default"/>
+      </w:rPr>
+    </w:lvl>
+    <w:lvl w:ilvl="6" w:tplc="04090001" w:tentative="1">
+      <w:start w:val="1"/>
+      <w:numFmt w:val="bullet"/>
+      <w:lvlText w:val=""/>
+      <w:lvlJc w:val="left"/>
+      <w:pPr>
+        <w:ind w:left="5040" w:hanging="360"/>
+      </w:pPr>
+      <w:rPr>
+        <w:rFonts w:ascii="Symbol" w:hAnsi="Symbol" w:hint="default"/>
+      </w:rPr>
+    </w:lvl>
+    <w:lvl w:ilvl="7" w:tplc="04090003" w:tentative="1">
+      <w:start w:val="1"/>
+      <w:numFmt w:val="bullet"/>
+      <w:lvlText w:val="o"/>
+      <w:lvlJc w:val="left"/>
+      <w:pPr>
+        <w:ind w:left="5760" w:hanging="360"/>
+      </w:pPr>
+      <w:rPr>
+        <w:rFonts w:ascii="Courier New" w:hAnsi="Courier New" w:cs="Courier New" w:hint="default"/>
+      </w:rPr>
+    </w:lvl>
+    <w:lvl w:ilvl="8" w:tplc="04090005" w:tentative="1">
+      <w:start w:val="1"/>
+      <w:numFmt w:val="bullet"/>
+      <w:lvlText w:val=""/>
+      <w:lvlJc w:val="left"/>
+      <w:pPr>
+        <w:ind w:left="6480" w:hanging="360"/>
+      </w:pPr>
+      <w:rPr>
+        <w:rFonts w:ascii="Wingdings" w:hAnsi="Wingdings" w:hint="default"/>
+      </w:rPr>
+    </w:lvl>
+  </w:abstractNum>
   <w:num w:numId="1">
-    <w:abstractNumId w:val="19"/>
+    <w:abstractNumId w:val="18"/>
   </w:num>
   <w:num w:numId="2">
-    <w:abstractNumId w:val="11"/>
+    <w:abstractNumId w:val="10"/>
   </w:num>
   <w:num w:numId="3">
-    <w:abstractNumId w:val="35"/>
+    <w:abstractNumId w:val="33"/>
   </w:num>
   <w:num w:numId="4">
-    <w:abstractNumId w:val="46"/>
+    <w:abstractNumId w:val="45"/>
   </w:num>
   <w:num w:numId="5">
     <w:abstractNumId w:val="3"/>
   </w:num>
   <w:num w:numId="6">
-    <w:abstractNumId w:val="58"/>
+    <w:abstractNumId w:val="59"/>
   </w:num>
   <w:num w:numId="7">
-    <w:abstractNumId w:val="59"/>
+    <w:abstractNumId w:val="60"/>
   </w:num>
   <w:num w:numId="8">
-    <w:abstractNumId w:val="57"/>
+    <w:abstractNumId w:val="58"/>
   </w:num>
   <w:num w:numId="9">
     <w:abstractNumId w:val="4"/>
   </w:num>
   <w:num w:numId="10">
-    <w:abstractNumId w:val="14"/>
+    <w:abstractNumId w:val="13"/>
   </w:num>
   <w:num w:numId="11">
-    <w:abstractNumId w:val="48"/>
+    <w:abstractNumId w:val="47"/>
   </w:num>
   <w:num w:numId="12">
-    <w:abstractNumId w:val="22"/>
+    <w:abstractNumId w:val="21"/>
   </w:num>
   <w:num w:numId="13">
     <w:abstractNumId w:val="53"/>
   </w:num>
   <w:num w:numId="14">
-    <w:abstractNumId w:val="15"/>
+    <w:abstractNumId w:val="14"/>
   </w:num>
   <w:num w:numId="15">
-    <w:abstractNumId w:val="43"/>
+    <w:abstractNumId w:val="42"/>
   </w:num>
   <w:num w:numId="16">
-    <w:abstractNumId w:val="13"/>
+    <w:abstractNumId w:val="12"/>
   </w:num>
   <w:num w:numId="17">
-    <w:abstractNumId w:val="60"/>
+    <w:abstractNumId w:val="61"/>
   </w:num>
   <w:num w:numId="18">
-    <w:abstractNumId w:val="37"/>
+    <w:abstractNumId w:val="35"/>
   </w:num>
   <w:num w:numId="19">
     <w:abstractNumId w:val="2"/>
   </w:num>
   <w:num w:numId="20">
-    <w:abstractNumId w:val="38"/>
+    <w:abstractNumId w:val="36"/>
   </w:num>
   <w:num w:numId="21">
-    <w:abstractNumId w:val="51"/>
+    <w:abstractNumId w:val="50"/>
   </w:num>
   <w:num w:numId="22">
-    <w:abstractNumId w:val="33"/>
+    <w:abstractNumId w:val="31"/>
   </w:num>
   <w:num w:numId="23">
-    <w:abstractNumId w:val="24"/>
+    <w:abstractNumId w:val="23"/>
   </w:num>
   <w:num w:numId="24">
-    <w:abstractNumId w:val="44"/>
+    <w:abstractNumId w:val="43"/>
   </w:num>
   <w:num w:numId="25">
     <w:abstractNumId w:val="5"/>
   </w:num>
   <w:num w:numId="26">
-    <w:abstractNumId w:val="50"/>
+    <w:abstractNumId w:val="49"/>
   </w:num>
   <w:num w:numId="27">
-    <w:abstractNumId w:val="49"/>
+    <w:abstractNumId w:val="48"/>
   </w:num>
   <w:num w:numId="28">
-    <w:abstractNumId w:val="23"/>
+    <w:abstractNumId w:val="22"/>
   </w:num>
   <w:num w:numId="29">
-    <w:abstractNumId w:val="18"/>
+    <w:abstractNumId w:val="17"/>
   </w:num>
   <w:num w:numId="30">
-    <w:abstractNumId w:val="10"/>
+    <w:abstractNumId w:val="9"/>
   </w:num>
   <w:num w:numId="31">
-    <w:abstractNumId w:val="25"/>
+    <w:abstractNumId w:val="24"/>
   </w:num>
   <w:num w:numId="32">
+    <w:abstractNumId w:val="30"/>
+  </w:num>
+  <w:num w:numId="33">
+    <w:abstractNumId w:val="19"/>
+  </w:num>
+  <w:num w:numId="34">
     <w:abstractNumId w:val="32"/>
   </w:num>
-  <w:num w:numId="33">
-    <w:abstractNumId w:val="20"/>
-  </w:num>
-  <w:num w:numId="34">
-    <w:abstractNumId w:val="34"/>
-  </w:num>
   <w:num w:numId="35">
-    <w:abstractNumId w:val="45"/>
+    <w:abstractNumId w:val="44"/>
   </w:num>
   <w:num w:numId="36">
     <w:abstractNumId w:val="7"/>
@@ -20585,72 +22157,78 @@
     <w:abstractNumId w:val="55"/>
   </w:num>
   <w:num w:numId="40">
-    <w:abstractNumId w:val="39"/>
+    <w:abstractNumId w:val="37"/>
   </w:num>
   <w:num w:numId="41">
     <w:abstractNumId w:val="6"/>
   </w:num>
   <w:num w:numId="42">
-    <w:abstractNumId w:val="30"/>
+    <w:abstractNumId w:val="27"/>
   </w:num>
   <w:num w:numId="43">
     <w:abstractNumId w:val="54"/>
   </w:num>
   <w:num w:numId="44">
-    <w:abstractNumId w:val="29"/>
+    <w:abstractNumId w:val="26"/>
   </w:num>
   <w:num w:numId="45">
-    <w:abstractNumId w:val="21"/>
+    <w:abstractNumId w:val="20"/>
   </w:num>
   <w:num w:numId="46">
-    <w:abstractNumId w:val="41"/>
+    <w:abstractNumId w:val="40"/>
   </w:num>
   <w:num w:numId="47">
-    <w:abstractNumId w:val="47"/>
+    <w:abstractNumId w:val="46"/>
   </w:num>
   <w:num w:numId="48">
-    <w:abstractNumId w:val="27"/>
+    <w:abstractNumId w:val="25"/>
   </w:num>
   <w:num w:numId="49">
     <w:abstractNumId w:val="1"/>
   </w:num>
   <w:num w:numId="50">
-    <w:abstractNumId w:val="26"/>
+    <w:abstractNumId w:val="16"/>
   </w:num>
   <w:num w:numId="51">
-    <w:abstractNumId w:val="9"/>
+    <w:abstractNumId w:val="28"/>
   </w:num>
   <w:num w:numId="52">
-    <w:abstractNumId w:val="28"/>
+    <w:abstractNumId w:val="34"/>
   </w:num>
   <w:num w:numId="53">
-    <w:abstractNumId w:val="17"/>
+    <w:abstractNumId w:val="39"/>
   </w:num>
   <w:num w:numId="54">
-    <w:abstractNumId w:val="31"/>
+    <w:abstractNumId w:val="15"/>
   </w:num>
   <w:num w:numId="55">
-    <w:abstractNumId w:val="36"/>
+    <w:abstractNumId w:val="0"/>
   </w:num>
   <w:num w:numId="56">
-    <w:abstractNumId w:val="40"/>
+    <w:abstractNumId w:val="11"/>
   </w:num>
   <w:num w:numId="57">
-    <w:abstractNumId w:val="16"/>
+    <w:abstractNumId w:val="41"/>
   </w:num>
   <w:num w:numId="58">
-    <w:abstractNumId w:val="0"/>
+    <w:abstractNumId w:val="51"/>
   </w:num>
   <w:num w:numId="59">
-    <w:abstractNumId w:val="12"/>
+    <w:abstractNumId w:val="62"/>
   </w:num>
   <w:num w:numId="60">
-    <w:abstractNumId w:val="42"/>
+    <w:abstractNumId w:val="29"/>
   </w:num>
   <w:num w:numId="61">
+    <w:abstractNumId w:val="57"/>
+  </w:num>
+  <w:num w:numId="62">
+    <w:abstractNumId w:val="38"/>
+  </w:num>
+  <w:num w:numId="63">
     <w:abstractNumId w:val="52"/>
   </w:num>
-  <w:numIdMacAtCleanup w:val="52"/>
+  <w:numIdMacAtCleanup w:val="63"/>
 </w:numbering>
 </file>
 
@@ -21047,7 +22625,7 @@
   <w:style w:type="paragraph" w:default="1" w:styleId="Normal">
     <w:name w:val="Normal"/>
     <w:qFormat/>
-    <w:rsid w:val="008402C1"/>
+    <w:rsid w:val="0027139D"/>
   </w:style>
   <w:style w:type="paragraph" w:styleId="Heading2">
     <w:name w:val="heading 2"/>
@@ -21461,7 +23039,7 @@
 </file>
 
 <file path=customXml/itemProps1.xml><?xml version="1.0" encoding="utf-8"?>
-<ds:datastoreItem xmlns:ds="http://schemas.openxmlformats.org/officeDocument/2006/customXml" ds:itemID="{C4F1C612-1C4D-447E-8E08-ABEBFA782B1B}">
+<ds:datastoreItem xmlns:ds="http://schemas.openxmlformats.org/officeDocument/2006/customXml" ds:itemID="{A8713990-3298-463D-8CF1-961810F08DDC}">
   <ds:schemaRefs>
     <ds:schemaRef ds:uri="http://schemas.openxmlformats.org/officeDocument/2006/bibliography"/>
   </ds:schemaRefs>

</xml_diff>

<commit_message>
Profiling refinements, bridge updates, architecture documentation, and supporting work files
</commit_message>
<xml_diff>
--- a/docs/01_Daily_Log.docx
+++ b/docs/01_Daily_Log.docx
@@ -8049,25 +8049,7 @@
           <w:sz w:val="24"/>
           <w:szCs w:val="24"/>
         </w:rPr>
-        <w:t xml:space="preserve"> 27</w:t>
-      </w:r>
-      <w:r>
-        <w:rPr>
-          <w:rFonts w:ascii="Times New Roman" w:eastAsia="Times New Roman" w:hAnsi="Times New Roman" w:cs="Times New Roman"/>
-          <w:b/>
-          <w:sz w:val="24"/>
-          <w:szCs w:val="24"/>
-        </w:rPr>
-        <w:t xml:space="preserve">/01/2026                                                                                    </w:t>
-      </w:r>
-      <w:r>
-        <w:rPr>
-          <w:rFonts w:ascii="Times New Roman" w:eastAsia="Times New Roman" w:hAnsi="Times New Roman" w:cs="Times New Roman"/>
-          <w:b/>
-          <w:sz w:val="24"/>
-          <w:szCs w:val="24"/>
-        </w:rPr>
-        <w:t xml:space="preserve">                          Day 15</w:t>
+        <w:t xml:space="preserve"> 27/01/2026                                                                                                              Day 15</w:t>
       </w:r>
       <w:r>
         <w:rPr>
@@ -8129,12 +8111,18 @@
     <w:p>
       <w:pPr>
         <w:pStyle w:val="Heading3"/>
+        <w:rPr>
+          <w:sz w:val="24"/>
+          <w:szCs w:val="24"/>
+        </w:rPr>
       </w:pPr>
       <w:r>
         <w:rPr>
           <w:rStyle w:val="Strong"/>
           <w:b/>
           <w:bCs/>
+          <w:sz w:val="24"/>
+          <w:szCs w:val="24"/>
         </w:rPr>
         <w:t>Objective of the Day</w:t>
       </w:r>
@@ -8150,12 +8138,18 @@
     <w:p>
       <w:pPr>
         <w:pStyle w:val="Heading3"/>
+        <w:rPr>
+          <w:sz w:val="24"/>
+          <w:szCs w:val="24"/>
+        </w:rPr>
       </w:pPr>
       <w:r>
         <w:rPr>
           <w:rStyle w:val="Strong"/>
           <w:b/>
           <w:bCs/>
+          <w:sz w:val="24"/>
+          <w:szCs w:val="24"/>
         </w:rPr>
         <w:t>Activities Performed</w:t>
       </w:r>
@@ -8236,12 +8230,18 @@
     <w:p>
       <w:pPr>
         <w:pStyle w:val="Heading3"/>
+        <w:rPr>
+          <w:sz w:val="24"/>
+          <w:szCs w:val="24"/>
+        </w:rPr>
       </w:pPr>
       <w:r>
         <w:rPr>
           <w:rStyle w:val="Strong"/>
           <w:b/>
           <w:bCs/>
+          <w:sz w:val="24"/>
+          <w:szCs w:val="24"/>
         </w:rPr>
         <w:t>Outcome of the Day</w:t>
       </w:r>
@@ -8269,12 +8269,18 @@
     <w:p>
       <w:pPr>
         <w:pStyle w:val="Heading3"/>
+        <w:rPr>
+          <w:sz w:val="24"/>
+          <w:szCs w:val="24"/>
+        </w:rPr>
       </w:pPr>
       <w:r>
         <w:rPr>
           <w:rStyle w:val="Strong"/>
           <w:b/>
           <w:bCs/>
+          <w:sz w:val="24"/>
+          <w:szCs w:val="24"/>
         </w:rPr>
         <w:t>Key Learnings</w:t>
       </w:r>
@@ -8298,12 +8304,18 @@
     <w:p>
       <w:pPr>
         <w:pStyle w:val="Heading3"/>
+        <w:rPr>
+          <w:sz w:val="24"/>
+          <w:szCs w:val="24"/>
+        </w:rPr>
       </w:pPr>
       <w:r>
         <w:rPr>
           <w:rStyle w:val="Strong"/>
           <w:b/>
           <w:bCs/>
+          <w:sz w:val="24"/>
+          <w:szCs w:val="24"/>
         </w:rPr>
         <w:t>Next Steps</w:t>
       </w:r>
@@ -8389,25 +8401,7 @@
           <w:sz w:val="24"/>
           <w:szCs w:val="24"/>
         </w:rPr>
-        <w:t xml:space="preserve"> 28</w:t>
-      </w:r>
-      <w:r>
-        <w:rPr>
-          <w:rFonts w:ascii="Times New Roman" w:eastAsia="Times New Roman" w:hAnsi="Times New Roman" w:cs="Times New Roman"/>
-          <w:b/>
-          <w:sz w:val="24"/>
-          <w:szCs w:val="24"/>
-        </w:rPr>
-        <w:t xml:space="preserve">/01/2026                                                                                    </w:t>
-      </w:r>
-      <w:r>
-        <w:rPr>
-          <w:rFonts w:ascii="Times New Roman" w:eastAsia="Times New Roman" w:hAnsi="Times New Roman" w:cs="Times New Roman"/>
-          <w:b/>
-          <w:sz w:val="24"/>
-          <w:szCs w:val="24"/>
-        </w:rPr>
-        <w:t xml:space="preserve">                          Day 16</w:t>
+        <w:t xml:space="preserve"> 28/01/2026                                                                                                              Day 16</w:t>
       </w:r>
       <w:r>
         <w:rPr>
@@ -8469,12 +8463,18 @@
     <w:p>
       <w:pPr>
         <w:pStyle w:val="Heading3"/>
+        <w:rPr>
+          <w:sz w:val="24"/>
+          <w:szCs w:val="24"/>
+        </w:rPr>
       </w:pPr>
       <w:r>
         <w:rPr>
           <w:rStyle w:val="Strong"/>
           <w:b/>
           <w:bCs/>
+          <w:sz w:val="24"/>
+          <w:szCs w:val="24"/>
         </w:rPr>
         <w:t>Objective of the Day</w:t>
       </w:r>
@@ -8490,12 +8490,18 @@
     <w:p>
       <w:pPr>
         <w:pStyle w:val="Heading3"/>
+        <w:rPr>
+          <w:sz w:val="24"/>
+          <w:szCs w:val="24"/>
+        </w:rPr>
       </w:pPr>
       <w:r>
         <w:rPr>
           <w:rStyle w:val="Strong"/>
           <w:b/>
           <w:bCs/>
+          <w:sz w:val="24"/>
+          <w:szCs w:val="24"/>
         </w:rPr>
         <w:t>Activities Performed</w:t>
       </w:r>
@@ -8617,12 +8623,18 @@
     <w:p>
       <w:pPr>
         <w:pStyle w:val="Heading3"/>
+        <w:rPr>
+          <w:sz w:val="24"/>
+          <w:szCs w:val="24"/>
+        </w:rPr>
       </w:pPr>
       <w:r>
         <w:rPr>
           <w:rStyle w:val="Strong"/>
           <w:b/>
           <w:bCs/>
+          <w:sz w:val="24"/>
+          <w:szCs w:val="24"/>
         </w:rPr>
         <w:t>Outcome of the Day</w:t>
       </w:r>
@@ -8646,12 +8658,18 @@
     <w:p>
       <w:pPr>
         <w:pStyle w:val="Heading3"/>
+        <w:rPr>
+          <w:sz w:val="24"/>
+          <w:szCs w:val="24"/>
+        </w:rPr>
       </w:pPr>
       <w:r>
         <w:rPr>
           <w:rStyle w:val="Strong"/>
           <w:b/>
           <w:bCs/>
+          <w:sz w:val="24"/>
+          <w:szCs w:val="24"/>
         </w:rPr>
         <w:t>Key Learnings</w:t>
       </w:r>
@@ -8675,12 +8693,18 @@
     <w:p>
       <w:pPr>
         <w:pStyle w:val="Heading3"/>
+        <w:rPr>
+          <w:sz w:val="24"/>
+          <w:szCs w:val="24"/>
+        </w:rPr>
       </w:pPr>
       <w:r>
         <w:rPr>
           <w:rStyle w:val="Strong"/>
           <w:b/>
           <w:bCs/>
+          <w:sz w:val="24"/>
+          <w:szCs w:val="24"/>
         </w:rPr>
         <w:t>Next Steps</w:t>
       </w:r>
@@ -8792,12 +8816,18 @@
     <w:p>
       <w:pPr>
         <w:pStyle w:val="Heading3"/>
+        <w:rPr>
+          <w:sz w:val="24"/>
+          <w:szCs w:val="24"/>
+        </w:rPr>
       </w:pPr>
       <w:r>
         <w:rPr>
           <w:rStyle w:val="Strong"/>
           <w:b/>
           <w:bCs/>
+          <w:sz w:val="24"/>
+          <w:szCs w:val="24"/>
         </w:rPr>
         <w:t>Objective of the Day</w:t>
       </w:r>
@@ -8814,12 +8844,18 @@
       <w:pPr>
         <w:pStyle w:val="Heading3"/>
         <w:spacing w:before="0" w:beforeAutospacing="0" w:after="0" w:afterAutospacing="0"/>
+        <w:rPr>
+          <w:sz w:val="24"/>
+          <w:szCs w:val="24"/>
+        </w:rPr>
       </w:pPr>
       <w:r>
         <w:rPr>
           <w:rStyle w:val="Strong"/>
           <w:b/>
           <w:bCs/>
+          <w:sz w:val="24"/>
+          <w:szCs w:val="24"/>
         </w:rPr>
         <w:t>Activities Performed</w:t>
       </w:r>
@@ -8967,12 +9003,18 @@
     <w:p>
       <w:pPr>
         <w:pStyle w:val="Heading3"/>
+        <w:rPr>
+          <w:sz w:val="24"/>
+          <w:szCs w:val="24"/>
+        </w:rPr>
       </w:pPr>
       <w:r>
         <w:rPr>
           <w:rStyle w:val="Strong"/>
           <w:b/>
           <w:bCs/>
+          <w:sz w:val="24"/>
+          <w:szCs w:val="24"/>
         </w:rPr>
         <w:t>Outcome of the Day</w:t>
       </w:r>
@@ -8996,12 +9038,18 @@
     <w:p>
       <w:pPr>
         <w:pStyle w:val="Heading3"/>
+        <w:rPr>
+          <w:sz w:val="24"/>
+          <w:szCs w:val="24"/>
+        </w:rPr>
       </w:pPr>
       <w:r>
         <w:rPr>
           <w:rStyle w:val="Strong"/>
           <w:b/>
           <w:bCs/>
+          <w:sz w:val="24"/>
+          <w:szCs w:val="24"/>
         </w:rPr>
         <w:t>Key Learnings</w:t>
       </w:r>
@@ -9025,12 +9073,18 @@
     <w:p>
       <w:pPr>
         <w:pStyle w:val="Heading3"/>
+        <w:rPr>
+          <w:sz w:val="24"/>
+          <w:szCs w:val="24"/>
+        </w:rPr>
       </w:pPr>
       <w:r>
         <w:rPr>
           <w:rStyle w:val="Strong"/>
           <w:b/>
           <w:bCs/>
+          <w:sz w:val="24"/>
+          <w:szCs w:val="24"/>
         </w:rPr>
         <w:t>Next Steps</w:t>
       </w:r>
@@ -9153,12 +9207,18 @@
     <w:p>
       <w:pPr>
         <w:pStyle w:val="Heading3"/>
+        <w:rPr>
+          <w:sz w:val="24"/>
+          <w:szCs w:val="24"/>
+        </w:rPr>
       </w:pPr>
       <w:r>
         <w:rPr>
           <w:rStyle w:val="Strong"/>
           <w:b/>
           <w:bCs/>
+          <w:sz w:val="24"/>
+          <w:szCs w:val="24"/>
         </w:rPr>
         <w:t>Objective of the Day</w:t>
       </w:r>
@@ -9175,12 +9235,18 @@
       <w:pPr>
         <w:pStyle w:val="Heading3"/>
         <w:spacing w:before="0" w:beforeAutospacing="0" w:after="0" w:afterAutospacing="0"/>
+        <w:rPr>
+          <w:sz w:val="24"/>
+          <w:szCs w:val="24"/>
+        </w:rPr>
       </w:pPr>
       <w:r>
         <w:rPr>
           <w:rStyle w:val="Strong"/>
           <w:b/>
           <w:bCs/>
+          <w:sz w:val="24"/>
+          <w:szCs w:val="24"/>
         </w:rPr>
         <w:t>Activities Performed</w:t>
       </w:r>
@@ -9355,12 +9421,18 @@
       <w:pPr>
         <w:pStyle w:val="Heading3"/>
         <w:spacing w:before="0" w:beforeAutospacing="0" w:after="0" w:afterAutospacing="0"/>
+        <w:rPr>
+          <w:sz w:val="24"/>
+          <w:szCs w:val="24"/>
+        </w:rPr>
       </w:pPr>
       <w:r>
         <w:rPr>
           <w:rStyle w:val="Strong"/>
           <w:b/>
           <w:bCs/>
+          <w:sz w:val="24"/>
+          <w:szCs w:val="24"/>
         </w:rPr>
         <w:t>Outcome of the Day</w:t>
       </w:r>
@@ -9385,12 +9457,18 @@
     <w:p>
       <w:pPr>
         <w:pStyle w:val="Heading3"/>
+        <w:rPr>
+          <w:sz w:val="24"/>
+          <w:szCs w:val="24"/>
+        </w:rPr>
       </w:pPr>
       <w:r>
         <w:rPr>
           <w:rStyle w:val="Strong"/>
           <w:b/>
           <w:bCs/>
+          <w:sz w:val="24"/>
+          <w:szCs w:val="24"/>
         </w:rPr>
         <w:t>Key Learnings</w:t>
       </w:r>
@@ -9414,12 +9492,18 @@
     <w:p>
       <w:pPr>
         <w:pStyle w:val="Heading3"/>
+        <w:rPr>
+          <w:sz w:val="24"/>
+          <w:szCs w:val="24"/>
+        </w:rPr>
       </w:pPr>
       <w:r>
         <w:rPr>
           <w:rStyle w:val="Strong"/>
           <w:b/>
           <w:bCs/>
+          <w:sz w:val="24"/>
+          <w:szCs w:val="24"/>
         </w:rPr>
         <w:t>Next Steps</w:t>
       </w:r>
@@ -9531,12 +9615,18 @@
     <w:p>
       <w:pPr>
         <w:pStyle w:val="Heading3"/>
+        <w:rPr>
+          <w:sz w:val="24"/>
+          <w:szCs w:val="24"/>
+        </w:rPr>
       </w:pPr>
       <w:r>
         <w:rPr>
           <w:rStyle w:val="Strong"/>
           <w:b/>
           <w:bCs/>
+          <w:sz w:val="24"/>
+          <w:szCs w:val="24"/>
         </w:rPr>
         <w:t>Objective of the Day</w:t>
       </w:r>
@@ -9553,12 +9643,18 @@
       <w:pPr>
         <w:pStyle w:val="Heading3"/>
         <w:spacing w:before="0" w:beforeAutospacing="0" w:after="0" w:afterAutospacing="0"/>
+        <w:rPr>
+          <w:sz w:val="24"/>
+          <w:szCs w:val="24"/>
+        </w:rPr>
       </w:pPr>
       <w:r>
         <w:rPr>
           <w:rStyle w:val="Strong"/>
           <w:b/>
           <w:bCs/>
+          <w:sz w:val="24"/>
+          <w:szCs w:val="24"/>
         </w:rPr>
         <w:t>Activities Performed</w:t>
       </w:r>
@@ -9705,12 +9801,18 @@
       <w:pPr>
         <w:pStyle w:val="Heading3"/>
         <w:spacing w:before="0" w:beforeAutospacing="0" w:after="0" w:afterAutospacing="0"/>
+        <w:rPr>
+          <w:sz w:val="24"/>
+          <w:szCs w:val="24"/>
+        </w:rPr>
       </w:pPr>
       <w:r>
         <w:rPr>
           <w:rStyle w:val="Strong"/>
           <w:b/>
           <w:bCs/>
+          <w:sz w:val="24"/>
+          <w:szCs w:val="24"/>
         </w:rPr>
         <w:t>Outcome of the Day</w:t>
       </w:r>
@@ -9736,12 +9838,18 @@
       <w:pPr>
         <w:pStyle w:val="Heading3"/>
         <w:spacing w:before="0" w:beforeAutospacing="0" w:after="0" w:afterAutospacing="0"/>
+        <w:rPr>
+          <w:sz w:val="24"/>
+          <w:szCs w:val="24"/>
+        </w:rPr>
       </w:pPr>
       <w:r>
         <w:rPr>
           <w:rStyle w:val="Strong"/>
           <w:b/>
           <w:bCs/>
+          <w:sz w:val="24"/>
+          <w:szCs w:val="24"/>
         </w:rPr>
         <w:t>Key Learnings</w:t>
       </w:r>
@@ -9767,12 +9875,18 @@
       <w:pPr>
         <w:pStyle w:val="Heading3"/>
         <w:spacing w:before="0" w:beforeAutospacing="0" w:after="0" w:afterAutospacing="0"/>
+        <w:rPr>
+          <w:sz w:val="24"/>
+          <w:szCs w:val="24"/>
+        </w:rPr>
       </w:pPr>
       <w:r>
         <w:rPr>
           <w:rStyle w:val="Strong"/>
           <w:b/>
           <w:bCs/>
+          <w:sz w:val="24"/>
+          <w:szCs w:val="24"/>
         </w:rPr>
         <w:t>Next Steps</w:t>
       </w:r>
@@ -9891,12 +10005,18 @@
     <w:p>
       <w:pPr>
         <w:pStyle w:val="Heading3"/>
+        <w:rPr>
+          <w:sz w:val="24"/>
+          <w:szCs w:val="24"/>
+        </w:rPr>
       </w:pPr>
       <w:r>
         <w:rPr>
           <w:rStyle w:val="Strong"/>
           <w:b/>
           <w:bCs/>
+          <w:sz w:val="24"/>
+          <w:szCs w:val="24"/>
         </w:rPr>
         <w:t>Objective of the Day</w:t>
       </w:r>
@@ -9913,12 +10033,18 @@
       <w:pPr>
         <w:pStyle w:val="Heading3"/>
         <w:spacing w:before="0" w:beforeAutospacing="0" w:after="0" w:afterAutospacing="0"/>
+        <w:rPr>
+          <w:sz w:val="24"/>
+          <w:szCs w:val="24"/>
+        </w:rPr>
       </w:pPr>
       <w:r>
         <w:rPr>
           <w:rStyle w:val="Strong"/>
           <w:b/>
           <w:bCs/>
+          <w:sz w:val="24"/>
+          <w:szCs w:val="24"/>
         </w:rPr>
         <w:t>Activities Performed</w:t>
       </w:r>
@@ -10078,12 +10204,18 @@
       <w:pPr>
         <w:pStyle w:val="Heading3"/>
         <w:spacing w:before="0" w:beforeAutospacing="0" w:after="0" w:afterAutospacing="0"/>
+        <w:rPr>
+          <w:sz w:val="24"/>
+          <w:szCs w:val="24"/>
+        </w:rPr>
       </w:pPr>
       <w:r>
         <w:rPr>
           <w:rStyle w:val="Strong"/>
           <w:b/>
           <w:bCs/>
+          <w:sz w:val="24"/>
+          <w:szCs w:val="24"/>
         </w:rPr>
         <w:t>Outcome of the Day</w:t>
       </w:r>
@@ -10114,12 +10246,18 @@
     <w:p>
       <w:pPr>
         <w:pStyle w:val="Heading3"/>
+        <w:rPr>
+          <w:sz w:val="24"/>
+          <w:szCs w:val="24"/>
+        </w:rPr>
       </w:pPr>
       <w:r>
         <w:rPr>
           <w:rStyle w:val="Strong"/>
           <w:b/>
           <w:bCs/>
+          <w:sz w:val="24"/>
+          <w:szCs w:val="24"/>
         </w:rPr>
         <w:t>Key Learnings</w:t>
       </w:r>
@@ -10143,12 +10281,18 @@
     <w:p>
       <w:pPr>
         <w:pStyle w:val="Heading3"/>
+        <w:rPr>
+          <w:sz w:val="24"/>
+          <w:szCs w:val="24"/>
+        </w:rPr>
       </w:pPr>
       <w:r>
         <w:rPr>
           <w:rStyle w:val="Strong"/>
           <w:b/>
           <w:bCs/>
+          <w:sz w:val="24"/>
+          <w:szCs w:val="24"/>
         </w:rPr>
         <w:t>Next Steps</w:t>
       </w:r>
@@ -12132,25 +12276,7 @@
           <w:sz w:val="24"/>
           <w:szCs w:val="24"/>
         </w:rPr>
-        <w:t xml:space="preserve"> 11</w:t>
-      </w:r>
-      <w:r>
-        <w:rPr>
-          <w:rFonts w:ascii="Times New Roman" w:eastAsia="Times New Roman" w:hAnsi="Times New Roman" w:cs="Times New Roman"/>
-          <w:b/>
-          <w:sz w:val="24"/>
-          <w:szCs w:val="24"/>
-        </w:rPr>
-        <w:t xml:space="preserve">/02/2026                                                                                    </w:t>
-      </w:r>
-      <w:r>
-        <w:rPr>
-          <w:rFonts w:ascii="Times New Roman" w:eastAsia="Times New Roman" w:hAnsi="Times New Roman" w:cs="Times New Roman"/>
-          <w:b/>
-          <w:sz w:val="24"/>
-          <w:szCs w:val="24"/>
-        </w:rPr>
-        <w:t xml:space="preserve">                          Day 25</w:t>
+        <w:t xml:space="preserve"> 11/02/2026                                                                                                              Day 25</w:t>
       </w:r>
       <w:r>
         <w:rPr>
@@ -12227,16 +12353,7 @@
           <w:sz w:val="24"/>
           <w:szCs w:val="24"/>
         </w:rPr>
-        <w:t>Shift: Third</w:t>
-      </w:r>
-      <w:r>
-        <w:rPr>
-          <w:rFonts w:ascii="Times New Roman" w:eastAsia="Times New Roman" w:hAnsi="Times New Roman" w:cs="Times New Roman"/>
-          <w:b/>
-          <w:sz w:val="24"/>
-          <w:szCs w:val="24"/>
-        </w:rPr>
-        <w:t xml:space="preserve"> Shift</w:t>
+        <w:t>Shift: Third Shift</w:t>
       </w:r>
     </w:p>
     <w:p>
@@ -12745,261 +12862,1588 @@
         </w:rPr>
         <w:t>UI communication layer</w:t>
       </w:r>
+    </w:p>
+    <w:p>
+      <w:pPr>
+        <w:spacing w:after="0" w:line="240" w:lineRule="auto"/>
+        <w:outlineLvl w:val="1"/>
+        <w:rPr>
+          <w:rFonts w:ascii="Times New Roman" w:eastAsia="Times New Roman" w:hAnsi="Times New Roman" w:cs="Times New Roman"/>
+          <w:b/>
+          <w:sz w:val="24"/>
+          <w:szCs w:val="24"/>
+        </w:rPr>
+      </w:pPr>
+    </w:p>
+    <w:p>
+      <w:pPr>
+        <w:spacing w:after="0" w:line="240" w:lineRule="auto"/>
+        <w:outlineLvl w:val="1"/>
+        <w:rPr>
+          <w:rFonts w:ascii="Times New Roman" w:eastAsia="Times New Roman" w:hAnsi="Times New Roman" w:cs="Times New Roman"/>
+          <w:b/>
+          <w:sz w:val="24"/>
+          <w:szCs w:val="24"/>
+        </w:rPr>
+      </w:pPr>
+      <w:r>
+        <w:rPr>
+          <w:rFonts w:ascii="Times New Roman" w:eastAsia="Times New Roman" w:hAnsi="Times New Roman" w:cs="Times New Roman"/>
+          <w:b/>
+          <w:sz w:val="24"/>
+          <w:szCs w:val="24"/>
+        </w:rPr>
+        <w:t>Challenges / Open Points</w:t>
+      </w:r>
+    </w:p>
+    <w:p>
+      <w:pPr>
+        <w:pStyle w:val="ListParagraph"/>
+        <w:numPr>
+          <w:ilvl w:val="0"/>
+          <w:numId w:val="62"/>
+        </w:numPr>
+        <w:spacing w:after="0" w:line="240" w:lineRule="auto"/>
+        <w:outlineLvl w:val="1"/>
+        <w:rPr>
+          <w:rFonts w:ascii="Times New Roman" w:eastAsia="Times New Roman" w:hAnsi="Times New Roman" w:cs="Times New Roman"/>
+          <w:sz w:val="24"/>
+          <w:szCs w:val="24"/>
+        </w:rPr>
+      </w:pPr>
+      <w:r>
+        <w:rPr>
+          <w:rFonts w:ascii="Times New Roman" w:eastAsia="Times New Roman" w:hAnsi="Times New Roman" w:cs="Times New Roman"/>
+          <w:sz w:val="24"/>
+          <w:szCs w:val="24"/>
+        </w:rPr>
+        <w:t>Search modal still requires UI centering refinement and final stability verification</w:t>
+      </w:r>
+    </w:p>
+    <w:p>
+      <w:pPr>
+        <w:pStyle w:val="ListParagraph"/>
+        <w:numPr>
+          <w:ilvl w:val="0"/>
+          <w:numId w:val="62"/>
+        </w:numPr>
+        <w:spacing w:after="0" w:line="240" w:lineRule="auto"/>
+        <w:outlineLvl w:val="1"/>
+        <w:rPr>
+          <w:rFonts w:ascii="Times New Roman" w:eastAsia="Times New Roman" w:hAnsi="Times New Roman" w:cs="Times New Roman"/>
+          <w:sz w:val="24"/>
+          <w:szCs w:val="24"/>
+        </w:rPr>
+      </w:pPr>
+      <w:r>
+        <w:rPr>
+          <w:rFonts w:ascii="Times New Roman" w:eastAsia="Times New Roman" w:hAnsi="Times New Roman" w:cs="Times New Roman"/>
+          <w:sz w:val="24"/>
+          <w:szCs w:val="24"/>
+        </w:rPr>
+        <w:t>Ingestion pipeline automation not yet fully implemented</w:t>
+      </w:r>
+    </w:p>
+    <w:p>
+      <w:pPr>
+        <w:pStyle w:val="ListParagraph"/>
+        <w:numPr>
+          <w:ilvl w:val="0"/>
+          <w:numId w:val="62"/>
+        </w:numPr>
+        <w:spacing w:after="0" w:line="240" w:lineRule="auto"/>
+        <w:outlineLvl w:val="1"/>
+        <w:rPr>
+          <w:rFonts w:ascii="Times New Roman" w:eastAsia="Times New Roman" w:hAnsi="Times New Roman" w:cs="Times New Roman"/>
+          <w:sz w:val="24"/>
+          <w:szCs w:val="24"/>
+        </w:rPr>
+      </w:pPr>
+      <w:r>
+        <w:rPr>
+          <w:rFonts w:ascii="Times New Roman" w:eastAsia="Times New Roman" w:hAnsi="Times New Roman" w:cs="Times New Roman"/>
+          <w:sz w:val="24"/>
+          <w:szCs w:val="24"/>
+        </w:rPr>
+        <w:t>Rule-based and ML-based insight engine layer pending implementation</w:t>
+      </w:r>
+    </w:p>
+    <w:p>
+      <w:pPr>
+        <w:spacing w:after="0" w:line="240" w:lineRule="auto"/>
+        <w:outlineLvl w:val="1"/>
+        <w:rPr>
+          <w:rFonts w:ascii="Times New Roman" w:eastAsia="Times New Roman" w:hAnsi="Times New Roman" w:cs="Times New Roman"/>
+          <w:b/>
+          <w:sz w:val="24"/>
+          <w:szCs w:val="24"/>
+        </w:rPr>
+      </w:pPr>
+    </w:p>
+    <w:p>
+      <w:pPr>
+        <w:spacing w:after="0" w:line="240" w:lineRule="auto"/>
+        <w:outlineLvl w:val="1"/>
+        <w:rPr>
+          <w:rFonts w:ascii="Times New Roman" w:eastAsia="Times New Roman" w:hAnsi="Times New Roman" w:cs="Times New Roman"/>
+          <w:b/>
+          <w:sz w:val="24"/>
+          <w:szCs w:val="24"/>
+        </w:rPr>
+      </w:pPr>
+      <w:r>
+        <w:rPr>
+          <w:rFonts w:ascii="Times New Roman" w:eastAsia="Times New Roman" w:hAnsi="Times New Roman" w:cs="Times New Roman"/>
+          <w:b/>
+          <w:sz w:val="24"/>
+          <w:szCs w:val="24"/>
+        </w:rPr>
+        <w:t>Next Steps</w:t>
+      </w:r>
+    </w:p>
+    <w:p>
+      <w:pPr>
+        <w:pStyle w:val="ListParagraph"/>
+        <w:numPr>
+          <w:ilvl w:val="0"/>
+          <w:numId w:val="63"/>
+        </w:numPr>
+        <w:spacing w:after="0" w:line="240" w:lineRule="auto"/>
+        <w:outlineLvl w:val="1"/>
+        <w:rPr>
+          <w:rFonts w:ascii="Times New Roman" w:eastAsia="Times New Roman" w:hAnsi="Times New Roman" w:cs="Times New Roman"/>
+          <w:sz w:val="24"/>
+          <w:szCs w:val="24"/>
+        </w:rPr>
+      </w:pPr>
+      <w:r>
+        <w:rPr>
+          <w:rFonts w:ascii="Times New Roman" w:eastAsia="Times New Roman" w:hAnsi="Times New Roman" w:cs="Times New Roman"/>
+          <w:sz w:val="24"/>
+          <w:szCs w:val="24"/>
+        </w:rPr>
+        <w:t>Complete ingestion pipeline end-to-end</w:t>
+      </w:r>
+    </w:p>
+    <w:p>
+      <w:pPr>
+        <w:pStyle w:val="ListParagraph"/>
+        <w:numPr>
+          <w:ilvl w:val="0"/>
+          <w:numId w:val="63"/>
+        </w:numPr>
+        <w:spacing w:after="0" w:line="240" w:lineRule="auto"/>
+        <w:outlineLvl w:val="1"/>
+        <w:rPr>
+          <w:rFonts w:ascii="Times New Roman" w:eastAsia="Times New Roman" w:hAnsi="Times New Roman" w:cs="Times New Roman"/>
+          <w:sz w:val="24"/>
+          <w:szCs w:val="24"/>
+        </w:rPr>
+      </w:pPr>
+      <w:r>
+        <w:rPr>
+          <w:rFonts w:ascii="Times New Roman" w:eastAsia="Times New Roman" w:hAnsi="Times New Roman" w:cs="Times New Roman"/>
+          <w:sz w:val="24"/>
+          <w:szCs w:val="24"/>
+        </w:rPr>
+        <w:t>Implement rule-based engine layer for deterministic insights</w:t>
+      </w:r>
+    </w:p>
+    <w:p>
+      <w:pPr>
+        <w:pStyle w:val="ListParagraph"/>
+        <w:numPr>
+          <w:ilvl w:val="0"/>
+          <w:numId w:val="63"/>
+        </w:numPr>
+        <w:spacing w:after="0" w:line="240" w:lineRule="auto"/>
+        <w:outlineLvl w:val="1"/>
+        <w:rPr>
+          <w:rFonts w:ascii="Times New Roman" w:eastAsia="Times New Roman" w:hAnsi="Times New Roman" w:cs="Times New Roman"/>
+          <w:sz w:val="24"/>
+          <w:szCs w:val="24"/>
+        </w:rPr>
+      </w:pPr>
+      <w:r>
+        <w:rPr>
+          <w:rFonts w:ascii="Times New Roman" w:eastAsia="Times New Roman" w:hAnsi="Times New Roman" w:cs="Times New Roman"/>
+          <w:sz w:val="24"/>
+          <w:szCs w:val="24"/>
+        </w:rPr>
+        <w:t>Design and integrate ML-based anomaly detection layer</w:t>
+      </w:r>
+    </w:p>
+    <w:p>
+      <w:pPr>
+        <w:pStyle w:val="ListParagraph"/>
+        <w:numPr>
+          <w:ilvl w:val="0"/>
+          <w:numId w:val="63"/>
+        </w:numPr>
+        <w:spacing w:after="0" w:line="240" w:lineRule="auto"/>
+        <w:outlineLvl w:val="1"/>
+        <w:rPr>
+          <w:rFonts w:ascii="Times New Roman" w:eastAsia="Times New Roman" w:hAnsi="Times New Roman" w:cs="Times New Roman"/>
+          <w:sz w:val="24"/>
+          <w:szCs w:val="24"/>
+        </w:rPr>
+      </w:pPr>
+      <w:r>
+        <w:rPr>
+          <w:rFonts w:ascii="Times New Roman" w:eastAsia="Times New Roman" w:hAnsi="Times New Roman" w:cs="Times New Roman"/>
+          <w:sz w:val="24"/>
+          <w:szCs w:val="24"/>
+        </w:rPr>
+        <w:t>Finalize desktop UI production stability</w:t>
+      </w:r>
+    </w:p>
+    <w:p>
+      <w:pPr>
+        <w:pStyle w:val="Heading3"/>
+        <w:spacing w:before="0" w:beforeAutospacing="0" w:after="0" w:afterAutospacing="0"/>
+        <w:rPr>
+          <w:b w:val="0"/>
+          <w:sz w:val="24"/>
+          <w:szCs w:val="24"/>
+        </w:rPr>
+      </w:pPr>
+    </w:p>
+    <w:p>
+      <w:pPr>
+        <w:pStyle w:val="Heading3"/>
+        <w:spacing w:before="0" w:beforeAutospacing="0" w:after="0" w:afterAutospacing="0"/>
+        <w:rPr>
+          <w:b w:val="0"/>
+          <w:sz w:val="24"/>
+          <w:szCs w:val="24"/>
+        </w:rPr>
+      </w:pPr>
+    </w:p>
+    <w:p>
+      <w:pPr>
+        <w:pStyle w:val="Heading3"/>
+        <w:spacing w:before="0" w:beforeAutospacing="0" w:after="0" w:afterAutospacing="0"/>
+        <w:rPr>
+          <w:b w:val="0"/>
+          <w:sz w:val="24"/>
+          <w:szCs w:val="24"/>
+        </w:rPr>
+      </w:pPr>
+    </w:p>
+    <w:p>
+      <w:pPr>
+        <w:pStyle w:val="Heading3"/>
+        <w:spacing w:before="0" w:beforeAutospacing="0" w:after="0" w:afterAutospacing="0"/>
+        <w:rPr>
+          <w:b w:val="0"/>
+          <w:sz w:val="24"/>
+          <w:szCs w:val="24"/>
+        </w:rPr>
+      </w:pPr>
+    </w:p>
+    <w:p>
+      <w:pPr>
+        <w:pStyle w:val="Heading3"/>
+        <w:spacing w:before="0" w:beforeAutospacing="0" w:after="0" w:afterAutospacing="0"/>
+        <w:rPr>
+          <w:b w:val="0"/>
+          <w:sz w:val="24"/>
+          <w:szCs w:val="24"/>
+        </w:rPr>
+      </w:pPr>
+    </w:p>
+    <w:p>
+      <w:pPr>
+        <w:spacing w:after="0" w:line="240" w:lineRule="auto"/>
+        <w:outlineLvl w:val="1"/>
+        <w:rPr>
+          <w:rFonts w:ascii="Times New Roman" w:eastAsia="Times New Roman" w:hAnsi="Times New Roman" w:cs="Times New Roman"/>
+          <w:b/>
+          <w:sz w:val="24"/>
+          <w:szCs w:val="24"/>
+        </w:rPr>
+      </w:pPr>
+      <w:r>
+        <w:rPr>
+          <w:rFonts w:ascii="Times New Roman" w:eastAsia="Times New Roman" w:hAnsi="Times New Roman" w:cs="Times New Roman"/>
+          <w:b/>
+          <w:bCs/>
+          <w:sz w:val="24"/>
+          <w:szCs w:val="24"/>
+        </w:rPr>
+        <w:lastRenderedPageBreak/>
+        <w:t>Date:</w:t>
+      </w:r>
+      <w:r>
+        <w:rPr>
+          <w:rFonts w:ascii="Times New Roman" w:eastAsia="Times New Roman" w:hAnsi="Times New Roman" w:cs="Times New Roman"/>
+          <w:b/>
+          <w:sz w:val="24"/>
+          <w:szCs w:val="24"/>
+        </w:rPr>
+        <w:t xml:space="preserve"> 12</w:t>
+      </w:r>
+      <w:r>
+        <w:rPr>
+          <w:rFonts w:ascii="Times New Roman" w:eastAsia="Times New Roman" w:hAnsi="Times New Roman" w:cs="Times New Roman"/>
+          <w:b/>
+          <w:sz w:val="24"/>
+          <w:szCs w:val="24"/>
+        </w:rPr>
+        <w:t>/02/2026                                                                                                              Day 25</w:t>
+      </w:r>
+      <w:r>
+        <w:rPr>
+          <w:rFonts w:ascii="Times New Roman" w:eastAsia="Times New Roman" w:hAnsi="Times New Roman" w:cs="Times New Roman"/>
+          <w:b/>
+          <w:sz w:val="24"/>
+          <w:szCs w:val="24"/>
+        </w:rPr>
+        <w:br/>
+      </w:r>
+      <w:r>
+        <w:rPr>
+          <w:rFonts w:ascii="Times New Roman" w:eastAsia="Times New Roman" w:hAnsi="Times New Roman" w:cs="Times New Roman"/>
+          <w:b/>
+          <w:bCs/>
+          <w:sz w:val="24"/>
+          <w:szCs w:val="24"/>
+        </w:rPr>
+        <w:t>Department:</w:t>
+      </w:r>
+      <w:r>
+        <w:rPr>
+          <w:rFonts w:ascii="Times New Roman" w:eastAsia="Times New Roman" w:hAnsi="Times New Roman" w:cs="Times New Roman"/>
+          <w:b/>
+          <w:sz w:val="24"/>
+          <w:szCs w:val="24"/>
+        </w:rPr>
+        <w:t xml:space="preserve"> Maintenance</w:t>
+      </w:r>
+      <w:r>
+        <w:rPr>
+          <w:rFonts w:ascii="Times New Roman" w:eastAsia="Times New Roman" w:hAnsi="Times New Roman" w:cs="Times New Roman"/>
+          <w:b/>
+          <w:sz w:val="24"/>
+          <w:szCs w:val="24"/>
+        </w:rPr>
+        <w:br/>
+      </w:r>
+      <w:r>
+        <w:rPr>
+          <w:rFonts w:ascii="Times New Roman" w:eastAsia="Times New Roman" w:hAnsi="Times New Roman" w:cs="Times New Roman"/>
+          <w:b/>
+          <w:bCs/>
+          <w:sz w:val="24"/>
+          <w:szCs w:val="24"/>
+        </w:rPr>
+        <w:t>Plant:</w:t>
+      </w:r>
+      <w:r>
+        <w:rPr>
+          <w:rFonts w:ascii="Times New Roman" w:eastAsia="Times New Roman" w:hAnsi="Times New Roman" w:cs="Times New Roman"/>
+          <w:b/>
+          <w:sz w:val="24"/>
+          <w:szCs w:val="24"/>
+        </w:rPr>
+        <w:t xml:space="preserve"> Drive Shaft Manufacturing</w:t>
+      </w:r>
+    </w:p>
+    <w:p>
+      <w:pPr>
+        <w:spacing w:after="0" w:line="240" w:lineRule="auto"/>
+        <w:outlineLvl w:val="1"/>
+        <w:rPr>
+          <w:rFonts w:ascii="Times New Roman" w:eastAsia="Times New Roman" w:hAnsi="Times New Roman" w:cs="Times New Roman"/>
+          <w:b/>
+          <w:sz w:val="24"/>
+          <w:szCs w:val="24"/>
+        </w:rPr>
+      </w:pPr>
+      <w:r>
+        <w:rPr>
+          <w:rFonts w:ascii="Times New Roman" w:eastAsia="Times New Roman" w:hAnsi="Times New Roman" w:cs="Times New Roman"/>
+          <w:b/>
+          <w:sz w:val="24"/>
+          <w:szCs w:val="24"/>
+        </w:rPr>
+        <w:t>Shift: Third Shift</w:t>
+      </w:r>
+    </w:p>
+    <w:p>
+      <w:pPr>
+        <w:spacing w:after="0" w:line="240" w:lineRule="auto"/>
+        <w:outlineLvl w:val="1"/>
+        <w:rPr>
+          <w:rFonts w:ascii="Times New Roman" w:eastAsia="Times New Roman" w:hAnsi="Times New Roman" w:cs="Times New Roman"/>
+          <w:b/>
+          <w:sz w:val="24"/>
+          <w:szCs w:val="24"/>
+        </w:rPr>
+      </w:pPr>
+    </w:p>
+    <w:p>
+      <w:pPr>
+        <w:pStyle w:val="Heading2"/>
+        <w:spacing w:before="0" w:beforeAutospacing="0" w:after="0" w:afterAutospacing="0"/>
+        <w:rPr>
+          <w:sz w:val="24"/>
+          <w:szCs w:val="24"/>
+        </w:rPr>
+      </w:pPr>
+      <w:r>
+        <w:rPr>
+          <w:sz w:val="24"/>
+          <w:szCs w:val="24"/>
+        </w:rPr>
+        <w:t>Objective of the Day</w:t>
+      </w:r>
+    </w:p>
+    <w:p>
+      <w:pPr>
+        <w:pStyle w:val="NormalWeb"/>
+        <w:spacing w:before="0" w:beforeAutospacing="0" w:after="0" w:afterAutospacing="0"/>
+      </w:pPr>
+      <w:r>
+        <w:t>To stabilize the ingestion-to-frontend communication layer, resolve all runtime warnings, and complete full frontend–backend bridge integration using a production-ready Qt WebChannel architecture. Additionally, initiate the design of an offline ML-CV mobile application to digitize handwritten machine reading sheets with structural fidelity.</w:t>
+      </w:r>
+    </w:p>
+    <w:p>
+      <w:pPr>
+        <w:pStyle w:val="Heading2"/>
+        <w:spacing w:before="0" w:beforeAutospacing="0" w:after="0" w:afterAutospacing="0"/>
+        <w:rPr>
+          <w:sz w:val="24"/>
+          <w:szCs w:val="24"/>
+        </w:rPr>
+      </w:pPr>
+      <w:r>
+        <w:rPr>
+          <w:sz w:val="24"/>
+          <w:szCs w:val="24"/>
+        </w:rPr>
+        <w:t>Activities Performed</w:t>
+      </w:r>
+    </w:p>
+    <w:p>
+      <w:pPr>
+        <w:pStyle w:val="Heading3"/>
+        <w:spacing w:before="0" w:beforeAutospacing="0" w:after="0" w:afterAutospacing="0"/>
+        <w:rPr>
+          <w:sz w:val="24"/>
+          <w:szCs w:val="24"/>
+        </w:rPr>
+      </w:pPr>
+      <w:r>
+        <w:rPr>
+          <w:sz w:val="24"/>
+          <w:szCs w:val="24"/>
+        </w:rPr>
+        <w:t>1. Ingestion Layer Finalization (Module 1)</w:t>
+      </w:r>
+    </w:p>
+    <w:p>
+      <w:pPr>
+        <w:pStyle w:val="NormalWeb"/>
+        <w:numPr>
+          <w:ilvl w:val="0"/>
+          <w:numId w:val="64"/>
+        </w:numPr>
+        <w:spacing w:before="0" w:beforeAutospacing="0" w:after="0" w:afterAutospacing="0"/>
+      </w:pPr>
+      <w:r>
+        <w:t>Completed ingestion workflow including upload handling, auto-detection, and run-based versioning.</w:t>
+      </w:r>
+    </w:p>
+    <w:p>
+      <w:pPr>
+        <w:pStyle w:val="NormalWeb"/>
+        <w:numPr>
+          <w:ilvl w:val="0"/>
+          <w:numId w:val="64"/>
+        </w:numPr>
+        <w:spacing w:before="0" w:beforeAutospacing="0" w:after="0" w:afterAutospacing="0"/>
+      </w:pPr>
+      <w:r>
+        <w:t>Ensured frontend file upload triggers backend ingestion correctly.</w:t>
+      </w:r>
+    </w:p>
+    <w:p>
+      <w:pPr>
+        <w:pStyle w:val="NormalWeb"/>
+        <w:numPr>
+          <w:ilvl w:val="0"/>
+          <w:numId w:val="64"/>
+        </w:numPr>
+        <w:spacing w:before="0" w:beforeAutospacing="0" w:after="0" w:afterAutospacing="0"/>
+      </w:pPr>
+      <w:r>
+        <w:t>Validated ingestion status tracking mechanism.</w:t>
+      </w:r>
+    </w:p>
+    <w:p>
+      <w:pPr>
+        <w:pStyle w:val="NormalWeb"/>
+        <w:numPr>
+          <w:ilvl w:val="0"/>
+          <w:numId w:val="64"/>
+        </w:numPr>
+        <w:spacing w:before="0" w:beforeAutospacing="0" w:after="0" w:afterAutospacing="0"/>
+      </w:pPr>
+      <w:r>
+        <w:t>Verified deterministic run metadata creation for auditability.</w:t>
+      </w:r>
+    </w:p>
+    <w:p>
+      <w:pPr>
+        <w:pStyle w:val="Heading3"/>
+        <w:spacing w:before="0" w:beforeAutospacing="0" w:after="0" w:afterAutospacing="0"/>
+        <w:rPr>
+          <w:sz w:val="24"/>
+          <w:szCs w:val="24"/>
+        </w:rPr>
+      </w:pPr>
+      <w:r>
+        <w:rPr>
+          <w:sz w:val="24"/>
+          <w:szCs w:val="24"/>
+        </w:rPr>
+        <w:t>2. Qt WebChannel Bridge Stabilization (main.py)</w:t>
+      </w:r>
+    </w:p>
+    <w:p>
+      <w:pPr>
+        <w:pStyle w:val="NormalWeb"/>
+        <w:numPr>
+          <w:ilvl w:val="0"/>
+          <w:numId w:val="65"/>
+        </w:numPr>
+        <w:spacing w:before="0" w:beforeAutospacing="0" w:after="0" w:afterAutospacing="0"/>
+      </w:pPr>
+      <w:r>
+        <w:t xml:space="preserve">Rewrote injection script to load </w:t>
+      </w:r>
+      <w:r>
+        <w:rPr>
+          <w:rStyle w:val="HTMLCode"/>
+          <w:rFonts w:ascii="Times New Roman" w:hAnsi="Times New Roman" w:cs="Times New Roman"/>
+          <w:sz w:val="24"/>
+          <w:szCs w:val="24"/>
+        </w:rPr>
+        <w:t>qwebchannel.js</w:t>
+      </w:r>
+      <w:r>
+        <w:t xml:space="preserve"> directly from PySide6 resources.</w:t>
+      </w:r>
+    </w:p>
+    <w:p>
+      <w:pPr>
+        <w:pStyle w:val="NormalWeb"/>
+        <w:numPr>
+          <w:ilvl w:val="0"/>
+          <w:numId w:val="65"/>
+        </w:numPr>
+        <w:spacing w:before="0" w:beforeAutospacing="0" w:after="0" w:afterAutospacing="0"/>
+      </w:pPr>
+      <w:r>
+        <w:t>Implemented event dispatcher mechanism (</w:t>
+      </w:r>
+      <w:r>
+        <w:rPr>
+          <w:rStyle w:val="HTMLCode"/>
+          <w:rFonts w:ascii="Times New Roman" w:hAnsi="Times New Roman" w:cs="Times New Roman"/>
+          <w:sz w:val="24"/>
+          <w:szCs w:val="24"/>
+        </w:rPr>
+        <w:t>qt-ready</w:t>
+      </w:r>
+      <w:r>
+        <w:t>) to notify frontend when bridge becomes available.</w:t>
+      </w:r>
+    </w:p>
+    <w:p>
+      <w:pPr>
+        <w:pStyle w:val="NormalWeb"/>
+        <w:numPr>
+          <w:ilvl w:val="0"/>
+          <w:numId w:val="65"/>
+        </w:numPr>
+        <w:spacing w:before="0" w:beforeAutospacing="0" w:after="0" w:afterAutospacing="0"/>
+      </w:pPr>
+      <w:r>
+        <w:t>Added structured console logging for bridge initialization debugging.</w:t>
+      </w:r>
+    </w:p>
+    <w:p>
+      <w:pPr>
+        <w:pStyle w:val="NormalWeb"/>
+        <w:numPr>
+          <w:ilvl w:val="0"/>
+          <w:numId w:val="65"/>
+        </w:numPr>
+        <w:spacing w:before="0" w:beforeAutospacing="0" w:after="0" w:afterAutospacing="0"/>
+      </w:pPr>
+      <w:r>
+        <w:t>Ensured non-blocking bridge behavior even if WebChannel script loading fails.</w:t>
+      </w:r>
+    </w:p>
+    <w:p>
+      <w:pPr>
+        <w:pStyle w:val="NormalWeb"/>
+        <w:spacing w:before="0" w:beforeAutospacing="0" w:after="0" w:afterAutospacing="0"/>
+      </w:pPr>
+      <w:r>
+        <w:rPr>
+          <w:rStyle w:val="Strong"/>
+        </w:rPr>
+        <w:t>Reason for Change:</w:t>
+      </w:r>
+    </w:p>
+    <w:p>
+      <w:pPr>
+        <w:pStyle w:val="NormalWeb"/>
+        <w:spacing w:before="0" w:beforeAutospacing="0" w:after="0" w:afterAutospacing="0"/>
+      </w:pPr>
+      <w:r>
+        <w:t xml:space="preserve">The original implementation attempted to initialize </w:t>
+      </w:r>
+      <w:r>
+        <w:rPr>
+          <w:rStyle w:val="HTMLCode"/>
+          <w:rFonts w:ascii="Times New Roman" w:hAnsi="Times New Roman" w:cs="Times New Roman"/>
+          <w:sz w:val="24"/>
+          <w:szCs w:val="24"/>
+        </w:rPr>
+        <w:t>QWebChannel</w:t>
+      </w:r>
+      <w:r>
+        <w:t xml:space="preserve"> without guaranteeing that </w:t>
+      </w:r>
+      <w:r>
+        <w:rPr>
+          <w:rStyle w:val="HTMLCode"/>
+          <w:rFonts w:ascii="Times New Roman" w:hAnsi="Times New Roman" w:cs="Times New Roman"/>
+          <w:sz w:val="24"/>
+          <w:szCs w:val="24"/>
+        </w:rPr>
+        <w:t>qwebchannel.js</w:t>
+      </w:r>
+      <w:r>
+        <w:t xml:space="preserve"> was loaded first, causing silent failures and unstable IPC calls. The new architecture ensures script loading precedes channel initialization.</w:t>
+      </w:r>
+    </w:p>
+    <w:p>
+      <w:pPr>
+        <w:pStyle w:val="Heading3"/>
+        <w:spacing w:before="0" w:beforeAutospacing="0" w:after="0" w:afterAutospacing="0"/>
+        <w:rPr>
+          <w:sz w:val="24"/>
+          <w:szCs w:val="24"/>
+        </w:rPr>
+      </w:pPr>
+      <w:r>
+        <w:rPr>
+          <w:sz w:val="24"/>
+          <w:szCs w:val="24"/>
+        </w:rPr>
+        <w:t>3. IPC Exposure Completion (preload.py)</w:t>
+      </w:r>
+    </w:p>
+    <w:p>
+      <w:pPr>
+        <w:pStyle w:val="NormalWeb"/>
+        <w:numPr>
+          <w:ilvl w:val="0"/>
+          <w:numId w:val="66"/>
+        </w:numPr>
+        <w:spacing w:before="0" w:beforeAutospacing="0" w:after="0" w:afterAutospacing="0"/>
+      </w:pPr>
+      <w:r>
+        <w:t xml:space="preserve">Implemented </w:t>
+      </w:r>
+      <w:r>
+        <w:rPr>
+          <w:rStyle w:val="HTMLCode"/>
+          <w:rFonts w:ascii="Times New Roman" w:hAnsi="Times New Roman" w:cs="Times New Roman"/>
+          <w:sz w:val="24"/>
+          <w:szCs w:val="24"/>
+        </w:rPr>
+        <w:t>upload_file()</w:t>
+      </w:r>
+      <w:r>
+        <w:t xml:space="preserve"> slot method exposing ingestion upload handler to JavaScript.</w:t>
+      </w:r>
+    </w:p>
+    <w:p>
+      <w:pPr>
+        <w:pStyle w:val="NormalWeb"/>
+        <w:numPr>
+          <w:ilvl w:val="0"/>
+          <w:numId w:val="66"/>
+        </w:numPr>
+        <w:spacing w:before="0" w:beforeAutospacing="0" w:after="0" w:afterAutospacing="0"/>
+      </w:pPr>
+      <w:r>
+        <w:t xml:space="preserve">Implemented </w:t>
+      </w:r>
+      <w:r>
+        <w:rPr>
+          <w:rStyle w:val="HTMLCode"/>
+          <w:rFonts w:ascii="Times New Roman" w:hAnsi="Times New Roman" w:cs="Times New Roman"/>
+          <w:sz w:val="24"/>
+          <w:szCs w:val="24"/>
+        </w:rPr>
+        <w:t>get_ingestion_status()</w:t>
+      </w:r>
+      <w:r>
+        <w:t xml:space="preserve"> slot method.</w:t>
+      </w:r>
+    </w:p>
+    <w:p>
+      <w:pPr>
+        <w:pStyle w:val="NormalWeb"/>
+        <w:numPr>
+          <w:ilvl w:val="0"/>
+          <w:numId w:val="66"/>
+        </w:numPr>
+        <w:spacing w:before="0" w:beforeAutospacing="0" w:after="0" w:afterAutospacing="0"/>
+      </w:pPr>
+      <w:r>
+        <w:t>Reorganized imports to properly include ingestion IPC handlers.</w:t>
+      </w:r>
+    </w:p>
+    <w:p>
+      <w:pPr>
+        <w:pStyle w:val="NormalWeb"/>
+        <w:numPr>
+          <w:ilvl w:val="0"/>
+          <w:numId w:val="66"/>
+        </w:numPr>
+        <w:spacing w:before="0" w:beforeAutospacing="0" w:after="0" w:afterAutospacing="0"/>
+      </w:pPr>
+      <w:r>
+        <w:t>Validated slot exposure through frontend bridge calls.</w:t>
+      </w:r>
+    </w:p>
+    <w:p>
+      <w:pPr>
+        <w:pStyle w:val="NormalWeb"/>
+        <w:spacing w:before="0" w:beforeAutospacing="0" w:after="0" w:afterAutospacing="0"/>
+      </w:pPr>
+      <w:r>
+        <w:rPr>
+          <w:rStyle w:val="Strong"/>
+        </w:rPr>
+        <w:t>Reason for Change:</w:t>
+      </w:r>
+    </w:p>
+    <w:p>
+      <w:pPr>
+        <w:pStyle w:val="NormalWeb"/>
+        <w:spacing w:before="0" w:beforeAutospacing="0" w:after="0" w:afterAutospacing="0"/>
+      </w:pPr>
+      <w:r>
+        <w:t>Although backend ingestion handlers existed, they were not exposed to JavaScript via the preload layer, making ingestion unusable from the UI.</w:t>
+      </w:r>
+    </w:p>
+    <w:p>
+      <w:pPr>
+        <w:pStyle w:val="Heading3"/>
+        <w:spacing w:before="0" w:beforeAutospacing="0" w:after="0" w:afterAutospacing="0"/>
+        <w:rPr>
+          <w:sz w:val="24"/>
+          <w:szCs w:val="24"/>
+        </w:rPr>
+      </w:pPr>
+      <w:r>
+        <w:rPr>
+          <w:sz w:val="24"/>
+          <w:szCs w:val="24"/>
+        </w:rPr>
+        <w:t>4. Frontend API Completion (frontendApi.ts)</w:t>
+      </w:r>
+    </w:p>
+    <w:p>
+      <w:pPr>
+        <w:pStyle w:val="NormalWeb"/>
+        <w:numPr>
+          <w:ilvl w:val="0"/>
+          <w:numId w:val="67"/>
+        </w:numPr>
+        <w:spacing w:before="0" w:beforeAutospacing="0" w:after="0" w:afterAutospacing="0"/>
+      </w:pPr>
+      <w:r>
+        <w:t xml:space="preserve">Introduced </w:t>
+      </w:r>
+      <w:r>
+        <w:rPr>
+          <w:rStyle w:val="HTMLCode"/>
+          <w:rFonts w:ascii="Times New Roman" w:hAnsi="Times New Roman" w:cs="Times New Roman"/>
+          <w:sz w:val="24"/>
+          <w:szCs w:val="24"/>
+        </w:rPr>
+        <w:t>waitForBridge()</w:t>
+      </w:r>
+      <w:r>
+        <w:t xml:space="preserve"> Promise to block API calls until </w:t>
+      </w:r>
+      <w:r>
+        <w:rPr>
+          <w:rStyle w:val="HTMLCode"/>
+          <w:rFonts w:ascii="Times New Roman" w:hAnsi="Times New Roman" w:cs="Times New Roman"/>
+          <w:sz w:val="24"/>
+          <w:szCs w:val="24"/>
+        </w:rPr>
+        <w:t>qt-ready</w:t>
+      </w:r>
+      <w:r>
+        <w:t xml:space="preserve"> event is received.</w:t>
+      </w:r>
+    </w:p>
+    <w:p>
+      <w:pPr>
+        <w:pStyle w:val="NormalWeb"/>
+        <w:numPr>
+          <w:ilvl w:val="0"/>
+          <w:numId w:val="67"/>
+        </w:numPr>
+        <w:spacing w:before="0" w:beforeAutospacing="0" w:after="0" w:afterAutospacing="0"/>
+      </w:pPr>
+      <w:r>
+        <w:t>Implemented all six API categories:</w:t>
+      </w:r>
+    </w:p>
+    <w:p>
+      <w:pPr>
+        <w:pStyle w:val="NormalWeb"/>
+        <w:numPr>
+          <w:ilvl w:val="1"/>
+          <w:numId w:val="67"/>
+        </w:numPr>
+        <w:spacing w:before="0" w:beforeAutospacing="0" w:after="0" w:afterAutospacing="0"/>
+      </w:pPr>
+      <w:r>
+        <w:t xml:space="preserve">Ingestion: </w:t>
+      </w:r>
+      <w:r>
+        <w:rPr>
+          <w:rStyle w:val="HTMLCode"/>
+          <w:rFonts w:ascii="Times New Roman" w:hAnsi="Times New Roman" w:cs="Times New Roman"/>
+          <w:sz w:val="24"/>
+          <w:szCs w:val="24"/>
+        </w:rPr>
+        <w:t>uploadFile()</w:t>
+      </w:r>
+      <w:r>
+        <w:t xml:space="preserve">, </w:t>
+      </w:r>
+      <w:r>
+        <w:rPr>
+          <w:rStyle w:val="HTMLCode"/>
+          <w:rFonts w:ascii="Times New Roman" w:hAnsi="Times New Roman" w:cs="Times New Roman"/>
+          <w:sz w:val="24"/>
+          <w:szCs w:val="24"/>
+        </w:rPr>
+        <w:t>getIngestionStatus()</w:t>
+      </w:r>
+    </w:p>
+    <w:p>
+      <w:pPr>
+        <w:pStyle w:val="NormalWeb"/>
+        <w:numPr>
+          <w:ilvl w:val="1"/>
+          <w:numId w:val="67"/>
+        </w:numPr>
+        <w:spacing w:before="0" w:beforeAutospacing="0" w:after="0" w:afterAutospacing="0"/>
+      </w:pPr>
+      <w:r>
+        <w:t xml:space="preserve">Runs: </w:t>
+      </w:r>
+      <w:r>
+        <w:rPr>
+          <w:rStyle w:val="HTMLCode"/>
+          <w:rFonts w:ascii="Times New Roman" w:hAnsi="Times New Roman" w:cs="Times New Roman"/>
+          <w:sz w:val="24"/>
+          <w:szCs w:val="24"/>
+        </w:rPr>
+        <w:t>getRuns()</w:t>
+      </w:r>
+      <w:r>
+        <w:t xml:space="preserve">, </w:t>
+      </w:r>
+      <w:r>
+        <w:rPr>
+          <w:rStyle w:val="HTMLCode"/>
+          <w:rFonts w:ascii="Times New Roman" w:hAnsi="Times New Roman" w:cs="Times New Roman"/>
+          <w:sz w:val="24"/>
+          <w:szCs w:val="24"/>
+        </w:rPr>
+        <w:t>searchRuns()</w:t>
+      </w:r>
+    </w:p>
+    <w:p>
+      <w:pPr>
+        <w:pStyle w:val="NormalWeb"/>
+        <w:numPr>
+          <w:ilvl w:val="1"/>
+          <w:numId w:val="67"/>
+        </w:numPr>
+        <w:spacing w:before="0" w:beforeAutospacing="0" w:after="0" w:afterAutospacing="0"/>
+      </w:pPr>
+      <w:r>
+        <w:t xml:space="preserve">Insights: </w:t>
+      </w:r>
+      <w:r>
+        <w:rPr>
+          <w:rStyle w:val="HTMLCode"/>
+          <w:rFonts w:ascii="Times New Roman" w:hAnsi="Times New Roman" w:cs="Times New Roman"/>
+          <w:sz w:val="24"/>
+          <w:szCs w:val="24"/>
+        </w:rPr>
+        <w:t>getInsights()</w:t>
+      </w:r>
+    </w:p>
+    <w:p>
+      <w:pPr>
+        <w:pStyle w:val="NormalWeb"/>
+        <w:numPr>
+          <w:ilvl w:val="1"/>
+          <w:numId w:val="67"/>
+        </w:numPr>
+        <w:spacing w:before="0" w:beforeAutospacing="0" w:after="0" w:afterAutospacing="0"/>
+      </w:pPr>
+      <w:r>
+        <w:t xml:space="preserve">Dashboard: </w:t>
+      </w:r>
+      <w:r>
+        <w:rPr>
+          <w:rStyle w:val="HTMLCode"/>
+          <w:rFonts w:ascii="Times New Roman" w:hAnsi="Times New Roman" w:cs="Times New Roman"/>
+          <w:sz w:val="24"/>
+          <w:szCs w:val="24"/>
+        </w:rPr>
+        <w:t>getDashboard()</w:t>
+      </w:r>
+    </w:p>
+    <w:p>
+      <w:pPr>
+        <w:pStyle w:val="NormalWeb"/>
+        <w:numPr>
+          <w:ilvl w:val="1"/>
+          <w:numId w:val="67"/>
+        </w:numPr>
+        <w:spacing w:before="0" w:beforeAutospacing="0" w:after="0" w:afterAutospacing="0"/>
+      </w:pPr>
+      <w:r>
+        <w:t xml:space="preserve">DataHealth: </w:t>
+      </w:r>
+      <w:r>
+        <w:rPr>
+          <w:rStyle w:val="HTMLCode"/>
+          <w:rFonts w:ascii="Times New Roman" w:hAnsi="Times New Roman" w:cs="Times New Roman"/>
+          <w:sz w:val="24"/>
+          <w:szCs w:val="24"/>
+        </w:rPr>
+        <w:t>getDataHealth()</w:t>
+      </w:r>
+    </w:p>
+    <w:p>
+      <w:pPr>
+        <w:pStyle w:val="NormalWeb"/>
+        <w:numPr>
+          <w:ilvl w:val="1"/>
+          <w:numId w:val="67"/>
+        </w:numPr>
+        <w:spacing w:before="0" w:beforeAutospacing="0" w:after="0" w:afterAutospacing="0"/>
+      </w:pPr>
+      <w:r>
+        <w:t xml:space="preserve">Exports: </w:t>
+      </w:r>
+      <w:r>
+        <w:rPr>
+          <w:rStyle w:val="HTMLCode"/>
+          <w:rFonts w:ascii="Times New Roman" w:hAnsi="Times New Roman" w:cs="Times New Roman"/>
+          <w:sz w:val="24"/>
+          <w:szCs w:val="24"/>
+        </w:rPr>
+        <w:t>getExports()</w:t>
+      </w:r>
+    </w:p>
+    <w:p>
+      <w:pPr>
+        <w:pStyle w:val="NormalWeb"/>
+        <w:numPr>
+          <w:ilvl w:val="0"/>
+          <w:numId w:val="67"/>
+        </w:numPr>
+        <w:spacing w:before="0" w:beforeAutospacing="0" w:after="0" w:afterAutospacing="0"/>
+      </w:pPr>
+      <w:r>
+        <w:t>Added structured error handling for bridge failure cases.</w:t>
+      </w:r>
+    </w:p>
+    <w:p>
+      <w:pPr>
+        <w:pStyle w:val="NormalWeb"/>
+        <w:numPr>
+          <w:ilvl w:val="0"/>
+          <w:numId w:val="67"/>
+        </w:numPr>
+        <w:spacing w:before="0" w:beforeAutospacing="0" w:after="0" w:afterAutospacing="0"/>
+      </w:pPr>
+      <w:r>
+        <w:t>Introduced TypeScript type definitions for IPC responses.</w:t>
+      </w:r>
+    </w:p>
+    <w:p>
+      <w:pPr>
+        <w:pStyle w:val="NormalWeb"/>
+        <w:numPr>
+          <w:ilvl w:val="0"/>
+          <w:numId w:val="67"/>
+        </w:numPr>
+        <w:spacing w:before="0" w:beforeAutospacing="0" w:after="0" w:afterAutospacing="0"/>
+      </w:pPr>
+      <w:r>
+        <w:lastRenderedPageBreak/>
+        <w:t>Ensured every API method waits for bridge readiness before execution.</w:t>
+      </w:r>
+    </w:p>
+    <w:p>
+      <w:pPr>
+        <w:pStyle w:val="NormalWeb"/>
+        <w:spacing w:before="0" w:beforeAutospacing="0" w:after="0" w:afterAutospacing="0"/>
+      </w:pPr>
+      <w:r>
+        <w:rPr>
+          <w:rStyle w:val="Strong"/>
+        </w:rPr>
+        <w:t>Reason for Change:</w:t>
+      </w:r>
+    </w:p>
+    <w:p>
+      <w:pPr>
+        <w:pStyle w:val="NormalWeb"/>
+        <w:spacing w:before="0" w:beforeAutospacing="0" w:after="0" w:afterAutospacing="0"/>
+      </w:pPr>
+      <w:r>
+        <w:t>SearchBar and dashboard components were attempting backend calls before the Qt bridge was ready, resulting in race conditions and undefined behavior.</w:t>
+      </w:r>
+    </w:p>
+    <w:p>
+      <w:pPr>
+        <w:pStyle w:val="Heading3"/>
+        <w:spacing w:before="0" w:beforeAutospacing="0" w:after="0" w:afterAutospacing="0"/>
+        <w:rPr>
+          <w:sz w:val="24"/>
+          <w:szCs w:val="24"/>
+        </w:rPr>
+      </w:pPr>
+      <w:r>
+        <w:rPr>
+          <w:sz w:val="24"/>
+          <w:szCs w:val="24"/>
+        </w:rPr>
+        <w:t>5. Warning Resolution</w:t>
+      </w:r>
+    </w:p>
+    <w:p>
+      <w:pPr>
+        <w:pStyle w:val="NormalWeb"/>
+        <w:numPr>
+          <w:ilvl w:val="0"/>
+          <w:numId w:val="68"/>
+        </w:numPr>
+        <w:spacing w:before="0" w:beforeAutospacing="0" w:after="0" w:afterAutospacing="0"/>
+      </w:pPr>
+      <w:r>
+        <w:t>Identified and resolved 214 warnings across frontend codebase.</w:t>
+      </w:r>
+    </w:p>
+    <w:p>
+      <w:pPr>
+        <w:pStyle w:val="NormalWeb"/>
+        <w:numPr>
+          <w:ilvl w:val="0"/>
+          <w:numId w:val="68"/>
+        </w:numPr>
+        <w:spacing w:before="0" w:beforeAutospacing="0" w:after="0" w:afterAutospacing="0"/>
+      </w:pPr>
+      <w:r>
+        <w:t>Cleaned unused imports.</w:t>
+      </w:r>
+    </w:p>
+    <w:p>
+      <w:pPr>
+        <w:pStyle w:val="NormalWeb"/>
+        <w:numPr>
+          <w:ilvl w:val="0"/>
+          <w:numId w:val="68"/>
+        </w:numPr>
+        <w:spacing w:before="0" w:beforeAutospacing="0" w:after="0" w:afterAutospacing="0"/>
+      </w:pPr>
+      <w:r>
+        <w:t>Removed redundant state transitions.</w:t>
+      </w:r>
+    </w:p>
+    <w:p>
+      <w:pPr>
+        <w:pStyle w:val="NormalWeb"/>
+        <w:numPr>
+          <w:ilvl w:val="0"/>
+          <w:numId w:val="68"/>
+        </w:numPr>
+        <w:spacing w:before="0" w:beforeAutospacing="0" w:after="0" w:afterAutospacing="0"/>
+      </w:pPr>
+      <w:r>
+        <w:t>Ensured deterministic state updates.</w:t>
+      </w:r>
+    </w:p>
+    <w:p>
+      <w:pPr>
+        <w:pStyle w:val="Heading3"/>
+        <w:spacing w:before="0" w:beforeAutospacing="0" w:after="0" w:afterAutospacing="0"/>
+        <w:rPr>
+          <w:sz w:val="24"/>
+          <w:szCs w:val="24"/>
+        </w:rPr>
+      </w:pPr>
+      <w:r>
+        <w:rPr>
+          <w:sz w:val="24"/>
+          <w:szCs w:val="24"/>
+        </w:rPr>
+        <w:t>6. Operational Activities</w:t>
+      </w:r>
+    </w:p>
+    <w:p>
+      <w:pPr>
+        <w:pStyle w:val="NormalWeb"/>
+        <w:numPr>
+          <w:ilvl w:val="0"/>
+          <w:numId w:val="69"/>
+        </w:numPr>
+        <w:spacing w:before="0" w:beforeAutospacing="0" w:after="0" w:afterAutospacing="0"/>
+      </w:pPr>
+      <w:r>
+        <w:t>Continued manual readings and power cost analysis sheet updates for Driveline SMT.</w:t>
+      </w:r>
+    </w:p>
+    <w:p>
+      <w:pPr>
+        <w:pStyle w:val="NormalWeb"/>
+        <w:numPr>
+          <w:ilvl w:val="0"/>
+          <w:numId w:val="69"/>
+        </w:numPr>
+        <w:spacing w:before="0" w:beforeAutospacing="0" w:after="0" w:afterAutospacing="0"/>
+      </w:pPr>
+      <w:r>
+        <w:t>Reviewed entry consistency and structure alignment.</w:t>
+      </w:r>
+    </w:p>
+    <w:p>
+      <w:pPr>
+        <w:pStyle w:val="Heading3"/>
+        <w:spacing w:before="0" w:beforeAutospacing="0" w:after="0" w:afterAutospacing="0"/>
+        <w:rPr>
+          <w:sz w:val="24"/>
+          <w:szCs w:val="24"/>
+        </w:rPr>
+      </w:pPr>
+      <w:r>
+        <w:rPr>
+          <w:sz w:val="24"/>
+          <w:szCs w:val="24"/>
+        </w:rPr>
+        <w:t>7. Initiation of ML-CV Offline Mobile Application</w:t>
+      </w:r>
+    </w:p>
+    <w:p>
+      <w:pPr>
+        <w:pStyle w:val="NormalWeb"/>
+        <w:spacing w:before="0" w:beforeAutospacing="0" w:after="0" w:afterAutospacing="0"/>
+      </w:pPr>
+      <w:r>
+        <w:t>Started development planning for:</w:t>
+      </w:r>
+    </w:p>
+    <w:p>
+      <w:pPr>
+        <w:pStyle w:val="NormalWeb"/>
+        <w:spacing w:before="0" w:beforeAutospacing="0" w:after="0" w:afterAutospacing="0"/>
+      </w:pPr>
+      <w:r>
+        <w:rPr>
+          <w:rStyle w:val="Strong"/>
+        </w:rPr>
+        <w:t>SCANKAR – ML-CV Offline App</w:t>
+      </w:r>
+    </w:p>
+    <w:p>
+      <w:pPr>
+        <w:pStyle w:val="NormalWeb"/>
+        <w:spacing w:before="0" w:beforeAutospacing="0" w:after="0" w:afterAutospacing="0"/>
+      </w:pPr>
+      <w:r>
+        <w:t>Objective:</w:t>
+      </w:r>
+    </w:p>
+    <w:p>
+      <w:pPr>
+        <w:pStyle w:val="NormalWeb"/>
+        <w:spacing w:before="0" w:beforeAutospacing="0" w:after="0" w:afterAutospacing="0"/>
+      </w:pPr>
+      <w:r>
+        <w:t>To design a production-ready, 100% offline, zero-cost cross-platform mobile application (iOS &amp; Android) that:</w:t>
+      </w:r>
+    </w:p>
+    <w:p>
+      <w:pPr>
+        <w:pStyle w:val="NormalWeb"/>
+        <w:numPr>
+          <w:ilvl w:val="0"/>
+          <w:numId w:val="70"/>
+        </w:numPr>
+        <w:spacing w:before="0" w:beforeAutospacing="0" w:after="0" w:afterAutospacing="0"/>
+      </w:pPr>
+      <w:r>
+        <w:t>Uses Machine Learning + Computer Vision</w:t>
+      </w:r>
+    </w:p>
+    <w:p>
+      <w:pPr>
+        <w:pStyle w:val="NormalWeb"/>
+        <w:numPr>
+          <w:ilvl w:val="0"/>
+          <w:numId w:val="70"/>
+        </w:numPr>
+        <w:spacing w:before="0" w:beforeAutospacing="0" w:after="0" w:afterAutospacing="0"/>
+      </w:pPr>
+      <w:r>
+        <w:t>Scans handwritten machine reading sheets</w:t>
+      </w:r>
+    </w:p>
+    <w:p>
+      <w:pPr>
+        <w:pStyle w:val="NormalWeb"/>
+        <w:numPr>
+          <w:ilvl w:val="0"/>
+          <w:numId w:val="70"/>
+        </w:numPr>
+        <w:spacing w:before="0" w:beforeAutospacing="0" w:after="0" w:afterAutospacing="0"/>
+      </w:pPr>
+      <w:r>
+        <w:t>Extracts data while preserving table structure</w:t>
+      </w:r>
+    </w:p>
+    <w:p>
+      <w:pPr>
+        <w:pStyle w:val="NormalWeb"/>
+        <w:numPr>
+          <w:ilvl w:val="0"/>
+          <w:numId w:val="70"/>
+        </w:numPr>
+        <w:spacing w:before="0" w:beforeAutospacing="0" w:after="0" w:afterAutospacing="0"/>
+      </w:pPr>
+      <w:r>
+        <w:t>Maintains exact column alignment and row structure</w:t>
+      </w:r>
+    </w:p>
+    <w:p>
+      <w:pPr>
+        <w:pStyle w:val="NormalWeb"/>
+        <w:numPr>
+          <w:ilvl w:val="0"/>
+          <w:numId w:val="70"/>
+        </w:numPr>
+        <w:spacing w:before="0" w:beforeAutospacing="0" w:after="0" w:afterAutospacing="0"/>
+      </w:pPr>
+      <w:r>
+        <w:t>Exports data in pixel-faithful tabular format</w:t>
+      </w:r>
+    </w:p>
+    <w:p>
+      <w:pPr>
+        <w:pStyle w:val="NormalWeb"/>
+        <w:spacing w:before="0" w:beforeAutospacing="0" w:after="0" w:afterAutospacing="0"/>
+      </w:pPr>
+      <w:r>
+        <w:rPr>
+          <w:rStyle w:val="Strong"/>
+        </w:rPr>
+        <w:t>Critical Requirement:</w:t>
+      </w:r>
+    </w:p>
+    <w:p>
+      <w:pPr>
+        <w:pStyle w:val="NormalWeb"/>
+        <w:spacing w:before="0" w:beforeAutospacing="0" w:after="0" w:afterAutospacing="0"/>
+      </w:pPr>
+      <w:r>
+        <w:t>When readings appear in columns in the source image, the extracted output must preserve identical column structure without flattening or reshaping.</w:t>
+      </w:r>
+    </w:p>
+    <w:p>
+      <w:pPr>
+        <w:pStyle w:val="NormalWeb"/>
+        <w:spacing w:before="0" w:beforeAutospacing="0" w:after="0" w:afterAutospacing="0"/>
+      </w:pPr>
+    </w:p>
+    <w:p>
+      <w:pPr>
+        <w:pStyle w:val="Heading2"/>
+        <w:spacing w:before="0" w:beforeAutospacing="0" w:after="0" w:afterAutospacing="0"/>
+        <w:rPr>
+          <w:sz w:val="24"/>
+          <w:szCs w:val="24"/>
+        </w:rPr>
+      </w:pPr>
+      <w:r>
+        <w:rPr>
+          <w:sz w:val="24"/>
+          <w:szCs w:val="24"/>
+        </w:rPr>
+        <w:t>Outcome of the Day</w:t>
+      </w:r>
+    </w:p>
+    <w:p>
+      <w:pPr>
+        <w:pStyle w:val="NormalWeb"/>
+        <w:numPr>
+          <w:ilvl w:val="0"/>
+          <w:numId w:val="71"/>
+        </w:numPr>
+        <w:spacing w:before="0" w:beforeAutospacing="0" w:after="0" w:afterAutospacing="0"/>
+      </w:pPr>
+      <w:r>
+        <w:t>Ingestion workflow is fully operational through frontend.</w:t>
+      </w:r>
+    </w:p>
+    <w:p>
+      <w:pPr>
+        <w:pStyle w:val="NormalWeb"/>
+        <w:numPr>
+          <w:ilvl w:val="0"/>
+          <w:numId w:val="71"/>
+        </w:numPr>
+        <w:spacing w:before="0" w:beforeAutospacing="0" w:after="0" w:afterAutospacing="0"/>
+      </w:pPr>
+      <w:r>
+        <w:t>Qt WebChannel bridge is stable, deterministic, and non-blocking.</w:t>
+      </w:r>
+    </w:p>
+    <w:p>
+      <w:pPr>
+        <w:pStyle w:val="NormalWeb"/>
+        <w:numPr>
+          <w:ilvl w:val="0"/>
+          <w:numId w:val="71"/>
+        </w:numPr>
+        <w:spacing w:before="0" w:beforeAutospacing="0" w:after="0" w:afterAutospacing="0"/>
+      </w:pPr>
+      <w:r>
+        <w:t>Frontend API layer is complete and contract-aligned.</w:t>
+      </w:r>
+    </w:p>
+    <w:p>
+      <w:pPr>
+        <w:pStyle w:val="NormalWeb"/>
+        <w:numPr>
+          <w:ilvl w:val="0"/>
+          <w:numId w:val="71"/>
+        </w:numPr>
+        <w:spacing w:before="0" w:beforeAutospacing="0" w:after="0" w:afterAutospacing="0"/>
+      </w:pPr>
+      <w:r>
+        <w:t>All bridge race conditions eliminated.</w:t>
+      </w:r>
+    </w:p>
+    <w:p>
+      <w:pPr>
+        <w:pStyle w:val="NormalWeb"/>
+        <w:numPr>
+          <w:ilvl w:val="0"/>
+          <w:numId w:val="71"/>
+        </w:numPr>
+        <w:spacing w:before="0" w:beforeAutospacing="0" w:after="0" w:afterAutospacing="0"/>
+      </w:pPr>
+      <w:r>
+        <w:t>System warnings reduced to zero.</w:t>
+      </w:r>
+    </w:p>
+    <w:p>
+      <w:pPr>
+        <w:pStyle w:val="NormalWeb"/>
+        <w:numPr>
+          <w:ilvl w:val="0"/>
+          <w:numId w:val="71"/>
+        </w:numPr>
+        <w:spacing w:before="0" w:beforeAutospacing="0" w:after="0" w:afterAutospacing="0"/>
+      </w:pPr>
+      <w:r>
+        <w:t>Foundation laid for ML-CV-based digitization system for maintenance sheets.</w:t>
+      </w:r>
+    </w:p>
+    <w:p>
+      <w:pPr>
+        <w:pStyle w:val="NormalWeb"/>
+        <w:numPr>
+          <w:ilvl w:val="0"/>
+          <w:numId w:val="71"/>
+        </w:numPr>
+        <w:spacing w:before="0" w:beforeAutospacing="0" w:after="0" w:afterAutospacing="0"/>
+      </w:pPr>
+    </w:p>
+    <w:p>
+      <w:pPr>
+        <w:pStyle w:val="Heading2"/>
+        <w:spacing w:before="0" w:beforeAutospacing="0" w:after="0" w:afterAutospacing="0"/>
+        <w:rPr>
+          <w:sz w:val="24"/>
+          <w:szCs w:val="24"/>
+        </w:rPr>
+      </w:pPr>
+      <w:r>
+        <w:rPr>
+          <w:sz w:val="24"/>
+          <w:szCs w:val="24"/>
+        </w:rPr>
+        <w:t>Key Learnings</w:t>
+      </w:r>
+    </w:p>
+    <w:p>
+      <w:pPr>
+        <w:pStyle w:val="NormalWeb"/>
+        <w:numPr>
+          <w:ilvl w:val="0"/>
+          <w:numId w:val="72"/>
+        </w:numPr>
+        <w:spacing w:before="0" w:beforeAutospacing="0" w:after="0" w:afterAutospacing="0"/>
+      </w:pPr>
+      <w:r>
+        <w:t>Qt WebChannel initialization order is critical for stable IPC.</w:t>
+      </w:r>
+    </w:p>
+    <w:p>
+      <w:pPr>
+        <w:pStyle w:val="NormalWeb"/>
+        <w:numPr>
+          <w:ilvl w:val="0"/>
+          <w:numId w:val="72"/>
+        </w:numPr>
+        <w:spacing w:before="0" w:beforeAutospacing="0" w:after="0" w:afterAutospacing="0"/>
+      </w:pPr>
+      <w:r>
+        <w:t>Deterministic event signaling prevents race conditions.</w:t>
+      </w:r>
+    </w:p>
+    <w:p>
+      <w:pPr>
+        <w:pStyle w:val="NormalWeb"/>
+        <w:numPr>
+          <w:ilvl w:val="0"/>
+          <w:numId w:val="72"/>
+        </w:numPr>
+        <w:spacing w:before="0" w:beforeAutospacing="0" w:after="0" w:afterAutospacing="0"/>
+      </w:pPr>
+      <w:r>
+        <w:t>Bridge availability must be treated as asynchronous infrastructure.</w:t>
+      </w:r>
+    </w:p>
+    <w:p>
+      <w:pPr>
+        <w:pStyle w:val="NormalWeb"/>
+        <w:numPr>
+          <w:ilvl w:val="0"/>
+          <w:numId w:val="72"/>
+        </w:numPr>
+        <w:spacing w:before="0" w:beforeAutospacing="0" w:after="0" w:afterAutospacing="0"/>
+      </w:pPr>
+      <w:r>
+        <w:t>Structural fidelity in CV-based digitization requires layout-aware extraction models.</w:t>
+      </w:r>
+    </w:p>
+    <w:p>
+      <w:pPr>
+        <w:pStyle w:val="NormalWeb"/>
+        <w:numPr>
+          <w:ilvl w:val="0"/>
+          <w:numId w:val="72"/>
+        </w:numPr>
+        <w:spacing w:before="0" w:beforeAutospacing="0" w:after="0" w:afterAutospacing="0"/>
+      </w:pPr>
+    </w:p>
+    <w:p>
+      <w:pPr>
+        <w:pStyle w:val="Heading2"/>
+        <w:spacing w:before="0" w:beforeAutospacing="0" w:after="0" w:afterAutospacing="0"/>
+        <w:rPr>
+          <w:sz w:val="24"/>
+          <w:szCs w:val="24"/>
+        </w:rPr>
+      </w:pPr>
+      <w:r>
+        <w:rPr>
+          <w:sz w:val="24"/>
+          <w:szCs w:val="24"/>
+        </w:rPr>
+        <w:t>Next Steps</w:t>
+      </w:r>
+    </w:p>
+    <w:p>
+      <w:pPr>
+        <w:pStyle w:val="NormalWeb"/>
+        <w:numPr>
+          <w:ilvl w:val="0"/>
+          <w:numId w:val="73"/>
+        </w:numPr>
+        <w:spacing w:before="0" w:beforeAutospacing="0" w:after="0" w:afterAutospacing="0"/>
+      </w:pPr>
+      <w:r>
+        <w:t>Integrate ingestion success flow with dashboard auto-refresh.</w:t>
+      </w:r>
+    </w:p>
+    <w:p>
+      <w:pPr>
+        <w:pStyle w:val="NormalWeb"/>
+        <w:numPr>
+          <w:ilvl w:val="0"/>
+          <w:numId w:val="73"/>
+        </w:numPr>
+        <w:spacing w:before="0" w:beforeAutospacing="0" w:after="0" w:afterAutospacing="0"/>
+      </w:pPr>
+      <w:r>
+        <w:t>Begin CV model selection for table detection.</w:t>
+      </w:r>
+    </w:p>
+    <w:p>
+      <w:pPr>
+        <w:pStyle w:val="NormalWeb"/>
+        <w:numPr>
+          <w:ilvl w:val="0"/>
+          <w:numId w:val="73"/>
+        </w:numPr>
+        <w:spacing w:before="0" w:beforeAutospacing="0" w:after="0" w:afterAutospacing="0"/>
+      </w:pPr>
+      <w:r>
+        <w:t>Prototype table-structure-preserving OCR pipeline.</w:t>
+      </w:r>
+    </w:p>
+    <w:p>
+      <w:pPr>
+        <w:pStyle w:val="NormalWeb"/>
+        <w:numPr>
+          <w:ilvl w:val="0"/>
+          <w:numId w:val="73"/>
+        </w:numPr>
+        <w:spacing w:before="0" w:beforeAutospacing="0" w:after="0" w:afterAutospacing="0"/>
+      </w:pPr>
+      <w:r>
+        <w:t>Define export format contract for SCANKAR mobile app.</w:t>
+      </w:r>
       <w:bookmarkStart w:id="0" w:name="_GoBack"/>
       <w:bookmarkEnd w:id="0"/>
-    </w:p>
-    <w:p>
-      <w:pPr>
-        <w:spacing w:after="0" w:line="240" w:lineRule="auto"/>
-        <w:outlineLvl w:val="1"/>
-        <w:rPr>
-          <w:rFonts w:ascii="Times New Roman" w:eastAsia="Times New Roman" w:hAnsi="Times New Roman" w:cs="Times New Roman"/>
-          <w:b/>
-          <w:sz w:val="24"/>
-          <w:szCs w:val="24"/>
-        </w:rPr>
-      </w:pPr>
-    </w:p>
-    <w:p>
-      <w:pPr>
-        <w:spacing w:after="0" w:line="240" w:lineRule="auto"/>
-        <w:outlineLvl w:val="1"/>
-        <w:rPr>
-          <w:rFonts w:ascii="Times New Roman" w:eastAsia="Times New Roman" w:hAnsi="Times New Roman" w:cs="Times New Roman"/>
-          <w:b/>
-          <w:sz w:val="24"/>
-          <w:szCs w:val="24"/>
-        </w:rPr>
-      </w:pPr>
-      <w:r>
-        <w:rPr>
-          <w:rFonts w:ascii="Times New Roman" w:eastAsia="Times New Roman" w:hAnsi="Times New Roman" w:cs="Times New Roman"/>
-          <w:b/>
-          <w:sz w:val="24"/>
-          <w:szCs w:val="24"/>
-        </w:rPr>
-        <w:t>Challenges / Open Points</w:t>
-      </w:r>
-    </w:p>
-    <w:p>
-      <w:pPr>
-        <w:pStyle w:val="ListParagraph"/>
-        <w:numPr>
-          <w:ilvl w:val="0"/>
-          <w:numId w:val="62"/>
-        </w:numPr>
-        <w:spacing w:after="0" w:line="240" w:lineRule="auto"/>
-        <w:outlineLvl w:val="1"/>
-        <w:rPr>
-          <w:rFonts w:ascii="Times New Roman" w:eastAsia="Times New Roman" w:hAnsi="Times New Roman" w:cs="Times New Roman"/>
-          <w:sz w:val="24"/>
-          <w:szCs w:val="24"/>
-        </w:rPr>
-      </w:pPr>
-      <w:r>
-        <w:rPr>
-          <w:rFonts w:ascii="Times New Roman" w:eastAsia="Times New Roman" w:hAnsi="Times New Roman" w:cs="Times New Roman"/>
-          <w:sz w:val="24"/>
-          <w:szCs w:val="24"/>
-        </w:rPr>
-        <w:t>Search modal still requires UI centering refinement and final stability verification</w:t>
-      </w:r>
-    </w:p>
-    <w:p>
-      <w:pPr>
-        <w:pStyle w:val="ListParagraph"/>
-        <w:numPr>
-          <w:ilvl w:val="0"/>
-          <w:numId w:val="62"/>
-        </w:numPr>
-        <w:spacing w:after="0" w:line="240" w:lineRule="auto"/>
-        <w:outlineLvl w:val="1"/>
-        <w:rPr>
-          <w:rFonts w:ascii="Times New Roman" w:eastAsia="Times New Roman" w:hAnsi="Times New Roman" w:cs="Times New Roman"/>
-          <w:sz w:val="24"/>
-          <w:szCs w:val="24"/>
-        </w:rPr>
-      </w:pPr>
-      <w:r>
-        <w:rPr>
-          <w:rFonts w:ascii="Times New Roman" w:eastAsia="Times New Roman" w:hAnsi="Times New Roman" w:cs="Times New Roman"/>
-          <w:sz w:val="24"/>
-          <w:szCs w:val="24"/>
-        </w:rPr>
-        <w:t>Ingestion pipeline automation not yet fully implemented</w:t>
-      </w:r>
-    </w:p>
-    <w:p>
-      <w:pPr>
-        <w:pStyle w:val="ListParagraph"/>
-        <w:numPr>
-          <w:ilvl w:val="0"/>
-          <w:numId w:val="62"/>
-        </w:numPr>
-        <w:spacing w:after="0" w:line="240" w:lineRule="auto"/>
-        <w:outlineLvl w:val="1"/>
-        <w:rPr>
-          <w:rFonts w:ascii="Times New Roman" w:eastAsia="Times New Roman" w:hAnsi="Times New Roman" w:cs="Times New Roman"/>
-          <w:sz w:val="24"/>
-          <w:szCs w:val="24"/>
-        </w:rPr>
-      </w:pPr>
-      <w:r>
-        <w:rPr>
-          <w:rFonts w:ascii="Times New Roman" w:eastAsia="Times New Roman" w:hAnsi="Times New Roman" w:cs="Times New Roman"/>
-          <w:sz w:val="24"/>
-          <w:szCs w:val="24"/>
-        </w:rPr>
-        <w:t>Rule-based and ML-based insight engine layer pending implementation</w:t>
-      </w:r>
-    </w:p>
-    <w:p>
-      <w:pPr>
-        <w:spacing w:after="0" w:line="240" w:lineRule="auto"/>
-        <w:outlineLvl w:val="1"/>
-        <w:rPr>
-          <w:rFonts w:ascii="Times New Roman" w:eastAsia="Times New Roman" w:hAnsi="Times New Roman" w:cs="Times New Roman"/>
-          <w:b/>
-          <w:sz w:val="24"/>
-          <w:szCs w:val="24"/>
-        </w:rPr>
-      </w:pPr>
-    </w:p>
-    <w:p>
-      <w:pPr>
-        <w:spacing w:after="0" w:line="240" w:lineRule="auto"/>
-        <w:outlineLvl w:val="1"/>
-        <w:rPr>
-          <w:rFonts w:ascii="Times New Roman" w:eastAsia="Times New Roman" w:hAnsi="Times New Roman" w:cs="Times New Roman"/>
-          <w:b/>
-          <w:sz w:val="24"/>
-          <w:szCs w:val="24"/>
-        </w:rPr>
-      </w:pPr>
-      <w:r>
-        <w:rPr>
-          <w:rFonts w:ascii="Times New Roman" w:eastAsia="Times New Roman" w:hAnsi="Times New Roman" w:cs="Times New Roman"/>
-          <w:b/>
-          <w:sz w:val="24"/>
-          <w:szCs w:val="24"/>
-        </w:rPr>
-        <w:t>Next Steps</w:t>
-      </w:r>
-    </w:p>
-    <w:p>
-      <w:pPr>
-        <w:pStyle w:val="ListParagraph"/>
-        <w:numPr>
-          <w:ilvl w:val="0"/>
-          <w:numId w:val="63"/>
-        </w:numPr>
-        <w:spacing w:after="0" w:line="240" w:lineRule="auto"/>
-        <w:outlineLvl w:val="1"/>
-        <w:rPr>
-          <w:rFonts w:ascii="Times New Roman" w:eastAsia="Times New Roman" w:hAnsi="Times New Roman" w:cs="Times New Roman"/>
-          <w:sz w:val="24"/>
-          <w:szCs w:val="24"/>
-        </w:rPr>
-      </w:pPr>
-      <w:r>
-        <w:rPr>
-          <w:rFonts w:ascii="Times New Roman" w:eastAsia="Times New Roman" w:hAnsi="Times New Roman" w:cs="Times New Roman"/>
-          <w:sz w:val="24"/>
-          <w:szCs w:val="24"/>
-        </w:rPr>
-        <w:t>Complete ingestion pipeline end-to-end</w:t>
-      </w:r>
-    </w:p>
-    <w:p>
-      <w:pPr>
-        <w:pStyle w:val="ListParagraph"/>
-        <w:numPr>
-          <w:ilvl w:val="0"/>
-          <w:numId w:val="63"/>
-        </w:numPr>
-        <w:spacing w:after="0" w:line="240" w:lineRule="auto"/>
-        <w:outlineLvl w:val="1"/>
-        <w:rPr>
-          <w:rFonts w:ascii="Times New Roman" w:eastAsia="Times New Roman" w:hAnsi="Times New Roman" w:cs="Times New Roman"/>
-          <w:sz w:val="24"/>
-          <w:szCs w:val="24"/>
-        </w:rPr>
-      </w:pPr>
-      <w:r>
-        <w:rPr>
-          <w:rFonts w:ascii="Times New Roman" w:eastAsia="Times New Roman" w:hAnsi="Times New Roman" w:cs="Times New Roman"/>
-          <w:sz w:val="24"/>
-          <w:szCs w:val="24"/>
-        </w:rPr>
-        <w:t>I</w:t>
-      </w:r>
-      <w:r>
-        <w:rPr>
-          <w:rFonts w:ascii="Times New Roman" w:eastAsia="Times New Roman" w:hAnsi="Times New Roman" w:cs="Times New Roman"/>
-          <w:sz w:val="24"/>
-          <w:szCs w:val="24"/>
-        </w:rPr>
-        <w:t>mplement rule-based engine layer for deterministic insights</w:t>
-      </w:r>
-    </w:p>
-    <w:p>
-      <w:pPr>
-        <w:pStyle w:val="ListParagraph"/>
-        <w:numPr>
-          <w:ilvl w:val="0"/>
-          <w:numId w:val="63"/>
-        </w:numPr>
-        <w:spacing w:after="0" w:line="240" w:lineRule="auto"/>
-        <w:outlineLvl w:val="1"/>
-        <w:rPr>
-          <w:rFonts w:ascii="Times New Roman" w:eastAsia="Times New Roman" w:hAnsi="Times New Roman" w:cs="Times New Roman"/>
-          <w:sz w:val="24"/>
-          <w:szCs w:val="24"/>
-        </w:rPr>
-      </w:pPr>
-      <w:r>
-        <w:rPr>
-          <w:rFonts w:ascii="Times New Roman" w:eastAsia="Times New Roman" w:hAnsi="Times New Roman" w:cs="Times New Roman"/>
-          <w:sz w:val="24"/>
-          <w:szCs w:val="24"/>
-        </w:rPr>
-        <w:t>Design and integrate ML-based anomaly detection layer</w:t>
-      </w:r>
-    </w:p>
-    <w:p>
-      <w:pPr>
-        <w:pStyle w:val="ListParagraph"/>
-        <w:numPr>
-          <w:ilvl w:val="0"/>
-          <w:numId w:val="63"/>
-        </w:numPr>
-        <w:spacing w:after="0" w:line="240" w:lineRule="auto"/>
-        <w:outlineLvl w:val="1"/>
-        <w:rPr>
-          <w:rFonts w:ascii="Times New Roman" w:eastAsia="Times New Roman" w:hAnsi="Times New Roman" w:cs="Times New Roman"/>
-          <w:sz w:val="24"/>
-          <w:szCs w:val="24"/>
-        </w:rPr>
-      </w:pPr>
-      <w:r>
-        <w:rPr>
-          <w:rFonts w:ascii="Times New Roman" w:eastAsia="Times New Roman" w:hAnsi="Times New Roman" w:cs="Times New Roman"/>
-          <w:sz w:val="24"/>
-          <w:szCs w:val="24"/>
-        </w:rPr>
-        <w:t>Finalize desktop UI production stability</w:t>
-      </w:r>
-    </w:p>
-    <w:p>
-      <w:pPr>
-        <w:pStyle w:val="Heading3"/>
-        <w:spacing w:before="0" w:beforeAutospacing="0" w:after="0" w:afterAutospacing="0"/>
-        <w:rPr>
-          <w:b w:val="0"/>
-          <w:sz w:val="24"/>
-          <w:szCs w:val="24"/>
-        </w:rPr>
-      </w:pPr>
     </w:p>
     <w:sectPr>
       <w:pgSz w:w="12240" w:h="15840"/>
@@ -15064,6 +16508,304 @@
     </w:lvl>
   </w:abstractNum>
   <w:abstractNum w:abstractNumId="14" w15:restartNumberingAfterBreak="0">
+    <w:nsid w:val="1AA157C6"/>
+    <w:multiLevelType w:val="multilevel"/>
+    <w:tmpl w:val="349810B6"/>
+    <w:lvl w:ilvl="0">
+      <w:start w:val="1"/>
+      <w:numFmt w:val="bullet"/>
+      <w:lvlText w:val=""/>
+      <w:lvlJc w:val="left"/>
+      <w:pPr>
+        <w:tabs>
+          <w:tab w:val="num" w:pos="720"/>
+        </w:tabs>
+        <w:ind w:left="720" w:hanging="360"/>
+      </w:pPr>
+      <w:rPr>
+        <w:rFonts w:ascii="Symbol" w:hAnsi="Symbol" w:hint="default"/>
+        <w:sz w:val="20"/>
+      </w:rPr>
+    </w:lvl>
+    <w:lvl w:ilvl="1" w:tentative="1">
+      <w:start w:val="1"/>
+      <w:numFmt w:val="bullet"/>
+      <w:lvlText w:val="o"/>
+      <w:lvlJc w:val="left"/>
+      <w:pPr>
+        <w:tabs>
+          <w:tab w:val="num" w:pos="1440"/>
+        </w:tabs>
+        <w:ind w:left="1440" w:hanging="360"/>
+      </w:pPr>
+      <w:rPr>
+        <w:rFonts w:ascii="Courier New" w:hAnsi="Courier New" w:hint="default"/>
+        <w:sz w:val="20"/>
+      </w:rPr>
+    </w:lvl>
+    <w:lvl w:ilvl="2" w:tentative="1">
+      <w:start w:val="1"/>
+      <w:numFmt w:val="bullet"/>
+      <w:lvlText w:val=""/>
+      <w:lvlJc w:val="left"/>
+      <w:pPr>
+        <w:tabs>
+          <w:tab w:val="num" w:pos="2160"/>
+        </w:tabs>
+        <w:ind w:left="2160" w:hanging="360"/>
+      </w:pPr>
+      <w:rPr>
+        <w:rFonts w:ascii="Wingdings" w:hAnsi="Wingdings" w:hint="default"/>
+        <w:sz w:val="20"/>
+      </w:rPr>
+    </w:lvl>
+    <w:lvl w:ilvl="3" w:tentative="1">
+      <w:start w:val="1"/>
+      <w:numFmt w:val="bullet"/>
+      <w:lvlText w:val=""/>
+      <w:lvlJc w:val="left"/>
+      <w:pPr>
+        <w:tabs>
+          <w:tab w:val="num" w:pos="2880"/>
+        </w:tabs>
+        <w:ind w:left="2880" w:hanging="360"/>
+      </w:pPr>
+      <w:rPr>
+        <w:rFonts w:ascii="Wingdings" w:hAnsi="Wingdings" w:hint="default"/>
+        <w:sz w:val="20"/>
+      </w:rPr>
+    </w:lvl>
+    <w:lvl w:ilvl="4" w:tentative="1">
+      <w:start w:val="1"/>
+      <w:numFmt w:val="bullet"/>
+      <w:lvlText w:val=""/>
+      <w:lvlJc w:val="left"/>
+      <w:pPr>
+        <w:tabs>
+          <w:tab w:val="num" w:pos="3600"/>
+        </w:tabs>
+        <w:ind w:left="3600" w:hanging="360"/>
+      </w:pPr>
+      <w:rPr>
+        <w:rFonts w:ascii="Wingdings" w:hAnsi="Wingdings" w:hint="default"/>
+        <w:sz w:val="20"/>
+      </w:rPr>
+    </w:lvl>
+    <w:lvl w:ilvl="5" w:tentative="1">
+      <w:start w:val="1"/>
+      <w:numFmt w:val="bullet"/>
+      <w:lvlText w:val=""/>
+      <w:lvlJc w:val="left"/>
+      <w:pPr>
+        <w:tabs>
+          <w:tab w:val="num" w:pos="4320"/>
+        </w:tabs>
+        <w:ind w:left="4320" w:hanging="360"/>
+      </w:pPr>
+      <w:rPr>
+        <w:rFonts w:ascii="Wingdings" w:hAnsi="Wingdings" w:hint="default"/>
+        <w:sz w:val="20"/>
+      </w:rPr>
+    </w:lvl>
+    <w:lvl w:ilvl="6" w:tentative="1">
+      <w:start w:val="1"/>
+      <w:numFmt w:val="bullet"/>
+      <w:lvlText w:val=""/>
+      <w:lvlJc w:val="left"/>
+      <w:pPr>
+        <w:tabs>
+          <w:tab w:val="num" w:pos="5040"/>
+        </w:tabs>
+        <w:ind w:left="5040" w:hanging="360"/>
+      </w:pPr>
+      <w:rPr>
+        <w:rFonts w:ascii="Wingdings" w:hAnsi="Wingdings" w:hint="default"/>
+        <w:sz w:val="20"/>
+      </w:rPr>
+    </w:lvl>
+    <w:lvl w:ilvl="7" w:tentative="1">
+      <w:start w:val="1"/>
+      <w:numFmt w:val="bullet"/>
+      <w:lvlText w:val=""/>
+      <w:lvlJc w:val="left"/>
+      <w:pPr>
+        <w:tabs>
+          <w:tab w:val="num" w:pos="5760"/>
+        </w:tabs>
+        <w:ind w:left="5760" w:hanging="360"/>
+      </w:pPr>
+      <w:rPr>
+        <w:rFonts w:ascii="Wingdings" w:hAnsi="Wingdings" w:hint="default"/>
+        <w:sz w:val="20"/>
+      </w:rPr>
+    </w:lvl>
+    <w:lvl w:ilvl="8" w:tentative="1">
+      <w:start w:val="1"/>
+      <w:numFmt w:val="bullet"/>
+      <w:lvlText w:val=""/>
+      <w:lvlJc w:val="left"/>
+      <w:pPr>
+        <w:tabs>
+          <w:tab w:val="num" w:pos="6480"/>
+        </w:tabs>
+        <w:ind w:left="6480" w:hanging="360"/>
+      </w:pPr>
+      <w:rPr>
+        <w:rFonts w:ascii="Wingdings" w:hAnsi="Wingdings" w:hint="default"/>
+        <w:sz w:val="20"/>
+      </w:rPr>
+    </w:lvl>
+  </w:abstractNum>
+  <w:abstractNum w:abstractNumId="15" w15:restartNumberingAfterBreak="0">
+    <w:nsid w:val="1D784D91"/>
+    <w:multiLevelType w:val="multilevel"/>
+    <w:tmpl w:val="D990E908"/>
+    <w:lvl w:ilvl="0">
+      <w:start w:val="1"/>
+      <w:numFmt w:val="bullet"/>
+      <w:lvlText w:val=""/>
+      <w:lvlJc w:val="left"/>
+      <w:pPr>
+        <w:tabs>
+          <w:tab w:val="num" w:pos="720"/>
+        </w:tabs>
+        <w:ind w:left="720" w:hanging="360"/>
+      </w:pPr>
+      <w:rPr>
+        <w:rFonts w:ascii="Symbol" w:hAnsi="Symbol" w:hint="default"/>
+        <w:sz w:val="20"/>
+      </w:rPr>
+    </w:lvl>
+    <w:lvl w:ilvl="1" w:tentative="1">
+      <w:start w:val="1"/>
+      <w:numFmt w:val="bullet"/>
+      <w:lvlText w:val="o"/>
+      <w:lvlJc w:val="left"/>
+      <w:pPr>
+        <w:tabs>
+          <w:tab w:val="num" w:pos="1440"/>
+        </w:tabs>
+        <w:ind w:left="1440" w:hanging="360"/>
+      </w:pPr>
+      <w:rPr>
+        <w:rFonts w:ascii="Courier New" w:hAnsi="Courier New" w:hint="default"/>
+        <w:sz w:val="20"/>
+      </w:rPr>
+    </w:lvl>
+    <w:lvl w:ilvl="2" w:tentative="1">
+      <w:start w:val="1"/>
+      <w:numFmt w:val="bullet"/>
+      <w:lvlText w:val=""/>
+      <w:lvlJc w:val="left"/>
+      <w:pPr>
+        <w:tabs>
+          <w:tab w:val="num" w:pos="2160"/>
+        </w:tabs>
+        <w:ind w:left="2160" w:hanging="360"/>
+      </w:pPr>
+      <w:rPr>
+        <w:rFonts w:ascii="Wingdings" w:hAnsi="Wingdings" w:hint="default"/>
+        <w:sz w:val="20"/>
+      </w:rPr>
+    </w:lvl>
+    <w:lvl w:ilvl="3" w:tentative="1">
+      <w:start w:val="1"/>
+      <w:numFmt w:val="bullet"/>
+      <w:lvlText w:val=""/>
+      <w:lvlJc w:val="left"/>
+      <w:pPr>
+        <w:tabs>
+          <w:tab w:val="num" w:pos="2880"/>
+        </w:tabs>
+        <w:ind w:left="2880" w:hanging="360"/>
+      </w:pPr>
+      <w:rPr>
+        <w:rFonts w:ascii="Wingdings" w:hAnsi="Wingdings" w:hint="default"/>
+        <w:sz w:val="20"/>
+      </w:rPr>
+    </w:lvl>
+    <w:lvl w:ilvl="4" w:tentative="1">
+      <w:start w:val="1"/>
+      <w:numFmt w:val="bullet"/>
+      <w:lvlText w:val=""/>
+      <w:lvlJc w:val="left"/>
+      <w:pPr>
+        <w:tabs>
+          <w:tab w:val="num" w:pos="3600"/>
+        </w:tabs>
+        <w:ind w:left="3600" w:hanging="360"/>
+      </w:pPr>
+      <w:rPr>
+        <w:rFonts w:ascii="Wingdings" w:hAnsi="Wingdings" w:hint="default"/>
+        <w:sz w:val="20"/>
+      </w:rPr>
+    </w:lvl>
+    <w:lvl w:ilvl="5" w:tentative="1">
+      <w:start w:val="1"/>
+      <w:numFmt w:val="bullet"/>
+      <w:lvlText w:val=""/>
+      <w:lvlJc w:val="left"/>
+      <w:pPr>
+        <w:tabs>
+          <w:tab w:val="num" w:pos="4320"/>
+        </w:tabs>
+        <w:ind w:left="4320" w:hanging="360"/>
+      </w:pPr>
+      <w:rPr>
+        <w:rFonts w:ascii="Wingdings" w:hAnsi="Wingdings" w:hint="default"/>
+        <w:sz w:val="20"/>
+      </w:rPr>
+    </w:lvl>
+    <w:lvl w:ilvl="6" w:tentative="1">
+      <w:start w:val="1"/>
+      <w:numFmt w:val="bullet"/>
+      <w:lvlText w:val=""/>
+      <w:lvlJc w:val="left"/>
+      <w:pPr>
+        <w:tabs>
+          <w:tab w:val="num" w:pos="5040"/>
+        </w:tabs>
+        <w:ind w:left="5040" w:hanging="360"/>
+      </w:pPr>
+      <w:rPr>
+        <w:rFonts w:ascii="Wingdings" w:hAnsi="Wingdings" w:hint="default"/>
+        <w:sz w:val="20"/>
+      </w:rPr>
+    </w:lvl>
+    <w:lvl w:ilvl="7" w:tentative="1">
+      <w:start w:val="1"/>
+      <w:numFmt w:val="bullet"/>
+      <w:lvlText w:val=""/>
+      <w:lvlJc w:val="left"/>
+      <w:pPr>
+        <w:tabs>
+          <w:tab w:val="num" w:pos="5760"/>
+        </w:tabs>
+        <w:ind w:left="5760" w:hanging="360"/>
+      </w:pPr>
+      <w:rPr>
+        <w:rFonts w:ascii="Wingdings" w:hAnsi="Wingdings" w:hint="default"/>
+        <w:sz w:val="20"/>
+      </w:rPr>
+    </w:lvl>
+    <w:lvl w:ilvl="8" w:tentative="1">
+      <w:start w:val="1"/>
+      <w:numFmt w:val="bullet"/>
+      <w:lvlText w:val=""/>
+      <w:lvlJc w:val="left"/>
+      <w:pPr>
+        <w:tabs>
+          <w:tab w:val="num" w:pos="6480"/>
+        </w:tabs>
+        <w:ind w:left="6480" w:hanging="360"/>
+      </w:pPr>
+      <w:rPr>
+        <w:rFonts w:ascii="Wingdings" w:hAnsi="Wingdings" w:hint="default"/>
+        <w:sz w:val="20"/>
+      </w:rPr>
+    </w:lvl>
+  </w:abstractNum>
+  <w:abstractNum w:abstractNumId="16" w15:restartNumberingAfterBreak="0">
     <w:nsid w:val="1D795E8D"/>
     <w:multiLevelType w:val="multilevel"/>
     <w:tmpl w:val="1D48DAD0"/>
@@ -15212,7 +16954,7 @@
       </w:rPr>
     </w:lvl>
   </w:abstractNum>
-  <w:abstractNum w:abstractNumId="15" w15:restartNumberingAfterBreak="0">
+  <w:abstractNum w:abstractNumId="17" w15:restartNumberingAfterBreak="0">
     <w:nsid w:val="1E013F2E"/>
     <w:multiLevelType w:val="multilevel"/>
     <w:tmpl w:val="ED0466AA"/>
@@ -15361,7 +17103,7 @@
       </w:rPr>
     </w:lvl>
   </w:abstractNum>
-  <w:abstractNum w:abstractNumId="16" w15:restartNumberingAfterBreak="0">
+  <w:abstractNum w:abstractNumId="18" w15:restartNumberingAfterBreak="0">
     <w:nsid w:val="1E957172"/>
     <w:multiLevelType w:val="multilevel"/>
     <w:tmpl w:val="E1EC9D14"/>
@@ -15510,7 +17252,7 @@
       </w:rPr>
     </w:lvl>
   </w:abstractNum>
-  <w:abstractNum w:abstractNumId="17" w15:restartNumberingAfterBreak="0">
+  <w:abstractNum w:abstractNumId="19" w15:restartNumberingAfterBreak="0">
     <w:nsid w:val="1F04011B"/>
     <w:multiLevelType w:val="multilevel"/>
     <w:tmpl w:val="32E60924"/>
@@ -15659,7 +17401,7 @@
       </w:rPr>
     </w:lvl>
   </w:abstractNum>
-  <w:abstractNum w:abstractNumId="18" w15:restartNumberingAfterBreak="0">
+  <w:abstractNum w:abstractNumId="20" w15:restartNumberingAfterBreak="0">
     <w:nsid w:val="1FFA7335"/>
     <w:multiLevelType w:val="multilevel"/>
     <w:tmpl w:val="F746CC02"/>
@@ -15808,7 +17550,7 @@
       </w:rPr>
     </w:lvl>
   </w:abstractNum>
-  <w:abstractNum w:abstractNumId="19" w15:restartNumberingAfterBreak="0">
+  <w:abstractNum w:abstractNumId="21" w15:restartNumberingAfterBreak="0">
     <w:nsid w:val="277F001C"/>
     <w:multiLevelType w:val="multilevel"/>
     <w:tmpl w:val="DD520D0A"/>
@@ -15957,7 +17699,7 @@
       </w:rPr>
     </w:lvl>
   </w:abstractNum>
-  <w:abstractNum w:abstractNumId="20" w15:restartNumberingAfterBreak="0">
+  <w:abstractNum w:abstractNumId="22" w15:restartNumberingAfterBreak="0">
     <w:nsid w:val="281F6B31"/>
     <w:multiLevelType w:val="multilevel"/>
     <w:tmpl w:val="1D141264"/>
@@ -16106,7 +17848,7 @@
       </w:rPr>
     </w:lvl>
   </w:abstractNum>
-  <w:abstractNum w:abstractNumId="21" w15:restartNumberingAfterBreak="0">
+  <w:abstractNum w:abstractNumId="23" w15:restartNumberingAfterBreak="0">
     <w:nsid w:val="2C4213E1"/>
     <w:multiLevelType w:val="multilevel"/>
     <w:tmpl w:val="C2442892"/>
@@ -16255,7 +17997,156 @@
       </w:rPr>
     </w:lvl>
   </w:abstractNum>
-  <w:abstractNum w:abstractNumId="22" w15:restartNumberingAfterBreak="0">
+  <w:abstractNum w:abstractNumId="24" w15:restartNumberingAfterBreak="0">
+    <w:nsid w:val="2C574A5E"/>
+    <w:multiLevelType w:val="multilevel"/>
+    <w:tmpl w:val="7A28EA68"/>
+    <w:lvl w:ilvl="0">
+      <w:start w:val="1"/>
+      <w:numFmt w:val="bullet"/>
+      <w:lvlText w:val=""/>
+      <w:lvlJc w:val="left"/>
+      <w:pPr>
+        <w:tabs>
+          <w:tab w:val="num" w:pos="720"/>
+        </w:tabs>
+        <w:ind w:left="720" w:hanging="360"/>
+      </w:pPr>
+      <w:rPr>
+        <w:rFonts w:ascii="Symbol" w:hAnsi="Symbol" w:hint="default"/>
+        <w:sz w:val="20"/>
+      </w:rPr>
+    </w:lvl>
+    <w:lvl w:ilvl="1" w:tentative="1">
+      <w:start w:val="1"/>
+      <w:numFmt w:val="bullet"/>
+      <w:lvlText w:val="o"/>
+      <w:lvlJc w:val="left"/>
+      <w:pPr>
+        <w:tabs>
+          <w:tab w:val="num" w:pos="1440"/>
+        </w:tabs>
+        <w:ind w:left="1440" w:hanging="360"/>
+      </w:pPr>
+      <w:rPr>
+        <w:rFonts w:ascii="Courier New" w:hAnsi="Courier New" w:hint="default"/>
+        <w:sz w:val="20"/>
+      </w:rPr>
+    </w:lvl>
+    <w:lvl w:ilvl="2" w:tentative="1">
+      <w:start w:val="1"/>
+      <w:numFmt w:val="bullet"/>
+      <w:lvlText w:val=""/>
+      <w:lvlJc w:val="left"/>
+      <w:pPr>
+        <w:tabs>
+          <w:tab w:val="num" w:pos="2160"/>
+        </w:tabs>
+        <w:ind w:left="2160" w:hanging="360"/>
+      </w:pPr>
+      <w:rPr>
+        <w:rFonts w:ascii="Wingdings" w:hAnsi="Wingdings" w:hint="default"/>
+        <w:sz w:val="20"/>
+      </w:rPr>
+    </w:lvl>
+    <w:lvl w:ilvl="3" w:tentative="1">
+      <w:start w:val="1"/>
+      <w:numFmt w:val="bullet"/>
+      <w:lvlText w:val=""/>
+      <w:lvlJc w:val="left"/>
+      <w:pPr>
+        <w:tabs>
+          <w:tab w:val="num" w:pos="2880"/>
+        </w:tabs>
+        <w:ind w:left="2880" w:hanging="360"/>
+      </w:pPr>
+      <w:rPr>
+        <w:rFonts w:ascii="Wingdings" w:hAnsi="Wingdings" w:hint="default"/>
+        <w:sz w:val="20"/>
+      </w:rPr>
+    </w:lvl>
+    <w:lvl w:ilvl="4" w:tentative="1">
+      <w:start w:val="1"/>
+      <w:numFmt w:val="bullet"/>
+      <w:lvlText w:val=""/>
+      <w:lvlJc w:val="left"/>
+      <w:pPr>
+        <w:tabs>
+          <w:tab w:val="num" w:pos="3600"/>
+        </w:tabs>
+        <w:ind w:left="3600" w:hanging="360"/>
+      </w:pPr>
+      <w:rPr>
+        <w:rFonts w:ascii="Wingdings" w:hAnsi="Wingdings" w:hint="default"/>
+        <w:sz w:val="20"/>
+      </w:rPr>
+    </w:lvl>
+    <w:lvl w:ilvl="5" w:tentative="1">
+      <w:start w:val="1"/>
+      <w:numFmt w:val="bullet"/>
+      <w:lvlText w:val=""/>
+      <w:lvlJc w:val="left"/>
+      <w:pPr>
+        <w:tabs>
+          <w:tab w:val="num" w:pos="4320"/>
+        </w:tabs>
+        <w:ind w:left="4320" w:hanging="360"/>
+      </w:pPr>
+      <w:rPr>
+        <w:rFonts w:ascii="Wingdings" w:hAnsi="Wingdings" w:hint="default"/>
+        <w:sz w:val="20"/>
+      </w:rPr>
+    </w:lvl>
+    <w:lvl w:ilvl="6" w:tentative="1">
+      <w:start w:val="1"/>
+      <w:numFmt w:val="bullet"/>
+      <w:lvlText w:val=""/>
+      <w:lvlJc w:val="left"/>
+      <w:pPr>
+        <w:tabs>
+          <w:tab w:val="num" w:pos="5040"/>
+        </w:tabs>
+        <w:ind w:left="5040" w:hanging="360"/>
+      </w:pPr>
+      <w:rPr>
+        <w:rFonts w:ascii="Wingdings" w:hAnsi="Wingdings" w:hint="default"/>
+        <w:sz w:val="20"/>
+      </w:rPr>
+    </w:lvl>
+    <w:lvl w:ilvl="7" w:tentative="1">
+      <w:start w:val="1"/>
+      <w:numFmt w:val="bullet"/>
+      <w:lvlText w:val=""/>
+      <w:lvlJc w:val="left"/>
+      <w:pPr>
+        <w:tabs>
+          <w:tab w:val="num" w:pos="5760"/>
+        </w:tabs>
+        <w:ind w:left="5760" w:hanging="360"/>
+      </w:pPr>
+      <w:rPr>
+        <w:rFonts w:ascii="Wingdings" w:hAnsi="Wingdings" w:hint="default"/>
+        <w:sz w:val="20"/>
+      </w:rPr>
+    </w:lvl>
+    <w:lvl w:ilvl="8" w:tentative="1">
+      <w:start w:val="1"/>
+      <w:numFmt w:val="bullet"/>
+      <w:lvlText w:val=""/>
+      <w:lvlJc w:val="left"/>
+      <w:pPr>
+        <w:tabs>
+          <w:tab w:val="num" w:pos="6480"/>
+        </w:tabs>
+        <w:ind w:left="6480" w:hanging="360"/>
+      </w:pPr>
+      <w:rPr>
+        <w:rFonts w:ascii="Wingdings" w:hAnsi="Wingdings" w:hint="default"/>
+        <w:sz w:val="20"/>
+      </w:rPr>
+    </w:lvl>
+  </w:abstractNum>
+  <w:abstractNum w:abstractNumId="25" w15:restartNumberingAfterBreak="0">
     <w:nsid w:val="2D875DB2"/>
     <w:multiLevelType w:val="multilevel"/>
     <w:tmpl w:val="6450BF7A"/>
@@ -16404,7 +18295,7 @@
       </w:rPr>
     </w:lvl>
   </w:abstractNum>
-  <w:abstractNum w:abstractNumId="23" w15:restartNumberingAfterBreak="0">
+  <w:abstractNum w:abstractNumId="26" w15:restartNumberingAfterBreak="0">
     <w:nsid w:val="2EDC66D7"/>
     <w:multiLevelType w:val="multilevel"/>
     <w:tmpl w:val="484CDF84"/>
@@ -16553,7 +18444,7 @@
       </w:rPr>
     </w:lvl>
   </w:abstractNum>
-  <w:abstractNum w:abstractNumId="24" w15:restartNumberingAfterBreak="0">
+  <w:abstractNum w:abstractNumId="27" w15:restartNumberingAfterBreak="0">
     <w:nsid w:val="2F3960A5"/>
     <w:multiLevelType w:val="multilevel"/>
     <w:tmpl w:val="C5E2EACE"/>
@@ -16702,7 +18593,7 @@
       </w:rPr>
     </w:lvl>
   </w:abstractNum>
-  <w:abstractNum w:abstractNumId="25" w15:restartNumberingAfterBreak="0">
+  <w:abstractNum w:abstractNumId="28" w15:restartNumberingAfterBreak="0">
     <w:nsid w:val="329C39BB"/>
     <w:multiLevelType w:val="multilevel"/>
     <w:tmpl w:val="1696BB5C"/>
@@ -16851,7 +18742,7 @@
       </w:rPr>
     </w:lvl>
   </w:abstractNum>
-  <w:abstractNum w:abstractNumId="26" w15:restartNumberingAfterBreak="0">
+  <w:abstractNum w:abstractNumId="29" w15:restartNumberingAfterBreak="0">
     <w:nsid w:val="33FF6B03"/>
     <w:multiLevelType w:val="multilevel"/>
     <w:tmpl w:val="38D493B4"/>
@@ -17000,7 +18891,156 @@
       </w:rPr>
     </w:lvl>
   </w:abstractNum>
-  <w:abstractNum w:abstractNumId="27" w15:restartNumberingAfterBreak="0">
+  <w:abstractNum w:abstractNumId="30" w15:restartNumberingAfterBreak="0">
+    <w:nsid w:val="37DD4BC5"/>
+    <w:multiLevelType w:val="multilevel"/>
+    <w:tmpl w:val="36DC130E"/>
+    <w:lvl w:ilvl="0">
+      <w:start w:val="1"/>
+      <w:numFmt w:val="bullet"/>
+      <w:lvlText w:val=""/>
+      <w:lvlJc w:val="left"/>
+      <w:pPr>
+        <w:tabs>
+          <w:tab w:val="num" w:pos="720"/>
+        </w:tabs>
+        <w:ind w:left="720" w:hanging="360"/>
+      </w:pPr>
+      <w:rPr>
+        <w:rFonts w:ascii="Symbol" w:hAnsi="Symbol" w:hint="default"/>
+        <w:sz w:val="20"/>
+      </w:rPr>
+    </w:lvl>
+    <w:lvl w:ilvl="1" w:tentative="1">
+      <w:start w:val="1"/>
+      <w:numFmt w:val="bullet"/>
+      <w:lvlText w:val="o"/>
+      <w:lvlJc w:val="left"/>
+      <w:pPr>
+        <w:tabs>
+          <w:tab w:val="num" w:pos="1440"/>
+        </w:tabs>
+        <w:ind w:left="1440" w:hanging="360"/>
+      </w:pPr>
+      <w:rPr>
+        <w:rFonts w:ascii="Courier New" w:hAnsi="Courier New" w:hint="default"/>
+        <w:sz w:val="20"/>
+      </w:rPr>
+    </w:lvl>
+    <w:lvl w:ilvl="2" w:tentative="1">
+      <w:start w:val="1"/>
+      <w:numFmt w:val="bullet"/>
+      <w:lvlText w:val=""/>
+      <w:lvlJc w:val="left"/>
+      <w:pPr>
+        <w:tabs>
+          <w:tab w:val="num" w:pos="2160"/>
+        </w:tabs>
+        <w:ind w:left="2160" w:hanging="360"/>
+      </w:pPr>
+      <w:rPr>
+        <w:rFonts w:ascii="Wingdings" w:hAnsi="Wingdings" w:hint="default"/>
+        <w:sz w:val="20"/>
+      </w:rPr>
+    </w:lvl>
+    <w:lvl w:ilvl="3" w:tentative="1">
+      <w:start w:val="1"/>
+      <w:numFmt w:val="bullet"/>
+      <w:lvlText w:val=""/>
+      <w:lvlJc w:val="left"/>
+      <w:pPr>
+        <w:tabs>
+          <w:tab w:val="num" w:pos="2880"/>
+        </w:tabs>
+        <w:ind w:left="2880" w:hanging="360"/>
+      </w:pPr>
+      <w:rPr>
+        <w:rFonts w:ascii="Wingdings" w:hAnsi="Wingdings" w:hint="default"/>
+        <w:sz w:val="20"/>
+      </w:rPr>
+    </w:lvl>
+    <w:lvl w:ilvl="4" w:tentative="1">
+      <w:start w:val="1"/>
+      <w:numFmt w:val="bullet"/>
+      <w:lvlText w:val=""/>
+      <w:lvlJc w:val="left"/>
+      <w:pPr>
+        <w:tabs>
+          <w:tab w:val="num" w:pos="3600"/>
+        </w:tabs>
+        <w:ind w:left="3600" w:hanging="360"/>
+      </w:pPr>
+      <w:rPr>
+        <w:rFonts w:ascii="Wingdings" w:hAnsi="Wingdings" w:hint="default"/>
+        <w:sz w:val="20"/>
+      </w:rPr>
+    </w:lvl>
+    <w:lvl w:ilvl="5" w:tentative="1">
+      <w:start w:val="1"/>
+      <w:numFmt w:val="bullet"/>
+      <w:lvlText w:val=""/>
+      <w:lvlJc w:val="left"/>
+      <w:pPr>
+        <w:tabs>
+          <w:tab w:val="num" w:pos="4320"/>
+        </w:tabs>
+        <w:ind w:left="4320" w:hanging="360"/>
+      </w:pPr>
+      <w:rPr>
+        <w:rFonts w:ascii="Wingdings" w:hAnsi="Wingdings" w:hint="default"/>
+        <w:sz w:val="20"/>
+      </w:rPr>
+    </w:lvl>
+    <w:lvl w:ilvl="6" w:tentative="1">
+      <w:start w:val="1"/>
+      <w:numFmt w:val="bullet"/>
+      <w:lvlText w:val=""/>
+      <w:lvlJc w:val="left"/>
+      <w:pPr>
+        <w:tabs>
+          <w:tab w:val="num" w:pos="5040"/>
+        </w:tabs>
+        <w:ind w:left="5040" w:hanging="360"/>
+      </w:pPr>
+      <w:rPr>
+        <w:rFonts w:ascii="Wingdings" w:hAnsi="Wingdings" w:hint="default"/>
+        <w:sz w:val="20"/>
+      </w:rPr>
+    </w:lvl>
+    <w:lvl w:ilvl="7" w:tentative="1">
+      <w:start w:val="1"/>
+      <w:numFmt w:val="bullet"/>
+      <w:lvlText w:val=""/>
+      <w:lvlJc w:val="left"/>
+      <w:pPr>
+        <w:tabs>
+          <w:tab w:val="num" w:pos="5760"/>
+        </w:tabs>
+        <w:ind w:left="5760" w:hanging="360"/>
+      </w:pPr>
+      <w:rPr>
+        <w:rFonts w:ascii="Wingdings" w:hAnsi="Wingdings" w:hint="default"/>
+        <w:sz w:val="20"/>
+      </w:rPr>
+    </w:lvl>
+    <w:lvl w:ilvl="8" w:tentative="1">
+      <w:start w:val="1"/>
+      <w:numFmt w:val="bullet"/>
+      <w:lvlText w:val=""/>
+      <w:lvlJc w:val="left"/>
+      <w:pPr>
+        <w:tabs>
+          <w:tab w:val="num" w:pos="6480"/>
+        </w:tabs>
+        <w:ind w:left="6480" w:hanging="360"/>
+      </w:pPr>
+      <w:rPr>
+        <w:rFonts w:ascii="Wingdings" w:hAnsi="Wingdings" w:hint="default"/>
+        <w:sz w:val="20"/>
+      </w:rPr>
+    </w:lvl>
+  </w:abstractNum>
+  <w:abstractNum w:abstractNumId="31" w15:restartNumberingAfterBreak="0">
     <w:nsid w:val="391764DC"/>
     <w:multiLevelType w:val="multilevel"/>
     <w:tmpl w:val="31FAB04C"/>
@@ -17149,7 +19189,305 @@
       </w:rPr>
     </w:lvl>
   </w:abstractNum>
-  <w:abstractNum w:abstractNumId="28" w15:restartNumberingAfterBreak="0">
+  <w:abstractNum w:abstractNumId="32" w15:restartNumberingAfterBreak="0">
+    <w:nsid w:val="392F72CA"/>
+    <w:multiLevelType w:val="multilevel"/>
+    <w:tmpl w:val="25B4DBF2"/>
+    <w:lvl w:ilvl="0">
+      <w:start w:val="1"/>
+      <w:numFmt w:val="bullet"/>
+      <w:lvlText w:val=""/>
+      <w:lvlJc w:val="left"/>
+      <w:pPr>
+        <w:tabs>
+          <w:tab w:val="num" w:pos="720"/>
+        </w:tabs>
+        <w:ind w:left="720" w:hanging="360"/>
+      </w:pPr>
+      <w:rPr>
+        <w:rFonts w:ascii="Symbol" w:hAnsi="Symbol" w:hint="default"/>
+        <w:sz w:val="20"/>
+      </w:rPr>
+    </w:lvl>
+    <w:lvl w:ilvl="1" w:tentative="1">
+      <w:start w:val="1"/>
+      <w:numFmt w:val="bullet"/>
+      <w:lvlText w:val="o"/>
+      <w:lvlJc w:val="left"/>
+      <w:pPr>
+        <w:tabs>
+          <w:tab w:val="num" w:pos="1440"/>
+        </w:tabs>
+        <w:ind w:left="1440" w:hanging="360"/>
+      </w:pPr>
+      <w:rPr>
+        <w:rFonts w:ascii="Courier New" w:hAnsi="Courier New" w:hint="default"/>
+        <w:sz w:val="20"/>
+      </w:rPr>
+    </w:lvl>
+    <w:lvl w:ilvl="2" w:tentative="1">
+      <w:start w:val="1"/>
+      <w:numFmt w:val="bullet"/>
+      <w:lvlText w:val=""/>
+      <w:lvlJc w:val="left"/>
+      <w:pPr>
+        <w:tabs>
+          <w:tab w:val="num" w:pos="2160"/>
+        </w:tabs>
+        <w:ind w:left="2160" w:hanging="360"/>
+      </w:pPr>
+      <w:rPr>
+        <w:rFonts w:ascii="Wingdings" w:hAnsi="Wingdings" w:hint="default"/>
+        <w:sz w:val="20"/>
+      </w:rPr>
+    </w:lvl>
+    <w:lvl w:ilvl="3" w:tentative="1">
+      <w:start w:val="1"/>
+      <w:numFmt w:val="bullet"/>
+      <w:lvlText w:val=""/>
+      <w:lvlJc w:val="left"/>
+      <w:pPr>
+        <w:tabs>
+          <w:tab w:val="num" w:pos="2880"/>
+        </w:tabs>
+        <w:ind w:left="2880" w:hanging="360"/>
+      </w:pPr>
+      <w:rPr>
+        <w:rFonts w:ascii="Wingdings" w:hAnsi="Wingdings" w:hint="default"/>
+        <w:sz w:val="20"/>
+      </w:rPr>
+    </w:lvl>
+    <w:lvl w:ilvl="4" w:tentative="1">
+      <w:start w:val="1"/>
+      <w:numFmt w:val="bullet"/>
+      <w:lvlText w:val=""/>
+      <w:lvlJc w:val="left"/>
+      <w:pPr>
+        <w:tabs>
+          <w:tab w:val="num" w:pos="3600"/>
+        </w:tabs>
+        <w:ind w:left="3600" w:hanging="360"/>
+      </w:pPr>
+      <w:rPr>
+        <w:rFonts w:ascii="Wingdings" w:hAnsi="Wingdings" w:hint="default"/>
+        <w:sz w:val="20"/>
+      </w:rPr>
+    </w:lvl>
+    <w:lvl w:ilvl="5" w:tentative="1">
+      <w:start w:val="1"/>
+      <w:numFmt w:val="bullet"/>
+      <w:lvlText w:val=""/>
+      <w:lvlJc w:val="left"/>
+      <w:pPr>
+        <w:tabs>
+          <w:tab w:val="num" w:pos="4320"/>
+        </w:tabs>
+        <w:ind w:left="4320" w:hanging="360"/>
+      </w:pPr>
+      <w:rPr>
+        <w:rFonts w:ascii="Wingdings" w:hAnsi="Wingdings" w:hint="default"/>
+        <w:sz w:val="20"/>
+      </w:rPr>
+    </w:lvl>
+    <w:lvl w:ilvl="6" w:tentative="1">
+      <w:start w:val="1"/>
+      <w:numFmt w:val="bullet"/>
+      <w:lvlText w:val=""/>
+      <w:lvlJc w:val="left"/>
+      <w:pPr>
+        <w:tabs>
+          <w:tab w:val="num" w:pos="5040"/>
+        </w:tabs>
+        <w:ind w:left="5040" w:hanging="360"/>
+      </w:pPr>
+      <w:rPr>
+        <w:rFonts w:ascii="Wingdings" w:hAnsi="Wingdings" w:hint="default"/>
+        <w:sz w:val="20"/>
+      </w:rPr>
+    </w:lvl>
+    <w:lvl w:ilvl="7" w:tentative="1">
+      <w:start w:val="1"/>
+      <w:numFmt w:val="bullet"/>
+      <w:lvlText w:val=""/>
+      <w:lvlJc w:val="left"/>
+      <w:pPr>
+        <w:tabs>
+          <w:tab w:val="num" w:pos="5760"/>
+        </w:tabs>
+        <w:ind w:left="5760" w:hanging="360"/>
+      </w:pPr>
+      <w:rPr>
+        <w:rFonts w:ascii="Wingdings" w:hAnsi="Wingdings" w:hint="default"/>
+        <w:sz w:val="20"/>
+      </w:rPr>
+    </w:lvl>
+    <w:lvl w:ilvl="8" w:tentative="1">
+      <w:start w:val="1"/>
+      <w:numFmt w:val="bullet"/>
+      <w:lvlText w:val=""/>
+      <w:lvlJc w:val="left"/>
+      <w:pPr>
+        <w:tabs>
+          <w:tab w:val="num" w:pos="6480"/>
+        </w:tabs>
+        <w:ind w:left="6480" w:hanging="360"/>
+      </w:pPr>
+      <w:rPr>
+        <w:rFonts w:ascii="Wingdings" w:hAnsi="Wingdings" w:hint="default"/>
+        <w:sz w:val="20"/>
+      </w:rPr>
+    </w:lvl>
+  </w:abstractNum>
+  <w:abstractNum w:abstractNumId="33" w15:restartNumberingAfterBreak="0">
+    <w:nsid w:val="39DA1D2E"/>
+    <w:multiLevelType w:val="multilevel"/>
+    <w:tmpl w:val="4D10BF44"/>
+    <w:lvl w:ilvl="0">
+      <w:start w:val="1"/>
+      <w:numFmt w:val="bullet"/>
+      <w:lvlText w:val=""/>
+      <w:lvlJc w:val="left"/>
+      <w:pPr>
+        <w:tabs>
+          <w:tab w:val="num" w:pos="720"/>
+        </w:tabs>
+        <w:ind w:left="720" w:hanging="360"/>
+      </w:pPr>
+      <w:rPr>
+        <w:rFonts w:ascii="Symbol" w:hAnsi="Symbol" w:hint="default"/>
+        <w:sz w:val="20"/>
+      </w:rPr>
+    </w:lvl>
+    <w:lvl w:ilvl="1" w:tentative="1">
+      <w:start w:val="1"/>
+      <w:numFmt w:val="bullet"/>
+      <w:lvlText w:val="o"/>
+      <w:lvlJc w:val="left"/>
+      <w:pPr>
+        <w:tabs>
+          <w:tab w:val="num" w:pos="1440"/>
+        </w:tabs>
+        <w:ind w:left="1440" w:hanging="360"/>
+      </w:pPr>
+      <w:rPr>
+        <w:rFonts w:ascii="Courier New" w:hAnsi="Courier New" w:hint="default"/>
+        <w:sz w:val="20"/>
+      </w:rPr>
+    </w:lvl>
+    <w:lvl w:ilvl="2" w:tentative="1">
+      <w:start w:val="1"/>
+      <w:numFmt w:val="bullet"/>
+      <w:lvlText w:val=""/>
+      <w:lvlJc w:val="left"/>
+      <w:pPr>
+        <w:tabs>
+          <w:tab w:val="num" w:pos="2160"/>
+        </w:tabs>
+        <w:ind w:left="2160" w:hanging="360"/>
+      </w:pPr>
+      <w:rPr>
+        <w:rFonts w:ascii="Wingdings" w:hAnsi="Wingdings" w:hint="default"/>
+        <w:sz w:val="20"/>
+      </w:rPr>
+    </w:lvl>
+    <w:lvl w:ilvl="3" w:tentative="1">
+      <w:start w:val="1"/>
+      <w:numFmt w:val="bullet"/>
+      <w:lvlText w:val=""/>
+      <w:lvlJc w:val="left"/>
+      <w:pPr>
+        <w:tabs>
+          <w:tab w:val="num" w:pos="2880"/>
+        </w:tabs>
+        <w:ind w:left="2880" w:hanging="360"/>
+      </w:pPr>
+      <w:rPr>
+        <w:rFonts w:ascii="Wingdings" w:hAnsi="Wingdings" w:hint="default"/>
+        <w:sz w:val="20"/>
+      </w:rPr>
+    </w:lvl>
+    <w:lvl w:ilvl="4" w:tentative="1">
+      <w:start w:val="1"/>
+      <w:numFmt w:val="bullet"/>
+      <w:lvlText w:val=""/>
+      <w:lvlJc w:val="left"/>
+      <w:pPr>
+        <w:tabs>
+          <w:tab w:val="num" w:pos="3600"/>
+        </w:tabs>
+        <w:ind w:left="3600" w:hanging="360"/>
+      </w:pPr>
+      <w:rPr>
+        <w:rFonts w:ascii="Wingdings" w:hAnsi="Wingdings" w:hint="default"/>
+        <w:sz w:val="20"/>
+      </w:rPr>
+    </w:lvl>
+    <w:lvl w:ilvl="5" w:tentative="1">
+      <w:start w:val="1"/>
+      <w:numFmt w:val="bullet"/>
+      <w:lvlText w:val=""/>
+      <w:lvlJc w:val="left"/>
+      <w:pPr>
+        <w:tabs>
+          <w:tab w:val="num" w:pos="4320"/>
+        </w:tabs>
+        <w:ind w:left="4320" w:hanging="360"/>
+      </w:pPr>
+      <w:rPr>
+        <w:rFonts w:ascii="Wingdings" w:hAnsi="Wingdings" w:hint="default"/>
+        <w:sz w:val="20"/>
+      </w:rPr>
+    </w:lvl>
+    <w:lvl w:ilvl="6" w:tentative="1">
+      <w:start w:val="1"/>
+      <w:numFmt w:val="bullet"/>
+      <w:lvlText w:val=""/>
+      <w:lvlJc w:val="left"/>
+      <w:pPr>
+        <w:tabs>
+          <w:tab w:val="num" w:pos="5040"/>
+        </w:tabs>
+        <w:ind w:left="5040" w:hanging="360"/>
+      </w:pPr>
+      <w:rPr>
+        <w:rFonts w:ascii="Wingdings" w:hAnsi="Wingdings" w:hint="default"/>
+        <w:sz w:val="20"/>
+      </w:rPr>
+    </w:lvl>
+    <w:lvl w:ilvl="7" w:tentative="1">
+      <w:start w:val="1"/>
+      <w:numFmt w:val="bullet"/>
+      <w:lvlText w:val=""/>
+      <w:lvlJc w:val="left"/>
+      <w:pPr>
+        <w:tabs>
+          <w:tab w:val="num" w:pos="5760"/>
+        </w:tabs>
+        <w:ind w:left="5760" w:hanging="360"/>
+      </w:pPr>
+      <w:rPr>
+        <w:rFonts w:ascii="Wingdings" w:hAnsi="Wingdings" w:hint="default"/>
+        <w:sz w:val="20"/>
+      </w:rPr>
+    </w:lvl>
+    <w:lvl w:ilvl="8" w:tentative="1">
+      <w:start w:val="1"/>
+      <w:numFmt w:val="bullet"/>
+      <w:lvlText w:val=""/>
+      <w:lvlJc w:val="left"/>
+      <w:pPr>
+        <w:tabs>
+          <w:tab w:val="num" w:pos="6480"/>
+        </w:tabs>
+        <w:ind w:left="6480" w:hanging="360"/>
+      </w:pPr>
+      <w:rPr>
+        <w:rFonts w:ascii="Wingdings" w:hAnsi="Wingdings" w:hint="default"/>
+        <w:sz w:val="20"/>
+      </w:rPr>
+    </w:lvl>
+  </w:abstractNum>
+  <w:abstractNum w:abstractNumId="34" w15:restartNumberingAfterBreak="0">
     <w:nsid w:val="3B125DF7"/>
     <w:multiLevelType w:val="multilevel"/>
     <w:tmpl w:val="2DFA1608"/>
@@ -17298,7 +19636,7 @@
       </w:rPr>
     </w:lvl>
   </w:abstractNum>
-  <w:abstractNum w:abstractNumId="29" w15:restartNumberingAfterBreak="0">
+  <w:abstractNum w:abstractNumId="35" w15:restartNumberingAfterBreak="0">
     <w:nsid w:val="3BBD0916"/>
     <w:multiLevelType w:val="hybridMultilevel"/>
     <w:tmpl w:val="9D041C18"/>
@@ -17411,7 +19749,7 @@
       </w:rPr>
     </w:lvl>
   </w:abstractNum>
-  <w:abstractNum w:abstractNumId="30" w15:restartNumberingAfterBreak="0">
+  <w:abstractNum w:abstractNumId="36" w15:restartNumberingAfterBreak="0">
     <w:nsid w:val="3CEB3B07"/>
     <w:multiLevelType w:val="multilevel"/>
     <w:tmpl w:val="6C903DEA"/>
@@ -17560,7 +19898,7 @@
       </w:rPr>
     </w:lvl>
   </w:abstractNum>
-  <w:abstractNum w:abstractNumId="31" w15:restartNumberingAfterBreak="0">
+  <w:abstractNum w:abstractNumId="37" w15:restartNumberingAfterBreak="0">
     <w:nsid w:val="3D1E6C5B"/>
     <w:multiLevelType w:val="multilevel"/>
     <w:tmpl w:val="7D5A8D26"/>
@@ -17709,7 +20047,7 @@
       </w:rPr>
     </w:lvl>
   </w:abstractNum>
-  <w:abstractNum w:abstractNumId="32" w15:restartNumberingAfterBreak="0">
+  <w:abstractNum w:abstractNumId="38" w15:restartNumberingAfterBreak="0">
     <w:nsid w:val="3E75593D"/>
     <w:multiLevelType w:val="multilevel"/>
     <w:tmpl w:val="77E60D1C"/>
@@ -17858,7 +20196,7 @@
       </w:rPr>
     </w:lvl>
   </w:abstractNum>
-  <w:abstractNum w:abstractNumId="33" w15:restartNumberingAfterBreak="0">
+  <w:abstractNum w:abstractNumId="39" w15:restartNumberingAfterBreak="0">
     <w:nsid w:val="3FE16A64"/>
     <w:multiLevelType w:val="multilevel"/>
     <w:tmpl w:val="BAF6EC1C"/>
@@ -18007,7 +20345,7 @@
       </w:rPr>
     </w:lvl>
   </w:abstractNum>
-  <w:abstractNum w:abstractNumId="34" w15:restartNumberingAfterBreak="0">
+  <w:abstractNum w:abstractNumId="40" w15:restartNumberingAfterBreak="0">
     <w:nsid w:val="40D03BCD"/>
     <w:multiLevelType w:val="multilevel"/>
     <w:tmpl w:val="E53A8542"/>
@@ -18156,7 +20494,156 @@
       </w:rPr>
     </w:lvl>
   </w:abstractNum>
-  <w:abstractNum w:abstractNumId="35" w15:restartNumberingAfterBreak="0">
+  <w:abstractNum w:abstractNumId="41" w15:restartNumberingAfterBreak="0">
+    <w:nsid w:val="4B427678"/>
+    <w:multiLevelType w:val="multilevel"/>
+    <w:tmpl w:val="48E4A9FC"/>
+    <w:lvl w:ilvl="0">
+      <w:start w:val="1"/>
+      <w:numFmt w:val="bullet"/>
+      <w:lvlText w:val=""/>
+      <w:lvlJc w:val="left"/>
+      <w:pPr>
+        <w:tabs>
+          <w:tab w:val="num" w:pos="720"/>
+        </w:tabs>
+        <w:ind w:left="720" w:hanging="360"/>
+      </w:pPr>
+      <w:rPr>
+        <w:rFonts w:ascii="Symbol" w:hAnsi="Symbol" w:hint="default"/>
+        <w:sz w:val="20"/>
+      </w:rPr>
+    </w:lvl>
+    <w:lvl w:ilvl="1" w:tentative="1">
+      <w:start w:val="1"/>
+      <w:numFmt w:val="bullet"/>
+      <w:lvlText w:val="o"/>
+      <w:lvlJc w:val="left"/>
+      <w:pPr>
+        <w:tabs>
+          <w:tab w:val="num" w:pos="1440"/>
+        </w:tabs>
+        <w:ind w:left="1440" w:hanging="360"/>
+      </w:pPr>
+      <w:rPr>
+        <w:rFonts w:ascii="Courier New" w:hAnsi="Courier New" w:hint="default"/>
+        <w:sz w:val="20"/>
+      </w:rPr>
+    </w:lvl>
+    <w:lvl w:ilvl="2" w:tentative="1">
+      <w:start w:val="1"/>
+      <w:numFmt w:val="bullet"/>
+      <w:lvlText w:val=""/>
+      <w:lvlJc w:val="left"/>
+      <w:pPr>
+        <w:tabs>
+          <w:tab w:val="num" w:pos="2160"/>
+        </w:tabs>
+        <w:ind w:left="2160" w:hanging="360"/>
+      </w:pPr>
+      <w:rPr>
+        <w:rFonts w:ascii="Wingdings" w:hAnsi="Wingdings" w:hint="default"/>
+        <w:sz w:val="20"/>
+      </w:rPr>
+    </w:lvl>
+    <w:lvl w:ilvl="3" w:tentative="1">
+      <w:start w:val="1"/>
+      <w:numFmt w:val="bullet"/>
+      <w:lvlText w:val=""/>
+      <w:lvlJc w:val="left"/>
+      <w:pPr>
+        <w:tabs>
+          <w:tab w:val="num" w:pos="2880"/>
+        </w:tabs>
+        <w:ind w:left="2880" w:hanging="360"/>
+      </w:pPr>
+      <w:rPr>
+        <w:rFonts w:ascii="Wingdings" w:hAnsi="Wingdings" w:hint="default"/>
+        <w:sz w:val="20"/>
+      </w:rPr>
+    </w:lvl>
+    <w:lvl w:ilvl="4" w:tentative="1">
+      <w:start w:val="1"/>
+      <w:numFmt w:val="bullet"/>
+      <w:lvlText w:val=""/>
+      <w:lvlJc w:val="left"/>
+      <w:pPr>
+        <w:tabs>
+          <w:tab w:val="num" w:pos="3600"/>
+        </w:tabs>
+        <w:ind w:left="3600" w:hanging="360"/>
+      </w:pPr>
+      <w:rPr>
+        <w:rFonts w:ascii="Wingdings" w:hAnsi="Wingdings" w:hint="default"/>
+        <w:sz w:val="20"/>
+      </w:rPr>
+    </w:lvl>
+    <w:lvl w:ilvl="5" w:tentative="1">
+      <w:start w:val="1"/>
+      <w:numFmt w:val="bullet"/>
+      <w:lvlText w:val=""/>
+      <w:lvlJc w:val="left"/>
+      <w:pPr>
+        <w:tabs>
+          <w:tab w:val="num" w:pos="4320"/>
+        </w:tabs>
+        <w:ind w:left="4320" w:hanging="360"/>
+      </w:pPr>
+      <w:rPr>
+        <w:rFonts w:ascii="Wingdings" w:hAnsi="Wingdings" w:hint="default"/>
+        <w:sz w:val="20"/>
+      </w:rPr>
+    </w:lvl>
+    <w:lvl w:ilvl="6" w:tentative="1">
+      <w:start w:val="1"/>
+      <w:numFmt w:val="bullet"/>
+      <w:lvlText w:val=""/>
+      <w:lvlJc w:val="left"/>
+      <w:pPr>
+        <w:tabs>
+          <w:tab w:val="num" w:pos="5040"/>
+        </w:tabs>
+        <w:ind w:left="5040" w:hanging="360"/>
+      </w:pPr>
+      <w:rPr>
+        <w:rFonts w:ascii="Wingdings" w:hAnsi="Wingdings" w:hint="default"/>
+        <w:sz w:val="20"/>
+      </w:rPr>
+    </w:lvl>
+    <w:lvl w:ilvl="7" w:tentative="1">
+      <w:start w:val="1"/>
+      <w:numFmt w:val="bullet"/>
+      <w:lvlText w:val=""/>
+      <w:lvlJc w:val="left"/>
+      <w:pPr>
+        <w:tabs>
+          <w:tab w:val="num" w:pos="5760"/>
+        </w:tabs>
+        <w:ind w:left="5760" w:hanging="360"/>
+      </w:pPr>
+      <w:rPr>
+        <w:rFonts w:ascii="Wingdings" w:hAnsi="Wingdings" w:hint="default"/>
+        <w:sz w:val="20"/>
+      </w:rPr>
+    </w:lvl>
+    <w:lvl w:ilvl="8" w:tentative="1">
+      <w:start w:val="1"/>
+      <w:numFmt w:val="bullet"/>
+      <w:lvlText w:val=""/>
+      <w:lvlJc w:val="left"/>
+      <w:pPr>
+        <w:tabs>
+          <w:tab w:val="num" w:pos="6480"/>
+        </w:tabs>
+        <w:ind w:left="6480" w:hanging="360"/>
+      </w:pPr>
+      <w:rPr>
+        <w:rFonts w:ascii="Wingdings" w:hAnsi="Wingdings" w:hint="default"/>
+        <w:sz w:val="20"/>
+      </w:rPr>
+    </w:lvl>
+  </w:abstractNum>
+  <w:abstractNum w:abstractNumId="42" w15:restartNumberingAfterBreak="0">
     <w:nsid w:val="4D6C676B"/>
     <w:multiLevelType w:val="multilevel"/>
     <w:tmpl w:val="864695D8"/>
@@ -18305,7 +20792,7 @@
       </w:rPr>
     </w:lvl>
   </w:abstractNum>
-  <w:abstractNum w:abstractNumId="36" w15:restartNumberingAfterBreak="0">
+  <w:abstractNum w:abstractNumId="43" w15:restartNumberingAfterBreak="0">
     <w:nsid w:val="4EC51907"/>
     <w:multiLevelType w:val="multilevel"/>
     <w:tmpl w:val="B9D0FF78"/>
@@ -18454,7 +20941,7 @@
       </w:rPr>
     </w:lvl>
   </w:abstractNum>
-  <w:abstractNum w:abstractNumId="37" w15:restartNumberingAfterBreak="0">
+  <w:abstractNum w:abstractNumId="44" w15:restartNumberingAfterBreak="0">
     <w:nsid w:val="4F720D32"/>
     <w:multiLevelType w:val="multilevel"/>
     <w:tmpl w:val="C0FE42C6"/>
@@ -18603,7 +21090,305 @@
       </w:rPr>
     </w:lvl>
   </w:abstractNum>
-  <w:abstractNum w:abstractNumId="38" w15:restartNumberingAfterBreak="0">
+  <w:abstractNum w:abstractNumId="45" w15:restartNumberingAfterBreak="0">
+    <w:nsid w:val="4F9C4D08"/>
+    <w:multiLevelType w:val="multilevel"/>
+    <w:tmpl w:val="D01EC1BA"/>
+    <w:lvl w:ilvl="0">
+      <w:start w:val="1"/>
+      <w:numFmt w:val="bullet"/>
+      <w:lvlText w:val=""/>
+      <w:lvlJc w:val="left"/>
+      <w:pPr>
+        <w:tabs>
+          <w:tab w:val="num" w:pos="720"/>
+        </w:tabs>
+        <w:ind w:left="720" w:hanging="360"/>
+      </w:pPr>
+      <w:rPr>
+        <w:rFonts w:ascii="Symbol" w:hAnsi="Symbol" w:hint="default"/>
+        <w:sz w:val="20"/>
+      </w:rPr>
+    </w:lvl>
+    <w:lvl w:ilvl="1">
+      <w:start w:val="1"/>
+      <w:numFmt w:val="bullet"/>
+      <w:lvlText w:val="o"/>
+      <w:lvlJc w:val="left"/>
+      <w:pPr>
+        <w:tabs>
+          <w:tab w:val="num" w:pos="1440"/>
+        </w:tabs>
+        <w:ind w:left="1440" w:hanging="360"/>
+      </w:pPr>
+      <w:rPr>
+        <w:rFonts w:ascii="Courier New" w:hAnsi="Courier New" w:hint="default"/>
+        <w:sz w:val="20"/>
+      </w:rPr>
+    </w:lvl>
+    <w:lvl w:ilvl="2" w:tentative="1">
+      <w:start w:val="1"/>
+      <w:numFmt w:val="bullet"/>
+      <w:lvlText w:val=""/>
+      <w:lvlJc w:val="left"/>
+      <w:pPr>
+        <w:tabs>
+          <w:tab w:val="num" w:pos="2160"/>
+        </w:tabs>
+        <w:ind w:left="2160" w:hanging="360"/>
+      </w:pPr>
+      <w:rPr>
+        <w:rFonts w:ascii="Wingdings" w:hAnsi="Wingdings" w:hint="default"/>
+        <w:sz w:val="20"/>
+      </w:rPr>
+    </w:lvl>
+    <w:lvl w:ilvl="3" w:tentative="1">
+      <w:start w:val="1"/>
+      <w:numFmt w:val="bullet"/>
+      <w:lvlText w:val=""/>
+      <w:lvlJc w:val="left"/>
+      <w:pPr>
+        <w:tabs>
+          <w:tab w:val="num" w:pos="2880"/>
+        </w:tabs>
+        <w:ind w:left="2880" w:hanging="360"/>
+      </w:pPr>
+      <w:rPr>
+        <w:rFonts w:ascii="Wingdings" w:hAnsi="Wingdings" w:hint="default"/>
+        <w:sz w:val="20"/>
+      </w:rPr>
+    </w:lvl>
+    <w:lvl w:ilvl="4" w:tentative="1">
+      <w:start w:val="1"/>
+      <w:numFmt w:val="bullet"/>
+      <w:lvlText w:val=""/>
+      <w:lvlJc w:val="left"/>
+      <w:pPr>
+        <w:tabs>
+          <w:tab w:val="num" w:pos="3600"/>
+        </w:tabs>
+        <w:ind w:left="3600" w:hanging="360"/>
+      </w:pPr>
+      <w:rPr>
+        <w:rFonts w:ascii="Wingdings" w:hAnsi="Wingdings" w:hint="default"/>
+        <w:sz w:val="20"/>
+      </w:rPr>
+    </w:lvl>
+    <w:lvl w:ilvl="5" w:tentative="1">
+      <w:start w:val="1"/>
+      <w:numFmt w:val="bullet"/>
+      <w:lvlText w:val=""/>
+      <w:lvlJc w:val="left"/>
+      <w:pPr>
+        <w:tabs>
+          <w:tab w:val="num" w:pos="4320"/>
+        </w:tabs>
+        <w:ind w:left="4320" w:hanging="360"/>
+      </w:pPr>
+      <w:rPr>
+        <w:rFonts w:ascii="Wingdings" w:hAnsi="Wingdings" w:hint="default"/>
+        <w:sz w:val="20"/>
+      </w:rPr>
+    </w:lvl>
+    <w:lvl w:ilvl="6" w:tentative="1">
+      <w:start w:val="1"/>
+      <w:numFmt w:val="bullet"/>
+      <w:lvlText w:val=""/>
+      <w:lvlJc w:val="left"/>
+      <w:pPr>
+        <w:tabs>
+          <w:tab w:val="num" w:pos="5040"/>
+        </w:tabs>
+        <w:ind w:left="5040" w:hanging="360"/>
+      </w:pPr>
+      <w:rPr>
+        <w:rFonts w:ascii="Wingdings" w:hAnsi="Wingdings" w:hint="default"/>
+        <w:sz w:val="20"/>
+      </w:rPr>
+    </w:lvl>
+    <w:lvl w:ilvl="7" w:tentative="1">
+      <w:start w:val="1"/>
+      <w:numFmt w:val="bullet"/>
+      <w:lvlText w:val=""/>
+      <w:lvlJc w:val="left"/>
+      <w:pPr>
+        <w:tabs>
+          <w:tab w:val="num" w:pos="5760"/>
+        </w:tabs>
+        <w:ind w:left="5760" w:hanging="360"/>
+      </w:pPr>
+      <w:rPr>
+        <w:rFonts w:ascii="Wingdings" w:hAnsi="Wingdings" w:hint="default"/>
+        <w:sz w:val="20"/>
+      </w:rPr>
+    </w:lvl>
+    <w:lvl w:ilvl="8" w:tentative="1">
+      <w:start w:val="1"/>
+      <w:numFmt w:val="bullet"/>
+      <w:lvlText w:val=""/>
+      <w:lvlJc w:val="left"/>
+      <w:pPr>
+        <w:tabs>
+          <w:tab w:val="num" w:pos="6480"/>
+        </w:tabs>
+        <w:ind w:left="6480" w:hanging="360"/>
+      </w:pPr>
+      <w:rPr>
+        <w:rFonts w:ascii="Wingdings" w:hAnsi="Wingdings" w:hint="default"/>
+        <w:sz w:val="20"/>
+      </w:rPr>
+    </w:lvl>
+  </w:abstractNum>
+  <w:abstractNum w:abstractNumId="46" w15:restartNumberingAfterBreak="0">
+    <w:nsid w:val="507F5705"/>
+    <w:multiLevelType w:val="multilevel"/>
+    <w:tmpl w:val="366AE6C4"/>
+    <w:lvl w:ilvl="0">
+      <w:start w:val="1"/>
+      <w:numFmt w:val="bullet"/>
+      <w:lvlText w:val=""/>
+      <w:lvlJc w:val="left"/>
+      <w:pPr>
+        <w:tabs>
+          <w:tab w:val="num" w:pos="720"/>
+        </w:tabs>
+        <w:ind w:left="720" w:hanging="360"/>
+      </w:pPr>
+      <w:rPr>
+        <w:rFonts w:ascii="Symbol" w:hAnsi="Symbol" w:hint="default"/>
+        <w:sz w:val="20"/>
+      </w:rPr>
+    </w:lvl>
+    <w:lvl w:ilvl="1" w:tentative="1">
+      <w:start w:val="1"/>
+      <w:numFmt w:val="bullet"/>
+      <w:lvlText w:val="o"/>
+      <w:lvlJc w:val="left"/>
+      <w:pPr>
+        <w:tabs>
+          <w:tab w:val="num" w:pos="1440"/>
+        </w:tabs>
+        <w:ind w:left="1440" w:hanging="360"/>
+      </w:pPr>
+      <w:rPr>
+        <w:rFonts w:ascii="Courier New" w:hAnsi="Courier New" w:hint="default"/>
+        <w:sz w:val="20"/>
+      </w:rPr>
+    </w:lvl>
+    <w:lvl w:ilvl="2" w:tentative="1">
+      <w:start w:val="1"/>
+      <w:numFmt w:val="bullet"/>
+      <w:lvlText w:val=""/>
+      <w:lvlJc w:val="left"/>
+      <w:pPr>
+        <w:tabs>
+          <w:tab w:val="num" w:pos="2160"/>
+        </w:tabs>
+        <w:ind w:left="2160" w:hanging="360"/>
+      </w:pPr>
+      <w:rPr>
+        <w:rFonts w:ascii="Wingdings" w:hAnsi="Wingdings" w:hint="default"/>
+        <w:sz w:val="20"/>
+      </w:rPr>
+    </w:lvl>
+    <w:lvl w:ilvl="3" w:tentative="1">
+      <w:start w:val="1"/>
+      <w:numFmt w:val="bullet"/>
+      <w:lvlText w:val=""/>
+      <w:lvlJc w:val="left"/>
+      <w:pPr>
+        <w:tabs>
+          <w:tab w:val="num" w:pos="2880"/>
+        </w:tabs>
+        <w:ind w:left="2880" w:hanging="360"/>
+      </w:pPr>
+      <w:rPr>
+        <w:rFonts w:ascii="Wingdings" w:hAnsi="Wingdings" w:hint="default"/>
+        <w:sz w:val="20"/>
+      </w:rPr>
+    </w:lvl>
+    <w:lvl w:ilvl="4" w:tentative="1">
+      <w:start w:val="1"/>
+      <w:numFmt w:val="bullet"/>
+      <w:lvlText w:val=""/>
+      <w:lvlJc w:val="left"/>
+      <w:pPr>
+        <w:tabs>
+          <w:tab w:val="num" w:pos="3600"/>
+        </w:tabs>
+        <w:ind w:left="3600" w:hanging="360"/>
+      </w:pPr>
+      <w:rPr>
+        <w:rFonts w:ascii="Wingdings" w:hAnsi="Wingdings" w:hint="default"/>
+        <w:sz w:val="20"/>
+      </w:rPr>
+    </w:lvl>
+    <w:lvl w:ilvl="5" w:tentative="1">
+      <w:start w:val="1"/>
+      <w:numFmt w:val="bullet"/>
+      <w:lvlText w:val=""/>
+      <w:lvlJc w:val="left"/>
+      <w:pPr>
+        <w:tabs>
+          <w:tab w:val="num" w:pos="4320"/>
+        </w:tabs>
+        <w:ind w:left="4320" w:hanging="360"/>
+      </w:pPr>
+      <w:rPr>
+        <w:rFonts w:ascii="Wingdings" w:hAnsi="Wingdings" w:hint="default"/>
+        <w:sz w:val="20"/>
+      </w:rPr>
+    </w:lvl>
+    <w:lvl w:ilvl="6" w:tentative="1">
+      <w:start w:val="1"/>
+      <w:numFmt w:val="bullet"/>
+      <w:lvlText w:val=""/>
+      <w:lvlJc w:val="left"/>
+      <w:pPr>
+        <w:tabs>
+          <w:tab w:val="num" w:pos="5040"/>
+        </w:tabs>
+        <w:ind w:left="5040" w:hanging="360"/>
+      </w:pPr>
+      <w:rPr>
+        <w:rFonts w:ascii="Wingdings" w:hAnsi="Wingdings" w:hint="default"/>
+        <w:sz w:val="20"/>
+      </w:rPr>
+    </w:lvl>
+    <w:lvl w:ilvl="7" w:tentative="1">
+      <w:start w:val="1"/>
+      <w:numFmt w:val="bullet"/>
+      <w:lvlText w:val=""/>
+      <w:lvlJc w:val="left"/>
+      <w:pPr>
+        <w:tabs>
+          <w:tab w:val="num" w:pos="5760"/>
+        </w:tabs>
+        <w:ind w:left="5760" w:hanging="360"/>
+      </w:pPr>
+      <w:rPr>
+        <w:rFonts w:ascii="Wingdings" w:hAnsi="Wingdings" w:hint="default"/>
+        <w:sz w:val="20"/>
+      </w:rPr>
+    </w:lvl>
+    <w:lvl w:ilvl="8" w:tentative="1">
+      <w:start w:val="1"/>
+      <w:numFmt w:val="bullet"/>
+      <w:lvlText w:val=""/>
+      <w:lvlJc w:val="left"/>
+      <w:pPr>
+        <w:tabs>
+          <w:tab w:val="num" w:pos="6480"/>
+        </w:tabs>
+        <w:ind w:left="6480" w:hanging="360"/>
+      </w:pPr>
+      <w:rPr>
+        <w:rFonts w:ascii="Wingdings" w:hAnsi="Wingdings" w:hint="default"/>
+        <w:sz w:val="20"/>
+      </w:rPr>
+    </w:lvl>
+  </w:abstractNum>
+  <w:abstractNum w:abstractNumId="47" w15:restartNumberingAfterBreak="0">
     <w:nsid w:val="50C66FD1"/>
     <w:multiLevelType w:val="hybridMultilevel"/>
     <w:tmpl w:val="E0468BCE"/>
@@ -18716,7 +21501,7 @@
       </w:rPr>
     </w:lvl>
   </w:abstractNum>
-  <w:abstractNum w:abstractNumId="39" w15:restartNumberingAfterBreak="0">
+  <w:abstractNum w:abstractNumId="48" w15:restartNumberingAfterBreak="0">
     <w:nsid w:val="51CB0FFF"/>
     <w:multiLevelType w:val="multilevel"/>
     <w:tmpl w:val="C4269EBC"/>
@@ -18865,7 +21650,7 @@
       </w:rPr>
     </w:lvl>
   </w:abstractNum>
-  <w:abstractNum w:abstractNumId="40" w15:restartNumberingAfterBreak="0">
+  <w:abstractNum w:abstractNumId="49" w15:restartNumberingAfterBreak="0">
     <w:nsid w:val="51F43525"/>
     <w:multiLevelType w:val="multilevel"/>
     <w:tmpl w:val="17FC6A90"/>
@@ -19014,7 +21799,7 @@
       </w:rPr>
     </w:lvl>
   </w:abstractNum>
-  <w:abstractNum w:abstractNumId="41" w15:restartNumberingAfterBreak="0">
+  <w:abstractNum w:abstractNumId="50" w15:restartNumberingAfterBreak="0">
     <w:nsid w:val="520C5DD3"/>
     <w:multiLevelType w:val="multilevel"/>
     <w:tmpl w:val="753AC0D2"/>
@@ -19163,7 +21948,7 @@
       </w:rPr>
     </w:lvl>
   </w:abstractNum>
-  <w:abstractNum w:abstractNumId="42" w15:restartNumberingAfterBreak="0">
+  <w:abstractNum w:abstractNumId="51" w15:restartNumberingAfterBreak="0">
     <w:nsid w:val="53F5143F"/>
     <w:multiLevelType w:val="hybridMultilevel"/>
     <w:tmpl w:val="B2005722"/>
@@ -19276,7 +22061,7 @@
       </w:rPr>
     </w:lvl>
   </w:abstractNum>
-  <w:abstractNum w:abstractNumId="43" w15:restartNumberingAfterBreak="0">
+  <w:abstractNum w:abstractNumId="52" w15:restartNumberingAfterBreak="0">
     <w:nsid w:val="5418548D"/>
     <w:multiLevelType w:val="multilevel"/>
     <w:tmpl w:val="F3745D64"/>
@@ -19425,7 +22210,7 @@
       </w:rPr>
     </w:lvl>
   </w:abstractNum>
-  <w:abstractNum w:abstractNumId="44" w15:restartNumberingAfterBreak="0">
+  <w:abstractNum w:abstractNumId="53" w15:restartNumberingAfterBreak="0">
     <w:nsid w:val="54E51C22"/>
     <w:multiLevelType w:val="hybridMultilevel"/>
     <w:tmpl w:val="D9A89FBA"/>
@@ -19538,7 +22323,7 @@
       </w:rPr>
     </w:lvl>
   </w:abstractNum>
-  <w:abstractNum w:abstractNumId="45" w15:restartNumberingAfterBreak="0">
+  <w:abstractNum w:abstractNumId="54" w15:restartNumberingAfterBreak="0">
     <w:nsid w:val="56141124"/>
     <w:multiLevelType w:val="multilevel"/>
     <w:tmpl w:val="72CECC2A"/>
@@ -19687,7 +22472,7 @@
       </w:rPr>
     </w:lvl>
   </w:abstractNum>
-  <w:abstractNum w:abstractNumId="46" w15:restartNumberingAfterBreak="0">
+  <w:abstractNum w:abstractNumId="55" w15:restartNumberingAfterBreak="0">
     <w:nsid w:val="5668129C"/>
     <w:multiLevelType w:val="multilevel"/>
     <w:tmpl w:val="193EC38C"/>
@@ -19836,7 +22621,7 @@
       </w:rPr>
     </w:lvl>
   </w:abstractNum>
-  <w:abstractNum w:abstractNumId="47" w15:restartNumberingAfterBreak="0">
+  <w:abstractNum w:abstractNumId="56" w15:restartNumberingAfterBreak="0">
     <w:nsid w:val="5BD530F4"/>
     <w:multiLevelType w:val="multilevel"/>
     <w:tmpl w:val="85BE4242"/>
@@ -19985,7 +22770,7 @@
       </w:rPr>
     </w:lvl>
   </w:abstractNum>
-  <w:abstractNum w:abstractNumId="48" w15:restartNumberingAfterBreak="0">
+  <w:abstractNum w:abstractNumId="57" w15:restartNumberingAfterBreak="0">
     <w:nsid w:val="5F797678"/>
     <w:multiLevelType w:val="multilevel"/>
     <w:tmpl w:val="4BE291F8"/>
@@ -20134,7 +22919,7 @@
       </w:rPr>
     </w:lvl>
   </w:abstractNum>
-  <w:abstractNum w:abstractNumId="49" w15:restartNumberingAfterBreak="0">
+  <w:abstractNum w:abstractNumId="58" w15:restartNumberingAfterBreak="0">
     <w:nsid w:val="64B00720"/>
     <w:multiLevelType w:val="multilevel"/>
     <w:tmpl w:val="ECA4E594"/>
@@ -20283,7 +23068,7 @@
       </w:rPr>
     </w:lvl>
   </w:abstractNum>
-  <w:abstractNum w:abstractNumId="50" w15:restartNumberingAfterBreak="0">
+  <w:abstractNum w:abstractNumId="59" w15:restartNumberingAfterBreak="0">
     <w:nsid w:val="64D8791F"/>
     <w:multiLevelType w:val="multilevel"/>
     <w:tmpl w:val="C818DFEE"/>
@@ -20432,7 +23217,7 @@
       </w:rPr>
     </w:lvl>
   </w:abstractNum>
-  <w:abstractNum w:abstractNumId="51" w15:restartNumberingAfterBreak="0">
+  <w:abstractNum w:abstractNumId="60" w15:restartNumberingAfterBreak="0">
     <w:nsid w:val="65220CC3"/>
     <w:multiLevelType w:val="multilevel"/>
     <w:tmpl w:val="8D34722E"/>
@@ -20581,7 +23366,7 @@
       </w:rPr>
     </w:lvl>
   </w:abstractNum>
-  <w:abstractNum w:abstractNumId="52" w15:restartNumberingAfterBreak="0">
+  <w:abstractNum w:abstractNumId="61" w15:restartNumberingAfterBreak="0">
     <w:nsid w:val="66383948"/>
     <w:multiLevelType w:val="hybridMultilevel"/>
     <w:tmpl w:val="938C0E22"/>
@@ -20694,7 +23479,7 @@
       </w:rPr>
     </w:lvl>
   </w:abstractNum>
-  <w:abstractNum w:abstractNumId="53" w15:restartNumberingAfterBreak="0">
+  <w:abstractNum w:abstractNumId="62" w15:restartNumberingAfterBreak="0">
     <w:nsid w:val="6D3E2179"/>
     <w:multiLevelType w:val="multilevel"/>
     <w:tmpl w:val="CAE0758E"/>
@@ -20843,7 +23628,7 @@
       </w:rPr>
     </w:lvl>
   </w:abstractNum>
-  <w:abstractNum w:abstractNumId="54" w15:restartNumberingAfterBreak="0">
+  <w:abstractNum w:abstractNumId="63" w15:restartNumberingAfterBreak="0">
     <w:nsid w:val="6E6A33B4"/>
     <w:multiLevelType w:val="multilevel"/>
     <w:tmpl w:val="95FC9004"/>
@@ -20992,7 +23777,7 @@
       </w:rPr>
     </w:lvl>
   </w:abstractNum>
-  <w:abstractNum w:abstractNumId="55" w15:restartNumberingAfterBreak="0">
+  <w:abstractNum w:abstractNumId="64" w15:restartNumberingAfterBreak="0">
     <w:nsid w:val="714D5569"/>
     <w:multiLevelType w:val="multilevel"/>
     <w:tmpl w:val="CD0AA0D6"/>
@@ -21141,7 +23926,7 @@
       </w:rPr>
     </w:lvl>
   </w:abstractNum>
-  <w:abstractNum w:abstractNumId="56" w15:restartNumberingAfterBreak="0">
+  <w:abstractNum w:abstractNumId="65" w15:restartNumberingAfterBreak="0">
     <w:nsid w:val="73042D32"/>
     <w:multiLevelType w:val="hybridMultilevel"/>
     <w:tmpl w:val="1EF05924"/>
@@ -21254,7 +24039,7 @@
       </w:rPr>
     </w:lvl>
   </w:abstractNum>
-  <w:abstractNum w:abstractNumId="57" w15:restartNumberingAfterBreak="0">
+  <w:abstractNum w:abstractNumId="66" w15:restartNumberingAfterBreak="0">
     <w:nsid w:val="7315484B"/>
     <w:multiLevelType w:val="hybridMultilevel"/>
     <w:tmpl w:val="AABA4838"/>
@@ -21367,7 +24152,7 @@
       </w:rPr>
     </w:lvl>
   </w:abstractNum>
-  <w:abstractNum w:abstractNumId="58" w15:restartNumberingAfterBreak="0">
+  <w:abstractNum w:abstractNumId="67" w15:restartNumberingAfterBreak="0">
     <w:nsid w:val="77AE223B"/>
     <w:multiLevelType w:val="multilevel"/>
     <w:tmpl w:val="E7AC683A"/>
@@ -21516,7 +24301,7 @@
       </w:rPr>
     </w:lvl>
   </w:abstractNum>
-  <w:abstractNum w:abstractNumId="59" w15:restartNumberingAfterBreak="0">
+  <w:abstractNum w:abstractNumId="68" w15:restartNumberingAfterBreak="0">
     <w:nsid w:val="7C261037"/>
     <w:multiLevelType w:val="multilevel"/>
     <w:tmpl w:val="910E7076"/>
@@ -21665,7 +24450,7 @@
       </w:rPr>
     </w:lvl>
   </w:abstractNum>
-  <w:abstractNum w:abstractNumId="60" w15:restartNumberingAfterBreak="0">
+  <w:abstractNum w:abstractNumId="69" w15:restartNumberingAfterBreak="0">
     <w:nsid w:val="7C3B2547"/>
     <w:multiLevelType w:val="multilevel"/>
     <w:tmpl w:val="B18CE0AE"/>
@@ -21814,7 +24599,7 @@
       </w:rPr>
     </w:lvl>
   </w:abstractNum>
-  <w:abstractNum w:abstractNumId="61" w15:restartNumberingAfterBreak="0">
+  <w:abstractNum w:abstractNumId="70" w15:restartNumberingAfterBreak="0">
     <w:nsid w:val="7C495741"/>
     <w:multiLevelType w:val="multilevel"/>
     <w:tmpl w:val="31921748"/>
@@ -21927,7 +24712,156 @@
       </w:pPr>
     </w:lvl>
   </w:abstractNum>
-  <w:abstractNum w:abstractNumId="62" w15:restartNumberingAfterBreak="0">
+  <w:abstractNum w:abstractNumId="71" w15:restartNumberingAfterBreak="0">
+    <w:nsid w:val="7C8305CC"/>
+    <w:multiLevelType w:val="multilevel"/>
+    <w:tmpl w:val="10D04C10"/>
+    <w:lvl w:ilvl="0">
+      <w:start w:val="1"/>
+      <w:numFmt w:val="bullet"/>
+      <w:lvlText w:val=""/>
+      <w:lvlJc w:val="left"/>
+      <w:pPr>
+        <w:tabs>
+          <w:tab w:val="num" w:pos="720"/>
+        </w:tabs>
+        <w:ind w:left="720" w:hanging="360"/>
+      </w:pPr>
+      <w:rPr>
+        <w:rFonts w:ascii="Symbol" w:hAnsi="Symbol" w:hint="default"/>
+        <w:sz w:val="20"/>
+      </w:rPr>
+    </w:lvl>
+    <w:lvl w:ilvl="1" w:tentative="1">
+      <w:start w:val="1"/>
+      <w:numFmt w:val="bullet"/>
+      <w:lvlText w:val="o"/>
+      <w:lvlJc w:val="left"/>
+      <w:pPr>
+        <w:tabs>
+          <w:tab w:val="num" w:pos="1440"/>
+        </w:tabs>
+        <w:ind w:left="1440" w:hanging="360"/>
+      </w:pPr>
+      <w:rPr>
+        <w:rFonts w:ascii="Courier New" w:hAnsi="Courier New" w:hint="default"/>
+        <w:sz w:val="20"/>
+      </w:rPr>
+    </w:lvl>
+    <w:lvl w:ilvl="2" w:tentative="1">
+      <w:start w:val="1"/>
+      <w:numFmt w:val="bullet"/>
+      <w:lvlText w:val=""/>
+      <w:lvlJc w:val="left"/>
+      <w:pPr>
+        <w:tabs>
+          <w:tab w:val="num" w:pos="2160"/>
+        </w:tabs>
+        <w:ind w:left="2160" w:hanging="360"/>
+      </w:pPr>
+      <w:rPr>
+        <w:rFonts w:ascii="Wingdings" w:hAnsi="Wingdings" w:hint="default"/>
+        <w:sz w:val="20"/>
+      </w:rPr>
+    </w:lvl>
+    <w:lvl w:ilvl="3" w:tentative="1">
+      <w:start w:val="1"/>
+      <w:numFmt w:val="bullet"/>
+      <w:lvlText w:val=""/>
+      <w:lvlJc w:val="left"/>
+      <w:pPr>
+        <w:tabs>
+          <w:tab w:val="num" w:pos="2880"/>
+        </w:tabs>
+        <w:ind w:left="2880" w:hanging="360"/>
+      </w:pPr>
+      <w:rPr>
+        <w:rFonts w:ascii="Wingdings" w:hAnsi="Wingdings" w:hint="default"/>
+        <w:sz w:val="20"/>
+      </w:rPr>
+    </w:lvl>
+    <w:lvl w:ilvl="4" w:tentative="1">
+      <w:start w:val="1"/>
+      <w:numFmt w:val="bullet"/>
+      <w:lvlText w:val=""/>
+      <w:lvlJc w:val="left"/>
+      <w:pPr>
+        <w:tabs>
+          <w:tab w:val="num" w:pos="3600"/>
+        </w:tabs>
+        <w:ind w:left="3600" w:hanging="360"/>
+      </w:pPr>
+      <w:rPr>
+        <w:rFonts w:ascii="Wingdings" w:hAnsi="Wingdings" w:hint="default"/>
+        <w:sz w:val="20"/>
+      </w:rPr>
+    </w:lvl>
+    <w:lvl w:ilvl="5" w:tentative="1">
+      <w:start w:val="1"/>
+      <w:numFmt w:val="bullet"/>
+      <w:lvlText w:val=""/>
+      <w:lvlJc w:val="left"/>
+      <w:pPr>
+        <w:tabs>
+          <w:tab w:val="num" w:pos="4320"/>
+        </w:tabs>
+        <w:ind w:left="4320" w:hanging="360"/>
+      </w:pPr>
+      <w:rPr>
+        <w:rFonts w:ascii="Wingdings" w:hAnsi="Wingdings" w:hint="default"/>
+        <w:sz w:val="20"/>
+      </w:rPr>
+    </w:lvl>
+    <w:lvl w:ilvl="6" w:tentative="1">
+      <w:start w:val="1"/>
+      <w:numFmt w:val="bullet"/>
+      <w:lvlText w:val=""/>
+      <w:lvlJc w:val="left"/>
+      <w:pPr>
+        <w:tabs>
+          <w:tab w:val="num" w:pos="5040"/>
+        </w:tabs>
+        <w:ind w:left="5040" w:hanging="360"/>
+      </w:pPr>
+      <w:rPr>
+        <w:rFonts w:ascii="Wingdings" w:hAnsi="Wingdings" w:hint="default"/>
+        <w:sz w:val="20"/>
+      </w:rPr>
+    </w:lvl>
+    <w:lvl w:ilvl="7" w:tentative="1">
+      <w:start w:val="1"/>
+      <w:numFmt w:val="bullet"/>
+      <w:lvlText w:val=""/>
+      <w:lvlJc w:val="left"/>
+      <w:pPr>
+        <w:tabs>
+          <w:tab w:val="num" w:pos="5760"/>
+        </w:tabs>
+        <w:ind w:left="5760" w:hanging="360"/>
+      </w:pPr>
+      <w:rPr>
+        <w:rFonts w:ascii="Wingdings" w:hAnsi="Wingdings" w:hint="default"/>
+        <w:sz w:val="20"/>
+      </w:rPr>
+    </w:lvl>
+    <w:lvl w:ilvl="8" w:tentative="1">
+      <w:start w:val="1"/>
+      <w:numFmt w:val="bullet"/>
+      <w:lvlText w:val=""/>
+      <w:lvlJc w:val="left"/>
+      <w:pPr>
+        <w:tabs>
+          <w:tab w:val="num" w:pos="6480"/>
+        </w:tabs>
+        <w:ind w:left="6480" w:hanging="360"/>
+      </w:pPr>
+      <w:rPr>
+        <w:rFonts w:ascii="Wingdings" w:hAnsi="Wingdings" w:hint="default"/>
+        <w:sz w:val="20"/>
+      </w:rPr>
+    </w:lvl>
+  </w:abstractNum>
+  <w:abstractNum w:abstractNumId="72" w15:restartNumberingAfterBreak="0">
     <w:nsid w:val="7D050E13"/>
     <w:multiLevelType w:val="hybridMultilevel"/>
     <w:tmpl w:val="4410AC02"/>
@@ -22040,28 +24974,28 @@
     </w:lvl>
   </w:abstractNum>
   <w:num w:numId="1">
-    <w:abstractNumId w:val="18"/>
+    <w:abstractNumId w:val="20"/>
   </w:num>
   <w:num w:numId="2">
     <w:abstractNumId w:val="10"/>
   </w:num>
   <w:num w:numId="3">
-    <w:abstractNumId w:val="33"/>
+    <w:abstractNumId w:val="39"/>
   </w:num>
   <w:num w:numId="4">
-    <w:abstractNumId w:val="45"/>
+    <w:abstractNumId w:val="54"/>
   </w:num>
   <w:num w:numId="5">
     <w:abstractNumId w:val="3"/>
   </w:num>
   <w:num w:numId="6">
-    <w:abstractNumId w:val="59"/>
+    <w:abstractNumId w:val="68"/>
   </w:num>
   <w:num w:numId="7">
-    <w:abstractNumId w:val="60"/>
+    <w:abstractNumId w:val="69"/>
   </w:num>
   <w:num w:numId="8">
-    <w:abstractNumId w:val="58"/>
+    <w:abstractNumId w:val="67"/>
   </w:num>
   <w:num w:numId="9">
     <w:abstractNumId w:val="4"/>
@@ -22070,136 +25004,136 @@
     <w:abstractNumId w:val="13"/>
   </w:num>
   <w:num w:numId="11">
-    <w:abstractNumId w:val="47"/>
+    <w:abstractNumId w:val="56"/>
   </w:num>
   <w:num w:numId="12">
-    <w:abstractNumId w:val="21"/>
+    <w:abstractNumId w:val="23"/>
   </w:num>
   <w:num w:numId="13">
-    <w:abstractNumId w:val="53"/>
+    <w:abstractNumId w:val="62"/>
   </w:num>
   <w:num w:numId="14">
-    <w:abstractNumId w:val="14"/>
+    <w:abstractNumId w:val="16"/>
   </w:num>
   <w:num w:numId="15">
-    <w:abstractNumId w:val="42"/>
+    <w:abstractNumId w:val="51"/>
   </w:num>
   <w:num w:numId="16">
     <w:abstractNumId w:val="12"/>
   </w:num>
   <w:num w:numId="17">
-    <w:abstractNumId w:val="61"/>
+    <w:abstractNumId w:val="70"/>
   </w:num>
   <w:num w:numId="18">
-    <w:abstractNumId w:val="35"/>
+    <w:abstractNumId w:val="42"/>
   </w:num>
   <w:num w:numId="19">
     <w:abstractNumId w:val="2"/>
   </w:num>
   <w:num w:numId="20">
-    <w:abstractNumId w:val="36"/>
+    <w:abstractNumId w:val="43"/>
   </w:num>
   <w:num w:numId="21">
-    <w:abstractNumId w:val="50"/>
+    <w:abstractNumId w:val="59"/>
   </w:num>
   <w:num w:numId="22">
-    <w:abstractNumId w:val="31"/>
+    <w:abstractNumId w:val="37"/>
   </w:num>
   <w:num w:numId="23">
-    <w:abstractNumId w:val="23"/>
+    <w:abstractNumId w:val="26"/>
   </w:num>
   <w:num w:numId="24">
-    <w:abstractNumId w:val="43"/>
+    <w:abstractNumId w:val="52"/>
   </w:num>
   <w:num w:numId="25">
     <w:abstractNumId w:val="5"/>
   </w:num>
   <w:num w:numId="26">
-    <w:abstractNumId w:val="49"/>
+    <w:abstractNumId w:val="58"/>
   </w:num>
   <w:num w:numId="27">
-    <w:abstractNumId w:val="48"/>
+    <w:abstractNumId w:val="57"/>
   </w:num>
   <w:num w:numId="28">
-    <w:abstractNumId w:val="22"/>
+    <w:abstractNumId w:val="25"/>
   </w:num>
   <w:num w:numId="29">
-    <w:abstractNumId w:val="17"/>
+    <w:abstractNumId w:val="19"/>
   </w:num>
   <w:num w:numId="30">
     <w:abstractNumId w:val="9"/>
   </w:num>
   <w:num w:numId="31">
-    <w:abstractNumId w:val="24"/>
+    <w:abstractNumId w:val="27"/>
   </w:num>
   <w:num w:numId="32">
-    <w:abstractNumId w:val="30"/>
+    <w:abstractNumId w:val="36"/>
   </w:num>
   <w:num w:numId="33">
-    <w:abstractNumId w:val="19"/>
+    <w:abstractNumId w:val="21"/>
   </w:num>
   <w:num w:numId="34">
-    <w:abstractNumId w:val="32"/>
+    <w:abstractNumId w:val="38"/>
   </w:num>
   <w:num w:numId="35">
-    <w:abstractNumId w:val="44"/>
+    <w:abstractNumId w:val="53"/>
   </w:num>
   <w:num w:numId="36">
     <w:abstractNumId w:val="7"/>
   </w:num>
   <w:num w:numId="37">
-    <w:abstractNumId w:val="56"/>
+    <w:abstractNumId w:val="65"/>
   </w:num>
   <w:num w:numId="38">
     <w:abstractNumId w:val="8"/>
   </w:num>
   <w:num w:numId="39">
-    <w:abstractNumId w:val="55"/>
+    <w:abstractNumId w:val="64"/>
   </w:num>
   <w:num w:numId="40">
-    <w:abstractNumId w:val="37"/>
+    <w:abstractNumId w:val="44"/>
   </w:num>
   <w:num w:numId="41">
     <w:abstractNumId w:val="6"/>
   </w:num>
   <w:num w:numId="42">
-    <w:abstractNumId w:val="27"/>
+    <w:abstractNumId w:val="31"/>
   </w:num>
   <w:num w:numId="43">
-    <w:abstractNumId w:val="54"/>
+    <w:abstractNumId w:val="63"/>
   </w:num>
   <w:num w:numId="44">
-    <w:abstractNumId w:val="26"/>
+    <w:abstractNumId w:val="29"/>
   </w:num>
   <w:num w:numId="45">
-    <w:abstractNumId w:val="20"/>
+    <w:abstractNumId w:val="22"/>
   </w:num>
   <w:num w:numId="46">
-    <w:abstractNumId w:val="40"/>
+    <w:abstractNumId w:val="49"/>
   </w:num>
   <w:num w:numId="47">
-    <w:abstractNumId w:val="46"/>
+    <w:abstractNumId w:val="55"/>
   </w:num>
   <w:num w:numId="48">
-    <w:abstractNumId w:val="25"/>
+    <w:abstractNumId w:val="28"/>
   </w:num>
   <w:num w:numId="49">
     <w:abstractNumId w:val="1"/>
   </w:num>
   <w:num w:numId="50">
-    <w:abstractNumId w:val="16"/>
+    <w:abstractNumId w:val="18"/>
   </w:num>
   <w:num w:numId="51">
-    <w:abstractNumId w:val="28"/>
+    <w:abstractNumId w:val="34"/>
   </w:num>
   <w:num w:numId="52">
-    <w:abstractNumId w:val="34"/>
+    <w:abstractNumId w:val="40"/>
   </w:num>
   <w:num w:numId="53">
-    <w:abstractNumId w:val="39"/>
+    <w:abstractNumId w:val="48"/>
   </w:num>
   <w:num w:numId="54">
-    <w:abstractNumId w:val="15"/>
+    <w:abstractNumId w:val="17"/>
   </w:num>
   <w:num w:numId="55">
     <w:abstractNumId w:val="0"/>
@@ -22208,25 +25142,55 @@
     <w:abstractNumId w:val="11"/>
   </w:num>
   <w:num w:numId="57">
+    <w:abstractNumId w:val="50"/>
+  </w:num>
+  <w:num w:numId="58">
+    <w:abstractNumId w:val="60"/>
+  </w:num>
+  <w:num w:numId="59">
+    <w:abstractNumId w:val="72"/>
+  </w:num>
+  <w:num w:numId="60">
+    <w:abstractNumId w:val="35"/>
+  </w:num>
+  <w:num w:numId="61">
+    <w:abstractNumId w:val="66"/>
+  </w:num>
+  <w:num w:numId="62">
+    <w:abstractNumId w:val="47"/>
+  </w:num>
+  <w:num w:numId="63">
+    <w:abstractNumId w:val="61"/>
+  </w:num>
+  <w:num w:numId="64">
+    <w:abstractNumId w:val="71"/>
+  </w:num>
+  <w:num w:numId="65">
     <w:abstractNumId w:val="41"/>
   </w:num>
-  <w:num w:numId="58">
-    <w:abstractNumId w:val="51"/>
+  <w:num w:numId="66">
+    <w:abstractNumId w:val="46"/>
   </w:num>
-  <w:num w:numId="59">
-    <w:abstractNumId w:val="62"/>
+  <w:num w:numId="67">
+    <w:abstractNumId w:val="45"/>
   </w:num>
-  <w:num w:numId="60">
-    <w:abstractNumId w:val="29"/>
+  <w:num w:numId="68">
+    <w:abstractNumId w:val="33"/>
   </w:num>
-  <w:num w:numId="61">
-    <w:abstractNumId w:val="57"/>
+  <w:num w:numId="69">
+    <w:abstractNumId w:val="15"/>
   </w:num>
-  <w:num w:numId="62">
-    <w:abstractNumId w:val="38"/>
+  <w:num w:numId="70">
+    <w:abstractNumId w:val="30"/>
   </w:num>
-  <w:num w:numId="63">
-    <w:abstractNumId w:val="52"/>
+  <w:num w:numId="71">
+    <w:abstractNumId w:val="24"/>
+  </w:num>
+  <w:num w:numId="72">
+    <w:abstractNumId w:val="14"/>
+  </w:num>
+  <w:num w:numId="73">
+    <w:abstractNumId w:val="32"/>
   </w:num>
   <w:numIdMacAtCleanup w:val="63"/>
 </w:numbering>
@@ -22625,7 +25589,7 @@
   <w:style w:type="paragraph" w:default="1" w:styleId="Normal">
     <w:name w:val="Normal"/>
     <w:qFormat/>
-    <w:rsid w:val="0027139D"/>
+    <w:rsid w:val="00E9387D"/>
   </w:style>
   <w:style w:type="paragraph" w:styleId="Heading2">
     <w:name w:val="heading 2"/>
@@ -23039,7 +26003,7 @@
 </file>
 
 <file path=customXml/itemProps1.xml><?xml version="1.0" encoding="utf-8"?>
-<ds:datastoreItem xmlns:ds="http://schemas.openxmlformats.org/officeDocument/2006/customXml" ds:itemID="{A8713990-3298-463D-8CF1-961810F08DDC}">
+<ds:datastoreItem xmlns:ds="http://schemas.openxmlformats.org/officeDocument/2006/customXml" ds:itemID="{E227F166-5622-4DCB-96D1-C525EAF4920A}">
   <ds:schemaRefs>
     <ds:schemaRef ds:uri="http://schemas.openxmlformats.org/officeDocument/2006/bibliography"/>
   </ds:schemaRefs>

</xml_diff>

<commit_message>
Update project documentation and daily logs (Day 26–29 updates)
</commit_message>
<xml_diff>
--- a/docs/01_Daily_Log.docx
+++ b/docs/01_Daily_Log.docx
@@ -13181,16 +13181,16 @@
           <w:sz w:val="24"/>
           <w:szCs w:val="24"/>
         </w:rPr>
-        <w:t xml:space="preserve"> 12</w:t>
-      </w:r>
-      <w:r>
-        <w:rPr>
-          <w:rFonts w:ascii="Times New Roman" w:eastAsia="Times New Roman" w:hAnsi="Times New Roman" w:cs="Times New Roman"/>
-          <w:b/>
-          <w:sz w:val="24"/>
-          <w:szCs w:val="24"/>
-        </w:rPr>
-        <w:t>/02/2026                                                                                                              Day 25</w:t>
+        <w:t xml:space="preserve"> 12/02/2026                                                                                    </w:t>
+      </w:r>
+      <w:r>
+        <w:rPr>
+          <w:rFonts w:ascii="Times New Roman" w:eastAsia="Times New Roman" w:hAnsi="Times New Roman" w:cs="Times New Roman"/>
+          <w:b/>
+          <w:sz w:val="24"/>
+          <w:szCs w:val="24"/>
+        </w:rPr>
+        <w:t xml:space="preserve">                          Day 26</w:t>
       </w:r>
       <w:r>
         <w:rPr>
@@ -14440,10 +14440,2238 @@
         <w:spacing w:before="0" w:beforeAutospacing="0" w:after="0" w:afterAutospacing="0"/>
       </w:pPr>
       <w:r>
-        <w:t>Define export format contract for SCANKAR mobile app.</w:t>
+        <w:t xml:space="preserve">Define export format </w:t>
+      </w:r>
+      <w:r>
+        <w:t>contract for SCANKAR mobile app.</w:t>
+      </w:r>
+    </w:p>
+    <w:p>
+      <w:pPr>
+        <w:spacing w:after="0" w:line="240" w:lineRule="auto"/>
+        <w:outlineLvl w:val="1"/>
+        <w:rPr>
+          <w:rFonts w:ascii="Times New Roman" w:eastAsia="Times New Roman" w:hAnsi="Times New Roman" w:cs="Times New Roman"/>
+          <w:b/>
+          <w:sz w:val="24"/>
+          <w:szCs w:val="24"/>
+        </w:rPr>
+      </w:pPr>
+      <w:r>
+        <w:rPr>
+          <w:rFonts w:ascii="Times New Roman" w:eastAsia="Times New Roman" w:hAnsi="Times New Roman" w:cs="Times New Roman"/>
+          <w:b/>
+          <w:bCs/>
+          <w:sz w:val="24"/>
+          <w:szCs w:val="24"/>
+        </w:rPr>
+        <w:lastRenderedPageBreak/>
+        <w:t>Date:</w:t>
+      </w:r>
+      <w:r>
+        <w:rPr>
+          <w:rFonts w:ascii="Times New Roman" w:eastAsia="Times New Roman" w:hAnsi="Times New Roman" w:cs="Times New Roman"/>
+          <w:b/>
+          <w:sz w:val="24"/>
+          <w:szCs w:val="24"/>
+        </w:rPr>
+        <w:t xml:space="preserve"> 13</w:t>
+      </w:r>
+      <w:r>
+        <w:rPr>
+          <w:rFonts w:ascii="Times New Roman" w:eastAsia="Times New Roman" w:hAnsi="Times New Roman" w:cs="Times New Roman"/>
+          <w:b/>
+          <w:sz w:val="24"/>
+          <w:szCs w:val="24"/>
+        </w:rPr>
+        <w:t xml:space="preserve">/02/2026                                                                                    </w:t>
+      </w:r>
+      <w:r>
+        <w:rPr>
+          <w:rFonts w:ascii="Times New Roman" w:eastAsia="Times New Roman" w:hAnsi="Times New Roman" w:cs="Times New Roman"/>
+          <w:b/>
+          <w:sz w:val="24"/>
+          <w:szCs w:val="24"/>
+        </w:rPr>
+        <w:t xml:space="preserve">                          Day 27</w:t>
+      </w:r>
+      <w:r>
+        <w:rPr>
+          <w:rFonts w:ascii="Times New Roman" w:eastAsia="Times New Roman" w:hAnsi="Times New Roman" w:cs="Times New Roman"/>
+          <w:b/>
+          <w:sz w:val="24"/>
+          <w:szCs w:val="24"/>
+        </w:rPr>
+        <w:br/>
+      </w:r>
+      <w:r>
+        <w:rPr>
+          <w:rFonts w:ascii="Times New Roman" w:eastAsia="Times New Roman" w:hAnsi="Times New Roman" w:cs="Times New Roman"/>
+          <w:b/>
+          <w:bCs/>
+          <w:sz w:val="24"/>
+          <w:szCs w:val="24"/>
+        </w:rPr>
+        <w:t>Department:</w:t>
+      </w:r>
+      <w:r>
+        <w:rPr>
+          <w:rFonts w:ascii="Times New Roman" w:eastAsia="Times New Roman" w:hAnsi="Times New Roman" w:cs="Times New Roman"/>
+          <w:b/>
+          <w:sz w:val="24"/>
+          <w:szCs w:val="24"/>
+        </w:rPr>
+        <w:t xml:space="preserve"> Maintenance</w:t>
+      </w:r>
+      <w:r>
+        <w:rPr>
+          <w:rFonts w:ascii="Times New Roman" w:eastAsia="Times New Roman" w:hAnsi="Times New Roman" w:cs="Times New Roman"/>
+          <w:b/>
+          <w:sz w:val="24"/>
+          <w:szCs w:val="24"/>
+        </w:rPr>
+        <w:br/>
+      </w:r>
+      <w:r>
+        <w:rPr>
+          <w:rFonts w:ascii="Times New Roman" w:eastAsia="Times New Roman" w:hAnsi="Times New Roman" w:cs="Times New Roman"/>
+          <w:b/>
+          <w:bCs/>
+          <w:sz w:val="24"/>
+          <w:szCs w:val="24"/>
+        </w:rPr>
+        <w:t>Plant:</w:t>
+      </w:r>
+      <w:r>
+        <w:rPr>
+          <w:rFonts w:ascii="Times New Roman" w:eastAsia="Times New Roman" w:hAnsi="Times New Roman" w:cs="Times New Roman"/>
+          <w:b/>
+          <w:sz w:val="24"/>
+          <w:szCs w:val="24"/>
+        </w:rPr>
+        <w:t xml:space="preserve"> Drive Shaft Manufacturing</w:t>
+      </w:r>
+    </w:p>
+    <w:p>
+      <w:pPr>
+        <w:spacing w:after="0" w:line="240" w:lineRule="auto"/>
+        <w:outlineLvl w:val="1"/>
+        <w:rPr>
+          <w:rFonts w:ascii="Times New Roman" w:eastAsia="Times New Roman" w:hAnsi="Times New Roman" w:cs="Times New Roman"/>
+          <w:b/>
+          <w:sz w:val="24"/>
+          <w:szCs w:val="24"/>
+        </w:rPr>
+      </w:pPr>
+      <w:r>
+        <w:rPr>
+          <w:rFonts w:ascii="Times New Roman" w:eastAsia="Times New Roman" w:hAnsi="Times New Roman" w:cs="Times New Roman"/>
+          <w:b/>
+          <w:sz w:val="24"/>
+          <w:szCs w:val="24"/>
+        </w:rPr>
+        <w:t>Work from Home</w:t>
+      </w:r>
+    </w:p>
+    <w:p>
+      <w:pPr>
+        <w:spacing w:after="0" w:line="240" w:lineRule="auto"/>
+        <w:outlineLvl w:val="1"/>
+        <w:rPr>
+          <w:rFonts w:ascii="Times New Roman" w:eastAsia="Times New Roman" w:hAnsi="Times New Roman" w:cs="Times New Roman"/>
+          <w:b/>
+          <w:sz w:val="24"/>
+          <w:szCs w:val="24"/>
+        </w:rPr>
+      </w:pPr>
+    </w:p>
+    <w:p>
+      <w:pPr>
+        <w:pStyle w:val="NormalWeb"/>
+        <w:spacing w:before="0" w:beforeAutospacing="0" w:after="0" w:afterAutospacing="0"/>
+        <w:rPr>
+          <w:b/>
+        </w:rPr>
+      </w:pPr>
+      <w:r>
+        <w:rPr>
+          <w:b/>
+        </w:rPr>
+        <w:t>Objective for the Day</w:t>
+      </w:r>
+    </w:p>
+    <w:p>
+      <w:pPr>
+        <w:pStyle w:val="NormalWeb"/>
+        <w:numPr>
+          <w:ilvl w:val="0"/>
+          <w:numId w:val="74"/>
+        </w:numPr>
+        <w:spacing w:before="0" w:beforeAutospacing="0" w:after="0" w:afterAutospacing="0"/>
+      </w:pPr>
+      <w:r>
+        <w:t>Enhance frontend UI and UX of the Offline Industrial Data Intelligence System</w:t>
+      </w:r>
+    </w:p>
+    <w:p>
+      <w:pPr>
+        <w:pStyle w:val="NormalWeb"/>
+        <w:numPr>
+          <w:ilvl w:val="0"/>
+          <w:numId w:val="74"/>
+        </w:numPr>
+        <w:spacing w:before="0" w:beforeAutospacing="0" w:after="0" w:afterAutospacing="0"/>
+      </w:pPr>
+      <w:r>
+        <w:t>Improve overall usability and visual consistency of the desktop application</w:t>
+      </w:r>
+    </w:p>
+    <w:p>
+      <w:pPr>
+        <w:pStyle w:val="NormalWeb"/>
+        <w:spacing w:before="0" w:beforeAutospacing="0" w:after="0" w:afterAutospacing="0"/>
+      </w:pPr>
+    </w:p>
+    <w:p>
+      <w:pPr>
+        <w:pStyle w:val="NormalWeb"/>
+        <w:spacing w:before="0" w:beforeAutospacing="0" w:after="0" w:afterAutospacing="0"/>
+        <w:rPr>
+          <w:b/>
+        </w:rPr>
+      </w:pPr>
+      <w:r>
+        <w:rPr>
+          <w:b/>
+        </w:rPr>
+        <w:t>Activities Performed</w:t>
+      </w:r>
+    </w:p>
+    <w:p>
+      <w:pPr>
+        <w:pStyle w:val="NormalWeb"/>
+        <w:numPr>
+          <w:ilvl w:val="0"/>
+          <w:numId w:val="75"/>
+        </w:numPr>
+        <w:spacing w:before="0" w:beforeAutospacing="0" w:after="0" w:afterAutospacing="0"/>
+      </w:pPr>
+      <w:r>
+        <w:t>Worked remotely on refining the frontend user interface design</w:t>
+      </w:r>
+    </w:p>
+    <w:p>
+      <w:pPr>
+        <w:pStyle w:val="NormalWeb"/>
+        <w:numPr>
+          <w:ilvl w:val="0"/>
+          <w:numId w:val="75"/>
+        </w:numPr>
+        <w:spacing w:before="0" w:beforeAutospacing="0" w:after="0" w:afterAutospacing="0"/>
+      </w:pPr>
+      <w:r>
+        <w:t>Improved layout alignment, spacing, and visual consistency across pages</w:t>
+      </w:r>
+    </w:p>
+    <w:p>
+      <w:pPr>
+        <w:pStyle w:val="NormalWeb"/>
+        <w:numPr>
+          <w:ilvl w:val="0"/>
+          <w:numId w:val="75"/>
+        </w:numPr>
+        <w:spacing w:before="0" w:beforeAutospacing="0" w:after="0" w:afterAutospacing="0"/>
+      </w:pPr>
+      <w:r>
+        <w:t>Enhanced run selection modal usability and filtering behavior</w:t>
+      </w:r>
+    </w:p>
+    <w:p>
+      <w:pPr>
+        <w:pStyle w:val="NormalWeb"/>
+        <w:numPr>
+          <w:ilvl w:val="0"/>
+          <w:numId w:val="75"/>
+        </w:numPr>
+        <w:spacing w:before="0" w:beforeAutospacing="0" w:after="0" w:afterAutospacing="0"/>
+      </w:pPr>
+      <w:r>
+        <w:t>Reviewed navigation flow between:</w:t>
+      </w:r>
+    </w:p>
+    <w:p>
+      <w:pPr>
+        <w:pStyle w:val="NormalWeb"/>
+        <w:spacing w:before="0" w:beforeAutospacing="0" w:after="0" w:afterAutospacing="0"/>
+        <w:ind w:left="1440"/>
+        <w:rPr>
+          <w:b/>
+        </w:rPr>
+      </w:pPr>
+      <w:r>
+        <w:rPr>
+          <w:b/>
+        </w:rPr>
+        <w:t>Home</w:t>
+      </w:r>
+    </w:p>
+    <w:p>
+      <w:pPr>
+        <w:pStyle w:val="NormalWeb"/>
+        <w:spacing w:before="0" w:beforeAutospacing="0" w:after="0" w:afterAutospacing="0"/>
+        <w:ind w:left="1440"/>
+        <w:rPr>
+          <w:b/>
+        </w:rPr>
+      </w:pPr>
+      <w:r>
+        <w:rPr>
+          <w:b/>
+        </w:rPr>
+        <w:t>Ingestion</w:t>
+      </w:r>
+    </w:p>
+    <w:p>
+      <w:pPr>
+        <w:pStyle w:val="NormalWeb"/>
+        <w:spacing w:before="0" w:beforeAutospacing="0" w:after="0" w:afterAutospacing="0"/>
+        <w:ind w:left="1440"/>
+        <w:rPr>
+          <w:b/>
+        </w:rPr>
+      </w:pPr>
+      <w:r>
+        <w:rPr>
+          <w:b/>
+        </w:rPr>
+        <w:t>Insights</w:t>
+      </w:r>
+    </w:p>
+    <w:p>
+      <w:pPr>
+        <w:pStyle w:val="NormalWeb"/>
+        <w:spacing w:before="0" w:beforeAutospacing="0" w:after="0" w:afterAutospacing="0"/>
+        <w:ind w:left="1440"/>
+        <w:rPr>
+          <w:b/>
+        </w:rPr>
+      </w:pPr>
+      <w:r>
+        <w:rPr>
+          <w:b/>
+        </w:rPr>
+        <w:t>Dashboards</w:t>
+      </w:r>
+    </w:p>
+    <w:p>
+      <w:pPr>
+        <w:pStyle w:val="NormalWeb"/>
+        <w:spacing w:before="0" w:beforeAutospacing="0" w:after="0" w:afterAutospacing="0"/>
+        <w:ind w:left="1440"/>
+        <w:rPr>
+          <w:b/>
+        </w:rPr>
+      </w:pPr>
+      <w:r>
+        <w:rPr>
+          <w:b/>
+        </w:rPr>
+        <w:t>Exports</w:t>
+      </w:r>
+    </w:p>
+    <w:p>
+      <w:pPr>
+        <w:pStyle w:val="NormalWeb"/>
+        <w:spacing w:before="0" w:beforeAutospacing="0" w:after="0" w:afterAutospacing="0"/>
+        <w:ind w:left="1440"/>
+        <w:rPr>
+          <w:b/>
+        </w:rPr>
+      </w:pPr>
+      <w:r>
+        <w:rPr>
+          <w:b/>
+        </w:rPr>
+        <w:t>Data Health</w:t>
+      </w:r>
+    </w:p>
+    <w:p>
+      <w:pPr>
+        <w:pStyle w:val="NormalWeb"/>
+        <w:spacing w:before="0" w:beforeAutospacing="0" w:after="0" w:afterAutospacing="0"/>
+        <w:ind w:left="1440"/>
+        <w:rPr>
+          <w:b/>
+        </w:rPr>
+      </w:pPr>
+      <w:r>
+        <w:rPr>
+          <w:b/>
+        </w:rPr>
+        <w:t>Explorer</w:t>
+      </w:r>
+    </w:p>
+    <w:p>
+      <w:pPr>
+        <w:pStyle w:val="NormalWeb"/>
+        <w:numPr>
+          <w:ilvl w:val="0"/>
+          <w:numId w:val="76"/>
+        </w:numPr>
+        <w:spacing w:before="0" w:beforeAutospacing="0" w:after="0" w:afterAutospacing="0"/>
+      </w:pPr>
+      <w:r>
+        <w:t>Improved user experience by making interaction flow more intuitive</w:t>
+      </w:r>
+    </w:p>
+    <w:p>
+      <w:pPr>
+        <w:pStyle w:val="NormalWeb"/>
+        <w:numPr>
+          <w:ilvl w:val="0"/>
+          <w:numId w:val="76"/>
+        </w:numPr>
+        <w:spacing w:before="0" w:beforeAutospacing="0" w:after="0" w:afterAutospacing="0"/>
+      </w:pPr>
+      <w:r>
+        <w:t>Validated desktop application behavior in offline mode</w:t>
+      </w:r>
+    </w:p>
+    <w:p>
+      <w:pPr>
+        <w:pStyle w:val="NormalWeb"/>
+        <w:spacing w:before="0" w:beforeAutospacing="0" w:after="0" w:afterAutospacing="0"/>
+        <w:rPr>
+          <w:b/>
+        </w:rPr>
+      </w:pPr>
+    </w:p>
+    <w:p>
+      <w:pPr>
+        <w:pStyle w:val="NormalWeb"/>
+        <w:spacing w:before="0" w:beforeAutospacing="0" w:after="0" w:afterAutospacing="0"/>
+        <w:rPr>
+          <w:b/>
+        </w:rPr>
+      </w:pPr>
+      <w:r>
+        <w:rPr>
+          <w:b/>
+        </w:rPr>
+        <w:t>Key Learnings</w:t>
+      </w:r>
+    </w:p>
+    <w:p>
+      <w:pPr>
+        <w:pStyle w:val="NormalWeb"/>
+        <w:numPr>
+          <w:ilvl w:val="0"/>
+          <w:numId w:val="78"/>
+        </w:numPr>
+        <w:spacing w:before="0" w:beforeAutospacing="0" w:after="0" w:afterAutospacing="0"/>
+      </w:pPr>
+      <w:r>
+        <w:t>UI clarity directly impacts system usability and decision-making efficiency</w:t>
+      </w:r>
+    </w:p>
+    <w:p>
+      <w:pPr>
+        <w:pStyle w:val="NormalWeb"/>
+        <w:numPr>
+          <w:ilvl w:val="0"/>
+          <w:numId w:val="78"/>
+        </w:numPr>
+        <w:spacing w:before="0" w:beforeAutospacing="0" w:after="0" w:afterAutospacing="0"/>
+      </w:pPr>
+      <w:r>
+        <w:t>UX improvements reduce operational confusion during analytical workflows</w:t>
+      </w:r>
+    </w:p>
+    <w:p>
+      <w:pPr>
+        <w:pStyle w:val="NormalWeb"/>
+        <w:numPr>
+          <w:ilvl w:val="0"/>
+          <w:numId w:val="78"/>
+        </w:numPr>
+        <w:spacing w:before="0" w:beforeAutospacing="0" w:after="0" w:afterAutospacing="0"/>
+      </w:pPr>
+      <w:r>
+        <w:t>Frontend architecture must remain synchronized with backend state management</w:t>
+      </w:r>
+    </w:p>
+    <w:p>
+      <w:pPr>
+        <w:pStyle w:val="NormalWeb"/>
+        <w:spacing w:before="0" w:beforeAutospacing="0" w:after="0" w:afterAutospacing="0"/>
+      </w:pPr>
+    </w:p>
+    <w:p>
+      <w:pPr>
+        <w:pStyle w:val="NormalWeb"/>
+        <w:spacing w:before="0" w:beforeAutospacing="0" w:after="0" w:afterAutospacing="0"/>
+        <w:rPr>
+          <w:b/>
+        </w:rPr>
+      </w:pPr>
+      <w:r>
+        <w:rPr>
+          <w:b/>
+        </w:rPr>
+        <w:t>Challenges / Open Points</w:t>
+      </w:r>
+    </w:p>
+    <w:p>
+      <w:pPr>
+        <w:pStyle w:val="NormalWeb"/>
+        <w:numPr>
+          <w:ilvl w:val="0"/>
+          <w:numId w:val="79"/>
+        </w:numPr>
+        <w:spacing w:before="0" w:beforeAutospacing="0" w:after="0" w:afterAutospacing="0"/>
+      </w:pPr>
+      <w:r>
+        <w:t>Ingestion pipeline automation still pending full implementation</w:t>
+      </w:r>
+    </w:p>
+    <w:p>
+      <w:pPr>
+        <w:pStyle w:val="NormalWeb"/>
+        <w:numPr>
+          <w:ilvl w:val="0"/>
+          <w:numId w:val="79"/>
+        </w:numPr>
+        <w:spacing w:before="0" w:beforeAutospacing="0" w:after="0" w:afterAutospacing="0"/>
+      </w:pPr>
+      <w:r>
+        <w:t>Rule-based and ML-based engine layers not yet integrated</w:t>
+      </w:r>
+    </w:p>
+    <w:p>
+      <w:pPr>
+        <w:pStyle w:val="NormalWeb"/>
+        <w:numPr>
+          <w:ilvl w:val="0"/>
+          <w:numId w:val="79"/>
+        </w:numPr>
+        <w:spacing w:before="0" w:beforeAutospacing="0" w:after="0" w:afterAutospacing="0"/>
+      </w:pPr>
+      <w:r>
+        <w:t>Need further UI standardization before final packaging</w:t>
+      </w:r>
+    </w:p>
+    <w:p>
+      <w:pPr>
+        <w:pStyle w:val="NormalWeb"/>
+        <w:spacing w:before="0" w:beforeAutospacing="0" w:after="0" w:afterAutospacing="0"/>
+      </w:pPr>
+    </w:p>
+    <w:p>
+      <w:pPr>
+        <w:pStyle w:val="NormalWeb"/>
+        <w:spacing w:before="0" w:beforeAutospacing="0" w:after="0" w:afterAutospacing="0"/>
+        <w:rPr>
+          <w:b/>
+        </w:rPr>
+      </w:pPr>
+      <w:r>
+        <w:rPr>
+          <w:b/>
+        </w:rPr>
+        <w:t>Next Steps</w:t>
+      </w:r>
+    </w:p>
+    <w:p>
+      <w:pPr>
+        <w:pStyle w:val="NormalWeb"/>
+        <w:numPr>
+          <w:ilvl w:val="0"/>
+          <w:numId w:val="77"/>
+        </w:numPr>
+        <w:spacing w:before="0" w:beforeAutospacing="0" w:after="0" w:afterAutospacing="0"/>
+      </w:pPr>
+      <w:r>
+        <w:t>Complete ingestion pipeline integration</w:t>
+      </w:r>
+    </w:p>
+    <w:p>
+      <w:pPr>
+        <w:pStyle w:val="NormalWeb"/>
+        <w:numPr>
+          <w:ilvl w:val="0"/>
+          <w:numId w:val="77"/>
+        </w:numPr>
+        <w:spacing w:before="0" w:beforeAutospacing="0" w:after="0" w:afterAutospacing="0"/>
+      </w:pPr>
+      <w:r>
+        <w:t>Begin rule-based engine layer implementation</w:t>
+      </w:r>
+    </w:p>
+    <w:p>
+      <w:pPr>
+        <w:pStyle w:val="NormalWeb"/>
+        <w:numPr>
+          <w:ilvl w:val="0"/>
+          <w:numId w:val="77"/>
+        </w:numPr>
+        <w:spacing w:before="0" w:beforeAutospacing="0" w:after="0" w:afterAutospacing="0"/>
+      </w:pPr>
+      <w:r>
+        <w:t>Continue refining UI components for production stability</w:t>
+      </w:r>
+    </w:p>
+    <w:p>
+      <w:pPr>
+        <w:pStyle w:val="NormalWeb"/>
+        <w:spacing w:before="0" w:beforeAutospacing="0" w:after="0" w:afterAutospacing="0"/>
+      </w:pPr>
+    </w:p>
+    <w:p>
+      <w:pPr>
+        <w:pStyle w:val="NormalWeb"/>
+        <w:spacing w:before="0" w:beforeAutospacing="0" w:after="0" w:afterAutospacing="0"/>
+      </w:pPr>
+    </w:p>
+    <w:p>
+      <w:pPr>
+        <w:pStyle w:val="NormalWeb"/>
+        <w:spacing w:before="0" w:beforeAutospacing="0" w:after="0" w:afterAutospacing="0"/>
+      </w:pPr>
+    </w:p>
+    <w:p>
+      <w:pPr>
+        <w:pStyle w:val="NormalWeb"/>
+        <w:spacing w:before="0" w:beforeAutospacing="0" w:after="0" w:afterAutospacing="0"/>
+      </w:pPr>
+    </w:p>
+    <w:p>
+      <w:pPr>
+        <w:pStyle w:val="NormalWeb"/>
+        <w:spacing w:before="0" w:beforeAutospacing="0" w:after="0" w:afterAutospacing="0"/>
+      </w:pPr>
+    </w:p>
+    <w:p>
+      <w:pPr>
+        <w:pStyle w:val="NormalWeb"/>
+        <w:spacing w:before="0" w:beforeAutospacing="0" w:after="0" w:afterAutospacing="0"/>
+      </w:pPr>
+    </w:p>
+    <w:p>
+      <w:pPr>
+        <w:pStyle w:val="NormalWeb"/>
+        <w:spacing w:before="0" w:beforeAutospacing="0" w:after="0" w:afterAutospacing="0"/>
+      </w:pPr>
+    </w:p>
+    <w:p>
+      <w:pPr>
+        <w:spacing w:after="0" w:line="240" w:lineRule="auto"/>
+        <w:outlineLvl w:val="1"/>
+        <w:rPr>
+          <w:rFonts w:ascii="Times New Roman" w:eastAsia="Times New Roman" w:hAnsi="Times New Roman" w:cs="Times New Roman"/>
+          <w:b/>
+          <w:sz w:val="24"/>
+          <w:szCs w:val="24"/>
+        </w:rPr>
+      </w:pPr>
+      <w:r>
+        <w:rPr>
+          <w:rFonts w:ascii="Times New Roman" w:eastAsia="Times New Roman" w:hAnsi="Times New Roman" w:cs="Times New Roman"/>
+          <w:b/>
+          <w:bCs/>
+          <w:sz w:val="24"/>
+          <w:szCs w:val="24"/>
+        </w:rPr>
+        <w:lastRenderedPageBreak/>
+        <w:t>Date:</w:t>
+      </w:r>
+      <w:r>
+        <w:rPr>
+          <w:rFonts w:ascii="Times New Roman" w:eastAsia="Times New Roman" w:hAnsi="Times New Roman" w:cs="Times New Roman"/>
+          <w:b/>
+          <w:sz w:val="24"/>
+          <w:szCs w:val="24"/>
+        </w:rPr>
+        <w:t xml:space="preserve"> 14</w:t>
+      </w:r>
+      <w:r>
+        <w:rPr>
+          <w:rFonts w:ascii="Times New Roman" w:eastAsia="Times New Roman" w:hAnsi="Times New Roman" w:cs="Times New Roman"/>
+          <w:b/>
+          <w:sz w:val="24"/>
+          <w:szCs w:val="24"/>
+        </w:rPr>
+        <w:t>/02/2026                                                                                                              Day 28</w:t>
+      </w:r>
+      <w:r>
+        <w:rPr>
+          <w:rFonts w:ascii="Times New Roman" w:eastAsia="Times New Roman" w:hAnsi="Times New Roman" w:cs="Times New Roman"/>
+          <w:b/>
+          <w:sz w:val="24"/>
+          <w:szCs w:val="24"/>
+        </w:rPr>
+        <w:br/>
+      </w:r>
+      <w:r>
+        <w:rPr>
+          <w:rFonts w:ascii="Times New Roman" w:eastAsia="Times New Roman" w:hAnsi="Times New Roman" w:cs="Times New Roman"/>
+          <w:b/>
+          <w:bCs/>
+          <w:sz w:val="24"/>
+          <w:szCs w:val="24"/>
+        </w:rPr>
+        <w:t>Department:</w:t>
+      </w:r>
+      <w:r>
+        <w:rPr>
+          <w:rFonts w:ascii="Times New Roman" w:eastAsia="Times New Roman" w:hAnsi="Times New Roman" w:cs="Times New Roman"/>
+          <w:b/>
+          <w:sz w:val="24"/>
+          <w:szCs w:val="24"/>
+        </w:rPr>
+        <w:t xml:space="preserve"> Maintenance</w:t>
+      </w:r>
+      <w:r>
+        <w:rPr>
+          <w:rFonts w:ascii="Times New Roman" w:eastAsia="Times New Roman" w:hAnsi="Times New Roman" w:cs="Times New Roman"/>
+          <w:b/>
+          <w:sz w:val="24"/>
+          <w:szCs w:val="24"/>
+        </w:rPr>
+        <w:br/>
+      </w:r>
+      <w:r>
+        <w:rPr>
+          <w:rFonts w:ascii="Times New Roman" w:eastAsia="Times New Roman" w:hAnsi="Times New Roman" w:cs="Times New Roman"/>
+          <w:b/>
+          <w:bCs/>
+          <w:sz w:val="24"/>
+          <w:szCs w:val="24"/>
+        </w:rPr>
+        <w:t>Plant:</w:t>
+      </w:r>
+      <w:r>
+        <w:rPr>
+          <w:rFonts w:ascii="Times New Roman" w:eastAsia="Times New Roman" w:hAnsi="Times New Roman" w:cs="Times New Roman"/>
+          <w:b/>
+          <w:sz w:val="24"/>
+          <w:szCs w:val="24"/>
+        </w:rPr>
+        <w:t xml:space="preserve"> Drive Shaft Manufacturing</w:t>
+      </w:r>
+    </w:p>
+    <w:p>
+      <w:pPr>
+        <w:spacing w:after="0" w:line="240" w:lineRule="auto"/>
+        <w:outlineLvl w:val="1"/>
+        <w:rPr>
+          <w:rFonts w:ascii="Times New Roman" w:eastAsia="Times New Roman" w:hAnsi="Times New Roman" w:cs="Times New Roman"/>
+          <w:b/>
+          <w:sz w:val="24"/>
+          <w:szCs w:val="24"/>
+        </w:rPr>
+      </w:pPr>
+      <w:r>
+        <w:rPr>
+          <w:rFonts w:ascii="Times New Roman" w:eastAsia="Times New Roman" w:hAnsi="Times New Roman" w:cs="Times New Roman"/>
+          <w:b/>
+          <w:sz w:val="24"/>
+          <w:szCs w:val="24"/>
+        </w:rPr>
+        <w:t>Work from Home</w:t>
+      </w:r>
+    </w:p>
+    <w:p>
+      <w:pPr>
+        <w:spacing w:after="0" w:line="240" w:lineRule="auto"/>
+        <w:outlineLvl w:val="1"/>
+        <w:rPr>
+          <w:rFonts w:ascii="Times New Roman" w:eastAsia="Times New Roman" w:hAnsi="Times New Roman" w:cs="Times New Roman"/>
+          <w:b/>
+          <w:sz w:val="24"/>
+          <w:szCs w:val="24"/>
+        </w:rPr>
+      </w:pPr>
+    </w:p>
+    <w:p>
+      <w:pPr>
+        <w:spacing w:after="0" w:line="240" w:lineRule="auto"/>
+        <w:outlineLvl w:val="1"/>
+        <w:rPr>
+          <w:rFonts w:ascii="Times New Roman" w:eastAsia="Times New Roman" w:hAnsi="Times New Roman" w:cs="Times New Roman"/>
+          <w:b/>
+          <w:sz w:val="24"/>
+          <w:szCs w:val="24"/>
+        </w:rPr>
+      </w:pPr>
+      <w:r>
+        <w:rPr>
+          <w:rFonts w:ascii="Times New Roman" w:eastAsia="Times New Roman" w:hAnsi="Times New Roman" w:cs="Times New Roman"/>
+          <w:b/>
+          <w:sz w:val="24"/>
+          <w:szCs w:val="24"/>
+        </w:rPr>
+        <w:t>Objective for the Day</w:t>
+      </w:r>
+    </w:p>
+    <w:p>
+      <w:pPr>
+        <w:pStyle w:val="ListParagraph"/>
+        <w:numPr>
+          <w:ilvl w:val="0"/>
+          <w:numId w:val="80"/>
+        </w:numPr>
+        <w:spacing w:after="0" w:line="240" w:lineRule="auto"/>
+        <w:outlineLvl w:val="1"/>
+        <w:rPr>
+          <w:rFonts w:ascii="Times New Roman" w:eastAsia="Times New Roman" w:hAnsi="Times New Roman" w:cs="Times New Roman"/>
+          <w:sz w:val="24"/>
+          <w:szCs w:val="24"/>
+        </w:rPr>
+      </w:pPr>
+      <w:r>
+        <w:rPr>
+          <w:rFonts w:ascii="Times New Roman" w:eastAsia="Times New Roman" w:hAnsi="Times New Roman" w:cs="Times New Roman"/>
+          <w:sz w:val="24"/>
+          <w:szCs w:val="24"/>
+        </w:rPr>
+        <w:t>Brainstorm and architect the S</w:t>
+      </w:r>
+      <w:r>
+        <w:rPr>
+          <w:rFonts w:ascii="Times New Roman" w:eastAsia="Times New Roman" w:hAnsi="Times New Roman" w:cs="Times New Roman"/>
+          <w:sz w:val="24"/>
+          <w:szCs w:val="24"/>
+        </w:rPr>
+        <w:t>CAN</w:t>
+      </w:r>
+      <w:r>
+        <w:rPr>
+          <w:rFonts w:ascii="Times New Roman" w:eastAsia="Times New Roman" w:hAnsi="Times New Roman" w:cs="Times New Roman"/>
+          <w:sz w:val="24"/>
+          <w:szCs w:val="24"/>
+        </w:rPr>
+        <w:t>Kar application</w:t>
+      </w:r>
+    </w:p>
+    <w:p>
+      <w:pPr>
+        <w:pStyle w:val="ListParagraph"/>
+        <w:numPr>
+          <w:ilvl w:val="0"/>
+          <w:numId w:val="80"/>
+        </w:numPr>
+        <w:spacing w:after="0" w:line="240" w:lineRule="auto"/>
+        <w:outlineLvl w:val="1"/>
+        <w:rPr>
+          <w:rFonts w:ascii="Times New Roman" w:eastAsia="Times New Roman" w:hAnsi="Times New Roman" w:cs="Times New Roman"/>
+          <w:sz w:val="24"/>
+          <w:szCs w:val="24"/>
+        </w:rPr>
+      </w:pPr>
+      <w:r>
+        <w:rPr>
+          <w:rFonts w:ascii="Times New Roman" w:eastAsia="Times New Roman" w:hAnsi="Times New Roman" w:cs="Times New Roman"/>
+          <w:sz w:val="24"/>
+          <w:szCs w:val="24"/>
+        </w:rPr>
+        <w:t>Define application workflow, page structure, and storage logic</w:t>
+      </w:r>
+    </w:p>
+    <w:p>
+      <w:pPr>
+        <w:spacing w:after="0" w:line="240" w:lineRule="auto"/>
+        <w:outlineLvl w:val="1"/>
+        <w:rPr>
+          <w:rFonts w:ascii="Times New Roman" w:eastAsia="Times New Roman" w:hAnsi="Times New Roman" w:cs="Times New Roman"/>
+          <w:b/>
+          <w:sz w:val="24"/>
+          <w:szCs w:val="24"/>
+        </w:rPr>
+      </w:pPr>
+    </w:p>
+    <w:p>
+      <w:pPr>
+        <w:spacing w:after="0" w:line="240" w:lineRule="auto"/>
+        <w:outlineLvl w:val="1"/>
+        <w:rPr>
+          <w:rFonts w:ascii="Times New Roman" w:eastAsia="Times New Roman" w:hAnsi="Times New Roman" w:cs="Times New Roman"/>
+          <w:b/>
+          <w:sz w:val="24"/>
+          <w:szCs w:val="24"/>
+        </w:rPr>
+      </w:pPr>
+      <w:r>
+        <w:rPr>
+          <w:rFonts w:ascii="Times New Roman" w:eastAsia="Times New Roman" w:hAnsi="Times New Roman" w:cs="Times New Roman"/>
+          <w:b/>
+          <w:sz w:val="24"/>
+          <w:szCs w:val="24"/>
+        </w:rPr>
+        <w:t>Activities Performed</w:t>
+      </w:r>
+    </w:p>
+    <w:p>
+      <w:pPr>
+        <w:pStyle w:val="ListParagraph"/>
+        <w:numPr>
+          <w:ilvl w:val="0"/>
+          <w:numId w:val="81"/>
+        </w:numPr>
+        <w:spacing w:after="0" w:line="240" w:lineRule="auto"/>
+        <w:outlineLvl w:val="1"/>
+        <w:rPr>
+          <w:rFonts w:ascii="Times New Roman" w:eastAsia="Times New Roman" w:hAnsi="Times New Roman" w:cs="Times New Roman"/>
+          <w:sz w:val="24"/>
+          <w:szCs w:val="24"/>
+        </w:rPr>
+      </w:pPr>
+      <w:r>
+        <w:rPr>
+          <w:rFonts w:ascii="Times New Roman" w:eastAsia="Times New Roman" w:hAnsi="Times New Roman" w:cs="Times New Roman"/>
+          <w:sz w:val="24"/>
+          <w:szCs w:val="24"/>
+        </w:rPr>
+        <w:t>Designed conc</w:t>
+      </w:r>
+      <w:r>
+        <w:rPr>
+          <w:rFonts w:ascii="Times New Roman" w:eastAsia="Times New Roman" w:hAnsi="Times New Roman" w:cs="Times New Roman"/>
+          <w:sz w:val="24"/>
+          <w:szCs w:val="24"/>
+        </w:rPr>
+        <w:t>eptual architecture for the SCAN</w:t>
+      </w:r>
+      <w:r>
+        <w:rPr>
+          <w:rFonts w:ascii="Times New Roman" w:eastAsia="Times New Roman" w:hAnsi="Times New Roman" w:cs="Times New Roman"/>
+          <w:sz w:val="24"/>
+          <w:szCs w:val="24"/>
+        </w:rPr>
+        <w:t>Kar mobile application</w:t>
+      </w:r>
+    </w:p>
+    <w:p>
+      <w:pPr>
+        <w:pStyle w:val="ListParagraph"/>
+        <w:numPr>
+          <w:ilvl w:val="0"/>
+          <w:numId w:val="81"/>
+        </w:numPr>
+        <w:spacing w:after="0" w:line="240" w:lineRule="auto"/>
+        <w:outlineLvl w:val="1"/>
+        <w:rPr>
+          <w:rFonts w:ascii="Times New Roman" w:eastAsia="Times New Roman" w:hAnsi="Times New Roman" w:cs="Times New Roman"/>
+          <w:sz w:val="24"/>
+          <w:szCs w:val="24"/>
+        </w:rPr>
+      </w:pPr>
+      <w:r>
+        <w:rPr>
+          <w:rFonts w:ascii="Times New Roman" w:eastAsia="Times New Roman" w:hAnsi="Times New Roman" w:cs="Times New Roman"/>
+          <w:sz w:val="24"/>
+          <w:szCs w:val="24"/>
+        </w:rPr>
+        <w:t>Defined major pages and their interconnectivity</w:t>
+      </w:r>
+    </w:p>
+    <w:p>
+      <w:pPr>
+        <w:pStyle w:val="ListParagraph"/>
+        <w:numPr>
+          <w:ilvl w:val="0"/>
+          <w:numId w:val="81"/>
+        </w:numPr>
+        <w:spacing w:after="0" w:line="240" w:lineRule="auto"/>
+        <w:outlineLvl w:val="1"/>
+        <w:rPr>
+          <w:rFonts w:ascii="Times New Roman" w:eastAsia="Times New Roman" w:hAnsi="Times New Roman" w:cs="Times New Roman"/>
+          <w:sz w:val="24"/>
+          <w:szCs w:val="24"/>
+        </w:rPr>
+      </w:pPr>
+      <w:r>
+        <w:rPr>
+          <w:rFonts w:ascii="Times New Roman" w:eastAsia="Times New Roman" w:hAnsi="Times New Roman" w:cs="Times New Roman"/>
+          <w:sz w:val="24"/>
+          <w:szCs w:val="24"/>
+        </w:rPr>
+        <w:t>Planned user flow from:</w:t>
+      </w:r>
+    </w:p>
+    <w:p>
+      <w:pPr>
+        <w:spacing w:after="0" w:line="240" w:lineRule="auto"/>
+        <w:ind w:left="1440"/>
+        <w:outlineLvl w:val="1"/>
+        <w:rPr>
+          <w:rFonts w:ascii="Times New Roman" w:eastAsia="Times New Roman" w:hAnsi="Times New Roman" w:cs="Times New Roman"/>
+          <w:b/>
+          <w:sz w:val="24"/>
+          <w:szCs w:val="24"/>
+        </w:rPr>
+      </w:pPr>
+      <w:r>
+        <w:rPr>
+          <w:rFonts w:ascii="Times New Roman" w:eastAsia="Times New Roman" w:hAnsi="Times New Roman" w:cs="Times New Roman"/>
+          <w:b/>
+          <w:sz w:val="24"/>
+          <w:szCs w:val="24"/>
+        </w:rPr>
+        <w:t>Document scanning</w:t>
+      </w:r>
+    </w:p>
+    <w:p>
+      <w:pPr>
+        <w:spacing w:after="0" w:line="240" w:lineRule="auto"/>
+        <w:ind w:left="1440"/>
+        <w:outlineLvl w:val="1"/>
+        <w:rPr>
+          <w:rFonts w:ascii="Times New Roman" w:eastAsia="Times New Roman" w:hAnsi="Times New Roman" w:cs="Times New Roman"/>
+          <w:b/>
+          <w:sz w:val="24"/>
+          <w:szCs w:val="24"/>
+        </w:rPr>
+      </w:pPr>
+      <w:r>
+        <w:rPr>
+          <w:rFonts w:ascii="Times New Roman" w:eastAsia="Times New Roman" w:hAnsi="Times New Roman" w:cs="Times New Roman"/>
+          <w:b/>
+          <w:sz w:val="24"/>
+          <w:szCs w:val="24"/>
+        </w:rPr>
+        <w:t>Data extraction</w:t>
+      </w:r>
+    </w:p>
+    <w:p>
+      <w:pPr>
+        <w:spacing w:after="0" w:line="240" w:lineRule="auto"/>
+        <w:ind w:left="1440"/>
+        <w:outlineLvl w:val="1"/>
+        <w:rPr>
+          <w:rFonts w:ascii="Times New Roman" w:eastAsia="Times New Roman" w:hAnsi="Times New Roman" w:cs="Times New Roman"/>
+          <w:b/>
+          <w:sz w:val="24"/>
+          <w:szCs w:val="24"/>
+        </w:rPr>
+      </w:pPr>
+      <w:r>
+        <w:rPr>
+          <w:rFonts w:ascii="Times New Roman" w:eastAsia="Times New Roman" w:hAnsi="Times New Roman" w:cs="Times New Roman"/>
+          <w:b/>
+          <w:sz w:val="24"/>
+          <w:szCs w:val="24"/>
+        </w:rPr>
+        <w:t>Verification</w:t>
+      </w:r>
+    </w:p>
+    <w:p>
+      <w:pPr>
+        <w:spacing w:after="0" w:line="240" w:lineRule="auto"/>
+        <w:ind w:left="1440"/>
+        <w:outlineLvl w:val="1"/>
+        <w:rPr>
+          <w:rFonts w:ascii="Times New Roman" w:eastAsia="Times New Roman" w:hAnsi="Times New Roman" w:cs="Times New Roman"/>
+          <w:b/>
+          <w:sz w:val="24"/>
+          <w:szCs w:val="24"/>
+        </w:rPr>
+      </w:pPr>
+      <w:r>
+        <w:rPr>
+          <w:rFonts w:ascii="Times New Roman" w:eastAsia="Times New Roman" w:hAnsi="Times New Roman" w:cs="Times New Roman"/>
+          <w:b/>
+          <w:sz w:val="24"/>
+          <w:szCs w:val="24"/>
+        </w:rPr>
+        <w:t>Storage</w:t>
+      </w:r>
+    </w:p>
+    <w:p>
+      <w:pPr>
+        <w:spacing w:after="0" w:line="240" w:lineRule="auto"/>
+        <w:ind w:left="1440"/>
+        <w:outlineLvl w:val="1"/>
+        <w:rPr>
+          <w:rFonts w:ascii="Times New Roman" w:eastAsia="Times New Roman" w:hAnsi="Times New Roman" w:cs="Times New Roman"/>
+          <w:sz w:val="24"/>
+          <w:szCs w:val="24"/>
+        </w:rPr>
+      </w:pPr>
+      <w:r>
+        <w:rPr>
+          <w:rFonts w:ascii="Times New Roman" w:eastAsia="Times New Roman" w:hAnsi="Times New Roman" w:cs="Times New Roman"/>
+          <w:b/>
+          <w:sz w:val="24"/>
+          <w:szCs w:val="24"/>
+        </w:rPr>
+        <w:t>Export</w:t>
+      </w:r>
+    </w:p>
+    <w:p>
+      <w:pPr>
+        <w:pStyle w:val="ListParagraph"/>
+        <w:numPr>
+          <w:ilvl w:val="0"/>
+          <w:numId w:val="82"/>
+        </w:numPr>
+        <w:spacing w:after="0" w:line="240" w:lineRule="auto"/>
+        <w:outlineLvl w:val="1"/>
+        <w:rPr>
+          <w:rFonts w:ascii="Times New Roman" w:eastAsia="Times New Roman" w:hAnsi="Times New Roman" w:cs="Times New Roman"/>
+          <w:sz w:val="24"/>
+          <w:szCs w:val="24"/>
+        </w:rPr>
+      </w:pPr>
+      <w:r>
+        <w:rPr>
+          <w:rFonts w:ascii="Times New Roman" w:eastAsia="Times New Roman" w:hAnsi="Times New Roman" w:cs="Times New Roman"/>
+          <w:sz w:val="24"/>
+          <w:szCs w:val="24"/>
+        </w:rPr>
+        <w:t>Outlined storage strategy and offline handling mechanisms</w:t>
+      </w:r>
+    </w:p>
+    <w:p>
+      <w:pPr>
+        <w:pStyle w:val="ListParagraph"/>
+        <w:numPr>
+          <w:ilvl w:val="0"/>
+          <w:numId w:val="82"/>
+        </w:numPr>
+        <w:spacing w:after="0" w:line="240" w:lineRule="auto"/>
+        <w:outlineLvl w:val="1"/>
+        <w:rPr>
+          <w:rFonts w:ascii="Times New Roman" w:eastAsia="Times New Roman" w:hAnsi="Times New Roman" w:cs="Times New Roman"/>
+          <w:sz w:val="24"/>
+          <w:szCs w:val="24"/>
+        </w:rPr>
+      </w:pPr>
+      <w:r>
+        <w:rPr>
+          <w:rFonts w:ascii="Times New Roman" w:eastAsia="Times New Roman" w:hAnsi="Times New Roman" w:cs="Times New Roman"/>
+          <w:sz w:val="24"/>
+          <w:szCs w:val="24"/>
+        </w:rPr>
+        <w:t>Planned logical separation between:</w:t>
+      </w:r>
+    </w:p>
+    <w:p>
+      <w:pPr>
+        <w:spacing w:after="0" w:line="240" w:lineRule="auto"/>
+        <w:ind w:left="1440"/>
+        <w:outlineLvl w:val="1"/>
+        <w:rPr>
+          <w:rFonts w:ascii="Times New Roman" w:eastAsia="Times New Roman" w:hAnsi="Times New Roman" w:cs="Times New Roman"/>
+          <w:b/>
+          <w:sz w:val="24"/>
+          <w:szCs w:val="24"/>
+        </w:rPr>
+      </w:pPr>
+      <w:r>
+        <w:rPr>
+          <w:rFonts w:ascii="Times New Roman" w:eastAsia="Times New Roman" w:hAnsi="Times New Roman" w:cs="Times New Roman"/>
+          <w:b/>
+          <w:sz w:val="24"/>
+          <w:szCs w:val="24"/>
+        </w:rPr>
+        <w:t>UI layer</w:t>
+      </w:r>
+    </w:p>
+    <w:p>
+      <w:pPr>
+        <w:spacing w:after="0" w:line="240" w:lineRule="auto"/>
+        <w:ind w:left="1440"/>
+        <w:outlineLvl w:val="1"/>
+        <w:rPr>
+          <w:rFonts w:ascii="Times New Roman" w:eastAsia="Times New Roman" w:hAnsi="Times New Roman" w:cs="Times New Roman"/>
+          <w:b/>
+          <w:sz w:val="24"/>
+          <w:szCs w:val="24"/>
+        </w:rPr>
+      </w:pPr>
+      <w:r>
+        <w:rPr>
+          <w:rFonts w:ascii="Times New Roman" w:eastAsia="Times New Roman" w:hAnsi="Times New Roman" w:cs="Times New Roman"/>
+          <w:b/>
+          <w:sz w:val="24"/>
+          <w:szCs w:val="24"/>
+        </w:rPr>
+        <w:t>Processing layer</w:t>
+      </w:r>
+    </w:p>
+    <w:p>
+      <w:pPr>
+        <w:spacing w:after="0" w:line="240" w:lineRule="auto"/>
+        <w:ind w:left="1440"/>
+        <w:outlineLvl w:val="1"/>
+        <w:rPr>
+          <w:rFonts w:ascii="Times New Roman" w:eastAsia="Times New Roman" w:hAnsi="Times New Roman" w:cs="Times New Roman"/>
+          <w:sz w:val="24"/>
+          <w:szCs w:val="24"/>
+        </w:rPr>
+      </w:pPr>
+      <w:r>
+        <w:rPr>
+          <w:rFonts w:ascii="Times New Roman" w:eastAsia="Times New Roman" w:hAnsi="Times New Roman" w:cs="Times New Roman"/>
+          <w:b/>
+          <w:sz w:val="24"/>
+          <w:szCs w:val="24"/>
+        </w:rPr>
+        <w:t>Storage layer</w:t>
+      </w:r>
+    </w:p>
+    <w:p>
+      <w:pPr>
+        <w:pStyle w:val="ListParagraph"/>
+        <w:numPr>
+          <w:ilvl w:val="0"/>
+          <w:numId w:val="83"/>
+        </w:numPr>
+        <w:spacing w:after="0" w:line="240" w:lineRule="auto"/>
+        <w:outlineLvl w:val="1"/>
+        <w:rPr>
+          <w:rFonts w:ascii="Times New Roman" w:eastAsia="Times New Roman" w:hAnsi="Times New Roman" w:cs="Times New Roman"/>
+          <w:sz w:val="24"/>
+          <w:szCs w:val="24"/>
+        </w:rPr>
+      </w:pPr>
+      <w:r>
+        <w:rPr>
+          <w:rFonts w:ascii="Times New Roman" w:eastAsia="Times New Roman" w:hAnsi="Times New Roman" w:cs="Times New Roman"/>
+          <w:sz w:val="24"/>
+          <w:szCs w:val="24"/>
+        </w:rPr>
+        <w:t>Documented operational workflow for efficient app behavior</w:t>
+      </w:r>
+    </w:p>
+    <w:p>
+      <w:pPr>
+        <w:spacing w:after="0" w:line="240" w:lineRule="auto"/>
+        <w:outlineLvl w:val="1"/>
+        <w:rPr>
+          <w:rFonts w:ascii="Times New Roman" w:eastAsia="Times New Roman" w:hAnsi="Times New Roman" w:cs="Times New Roman"/>
+          <w:b/>
+          <w:sz w:val="24"/>
+          <w:szCs w:val="24"/>
+        </w:rPr>
+      </w:pPr>
+    </w:p>
+    <w:p>
+      <w:pPr>
+        <w:spacing w:after="0" w:line="240" w:lineRule="auto"/>
+        <w:outlineLvl w:val="1"/>
+        <w:rPr>
+          <w:rFonts w:ascii="Times New Roman" w:eastAsia="Times New Roman" w:hAnsi="Times New Roman" w:cs="Times New Roman"/>
+          <w:b/>
+          <w:sz w:val="24"/>
+          <w:szCs w:val="24"/>
+        </w:rPr>
+      </w:pPr>
+      <w:r>
+        <w:rPr>
+          <w:rFonts w:ascii="Times New Roman" w:eastAsia="Times New Roman" w:hAnsi="Times New Roman" w:cs="Times New Roman"/>
+          <w:b/>
+          <w:sz w:val="24"/>
+          <w:szCs w:val="24"/>
+        </w:rPr>
+        <w:t>Key Learnings</w:t>
+      </w:r>
+    </w:p>
+    <w:p>
+      <w:pPr>
+        <w:pStyle w:val="ListParagraph"/>
+        <w:numPr>
+          <w:ilvl w:val="0"/>
+          <w:numId w:val="83"/>
+        </w:numPr>
+        <w:spacing w:after="0" w:line="240" w:lineRule="auto"/>
+        <w:outlineLvl w:val="1"/>
+        <w:rPr>
+          <w:rFonts w:ascii="Times New Roman" w:eastAsia="Times New Roman" w:hAnsi="Times New Roman" w:cs="Times New Roman"/>
+          <w:sz w:val="24"/>
+          <w:szCs w:val="24"/>
+        </w:rPr>
+      </w:pPr>
+      <w:r>
+        <w:rPr>
+          <w:rFonts w:ascii="Times New Roman" w:eastAsia="Times New Roman" w:hAnsi="Times New Roman" w:cs="Times New Roman"/>
+          <w:sz w:val="24"/>
+          <w:szCs w:val="24"/>
+        </w:rPr>
+        <w:t>Application flow clarity is critical before development begins</w:t>
+      </w:r>
+    </w:p>
+    <w:p>
+      <w:pPr>
+        <w:pStyle w:val="ListParagraph"/>
+        <w:numPr>
+          <w:ilvl w:val="0"/>
+          <w:numId w:val="83"/>
+        </w:numPr>
+        <w:spacing w:after="0" w:line="240" w:lineRule="auto"/>
+        <w:outlineLvl w:val="1"/>
+        <w:rPr>
+          <w:rFonts w:ascii="Times New Roman" w:eastAsia="Times New Roman" w:hAnsi="Times New Roman" w:cs="Times New Roman"/>
+          <w:sz w:val="24"/>
+          <w:szCs w:val="24"/>
+        </w:rPr>
+      </w:pPr>
+      <w:r>
+        <w:rPr>
+          <w:rFonts w:ascii="Times New Roman" w:eastAsia="Times New Roman" w:hAnsi="Times New Roman" w:cs="Times New Roman"/>
+          <w:sz w:val="24"/>
+          <w:szCs w:val="24"/>
+        </w:rPr>
+        <w:t>Page interconnectivity must be defined early to avoid rework</w:t>
+      </w:r>
+    </w:p>
+    <w:p>
+      <w:pPr>
+        <w:pStyle w:val="ListParagraph"/>
+        <w:numPr>
+          <w:ilvl w:val="0"/>
+          <w:numId w:val="83"/>
+        </w:numPr>
+        <w:spacing w:after="0" w:line="240" w:lineRule="auto"/>
+        <w:outlineLvl w:val="1"/>
+        <w:rPr>
+          <w:rFonts w:ascii="Times New Roman" w:eastAsia="Times New Roman" w:hAnsi="Times New Roman" w:cs="Times New Roman"/>
+          <w:sz w:val="24"/>
+          <w:szCs w:val="24"/>
+        </w:rPr>
+      </w:pPr>
+      <w:r>
+        <w:rPr>
+          <w:rFonts w:ascii="Times New Roman" w:eastAsia="Times New Roman" w:hAnsi="Times New Roman" w:cs="Times New Roman"/>
+          <w:sz w:val="24"/>
+          <w:szCs w:val="24"/>
+        </w:rPr>
+        <w:t>Offline-first storage planning improves scalability and robustness</w:t>
+      </w:r>
+    </w:p>
+    <w:p>
+      <w:pPr>
+        <w:spacing w:after="0" w:line="240" w:lineRule="auto"/>
+        <w:outlineLvl w:val="1"/>
+        <w:rPr>
+          <w:rFonts w:ascii="Times New Roman" w:eastAsia="Times New Roman" w:hAnsi="Times New Roman" w:cs="Times New Roman"/>
+          <w:b/>
+          <w:sz w:val="24"/>
+          <w:szCs w:val="24"/>
+        </w:rPr>
+      </w:pPr>
+    </w:p>
+    <w:p>
+      <w:pPr>
+        <w:spacing w:after="0" w:line="240" w:lineRule="auto"/>
+        <w:outlineLvl w:val="1"/>
+        <w:rPr>
+          <w:rFonts w:ascii="Times New Roman" w:eastAsia="Times New Roman" w:hAnsi="Times New Roman" w:cs="Times New Roman"/>
+          <w:b/>
+          <w:sz w:val="24"/>
+          <w:szCs w:val="24"/>
+        </w:rPr>
+      </w:pPr>
+      <w:r>
+        <w:rPr>
+          <w:rFonts w:ascii="Times New Roman" w:eastAsia="Times New Roman" w:hAnsi="Times New Roman" w:cs="Times New Roman"/>
+          <w:b/>
+          <w:sz w:val="24"/>
+          <w:szCs w:val="24"/>
+        </w:rPr>
+        <w:t>Challenges / Open Points</w:t>
+      </w:r>
+    </w:p>
+    <w:p>
+      <w:pPr>
+        <w:pStyle w:val="ListParagraph"/>
+        <w:numPr>
+          <w:ilvl w:val="0"/>
+          <w:numId w:val="84"/>
+        </w:numPr>
+        <w:spacing w:after="0" w:line="240" w:lineRule="auto"/>
+        <w:outlineLvl w:val="1"/>
+        <w:rPr>
+          <w:rFonts w:ascii="Times New Roman" w:eastAsia="Times New Roman" w:hAnsi="Times New Roman" w:cs="Times New Roman"/>
+          <w:sz w:val="24"/>
+          <w:szCs w:val="24"/>
+        </w:rPr>
+      </w:pPr>
+      <w:r>
+        <w:rPr>
+          <w:rFonts w:ascii="Times New Roman" w:eastAsia="Times New Roman" w:hAnsi="Times New Roman" w:cs="Times New Roman"/>
+          <w:sz w:val="24"/>
+          <w:szCs w:val="24"/>
+        </w:rPr>
+        <w:t>Processing engine logic for ScanKar yet to be implemented</w:t>
+      </w:r>
+    </w:p>
+    <w:p>
+      <w:pPr>
+        <w:pStyle w:val="ListParagraph"/>
+        <w:numPr>
+          <w:ilvl w:val="0"/>
+          <w:numId w:val="84"/>
+        </w:numPr>
+        <w:spacing w:after="0" w:line="240" w:lineRule="auto"/>
+        <w:outlineLvl w:val="1"/>
+        <w:rPr>
+          <w:rFonts w:ascii="Times New Roman" w:eastAsia="Times New Roman" w:hAnsi="Times New Roman" w:cs="Times New Roman"/>
+          <w:sz w:val="24"/>
+          <w:szCs w:val="24"/>
+        </w:rPr>
+      </w:pPr>
+      <w:r>
+        <w:rPr>
+          <w:rFonts w:ascii="Times New Roman" w:eastAsia="Times New Roman" w:hAnsi="Times New Roman" w:cs="Times New Roman"/>
+          <w:sz w:val="24"/>
+          <w:szCs w:val="24"/>
+        </w:rPr>
+        <w:t>Database schema design for ScanKar pending</w:t>
+      </w:r>
+    </w:p>
+    <w:p>
+      <w:pPr>
+        <w:pStyle w:val="ListParagraph"/>
+        <w:numPr>
+          <w:ilvl w:val="0"/>
+          <w:numId w:val="84"/>
+        </w:numPr>
+        <w:spacing w:after="0" w:line="240" w:lineRule="auto"/>
+        <w:outlineLvl w:val="1"/>
+        <w:rPr>
+          <w:rFonts w:ascii="Times New Roman" w:eastAsia="Times New Roman" w:hAnsi="Times New Roman" w:cs="Times New Roman"/>
+          <w:sz w:val="24"/>
+          <w:szCs w:val="24"/>
+        </w:rPr>
+      </w:pPr>
+      <w:r>
+        <w:rPr>
+          <w:rFonts w:ascii="Times New Roman" w:eastAsia="Times New Roman" w:hAnsi="Times New Roman" w:cs="Times New Roman"/>
+          <w:sz w:val="24"/>
+          <w:szCs w:val="24"/>
+        </w:rPr>
+        <w:t>Integration strategy between ScanKar and Industrial Data System to be evaluated</w:t>
+      </w:r>
+    </w:p>
+    <w:p>
+      <w:pPr>
+        <w:spacing w:after="0" w:line="240" w:lineRule="auto"/>
+        <w:outlineLvl w:val="1"/>
+        <w:rPr>
+          <w:rFonts w:ascii="Times New Roman" w:eastAsia="Times New Roman" w:hAnsi="Times New Roman" w:cs="Times New Roman"/>
+          <w:b/>
+          <w:sz w:val="24"/>
+          <w:szCs w:val="24"/>
+        </w:rPr>
+      </w:pPr>
+    </w:p>
+    <w:p>
+      <w:pPr>
+        <w:spacing w:after="0" w:line="240" w:lineRule="auto"/>
+        <w:outlineLvl w:val="1"/>
+        <w:rPr>
+          <w:rFonts w:ascii="Times New Roman" w:eastAsia="Times New Roman" w:hAnsi="Times New Roman" w:cs="Times New Roman"/>
+          <w:b/>
+          <w:sz w:val="24"/>
+          <w:szCs w:val="24"/>
+        </w:rPr>
+      </w:pPr>
+      <w:r>
+        <w:rPr>
+          <w:rFonts w:ascii="Times New Roman" w:eastAsia="Times New Roman" w:hAnsi="Times New Roman" w:cs="Times New Roman"/>
+          <w:b/>
+          <w:sz w:val="24"/>
+          <w:szCs w:val="24"/>
+        </w:rPr>
+        <w:t>Next Steps</w:t>
+      </w:r>
+    </w:p>
+    <w:p>
+      <w:pPr>
+        <w:pStyle w:val="ListParagraph"/>
+        <w:numPr>
+          <w:ilvl w:val="0"/>
+          <w:numId w:val="85"/>
+        </w:numPr>
+        <w:spacing w:after="0" w:line="240" w:lineRule="auto"/>
+        <w:outlineLvl w:val="1"/>
+        <w:rPr>
+          <w:rFonts w:ascii="Times New Roman" w:eastAsia="Times New Roman" w:hAnsi="Times New Roman" w:cs="Times New Roman"/>
+          <w:sz w:val="24"/>
+          <w:szCs w:val="24"/>
+        </w:rPr>
+      </w:pPr>
+      <w:r>
+        <w:rPr>
+          <w:rFonts w:ascii="Times New Roman" w:eastAsia="Times New Roman" w:hAnsi="Times New Roman" w:cs="Times New Roman"/>
+          <w:sz w:val="24"/>
+          <w:szCs w:val="24"/>
+        </w:rPr>
+        <w:t>Finalize ingestion automation in Industrial Data Intelligence System</w:t>
+      </w:r>
+    </w:p>
+    <w:p>
+      <w:pPr>
+        <w:pStyle w:val="ListParagraph"/>
+        <w:numPr>
+          <w:ilvl w:val="0"/>
+          <w:numId w:val="85"/>
+        </w:numPr>
+        <w:spacing w:after="0" w:line="240" w:lineRule="auto"/>
+        <w:outlineLvl w:val="1"/>
+        <w:rPr>
+          <w:rFonts w:ascii="Times New Roman" w:eastAsia="Times New Roman" w:hAnsi="Times New Roman" w:cs="Times New Roman"/>
+          <w:sz w:val="24"/>
+          <w:szCs w:val="24"/>
+        </w:rPr>
+      </w:pPr>
+      <w:r>
+        <w:rPr>
+          <w:rFonts w:ascii="Times New Roman" w:eastAsia="Times New Roman" w:hAnsi="Times New Roman" w:cs="Times New Roman"/>
+          <w:sz w:val="24"/>
+          <w:szCs w:val="24"/>
+        </w:rPr>
+        <w:t>Begin implementing rule-based insight engine</w:t>
+      </w:r>
+    </w:p>
+    <w:p>
+      <w:pPr>
+        <w:pStyle w:val="ListParagraph"/>
+        <w:numPr>
+          <w:ilvl w:val="0"/>
+          <w:numId w:val="85"/>
+        </w:numPr>
+        <w:spacing w:after="0" w:line="240" w:lineRule="auto"/>
+        <w:outlineLvl w:val="1"/>
+        <w:rPr>
+          <w:rFonts w:ascii="Times New Roman" w:eastAsia="Times New Roman" w:hAnsi="Times New Roman" w:cs="Times New Roman"/>
+          <w:sz w:val="24"/>
+          <w:szCs w:val="24"/>
+        </w:rPr>
+      </w:pPr>
+      <w:r>
+        <w:rPr>
+          <w:rFonts w:ascii="Times New Roman" w:eastAsia="Times New Roman" w:hAnsi="Times New Roman" w:cs="Times New Roman"/>
+          <w:sz w:val="24"/>
+          <w:szCs w:val="24"/>
+        </w:rPr>
+        <w:t>Convert ScanKar architecture into structured development roadmap</w:t>
+      </w:r>
+    </w:p>
+    <w:p>
+      <w:pPr>
+        <w:pStyle w:val="NormalWeb"/>
+        <w:spacing w:before="0" w:beforeAutospacing="0" w:after="0" w:afterAutospacing="0"/>
+      </w:pPr>
+    </w:p>
+    <w:p>
+      <w:pPr>
+        <w:pStyle w:val="NormalWeb"/>
+        <w:spacing w:before="0" w:beforeAutospacing="0" w:after="0" w:afterAutospacing="0"/>
+      </w:pPr>
+    </w:p>
+    <w:p>
+      <w:pPr>
+        <w:pStyle w:val="NormalWeb"/>
+        <w:spacing w:before="0" w:beforeAutospacing="0" w:after="0" w:afterAutospacing="0"/>
+      </w:pPr>
+    </w:p>
+    <w:p>
+      <w:pPr>
+        <w:pStyle w:val="NormalWeb"/>
+        <w:spacing w:before="0" w:beforeAutospacing="0" w:after="0" w:afterAutospacing="0"/>
+      </w:pPr>
+    </w:p>
+    <w:p>
+      <w:pPr>
+        <w:pStyle w:val="NormalWeb"/>
+        <w:spacing w:before="0" w:beforeAutospacing="0" w:after="0" w:afterAutospacing="0"/>
+      </w:pPr>
+    </w:p>
+    <w:p>
+      <w:pPr>
+        <w:pStyle w:val="NormalWeb"/>
+        <w:spacing w:before="0" w:beforeAutospacing="0" w:after="0" w:afterAutospacing="0"/>
+      </w:pPr>
+    </w:p>
+    <w:p>
+      <w:pPr>
+        <w:spacing w:after="0" w:line="240" w:lineRule="auto"/>
+        <w:outlineLvl w:val="1"/>
+        <w:rPr>
+          <w:rFonts w:ascii="Times New Roman" w:eastAsia="Times New Roman" w:hAnsi="Times New Roman" w:cs="Times New Roman"/>
+          <w:b/>
+          <w:sz w:val="24"/>
+          <w:szCs w:val="24"/>
+        </w:rPr>
+      </w:pPr>
+      <w:r>
+        <w:rPr>
+          <w:rFonts w:ascii="Times New Roman" w:eastAsia="Times New Roman" w:hAnsi="Times New Roman" w:cs="Times New Roman"/>
+          <w:b/>
+          <w:bCs/>
+          <w:sz w:val="24"/>
+          <w:szCs w:val="24"/>
+        </w:rPr>
+        <w:lastRenderedPageBreak/>
+        <w:t>Date:</w:t>
+      </w:r>
+      <w:r>
+        <w:rPr>
+          <w:rFonts w:ascii="Times New Roman" w:eastAsia="Times New Roman" w:hAnsi="Times New Roman" w:cs="Times New Roman"/>
+          <w:b/>
+          <w:sz w:val="24"/>
+          <w:szCs w:val="24"/>
+        </w:rPr>
+        <w:t xml:space="preserve"> 16</w:t>
+      </w:r>
+      <w:r>
+        <w:rPr>
+          <w:rFonts w:ascii="Times New Roman" w:eastAsia="Times New Roman" w:hAnsi="Times New Roman" w:cs="Times New Roman"/>
+          <w:b/>
+          <w:sz w:val="24"/>
+          <w:szCs w:val="24"/>
+        </w:rPr>
+        <w:t xml:space="preserve">/02/2026                                                                                    </w:t>
+      </w:r>
+      <w:r>
+        <w:rPr>
+          <w:rFonts w:ascii="Times New Roman" w:eastAsia="Times New Roman" w:hAnsi="Times New Roman" w:cs="Times New Roman"/>
+          <w:b/>
+          <w:sz w:val="24"/>
+          <w:szCs w:val="24"/>
+        </w:rPr>
+        <w:t xml:space="preserve">                          Day 29</w:t>
+      </w:r>
+      <w:r>
+        <w:rPr>
+          <w:rFonts w:ascii="Times New Roman" w:eastAsia="Times New Roman" w:hAnsi="Times New Roman" w:cs="Times New Roman"/>
+          <w:b/>
+          <w:sz w:val="24"/>
+          <w:szCs w:val="24"/>
+        </w:rPr>
+        <w:br/>
+      </w:r>
+      <w:r>
+        <w:rPr>
+          <w:rFonts w:ascii="Times New Roman" w:eastAsia="Times New Roman" w:hAnsi="Times New Roman" w:cs="Times New Roman"/>
+          <w:b/>
+          <w:bCs/>
+          <w:sz w:val="24"/>
+          <w:szCs w:val="24"/>
+        </w:rPr>
+        <w:t>Department:</w:t>
+      </w:r>
+      <w:r>
+        <w:rPr>
+          <w:rFonts w:ascii="Times New Roman" w:eastAsia="Times New Roman" w:hAnsi="Times New Roman" w:cs="Times New Roman"/>
+          <w:b/>
+          <w:sz w:val="24"/>
+          <w:szCs w:val="24"/>
+        </w:rPr>
+        <w:t xml:space="preserve"> Maintenance</w:t>
+      </w:r>
+      <w:r>
+        <w:rPr>
+          <w:rFonts w:ascii="Times New Roman" w:eastAsia="Times New Roman" w:hAnsi="Times New Roman" w:cs="Times New Roman"/>
+          <w:b/>
+          <w:sz w:val="24"/>
+          <w:szCs w:val="24"/>
+        </w:rPr>
+        <w:br/>
+      </w:r>
+      <w:r>
+        <w:rPr>
+          <w:rFonts w:ascii="Times New Roman" w:eastAsia="Times New Roman" w:hAnsi="Times New Roman" w:cs="Times New Roman"/>
+          <w:b/>
+          <w:bCs/>
+          <w:sz w:val="24"/>
+          <w:szCs w:val="24"/>
+        </w:rPr>
+        <w:t>Plant:</w:t>
+      </w:r>
+      <w:r>
+        <w:rPr>
+          <w:rFonts w:ascii="Times New Roman" w:eastAsia="Times New Roman" w:hAnsi="Times New Roman" w:cs="Times New Roman"/>
+          <w:b/>
+          <w:sz w:val="24"/>
+          <w:szCs w:val="24"/>
+        </w:rPr>
+        <w:t xml:space="preserve"> Drive Shaft Manufacturing</w:t>
+      </w:r>
+    </w:p>
+    <w:p>
+      <w:pPr>
+        <w:spacing w:after="0" w:line="240" w:lineRule="auto"/>
+        <w:outlineLvl w:val="1"/>
+        <w:rPr>
+          <w:rFonts w:ascii="Times New Roman" w:eastAsia="Times New Roman" w:hAnsi="Times New Roman" w:cs="Times New Roman"/>
+          <w:b/>
+          <w:sz w:val="24"/>
+          <w:szCs w:val="24"/>
+        </w:rPr>
+      </w:pPr>
+      <w:r>
+        <w:rPr>
+          <w:rFonts w:ascii="Times New Roman" w:eastAsia="Times New Roman" w:hAnsi="Times New Roman" w:cs="Times New Roman"/>
+          <w:b/>
+          <w:sz w:val="24"/>
+          <w:szCs w:val="24"/>
+        </w:rPr>
+        <w:t>Shift: Third Shift</w:t>
+      </w:r>
+    </w:p>
+    <w:p>
+      <w:pPr>
+        <w:pStyle w:val="NormalWeb"/>
+        <w:spacing w:before="0" w:beforeAutospacing="0" w:after="0" w:afterAutospacing="0"/>
+      </w:pPr>
+    </w:p>
+    <w:p>
+      <w:pPr>
+        <w:pStyle w:val="NormalWeb"/>
+        <w:spacing w:before="0" w:beforeAutospacing="0" w:after="0" w:afterAutospacing="0"/>
+      </w:pPr>
+      <w:r>
+        <w:t>Objective for the Day</w:t>
+      </w:r>
+    </w:p>
+    <w:p>
+      <w:pPr>
+        <w:pStyle w:val="NormalWeb"/>
+        <w:spacing w:before="0" w:beforeAutospacing="0" w:after="0" w:afterAutospacing="0"/>
+      </w:pPr>
+      <w:r>
+        <w:t>•</w:t>
+      </w:r>
+      <w:r>
+        <w:tab/>
       </w:r>
       <w:bookmarkStart w:id="0" w:name="_GoBack"/>
       <w:bookmarkEnd w:id="0"/>
+      <w:r>
+        <w:t>Integrate Module 2 (Profiling) into the main ingestion pipeline</w:t>
+      </w:r>
+    </w:p>
+    <w:p>
+      <w:pPr>
+        <w:pStyle w:val="NormalWeb"/>
+        <w:spacing w:before="0" w:beforeAutospacing="0" w:after="0" w:afterAutospacing="0"/>
+      </w:pPr>
+      <w:r>
+        <w:t>•</w:t>
+      </w:r>
+      <w:r>
+        <w:tab/>
+        <w:t>Begin implementation of Module 3 (Rule-Based Engine)</w:t>
+      </w:r>
+    </w:p>
+    <w:p>
+      <w:pPr>
+        <w:pStyle w:val="NormalWeb"/>
+        <w:spacing w:before="0" w:beforeAutospacing="0" w:after="0" w:afterAutospacing="0"/>
+      </w:pPr>
+      <w:r>
+        <w:t>•</w:t>
+      </w:r>
+      <w:r>
+        <w:tab/>
+        <w:t>Advance overall system development towards full analytical automation</w:t>
+      </w:r>
+    </w:p>
+    <w:p>
+      <w:pPr>
+        <w:pStyle w:val="NormalWeb"/>
+        <w:spacing w:before="0" w:beforeAutospacing="0" w:after="0" w:afterAutospacing="0"/>
+      </w:pPr>
+    </w:p>
+    <w:p>
+      <w:pPr>
+        <w:pStyle w:val="NormalWeb"/>
+        <w:spacing w:before="0" w:beforeAutospacing="0" w:after="0" w:afterAutospacing="0"/>
+      </w:pPr>
+      <w:r>
+        <w:t>Activities Performed</w:t>
+      </w:r>
+    </w:p>
+    <w:p>
+      <w:pPr>
+        <w:pStyle w:val="NormalWeb"/>
+        <w:spacing w:before="0" w:beforeAutospacing="0" w:after="0" w:afterAutospacing="0"/>
+      </w:pPr>
+      <w:r>
+        <w:t>•</w:t>
+      </w:r>
+      <w:r>
+        <w:tab/>
+        <w:t xml:space="preserve">Performed daily entries of energy meter readings (kWh and </w:t>
+      </w:r>
+      <w:proofErr w:type="spellStart"/>
+      <w:r>
+        <w:t>kVAh</w:t>
+      </w:r>
+      <w:proofErr w:type="spellEnd"/>
+      <w:r>
+        <w:t>) for both Driveline and SMT buildings</w:t>
+      </w:r>
+    </w:p>
+    <w:p>
+      <w:pPr>
+        <w:pStyle w:val="NormalWeb"/>
+        <w:spacing w:before="0" w:beforeAutospacing="0" w:after="0" w:afterAutospacing="0"/>
+      </w:pPr>
+      <w:r>
+        <w:t>•</w:t>
+      </w:r>
+      <w:r>
+        <w:tab/>
+        <w:t>Updated power cost analysis sheets based on recorded consumption data</w:t>
+      </w:r>
+    </w:p>
+    <w:p>
+      <w:pPr>
+        <w:pStyle w:val="NormalWeb"/>
+        <w:spacing w:before="0" w:beforeAutospacing="0" w:after="0" w:afterAutospacing="0"/>
+      </w:pPr>
+      <w:r>
+        <w:t>•</w:t>
+      </w:r>
+      <w:r>
+        <w:tab/>
+        <w:t>Integrated profiling components (</w:t>
+      </w:r>
+      <w:proofErr w:type="spellStart"/>
+      <w:r>
+        <w:t>ColumnClassifier</w:t>
+      </w:r>
+      <w:proofErr w:type="spellEnd"/>
+      <w:r>
+        <w:t xml:space="preserve">, </w:t>
+      </w:r>
+      <w:proofErr w:type="spellStart"/>
+      <w:r>
+        <w:t>DataProfiler</w:t>
+      </w:r>
+      <w:proofErr w:type="spellEnd"/>
+      <w:r>
+        <w:t xml:space="preserve">, </w:t>
+      </w:r>
+      <w:proofErr w:type="spellStart"/>
+      <w:r>
+        <w:t>HealthReport</w:t>
+      </w:r>
+      <w:proofErr w:type="spellEnd"/>
+      <w:r>
+        <w:t>) into pipeline_runner.py</w:t>
+      </w:r>
+    </w:p>
+    <w:p>
+      <w:pPr>
+        <w:pStyle w:val="NormalWeb"/>
+        <w:spacing w:before="0" w:beforeAutospacing="0" w:after="0" w:afterAutospacing="0"/>
+      </w:pPr>
+      <w:r>
+        <w:t>•</w:t>
+      </w:r>
+      <w:r>
+        <w:tab/>
+        <w:t>Implemented automatic profiling execution after file ingestion</w:t>
+      </w:r>
+    </w:p>
+    <w:p>
+      <w:pPr>
+        <w:pStyle w:val="NormalWeb"/>
+        <w:spacing w:before="0" w:beforeAutospacing="0" w:after="0" w:afterAutospacing="0"/>
+      </w:pPr>
+      <w:r>
+        <w:t>•</w:t>
+      </w:r>
+      <w:r>
+        <w:tab/>
+        <w:t xml:space="preserve">Enabled health score computation and persistence into </w:t>
+      </w:r>
+      <w:proofErr w:type="spellStart"/>
+      <w:r>
+        <w:t>profiling_results</w:t>
+      </w:r>
+      <w:proofErr w:type="spellEnd"/>
+      <w:r>
+        <w:t xml:space="preserve"> table</w:t>
+      </w:r>
+    </w:p>
+    <w:p>
+      <w:pPr>
+        <w:pStyle w:val="NormalWeb"/>
+        <w:spacing w:before="0" w:beforeAutospacing="0" w:after="0" w:afterAutospacing="0"/>
+      </w:pPr>
+      <w:r>
+        <w:t>•</w:t>
+      </w:r>
+      <w:r>
+        <w:tab/>
+        <w:t>Verified complete pipeline execution including ingestion, feature extraction, and profiling</w:t>
+      </w:r>
+    </w:p>
+    <w:p>
+      <w:pPr>
+        <w:pStyle w:val="NormalWeb"/>
+        <w:spacing w:before="0" w:beforeAutospacing="0" w:after="0" w:afterAutospacing="0"/>
+      </w:pPr>
+      <w:r>
+        <w:t>•</w:t>
+      </w:r>
+      <w:r>
+        <w:tab/>
+        <w:t>Fixed logger initialization bug for multi-logger handling</w:t>
+      </w:r>
+    </w:p>
+    <w:p>
+      <w:pPr>
+        <w:pStyle w:val="NormalWeb"/>
+        <w:spacing w:before="0" w:beforeAutospacing="0" w:after="0" w:afterAutospacing="0"/>
+      </w:pPr>
+      <w:r>
+        <w:t>•</w:t>
+      </w:r>
+      <w:r>
+        <w:tab/>
+        <w:t>Began implementation planning and development of Module 3 (Rules Engine)</w:t>
+      </w:r>
+    </w:p>
+    <w:p>
+      <w:pPr>
+        <w:pStyle w:val="NormalWeb"/>
+        <w:spacing w:before="0" w:beforeAutospacing="0" w:after="0" w:afterAutospacing="0"/>
+      </w:pPr>
+      <w:r>
+        <w:t>•</w:t>
+      </w:r>
+      <w:r>
+        <w:tab/>
+        <w:t>Outlined rule engine structure including:</w:t>
+      </w:r>
+    </w:p>
+    <w:p>
+      <w:pPr>
+        <w:pStyle w:val="NormalWeb"/>
+        <w:spacing w:before="0" w:beforeAutospacing="0" w:after="0" w:afterAutospacing="0"/>
+      </w:pPr>
+      <w:r>
+        <w:t>o</w:t>
+      </w:r>
+      <w:r>
+        <w:tab/>
+        <w:t>Base rule framework</w:t>
+      </w:r>
+    </w:p>
+    <w:p>
+      <w:pPr>
+        <w:pStyle w:val="NormalWeb"/>
+        <w:spacing w:before="0" w:beforeAutospacing="0" w:after="0" w:afterAutospacing="0"/>
+      </w:pPr>
+      <w:r>
+        <w:t>o</w:t>
+      </w:r>
+      <w:r>
+        <w:tab/>
+        <w:t>Threshold-based rules</w:t>
+      </w:r>
+    </w:p>
+    <w:p>
+      <w:pPr>
+        <w:pStyle w:val="NormalWeb"/>
+        <w:spacing w:before="0" w:beforeAutospacing="0" w:after="0" w:afterAutospacing="0"/>
+      </w:pPr>
+      <w:r>
+        <w:t>o</w:t>
+      </w:r>
+      <w:r>
+        <w:tab/>
+        <w:t>Maintenance-specific domain rules</w:t>
+      </w:r>
+    </w:p>
+    <w:p>
+      <w:pPr>
+        <w:pStyle w:val="NormalWeb"/>
+        <w:spacing w:before="0" w:beforeAutospacing="0" w:after="0" w:afterAutospacing="0"/>
+      </w:pPr>
+      <w:r>
+        <w:t>o</w:t>
+      </w:r>
+      <w:r>
+        <w:tab/>
+      </w:r>
+      <w:proofErr w:type="spellStart"/>
+      <w:r>
+        <w:t>Explainability</w:t>
+      </w:r>
+      <w:proofErr w:type="spellEnd"/>
+      <w:r>
+        <w:t xml:space="preserve"> layer</w:t>
+      </w:r>
+    </w:p>
+    <w:p>
+      <w:pPr>
+        <w:pStyle w:val="NormalWeb"/>
+        <w:spacing w:before="0" w:beforeAutospacing="0" w:after="0" w:afterAutospacing="0"/>
+      </w:pPr>
+      <w:r>
+        <w:t>•</w:t>
+      </w:r>
+      <w:r>
+        <w:tab/>
+        <w:t>Prepared architecture for ML engine integration (Module 4 strategy)</w:t>
+      </w:r>
+    </w:p>
+    <w:p>
+      <w:pPr>
+        <w:pStyle w:val="NormalWeb"/>
+        <w:spacing w:before="0" w:beforeAutospacing="0" w:after="0" w:afterAutospacing="0"/>
+      </w:pPr>
+      <w:r>
+        <w:t>•</w:t>
+      </w:r>
+      <w:r>
+        <w:tab/>
+        <w:t>Organized build folder structure for production-ready deployment</w:t>
+      </w:r>
+    </w:p>
+    <w:p>
+      <w:pPr>
+        <w:pStyle w:val="NormalWeb"/>
+        <w:spacing w:before="0" w:beforeAutospacing="0" w:after="0" w:afterAutospacing="0"/>
+      </w:pPr>
+    </w:p>
+    <w:p>
+      <w:pPr>
+        <w:pStyle w:val="NormalWeb"/>
+        <w:spacing w:before="0" w:beforeAutospacing="0" w:after="0" w:afterAutospacing="0"/>
+      </w:pPr>
+      <w:r>
+        <w:t>Key Learnings</w:t>
+      </w:r>
+    </w:p>
+    <w:p>
+      <w:pPr>
+        <w:pStyle w:val="NormalWeb"/>
+        <w:spacing w:before="0" w:beforeAutospacing="0" w:after="0" w:afterAutospacing="0"/>
+      </w:pPr>
+      <w:r>
+        <w:t>•</w:t>
+      </w:r>
+      <w:r>
+        <w:tab/>
+        <w:t>Profiling integration significantly enhances data validation and system reliability</w:t>
+      </w:r>
+    </w:p>
+    <w:p>
+      <w:pPr>
+        <w:pStyle w:val="NormalWeb"/>
+        <w:spacing w:before="0" w:beforeAutospacing="0" w:after="0" w:afterAutospacing="0"/>
+      </w:pPr>
+      <w:r>
+        <w:t>•</w:t>
+      </w:r>
+      <w:r>
+        <w:tab/>
+        <w:t>Run lifecycle and profiling must execute sequentially for deterministic results</w:t>
+      </w:r>
+    </w:p>
+    <w:p>
+      <w:pPr>
+        <w:pStyle w:val="NormalWeb"/>
+        <w:spacing w:before="0" w:beforeAutospacing="0" w:after="0" w:afterAutospacing="0"/>
+      </w:pPr>
+      <w:r>
+        <w:t>•</w:t>
+      </w:r>
+      <w:r>
+        <w:tab/>
+        <w:t>Rule-based engines require structured configuration and domain-driven design</w:t>
+      </w:r>
+    </w:p>
+    <w:p>
+      <w:pPr>
+        <w:pStyle w:val="NormalWeb"/>
+        <w:spacing w:before="0" w:beforeAutospacing="0" w:after="0" w:afterAutospacing="0"/>
+      </w:pPr>
+      <w:r>
+        <w:t>•</w:t>
+      </w:r>
+      <w:r>
+        <w:tab/>
+        <w:t>Proper logging and error handling are critical for production-grade backend systems</w:t>
+      </w:r>
+    </w:p>
+    <w:p>
+      <w:pPr>
+        <w:pStyle w:val="NormalWeb"/>
+        <w:spacing w:before="0" w:beforeAutospacing="0" w:after="0" w:afterAutospacing="0"/>
+      </w:pPr>
+      <w:r>
+        <w:t>•</w:t>
+      </w:r>
+      <w:r>
+        <w:tab/>
+        <w:t>System modularization simplifies multi-layer development and future scalability</w:t>
+      </w:r>
+    </w:p>
+    <w:p>
+      <w:pPr>
+        <w:pStyle w:val="NormalWeb"/>
+        <w:spacing w:before="0" w:beforeAutospacing="0" w:after="0" w:afterAutospacing="0"/>
+      </w:pPr>
+    </w:p>
+    <w:p>
+      <w:pPr>
+        <w:pStyle w:val="NormalWeb"/>
+        <w:spacing w:before="0" w:beforeAutospacing="0" w:after="0" w:afterAutospacing="0"/>
+      </w:pPr>
+      <w:r>
+        <w:t>Challenges / Open Points</w:t>
+      </w:r>
+    </w:p>
+    <w:p>
+      <w:pPr>
+        <w:pStyle w:val="NormalWeb"/>
+        <w:spacing w:before="0" w:beforeAutospacing="0" w:after="0" w:afterAutospacing="0"/>
+      </w:pPr>
+      <w:r>
+        <w:t>•</w:t>
+      </w:r>
+      <w:r>
+        <w:tab/>
+        <w:t>Rule-based engine not yet fully wired into orchestration layer</w:t>
+      </w:r>
+    </w:p>
+    <w:p>
+      <w:pPr>
+        <w:pStyle w:val="NormalWeb"/>
+        <w:spacing w:before="0" w:beforeAutospacing="0" w:after="0" w:afterAutospacing="0"/>
+      </w:pPr>
+      <w:r>
+        <w:t>•</w:t>
+      </w:r>
+      <w:r>
+        <w:tab/>
+        <w:t>ML-based anomaly detection not yet integrated into pipeline</w:t>
+      </w:r>
+    </w:p>
+    <w:p>
+      <w:pPr>
+        <w:pStyle w:val="NormalWeb"/>
+        <w:spacing w:before="0" w:beforeAutospacing="0" w:after="0" w:afterAutospacing="0"/>
+      </w:pPr>
+      <w:r>
+        <w:t>•</w:t>
+      </w:r>
+      <w:r>
+        <w:tab/>
+        <w:t>Frontend Insights page requires dynamic IPC integration</w:t>
+      </w:r>
+    </w:p>
+    <w:p>
+      <w:pPr>
+        <w:pStyle w:val="NormalWeb"/>
+        <w:spacing w:before="0" w:beforeAutospacing="0" w:after="0" w:afterAutospacing="0"/>
+      </w:pPr>
+      <w:r>
+        <w:t>•</w:t>
+      </w:r>
+      <w:r>
+        <w:tab/>
+        <w:t>Export engine and dashboard automation pending implementation</w:t>
+      </w:r>
+    </w:p>
+    <w:p>
+      <w:pPr>
+        <w:pStyle w:val="NormalWeb"/>
+        <w:spacing w:before="0" w:beforeAutospacing="0" w:after="0" w:afterAutospacing="0"/>
+      </w:pPr>
+    </w:p>
+    <w:p>
+      <w:pPr>
+        <w:pStyle w:val="NormalWeb"/>
+        <w:spacing w:before="0" w:beforeAutospacing="0" w:after="0" w:afterAutospacing="0"/>
+      </w:pPr>
+      <w:r>
+        <w:t>Next Steps</w:t>
+      </w:r>
+    </w:p>
+    <w:p>
+      <w:pPr>
+        <w:pStyle w:val="NormalWeb"/>
+        <w:spacing w:before="0" w:beforeAutospacing="0" w:after="0" w:afterAutospacing="0"/>
+      </w:pPr>
+      <w:r>
+        <w:t>•</w:t>
+      </w:r>
+      <w:r>
+        <w:tab/>
+        <w:t>Complete full implementation of Module 3 (Rules Engine)</w:t>
+      </w:r>
+    </w:p>
+    <w:p>
+      <w:pPr>
+        <w:pStyle w:val="NormalWeb"/>
+        <w:spacing w:before="0" w:beforeAutospacing="0" w:after="0" w:afterAutospacing="0"/>
+      </w:pPr>
+      <w:r>
+        <w:t>•</w:t>
+      </w:r>
+      <w:r>
+        <w:tab/>
+        <w:t>Implement orchestration layer (Module 5)</w:t>
+      </w:r>
+    </w:p>
+    <w:p>
+      <w:pPr>
+        <w:pStyle w:val="NormalWeb"/>
+        <w:spacing w:before="0" w:beforeAutospacing="0" w:after="0" w:afterAutospacing="0"/>
+      </w:pPr>
+      <w:r>
+        <w:lastRenderedPageBreak/>
+        <w:t>•</w:t>
+      </w:r>
+      <w:r>
+        <w:tab/>
+        <w:t>Integrate ML-based anomaly detection (Module 4)</w:t>
+      </w:r>
+    </w:p>
+    <w:p>
+      <w:pPr>
+        <w:pStyle w:val="NormalWeb"/>
+        <w:spacing w:before="0" w:beforeAutospacing="0" w:after="0" w:afterAutospacing="0"/>
+      </w:pPr>
+      <w:r>
+        <w:t>•</w:t>
+      </w:r>
+      <w:r>
+        <w:tab/>
+        <w:t xml:space="preserve">Update </w:t>
+      </w:r>
+      <w:proofErr w:type="spellStart"/>
+      <w:r>
+        <w:t>Insights.tsx</w:t>
+      </w:r>
+      <w:proofErr w:type="spellEnd"/>
+      <w:r>
+        <w:t xml:space="preserve"> to fetch real backend-driven data</w:t>
+      </w:r>
+    </w:p>
+    <w:p>
+      <w:pPr>
+        <w:pStyle w:val="NormalWeb"/>
+        <w:spacing w:before="0" w:beforeAutospacing="0" w:after="0" w:afterAutospacing="0"/>
+      </w:pPr>
+      <w:r>
+        <w:t>•</w:t>
+      </w:r>
+      <w:r>
+        <w:tab/>
+        <w:t>Continue strengthening offline-first system stability</w:t>
+      </w:r>
     </w:p>
     <w:sectPr>
       <w:pgSz w:w="12240" w:h="15840"/>
@@ -18296,6 +20524,119 @@
     </w:lvl>
   </w:abstractNum>
   <w:abstractNum w:abstractNumId="26" w15:restartNumberingAfterBreak="0">
+    <w:nsid w:val="2E19370C"/>
+    <w:multiLevelType w:val="hybridMultilevel"/>
+    <w:tmpl w:val="25684C34"/>
+    <w:lvl w:ilvl="0" w:tplc="04090001">
+      <w:start w:val="1"/>
+      <w:numFmt w:val="bullet"/>
+      <w:lvlText w:val=""/>
+      <w:lvlJc w:val="left"/>
+      <w:pPr>
+        <w:ind w:left="720" w:hanging="360"/>
+      </w:pPr>
+      <w:rPr>
+        <w:rFonts w:ascii="Symbol" w:hAnsi="Symbol" w:hint="default"/>
+      </w:rPr>
+    </w:lvl>
+    <w:lvl w:ilvl="1" w:tplc="04090003" w:tentative="1">
+      <w:start w:val="1"/>
+      <w:numFmt w:val="bullet"/>
+      <w:lvlText w:val="o"/>
+      <w:lvlJc w:val="left"/>
+      <w:pPr>
+        <w:ind w:left="1440" w:hanging="360"/>
+      </w:pPr>
+      <w:rPr>
+        <w:rFonts w:ascii="Courier New" w:hAnsi="Courier New" w:cs="Courier New" w:hint="default"/>
+      </w:rPr>
+    </w:lvl>
+    <w:lvl w:ilvl="2" w:tplc="04090005" w:tentative="1">
+      <w:start w:val="1"/>
+      <w:numFmt w:val="bullet"/>
+      <w:lvlText w:val=""/>
+      <w:lvlJc w:val="left"/>
+      <w:pPr>
+        <w:ind w:left="2160" w:hanging="360"/>
+      </w:pPr>
+      <w:rPr>
+        <w:rFonts w:ascii="Wingdings" w:hAnsi="Wingdings" w:hint="default"/>
+      </w:rPr>
+    </w:lvl>
+    <w:lvl w:ilvl="3" w:tplc="04090001" w:tentative="1">
+      <w:start w:val="1"/>
+      <w:numFmt w:val="bullet"/>
+      <w:lvlText w:val=""/>
+      <w:lvlJc w:val="left"/>
+      <w:pPr>
+        <w:ind w:left="2880" w:hanging="360"/>
+      </w:pPr>
+      <w:rPr>
+        <w:rFonts w:ascii="Symbol" w:hAnsi="Symbol" w:hint="default"/>
+      </w:rPr>
+    </w:lvl>
+    <w:lvl w:ilvl="4" w:tplc="04090003" w:tentative="1">
+      <w:start w:val="1"/>
+      <w:numFmt w:val="bullet"/>
+      <w:lvlText w:val="o"/>
+      <w:lvlJc w:val="left"/>
+      <w:pPr>
+        <w:ind w:left="3600" w:hanging="360"/>
+      </w:pPr>
+      <w:rPr>
+        <w:rFonts w:ascii="Courier New" w:hAnsi="Courier New" w:cs="Courier New" w:hint="default"/>
+      </w:rPr>
+    </w:lvl>
+    <w:lvl w:ilvl="5" w:tplc="04090005" w:tentative="1">
+      <w:start w:val="1"/>
+      <w:numFmt w:val="bullet"/>
+      <w:lvlText w:val=""/>
+      <w:lvlJc w:val="left"/>
+      <w:pPr>
+        <w:ind w:left="4320" w:hanging="360"/>
+      </w:pPr>
+      <w:rPr>
+        <w:rFonts w:ascii="Wingdings" w:hAnsi="Wingdings" w:hint="default"/>
+      </w:rPr>
+    </w:lvl>
+    <w:lvl w:ilvl="6" w:tplc="04090001" w:tentative="1">
+      <w:start w:val="1"/>
+      <w:numFmt w:val="bullet"/>
+      <w:lvlText w:val=""/>
+      <w:lvlJc w:val="left"/>
+      <w:pPr>
+        <w:ind w:left="5040" w:hanging="360"/>
+      </w:pPr>
+      <w:rPr>
+        <w:rFonts w:ascii="Symbol" w:hAnsi="Symbol" w:hint="default"/>
+      </w:rPr>
+    </w:lvl>
+    <w:lvl w:ilvl="7" w:tplc="04090003" w:tentative="1">
+      <w:start w:val="1"/>
+      <w:numFmt w:val="bullet"/>
+      <w:lvlText w:val="o"/>
+      <w:lvlJc w:val="left"/>
+      <w:pPr>
+        <w:ind w:left="5760" w:hanging="360"/>
+      </w:pPr>
+      <w:rPr>
+        <w:rFonts w:ascii="Courier New" w:hAnsi="Courier New" w:cs="Courier New" w:hint="default"/>
+      </w:rPr>
+    </w:lvl>
+    <w:lvl w:ilvl="8" w:tplc="04090005" w:tentative="1">
+      <w:start w:val="1"/>
+      <w:numFmt w:val="bullet"/>
+      <w:lvlText w:val=""/>
+      <w:lvlJc w:val="left"/>
+      <w:pPr>
+        <w:ind w:left="6480" w:hanging="360"/>
+      </w:pPr>
+      <w:rPr>
+        <w:rFonts w:ascii="Wingdings" w:hAnsi="Wingdings" w:hint="default"/>
+      </w:rPr>
+    </w:lvl>
+  </w:abstractNum>
+  <w:abstractNum w:abstractNumId="27" w15:restartNumberingAfterBreak="0">
     <w:nsid w:val="2EDC66D7"/>
     <w:multiLevelType w:val="multilevel"/>
     <w:tmpl w:val="484CDF84"/>
@@ -18444,7 +20785,7 @@
       </w:rPr>
     </w:lvl>
   </w:abstractNum>
-  <w:abstractNum w:abstractNumId="27" w15:restartNumberingAfterBreak="0">
+  <w:abstractNum w:abstractNumId="28" w15:restartNumberingAfterBreak="0">
     <w:nsid w:val="2F3960A5"/>
     <w:multiLevelType w:val="multilevel"/>
     <w:tmpl w:val="C5E2EACE"/>
@@ -18593,7 +20934,7 @@
       </w:rPr>
     </w:lvl>
   </w:abstractNum>
-  <w:abstractNum w:abstractNumId="28" w15:restartNumberingAfterBreak="0">
+  <w:abstractNum w:abstractNumId="29" w15:restartNumberingAfterBreak="0">
     <w:nsid w:val="329C39BB"/>
     <w:multiLevelType w:val="multilevel"/>
     <w:tmpl w:val="1696BB5C"/>
@@ -18742,7 +21083,120 @@
       </w:rPr>
     </w:lvl>
   </w:abstractNum>
-  <w:abstractNum w:abstractNumId="29" w15:restartNumberingAfterBreak="0">
+  <w:abstractNum w:abstractNumId="30" w15:restartNumberingAfterBreak="0">
+    <w:nsid w:val="32A06D6E"/>
+    <w:multiLevelType w:val="hybridMultilevel"/>
+    <w:tmpl w:val="D6B8F840"/>
+    <w:lvl w:ilvl="0" w:tplc="04090001">
+      <w:start w:val="1"/>
+      <w:numFmt w:val="bullet"/>
+      <w:lvlText w:val=""/>
+      <w:lvlJc w:val="left"/>
+      <w:pPr>
+        <w:ind w:left="720" w:hanging="360"/>
+      </w:pPr>
+      <w:rPr>
+        <w:rFonts w:ascii="Symbol" w:hAnsi="Symbol" w:hint="default"/>
+      </w:rPr>
+    </w:lvl>
+    <w:lvl w:ilvl="1" w:tplc="04090003" w:tentative="1">
+      <w:start w:val="1"/>
+      <w:numFmt w:val="bullet"/>
+      <w:lvlText w:val="o"/>
+      <w:lvlJc w:val="left"/>
+      <w:pPr>
+        <w:ind w:left="1440" w:hanging="360"/>
+      </w:pPr>
+      <w:rPr>
+        <w:rFonts w:ascii="Courier New" w:hAnsi="Courier New" w:cs="Courier New" w:hint="default"/>
+      </w:rPr>
+    </w:lvl>
+    <w:lvl w:ilvl="2" w:tplc="04090005" w:tentative="1">
+      <w:start w:val="1"/>
+      <w:numFmt w:val="bullet"/>
+      <w:lvlText w:val=""/>
+      <w:lvlJc w:val="left"/>
+      <w:pPr>
+        <w:ind w:left="2160" w:hanging="360"/>
+      </w:pPr>
+      <w:rPr>
+        <w:rFonts w:ascii="Wingdings" w:hAnsi="Wingdings" w:hint="default"/>
+      </w:rPr>
+    </w:lvl>
+    <w:lvl w:ilvl="3" w:tplc="04090001" w:tentative="1">
+      <w:start w:val="1"/>
+      <w:numFmt w:val="bullet"/>
+      <w:lvlText w:val=""/>
+      <w:lvlJc w:val="left"/>
+      <w:pPr>
+        <w:ind w:left="2880" w:hanging="360"/>
+      </w:pPr>
+      <w:rPr>
+        <w:rFonts w:ascii="Symbol" w:hAnsi="Symbol" w:hint="default"/>
+      </w:rPr>
+    </w:lvl>
+    <w:lvl w:ilvl="4" w:tplc="04090003" w:tentative="1">
+      <w:start w:val="1"/>
+      <w:numFmt w:val="bullet"/>
+      <w:lvlText w:val="o"/>
+      <w:lvlJc w:val="left"/>
+      <w:pPr>
+        <w:ind w:left="3600" w:hanging="360"/>
+      </w:pPr>
+      <w:rPr>
+        <w:rFonts w:ascii="Courier New" w:hAnsi="Courier New" w:cs="Courier New" w:hint="default"/>
+      </w:rPr>
+    </w:lvl>
+    <w:lvl w:ilvl="5" w:tplc="04090005" w:tentative="1">
+      <w:start w:val="1"/>
+      <w:numFmt w:val="bullet"/>
+      <w:lvlText w:val=""/>
+      <w:lvlJc w:val="left"/>
+      <w:pPr>
+        <w:ind w:left="4320" w:hanging="360"/>
+      </w:pPr>
+      <w:rPr>
+        <w:rFonts w:ascii="Wingdings" w:hAnsi="Wingdings" w:hint="default"/>
+      </w:rPr>
+    </w:lvl>
+    <w:lvl w:ilvl="6" w:tplc="04090001" w:tentative="1">
+      <w:start w:val="1"/>
+      <w:numFmt w:val="bullet"/>
+      <w:lvlText w:val=""/>
+      <w:lvlJc w:val="left"/>
+      <w:pPr>
+        <w:ind w:left="5040" w:hanging="360"/>
+      </w:pPr>
+      <w:rPr>
+        <w:rFonts w:ascii="Symbol" w:hAnsi="Symbol" w:hint="default"/>
+      </w:rPr>
+    </w:lvl>
+    <w:lvl w:ilvl="7" w:tplc="04090003" w:tentative="1">
+      <w:start w:val="1"/>
+      <w:numFmt w:val="bullet"/>
+      <w:lvlText w:val="o"/>
+      <w:lvlJc w:val="left"/>
+      <w:pPr>
+        <w:ind w:left="5760" w:hanging="360"/>
+      </w:pPr>
+      <w:rPr>
+        <w:rFonts w:ascii="Courier New" w:hAnsi="Courier New" w:cs="Courier New" w:hint="default"/>
+      </w:rPr>
+    </w:lvl>
+    <w:lvl w:ilvl="8" w:tplc="04090005" w:tentative="1">
+      <w:start w:val="1"/>
+      <w:numFmt w:val="bullet"/>
+      <w:lvlText w:val=""/>
+      <w:lvlJc w:val="left"/>
+      <w:pPr>
+        <w:ind w:left="6480" w:hanging="360"/>
+      </w:pPr>
+      <w:rPr>
+        <w:rFonts w:ascii="Wingdings" w:hAnsi="Wingdings" w:hint="default"/>
+      </w:rPr>
+    </w:lvl>
+  </w:abstractNum>
+  <w:abstractNum w:abstractNumId="31" w15:restartNumberingAfterBreak="0">
     <w:nsid w:val="33FF6B03"/>
     <w:multiLevelType w:val="multilevel"/>
     <w:tmpl w:val="38D493B4"/>
@@ -18891,7 +21345,7 @@
       </w:rPr>
     </w:lvl>
   </w:abstractNum>
-  <w:abstractNum w:abstractNumId="30" w15:restartNumberingAfterBreak="0">
+  <w:abstractNum w:abstractNumId="32" w15:restartNumberingAfterBreak="0">
     <w:nsid w:val="37DD4BC5"/>
     <w:multiLevelType w:val="multilevel"/>
     <w:tmpl w:val="36DC130E"/>
@@ -19040,7 +21494,120 @@
       </w:rPr>
     </w:lvl>
   </w:abstractNum>
-  <w:abstractNum w:abstractNumId="31" w15:restartNumberingAfterBreak="0">
+  <w:abstractNum w:abstractNumId="33" w15:restartNumberingAfterBreak="0">
+    <w:nsid w:val="384D26CE"/>
+    <w:multiLevelType w:val="hybridMultilevel"/>
+    <w:tmpl w:val="D58605C2"/>
+    <w:lvl w:ilvl="0" w:tplc="04090001">
+      <w:start w:val="1"/>
+      <w:numFmt w:val="bullet"/>
+      <w:lvlText w:val=""/>
+      <w:lvlJc w:val="left"/>
+      <w:pPr>
+        <w:ind w:left="720" w:hanging="360"/>
+      </w:pPr>
+      <w:rPr>
+        <w:rFonts w:ascii="Symbol" w:hAnsi="Symbol" w:hint="default"/>
+      </w:rPr>
+    </w:lvl>
+    <w:lvl w:ilvl="1" w:tplc="04090003" w:tentative="1">
+      <w:start w:val="1"/>
+      <w:numFmt w:val="bullet"/>
+      <w:lvlText w:val="o"/>
+      <w:lvlJc w:val="left"/>
+      <w:pPr>
+        <w:ind w:left="1440" w:hanging="360"/>
+      </w:pPr>
+      <w:rPr>
+        <w:rFonts w:ascii="Courier New" w:hAnsi="Courier New" w:cs="Courier New" w:hint="default"/>
+      </w:rPr>
+    </w:lvl>
+    <w:lvl w:ilvl="2" w:tplc="04090005" w:tentative="1">
+      <w:start w:val="1"/>
+      <w:numFmt w:val="bullet"/>
+      <w:lvlText w:val=""/>
+      <w:lvlJc w:val="left"/>
+      <w:pPr>
+        <w:ind w:left="2160" w:hanging="360"/>
+      </w:pPr>
+      <w:rPr>
+        <w:rFonts w:ascii="Wingdings" w:hAnsi="Wingdings" w:hint="default"/>
+      </w:rPr>
+    </w:lvl>
+    <w:lvl w:ilvl="3" w:tplc="04090001" w:tentative="1">
+      <w:start w:val="1"/>
+      <w:numFmt w:val="bullet"/>
+      <w:lvlText w:val=""/>
+      <w:lvlJc w:val="left"/>
+      <w:pPr>
+        <w:ind w:left="2880" w:hanging="360"/>
+      </w:pPr>
+      <w:rPr>
+        <w:rFonts w:ascii="Symbol" w:hAnsi="Symbol" w:hint="default"/>
+      </w:rPr>
+    </w:lvl>
+    <w:lvl w:ilvl="4" w:tplc="04090003" w:tentative="1">
+      <w:start w:val="1"/>
+      <w:numFmt w:val="bullet"/>
+      <w:lvlText w:val="o"/>
+      <w:lvlJc w:val="left"/>
+      <w:pPr>
+        <w:ind w:left="3600" w:hanging="360"/>
+      </w:pPr>
+      <w:rPr>
+        <w:rFonts w:ascii="Courier New" w:hAnsi="Courier New" w:cs="Courier New" w:hint="default"/>
+      </w:rPr>
+    </w:lvl>
+    <w:lvl w:ilvl="5" w:tplc="04090005" w:tentative="1">
+      <w:start w:val="1"/>
+      <w:numFmt w:val="bullet"/>
+      <w:lvlText w:val=""/>
+      <w:lvlJc w:val="left"/>
+      <w:pPr>
+        <w:ind w:left="4320" w:hanging="360"/>
+      </w:pPr>
+      <w:rPr>
+        <w:rFonts w:ascii="Wingdings" w:hAnsi="Wingdings" w:hint="default"/>
+      </w:rPr>
+    </w:lvl>
+    <w:lvl w:ilvl="6" w:tplc="04090001" w:tentative="1">
+      <w:start w:val="1"/>
+      <w:numFmt w:val="bullet"/>
+      <w:lvlText w:val=""/>
+      <w:lvlJc w:val="left"/>
+      <w:pPr>
+        <w:ind w:left="5040" w:hanging="360"/>
+      </w:pPr>
+      <w:rPr>
+        <w:rFonts w:ascii="Symbol" w:hAnsi="Symbol" w:hint="default"/>
+      </w:rPr>
+    </w:lvl>
+    <w:lvl w:ilvl="7" w:tplc="04090003" w:tentative="1">
+      <w:start w:val="1"/>
+      <w:numFmt w:val="bullet"/>
+      <w:lvlText w:val="o"/>
+      <w:lvlJc w:val="left"/>
+      <w:pPr>
+        <w:ind w:left="5760" w:hanging="360"/>
+      </w:pPr>
+      <w:rPr>
+        <w:rFonts w:ascii="Courier New" w:hAnsi="Courier New" w:cs="Courier New" w:hint="default"/>
+      </w:rPr>
+    </w:lvl>
+    <w:lvl w:ilvl="8" w:tplc="04090005" w:tentative="1">
+      <w:start w:val="1"/>
+      <w:numFmt w:val="bullet"/>
+      <w:lvlText w:val=""/>
+      <w:lvlJc w:val="left"/>
+      <w:pPr>
+        <w:ind w:left="6480" w:hanging="360"/>
+      </w:pPr>
+      <w:rPr>
+        <w:rFonts w:ascii="Wingdings" w:hAnsi="Wingdings" w:hint="default"/>
+      </w:rPr>
+    </w:lvl>
+  </w:abstractNum>
+  <w:abstractNum w:abstractNumId="34" w15:restartNumberingAfterBreak="0">
     <w:nsid w:val="391764DC"/>
     <w:multiLevelType w:val="multilevel"/>
     <w:tmpl w:val="31FAB04C"/>
@@ -19189,7 +21756,7 @@
       </w:rPr>
     </w:lvl>
   </w:abstractNum>
-  <w:abstractNum w:abstractNumId="32" w15:restartNumberingAfterBreak="0">
+  <w:abstractNum w:abstractNumId="35" w15:restartNumberingAfterBreak="0">
     <w:nsid w:val="392F72CA"/>
     <w:multiLevelType w:val="multilevel"/>
     <w:tmpl w:val="25B4DBF2"/>
@@ -19338,7 +21905,7 @@
       </w:rPr>
     </w:lvl>
   </w:abstractNum>
-  <w:abstractNum w:abstractNumId="33" w15:restartNumberingAfterBreak="0">
+  <w:abstractNum w:abstractNumId="36" w15:restartNumberingAfterBreak="0">
     <w:nsid w:val="39DA1D2E"/>
     <w:multiLevelType w:val="multilevel"/>
     <w:tmpl w:val="4D10BF44"/>
@@ -19487,7 +22054,7 @@
       </w:rPr>
     </w:lvl>
   </w:abstractNum>
-  <w:abstractNum w:abstractNumId="34" w15:restartNumberingAfterBreak="0">
+  <w:abstractNum w:abstractNumId="37" w15:restartNumberingAfterBreak="0">
     <w:nsid w:val="3B125DF7"/>
     <w:multiLevelType w:val="multilevel"/>
     <w:tmpl w:val="2DFA1608"/>
@@ -19636,7 +22203,7 @@
       </w:rPr>
     </w:lvl>
   </w:abstractNum>
-  <w:abstractNum w:abstractNumId="35" w15:restartNumberingAfterBreak="0">
+  <w:abstractNum w:abstractNumId="38" w15:restartNumberingAfterBreak="0">
     <w:nsid w:val="3BBD0916"/>
     <w:multiLevelType w:val="hybridMultilevel"/>
     <w:tmpl w:val="9D041C18"/>
@@ -19749,7 +22316,120 @@
       </w:rPr>
     </w:lvl>
   </w:abstractNum>
-  <w:abstractNum w:abstractNumId="36" w15:restartNumberingAfterBreak="0">
+  <w:abstractNum w:abstractNumId="39" w15:restartNumberingAfterBreak="0">
+    <w:nsid w:val="3BD05342"/>
+    <w:multiLevelType w:val="hybridMultilevel"/>
+    <w:tmpl w:val="AA38D2AA"/>
+    <w:lvl w:ilvl="0" w:tplc="04090001">
+      <w:start w:val="1"/>
+      <w:numFmt w:val="bullet"/>
+      <w:lvlText w:val=""/>
+      <w:lvlJc w:val="left"/>
+      <w:pPr>
+        <w:ind w:left="720" w:hanging="360"/>
+      </w:pPr>
+      <w:rPr>
+        <w:rFonts w:ascii="Symbol" w:hAnsi="Symbol" w:hint="default"/>
+      </w:rPr>
+    </w:lvl>
+    <w:lvl w:ilvl="1" w:tplc="04090003" w:tentative="1">
+      <w:start w:val="1"/>
+      <w:numFmt w:val="bullet"/>
+      <w:lvlText w:val="o"/>
+      <w:lvlJc w:val="left"/>
+      <w:pPr>
+        <w:ind w:left="1440" w:hanging="360"/>
+      </w:pPr>
+      <w:rPr>
+        <w:rFonts w:ascii="Courier New" w:hAnsi="Courier New" w:cs="Courier New" w:hint="default"/>
+      </w:rPr>
+    </w:lvl>
+    <w:lvl w:ilvl="2" w:tplc="04090005" w:tentative="1">
+      <w:start w:val="1"/>
+      <w:numFmt w:val="bullet"/>
+      <w:lvlText w:val=""/>
+      <w:lvlJc w:val="left"/>
+      <w:pPr>
+        <w:ind w:left="2160" w:hanging="360"/>
+      </w:pPr>
+      <w:rPr>
+        <w:rFonts w:ascii="Wingdings" w:hAnsi="Wingdings" w:hint="default"/>
+      </w:rPr>
+    </w:lvl>
+    <w:lvl w:ilvl="3" w:tplc="04090001" w:tentative="1">
+      <w:start w:val="1"/>
+      <w:numFmt w:val="bullet"/>
+      <w:lvlText w:val=""/>
+      <w:lvlJc w:val="left"/>
+      <w:pPr>
+        <w:ind w:left="2880" w:hanging="360"/>
+      </w:pPr>
+      <w:rPr>
+        <w:rFonts w:ascii="Symbol" w:hAnsi="Symbol" w:hint="default"/>
+      </w:rPr>
+    </w:lvl>
+    <w:lvl w:ilvl="4" w:tplc="04090003" w:tentative="1">
+      <w:start w:val="1"/>
+      <w:numFmt w:val="bullet"/>
+      <w:lvlText w:val="o"/>
+      <w:lvlJc w:val="left"/>
+      <w:pPr>
+        <w:ind w:left="3600" w:hanging="360"/>
+      </w:pPr>
+      <w:rPr>
+        <w:rFonts w:ascii="Courier New" w:hAnsi="Courier New" w:cs="Courier New" w:hint="default"/>
+      </w:rPr>
+    </w:lvl>
+    <w:lvl w:ilvl="5" w:tplc="04090005" w:tentative="1">
+      <w:start w:val="1"/>
+      <w:numFmt w:val="bullet"/>
+      <w:lvlText w:val=""/>
+      <w:lvlJc w:val="left"/>
+      <w:pPr>
+        <w:ind w:left="4320" w:hanging="360"/>
+      </w:pPr>
+      <w:rPr>
+        <w:rFonts w:ascii="Wingdings" w:hAnsi="Wingdings" w:hint="default"/>
+      </w:rPr>
+    </w:lvl>
+    <w:lvl w:ilvl="6" w:tplc="04090001" w:tentative="1">
+      <w:start w:val="1"/>
+      <w:numFmt w:val="bullet"/>
+      <w:lvlText w:val=""/>
+      <w:lvlJc w:val="left"/>
+      <w:pPr>
+        <w:ind w:left="5040" w:hanging="360"/>
+      </w:pPr>
+      <w:rPr>
+        <w:rFonts w:ascii="Symbol" w:hAnsi="Symbol" w:hint="default"/>
+      </w:rPr>
+    </w:lvl>
+    <w:lvl w:ilvl="7" w:tplc="04090003" w:tentative="1">
+      <w:start w:val="1"/>
+      <w:numFmt w:val="bullet"/>
+      <w:lvlText w:val="o"/>
+      <w:lvlJc w:val="left"/>
+      <w:pPr>
+        <w:ind w:left="5760" w:hanging="360"/>
+      </w:pPr>
+      <w:rPr>
+        <w:rFonts w:ascii="Courier New" w:hAnsi="Courier New" w:cs="Courier New" w:hint="default"/>
+      </w:rPr>
+    </w:lvl>
+    <w:lvl w:ilvl="8" w:tplc="04090005" w:tentative="1">
+      <w:start w:val="1"/>
+      <w:numFmt w:val="bullet"/>
+      <w:lvlText w:val=""/>
+      <w:lvlJc w:val="left"/>
+      <w:pPr>
+        <w:ind w:left="6480" w:hanging="360"/>
+      </w:pPr>
+      <w:rPr>
+        <w:rFonts w:ascii="Wingdings" w:hAnsi="Wingdings" w:hint="default"/>
+      </w:rPr>
+    </w:lvl>
+  </w:abstractNum>
+  <w:abstractNum w:abstractNumId="40" w15:restartNumberingAfterBreak="0">
     <w:nsid w:val="3CEB3B07"/>
     <w:multiLevelType w:val="multilevel"/>
     <w:tmpl w:val="6C903DEA"/>
@@ -19898,7 +22578,7 @@
       </w:rPr>
     </w:lvl>
   </w:abstractNum>
-  <w:abstractNum w:abstractNumId="37" w15:restartNumberingAfterBreak="0">
+  <w:abstractNum w:abstractNumId="41" w15:restartNumberingAfterBreak="0">
     <w:nsid w:val="3D1E6C5B"/>
     <w:multiLevelType w:val="multilevel"/>
     <w:tmpl w:val="7D5A8D26"/>
@@ -20047,7 +22727,7 @@
       </w:rPr>
     </w:lvl>
   </w:abstractNum>
-  <w:abstractNum w:abstractNumId="38" w15:restartNumberingAfterBreak="0">
+  <w:abstractNum w:abstractNumId="42" w15:restartNumberingAfterBreak="0">
     <w:nsid w:val="3E75593D"/>
     <w:multiLevelType w:val="multilevel"/>
     <w:tmpl w:val="77E60D1C"/>
@@ -20196,7 +22876,7 @@
       </w:rPr>
     </w:lvl>
   </w:abstractNum>
-  <w:abstractNum w:abstractNumId="39" w15:restartNumberingAfterBreak="0">
+  <w:abstractNum w:abstractNumId="43" w15:restartNumberingAfterBreak="0">
     <w:nsid w:val="3FE16A64"/>
     <w:multiLevelType w:val="multilevel"/>
     <w:tmpl w:val="BAF6EC1C"/>
@@ -20345,7 +23025,7 @@
       </w:rPr>
     </w:lvl>
   </w:abstractNum>
-  <w:abstractNum w:abstractNumId="40" w15:restartNumberingAfterBreak="0">
+  <w:abstractNum w:abstractNumId="44" w15:restartNumberingAfterBreak="0">
     <w:nsid w:val="40D03BCD"/>
     <w:multiLevelType w:val="multilevel"/>
     <w:tmpl w:val="E53A8542"/>
@@ -20494,7 +23174,120 @@
       </w:rPr>
     </w:lvl>
   </w:abstractNum>
-  <w:abstractNum w:abstractNumId="41" w15:restartNumberingAfterBreak="0">
+  <w:abstractNum w:abstractNumId="45" w15:restartNumberingAfterBreak="0">
+    <w:nsid w:val="45783CE4"/>
+    <w:multiLevelType w:val="hybridMultilevel"/>
+    <w:tmpl w:val="78DAA06C"/>
+    <w:lvl w:ilvl="0" w:tplc="04090001">
+      <w:start w:val="1"/>
+      <w:numFmt w:val="bullet"/>
+      <w:lvlText w:val=""/>
+      <w:lvlJc w:val="left"/>
+      <w:pPr>
+        <w:ind w:left="720" w:hanging="360"/>
+      </w:pPr>
+      <w:rPr>
+        <w:rFonts w:ascii="Symbol" w:hAnsi="Symbol" w:hint="default"/>
+      </w:rPr>
+    </w:lvl>
+    <w:lvl w:ilvl="1" w:tplc="04090003" w:tentative="1">
+      <w:start w:val="1"/>
+      <w:numFmt w:val="bullet"/>
+      <w:lvlText w:val="o"/>
+      <w:lvlJc w:val="left"/>
+      <w:pPr>
+        <w:ind w:left="1440" w:hanging="360"/>
+      </w:pPr>
+      <w:rPr>
+        <w:rFonts w:ascii="Courier New" w:hAnsi="Courier New" w:cs="Courier New" w:hint="default"/>
+      </w:rPr>
+    </w:lvl>
+    <w:lvl w:ilvl="2" w:tplc="04090005" w:tentative="1">
+      <w:start w:val="1"/>
+      <w:numFmt w:val="bullet"/>
+      <w:lvlText w:val=""/>
+      <w:lvlJc w:val="left"/>
+      <w:pPr>
+        <w:ind w:left="2160" w:hanging="360"/>
+      </w:pPr>
+      <w:rPr>
+        <w:rFonts w:ascii="Wingdings" w:hAnsi="Wingdings" w:hint="default"/>
+      </w:rPr>
+    </w:lvl>
+    <w:lvl w:ilvl="3" w:tplc="04090001" w:tentative="1">
+      <w:start w:val="1"/>
+      <w:numFmt w:val="bullet"/>
+      <w:lvlText w:val=""/>
+      <w:lvlJc w:val="left"/>
+      <w:pPr>
+        <w:ind w:left="2880" w:hanging="360"/>
+      </w:pPr>
+      <w:rPr>
+        <w:rFonts w:ascii="Symbol" w:hAnsi="Symbol" w:hint="default"/>
+      </w:rPr>
+    </w:lvl>
+    <w:lvl w:ilvl="4" w:tplc="04090003" w:tentative="1">
+      <w:start w:val="1"/>
+      <w:numFmt w:val="bullet"/>
+      <w:lvlText w:val="o"/>
+      <w:lvlJc w:val="left"/>
+      <w:pPr>
+        <w:ind w:left="3600" w:hanging="360"/>
+      </w:pPr>
+      <w:rPr>
+        <w:rFonts w:ascii="Courier New" w:hAnsi="Courier New" w:cs="Courier New" w:hint="default"/>
+      </w:rPr>
+    </w:lvl>
+    <w:lvl w:ilvl="5" w:tplc="04090005" w:tentative="1">
+      <w:start w:val="1"/>
+      <w:numFmt w:val="bullet"/>
+      <w:lvlText w:val=""/>
+      <w:lvlJc w:val="left"/>
+      <w:pPr>
+        <w:ind w:left="4320" w:hanging="360"/>
+      </w:pPr>
+      <w:rPr>
+        <w:rFonts w:ascii="Wingdings" w:hAnsi="Wingdings" w:hint="default"/>
+      </w:rPr>
+    </w:lvl>
+    <w:lvl w:ilvl="6" w:tplc="04090001" w:tentative="1">
+      <w:start w:val="1"/>
+      <w:numFmt w:val="bullet"/>
+      <w:lvlText w:val=""/>
+      <w:lvlJc w:val="left"/>
+      <w:pPr>
+        <w:ind w:left="5040" w:hanging="360"/>
+      </w:pPr>
+      <w:rPr>
+        <w:rFonts w:ascii="Symbol" w:hAnsi="Symbol" w:hint="default"/>
+      </w:rPr>
+    </w:lvl>
+    <w:lvl w:ilvl="7" w:tplc="04090003" w:tentative="1">
+      <w:start w:val="1"/>
+      <w:numFmt w:val="bullet"/>
+      <w:lvlText w:val="o"/>
+      <w:lvlJc w:val="left"/>
+      <w:pPr>
+        <w:ind w:left="5760" w:hanging="360"/>
+      </w:pPr>
+      <w:rPr>
+        <w:rFonts w:ascii="Courier New" w:hAnsi="Courier New" w:cs="Courier New" w:hint="default"/>
+      </w:rPr>
+    </w:lvl>
+    <w:lvl w:ilvl="8" w:tplc="04090005" w:tentative="1">
+      <w:start w:val="1"/>
+      <w:numFmt w:val="bullet"/>
+      <w:lvlText w:val=""/>
+      <w:lvlJc w:val="left"/>
+      <w:pPr>
+        <w:ind w:left="6480" w:hanging="360"/>
+      </w:pPr>
+      <w:rPr>
+        <w:rFonts w:ascii="Wingdings" w:hAnsi="Wingdings" w:hint="default"/>
+      </w:rPr>
+    </w:lvl>
+  </w:abstractNum>
+  <w:abstractNum w:abstractNumId="46" w15:restartNumberingAfterBreak="0">
     <w:nsid w:val="4B427678"/>
     <w:multiLevelType w:val="multilevel"/>
     <w:tmpl w:val="48E4A9FC"/>
@@ -20643,7 +23436,120 @@
       </w:rPr>
     </w:lvl>
   </w:abstractNum>
-  <w:abstractNum w:abstractNumId="42" w15:restartNumberingAfterBreak="0">
+  <w:abstractNum w:abstractNumId="47" w15:restartNumberingAfterBreak="0">
+    <w:nsid w:val="4C465F49"/>
+    <w:multiLevelType w:val="hybridMultilevel"/>
+    <w:tmpl w:val="7AC2E18C"/>
+    <w:lvl w:ilvl="0" w:tplc="04090001">
+      <w:start w:val="1"/>
+      <w:numFmt w:val="bullet"/>
+      <w:lvlText w:val=""/>
+      <w:lvlJc w:val="left"/>
+      <w:pPr>
+        <w:ind w:left="720" w:hanging="360"/>
+      </w:pPr>
+      <w:rPr>
+        <w:rFonts w:ascii="Symbol" w:hAnsi="Symbol" w:hint="default"/>
+      </w:rPr>
+    </w:lvl>
+    <w:lvl w:ilvl="1" w:tplc="04090003" w:tentative="1">
+      <w:start w:val="1"/>
+      <w:numFmt w:val="bullet"/>
+      <w:lvlText w:val="o"/>
+      <w:lvlJc w:val="left"/>
+      <w:pPr>
+        <w:ind w:left="1440" w:hanging="360"/>
+      </w:pPr>
+      <w:rPr>
+        <w:rFonts w:ascii="Courier New" w:hAnsi="Courier New" w:cs="Courier New" w:hint="default"/>
+      </w:rPr>
+    </w:lvl>
+    <w:lvl w:ilvl="2" w:tplc="04090005" w:tentative="1">
+      <w:start w:val="1"/>
+      <w:numFmt w:val="bullet"/>
+      <w:lvlText w:val=""/>
+      <w:lvlJc w:val="left"/>
+      <w:pPr>
+        <w:ind w:left="2160" w:hanging="360"/>
+      </w:pPr>
+      <w:rPr>
+        <w:rFonts w:ascii="Wingdings" w:hAnsi="Wingdings" w:hint="default"/>
+      </w:rPr>
+    </w:lvl>
+    <w:lvl w:ilvl="3" w:tplc="04090001" w:tentative="1">
+      <w:start w:val="1"/>
+      <w:numFmt w:val="bullet"/>
+      <w:lvlText w:val=""/>
+      <w:lvlJc w:val="left"/>
+      <w:pPr>
+        <w:ind w:left="2880" w:hanging="360"/>
+      </w:pPr>
+      <w:rPr>
+        <w:rFonts w:ascii="Symbol" w:hAnsi="Symbol" w:hint="default"/>
+      </w:rPr>
+    </w:lvl>
+    <w:lvl w:ilvl="4" w:tplc="04090003" w:tentative="1">
+      <w:start w:val="1"/>
+      <w:numFmt w:val="bullet"/>
+      <w:lvlText w:val="o"/>
+      <w:lvlJc w:val="left"/>
+      <w:pPr>
+        <w:ind w:left="3600" w:hanging="360"/>
+      </w:pPr>
+      <w:rPr>
+        <w:rFonts w:ascii="Courier New" w:hAnsi="Courier New" w:cs="Courier New" w:hint="default"/>
+      </w:rPr>
+    </w:lvl>
+    <w:lvl w:ilvl="5" w:tplc="04090005" w:tentative="1">
+      <w:start w:val="1"/>
+      <w:numFmt w:val="bullet"/>
+      <w:lvlText w:val=""/>
+      <w:lvlJc w:val="left"/>
+      <w:pPr>
+        <w:ind w:left="4320" w:hanging="360"/>
+      </w:pPr>
+      <w:rPr>
+        <w:rFonts w:ascii="Wingdings" w:hAnsi="Wingdings" w:hint="default"/>
+      </w:rPr>
+    </w:lvl>
+    <w:lvl w:ilvl="6" w:tplc="04090001" w:tentative="1">
+      <w:start w:val="1"/>
+      <w:numFmt w:val="bullet"/>
+      <w:lvlText w:val=""/>
+      <w:lvlJc w:val="left"/>
+      <w:pPr>
+        <w:ind w:left="5040" w:hanging="360"/>
+      </w:pPr>
+      <w:rPr>
+        <w:rFonts w:ascii="Symbol" w:hAnsi="Symbol" w:hint="default"/>
+      </w:rPr>
+    </w:lvl>
+    <w:lvl w:ilvl="7" w:tplc="04090003" w:tentative="1">
+      <w:start w:val="1"/>
+      <w:numFmt w:val="bullet"/>
+      <w:lvlText w:val="o"/>
+      <w:lvlJc w:val="left"/>
+      <w:pPr>
+        <w:ind w:left="5760" w:hanging="360"/>
+      </w:pPr>
+      <w:rPr>
+        <w:rFonts w:ascii="Courier New" w:hAnsi="Courier New" w:cs="Courier New" w:hint="default"/>
+      </w:rPr>
+    </w:lvl>
+    <w:lvl w:ilvl="8" w:tplc="04090005" w:tentative="1">
+      <w:start w:val="1"/>
+      <w:numFmt w:val="bullet"/>
+      <w:lvlText w:val=""/>
+      <w:lvlJc w:val="left"/>
+      <w:pPr>
+        <w:ind w:left="6480" w:hanging="360"/>
+      </w:pPr>
+      <w:rPr>
+        <w:rFonts w:ascii="Wingdings" w:hAnsi="Wingdings" w:hint="default"/>
+      </w:rPr>
+    </w:lvl>
+  </w:abstractNum>
+  <w:abstractNum w:abstractNumId="48" w15:restartNumberingAfterBreak="0">
     <w:nsid w:val="4D6C676B"/>
     <w:multiLevelType w:val="multilevel"/>
     <w:tmpl w:val="864695D8"/>
@@ -20792,7 +23698,233 @@
       </w:rPr>
     </w:lvl>
   </w:abstractNum>
-  <w:abstractNum w:abstractNumId="43" w15:restartNumberingAfterBreak="0">
+  <w:abstractNum w:abstractNumId="49" w15:restartNumberingAfterBreak="0">
+    <w:nsid w:val="4D905590"/>
+    <w:multiLevelType w:val="hybridMultilevel"/>
+    <w:tmpl w:val="A012729C"/>
+    <w:lvl w:ilvl="0" w:tplc="04090001">
+      <w:start w:val="1"/>
+      <w:numFmt w:val="bullet"/>
+      <w:lvlText w:val=""/>
+      <w:lvlJc w:val="left"/>
+      <w:pPr>
+        <w:ind w:left="720" w:hanging="360"/>
+      </w:pPr>
+      <w:rPr>
+        <w:rFonts w:ascii="Symbol" w:hAnsi="Symbol" w:hint="default"/>
+      </w:rPr>
+    </w:lvl>
+    <w:lvl w:ilvl="1" w:tplc="04090003" w:tentative="1">
+      <w:start w:val="1"/>
+      <w:numFmt w:val="bullet"/>
+      <w:lvlText w:val="o"/>
+      <w:lvlJc w:val="left"/>
+      <w:pPr>
+        <w:ind w:left="1440" w:hanging="360"/>
+      </w:pPr>
+      <w:rPr>
+        <w:rFonts w:ascii="Courier New" w:hAnsi="Courier New" w:cs="Courier New" w:hint="default"/>
+      </w:rPr>
+    </w:lvl>
+    <w:lvl w:ilvl="2" w:tplc="04090005" w:tentative="1">
+      <w:start w:val="1"/>
+      <w:numFmt w:val="bullet"/>
+      <w:lvlText w:val=""/>
+      <w:lvlJc w:val="left"/>
+      <w:pPr>
+        <w:ind w:left="2160" w:hanging="360"/>
+      </w:pPr>
+      <w:rPr>
+        <w:rFonts w:ascii="Wingdings" w:hAnsi="Wingdings" w:hint="default"/>
+      </w:rPr>
+    </w:lvl>
+    <w:lvl w:ilvl="3" w:tplc="04090001" w:tentative="1">
+      <w:start w:val="1"/>
+      <w:numFmt w:val="bullet"/>
+      <w:lvlText w:val=""/>
+      <w:lvlJc w:val="left"/>
+      <w:pPr>
+        <w:ind w:left="2880" w:hanging="360"/>
+      </w:pPr>
+      <w:rPr>
+        <w:rFonts w:ascii="Symbol" w:hAnsi="Symbol" w:hint="default"/>
+      </w:rPr>
+    </w:lvl>
+    <w:lvl w:ilvl="4" w:tplc="04090003" w:tentative="1">
+      <w:start w:val="1"/>
+      <w:numFmt w:val="bullet"/>
+      <w:lvlText w:val="o"/>
+      <w:lvlJc w:val="left"/>
+      <w:pPr>
+        <w:ind w:left="3600" w:hanging="360"/>
+      </w:pPr>
+      <w:rPr>
+        <w:rFonts w:ascii="Courier New" w:hAnsi="Courier New" w:cs="Courier New" w:hint="default"/>
+      </w:rPr>
+    </w:lvl>
+    <w:lvl w:ilvl="5" w:tplc="04090005" w:tentative="1">
+      <w:start w:val="1"/>
+      <w:numFmt w:val="bullet"/>
+      <w:lvlText w:val=""/>
+      <w:lvlJc w:val="left"/>
+      <w:pPr>
+        <w:ind w:left="4320" w:hanging="360"/>
+      </w:pPr>
+      <w:rPr>
+        <w:rFonts w:ascii="Wingdings" w:hAnsi="Wingdings" w:hint="default"/>
+      </w:rPr>
+    </w:lvl>
+    <w:lvl w:ilvl="6" w:tplc="04090001" w:tentative="1">
+      <w:start w:val="1"/>
+      <w:numFmt w:val="bullet"/>
+      <w:lvlText w:val=""/>
+      <w:lvlJc w:val="left"/>
+      <w:pPr>
+        <w:ind w:left="5040" w:hanging="360"/>
+      </w:pPr>
+      <w:rPr>
+        <w:rFonts w:ascii="Symbol" w:hAnsi="Symbol" w:hint="default"/>
+      </w:rPr>
+    </w:lvl>
+    <w:lvl w:ilvl="7" w:tplc="04090003" w:tentative="1">
+      <w:start w:val="1"/>
+      <w:numFmt w:val="bullet"/>
+      <w:lvlText w:val="o"/>
+      <w:lvlJc w:val="left"/>
+      <w:pPr>
+        <w:ind w:left="5760" w:hanging="360"/>
+      </w:pPr>
+      <w:rPr>
+        <w:rFonts w:ascii="Courier New" w:hAnsi="Courier New" w:cs="Courier New" w:hint="default"/>
+      </w:rPr>
+    </w:lvl>
+    <w:lvl w:ilvl="8" w:tplc="04090005" w:tentative="1">
+      <w:start w:val="1"/>
+      <w:numFmt w:val="bullet"/>
+      <w:lvlText w:val=""/>
+      <w:lvlJc w:val="left"/>
+      <w:pPr>
+        <w:ind w:left="6480" w:hanging="360"/>
+      </w:pPr>
+      <w:rPr>
+        <w:rFonts w:ascii="Wingdings" w:hAnsi="Wingdings" w:hint="default"/>
+      </w:rPr>
+    </w:lvl>
+  </w:abstractNum>
+  <w:abstractNum w:abstractNumId="50" w15:restartNumberingAfterBreak="0">
+    <w:nsid w:val="4DF575B1"/>
+    <w:multiLevelType w:val="hybridMultilevel"/>
+    <w:tmpl w:val="C5C0F41A"/>
+    <w:lvl w:ilvl="0" w:tplc="04090001">
+      <w:start w:val="1"/>
+      <w:numFmt w:val="bullet"/>
+      <w:lvlText w:val=""/>
+      <w:lvlJc w:val="left"/>
+      <w:pPr>
+        <w:ind w:left="720" w:hanging="360"/>
+      </w:pPr>
+      <w:rPr>
+        <w:rFonts w:ascii="Symbol" w:hAnsi="Symbol" w:hint="default"/>
+      </w:rPr>
+    </w:lvl>
+    <w:lvl w:ilvl="1" w:tplc="04090003" w:tentative="1">
+      <w:start w:val="1"/>
+      <w:numFmt w:val="bullet"/>
+      <w:lvlText w:val="o"/>
+      <w:lvlJc w:val="left"/>
+      <w:pPr>
+        <w:ind w:left="1440" w:hanging="360"/>
+      </w:pPr>
+      <w:rPr>
+        <w:rFonts w:ascii="Courier New" w:hAnsi="Courier New" w:cs="Courier New" w:hint="default"/>
+      </w:rPr>
+    </w:lvl>
+    <w:lvl w:ilvl="2" w:tplc="04090005" w:tentative="1">
+      <w:start w:val="1"/>
+      <w:numFmt w:val="bullet"/>
+      <w:lvlText w:val=""/>
+      <w:lvlJc w:val="left"/>
+      <w:pPr>
+        <w:ind w:left="2160" w:hanging="360"/>
+      </w:pPr>
+      <w:rPr>
+        <w:rFonts w:ascii="Wingdings" w:hAnsi="Wingdings" w:hint="default"/>
+      </w:rPr>
+    </w:lvl>
+    <w:lvl w:ilvl="3" w:tplc="04090001" w:tentative="1">
+      <w:start w:val="1"/>
+      <w:numFmt w:val="bullet"/>
+      <w:lvlText w:val=""/>
+      <w:lvlJc w:val="left"/>
+      <w:pPr>
+        <w:ind w:left="2880" w:hanging="360"/>
+      </w:pPr>
+      <w:rPr>
+        <w:rFonts w:ascii="Symbol" w:hAnsi="Symbol" w:hint="default"/>
+      </w:rPr>
+    </w:lvl>
+    <w:lvl w:ilvl="4" w:tplc="04090003" w:tentative="1">
+      <w:start w:val="1"/>
+      <w:numFmt w:val="bullet"/>
+      <w:lvlText w:val="o"/>
+      <w:lvlJc w:val="left"/>
+      <w:pPr>
+        <w:ind w:left="3600" w:hanging="360"/>
+      </w:pPr>
+      <w:rPr>
+        <w:rFonts w:ascii="Courier New" w:hAnsi="Courier New" w:cs="Courier New" w:hint="default"/>
+      </w:rPr>
+    </w:lvl>
+    <w:lvl w:ilvl="5" w:tplc="04090005" w:tentative="1">
+      <w:start w:val="1"/>
+      <w:numFmt w:val="bullet"/>
+      <w:lvlText w:val=""/>
+      <w:lvlJc w:val="left"/>
+      <w:pPr>
+        <w:ind w:left="4320" w:hanging="360"/>
+      </w:pPr>
+      <w:rPr>
+        <w:rFonts w:ascii="Wingdings" w:hAnsi="Wingdings" w:hint="default"/>
+      </w:rPr>
+    </w:lvl>
+    <w:lvl w:ilvl="6" w:tplc="04090001" w:tentative="1">
+      <w:start w:val="1"/>
+      <w:numFmt w:val="bullet"/>
+      <w:lvlText w:val=""/>
+      <w:lvlJc w:val="left"/>
+      <w:pPr>
+        <w:ind w:left="5040" w:hanging="360"/>
+      </w:pPr>
+      <w:rPr>
+        <w:rFonts w:ascii="Symbol" w:hAnsi="Symbol" w:hint="default"/>
+      </w:rPr>
+    </w:lvl>
+    <w:lvl w:ilvl="7" w:tplc="04090003" w:tentative="1">
+      <w:start w:val="1"/>
+      <w:numFmt w:val="bullet"/>
+      <w:lvlText w:val="o"/>
+      <w:lvlJc w:val="left"/>
+      <w:pPr>
+        <w:ind w:left="5760" w:hanging="360"/>
+      </w:pPr>
+      <w:rPr>
+        <w:rFonts w:ascii="Courier New" w:hAnsi="Courier New" w:cs="Courier New" w:hint="default"/>
+      </w:rPr>
+    </w:lvl>
+    <w:lvl w:ilvl="8" w:tplc="04090005" w:tentative="1">
+      <w:start w:val="1"/>
+      <w:numFmt w:val="bullet"/>
+      <w:lvlText w:val=""/>
+      <w:lvlJc w:val="left"/>
+      <w:pPr>
+        <w:ind w:left="6480" w:hanging="360"/>
+      </w:pPr>
+      <w:rPr>
+        <w:rFonts w:ascii="Wingdings" w:hAnsi="Wingdings" w:hint="default"/>
+      </w:rPr>
+    </w:lvl>
+  </w:abstractNum>
+  <w:abstractNum w:abstractNumId="51" w15:restartNumberingAfterBreak="0">
     <w:nsid w:val="4EC51907"/>
     <w:multiLevelType w:val="multilevel"/>
     <w:tmpl w:val="B9D0FF78"/>
@@ -20941,7 +24073,7 @@
       </w:rPr>
     </w:lvl>
   </w:abstractNum>
-  <w:abstractNum w:abstractNumId="44" w15:restartNumberingAfterBreak="0">
+  <w:abstractNum w:abstractNumId="52" w15:restartNumberingAfterBreak="0">
     <w:nsid w:val="4F720D32"/>
     <w:multiLevelType w:val="multilevel"/>
     <w:tmpl w:val="C0FE42C6"/>
@@ -21090,7 +24222,7 @@
       </w:rPr>
     </w:lvl>
   </w:abstractNum>
-  <w:abstractNum w:abstractNumId="45" w15:restartNumberingAfterBreak="0">
+  <w:abstractNum w:abstractNumId="53" w15:restartNumberingAfterBreak="0">
     <w:nsid w:val="4F9C4D08"/>
     <w:multiLevelType w:val="multilevel"/>
     <w:tmpl w:val="D01EC1BA"/>
@@ -21239,7 +24371,7 @@
       </w:rPr>
     </w:lvl>
   </w:abstractNum>
-  <w:abstractNum w:abstractNumId="46" w15:restartNumberingAfterBreak="0">
+  <w:abstractNum w:abstractNumId="54" w15:restartNumberingAfterBreak="0">
     <w:nsid w:val="507F5705"/>
     <w:multiLevelType w:val="multilevel"/>
     <w:tmpl w:val="366AE6C4"/>
@@ -21388,7 +24520,7 @@
       </w:rPr>
     </w:lvl>
   </w:abstractNum>
-  <w:abstractNum w:abstractNumId="47" w15:restartNumberingAfterBreak="0">
+  <w:abstractNum w:abstractNumId="55" w15:restartNumberingAfterBreak="0">
     <w:nsid w:val="50C66FD1"/>
     <w:multiLevelType w:val="hybridMultilevel"/>
     <w:tmpl w:val="E0468BCE"/>
@@ -21501,7 +24633,7 @@
       </w:rPr>
     </w:lvl>
   </w:abstractNum>
-  <w:abstractNum w:abstractNumId="48" w15:restartNumberingAfterBreak="0">
+  <w:abstractNum w:abstractNumId="56" w15:restartNumberingAfterBreak="0">
     <w:nsid w:val="51CB0FFF"/>
     <w:multiLevelType w:val="multilevel"/>
     <w:tmpl w:val="C4269EBC"/>
@@ -21650,7 +24782,7 @@
       </w:rPr>
     </w:lvl>
   </w:abstractNum>
-  <w:abstractNum w:abstractNumId="49" w15:restartNumberingAfterBreak="0">
+  <w:abstractNum w:abstractNumId="57" w15:restartNumberingAfterBreak="0">
     <w:nsid w:val="51F43525"/>
     <w:multiLevelType w:val="multilevel"/>
     <w:tmpl w:val="17FC6A90"/>
@@ -21799,7 +24931,7 @@
       </w:rPr>
     </w:lvl>
   </w:abstractNum>
-  <w:abstractNum w:abstractNumId="50" w15:restartNumberingAfterBreak="0">
+  <w:abstractNum w:abstractNumId="58" w15:restartNumberingAfterBreak="0">
     <w:nsid w:val="520C5DD3"/>
     <w:multiLevelType w:val="multilevel"/>
     <w:tmpl w:val="753AC0D2"/>
@@ -21948,7 +25080,7 @@
       </w:rPr>
     </w:lvl>
   </w:abstractNum>
-  <w:abstractNum w:abstractNumId="51" w15:restartNumberingAfterBreak="0">
+  <w:abstractNum w:abstractNumId="59" w15:restartNumberingAfterBreak="0">
     <w:nsid w:val="53F5143F"/>
     <w:multiLevelType w:val="hybridMultilevel"/>
     <w:tmpl w:val="B2005722"/>
@@ -22061,7 +25193,7 @@
       </w:rPr>
     </w:lvl>
   </w:abstractNum>
-  <w:abstractNum w:abstractNumId="52" w15:restartNumberingAfterBreak="0">
+  <w:abstractNum w:abstractNumId="60" w15:restartNumberingAfterBreak="0">
     <w:nsid w:val="5418548D"/>
     <w:multiLevelType w:val="multilevel"/>
     <w:tmpl w:val="F3745D64"/>
@@ -22210,7 +25342,7 @@
       </w:rPr>
     </w:lvl>
   </w:abstractNum>
-  <w:abstractNum w:abstractNumId="53" w15:restartNumberingAfterBreak="0">
+  <w:abstractNum w:abstractNumId="61" w15:restartNumberingAfterBreak="0">
     <w:nsid w:val="54E51C22"/>
     <w:multiLevelType w:val="hybridMultilevel"/>
     <w:tmpl w:val="D9A89FBA"/>
@@ -22323,7 +25455,7 @@
       </w:rPr>
     </w:lvl>
   </w:abstractNum>
-  <w:abstractNum w:abstractNumId="54" w15:restartNumberingAfterBreak="0">
+  <w:abstractNum w:abstractNumId="62" w15:restartNumberingAfterBreak="0">
     <w:nsid w:val="56141124"/>
     <w:multiLevelType w:val="multilevel"/>
     <w:tmpl w:val="72CECC2A"/>
@@ -22472,7 +25604,7 @@
       </w:rPr>
     </w:lvl>
   </w:abstractNum>
-  <w:abstractNum w:abstractNumId="55" w15:restartNumberingAfterBreak="0">
+  <w:abstractNum w:abstractNumId="63" w15:restartNumberingAfterBreak="0">
     <w:nsid w:val="5668129C"/>
     <w:multiLevelType w:val="multilevel"/>
     <w:tmpl w:val="193EC38C"/>
@@ -22621,7 +25753,7 @@
       </w:rPr>
     </w:lvl>
   </w:abstractNum>
-  <w:abstractNum w:abstractNumId="56" w15:restartNumberingAfterBreak="0">
+  <w:abstractNum w:abstractNumId="64" w15:restartNumberingAfterBreak="0">
     <w:nsid w:val="5BD530F4"/>
     <w:multiLevelType w:val="multilevel"/>
     <w:tmpl w:val="85BE4242"/>
@@ -22770,7 +25902,7 @@
       </w:rPr>
     </w:lvl>
   </w:abstractNum>
-  <w:abstractNum w:abstractNumId="57" w15:restartNumberingAfterBreak="0">
+  <w:abstractNum w:abstractNumId="65" w15:restartNumberingAfterBreak="0">
     <w:nsid w:val="5F797678"/>
     <w:multiLevelType w:val="multilevel"/>
     <w:tmpl w:val="4BE291F8"/>
@@ -22919,7 +26051,120 @@
       </w:rPr>
     </w:lvl>
   </w:abstractNum>
-  <w:abstractNum w:abstractNumId="58" w15:restartNumberingAfterBreak="0">
+  <w:abstractNum w:abstractNumId="66" w15:restartNumberingAfterBreak="0">
+    <w:nsid w:val="619D222B"/>
+    <w:multiLevelType w:val="hybridMultilevel"/>
+    <w:tmpl w:val="EE5E16D2"/>
+    <w:lvl w:ilvl="0" w:tplc="04090001">
+      <w:start w:val="1"/>
+      <w:numFmt w:val="bullet"/>
+      <w:lvlText w:val=""/>
+      <w:lvlJc w:val="left"/>
+      <w:pPr>
+        <w:ind w:left="720" w:hanging="360"/>
+      </w:pPr>
+      <w:rPr>
+        <w:rFonts w:ascii="Symbol" w:hAnsi="Symbol" w:hint="default"/>
+      </w:rPr>
+    </w:lvl>
+    <w:lvl w:ilvl="1" w:tplc="04090003" w:tentative="1">
+      <w:start w:val="1"/>
+      <w:numFmt w:val="bullet"/>
+      <w:lvlText w:val="o"/>
+      <w:lvlJc w:val="left"/>
+      <w:pPr>
+        <w:ind w:left="1440" w:hanging="360"/>
+      </w:pPr>
+      <w:rPr>
+        <w:rFonts w:ascii="Courier New" w:hAnsi="Courier New" w:cs="Courier New" w:hint="default"/>
+      </w:rPr>
+    </w:lvl>
+    <w:lvl w:ilvl="2" w:tplc="04090005" w:tentative="1">
+      <w:start w:val="1"/>
+      <w:numFmt w:val="bullet"/>
+      <w:lvlText w:val=""/>
+      <w:lvlJc w:val="left"/>
+      <w:pPr>
+        <w:ind w:left="2160" w:hanging="360"/>
+      </w:pPr>
+      <w:rPr>
+        <w:rFonts w:ascii="Wingdings" w:hAnsi="Wingdings" w:hint="default"/>
+      </w:rPr>
+    </w:lvl>
+    <w:lvl w:ilvl="3" w:tplc="04090001" w:tentative="1">
+      <w:start w:val="1"/>
+      <w:numFmt w:val="bullet"/>
+      <w:lvlText w:val=""/>
+      <w:lvlJc w:val="left"/>
+      <w:pPr>
+        <w:ind w:left="2880" w:hanging="360"/>
+      </w:pPr>
+      <w:rPr>
+        <w:rFonts w:ascii="Symbol" w:hAnsi="Symbol" w:hint="default"/>
+      </w:rPr>
+    </w:lvl>
+    <w:lvl w:ilvl="4" w:tplc="04090003" w:tentative="1">
+      <w:start w:val="1"/>
+      <w:numFmt w:val="bullet"/>
+      <w:lvlText w:val="o"/>
+      <w:lvlJc w:val="left"/>
+      <w:pPr>
+        <w:ind w:left="3600" w:hanging="360"/>
+      </w:pPr>
+      <w:rPr>
+        <w:rFonts w:ascii="Courier New" w:hAnsi="Courier New" w:cs="Courier New" w:hint="default"/>
+      </w:rPr>
+    </w:lvl>
+    <w:lvl w:ilvl="5" w:tplc="04090005" w:tentative="1">
+      <w:start w:val="1"/>
+      <w:numFmt w:val="bullet"/>
+      <w:lvlText w:val=""/>
+      <w:lvlJc w:val="left"/>
+      <w:pPr>
+        <w:ind w:left="4320" w:hanging="360"/>
+      </w:pPr>
+      <w:rPr>
+        <w:rFonts w:ascii="Wingdings" w:hAnsi="Wingdings" w:hint="default"/>
+      </w:rPr>
+    </w:lvl>
+    <w:lvl w:ilvl="6" w:tplc="04090001" w:tentative="1">
+      <w:start w:val="1"/>
+      <w:numFmt w:val="bullet"/>
+      <w:lvlText w:val=""/>
+      <w:lvlJc w:val="left"/>
+      <w:pPr>
+        <w:ind w:left="5040" w:hanging="360"/>
+      </w:pPr>
+      <w:rPr>
+        <w:rFonts w:ascii="Symbol" w:hAnsi="Symbol" w:hint="default"/>
+      </w:rPr>
+    </w:lvl>
+    <w:lvl w:ilvl="7" w:tplc="04090003" w:tentative="1">
+      <w:start w:val="1"/>
+      <w:numFmt w:val="bullet"/>
+      <w:lvlText w:val="o"/>
+      <w:lvlJc w:val="left"/>
+      <w:pPr>
+        <w:ind w:left="5760" w:hanging="360"/>
+      </w:pPr>
+      <w:rPr>
+        <w:rFonts w:ascii="Courier New" w:hAnsi="Courier New" w:cs="Courier New" w:hint="default"/>
+      </w:rPr>
+    </w:lvl>
+    <w:lvl w:ilvl="8" w:tplc="04090005" w:tentative="1">
+      <w:start w:val="1"/>
+      <w:numFmt w:val="bullet"/>
+      <w:lvlText w:val=""/>
+      <w:lvlJc w:val="left"/>
+      <w:pPr>
+        <w:ind w:left="6480" w:hanging="360"/>
+      </w:pPr>
+      <w:rPr>
+        <w:rFonts w:ascii="Wingdings" w:hAnsi="Wingdings" w:hint="default"/>
+      </w:rPr>
+    </w:lvl>
+  </w:abstractNum>
+  <w:abstractNum w:abstractNumId="67" w15:restartNumberingAfterBreak="0">
     <w:nsid w:val="64B00720"/>
     <w:multiLevelType w:val="multilevel"/>
     <w:tmpl w:val="ECA4E594"/>
@@ -23068,7 +26313,7 @@
       </w:rPr>
     </w:lvl>
   </w:abstractNum>
-  <w:abstractNum w:abstractNumId="59" w15:restartNumberingAfterBreak="0">
+  <w:abstractNum w:abstractNumId="68" w15:restartNumberingAfterBreak="0">
     <w:nsid w:val="64D8791F"/>
     <w:multiLevelType w:val="multilevel"/>
     <w:tmpl w:val="C818DFEE"/>
@@ -23217,7 +26462,7 @@
       </w:rPr>
     </w:lvl>
   </w:abstractNum>
-  <w:abstractNum w:abstractNumId="60" w15:restartNumberingAfterBreak="0">
+  <w:abstractNum w:abstractNumId="69" w15:restartNumberingAfterBreak="0">
     <w:nsid w:val="65220CC3"/>
     <w:multiLevelType w:val="multilevel"/>
     <w:tmpl w:val="8D34722E"/>
@@ -23366,7 +26611,7 @@
       </w:rPr>
     </w:lvl>
   </w:abstractNum>
-  <w:abstractNum w:abstractNumId="61" w15:restartNumberingAfterBreak="0">
+  <w:abstractNum w:abstractNumId="70" w15:restartNumberingAfterBreak="0">
     <w:nsid w:val="66383948"/>
     <w:multiLevelType w:val="hybridMultilevel"/>
     <w:tmpl w:val="938C0E22"/>
@@ -23479,7 +26724,120 @@
       </w:rPr>
     </w:lvl>
   </w:abstractNum>
-  <w:abstractNum w:abstractNumId="62" w15:restartNumberingAfterBreak="0">
+  <w:abstractNum w:abstractNumId="71" w15:restartNumberingAfterBreak="0">
+    <w:nsid w:val="6CBD68F9"/>
+    <w:multiLevelType w:val="hybridMultilevel"/>
+    <w:tmpl w:val="D6145C82"/>
+    <w:lvl w:ilvl="0" w:tplc="04090001">
+      <w:start w:val="1"/>
+      <w:numFmt w:val="bullet"/>
+      <w:lvlText w:val=""/>
+      <w:lvlJc w:val="left"/>
+      <w:pPr>
+        <w:ind w:left="720" w:hanging="360"/>
+      </w:pPr>
+      <w:rPr>
+        <w:rFonts w:ascii="Symbol" w:hAnsi="Symbol" w:hint="default"/>
+      </w:rPr>
+    </w:lvl>
+    <w:lvl w:ilvl="1" w:tplc="04090003" w:tentative="1">
+      <w:start w:val="1"/>
+      <w:numFmt w:val="bullet"/>
+      <w:lvlText w:val="o"/>
+      <w:lvlJc w:val="left"/>
+      <w:pPr>
+        <w:ind w:left="1440" w:hanging="360"/>
+      </w:pPr>
+      <w:rPr>
+        <w:rFonts w:ascii="Courier New" w:hAnsi="Courier New" w:cs="Courier New" w:hint="default"/>
+      </w:rPr>
+    </w:lvl>
+    <w:lvl w:ilvl="2" w:tplc="04090005" w:tentative="1">
+      <w:start w:val="1"/>
+      <w:numFmt w:val="bullet"/>
+      <w:lvlText w:val=""/>
+      <w:lvlJc w:val="left"/>
+      <w:pPr>
+        <w:ind w:left="2160" w:hanging="360"/>
+      </w:pPr>
+      <w:rPr>
+        <w:rFonts w:ascii="Wingdings" w:hAnsi="Wingdings" w:hint="default"/>
+      </w:rPr>
+    </w:lvl>
+    <w:lvl w:ilvl="3" w:tplc="04090001" w:tentative="1">
+      <w:start w:val="1"/>
+      <w:numFmt w:val="bullet"/>
+      <w:lvlText w:val=""/>
+      <w:lvlJc w:val="left"/>
+      <w:pPr>
+        <w:ind w:left="2880" w:hanging="360"/>
+      </w:pPr>
+      <w:rPr>
+        <w:rFonts w:ascii="Symbol" w:hAnsi="Symbol" w:hint="default"/>
+      </w:rPr>
+    </w:lvl>
+    <w:lvl w:ilvl="4" w:tplc="04090003" w:tentative="1">
+      <w:start w:val="1"/>
+      <w:numFmt w:val="bullet"/>
+      <w:lvlText w:val="o"/>
+      <w:lvlJc w:val="left"/>
+      <w:pPr>
+        <w:ind w:left="3600" w:hanging="360"/>
+      </w:pPr>
+      <w:rPr>
+        <w:rFonts w:ascii="Courier New" w:hAnsi="Courier New" w:cs="Courier New" w:hint="default"/>
+      </w:rPr>
+    </w:lvl>
+    <w:lvl w:ilvl="5" w:tplc="04090005" w:tentative="1">
+      <w:start w:val="1"/>
+      <w:numFmt w:val="bullet"/>
+      <w:lvlText w:val=""/>
+      <w:lvlJc w:val="left"/>
+      <w:pPr>
+        <w:ind w:left="4320" w:hanging="360"/>
+      </w:pPr>
+      <w:rPr>
+        <w:rFonts w:ascii="Wingdings" w:hAnsi="Wingdings" w:hint="default"/>
+      </w:rPr>
+    </w:lvl>
+    <w:lvl w:ilvl="6" w:tplc="04090001" w:tentative="1">
+      <w:start w:val="1"/>
+      <w:numFmt w:val="bullet"/>
+      <w:lvlText w:val=""/>
+      <w:lvlJc w:val="left"/>
+      <w:pPr>
+        <w:ind w:left="5040" w:hanging="360"/>
+      </w:pPr>
+      <w:rPr>
+        <w:rFonts w:ascii="Symbol" w:hAnsi="Symbol" w:hint="default"/>
+      </w:rPr>
+    </w:lvl>
+    <w:lvl w:ilvl="7" w:tplc="04090003" w:tentative="1">
+      <w:start w:val="1"/>
+      <w:numFmt w:val="bullet"/>
+      <w:lvlText w:val="o"/>
+      <w:lvlJc w:val="left"/>
+      <w:pPr>
+        <w:ind w:left="5760" w:hanging="360"/>
+      </w:pPr>
+      <w:rPr>
+        <w:rFonts w:ascii="Courier New" w:hAnsi="Courier New" w:cs="Courier New" w:hint="default"/>
+      </w:rPr>
+    </w:lvl>
+    <w:lvl w:ilvl="8" w:tplc="04090005" w:tentative="1">
+      <w:start w:val="1"/>
+      <w:numFmt w:val="bullet"/>
+      <w:lvlText w:val=""/>
+      <w:lvlJc w:val="left"/>
+      <w:pPr>
+        <w:ind w:left="6480" w:hanging="360"/>
+      </w:pPr>
+      <w:rPr>
+        <w:rFonts w:ascii="Wingdings" w:hAnsi="Wingdings" w:hint="default"/>
+      </w:rPr>
+    </w:lvl>
+  </w:abstractNum>
+  <w:abstractNum w:abstractNumId="72" w15:restartNumberingAfterBreak="0">
     <w:nsid w:val="6D3E2179"/>
     <w:multiLevelType w:val="multilevel"/>
     <w:tmpl w:val="CAE0758E"/>
@@ -23628,7 +26986,7 @@
       </w:rPr>
     </w:lvl>
   </w:abstractNum>
-  <w:abstractNum w:abstractNumId="63" w15:restartNumberingAfterBreak="0">
+  <w:abstractNum w:abstractNumId="73" w15:restartNumberingAfterBreak="0">
     <w:nsid w:val="6E6A33B4"/>
     <w:multiLevelType w:val="multilevel"/>
     <w:tmpl w:val="95FC9004"/>
@@ -23777,7 +27135,120 @@
       </w:rPr>
     </w:lvl>
   </w:abstractNum>
-  <w:abstractNum w:abstractNumId="64" w15:restartNumberingAfterBreak="0">
+  <w:abstractNum w:abstractNumId="74" w15:restartNumberingAfterBreak="0">
+    <w:nsid w:val="6FAB546B"/>
+    <w:multiLevelType w:val="hybridMultilevel"/>
+    <w:tmpl w:val="99DC22E6"/>
+    <w:lvl w:ilvl="0" w:tplc="04090001">
+      <w:start w:val="1"/>
+      <w:numFmt w:val="bullet"/>
+      <w:lvlText w:val=""/>
+      <w:lvlJc w:val="left"/>
+      <w:pPr>
+        <w:ind w:left="720" w:hanging="360"/>
+      </w:pPr>
+      <w:rPr>
+        <w:rFonts w:ascii="Symbol" w:hAnsi="Symbol" w:hint="default"/>
+      </w:rPr>
+    </w:lvl>
+    <w:lvl w:ilvl="1" w:tplc="04090003" w:tentative="1">
+      <w:start w:val="1"/>
+      <w:numFmt w:val="bullet"/>
+      <w:lvlText w:val="o"/>
+      <w:lvlJc w:val="left"/>
+      <w:pPr>
+        <w:ind w:left="1440" w:hanging="360"/>
+      </w:pPr>
+      <w:rPr>
+        <w:rFonts w:ascii="Courier New" w:hAnsi="Courier New" w:cs="Courier New" w:hint="default"/>
+      </w:rPr>
+    </w:lvl>
+    <w:lvl w:ilvl="2" w:tplc="04090005" w:tentative="1">
+      <w:start w:val="1"/>
+      <w:numFmt w:val="bullet"/>
+      <w:lvlText w:val=""/>
+      <w:lvlJc w:val="left"/>
+      <w:pPr>
+        <w:ind w:left="2160" w:hanging="360"/>
+      </w:pPr>
+      <w:rPr>
+        <w:rFonts w:ascii="Wingdings" w:hAnsi="Wingdings" w:hint="default"/>
+      </w:rPr>
+    </w:lvl>
+    <w:lvl w:ilvl="3" w:tplc="04090001" w:tentative="1">
+      <w:start w:val="1"/>
+      <w:numFmt w:val="bullet"/>
+      <w:lvlText w:val=""/>
+      <w:lvlJc w:val="left"/>
+      <w:pPr>
+        <w:ind w:left="2880" w:hanging="360"/>
+      </w:pPr>
+      <w:rPr>
+        <w:rFonts w:ascii="Symbol" w:hAnsi="Symbol" w:hint="default"/>
+      </w:rPr>
+    </w:lvl>
+    <w:lvl w:ilvl="4" w:tplc="04090003" w:tentative="1">
+      <w:start w:val="1"/>
+      <w:numFmt w:val="bullet"/>
+      <w:lvlText w:val="o"/>
+      <w:lvlJc w:val="left"/>
+      <w:pPr>
+        <w:ind w:left="3600" w:hanging="360"/>
+      </w:pPr>
+      <w:rPr>
+        <w:rFonts w:ascii="Courier New" w:hAnsi="Courier New" w:cs="Courier New" w:hint="default"/>
+      </w:rPr>
+    </w:lvl>
+    <w:lvl w:ilvl="5" w:tplc="04090005" w:tentative="1">
+      <w:start w:val="1"/>
+      <w:numFmt w:val="bullet"/>
+      <w:lvlText w:val=""/>
+      <w:lvlJc w:val="left"/>
+      <w:pPr>
+        <w:ind w:left="4320" w:hanging="360"/>
+      </w:pPr>
+      <w:rPr>
+        <w:rFonts w:ascii="Wingdings" w:hAnsi="Wingdings" w:hint="default"/>
+      </w:rPr>
+    </w:lvl>
+    <w:lvl w:ilvl="6" w:tplc="04090001" w:tentative="1">
+      <w:start w:val="1"/>
+      <w:numFmt w:val="bullet"/>
+      <w:lvlText w:val=""/>
+      <w:lvlJc w:val="left"/>
+      <w:pPr>
+        <w:ind w:left="5040" w:hanging="360"/>
+      </w:pPr>
+      <w:rPr>
+        <w:rFonts w:ascii="Symbol" w:hAnsi="Symbol" w:hint="default"/>
+      </w:rPr>
+    </w:lvl>
+    <w:lvl w:ilvl="7" w:tplc="04090003" w:tentative="1">
+      <w:start w:val="1"/>
+      <w:numFmt w:val="bullet"/>
+      <w:lvlText w:val="o"/>
+      <w:lvlJc w:val="left"/>
+      <w:pPr>
+        <w:ind w:left="5760" w:hanging="360"/>
+      </w:pPr>
+      <w:rPr>
+        <w:rFonts w:ascii="Courier New" w:hAnsi="Courier New" w:cs="Courier New" w:hint="default"/>
+      </w:rPr>
+    </w:lvl>
+    <w:lvl w:ilvl="8" w:tplc="04090005" w:tentative="1">
+      <w:start w:val="1"/>
+      <w:numFmt w:val="bullet"/>
+      <w:lvlText w:val=""/>
+      <w:lvlJc w:val="left"/>
+      <w:pPr>
+        <w:ind w:left="6480" w:hanging="360"/>
+      </w:pPr>
+      <w:rPr>
+        <w:rFonts w:ascii="Wingdings" w:hAnsi="Wingdings" w:hint="default"/>
+      </w:rPr>
+    </w:lvl>
+  </w:abstractNum>
+  <w:abstractNum w:abstractNumId="75" w15:restartNumberingAfterBreak="0">
     <w:nsid w:val="714D5569"/>
     <w:multiLevelType w:val="multilevel"/>
     <w:tmpl w:val="CD0AA0D6"/>
@@ -23926,7 +27397,7 @@
       </w:rPr>
     </w:lvl>
   </w:abstractNum>
-  <w:abstractNum w:abstractNumId="65" w15:restartNumberingAfterBreak="0">
+  <w:abstractNum w:abstractNumId="76" w15:restartNumberingAfterBreak="0">
     <w:nsid w:val="73042D32"/>
     <w:multiLevelType w:val="hybridMultilevel"/>
     <w:tmpl w:val="1EF05924"/>
@@ -24039,7 +27510,7 @@
       </w:rPr>
     </w:lvl>
   </w:abstractNum>
-  <w:abstractNum w:abstractNumId="66" w15:restartNumberingAfterBreak="0">
+  <w:abstractNum w:abstractNumId="77" w15:restartNumberingAfterBreak="0">
     <w:nsid w:val="7315484B"/>
     <w:multiLevelType w:val="hybridMultilevel"/>
     <w:tmpl w:val="AABA4838"/>
@@ -24152,7 +27623,120 @@
       </w:rPr>
     </w:lvl>
   </w:abstractNum>
-  <w:abstractNum w:abstractNumId="67" w15:restartNumberingAfterBreak="0">
+  <w:abstractNum w:abstractNumId="78" w15:restartNumberingAfterBreak="0">
+    <w:nsid w:val="76501D39"/>
+    <w:multiLevelType w:val="hybridMultilevel"/>
+    <w:tmpl w:val="999456A0"/>
+    <w:lvl w:ilvl="0" w:tplc="04090001">
+      <w:start w:val="1"/>
+      <w:numFmt w:val="bullet"/>
+      <w:lvlText w:val=""/>
+      <w:lvlJc w:val="left"/>
+      <w:pPr>
+        <w:ind w:left="720" w:hanging="360"/>
+      </w:pPr>
+      <w:rPr>
+        <w:rFonts w:ascii="Symbol" w:hAnsi="Symbol" w:hint="default"/>
+      </w:rPr>
+    </w:lvl>
+    <w:lvl w:ilvl="1" w:tplc="04090003" w:tentative="1">
+      <w:start w:val="1"/>
+      <w:numFmt w:val="bullet"/>
+      <w:lvlText w:val="o"/>
+      <w:lvlJc w:val="left"/>
+      <w:pPr>
+        <w:ind w:left="1440" w:hanging="360"/>
+      </w:pPr>
+      <w:rPr>
+        <w:rFonts w:ascii="Courier New" w:hAnsi="Courier New" w:cs="Courier New" w:hint="default"/>
+      </w:rPr>
+    </w:lvl>
+    <w:lvl w:ilvl="2" w:tplc="04090005" w:tentative="1">
+      <w:start w:val="1"/>
+      <w:numFmt w:val="bullet"/>
+      <w:lvlText w:val=""/>
+      <w:lvlJc w:val="left"/>
+      <w:pPr>
+        <w:ind w:left="2160" w:hanging="360"/>
+      </w:pPr>
+      <w:rPr>
+        <w:rFonts w:ascii="Wingdings" w:hAnsi="Wingdings" w:hint="default"/>
+      </w:rPr>
+    </w:lvl>
+    <w:lvl w:ilvl="3" w:tplc="04090001" w:tentative="1">
+      <w:start w:val="1"/>
+      <w:numFmt w:val="bullet"/>
+      <w:lvlText w:val=""/>
+      <w:lvlJc w:val="left"/>
+      <w:pPr>
+        <w:ind w:left="2880" w:hanging="360"/>
+      </w:pPr>
+      <w:rPr>
+        <w:rFonts w:ascii="Symbol" w:hAnsi="Symbol" w:hint="default"/>
+      </w:rPr>
+    </w:lvl>
+    <w:lvl w:ilvl="4" w:tplc="04090003" w:tentative="1">
+      <w:start w:val="1"/>
+      <w:numFmt w:val="bullet"/>
+      <w:lvlText w:val="o"/>
+      <w:lvlJc w:val="left"/>
+      <w:pPr>
+        <w:ind w:left="3600" w:hanging="360"/>
+      </w:pPr>
+      <w:rPr>
+        <w:rFonts w:ascii="Courier New" w:hAnsi="Courier New" w:cs="Courier New" w:hint="default"/>
+      </w:rPr>
+    </w:lvl>
+    <w:lvl w:ilvl="5" w:tplc="04090005" w:tentative="1">
+      <w:start w:val="1"/>
+      <w:numFmt w:val="bullet"/>
+      <w:lvlText w:val=""/>
+      <w:lvlJc w:val="left"/>
+      <w:pPr>
+        <w:ind w:left="4320" w:hanging="360"/>
+      </w:pPr>
+      <w:rPr>
+        <w:rFonts w:ascii="Wingdings" w:hAnsi="Wingdings" w:hint="default"/>
+      </w:rPr>
+    </w:lvl>
+    <w:lvl w:ilvl="6" w:tplc="04090001" w:tentative="1">
+      <w:start w:val="1"/>
+      <w:numFmt w:val="bullet"/>
+      <w:lvlText w:val=""/>
+      <w:lvlJc w:val="left"/>
+      <w:pPr>
+        <w:ind w:left="5040" w:hanging="360"/>
+      </w:pPr>
+      <w:rPr>
+        <w:rFonts w:ascii="Symbol" w:hAnsi="Symbol" w:hint="default"/>
+      </w:rPr>
+    </w:lvl>
+    <w:lvl w:ilvl="7" w:tplc="04090003" w:tentative="1">
+      <w:start w:val="1"/>
+      <w:numFmt w:val="bullet"/>
+      <w:lvlText w:val="o"/>
+      <w:lvlJc w:val="left"/>
+      <w:pPr>
+        <w:ind w:left="5760" w:hanging="360"/>
+      </w:pPr>
+      <w:rPr>
+        <w:rFonts w:ascii="Courier New" w:hAnsi="Courier New" w:cs="Courier New" w:hint="default"/>
+      </w:rPr>
+    </w:lvl>
+    <w:lvl w:ilvl="8" w:tplc="04090005" w:tentative="1">
+      <w:start w:val="1"/>
+      <w:numFmt w:val="bullet"/>
+      <w:lvlText w:val=""/>
+      <w:lvlJc w:val="left"/>
+      <w:pPr>
+        <w:ind w:left="6480" w:hanging="360"/>
+      </w:pPr>
+      <w:rPr>
+        <w:rFonts w:ascii="Wingdings" w:hAnsi="Wingdings" w:hint="default"/>
+      </w:rPr>
+    </w:lvl>
+  </w:abstractNum>
+  <w:abstractNum w:abstractNumId="79" w15:restartNumberingAfterBreak="0">
     <w:nsid w:val="77AE223B"/>
     <w:multiLevelType w:val="multilevel"/>
     <w:tmpl w:val="E7AC683A"/>
@@ -24301,7 +27885,7 @@
       </w:rPr>
     </w:lvl>
   </w:abstractNum>
-  <w:abstractNum w:abstractNumId="68" w15:restartNumberingAfterBreak="0">
+  <w:abstractNum w:abstractNumId="80" w15:restartNumberingAfterBreak="0">
     <w:nsid w:val="7C261037"/>
     <w:multiLevelType w:val="multilevel"/>
     <w:tmpl w:val="910E7076"/>
@@ -24450,7 +28034,7 @@
       </w:rPr>
     </w:lvl>
   </w:abstractNum>
-  <w:abstractNum w:abstractNumId="69" w15:restartNumberingAfterBreak="0">
+  <w:abstractNum w:abstractNumId="81" w15:restartNumberingAfterBreak="0">
     <w:nsid w:val="7C3B2547"/>
     <w:multiLevelType w:val="multilevel"/>
     <w:tmpl w:val="B18CE0AE"/>
@@ -24599,7 +28183,7 @@
       </w:rPr>
     </w:lvl>
   </w:abstractNum>
-  <w:abstractNum w:abstractNumId="70" w15:restartNumberingAfterBreak="0">
+  <w:abstractNum w:abstractNumId="82" w15:restartNumberingAfterBreak="0">
     <w:nsid w:val="7C495741"/>
     <w:multiLevelType w:val="multilevel"/>
     <w:tmpl w:val="31921748"/>
@@ -24712,7 +28296,7 @@
       </w:pPr>
     </w:lvl>
   </w:abstractNum>
-  <w:abstractNum w:abstractNumId="71" w15:restartNumberingAfterBreak="0">
+  <w:abstractNum w:abstractNumId="83" w15:restartNumberingAfterBreak="0">
     <w:nsid w:val="7C8305CC"/>
     <w:multiLevelType w:val="multilevel"/>
     <w:tmpl w:val="10D04C10"/>
@@ -24861,7 +28445,7 @@
       </w:rPr>
     </w:lvl>
   </w:abstractNum>
-  <w:abstractNum w:abstractNumId="72" w15:restartNumberingAfterBreak="0">
+  <w:abstractNum w:abstractNumId="84" w15:restartNumberingAfterBreak="0">
     <w:nsid w:val="7D050E13"/>
     <w:multiLevelType w:val="hybridMultilevel"/>
     <w:tmpl w:val="4410AC02"/>
@@ -24980,22 +28564,22 @@
     <w:abstractNumId w:val="10"/>
   </w:num>
   <w:num w:numId="3">
-    <w:abstractNumId w:val="39"/>
+    <w:abstractNumId w:val="43"/>
   </w:num>
   <w:num w:numId="4">
-    <w:abstractNumId w:val="54"/>
+    <w:abstractNumId w:val="62"/>
   </w:num>
   <w:num w:numId="5">
     <w:abstractNumId w:val="3"/>
   </w:num>
   <w:num w:numId="6">
-    <w:abstractNumId w:val="68"/>
+    <w:abstractNumId w:val="80"/>
   </w:num>
   <w:num w:numId="7">
-    <w:abstractNumId w:val="69"/>
+    <w:abstractNumId w:val="81"/>
   </w:num>
   <w:num w:numId="8">
-    <w:abstractNumId w:val="67"/>
+    <w:abstractNumId w:val="79"/>
   </w:num>
   <w:num w:numId="9">
     <w:abstractNumId w:val="4"/>
@@ -25004,55 +28588,55 @@
     <w:abstractNumId w:val="13"/>
   </w:num>
   <w:num w:numId="11">
-    <w:abstractNumId w:val="56"/>
+    <w:abstractNumId w:val="64"/>
   </w:num>
   <w:num w:numId="12">
     <w:abstractNumId w:val="23"/>
   </w:num>
   <w:num w:numId="13">
-    <w:abstractNumId w:val="62"/>
+    <w:abstractNumId w:val="72"/>
   </w:num>
   <w:num w:numId="14">
     <w:abstractNumId w:val="16"/>
   </w:num>
   <w:num w:numId="15">
-    <w:abstractNumId w:val="51"/>
+    <w:abstractNumId w:val="59"/>
   </w:num>
   <w:num w:numId="16">
     <w:abstractNumId w:val="12"/>
   </w:num>
   <w:num w:numId="17">
-    <w:abstractNumId w:val="70"/>
+    <w:abstractNumId w:val="82"/>
   </w:num>
   <w:num w:numId="18">
-    <w:abstractNumId w:val="42"/>
+    <w:abstractNumId w:val="48"/>
   </w:num>
   <w:num w:numId="19">
     <w:abstractNumId w:val="2"/>
   </w:num>
   <w:num w:numId="20">
-    <w:abstractNumId w:val="43"/>
+    <w:abstractNumId w:val="51"/>
   </w:num>
   <w:num w:numId="21">
-    <w:abstractNumId w:val="59"/>
+    <w:abstractNumId w:val="68"/>
   </w:num>
   <w:num w:numId="22">
-    <w:abstractNumId w:val="37"/>
+    <w:abstractNumId w:val="41"/>
   </w:num>
   <w:num w:numId="23">
-    <w:abstractNumId w:val="26"/>
+    <w:abstractNumId w:val="27"/>
   </w:num>
   <w:num w:numId="24">
-    <w:abstractNumId w:val="52"/>
+    <w:abstractNumId w:val="60"/>
   </w:num>
   <w:num w:numId="25">
     <w:abstractNumId w:val="5"/>
   </w:num>
   <w:num w:numId="26">
-    <w:abstractNumId w:val="58"/>
+    <w:abstractNumId w:val="67"/>
   </w:num>
   <w:num w:numId="27">
-    <w:abstractNumId w:val="57"/>
+    <w:abstractNumId w:val="65"/>
   </w:num>
   <w:num w:numId="28">
     <w:abstractNumId w:val="25"/>
@@ -25064,58 +28648,58 @@
     <w:abstractNumId w:val="9"/>
   </w:num>
   <w:num w:numId="31">
-    <w:abstractNumId w:val="27"/>
+    <w:abstractNumId w:val="28"/>
   </w:num>
   <w:num w:numId="32">
-    <w:abstractNumId w:val="36"/>
+    <w:abstractNumId w:val="40"/>
   </w:num>
   <w:num w:numId="33">
     <w:abstractNumId w:val="21"/>
   </w:num>
   <w:num w:numId="34">
-    <w:abstractNumId w:val="38"/>
+    <w:abstractNumId w:val="42"/>
   </w:num>
   <w:num w:numId="35">
-    <w:abstractNumId w:val="53"/>
+    <w:abstractNumId w:val="61"/>
   </w:num>
   <w:num w:numId="36">
     <w:abstractNumId w:val="7"/>
   </w:num>
   <w:num w:numId="37">
-    <w:abstractNumId w:val="65"/>
+    <w:abstractNumId w:val="76"/>
   </w:num>
   <w:num w:numId="38">
     <w:abstractNumId w:val="8"/>
   </w:num>
   <w:num w:numId="39">
-    <w:abstractNumId w:val="64"/>
+    <w:abstractNumId w:val="75"/>
   </w:num>
   <w:num w:numId="40">
-    <w:abstractNumId w:val="44"/>
+    <w:abstractNumId w:val="52"/>
   </w:num>
   <w:num w:numId="41">
     <w:abstractNumId w:val="6"/>
   </w:num>
   <w:num w:numId="42">
-    <w:abstractNumId w:val="31"/>
+    <w:abstractNumId w:val="34"/>
   </w:num>
   <w:num w:numId="43">
-    <w:abstractNumId w:val="63"/>
+    <w:abstractNumId w:val="73"/>
   </w:num>
   <w:num w:numId="44">
-    <w:abstractNumId w:val="29"/>
+    <w:abstractNumId w:val="31"/>
   </w:num>
   <w:num w:numId="45">
     <w:abstractNumId w:val="22"/>
   </w:num>
   <w:num w:numId="46">
-    <w:abstractNumId w:val="49"/>
+    <w:abstractNumId w:val="57"/>
   </w:num>
   <w:num w:numId="47">
-    <w:abstractNumId w:val="55"/>
+    <w:abstractNumId w:val="63"/>
   </w:num>
   <w:num w:numId="48">
-    <w:abstractNumId w:val="28"/>
+    <w:abstractNumId w:val="29"/>
   </w:num>
   <w:num w:numId="49">
     <w:abstractNumId w:val="1"/>
@@ -25124,13 +28708,13 @@
     <w:abstractNumId w:val="18"/>
   </w:num>
   <w:num w:numId="51">
-    <w:abstractNumId w:val="34"/>
+    <w:abstractNumId w:val="37"/>
   </w:num>
   <w:num w:numId="52">
-    <w:abstractNumId w:val="40"/>
+    <w:abstractNumId w:val="44"/>
   </w:num>
   <w:num w:numId="53">
-    <w:abstractNumId w:val="48"/>
+    <w:abstractNumId w:val="56"/>
   </w:num>
   <w:num w:numId="54">
     <w:abstractNumId w:val="17"/>
@@ -25142,46 +28726,46 @@
     <w:abstractNumId w:val="11"/>
   </w:num>
   <w:num w:numId="57">
-    <w:abstractNumId w:val="50"/>
+    <w:abstractNumId w:val="58"/>
   </w:num>
   <w:num w:numId="58">
-    <w:abstractNumId w:val="60"/>
+    <w:abstractNumId w:val="69"/>
   </w:num>
   <w:num w:numId="59">
-    <w:abstractNumId w:val="72"/>
+    <w:abstractNumId w:val="84"/>
   </w:num>
   <w:num w:numId="60">
-    <w:abstractNumId w:val="35"/>
+    <w:abstractNumId w:val="38"/>
   </w:num>
   <w:num w:numId="61">
-    <w:abstractNumId w:val="66"/>
+    <w:abstractNumId w:val="77"/>
   </w:num>
   <w:num w:numId="62">
-    <w:abstractNumId w:val="47"/>
+    <w:abstractNumId w:val="55"/>
   </w:num>
   <w:num w:numId="63">
-    <w:abstractNumId w:val="61"/>
+    <w:abstractNumId w:val="70"/>
   </w:num>
   <w:num w:numId="64">
-    <w:abstractNumId w:val="71"/>
+    <w:abstractNumId w:val="83"/>
   </w:num>
   <w:num w:numId="65">
-    <w:abstractNumId w:val="41"/>
+    <w:abstractNumId w:val="46"/>
   </w:num>
   <w:num w:numId="66">
-    <w:abstractNumId w:val="46"/>
+    <w:abstractNumId w:val="54"/>
   </w:num>
   <w:num w:numId="67">
-    <w:abstractNumId w:val="45"/>
+    <w:abstractNumId w:val="53"/>
   </w:num>
   <w:num w:numId="68">
-    <w:abstractNumId w:val="33"/>
+    <w:abstractNumId w:val="36"/>
   </w:num>
   <w:num w:numId="69">
     <w:abstractNumId w:val="15"/>
   </w:num>
   <w:num w:numId="70">
-    <w:abstractNumId w:val="30"/>
+    <w:abstractNumId w:val="32"/>
   </w:num>
   <w:num w:numId="71">
     <w:abstractNumId w:val="24"/>
@@ -25190,9 +28774,45 @@
     <w:abstractNumId w:val="14"/>
   </w:num>
   <w:num w:numId="73">
-    <w:abstractNumId w:val="32"/>
+    <w:abstractNumId w:val="35"/>
   </w:num>
-  <w:numIdMacAtCleanup w:val="63"/>
+  <w:num w:numId="74">
+    <w:abstractNumId w:val="30"/>
+  </w:num>
+  <w:num w:numId="75">
+    <w:abstractNumId w:val="71"/>
+  </w:num>
+  <w:num w:numId="76">
+    <w:abstractNumId w:val="39"/>
+  </w:num>
+  <w:num w:numId="77">
+    <w:abstractNumId w:val="26"/>
+  </w:num>
+  <w:num w:numId="78">
+    <w:abstractNumId w:val="78"/>
+  </w:num>
+  <w:num w:numId="79">
+    <w:abstractNumId w:val="47"/>
+  </w:num>
+  <w:num w:numId="80">
+    <w:abstractNumId w:val="66"/>
+  </w:num>
+  <w:num w:numId="81">
+    <w:abstractNumId w:val="33"/>
+  </w:num>
+  <w:num w:numId="82">
+    <w:abstractNumId w:val="45"/>
+  </w:num>
+  <w:num w:numId="83">
+    <w:abstractNumId w:val="74"/>
+  </w:num>
+  <w:num w:numId="84">
+    <w:abstractNumId w:val="50"/>
+  </w:num>
+  <w:num w:numId="85">
+    <w:abstractNumId w:val="49"/>
+  </w:num>
+  <w:numIdMacAtCleanup w:val="85"/>
 </w:numbering>
 </file>
 
@@ -25589,7 +29209,7 @@
   <w:style w:type="paragraph" w:default="1" w:styleId="Normal">
     <w:name w:val="Normal"/>
     <w:qFormat/>
-    <w:rsid w:val="00E9387D"/>
+    <w:rsid w:val="005E15ED"/>
   </w:style>
   <w:style w:type="paragraph" w:styleId="Heading2">
     <w:name w:val="heading 2"/>
@@ -26003,7 +29623,7 @@
 </file>
 
 <file path=customXml/itemProps1.xml><?xml version="1.0" encoding="utf-8"?>
-<ds:datastoreItem xmlns:ds="http://schemas.openxmlformats.org/officeDocument/2006/customXml" ds:itemID="{E227F166-5622-4DCB-96D1-C525EAF4920A}">
+<ds:datastoreItem xmlns:ds="http://schemas.openxmlformats.org/officeDocument/2006/customXml" ds:itemID="{21E7FF54-2E9B-4285-BB3A-05D6E033D830}">
   <ds:schemaRefs>
     <ds:schemaRef ds:uri="http://schemas.openxmlformats.org/officeDocument/2006/bibliography"/>
   </ds:schemaRefs>

</xml_diff>

<commit_message>
feat: system upgrade - ML engine enhancements, executive narrative, explorer IPC, ingestion improvements, dashboard updates
</commit_message>
<xml_diff>
--- a/docs/01_Daily_Log.docx
+++ b/docs/01_Daily_Log.docx
@@ -19792,23 +19792,1676 @@
         </w:rPr>
       </w:pPr>
       <w:r>
-        <w:t xml:space="preserve">Continue with </w:t>
-      </w:r>
-      <w:r>
-        <w:t xml:space="preserve"> SCANkar project</w:t>
-      </w:r>
+        <w:rPr>
+          <w:rFonts w:ascii="Times New Roman" w:hAnsi="Times New Roman" w:cs="Times New Roman"/>
+          <w:sz w:val="24"/>
+          <w:szCs w:val="24"/>
+        </w:rPr>
+        <w:t>Continue with  SCANkar project</w:t>
+      </w:r>
+    </w:p>
+    <w:p>
+      <w:pPr>
+        <w:spacing w:after="0" w:line="240" w:lineRule="auto"/>
+        <w:rPr>
+          <w:rFonts w:ascii="Times New Roman" w:eastAsia="Times New Roman" w:hAnsi="Times New Roman" w:cs="Times New Roman"/>
+          <w:sz w:val="24"/>
+          <w:szCs w:val="24"/>
+        </w:rPr>
+      </w:pPr>
+    </w:p>
+    <w:p>
+      <w:pPr>
+        <w:spacing w:after="0" w:line="240" w:lineRule="auto"/>
+        <w:rPr>
+          <w:rFonts w:ascii="Times New Roman" w:eastAsia="Times New Roman" w:hAnsi="Times New Roman" w:cs="Times New Roman"/>
+          <w:sz w:val="24"/>
+          <w:szCs w:val="24"/>
+        </w:rPr>
+      </w:pPr>
+    </w:p>
+    <w:p>
+      <w:pPr>
+        <w:spacing w:after="0" w:line="240" w:lineRule="auto"/>
+        <w:rPr>
+          <w:rFonts w:ascii="Times New Roman" w:eastAsia="Times New Roman" w:hAnsi="Times New Roman" w:cs="Times New Roman"/>
+          <w:sz w:val="24"/>
+          <w:szCs w:val="24"/>
+        </w:rPr>
+      </w:pPr>
+    </w:p>
+    <w:p>
+      <w:pPr>
+        <w:spacing w:after="0" w:line="240" w:lineRule="auto"/>
+        <w:rPr>
+          <w:rFonts w:ascii="Times New Roman" w:eastAsia="Times New Roman" w:hAnsi="Times New Roman" w:cs="Times New Roman"/>
+          <w:sz w:val="24"/>
+          <w:szCs w:val="24"/>
+        </w:rPr>
+      </w:pPr>
+    </w:p>
+    <w:p>
+      <w:pPr>
+        <w:spacing w:after="0" w:line="240" w:lineRule="auto"/>
+        <w:rPr>
+          <w:rFonts w:ascii="Times New Roman" w:eastAsia="Times New Roman" w:hAnsi="Times New Roman" w:cs="Times New Roman"/>
+          <w:sz w:val="24"/>
+          <w:szCs w:val="24"/>
+        </w:rPr>
+      </w:pPr>
+    </w:p>
+    <w:p>
+      <w:pPr>
+        <w:spacing w:after="0" w:line="240" w:lineRule="auto"/>
+        <w:rPr>
+          <w:rFonts w:ascii="Times New Roman" w:eastAsia="Times New Roman" w:hAnsi="Times New Roman" w:cs="Times New Roman"/>
+          <w:sz w:val="24"/>
+          <w:szCs w:val="24"/>
+        </w:rPr>
+      </w:pPr>
+    </w:p>
+    <w:p>
+      <w:pPr>
+        <w:spacing w:after="0" w:line="240" w:lineRule="auto"/>
+        <w:rPr>
+          <w:rFonts w:ascii="Times New Roman" w:eastAsia="Times New Roman" w:hAnsi="Times New Roman" w:cs="Times New Roman"/>
+          <w:sz w:val="24"/>
+          <w:szCs w:val="24"/>
+        </w:rPr>
+      </w:pPr>
+    </w:p>
+    <w:p>
+      <w:pPr>
+        <w:spacing w:after="0" w:line="240" w:lineRule="auto"/>
+        <w:rPr>
+          <w:rFonts w:ascii="Times New Roman" w:eastAsia="Times New Roman" w:hAnsi="Times New Roman" w:cs="Times New Roman"/>
+          <w:sz w:val="24"/>
+          <w:szCs w:val="24"/>
+        </w:rPr>
+      </w:pPr>
+    </w:p>
+    <w:p>
+      <w:pPr>
+        <w:spacing w:after="0" w:line="240" w:lineRule="auto"/>
+        <w:outlineLvl w:val="1"/>
+        <w:rPr>
+          <w:rFonts w:ascii="Times New Roman" w:eastAsia="Times New Roman" w:hAnsi="Times New Roman" w:cs="Times New Roman"/>
+          <w:b/>
+          <w:sz w:val="24"/>
+          <w:szCs w:val="24"/>
+        </w:rPr>
+      </w:pPr>
+      <w:r>
+        <w:rPr>
+          <w:rFonts w:ascii="Times New Roman" w:eastAsia="Times New Roman" w:hAnsi="Times New Roman" w:cs="Times New Roman"/>
+          <w:b/>
+          <w:bCs/>
+          <w:sz w:val="24"/>
+          <w:szCs w:val="24"/>
+        </w:rPr>
+        <w:lastRenderedPageBreak/>
+        <w:t>Date:</w:t>
+      </w:r>
+      <w:r>
+        <w:rPr>
+          <w:rFonts w:ascii="Times New Roman" w:eastAsia="Times New Roman" w:hAnsi="Times New Roman" w:cs="Times New Roman"/>
+          <w:b/>
+          <w:sz w:val="24"/>
+          <w:szCs w:val="24"/>
+        </w:rPr>
+        <w:t xml:space="preserve"> 20</w:t>
+      </w:r>
+      <w:r>
+        <w:rPr>
+          <w:rFonts w:ascii="Times New Roman" w:eastAsia="Times New Roman" w:hAnsi="Times New Roman" w:cs="Times New Roman"/>
+          <w:b/>
+          <w:sz w:val="24"/>
+          <w:szCs w:val="24"/>
+        </w:rPr>
+        <w:t xml:space="preserve">/02/2026                                                                                    </w:t>
+      </w:r>
+      <w:r>
+        <w:rPr>
+          <w:rFonts w:ascii="Times New Roman" w:eastAsia="Times New Roman" w:hAnsi="Times New Roman" w:cs="Times New Roman"/>
+          <w:b/>
+          <w:sz w:val="24"/>
+          <w:szCs w:val="24"/>
+        </w:rPr>
+        <w:t xml:space="preserve">                          Day 33</w:t>
+      </w:r>
+      <w:r>
+        <w:rPr>
+          <w:rFonts w:ascii="Times New Roman" w:eastAsia="Times New Roman" w:hAnsi="Times New Roman" w:cs="Times New Roman"/>
+          <w:b/>
+          <w:sz w:val="24"/>
+          <w:szCs w:val="24"/>
+        </w:rPr>
+        <w:br/>
+      </w:r>
+      <w:r>
+        <w:rPr>
+          <w:rFonts w:ascii="Times New Roman" w:eastAsia="Times New Roman" w:hAnsi="Times New Roman" w:cs="Times New Roman"/>
+          <w:b/>
+          <w:bCs/>
+          <w:sz w:val="24"/>
+          <w:szCs w:val="24"/>
+        </w:rPr>
+        <w:t>Department:</w:t>
+      </w:r>
+      <w:r>
+        <w:rPr>
+          <w:rFonts w:ascii="Times New Roman" w:eastAsia="Times New Roman" w:hAnsi="Times New Roman" w:cs="Times New Roman"/>
+          <w:b/>
+          <w:sz w:val="24"/>
+          <w:szCs w:val="24"/>
+        </w:rPr>
+        <w:t xml:space="preserve"> Maintenance</w:t>
+      </w:r>
+      <w:r>
+        <w:rPr>
+          <w:rFonts w:ascii="Times New Roman" w:eastAsia="Times New Roman" w:hAnsi="Times New Roman" w:cs="Times New Roman"/>
+          <w:b/>
+          <w:sz w:val="24"/>
+          <w:szCs w:val="24"/>
+        </w:rPr>
+        <w:br/>
+      </w:r>
+      <w:r>
+        <w:rPr>
+          <w:rFonts w:ascii="Times New Roman" w:eastAsia="Times New Roman" w:hAnsi="Times New Roman" w:cs="Times New Roman"/>
+          <w:b/>
+          <w:bCs/>
+          <w:sz w:val="24"/>
+          <w:szCs w:val="24"/>
+        </w:rPr>
+        <w:t>Plant:</w:t>
+      </w:r>
+      <w:r>
+        <w:rPr>
+          <w:rFonts w:ascii="Times New Roman" w:eastAsia="Times New Roman" w:hAnsi="Times New Roman" w:cs="Times New Roman"/>
+          <w:b/>
+          <w:sz w:val="24"/>
+          <w:szCs w:val="24"/>
+        </w:rPr>
+        <w:t xml:space="preserve"> Drive Shaft Manufacturing</w:t>
+      </w:r>
+    </w:p>
+    <w:p>
+      <w:pPr>
+        <w:spacing w:after="0" w:line="240" w:lineRule="auto"/>
+        <w:outlineLvl w:val="1"/>
+        <w:rPr>
+          <w:rFonts w:ascii="Times New Roman" w:eastAsia="Times New Roman" w:hAnsi="Times New Roman" w:cs="Times New Roman"/>
+          <w:b/>
+          <w:sz w:val="24"/>
+          <w:szCs w:val="24"/>
+        </w:rPr>
+      </w:pPr>
+      <w:r>
+        <w:rPr>
+          <w:rFonts w:ascii="Times New Roman" w:eastAsia="Times New Roman" w:hAnsi="Times New Roman" w:cs="Times New Roman"/>
+          <w:b/>
+          <w:sz w:val="24"/>
+          <w:szCs w:val="24"/>
+        </w:rPr>
+        <w:t>Work from Home</w:t>
+      </w:r>
+    </w:p>
+    <w:p>
+      <w:pPr>
+        <w:spacing w:after="0" w:line="240" w:lineRule="auto"/>
+        <w:rPr>
+          <w:rFonts w:ascii="Times New Roman" w:eastAsia="Times New Roman" w:hAnsi="Times New Roman" w:cs="Times New Roman"/>
+          <w:sz w:val="24"/>
+          <w:szCs w:val="24"/>
+        </w:rPr>
+      </w:pPr>
+    </w:p>
+    <w:p>
+      <w:pPr>
+        <w:pStyle w:val="Heading2"/>
+        <w:spacing w:before="0" w:beforeAutospacing="0" w:after="0" w:afterAutospacing="0"/>
+        <w:rPr>
+          <w:sz w:val="24"/>
+          <w:szCs w:val="24"/>
+        </w:rPr>
+      </w:pPr>
+      <w:r>
+        <w:rPr>
+          <w:rStyle w:val="Strong"/>
+          <w:b/>
+          <w:bCs/>
+          <w:sz w:val="24"/>
+          <w:szCs w:val="24"/>
+        </w:rPr>
+        <w:t>Objective</w:t>
+      </w:r>
+    </w:p>
+    <w:p>
+      <w:pPr>
+        <w:pStyle w:val="NormalWeb"/>
+        <w:spacing w:before="0" w:beforeAutospacing="0" w:after="0" w:afterAutospacing="0"/>
+      </w:pPr>
+      <w:r>
+        <w:t>To stabilize the packaging process, resolve installer-related issues, and plan the offline ML action strategy for the Industrial Intelligence Platform.</w:t>
+      </w:r>
+    </w:p>
+    <w:p>
+      <w:pPr>
+        <w:pStyle w:val="Heading2"/>
+        <w:spacing w:before="0" w:beforeAutospacing="0" w:after="0" w:afterAutospacing="0"/>
+        <w:rPr>
+          <w:sz w:val="24"/>
+          <w:szCs w:val="24"/>
+        </w:rPr>
+      </w:pPr>
+      <w:r>
+        <w:rPr>
+          <w:rStyle w:val="Strong"/>
+          <w:b/>
+          <w:bCs/>
+          <w:sz w:val="24"/>
+          <w:szCs w:val="24"/>
+        </w:rPr>
+        <w:t>Work Completed</w:t>
+      </w:r>
+    </w:p>
+    <w:p>
+      <w:pPr>
+        <w:pStyle w:val="Heading3"/>
+        <w:spacing w:before="0" w:beforeAutospacing="0" w:after="0" w:afterAutospacing="0"/>
+        <w:rPr>
+          <w:sz w:val="24"/>
+          <w:szCs w:val="24"/>
+        </w:rPr>
+      </w:pPr>
+      <w:r>
+        <w:rPr>
+          <w:sz w:val="24"/>
+          <w:szCs w:val="24"/>
+        </w:rPr>
+        <w:t>1️</w:t>
+      </w:r>
+      <w:r>
+        <w:rPr>
+          <w:sz w:val="24"/>
+          <w:szCs w:val="24"/>
+        </w:rPr>
+        <w:t xml:space="preserve">. </w:t>
+      </w:r>
+      <w:r>
+        <w:rPr>
+          <w:sz w:val="24"/>
+          <w:szCs w:val="24"/>
+        </w:rPr>
+        <w:t>NSIS Installer Error Resolution</w:t>
+      </w:r>
+    </w:p>
+    <w:p>
+      <w:pPr>
+        <w:pStyle w:val="NormalWeb"/>
+        <w:numPr>
+          <w:ilvl w:val="0"/>
+          <w:numId w:val="106"/>
+        </w:numPr>
+        <w:spacing w:before="0" w:beforeAutospacing="0" w:after="0" w:afterAutospacing="0"/>
+      </w:pPr>
+      <w:r>
+        <w:t>Identified and resolved NSIS installer configuration issues.</w:t>
+      </w:r>
+    </w:p>
+    <w:p>
+      <w:pPr>
+        <w:pStyle w:val="NormalWeb"/>
+        <w:numPr>
+          <w:ilvl w:val="0"/>
+          <w:numId w:val="106"/>
+        </w:numPr>
+        <w:spacing w:before="0" w:beforeAutospacing="0" w:after="0" w:afterAutospacing="0"/>
+      </w:pPr>
+      <w:r>
+        <w:t>Fixed icon-related errors and macro parameter mismatches.</w:t>
+      </w:r>
+    </w:p>
+    <w:p>
+      <w:pPr>
+        <w:pStyle w:val="NormalWeb"/>
+        <w:numPr>
+          <w:ilvl w:val="0"/>
+          <w:numId w:val="106"/>
+        </w:numPr>
+        <w:spacing w:before="0" w:beforeAutospacing="0" w:after="0" w:afterAutospacing="0"/>
+      </w:pPr>
+      <w:r>
+        <w:t>Ensured proper shortcut creation using correct shell context.</w:t>
+      </w:r>
+    </w:p>
+    <w:p>
+      <w:pPr>
+        <w:pStyle w:val="NormalWeb"/>
+        <w:numPr>
+          <w:ilvl w:val="0"/>
+          <w:numId w:val="106"/>
+        </w:numPr>
+        <w:spacing w:before="0" w:beforeAutospacing="0" w:after="0" w:afterAutospacing="0"/>
+      </w:pPr>
+      <w:r>
+        <w:t>Rebuilt installer successfully after debugging configuration.</w:t>
+      </w:r>
+    </w:p>
+    <w:p>
+      <w:pPr>
+        <w:pStyle w:val="NormalWeb"/>
+        <w:numPr>
+          <w:ilvl w:val="0"/>
+          <w:numId w:val="106"/>
+        </w:numPr>
+        <w:spacing w:before="0" w:beforeAutospacing="0" w:after="0" w:afterAutospacing="0"/>
+      </w:pPr>
+      <w:r>
+        <w:t>Verified installer compilation and generation of executable setup file.</w:t>
+      </w:r>
+    </w:p>
+    <w:p>
+      <w:pPr>
+        <w:spacing w:after="0"/>
+        <w:rPr>
+          <w:rFonts w:ascii="Times New Roman" w:hAnsi="Times New Roman" w:cs="Times New Roman"/>
+          <w:sz w:val="24"/>
+          <w:szCs w:val="24"/>
+        </w:rPr>
+      </w:pPr>
+    </w:p>
+    <w:p>
+      <w:pPr>
+        <w:pStyle w:val="Heading3"/>
+        <w:spacing w:before="0" w:beforeAutospacing="0" w:after="0" w:afterAutospacing="0"/>
+        <w:rPr>
+          <w:sz w:val="24"/>
+          <w:szCs w:val="24"/>
+        </w:rPr>
+      </w:pPr>
+      <w:r>
+        <w:rPr>
+          <w:sz w:val="24"/>
+          <w:szCs w:val="24"/>
+        </w:rPr>
+        <w:t>2️</w:t>
+      </w:r>
+      <w:r>
+        <w:rPr>
+          <w:sz w:val="24"/>
+          <w:szCs w:val="24"/>
+        </w:rPr>
+        <w:t xml:space="preserve">. </w:t>
+      </w:r>
+      <w:r>
+        <w:rPr>
+          <w:sz w:val="24"/>
+          <w:szCs w:val="24"/>
+        </w:rPr>
+        <w:t>ML Action Planning (Offline Mode)</w:t>
+      </w:r>
+    </w:p>
+    <w:p>
+      <w:pPr>
+        <w:pStyle w:val="NormalWeb"/>
+        <w:spacing w:before="0" w:beforeAutospacing="0" w:after="0" w:afterAutospacing="0"/>
+      </w:pPr>
+      <w:r>
+        <w:t>Planned structured implementation strategy for offline ML engine integration.</w:t>
+      </w:r>
+    </w:p>
+    <w:p>
+      <w:pPr>
+        <w:pStyle w:val="NormalWeb"/>
+        <w:spacing w:before="0" w:beforeAutospacing="0" w:after="0" w:afterAutospacing="0"/>
+      </w:pPr>
+      <w:r>
+        <w:t>Defined:</w:t>
+      </w:r>
+    </w:p>
+    <w:p>
+      <w:pPr>
+        <w:pStyle w:val="NormalWeb"/>
+        <w:numPr>
+          <w:ilvl w:val="0"/>
+          <w:numId w:val="107"/>
+        </w:numPr>
+        <w:spacing w:before="0" w:beforeAutospacing="0" w:after="0" w:afterAutospacing="0"/>
+      </w:pPr>
+      <w:r>
+        <w:t>Offline anomaly detection strategy.</w:t>
+      </w:r>
+    </w:p>
+    <w:p>
+      <w:pPr>
+        <w:pStyle w:val="NormalWeb"/>
+        <w:numPr>
+          <w:ilvl w:val="0"/>
+          <w:numId w:val="107"/>
+        </w:numPr>
+        <w:spacing w:before="0" w:beforeAutospacing="0" w:after="0" w:afterAutospacing="0"/>
+      </w:pPr>
+      <w:r>
+        <w:t>Repeat failure probability model approach.</w:t>
+      </w:r>
+    </w:p>
+    <w:p>
+      <w:pPr>
+        <w:pStyle w:val="NormalWeb"/>
+        <w:numPr>
+          <w:ilvl w:val="0"/>
+          <w:numId w:val="107"/>
+        </w:numPr>
+        <w:spacing w:before="0" w:beforeAutospacing="0" w:after="0" w:afterAutospacing="0"/>
+      </w:pPr>
+      <w:r>
+        <w:t>Risk scoring formula combining:</w:t>
+      </w:r>
+    </w:p>
+    <w:p>
+      <w:pPr>
+        <w:pStyle w:val="NormalWeb"/>
+        <w:numPr>
+          <w:ilvl w:val="1"/>
+          <w:numId w:val="107"/>
+        </w:numPr>
+        <w:spacing w:before="0" w:beforeAutospacing="0" w:after="0" w:afterAutospacing="0"/>
+      </w:pPr>
+      <w:r>
+        <w:t>Failure frequency</w:t>
+      </w:r>
+    </w:p>
+    <w:p>
+      <w:pPr>
+        <w:pStyle w:val="NormalWeb"/>
+        <w:numPr>
+          <w:ilvl w:val="1"/>
+          <w:numId w:val="107"/>
+        </w:numPr>
+        <w:spacing w:before="0" w:beforeAutospacing="0" w:after="0" w:afterAutospacing="0"/>
+      </w:pPr>
+      <w:r>
+        <w:t>Downtime</w:t>
+      </w:r>
+    </w:p>
+    <w:p>
+      <w:pPr>
+        <w:pStyle w:val="NormalWeb"/>
+        <w:numPr>
+          <w:ilvl w:val="1"/>
+          <w:numId w:val="107"/>
+        </w:numPr>
+        <w:spacing w:before="0" w:beforeAutospacing="0" w:after="0" w:afterAutospacing="0"/>
+      </w:pPr>
+      <w:r>
+        <w:t>Pattern recurrence</w:t>
+      </w:r>
+    </w:p>
+    <w:p>
+      <w:pPr>
+        <w:pStyle w:val="NormalWeb"/>
+        <w:numPr>
+          <w:ilvl w:val="0"/>
+          <w:numId w:val="107"/>
+        </w:numPr>
+        <w:spacing w:before="0" w:beforeAutospacing="0" w:after="0" w:afterAutospacing="0"/>
+      </w:pPr>
+      <w:r>
+        <w:t>Deterministic model behavior (no external APIs).</w:t>
+      </w:r>
+    </w:p>
+    <w:p>
+      <w:pPr>
+        <w:pStyle w:val="NormalWeb"/>
+        <w:numPr>
+          <w:ilvl w:val="0"/>
+          <w:numId w:val="107"/>
+        </w:numPr>
+        <w:spacing w:before="0" w:beforeAutospacing="0" w:after="0" w:afterAutospacing="0"/>
+      </w:pPr>
+      <w:r>
+        <w:t>Local training &amp; inference pipeline.</w:t>
+      </w:r>
+    </w:p>
+    <w:p>
+      <w:pPr>
+        <w:pStyle w:val="NormalWeb"/>
+        <w:numPr>
+          <w:ilvl w:val="0"/>
+          <w:numId w:val="107"/>
+        </w:numPr>
+        <w:spacing w:before="0" w:beforeAutospacing="0" w:after="0" w:afterAutospacing="0"/>
+      </w:pPr>
+      <w:r>
+        <w:t>ML + Rule Engine hybrid architecture.</w:t>
+      </w:r>
+    </w:p>
+    <w:p>
+      <w:pPr>
+        <w:pStyle w:val="NormalWeb"/>
+        <w:spacing w:before="0" w:beforeAutospacing="0" w:after="0" w:afterAutospacing="0"/>
+      </w:pPr>
+      <w:r>
+        <w:t>Designed ML objectives:</w:t>
+      </w:r>
+    </w:p>
+    <w:p>
+      <w:pPr>
+        <w:pStyle w:val="NormalWeb"/>
+        <w:numPr>
+          <w:ilvl w:val="0"/>
+          <w:numId w:val="108"/>
+        </w:numPr>
+        <w:spacing w:before="0" w:beforeAutospacing="0" w:after="0" w:afterAutospacing="0"/>
+      </w:pPr>
+      <w:r>
+        <w:t>Anomaly detection (Isolation Forest / LOF).</w:t>
+      </w:r>
+    </w:p>
+    <w:p>
+      <w:pPr>
+        <w:pStyle w:val="NormalWeb"/>
+        <w:numPr>
+          <w:ilvl w:val="0"/>
+          <w:numId w:val="108"/>
+        </w:numPr>
+        <w:spacing w:before="0" w:beforeAutospacing="0" w:after="0" w:afterAutospacing="0"/>
+      </w:pPr>
+      <w:r>
+        <w:t>Downtime prediction via regression.</w:t>
+      </w:r>
+    </w:p>
+    <w:p>
+      <w:pPr>
+        <w:pStyle w:val="NormalWeb"/>
+        <w:numPr>
+          <w:ilvl w:val="0"/>
+          <w:numId w:val="108"/>
+        </w:numPr>
+        <w:spacing w:before="0" w:beforeAutospacing="0" w:after="0" w:afterAutospacing="0"/>
+      </w:pPr>
+      <w:r>
+        <w:t>Machine risk classification.</w:t>
+      </w:r>
+    </w:p>
+    <w:p>
+      <w:pPr>
+        <w:pStyle w:val="NormalWeb"/>
+        <w:numPr>
+          <w:ilvl w:val="0"/>
+          <w:numId w:val="108"/>
+        </w:numPr>
+        <w:spacing w:before="0" w:beforeAutospacing="0" w:after="0" w:afterAutospacing="0"/>
+      </w:pPr>
+      <w:r>
+        <w:t>Predictive insight generation.</w:t>
+      </w:r>
+    </w:p>
+    <w:p>
+      <w:pPr>
+        <w:pStyle w:val="Heading3"/>
+        <w:spacing w:before="0" w:beforeAutospacing="0" w:after="0" w:afterAutospacing="0"/>
+        <w:rPr>
+          <w:sz w:val="24"/>
+          <w:szCs w:val="24"/>
+        </w:rPr>
+      </w:pPr>
+      <w:r>
+        <w:rPr>
+          <w:sz w:val="24"/>
+          <w:szCs w:val="24"/>
+        </w:rPr>
+        <w:t>3️</w:t>
+      </w:r>
+      <w:r>
+        <w:rPr>
+          <w:sz w:val="24"/>
+          <w:szCs w:val="24"/>
+        </w:rPr>
+        <w:t xml:space="preserve">. </w:t>
+      </w:r>
+      <w:r>
+        <w:rPr>
+          <w:sz w:val="24"/>
+          <w:szCs w:val="24"/>
+        </w:rPr>
+        <w:t>Architecture Alignment</w:t>
+      </w:r>
+    </w:p>
+    <w:p>
+      <w:pPr>
+        <w:pStyle w:val="NormalWeb"/>
+        <w:numPr>
+          <w:ilvl w:val="0"/>
+          <w:numId w:val="109"/>
+        </w:numPr>
+        <w:spacing w:before="0" w:beforeAutospacing="0" w:after="0" w:afterAutospacing="0"/>
+      </w:pPr>
+      <w:r>
+        <w:t>Reviewed pipeline sequence alignment with ML integration.</w:t>
+      </w:r>
+    </w:p>
+    <w:p>
+      <w:pPr>
+        <w:pStyle w:val="NormalWeb"/>
+        <w:numPr>
+          <w:ilvl w:val="0"/>
+          <w:numId w:val="109"/>
+        </w:numPr>
+        <w:spacing w:before="0" w:beforeAutospacing="0" w:after="0" w:afterAutospacing="0"/>
+      </w:pPr>
+      <w:r>
+        <w:t>Ensured ML layer fits between Rule Engine and Orchestrator.</w:t>
+      </w:r>
+    </w:p>
+    <w:p>
+      <w:pPr>
+        <w:pStyle w:val="NormalWeb"/>
+        <w:numPr>
+          <w:ilvl w:val="0"/>
+          <w:numId w:val="109"/>
+        </w:numPr>
+        <w:spacing w:before="0" w:beforeAutospacing="0" w:after="0" w:afterAutospacing="0"/>
+      </w:pPr>
+      <w:r>
+        <w:t>Planned deterministic output formatting for executive insight generation.</w:t>
+      </w:r>
+    </w:p>
+    <w:p>
+      <w:pPr>
+        <w:pStyle w:val="NormalWeb"/>
+        <w:numPr>
+          <w:ilvl w:val="0"/>
+          <w:numId w:val="109"/>
+        </w:numPr>
+        <w:spacing w:before="0" w:beforeAutospacing="0" w:after="0" w:afterAutospacing="0"/>
+      </w:pPr>
+      <w:r>
+        <w:t>Confirmed offline-only constraint maintained.</w:t>
+      </w:r>
+    </w:p>
+    <w:p>
+      <w:pPr>
+        <w:pStyle w:val="Heading2"/>
+        <w:spacing w:before="0" w:beforeAutospacing="0" w:after="0" w:afterAutospacing="0"/>
+        <w:rPr>
+          <w:sz w:val="24"/>
+          <w:szCs w:val="24"/>
+        </w:rPr>
+      </w:pPr>
+      <w:r>
+        <w:rPr>
+          <w:rStyle w:val="Strong"/>
+          <w:b/>
+          <w:bCs/>
+          <w:sz w:val="24"/>
+          <w:szCs w:val="24"/>
+        </w:rPr>
+        <w:t>Key Learnings</w:t>
+      </w:r>
+    </w:p>
+    <w:p>
+      <w:pPr>
+        <w:pStyle w:val="NormalWeb"/>
+        <w:numPr>
+          <w:ilvl w:val="0"/>
+          <w:numId w:val="110"/>
+        </w:numPr>
+        <w:spacing w:before="0" w:beforeAutospacing="0" w:after="0" w:afterAutospacing="0"/>
+      </w:pPr>
+      <w:r>
+        <w:t>NSIS requires strict macro structure compliance.</w:t>
+      </w:r>
+    </w:p>
+    <w:p>
+      <w:pPr>
+        <w:pStyle w:val="NormalWeb"/>
+        <w:numPr>
+          <w:ilvl w:val="0"/>
+          <w:numId w:val="110"/>
+        </w:numPr>
+        <w:spacing w:before="0" w:beforeAutospacing="0" w:after="0" w:afterAutospacing="0"/>
+      </w:pPr>
+      <w:r>
+        <w:t>Production packaging must avoid hardcoded paths.</w:t>
+      </w:r>
+    </w:p>
+    <w:p>
+      <w:pPr>
+        <w:pStyle w:val="NormalWeb"/>
+        <w:numPr>
+          <w:ilvl w:val="0"/>
+          <w:numId w:val="110"/>
+        </w:numPr>
+        <w:spacing w:before="0" w:beforeAutospacing="0" w:after="0" w:afterAutospacing="0"/>
+      </w:pPr>
+      <w:r>
+        <w:t>ML integration must be deterministic and reproducible.</w:t>
+      </w:r>
+    </w:p>
+    <w:p>
+      <w:pPr>
+        <w:pStyle w:val="NormalWeb"/>
+        <w:numPr>
+          <w:ilvl w:val="0"/>
+          <w:numId w:val="110"/>
+        </w:numPr>
+        <w:spacing w:before="0" w:beforeAutospacing="0" w:after="0" w:afterAutospacing="0"/>
+      </w:pPr>
+      <w:r>
+        <w:t>Hybrid Rule + ML architecture provides better interpretability.</w:t>
+      </w:r>
+    </w:p>
+    <w:p>
+      <w:pPr>
+        <w:spacing w:after="0" w:line="240" w:lineRule="auto"/>
+        <w:rPr>
+          <w:rFonts w:ascii="Times New Roman" w:eastAsia="Times New Roman" w:hAnsi="Times New Roman" w:cs="Times New Roman"/>
+          <w:sz w:val="24"/>
+          <w:szCs w:val="24"/>
+        </w:rPr>
+      </w:pPr>
+    </w:p>
+    <w:p>
+      <w:pPr>
+        <w:spacing w:after="0" w:line="240" w:lineRule="auto"/>
+        <w:rPr>
+          <w:rFonts w:ascii="Times New Roman" w:eastAsia="Times New Roman" w:hAnsi="Times New Roman" w:cs="Times New Roman"/>
+          <w:sz w:val="24"/>
+          <w:szCs w:val="24"/>
+        </w:rPr>
+      </w:pPr>
+    </w:p>
+    <w:p>
+      <w:pPr>
+        <w:spacing w:after="0" w:line="240" w:lineRule="auto"/>
+        <w:rPr>
+          <w:rFonts w:ascii="Times New Roman" w:eastAsia="Times New Roman" w:hAnsi="Times New Roman" w:cs="Times New Roman"/>
+          <w:sz w:val="24"/>
+          <w:szCs w:val="24"/>
+        </w:rPr>
+      </w:pPr>
+    </w:p>
+    <w:p>
+      <w:pPr>
+        <w:spacing w:after="0" w:line="240" w:lineRule="auto"/>
+        <w:outlineLvl w:val="1"/>
+        <w:rPr>
+          <w:rFonts w:ascii="Times New Roman" w:eastAsia="Times New Roman" w:hAnsi="Times New Roman" w:cs="Times New Roman"/>
+          <w:b/>
+          <w:sz w:val="24"/>
+          <w:szCs w:val="24"/>
+        </w:rPr>
+      </w:pPr>
+      <w:r>
+        <w:rPr>
+          <w:rFonts w:ascii="Times New Roman" w:eastAsia="Times New Roman" w:hAnsi="Times New Roman" w:cs="Times New Roman"/>
+          <w:b/>
+          <w:bCs/>
+          <w:sz w:val="24"/>
+          <w:szCs w:val="24"/>
+        </w:rPr>
+        <w:lastRenderedPageBreak/>
+        <w:t>Date:</w:t>
+      </w:r>
+      <w:r>
+        <w:rPr>
+          <w:rFonts w:ascii="Times New Roman" w:eastAsia="Times New Roman" w:hAnsi="Times New Roman" w:cs="Times New Roman"/>
+          <w:b/>
+          <w:sz w:val="24"/>
+          <w:szCs w:val="24"/>
+        </w:rPr>
+        <w:t xml:space="preserve"> 21</w:t>
+      </w:r>
+      <w:r>
+        <w:rPr>
+          <w:rFonts w:ascii="Times New Roman" w:eastAsia="Times New Roman" w:hAnsi="Times New Roman" w:cs="Times New Roman"/>
+          <w:b/>
+          <w:sz w:val="24"/>
+          <w:szCs w:val="24"/>
+        </w:rPr>
+        <w:t xml:space="preserve">/02/2026                                                                                    </w:t>
+      </w:r>
+      <w:r>
+        <w:rPr>
+          <w:rFonts w:ascii="Times New Roman" w:eastAsia="Times New Roman" w:hAnsi="Times New Roman" w:cs="Times New Roman"/>
+          <w:b/>
+          <w:sz w:val="24"/>
+          <w:szCs w:val="24"/>
+        </w:rPr>
+        <w:t xml:space="preserve">                          Day 34</w:t>
+      </w:r>
+      <w:r>
+        <w:rPr>
+          <w:rFonts w:ascii="Times New Roman" w:eastAsia="Times New Roman" w:hAnsi="Times New Roman" w:cs="Times New Roman"/>
+          <w:b/>
+          <w:sz w:val="24"/>
+          <w:szCs w:val="24"/>
+        </w:rPr>
+        <w:br/>
+      </w:r>
+      <w:r>
+        <w:rPr>
+          <w:rFonts w:ascii="Times New Roman" w:eastAsia="Times New Roman" w:hAnsi="Times New Roman" w:cs="Times New Roman"/>
+          <w:b/>
+          <w:bCs/>
+          <w:sz w:val="24"/>
+          <w:szCs w:val="24"/>
+        </w:rPr>
+        <w:t>Department:</w:t>
+      </w:r>
+      <w:r>
+        <w:rPr>
+          <w:rFonts w:ascii="Times New Roman" w:eastAsia="Times New Roman" w:hAnsi="Times New Roman" w:cs="Times New Roman"/>
+          <w:b/>
+          <w:sz w:val="24"/>
+          <w:szCs w:val="24"/>
+        </w:rPr>
+        <w:t xml:space="preserve"> Maintenance</w:t>
+      </w:r>
+      <w:r>
+        <w:rPr>
+          <w:rFonts w:ascii="Times New Roman" w:eastAsia="Times New Roman" w:hAnsi="Times New Roman" w:cs="Times New Roman"/>
+          <w:b/>
+          <w:sz w:val="24"/>
+          <w:szCs w:val="24"/>
+        </w:rPr>
+        <w:br/>
+      </w:r>
+      <w:r>
+        <w:rPr>
+          <w:rFonts w:ascii="Times New Roman" w:eastAsia="Times New Roman" w:hAnsi="Times New Roman" w:cs="Times New Roman"/>
+          <w:b/>
+          <w:bCs/>
+          <w:sz w:val="24"/>
+          <w:szCs w:val="24"/>
+        </w:rPr>
+        <w:t>Plant:</w:t>
+      </w:r>
+      <w:r>
+        <w:rPr>
+          <w:rFonts w:ascii="Times New Roman" w:eastAsia="Times New Roman" w:hAnsi="Times New Roman" w:cs="Times New Roman"/>
+          <w:b/>
+          <w:sz w:val="24"/>
+          <w:szCs w:val="24"/>
+        </w:rPr>
+        <w:t xml:space="preserve"> Drive Shaft Manufacturing</w:t>
+      </w:r>
+    </w:p>
+    <w:p>
+      <w:pPr>
+        <w:spacing w:after="0" w:line="240" w:lineRule="auto"/>
+        <w:outlineLvl w:val="1"/>
+        <w:rPr>
+          <w:rFonts w:ascii="Times New Roman" w:eastAsia="Times New Roman" w:hAnsi="Times New Roman" w:cs="Times New Roman"/>
+          <w:b/>
+          <w:sz w:val="24"/>
+          <w:szCs w:val="24"/>
+        </w:rPr>
+      </w:pPr>
+      <w:r>
+        <w:rPr>
+          <w:rFonts w:ascii="Times New Roman" w:eastAsia="Times New Roman" w:hAnsi="Times New Roman" w:cs="Times New Roman"/>
+          <w:b/>
+          <w:sz w:val="24"/>
+          <w:szCs w:val="24"/>
+        </w:rPr>
+        <w:t>Shift: Third Shift</w:t>
+      </w:r>
+    </w:p>
+    <w:p>
+      <w:pPr>
+        <w:pStyle w:val="Heading2"/>
+        <w:spacing w:before="0" w:beforeAutospacing="0" w:after="0" w:afterAutospacing="0"/>
+        <w:rPr>
+          <w:sz w:val="24"/>
+          <w:szCs w:val="24"/>
+        </w:rPr>
+      </w:pPr>
+      <w:r>
+        <w:rPr>
+          <w:rStyle w:val="Strong"/>
+          <w:b/>
+          <w:bCs/>
+          <w:sz w:val="24"/>
+          <w:szCs w:val="24"/>
+        </w:rPr>
+        <w:t>Objective</w:t>
+      </w:r>
+    </w:p>
+    <w:p>
+      <w:pPr>
+        <w:pStyle w:val="NormalWeb"/>
+        <w:spacing w:before="0" w:beforeAutospacing="0" w:after="0" w:afterAutospacing="0"/>
+      </w:pPr>
+      <w:r>
+        <w:t>To maintain operational tracking consistency and initiate structured planning for the ScanKar application.</w:t>
+      </w:r>
+    </w:p>
+    <w:p>
+      <w:pPr>
+        <w:pStyle w:val="Heading2"/>
+        <w:spacing w:before="0" w:beforeAutospacing="0" w:after="0" w:afterAutospacing="0"/>
+        <w:rPr>
+          <w:sz w:val="24"/>
+          <w:szCs w:val="24"/>
+        </w:rPr>
+      </w:pPr>
+      <w:r>
+        <w:rPr>
+          <w:rStyle w:val="Strong"/>
+          <w:b/>
+          <w:bCs/>
+          <w:sz w:val="24"/>
+          <w:szCs w:val="24"/>
+        </w:rPr>
+        <w:t>Work Completed</w:t>
+      </w:r>
+    </w:p>
+    <w:p>
+      <w:pPr>
+        <w:pStyle w:val="Heading3"/>
+        <w:spacing w:before="0" w:beforeAutospacing="0" w:after="0" w:afterAutospacing="0"/>
+        <w:rPr>
+          <w:sz w:val="24"/>
+          <w:szCs w:val="24"/>
+        </w:rPr>
+      </w:pPr>
+      <w:r>
+        <w:rPr>
+          <w:sz w:val="24"/>
+          <w:szCs w:val="24"/>
+        </w:rPr>
+        <w:t>1️</w:t>
+      </w:r>
+      <w:r>
+        <w:rPr>
+          <w:rFonts w:ascii="Tahoma" w:hAnsi="Tahoma" w:cs="Tahoma"/>
+          <w:sz w:val="24"/>
+          <w:szCs w:val="24"/>
+        </w:rPr>
+        <w:t xml:space="preserve">. </w:t>
+      </w:r>
+      <w:r>
+        <w:rPr>
+          <w:sz w:val="24"/>
+          <w:szCs w:val="24"/>
+        </w:rPr>
+        <w:t>Operational Tracking</w:t>
+      </w:r>
+    </w:p>
+    <w:p>
+      <w:pPr>
+        <w:pStyle w:val="NormalWeb"/>
+        <w:numPr>
+          <w:ilvl w:val="0"/>
+          <w:numId w:val="111"/>
+        </w:numPr>
+        <w:spacing w:before="0" w:beforeAutospacing="0" w:after="0" w:afterAutospacing="0"/>
+      </w:pPr>
+      <w:r>
+        <w:t>Updated Readings sheet (as per daily routine).</w:t>
+      </w:r>
+    </w:p>
+    <w:p>
+      <w:pPr>
+        <w:pStyle w:val="NormalWeb"/>
+        <w:numPr>
+          <w:ilvl w:val="0"/>
+          <w:numId w:val="111"/>
+        </w:numPr>
+        <w:spacing w:before="0" w:beforeAutospacing="0" w:after="0" w:afterAutospacing="0"/>
+      </w:pPr>
+      <w:r>
+        <w:t>Updated Power Cost Analysis sheet.</w:t>
+      </w:r>
+    </w:p>
+    <w:p>
+      <w:pPr>
+        <w:pStyle w:val="NormalWeb"/>
+        <w:numPr>
+          <w:ilvl w:val="0"/>
+          <w:numId w:val="111"/>
+        </w:numPr>
+        <w:spacing w:before="0" w:beforeAutospacing="0" w:after="0" w:afterAutospacing="0"/>
+      </w:pPr>
+      <w:r>
+        <w:t>Ensured consistency in energy consumption tracking.</w:t>
+      </w:r>
+    </w:p>
+    <w:p>
+      <w:pPr>
+        <w:pStyle w:val="NormalWeb"/>
+        <w:numPr>
+          <w:ilvl w:val="0"/>
+          <w:numId w:val="111"/>
+        </w:numPr>
+        <w:spacing w:before="0" w:beforeAutospacing="0" w:after="0" w:afterAutospacing="0"/>
+      </w:pPr>
+      <w:r>
+        <w:t>Verified data alignment with prior entries (Day 32 reference).</w:t>
+      </w:r>
+    </w:p>
+    <w:p>
+      <w:pPr>
+        <w:pStyle w:val="Heading3"/>
+        <w:spacing w:before="0" w:beforeAutospacing="0" w:after="0" w:afterAutospacing="0"/>
+        <w:rPr>
+          <w:sz w:val="24"/>
+          <w:szCs w:val="24"/>
+        </w:rPr>
+      </w:pPr>
+      <w:r>
+        <w:rPr>
+          <w:sz w:val="24"/>
+          <w:szCs w:val="24"/>
+        </w:rPr>
+        <w:t>2️</w:t>
+      </w:r>
+      <w:r>
+        <w:rPr>
+          <w:rFonts w:ascii="Tahoma" w:hAnsi="Tahoma" w:cs="Tahoma"/>
+          <w:sz w:val="24"/>
+          <w:szCs w:val="24"/>
+        </w:rPr>
+        <w:t xml:space="preserve">. </w:t>
+      </w:r>
+      <w:r>
+        <w:rPr>
+          <w:sz w:val="24"/>
+          <w:szCs w:val="24"/>
+        </w:rPr>
+        <w:t>ScanKar Application Review</w:t>
+      </w:r>
+    </w:p>
+    <w:p>
+      <w:pPr>
+        <w:pStyle w:val="NormalWeb"/>
+        <w:numPr>
+          <w:ilvl w:val="0"/>
+          <w:numId w:val="112"/>
+        </w:numPr>
+        <w:spacing w:before="0" w:beforeAutospacing="0" w:after="0" w:afterAutospacing="0"/>
+      </w:pPr>
+      <w:r>
+        <w:t>Reviewed existing ScanKar project structure.</w:t>
+      </w:r>
+    </w:p>
+    <w:p>
+      <w:pPr>
+        <w:pStyle w:val="NormalWeb"/>
+        <w:numPr>
+          <w:ilvl w:val="0"/>
+          <w:numId w:val="112"/>
+        </w:numPr>
+        <w:spacing w:before="0" w:beforeAutospacing="0" w:after="0" w:afterAutospacing="0"/>
+      </w:pPr>
+      <w:r>
+        <w:t>Evaluated current UI components and architecture.</w:t>
+      </w:r>
+    </w:p>
+    <w:p>
+      <w:pPr>
+        <w:pStyle w:val="NormalWeb"/>
+        <w:numPr>
+          <w:ilvl w:val="0"/>
+          <w:numId w:val="112"/>
+        </w:numPr>
+        <w:spacing w:before="0" w:beforeAutospacing="0" w:after="0" w:afterAutospacing="0"/>
+      </w:pPr>
+      <w:r>
+        <w:t>Identified gaps in UX flow and navigation clarity.</w:t>
+      </w:r>
+    </w:p>
+    <w:p>
+      <w:pPr>
+        <w:pStyle w:val="NormalWeb"/>
+        <w:numPr>
+          <w:ilvl w:val="0"/>
+          <w:numId w:val="112"/>
+        </w:numPr>
+        <w:spacing w:before="0" w:beforeAutospacing="0" w:after="0" w:afterAutospacing="0"/>
+      </w:pPr>
+      <w:r>
+        <w:t>Assessed scalability potential of current design.</w:t>
+      </w:r>
+    </w:p>
+    <w:p>
+      <w:pPr>
+        <w:pStyle w:val="Heading3"/>
+        <w:spacing w:before="0" w:beforeAutospacing="0" w:after="0" w:afterAutospacing="0"/>
+        <w:rPr>
+          <w:sz w:val="24"/>
+          <w:szCs w:val="24"/>
+        </w:rPr>
+      </w:pPr>
+      <w:r>
+        <w:rPr>
+          <w:sz w:val="24"/>
+          <w:szCs w:val="24"/>
+        </w:rPr>
+        <w:t>3️</w:t>
+      </w:r>
+      <w:r>
+        <w:rPr>
+          <w:rFonts w:ascii="Tahoma" w:hAnsi="Tahoma" w:cs="Tahoma"/>
+          <w:sz w:val="24"/>
+          <w:szCs w:val="24"/>
+        </w:rPr>
+        <w:t xml:space="preserve">. </w:t>
+      </w:r>
+      <w:r>
+        <w:rPr>
+          <w:sz w:val="24"/>
+          <w:szCs w:val="24"/>
+        </w:rPr>
+        <w:t>UI Planning – ScanKar App</w:t>
+      </w:r>
+    </w:p>
+    <w:p>
+      <w:pPr>
+        <w:pStyle w:val="NormalWeb"/>
+        <w:spacing w:before="0" w:beforeAutospacing="0" w:after="0" w:afterAutospacing="0"/>
+      </w:pPr>
+      <w:r>
+        <w:t>Defined:</w:t>
+      </w:r>
+    </w:p>
+    <w:p>
+      <w:pPr>
+        <w:pStyle w:val="NormalWeb"/>
+        <w:numPr>
+          <w:ilvl w:val="0"/>
+          <w:numId w:val="113"/>
+        </w:numPr>
+        <w:spacing w:before="0" w:beforeAutospacing="0" w:after="0" w:afterAutospacing="0"/>
+      </w:pPr>
+      <w:r>
+        <w:t>Target user persona.</w:t>
+      </w:r>
+    </w:p>
+    <w:p>
+      <w:pPr>
+        <w:pStyle w:val="NormalWeb"/>
+        <w:numPr>
+          <w:ilvl w:val="0"/>
+          <w:numId w:val="113"/>
+        </w:numPr>
+        <w:spacing w:before="0" w:beforeAutospacing="0" w:after="0" w:afterAutospacing="0"/>
+      </w:pPr>
+      <w:r>
+        <w:t>Primary workflows.</w:t>
+      </w:r>
+    </w:p>
+    <w:p>
+      <w:pPr>
+        <w:pStyle w:val="NormalWeb"/>
+        <w:numPr>
+          <w:ilvl w:val="0"/>
+          <w:numId w:val="113"/>
+        </w:numPr>
+        <w:spacing w:before="0" w:beforeAutospacing="0" w:after="0" w:afterAutospacing="0"/>
+      </w:pPr>
+      <w:r>
+        <w:t>Feature segmentation.</w:t>
+      </w:r>
+    </w:p>
+    <w:p>
+      <w:pPr>
+        <w:pStyle w:val="NormalWeb"/>
+        <w:numPr>
+          <w:ilvl w:val="0"/>
+          <w:numId w:val="113"/>
+        </w:numPr>
+        <w:spacing w:before="0" w:beforeAutospacing="0" w:after="0" w:afterAutospacing="0"/>
+      </w:pPr>
+      <w:r>
+        <w:t>Modular component design strategy.</w:t>
+      </w:r>
+    </w:p>
+    <w:p>
+      <w:pPr>
+        <w:pStyle w:val="NormalWeb"/>
+        <w:numPr>
+          <w:ilvl w:val="0"/>
+          <w:numId w:val="113"/>
+        </w:numPr>
+        <w:spacing w:before="0" w:beforeAutospacing="0" w:after="0" w:afterAutospacing="0"/>
+      </w:pPr>
+      <w:r>
+        <w:t>Interaction mapping between core features.</w:t>
+      </w:r>
+    </w:p>
+    <w:p>
+      <w:pPr>
+        <w:pStyle w:val="NormalWeb"/>
+        <w:spacing w:before="0" w:beforeAutospacing="0" w:after="0" w:afterAutospacing="0"/>
+      </w:pPr>
+      <w:r>
+        <w:t>Outlined:</w:t>
+      </w:r>
+    </w:p>
+    <w:p>
+      <w:pPr>
+        <w:pStyle w:val="NormalWeb"/>
+        <w:numPr>
+          <w:ilvl w:val="0"/>
+          <w:numId w:val="114"/>
+        </w:numPr>
+        <w:spacing w:before="0" w:beforeAutospacing="0" w:after="0" w:afterAutospacing="0"/>
+      </w:pPr>
+      <w:r>
+        <w:t>Home layout</w:t>
+      </w:r>
+    </w:p>
+    <w:p>
+      <w:pPr>
+        <w:pStyle w:val="NormalWeb"/>
+        <w:numPr>
+          <w:ilvl w:val="0"/>
+          <w:numId w:val="114"/>
+        </w:numPr>
+        <w:spacing w:before="0" w:beforeAutospacing="0" w:after="0" w:afterAutospacing="0"/>
+      </w:pPr>
+      <w:r>
+        <w:t>Action modules</w:t>
+      </w:r>
+    </w:p>
+    <w:p>
+      <w:pPr>
+        <w:pStyle w:val="NormalWeb"/>
+        <w:numPr>
+          <w:ilvl w:val="0"/>
+          <w:numId w:val="114"/>
+        </w:numPr>
+        <w:spacing w:before="0" w:beforeAutospacing="0" w:after="0" w:afterAutospacing="0"/>
+      </w:pPr>
+      <w:r>
+        <w:t>Data display structure</w:t>
+      </w:r>
+    </w:p>
+    <w:p>
+      <w:pPr>
+        <w:pStyle w:val="NormalWeb"/>
+        <w:numPr>
+          <w:ilvl w:val="0"/>
+          <w:numId w:val="114"/>
+        </w:numPr>
+        <w:spacing w:before="0" w:beforeAutospacing="0" w:after="0" w:afterAutospacing="0"/>
+      </w:pPr>
+      <w:r>
+        <w:t>Navigation hierarchy</w:t>
+      </w:r>
+    </w:p>
+    <w:p>
+      <w:pPr>
+        <w:pStyle w:val="Heading3"/>
+        <w:spacing w:before="0" w:beforeAutospacing="0" w:after="0" w:afterAutospacing="0"/>
+        <w:rPr>
+          <w:sz w:val="24"/>
+          <w:szCs w:val="24"/>
+        </w:rPr>
+      </w:pPr>
+      <w:r>
+        <w:rPr>
+          <w:sz w:val="24"/>
+          <w:szCs w:val="24"/>
+        </w:rPr>
+        <w:t>4️</w:t>
+      </w:r>
+      <w:r>
+        <w:rPr>
+          <w:rFonts w:ascii="Tahoma" w:hAnsi="Tahoma" w:cs="Tahoma"/>
+          <w:sz w:val="24"/>
+          <w:szCs w:val="24"/>
+        </w:rPr>
+        <w:t xml:space="preserve">. </w:t>
+      </w:r>
+      <w:r>
+        <w:rPr>
+          <w:sz w:val="24"/>
+          <w:szCs w:val="24"/>
+        </w:rPr>
+        <w:t>Wireframing</w:t>
+      </w:r>
+    </w:p>
+    <w:p>
+      <w:pPr>
+        <w:pStyle w:val="NormalWeb"/>
+        <w:spacing w:before="0" w:beforeAutospacing="0" w:after="0" w:afterAutospacing="0"/>
+      </w:pPr>
+      <w:r>
+        <w:t>Created initial wireframes covering:</w:t>
+      </w:r>
+    </w:p>
+    <w:p>
+      <w:pPr>
+        <w:pStyle w:val="NormalWeb"/>
+        <w:numPr>
+          <w:ilvl w:val="0"/>
+          <w:numId w:val="115"/>
+        </w:numPr>
+        <w:spacing w:before="0" w:beforeAutospacing="0" w:after="0" w:afterAutospacing="0"/>
+      </w:pPr>
+      <w:r>
+        <w:t>Dashboard layout</w:t>
+      </w:r>
+    </w:p>
+    <w:p>
+      <w:pPr>
+        <w:pStyle w:val="NormalWeb"/>
+        <w:numPr>
+          <w:ilvl w:val="0"/>
+          <w:numId w:val="115"/>
+        </w:numPr>
+        <w:spacing w:before="0" w:beforeAutospacing="0" w:after="0" w:afterAutospacing="0"/>
+      </w:pPr>
+      <w:r>
+        <w:t>Core interaction screens</w:t>
+      </w:r>
+    </w:p>
+    <w:p>
+      <w:pPr>
+        <w:pStyle w:val="NormalWeb"/>
+        <w:numPr>
+          <w:ilvl w:val="0"/>
+          <w:numId w:val="115"/>
+        </w:numPr>
+        <w:spacing w:before="0" w:beforeAutospacing="0" w:after="0" w:afterAutospacing="0"/>
+      </w:pPr>
+      <w:r>
+        <w:t>Input modules</w:t>
+      </w:r>
+    </w:p>
+    <w:p>
+      <w:pPr>
+        <w:pStyle w:val="NormalWeb"/>
+        <w:numPr>
+          <w:ilvl w:val="0"/>
+          <w:numId w:val="115"/>
+        </w:numPr>
+        <w:spacing w:before="0" w:beforeAutospacing="0" w:after="0" w:afterAutospacing="0"/>
+      </w:pPr>
+      <w:r>
+        <w:t>Reporting/summary pages</w:t>
+      </w:r>
+    </w:p>
+    <w:p>
+      <w:pPr>
+        <w:pStyle w:val="NormalWeb"/>
+        <w:numPr>
+          <w:ilvl w:val="0"/>
+          <w:numId w:val="115"/>
+        </w:numPr>
+        <w:spacing w:before="0" w:beforeAutospacing="0" w:after="0" w:afterAutospacing="0"/>
+      </w:pPr>
+      <w:r>
+        <w:t>Navigation flow</w:t>
+      </w:r>
+    </w:p>
+    <w:p>
+      <w:pPr>
+        <w:pStyle w:val="NormalWeb"/>
+        <w:spacing w:before="0" w:beforeAutospacing="0" w:after="0" w:afterAutospacing="0"/>
+      </w:pPr>
+      <w:r>
+        <w:t>Focused on:</w:t>
+      </w:r>
+    </w:p>
+    <w:p>
+      <w:pPr>
+        <w:pStyle w:val="NormalWeb"/>
+        <w:numPr>
+          <w:ilvl w:val="0"/>
+          <w:numId w:val="116"/>
+        </w:numPr>
+        <w:spacing w:before="0" w:beforeAutospacing="0" w:after="0" w:afterAutospacing="0"/>
+      </w:pPr>
+      <w:r>
+        <w:t>Simplicity</w:t>
+      </w:r>
+    </w:p>
+    <w:p>
+      <w:pPr>
+        <w:pStyle w:val="NormalWeb"/>
+        <w:numPr>
+          <w:ilvl w:val="0"/>
+          <w:numId w:val="116"/>
+        </w:numPr>
+        <w:spacing w:before="0" w:beforeAutospacing="0" w:after="0" w:afterAutospacing="0"/>
+      </w:pPr>
+      <w:r>
+        <w:t>Scalability</w:t>
+      </w:r>
+    </w:p>
+    <w:p>
+      <w:pPr>
+        <w:pStyle w:val="NormalWeb"/>
+        <w:numPr>
+          <w:ilvl w:val="0"/>
+          <w:numId w:val="116"/>
+        </w:numPr>
+        <w:spacing w:before="0" w:beforeAutospacing="0" w:after="0" w:afterAutospacing="0"/>
+      </w:pPr>
+      <w:r>
+        <w:t>Responsive layout</w:t>
+      </w:r>
+    </w:p>
+    <w:p>
+      <w:pPr>
+        <w:pStyle w:val="NormalWeb"/>
+        <w:numPr>
+          <w:ilvl w:val="0"/>
+          <w:numId w:val="116"/>
+        </w:numPr>
+        <w:spacing w:before="0" w:beforeAutospacing="0" w:after="0" w:afterAutospacing="0"/>
+      </w:pPr>
+      <w:r>
+        <w:t>Clean enterprise-style UI</w:t>
+      </w:r>
+    </w:p>
+    <w:p>
+      <w:pPr>
+        <w:pStyle w:val="Heading2"/>
+        <w:spacing w:before="0" w:beforeAutospacing="0" w:after="0" w:afterAutospacing="0"/>
+        <w:rPr>
+          <w:sz w:val="24"/>
+          <w:szCs w:val="24"/>
+        </w:rPr>
+      </w:pPr>
+      <w:r>
+        <w:rPr>
+          <w:rStyle w:val="Strong"/>
+          <w:b/>
+          <w:bCs/>
+          <w:sz w:val="24"/>
+          <w:szCs w:val="24"/>
+        </w:rPr>
+        <w:t>Key Learnings</w:t>
+      </w:r>
+    </w:p>
+    <w:p>
+      <w:pPr>
+        <w:pStyle w:val="NormalWeb"/>
+        <w:numPr>
+          <w:ilvl w:val="0"/>
+          <w:numId w:val="117"/>
+        </w:numPr>
+        <w:spacing w:before="0" w:beforeAutospacing="0" w:after="0" w:afterAutospacing="0"/>
+      </w:pPr>
+      <w:r>
+        <w:t>UI clarity significantly impacts user workflow efficiency.</w:t>
+      </w:r>
+    </w:p>
+    <w:p>
+      <w:pPr>
+        <w:pStyle w:val="NormalWeb"/>
+        <w:numPr>
+          <w:ilvl w:val="0"/>
+          <w:numId w:val="117"/>
+        </w:numPr>
+        <w:spacing w:before="0" w:beforeAutospacing="0" w:after="0" w:afterAutospacing="0"/>
+      </w:pPr>
+      <w:r>
+        <w:t>Early wireframing reduces architectural refactoring later.</w:t>
+      </w:r>
+    </w:p>
+    <w:p>
+      <w:pPr>
+        <w:pStyle w:val="NormalWeb"/>
+        <w:numPr>
+          <w:ilvl w:val="0"/>
+          <w:numId w:val="117"/>
+        </w:numPr>
+        <w:spacing w:before="0" w:beforeAutospacing="0" w:after="0" w:afterAutospacing="0"/>
+      </w:pPr>
+      <w:r>
+        <w:t>Structured module planning preve</w:t>
+      </w:r>
+      <w:r>
+        <w:t>nts scope creep.</w:t>
+      </w:r>
+    </w:p>
+    <w:p>
+      <w:pPr>
+        <w:spacing w:after="0" w:line="240" w:lineRule="auto"/>
+        <w:outlineLvl w:val="1"/>
+        <w:rPr>
+          <w:rFonts w:ascii="Times New Roman" w:eastAsia="Times New Roman" w:hAnsi="Times New Roman" w:cs="Times New Roman"/>
+          <w:b/>
+          <w:sz w:val="24"/>
+          <w:szCs w:val="24"/>
+        </w:rPr>
+      </w:pPr>
+      <w:r>
+        <w:rPr>
+          <w:rFonts w:ascii="Times New Roman" w:eastAsia="Times New Roman" w:hAnsi="Times New Roman" w:cs="Times New Roman"/>
+          <w:b/>
+          <w:bCs/>
+          <w:sz w:val="24"/>
+          <w:szCs w:val="24"/>
+        </w:rPr>
+        <w:lastRenderedPageBreak/>
+        <w:t>Date:</w:t>
+      </w:r>
+      <w:r>
+        <w:rPr>
+          <w:rFonts w:ascii="Times New Roman" w:eastAsia="Times New Roman" w:hAnsi="Times New Roman" w:cs="Times New Roman"/>
+          <w:b/>
+          <w:sz w:val="24"/>
+          <w:szCs w:val="24"/>
+        </w:rPr>
+        <w:t xml:space="preserve"> 22</w:t>
+      </w:r>
+      <w:r>
+        <w:rPr>
+          <w:rFonts w:ascii="Times New Roman" w:eastAsia="Times New Roman" w:hAnsi="Times New Roman" w:cs="Times New Roman"/>
+          <w:b/>
+          <w:sz w:val="24"/>
+          <w:szCs w:val="24"/>
+        </w:rPr>
+        <w:t xml:space="preserve">/02/2026                                                                                    </w:t>
+      </w:r>
+      <w:r>
+        <w:rPr>
+          <w:rFonts w:ascii="Times New Roman" w:eastAsia="Times New Roman" w:hAnsi="Times New Roman" w:cs="Times New Roman"/>
+          <w:b/>
+          <w:sz w:val="24"/>
+          <w:szCs w:val="24"/>
+        </w:rPr>
+        <w:t xml:space="preserve">                          Day 35</w:t>
+      </w:r>
+      <w:r>
+        <w:rPr>
+          <w:rFonts w:ascii="Times New Roman" w:eastAsia="Times New Roman" w:hAnsi="Times New Roman" w:cs="Times New Roman"/>
+          <w:b/>
+          <w:sz w:val="24"/>
+          <w:szCs w:val="24"/>
+        </w:rPr>
+        <w:br/>
+      </w:r>
+      <w:r>
+        <w:rPr>
+          <w:rFonts w:ascii="Times New Roman" w:eastAsia="Times New Roman" w:hAnsi="Times New Roman" w:cs="Times New Roman"/>
+          <w:b/>
+          <w:bCs/>
+          <w:sz w:val="24"/>
+          <w:szCs w:val="24"/>
+        </w:rPr>
+        <w:t>Department:</w:t>
+      </w:r>
+      <w:r>
+        <w:rPr>
+          <w:rFonts w:ascii="Times New Roman" w:eastAsia="Times New Roman" w:hAnsi="Times New Roman" w:cs="Times New Roman"/>
+          <w:b/>
+          <w:sz w:val="24"/>
+          <w:szCs w:val="24"/>
+        </w:rPr>
+        <w:t xml:space="preserve"> Maintenance</w:t>
+      </w:r>
+      <w:r>
+        <w:rPr>
+          <w:rFonts w:ascii="Times New Roman" w:eastAsia="Times New Roman" w:hAnsi="Times New Roman" w:cs="Times New Roman"/>
+          <w:b/>
+          <w:sz w:val="24"/>
+          <w:szCs w:val="24"/>
+        </w:rPr>
+        <w:br/>
+      </w:r>
+      <w:r>
+        <w:rPr>
+          <w:rFonts w:ascii="Times New Roman" w:eastAsia="Times New Roman" w:hAnsi="Times New Roman" w:cs="Times New Roman"/>
+          <w:b/>
+          <w:bCs/>
+          <w:sz w:val="24"/>
+          <w:szCs w:val="24"/>
+        </w:rPr>
+        <w:t>Plant:</w:t>
+      </w:r>
+      <w:r>
+        <w:rPr>
+          <w:rFonts w:ascii="Times New Roman" w:eastAsia="Times New Roman" w:hAnsi="Times New Roman" w:cs="Times New Roman"/>
+          <w:b/>
+          <w:sz w:val="24"/>
+          <w:szCs w:val="24"/>
+        </w:rPr>
+        <w:t xml:space="preserve"> Drive Shaft Manufacturing</w:t>
+      </w:r>
+    </w:p>
+    <w:p>
+      <w:pPr>
+        <w:spacing w:after="0" w:line="240" w:lineRule="auto"/>
+        <w:outlineLvl w:val="1"/>
+        <w:rPr>
+          <w:rFonts w:ascii="Times New Roman" w:eastAsia="Times New Roman" w:hAnsi="Times New Roman" w:cs="Times New Roman"/>
+          <w:b/>
+          <w:sz w:val="24"/>
+          <w:szCs w:val="24"/>
+        </w:rPr>
+      </w:pPr>
+      <w:r>
+        <w:rPr>
+          <w:rFonts w:ascii="Times New Roman" w:eastAsia="Times New Roman" w:hAnsi="Times New Roman" w:cs="Times New Roman"/>
+          <w:b/>
+          <w:sz w:val="24"/>
+          <w:szCs w:val="24"/>
+        </w:rPr>
+        <w:t>Work from Home</w:t>
+      </w:r>
+    </w:p>
+    <w:p>
+      <w:pPr>
+        <w:spacing w:after="0" w:line="240" w:lineRule="auto"/>
+        <w:rPr>
+          <w:rFonts w:ascii="Times New Roman" w:eastAsia="Times New Roman" w:hAnsi="Times New Roman" w:cs="Times New Roman"/>
+          <w:sz w:val="24"/>
+          <w:szCs w:val="24"/>
+        </w:rPr>
+      </w:pPr>
       <w:bookmarkStart w:id="0" w:name="_GoBack"/>
       <w:bookmarkEnd w:id="0"/>
-    </w:p>
-    <w:p>
-      <w:pPr>
-        <w:spacing w:after="0" w:line="240" w:lineRule="auto"/>
-        <w:rPr>
-          <w:rFonts w:ascii="Times New Roman" w:eastAsia="Times New Roman" w:hAnsi="Times New Roman" w:cs="Times New Roman"/>
-          <w:sz w:val="24"/>
-          <w:szCs w:val="24"/>
-        </w:rPr>
-      </w:pPr>
     </w:p>
     <w:sectPr>
       <w:pgSz w:w="12240" w:h="15840"/>
@@ -21128,6 +22781,155 @@
     </w:lvl>
   </w:abstractNum>
   <w:abstractNum w:abstractNumId="9" w15:restartNumberingAfterBreak="0">
+    <w:nsid w:val="0BD233B6"/>
+    <w:multiLevelType w:val="multilevel"/>
+    <w:tmpl w:val="F4400156"/>
+    <w:lvl w:ilvl="0">
+      <w:start w:val="1"/>
+      <w:numFmt w:val="bullet"/>
+      <w:lvlText w:val=""/>
+      <w:lvlJc w:val="left"/>
+      <w:pPr>
+        <w:tabs>
+          <w:tab w:val="num" w:pos="720"/>
+        </w:tabs>
+        <w:ind w:left="720" w:hanging="360"/>
+      </w:pPr>
+      <w:rPr>
+        <w:rFonts w:ascii="Symbol" w:hAnsi="Symbol" w:hint="default"/>
+        <w:sz w:val="20"/>
+      </w:rPr>
+    </w:lvl>
+    <w:lvl w:ilvl="1" w:tentative="1">
+      <w:start w:val="1"/>
+      <w:numFmt w:val="bullet"/>
+      <w:lvlText w:val="o"/>
+      <w:lvlJc w:val="left"/>
+      <w:pPr>
+        <w:tabs>
+          <w:tab w:val="num" w:pos="1440"/>
+        </w:tabs>
+        <w:ind w:left="1440" w:hanging="360"/>
+      </w:pPr>
+      <w:rPr>
+        <w:rFonts w:ascii="Courier New" w:hAnsi="Courier New" w:hint="default"/>
+        <w:sz w:val="20"/>
+      </w:rPr>
+    </w:lvl>
+    <w:lvl w:ilvl="2" w:tentative="1">
+      <w:start w:val="1"/>
+      <w:numFmt w:val="bullet"/>
+      <w:lvlText w:val=""/>
+      <w:lvlJc w:val="left"/>
+      <w:pPr>
+        <w:tabs>
+          <w:tab w:val="num" w:pos="2160"/>
+        </w:tabs>
+        <w:ind w:left="2160" w:hanging="360"/>
+      </w:pPr>
+      <w:rPr>
+        <w:rFonts w:ascii="Wingdings" w:hAnsi="Wingdings" w:hint="default"/>
+        <w:sz w:val="20"/>
+      </w:rPr>
+    </w:lvl>
+    <w:lvl w:ilvl="3" w:tentative="1">
+      <w:start w:val="1"/>
+      <w:numFmt w:val="bullet"/>
+      <w:lvlText w:val=""/>
+      <w:lvlJc w:val="left"/>
+      <w:pPr>
+        <w:tabs>
+          <w:tab w:val="num" w:pos="2880"/>
+        </w:tabs>
+        <w:ind w:left="2880" w:hanging="360"/>
+      </w:pPr>
+      <w:rPr>
+        <w:rFonts w:ascii="Wingdings" w:hAnsi="Wingdings" w:hint="default"/>
+        <w:sz w:val="20"/>
+      </w:rPr>
+    </w:lvl>
+    <w:lvl w:ilvl="4" w:tentative="1">
+      <w:start w:val="1"/>
+      <w:numFmt w:val="bullet"/>
+      <w:lvlText w:val=""/>
+      <w:lvlJc w:val="left"/>
+      <w:pPr>
+        <w:tabs>
+          <w:tab w:val="num" w:pos="3600"/>
+        </w:tabs>
+        <w:ind w:left="3600" w:hanging="360"/>
+      </w:pPr>
+      <w:rPr>
+        <w:rFonts w:ascii="Wingdings" w:hAnsi="Wingdings" w:hint="default"/>
+        <w:sz w:val="20"/>
+      </w:rPr>
+    </w:lvl>
+    <w:lvl w:ilvl="5" w:tentative="1">
+      <w:start w:val="1"/>
+      <w:numFmt w:val="bullet"/>
+      <w:lvlText w:val=""/>
+      <w:lvlJc w:val="left"/>
+      <w:pPr>
+        <w:tabs>
+          <w:tab w:val="num" w:pos="4320"/>
+        </w:tabs>
+        <w:ind w:left="4320" w:hanging="360"/>
+      </w:pPr>
+      <w:rPr>
+        <w:rFonts w:ascii="Wingdings" w:hAnsi="Wingdings" w:hint="default"/>
+        <w:sz w:val="20"/>
+      </w:rPr>
+    </w:lvl>
+    <w:lvl w:ilvl="6" w:tentative="1">
+      <w:start w:val="1"/>
+      <w:numFmt w:val="bullet"/>
+      <w:lvlText w:val=""/>
+      <w:lvlJc w:val="left"/>
+      <w:pPr>
+        <w:tabs>
+          <w:tab w:val="num" w:pos="5040"/>
+        </w:tabs>
+        <w:ind w:left="5040" w:hanging="360"/>
+      </w:pPr>
+      <w:rPr>
+        <w:rFonts w:ascii="Wingdings" w:hAnsi="Wingdings" w:hint="default"/>
+        <w:sz w:val="20"/>
+      </w:rPr>
+    </w:lvl>
+    <w:lvl w:ilvl="7" w:tentative="1">
+      <w:start w:val="1"/>
+      <w:numFmt w:val="bullet"/>
+      <w:lvlText w:val=""/>
+      <w:lvlJc w:val="left"/>
+      <w:pPr>
+        <w:tabs>
+          <w:tab w:val="num" w:pos="5760"/>
+        </w:tabs>
+        <w:ind w:left="5760" w:hanging="360"/>
+      </w:pPr>
+      <w:rPr>
+        <w:rFonts w:ascii="Wingdings" w:hAnsi="Wingdings" w:hint="default"/>
+        <w:sz w:val="20"/>
+      </w:rPr>
+    </w:lvl>
+    <w:lvl w:ilvl="8" w:tentative="1">
+      <w:start w:val="1"/>
+      <w:numFmt w:val="bullet"/>
+      <w:lvlText w:val=""/>
+      <w:lvlJc w:val="left"/>
+      <w:pPr>
+        <w:tabs>
+          <w:tab w:val="num" w:pos="6480"/>
+        </w:tabs>
+        <w:ind w:left="6480" w:hanging="360"/>
+      </w:pPr>
+      <w:rPr>
+        <w:rFonts w:ascii="Wingdings" w:hAnsi="Wingdings" w:hint="default"/>
+        <w:sz w:val="20"/>
+      </w:rPr>
+    </w:lvl>
+  </w:abstractNum>
+  <w:abstractNum w:abstractNumId="10" w15:restartNumberingAfterBreak="0">
     <w:nsid w:val="0C554F64"/>
     <w:multiLevelType w:val="hybridMultilevel"/>
     <w:tmpl w:val="0506FDCA"/>
@@ -21240,7 +23042,7 @@
       </w:rPr>
     </w:lvl>
   </w:abstractNum>
-  <w:abstractNum w:abstractNumId="10" w15:restartNumberingAfterBreak="0">
+  <w:abstractNum w:abstractNumId="11" w15:restartNumberingAfterBreak="0">
     <w:nsid w:val="0D4D7723"/>
     <w:multiLevelType w:val="multilevel"/>
     <w:tmpl w:val="FBA697AC"/>
@@ -21389,7 +23191,156 @@
       </w:rPr>
     </w:lvl>
   </w:abstractNum>
-  <w:abstractNum w:abstractNumId="11" w15:restartNumberingAfterBreak="0">
+  <w:abstractNum w:abstractNumId="12" w15:restartNumberingAfterBreak="0">
+    <w:nsid w:val="101C2CA6"/>
+    <w:multiLevelType w:val="multilevel"/>
+    <w:tmpl w:val="3890653A"/>
+    <w:lvl w:ilvl="0">
+      <w:start w:val="1"/>
+      <w:numFmt w:val="bullet"/>
+      <w:lvlText w:val=""/>
+      <w:lvlJc w:val="left"/>
+      <w:pPr>
+        <w:tabs>
+          <w:tab w:val="num" w:pos="720"/>
+        </w:tabs>
+        <w:ind w:left="720" w:hanging="360"/>
+      </w:pPr>
+      <w:rPr>
+        <w:rFonts w:ascii="Symbol" w:hAnsi="Symbol" w:hint="default"/>
+        <w:sz w:val="20"/>
+      </w:rPr>
+    </w:lvl>
+    <w:lvl w:ilvl="1" w:tentative="1">
+      <w:start w:val="1"/>
+      <w:numFmt w:val="bullet"/>
+      <w:lvlText w:val="o"/>
+      <w:lvlJc w:val="left"/>
+      <w:pPr>
+        <w:tabs>
+          <w:tab w:val="num" w:pos="1440"/>
+        </w:tabs>
+        <w:ind w:left="1440" w:hanging="360"/>
+      </w:pPr>
+      <w:rPr>
+        <w:rFonts w:ascii="Courier New" w:hAnsi="Courier New" w:hint="default"/>
+        <w:sz w:val="20"/>
+      </w:rPr>
+    </w:lvl>
+    <w:lvl w:ilvl="2" w:tentative="1">
+      <w:start w:val="1"/>
+      <w:numFmt w:val="bullet"/>
+      <w:lvlText w:val=""/>
+      <w:lvlJc w:val="left"/>
+      <w:pPr>
+        <w:tabs>
+          <w:tab w:val="num" w:pos="2160"/>
+        </w:tabs>
+        <w:ind w:left="2160" w:hanging="360"/>
+      </w:pPr>
+      <w:rPr>
+        <w:rFonts w:ascii="Wingdings" w:hAnsi="Wingdings" w:hint="default"/>
+        <w:sz w:val="20"/>
+      </w:rPr>
+    </w:lvl>
+    <w:lvl w:ilvl="3" w:tentative="1">
+      <w:start w:val="1"/>
+      <w:numFmt w:val="bullet"/>
+      <w:lvlText w:val=""/>
+      <w:lvlJc w:val="left"/>
+      <w:pPr>
+        <w:tabs>
+          <w:tab w:val="num" w:pos="2880"/>
+        </w:tabs>
+        <w:ind w:left="2880" w:hanging="360"/>
+      </w:pPr>
+      <w:rPr>
+        <w:rFonts w:ascii="Wingdings" w:hAnsi="Wingdings" w:hint="default"/>
+        <w:sz w:val="20"/>
+      </w:rPr>
+    </w:lvl>
+    <w:lvl w:ilvl="4" w:tentative="1">
+      <w:start w:val="1"/>
+      <w:numFmt w:val="bullet"/>
+      <w:lvlText w:val=""/>
+      <w:lvlJc w:val="left"/>
+      <w:pPr>
+        <w:tabs>
+          <w:tab w:val="num" w:pos="3600"/>
+        </w:tabs>
+        <w:ind w:left="3600" w:hanging="360"/>
+      </w:pPr>
+      <w:rPr>
+        <w:rFonts w:ascii="Wingdings" w:hAnsi="Wingdings" w:hint="default"/>
+        <w:sz w:val="20"/>
+      </w:rPr>
+    </w:lvl>
+    <w:lvl w:ilvl="5" w:tentative="1">
+      <w:start w:val="1"/>
+      <w:numFmt w:val="bullet"/>
+      <w:lvlText w:val=""/>
+      <w:lvlJc w:val="left"/>
+      <w:pPr>
+        <w:tabs>
+          <w:tab w:val="num" w:pos="4320"/>
+        </w:tabs>
+        <w:ind w:left="4320" w:hanging="360"/>
+      </w:pPr>
+      <w:rPr>
+        <w:rFonts w:ascii="Wingdings" w:hAnsi="Wingdings" w:hint="default"/>
+        <w:sz w:val="20"/>
+      </w:rPr>
+    </w:lvl>
+    <w:lvl w:ilvl="6" w:tentative="1">
+      <w:start w:val="1"/>
+      <w:numFmt w:val="bullet"/>
+      <w:lvlText w:val=""/>
+      <w:lvlJc w:val="left"/>
+      <w:pPr>
+        <w:tabs>
+          <w:tab w:val="num" w:pos="5040"/>
+        </w:tabs>
+        <w:ind w:left="5040" w:hanging="360"/>
+      </w:pPr>
+      <w:rPr>
+        <w:rFonts w:ascii="Wingdings" w:hAnsi="Wingdings" w:hint="default"/>
+        <w:sz w:val="20"/>
+      </w:rPr>
+    </w:lvl>
+    <w:lvl w:ilvl="7" w:tentative="1">
+      <w:start w:val="1"/>
+      <w:numFmt w:val="bullet"/>
+      <w:lvlText w:val=""/>
+      <w:lvlJc w:val="left"/>
+      <w:pPr>
+        <w:tabs>
+          <w:tab w:val="num" w:pos="5760"/>
+        </w:tabs>
+        <w:ind w:left="5760" w:hanging="360"/>
+      </w:pPr>
+      <w:rPr>
+        <w:rFonts w:ascii="Wingdings" w:hAnsi="Wingdings" w:hint="default"/>
+        <w:sz w:val="20"/>
+      </w:rPr>
+    </w:lvl>
+    <w:lvl w:ilvl="8" w:tentative="1">
+      <w:start w:val="1"/>
+      <w:numFmt w:val="bullet"/>
+      <w:lvlText w:val=""/>
+      <w:lvlJc w:val="left"/>
+      <w:pPr>
+        <w:tabs>
+          <w:tab w:val="num" w:pos="6480"/>
+        </w:tabs>
+        <w:ind w:left="6480" w:hanging="360"/>
+      </w:pPr>
+      <w:rPr>
+        <w:rFonts w:ascii="Wingdings" w:hAnsi="Wingdings" w:hint="default"/>
+        <w:sz w:val="20"/>
+      </w:rPr>
+    </w:lvl>
+  </w:abstractNum>
+  <w:abstractNum w:abstractNumId="13" w15:restartNumberingAfterBreak="0">
     <w:nsid w:val="1025101E"/>
     <w:multiLevelType w:val="multilevel"/>
     <w:tmpl w:val="2630475E"/>
@@ -21538,7 +23489,7 @@
       </w:rPr>
     </w:lvl>
   </w:abstractNum>
-  <w:abstractNum w:abstractNumId="12" w15:restartNumberingAfterBreak="0">
+  <w:abstractNum w:abstractNumId="14" w15:restartNumberingAfterBreak="0">
     <w:nsid w:val="11EC4F79"/>
     <w:multiLevelType w:val="multilevel"/>
     <w:tmpl w:val="4E904154"/>
@@ -21687,7 +23638,454 @@
       </w:rPr>
     </w:lvl>
   </w:abstractNum>
-  <w:abstractNum w:abstractNumId="13" w15:restartNumberingAfterBreak="0">
+  <w:abstractNum w:abstractNumId="15" w15:restartNumberingAfterBreak="0">
+    <w:nsid w:val="14D01B3A"/>
+    <w:multiLevelType w:val="multilevel"/>
+    <w:tmpl w:val="6128D0B4"/>
+    <w:lvl w:ilvl="0">
+      <w:start w:val="1"/>
+      <w:numFmt w:val="bullet"/>
+      <w:lvlText w:val=""/>
+      <w:lvlJc w:val="left"/>
+      <w:pPr>
+        <w:tabs>
+          <w:tab w:val="num" w:pos="720"/>
+        </w:tabs>
+        <w:ind w:left="720" w:hanging="360"/>
+      </w:pPr>
+      <w:rPr>
+        <w:rFonts w:ascii="Symbol" w:hAnsi="Symbol" w:hint="default"/>
+        <w:sz w:val="20"/>
+      </w:rPr>
+    </w:lvl>
+    <w:lvl w:ilvl="1" w:tentative="1">
+      <w:start w:val="1"/>
+      <w:numFmt w:val="bullet"/>
+      <w:lvlText w:val="o"/>
+      <w:lvlJc w:val="left"/>
+      <w:pPr>
+        <w:tabs>
+          <w:tab w:val="num" w:pos="1440"/>
+        </w:tabs>
+        <w:ind w:left="1440" w:hanging="360"/>
+      </w:pPr>
+      <w:rPr>
+        <w:rFonts w:ascii="Courier New" w:hAnsi="Courier New" w:hint="default"/>
+        <w:sz w:val="20"/>
+      </w:rPr>
+    </w:lvl>
+    <w:lvl w:ilvl="2" w:tentative="1">
+      <w:start w:val="1"/>
+      <w:numFmt w:val="bullet"/>
+      <w:lvlText w:val=""/>
+      <w:lvlJc w:val="left"/>
+      <w:pPr>
+        <w:tabs>
+          <w:tab w:val="num" w:pos="2160"/>
+        </w:tabs>
+        <w:ind w:left="2160" w:hanging="360"/>
+      </w:pPr>
+      <w:rPr>
+        <w:rFonts w:ascii="Wingdings" w:hAnsi="Wingdings" w:hint="default"/>
+        <w:sz w:val="20"/>
+      </w:rPr>
+    </w:lvl>
+    <w:lvl w:ilvl="3" w:tentative="1">
+      <w:start w:val="1"/>
+      <w:numFmt w:val="bullet"/>
+      <w:lvlText w:val=""/>
+      <w:lvlJc w:val="left"/>
+      <w:pPr>
+        <w:tabs>
+          <w:tab w:val="num" w:pos="2880"/>
+        </w:tabs>
+        <w:ind w:left="2880" w:hanging="360"/>
+      </w:pPr>
+      <w:rPr>
+        <w:rFonts w:ascii="Wingdings" w:hAnsi="Wingdings" w:hint="default"/>
+        <w:sz w:val="20"/>
+      </w:rPr>
+    </w:lvl>
+    <w:lvl w:ilvl="4" w:tentative="1">
+      <w:start w:val="1"/>
+      <w:numFmt w:val="bullet"/>
+      <w:lvlText w:val=""/>
+      <w:lvlJc w:val="left"/>
+      <w:pPr>
+        <w:tabs>
+          <w:tab w:val="num" w:pos="3600"/>
+        </w:tabs>
+        <w:ind w:left="3600" w:hanging="360"/>
+      </w:pPr>
+      <w:rPr>
+        <w:rFonts w:ascii="Wingdings" w:hAnsi="Wingdings" w:hint="default"/>
+        <w:sz w:val="20"/>
+      </w:rPr>
+    </w:lvl>
+    <w:lvl w:ilvl="5" w:tentative="1">
+      <w:start w:val="1"/>
+      <w:numFmt w:val="bullet"/>
+      <w:lvlText w:val=""/>
+      <w:lvlJc w:val="left"/>
+      <w:pPr>
+        <w:tabs>
+          <w:tab w:val="num" w:pos="4320"/>
+        </w:tabs>
+        <w:ind w:left="4320" w:hanging="360"/>
+      </w:pPr>
+      <w:rPr>
+        <w:rFonts w:ascii="Wingdings" w:hAnsi="Wingdings" w:hint="default"/>
+        <w:sz w:val="20"/>
+      </w:rPr>
+    </w:lvl>
+    <w:lvl w:ilvl="6" w:tentative="1">
+      <w:start w:val="1"/>
+      <w:numFmt w:val="bullet"/>
+      <w:lvlText w:val=""/>
+      <w:lvlJc w:val="left"/>
+      <w:pPr>
+        <w:tabs>
+          <w:tab w:val="num" w:pos="5040"/>
+        </w:tabs>
+        <w:ind w:left="5040" w:hanging="360"/>
+      </w:pPr>
+      <w:rPr>
+        <w:rFonts w:ascii="Wingdings" w:hAnsi="Wingdings" w:hint="default"/>
+        <w:sz w:val="20"/>
+      </w:rPr>
+    </w:lvl>
+    <w:lvl w:ilvl="7" w:tentative="1">
+      <w:start w:val="1"/>
+      <w:numFmt w:val="bullet"/>
+      <w:lvlText w:val=""/>
+      <w:lvlJc w:val="left"/>
+      <w:pPr>
+        <w:tabs>
+          <w:tab w:val="num" w:pos="5760"/>
+        </w:tabs>
+        <w:ind w:left="5760" w:hanging="360"/>
+      </w:pPr>
+      <w:rPr>
+        <w:rFonts w:ascii="Wingdings" w:hAnsi="Wingdings" w:hint="default"/>
+        <w:sz w:val="20"/>
+      </w:rPr>
+    </w:lvl>
+    <w:lvl w:ilvl="8" w:tentative="1">
+      <w:start w:val="1"/>
+      <w:numFmt w:val="bullet"/>
+      <w:lvlText w:val=""/>
+      <w:lvlJc w:val="left"/>
+      <w:pPr>
+        <w:tabs>
+          <w:tab w:val="num" w:pos="6480"/>
+        </w:tabs>
+        <w:ind w:left="6480" w:hanging="360"/>
+      </w:pPr>
+      <w:rPr>
+        <w:rFonts w:ascii="Wingdings" w:hAnsi="Wingdings" w:hint="default"/>
+        <w:sz w:val="20"/>
+      </w:rPr>
+    </w:lvl>
+  </w:abstractNum>
+  <w:abstractNum w:abstractNumId="16" w15:restartNumberingAfterBreak="0">
+    <w:nsid w:val="172B7FE6"/>
+    <w:multiLevelType w:val="multilevel"/>
+    <w:tmpl w:val="CB981820"/>
+    <w:lvl w:ilvl="0">
+      <w:start w:val="1"/>
+      <w:numFmt w:val="bullet"/>
+      <w:lvlText w:val=""/>
+      <w:lvlJc w:val="left"/>
+      <w:pPr>
+        <w:tabs>
+          <w:tab w:val="num" w:pos="720"/>
+        </w:tabs>
+        <w:ind w:left="720" w:hanging="360"/>
+      </w:pPr>
+      <w:rPr>
+        <w:rFonts w:ascii="Symbol" w:hAnsi="Symbol" w:hint="default"/>
+        <w:sz w:val="20"/>
+      </w:rPr>
+    </w:lvl>
+    <w:lvl w:ilvl="1" w:tentative="1">
+      <w:start w:val="1"/>
+      <w:numFmt w:val="bullet"/>
+      <w:lvlText w:val="o"/>
+      <w:lvlJc w:val="left"/>
+      <w:pPr>
+        <w:tabs>
+          <w:tab w:val="num" w:pos="1440"/>
+        </w:tabs>
+        <w:ind w:left="1440" w:hanging="360"/>
+      </w:pPr>
+      <w:rPr>
+        <w:rFonts w:ascii="Courier New" w:hAnsi="Courier New" w:hint="default"/>
+        <w:sz w:val="20"/>
+      </w:rPr>
+    </w:lvl>
+    <w:lvl w:ilvl="2" w:tentative="1">
+      <w:start w:val="1"/>
+      <w:numFmt w:val="bullet"/>
+      <w:lvlText w:val=""/>
+      <w:lvlJc w:val="left"/>
+      <w:pPr>
+        <w:tabs>
+          <w:tab w:val="num" w:pos="2160"/>
+        </w:tabs>
+        <w:ind w:left="2160" w:hanging="360"/>
+      </w:pPr>
+      <w:rPr>
+        <w:rFonts w:ascii="Wingdings" w:hAnsi="Wingdings" w:hint="default"/>
+        <w:sz w:val="20"/>
+      </w:rPr>
+    </w:lvl>
+    <w:lvl w:ilvl="3" w:tentative="1">
+      <w:start w:val="1"/>
+      <w:numFmt w:val="bullet"/>
+      <w:lvlText w:val=""/>
+      <w:lvlJc w:val="left"/>
+      <w:pPr>
+        <w:tabs>
+          <w:tab w:val="num" w:pos="2880"/>
+        </w:tabs>
+        <w:ind w:left="2880" w:hanging="360"/>
+      </w:pPr>
+      <w:rPr>
+        <w:rFonts w:ascii="Wingdings" w:hAnsi="Wingdings" w:hint="default"/>
+        <w:sz w:val="20"/>
+      </w:rPr>
+    </w:lvl>
+    <w:lvl w:ilvl="4" w:tentative="1">
+      <w:start w:val="1"/>
+      <w:numFmt w:val="bullet"/>
+      <w:lvlText w:val=""/>
+      <w:lvlJc w:val="left"/>
+      <w:pPr>
+        <w:tabs>
+          <w:tab w:val="num" w:pos="3600"/>
+        </w:tabs>
+        <w:ind w:left="3600" w:hanging="360"/>
+      </w:pPr>
+      <w:rPr>
+        <w:rFonts w:ascii="Wingdings" w:hAnsi="Wingdings" w:hint="default"/>
+        <w:sz w:val="20"/>
+      </w:rPr>
+    </w:lvl>
+    <w:lvl w:ilvl="5" w:tentative="1">
+      <w:start w:val="1"/>
+      <w:numFmt w:val="bullet"/>
+      <w:lvlText w:val=""/>
+      <w:lvlJc w:val="left"/>
+      <w:pPr>
+        <w:tabs>
+          <w:tab w:val="num" w:pos="4320"/>
+        </w:tabs>
+        <w:ind w:left="4320" w:hanging="360"/>
+      </w:pPr>
+      <w:rPr>
+        <w:rFonts w:ascii="Wingdings" w:hAnsi="Wingdings" w:hint="default"/>
+        <w:sz w:val="20"/>
+      </w:rPr>
+    </w:lvl>
+    <w:lvl w:ilvl="6" w:tentative="1">
+      <w:start w:val="1"/>
+      <w:numFmt w:val="bullet"/>
+      <w:lvlText w:val=""/>
+      <w:lvlJc w:val="left"/>
+      <w:pPr>
+        <w:tabs>
+          <w:tab w:val="num" w:pos="5040"/>
+        </w:tabs>
+        <w:ind w:left="5040" w:hanging="360"/>
+      </w:pPr>
+      <w:rPr>
+        <w:rFonts w:ascii="Wingdings" w:hAnsi="Wingdings" w:hint="default"/>
+        <w:sz w:val="20"/>
+      </w:rPr>
+    </w:lvl>
+    <w:lvl w:ilvl="7" w:tentative="1">
+      <w:start w:val="1"/>
+      <w:numFmt w:val="bullet"/>
+      <w:lvlText w:val=""/>
+      <w:lvlJc w:val="left"/>
+      <w:pPr>
+        <w:tabs>
+          <w:tab w:val="num" w:pos="5760"/>
+        </w:tabs>
+        <w:ind w:left="5760" w:hanging="360"/>
+      </w:pPr>
+      <w:rPr>
+        <w:rFonts w:ascii="Wingdings" w:hAnsi="Wingdings" w:hint="default"/>
+        <w:sz w:val="20"/>
+      </w:rPr>
+    </w:lvl>
+    <w:lvl w:ilvl="8" w:tentative="1">
+      <w:start w:val="1"/>
+      <w:numFmt w:val="bullet"/>
+      <w:lvlText w:val=""/>
+      <w:lvlJc w:val="left"/>
+      <w:pPr>
+        <w:tabs>
+          <w:tab w:val="num" w:pos="6480"/>
+        </w:tabs>
+        <w:ind w:left="6480" w:hanging="360"/>
+      </w:pPr>
+      <w:rPr>
+        <w:rFonts w:ascii="Wingdings" w:hAnsi="Wingdings" w:hint="default"/>
+        <w:sz w:val="20"/>
+      </w:rPr>
+    </w:lvl>
+  </w:abstractNum>
+  <w:abstractNum w:abstractNumId="17" w15:restartNumberingAfterBreak="0">
+    <w:nsid w:val="17A1283F"/>
+    <w:multiLevelType w:val="multilevel"/>
+    <w:tmpl w:val="42E499B4"/>
+    <w:lvl w:ilvl="0">
+      <w:start w:val="1"/>
+      <w:numFmt w:val="bullet"/>
+      <w:lvlText w:val=""/>
+      <w:lvlJc w:val="left"/>
+      <w:pPr>
+        <w:tabs>
+          <w:tab w:val="num" w:pos="720"/>
+        </w:tabs>
+        <w:ind w:left="720" w:hanging="360"/>
+      </w:pPr>
+      <w:rPr>
+        <w:rFonts w:ascii="Symbol" w:hAnsi="Symbol" w:hint="default"/>
+        <w:sz w:val="20"/>
+      </w:rPr>
+    </w:lvl>
+    <w:lvl w:ilvl="1" w:tentative="1">
+      <w:start w:val="1"/>
+      <w:numFmt w:val="bullet"/>
+      <w:lvlText w:val="o"/>
+      <w:lvlJc w:val="left"/>
+      <w:pPr>
+        <w:tabs>
+          <w:tab w:val="num" w:pos="1440"/>
+        </w:tabs>
+        <w:ind w:left="1440" w:hanging="360"/>
+      </w:pPr>
+      <w:rPr>
+        <w:rFonts w:ascii="Courier New" w:hAnsi="Courier New" w:hint="default"/>
+        <w:sz w:val="20"/>
+      </w:rPr>
+    </w:lvl>
+    <w:lvl w:ilvl="2" w:tentative="1">
+      <w:start w:val="1"/>
+      <w:numFmt w:val="bullet"/>
+      <w:lvlText w:val=""/>
+      <w:lvlJc w:val="left"/>
+      <w:pPr>
+        <w:tabs>
+          <w:tab w:val="num" w:pos="2160"/>
+        </w:tabs>
+        <w:ind w:left="2160" w:hanging="360"/>
+      </w:pPr>
+      <w:rPr>
+        <w:rFonts w:ascii="Wingdings" w:hAnsi="Wingdings" w:hint="default"/>
+        <w:sz w:val="20"/>
+      </w:rPr>
+    </w:lvl>
+    <w:lvl w:ilvl="3" w:tentative="1">
+      <w:start w:val="1"/>
+      <w:numFmt w:val="bullet"/>
+      <w:lvlText w:val=""/>
+      <w:lvlJc w:val="left"/>
+      <w:pPr>
+        <w:tabs>
+          <w:tab w:val="num" w:pos="2880"/>
+        </w:tabs>
+        <w:ind w:left="2880" w:hanging="360"/>
+      </w:pPr>
+      <w:rPr>
+        <w:rFonts w:ascii="Wingdings" w:hAnsi="Wingdings" w:hint="default"/>
+        <w:sz w:val="20"/>
+      </w:rPr>
+    </w:lvl>
+    <w:lvl w:ilvl="4" w:tentative="1">
+      <w:start w:val="1"/>
+      <w:numFmt w:val="bullet"/>
+      <w:lvlText w:val=""/>
+      <w:lvlJc w:val="left"/>
+      <w:pPr>
+        <w:tabs>
+          <w:tab w:val="num" w:pos="3600"/>
+        </w:tabs>
+        <w:ind w:left="3600" w:hanging="360"/>
+      </w:pPr>
+      <w:rPr>
+        <w:rFonts w:ascii="Wingdings" w:hAnsi="Wingdings" w:hint="default"/>
+        <w:sz w:val="20"/>
+      </w:rPr>
+    </w:lvl>
+    <w:lvl w:ilvl="5" w:tentative="1">
+      <w:start w:val="1"/>
+      <w:numFmt w:val="bullet"/>
+      <w:lvlText w:val=""/>
+      <w:lvlJc w:val="left"/>
+      <w:pPr>
+        <w:tabs>
+          <w:tab w:val="num" w:pos="4320"/>
+        </w:tabs>
+        <w:ind w:left="4320" w:hanging="360"/>
+      </w:pPr>
+      <w:rPr>
+        <w:rFonts w:ascii="Wingdings" w:hAnsi="Wingdings" w:hint="default"/>
+        <w:sz w:val="20"/>
+      </w:rPr>
+    </w:lvl>
+    <w:lvl w:ilvl="6" w:tentative="1">
+      <w:start w:val="1"/>
+      <w:numFmt w:val="bullet"/>
+      <w:lvlText w:val=""/>
+      <w:lvlJc w:val="left"/>
+      <w:pPr>
+        <w:tabs>
+          <w:tab w:val="num" w:pos="5040"/>
+        </w:tabs>
+        <w:ind w:left="5040" w:hanging="360"/>
+      </w:pPr>
+      <w:rPr>
+        <w:rFonts w:ascii="Wingdings" w:hAnsi="Wingdings" w:hint="default"/>
+        <w:sz w:val="20"/>
+      </w:rPr>
+    </w:lvl>
+    <w:lvl w:ilvl="7" w:tentative="1">
+      <w:start w:val="1"/>
+      <w:numFmt w:val="bullet"/>
+      <w:lvlText w:val=""/>
+      <w:lvlJc w:val="left"/>
+      <w:pPr>
+        <w:tabs>
+          <w:tab w:val="num" w:pos="5760"/>
+        </w:tabs>
+        <w:ind w:left="5760" w:hanging="360"/>
+      </w:pPr>
+      <w:rPr>
+        <w:rFonts w:ascii="Wingdings" w:hAnsi="Wingdings" w:hint="default"/>
+        <w:sz w:val="20"/>
+      </w:rPr>
+    </w:lvl>
+    <w:lvl w:ilvl="8" w:tentative="1">
+      <w:start w:val="1"/>
+      <w:numFmt w:val="bullet"/>
+      <w:lvlText w:val=""/>
+      <w:lvlJc w:val="left"/>
+      <w:pPr>
+        <w:tabs>
+          <w:tab w:val="num" w:pos="6480"/>
+        </w:tabs>
+        <w:ind w:left="6480" w:hanging="360"/>
+      </w:pPr>
+      <w:rPr>
+        <w:rFonts w:ascii="Wingdings" w:hAnsi="Wingdings" w:hint="default"/>
+        <w:sz w:val="20"/>
+      </w:rPr>
+    </w:lvl>
+  </w:abstractNum>
+  <w:abstractNum w:abstractNumId="18" w15:restartNumberingAfterBreak="0">
     <w:nsid w:val="19103BDD"/>
     <w:multiLevelType w:val="multilevel"/>
     <w:tmpl w:val="832E07AC"/>
@@ -21836,7 +24234,7 @@
       </w:rPr>
     </w:lvl>
   </w:abstractNum>
-  <w:abstractNum w:abstractNumId="14" w15:restartNumberingAfterBreak="0">
+  <w:abstractNum w:abstractNumId="19" w15:restartNumberingAfterBreak="0">
     <w:nsid w:val="191D2358"/>
     <w:multiLevelType w:val="multilevel"/>
     <w:tmpl w:val="4C76D0CE"/>
@@ -21985,7 +24383,7 @@
       </w:rPr>
     </w:lvl>
   </w:abstractNum>
-  <w:abstractNum w:abstractNumId="15" w15:restartNumberingAfterBreak="0">
+  <w:abstractNum w:abstractNumId="20" w15:restartNumberingAfterBreak="0">
     <w:nsid w:val="1A0904A8"/>
     <w:multiLevelType w:val="multilevel"/>
     <w:tmpl w:val="AEAA53BA"/>
@@ -22134,7 +24532,7 @@
       </w:rPr>
     </w:lvl>
   </w:abstractNum>
-  <w:abstractNum w:abstractNumId="16" w15:restartNumberingAfterBreak="0">
+  <w:abstractNum w:abstractNumId="21" w15:restartNumberingAfterBreak="0">
     <w:nsid w:val="1AA157C6"/>
     <w:multiLevelType w:val="multilevel"/>
     <w:tmpl w:val="349810B6"/>
@@ -22283,7 +24681,156 @@
       </w:rPr>
     </w:lvl>
   </w:abstractNum>
-  <w:abstractNum w:abstractNumId="17" w15:restartNumberingAfterBreak="0">
+  <w:abstractNum w:abstractNumId="22" w15:restartNumberingAfterBreak="0">
+    <w:nsid w:val="1D7724FA"/>
+    <w:multiLevelType w:val="multilevel"/>
+    <w:tmpl w:val="86AAB848"/>
+    <w:lvl w:ilvl="0">
+      <w:start w:val="1"/>
+      <w:numFmt w:val="bullet"/>
+      <w:lvlText w:val=""/>
+      <w:lvlJc w:val="left"/>
+      <w:pPr>
+        <w:tabs>
+          <w:tab w:val="num" w:pos="720"/>
+        </w:tabs>
+        <w:ind w:left="720" w:hanging="360"/>
+      </w:pPr>
+      <w:rPr>
+        <w:rFonts w:ascii="Symbol" w:hAnsi="Symbol" w:hint="default"/>
+        <w:sz w:val="20"/>
+      </w:rPr>
+    </w:lvl>
+    <w:lvl w:ilvl="1" w:tentative="1">
+      <w:start w:val="1"/>
+      <w:numFmt w:val="bullet"/>
+      <w:lvlText w:val="o"/>
+      <w:lvlJc w:val="left"/>
+      <w:pPr>
+        <w:tabs>
+          <w:tab w:val="num" w:pos="1440"/>
+        </w:tabs>
+        <w:ind w:left="1440" w:hanging="360"/>
+      </w:pPr>
+      <w:rPr>
+        <w:rFonts w:ascii="Courier New" w:hAnsi="Courier New" w:hint="default"/>
+        <w:sz w:val="20"/>
+      </w:rPr>
+    </w:lvl>
+    <w:lvl w:ilvl="2" w:tentative="1">
+      <w:start w:val="1"/>
+      <w:numFmt w:val="bullet"/>
+      <w:lvlText w:val=""/>
+      <w:lvlJc w:val="left"/>
+      <w:pPr>
+        <w:tabs>
+          <w:tab w:val="num" w:pos="2160"/>
+        </w:tabs>
+        <w:ind w:left="2160" w:hanging="360"/>
+      </w:pPr>
+      <w:rPr>
+        <w:rFonts w:ascii="Wingdings" w:hAnsi="Wingdings" w:hint="default"/>
+        <w:sz w:val="20"/>
+      </w:rPr>
+    </w:lvl>
+    <w:lvl w:ilvl="3" w:tentative="1">
+      <w:start w:val="1"/>
+      <w:numFmt w:val="bullet"/>
+      <w:lvlText w:val=""/>
+      <w:lvlJc w:val="left"/>
+      <w:pPr>
+        <w:tabs>
+          <w:tab w:val="num" w:pos="2880"/>
+        </w:tabs>
+        <w:ind w:left="2880" w:hanging="360"/>
+      </w:pPr>
+      <w:rPr>
+        <w:rFonts w:ascii="Wingdings" w:hAnsi="Wingdings" w:hint="default"/>
+        <w:sz w:val="20"/>
+      </w:rPr>
+    </w:lvl>
+    <w:lvl w:ilvl="4" w:tentative="1">
+      <w:start w:val="1"/>
+      <w:numFmt w:val="bullet"/>
+      <w:lvlText w:val=""/>
+      <w:lvlJc w:val="left"/>
+      <w:pPr>
+        <w:tabs>
+          <w:tab w:val="num" w:pos="3600"/>
+        </w:tabs>
+        <w:ind w:left="3600" w:hanging="360"/>
+      </w:pPr>
+      <w:rPr>
+        <w:rFonts w:ascii="Wingdings" w:hAnsi="Wingdings" w:hint="default"/>
+        <w:sz w:val="20"/>
+      </w:rPr>
+    </w:lvl>
+    <w:lvl w:ilvl="5" w:tentative="1">
+      <w:start w:val="1"/>
+      <w:numFmt w:val="bullet"/>
+      <w:lvlText w:val=""/>
+      <w:lvlJc w:val="left"/>
+      <w:pPr>
+        <w:tabs>
+          <w:tab w:val="num" w:pos="4320"/>
+        </w:tabs>
+        <w:ind w:left="4320" w:hanging="360"/>
+      </w:pPr>
+      <w:rPr>
+        <w:rFonts w:ascii="Wingdings" w:hAnsi="Wingdings" w:hint="default"/>
+        <w:sz w:val="20"/>
+      </w:rPr>
+    </w:lvl>
+    <w:lvl w:ilvl="6" w:tentative="1">
+      <w:start w:val="1"/>
+      <w:numFmt w:val="bullet"/>
+      <w:lvlText w:val=""/>
+      <w:lvlJc w:val="left"/>
+      <w:pPr>
+        <w:tabs>
+          <w:tab w:val="num" w:pos="5040"/>
+        </w:tabs>
+        <w:ind w:left="5040" w:hanging="360"/>
+      </w:pPr>
+      <w:rPr>
+        <w:rFonts w:ascii="Wingdings" w:hAnsi="Wingdings" w:hint="default"/>
+        <w:sz w:val="20"/>
+      </w:rPr>
+    </w:lvl>
+    <w:lvl w:ilvl="7" w:tentative="1">
+      <w:start w:val="1"/>
+      <w:numFmt w:val="bullet"/>
+      <w:lvlText w:val=""/>
+      <w:lvlJc w:val="left"/>
+      <w:pPr>
+        <w:tabs>
+          <w:tab w:val="num" w:pos="5760"/>
+        </w:tabs>
+        <w:ind w:left="5760" w:hanging="360"/>
+      </w:pPr>
+      <w:rPr>
+        <w:rFonts w:ascii="Wingdings" w:hAnsi="Wingdings" w:hint="default"/>
+        <w:sz w:val="20"/>
+      </w:rPr>
+    </w:lvl>
+    <w:lvl w:ilvl="8" w:tentative="1">
+      <w:start w:val="1"/>
+      <w:numFmt w:val="bullet"/>
+      <w:lvlText w:val=""/>
+      <w:lvlJc w:val="left"/>
+      <w:pPr>
+        <w:tabs>
+          <w:tab w:val="num" w:pos="6480"/>
+        </w:tabs>
+        <w:ind w:left="6480" w:hanging="360"/>
+      </w:pPr>
+      <w:rPr>
+        <w:rFonts w:ascii="Wingdings" w:hAnsi="Wingdings" w:hint="default"/>
+        <w:sz w:val="20"/>
+      </w:rPr>
+    </w:lvl>
+  </w:abstractNum>
+  <w:abstractNum w:abstractNumId="23" w15:restartNumberingAfterBreak="0">
     <w:nsid w:val="1D784D91"/>
     <w:multiLevelType w:val="multilevel"/>
     <w:tmpl w:val="D990E908"/>
@@ -22432,7 +24979,7 @@
       </w:rPr>
     </w:lvl>
   </w:abstractNum>
-  <w:abstractNum w:abstractNumId="18" w15:restartNumberingAfterBreak="0">
+  <w:abstractNum w:abstractNumId="24" w15:restartNumberingAfterBreak="0">
     <w:nsid w:val="1D795E8D"/>
     <w:multiLevelType w:val="multilevel"/>
     <w:tmpl w:val="1D48DAD0"/>
@@ -22581,7 +25128,7 @@
       </w:rPr>
     </w:lvl>
   </w:abstractNum>
-  <w:abstractNum w:abstractNumId="19" w15:restartNumberingAfterBreak="0">
+  <w:abstractNum w:abstractNumId="25" w15:restartNumberingAfterBreak="0">
     <w:nsid w:val="1E013F2E"/>
     <w:multiLevelType w:val="multilevel"/>
     <w:tmpl w:val="ED0466AA"/>
@@ -22730,7 +25277,7 @@
       </w:rPr>
     </w:lvl>
   </w:abstractNum>
-  <w:abstractNum w:abstractNumId="20" w15:restartNumberingAfterBreak="0">
+  <w:abstractNum w:abstractNumId="26" w15:restartNumberingAfterBreak="0">
     <w:nsid w:val="1E957172"/>
     <w:multiLevelType w:val="multilevel"/>
     <w:tmpl w:val="E1EC9D14"/>
@@ -22879,7 +25426,7 @@
       </w:rPr>
     </w:lvl>
   </w:abstractNum>
-  <w:abstractNum w:abstractNumId="21" w15:restartNumberingAfterBreak="0">
+  <w:abstractNum w:abstractNumId="27" w15:restartNumberingAfterBreak="0">
     <w:nsid w:val="1F04011B"/>
     <w:multiLevelType w:val="multilevel"/>
     <w:tmpl w:val="32E60924"/>
@@ -23028,7 +25575,156 @@
       </w:rPr>
     </w:lvl>
   </w:abstractNum>
-  <w:abstractNum w:abstractNumId="22" w15:restartNumberingAfterBreak="0">
+  <w:abstractNum w:abstractNumId="28" w15:restartNumberingAfterBreak="0">
+    <w:nsid w:val="1F6D3F16"/>
+    <w:multiLevelType w:val="multilevel"/>
+    <w:tmpl w:val="CA0482E6"/>
+    <w:lvl w:ilvl="0">
+      <w:start w:val="1"/>
+      <w:numFmt w:val="bullet"/>
+      <w:lvlText w:val=""/>
+      <w:lvlJc w:val="left"/>
+      <w:pPr>
+        <w:tabs>
+          <w:tab w:val="num" w:pos="720"/>
+        </w:tabs>
+        <w:ind w:left="720" w:hanging="360"/>
+      </w:pPr>
+      <w:rPr>
+        <w:rFonts w:ascii="Symbol" w:hAnsi="Symbol" w:hint="default"/>
+        <w:sz w:val="20"/>
+      </w:rPr>
+    </w:lvl>
+    <w:lvl w:ilvl="1" w:tentative="1">
+      <w:start w:val="1"/>
+      <w:numFmt w:val="bullet"/>
+      <w:lvlText w:val="o"/>
+      <w:lvlJc w:val="left"/>
+      <w:pPr>
+        <w:tabs>
+          <w:tab w:val="num" w:pos="1440"/>
+        </w:tabs>
+        <w:ind w:left="1440" w:hanging="360"/>
+      </w:pPr>
+      <w:rPr>
+        <w:rFonts w:ascii="Courier New" w:hAnsi="Courier New" w:hint="default"/>
+        <w:sz w:val="20"/>
+      </w:rPr>
+    </w:lvl>
+    <w:lvl w:ilvl="2" w:tentative="1">
+      <w:start w:val="1"/>
+      <w:numFmt w:val="bullet"/>
+      <w:lvlText w:val=""/>
+      <w:lvlJc w:val="left"/>
+      <w:pPr>
+        <w:tabs>
+          <w:tab w:val="num" w:pos="2160"/>
+        </w:tabs>
+        <w:ind w:left="2160" w:hanging="360"/>
+      </w:pPr>
+      <w:rPr>
+        <w:rFonts w:ascii="Wingdings" w:hAnsi="Wingdings" w:hint="default"/>
+        <w:sz w:val="20"/>
+      </w:rPr>
+    </w:lvl>
+    <w:lvl w:ilvl="3" w:tentative="1">
+      <w:start w:val="1"/>
+      <w:numFmt w:val="bullet"/>
+      <w:lvlText w:val=""/>
+      <w:lvlJc w:val="left"/>
+      <w:pPr>
+        <w:tabs>
+          <w:tab w:val="num" w:pos="2880"/>
+        </w:tabs>
+        <w:ind w:left="2880" w:hanging="360"/>
+      </w:pPr>
+      <w:rPr>
+        <w:rFonts w:ascii="Wingdings" w:hAnsi="Wingdings" w:hint="default"/>
+        <w:sz w:val="20"/>
+      </w:rPr>
+    </w:lvl>
+    <w:lvl w:ilvl="4" w:tentative="1">
+      <w:start w:val="1"/>
+      <w:numFmt w:val="bullet"/>
+      <w:lvlText w:val=""/>
+      <w:lvlJc w:val="left"/>
+      <w:pPr>
+        <w:tabs>
+          <w:tab w:val="num" w:pos="3600"/>
+        </w:tabs>
+        <w:ind w:left="3600" w:hanging="360"/>
+      </w:pPr>
+      <w:rPr>
+        <w:rFonts w:ascii="Wingdings" w:hAnsi="Wingdings" w:hint="default"/>
+        <w:sz w:val="20"/>
+      </w:rPr>
+    </w:lvl>
+    <w:lvl w:ilvl="5" w:tentative="1">
+      <w:start w:val="1"/>
+      <w:numFmt w:val="bullet"/>
+      <w:lvlText w:val=""/>
+      <w:lvlJc w:val="left"/>
+      <w:pPr>
+        <w:tabs>
+          <w:tab w:val="num" w:pos="4320"/>
+        </w:tabs>
+        <w:ind w:left="4320" w:hanging="360"/>
+      </w:pPr>
+      <w:rPr>
+        <w:rFonts w:ascii="Wingdings" w:hAnsi="Wingdings" w:hint="default"/>
+        <w:sz w:val="20"/>
+      </w:rPr>
+    </w:lvl>
+    <w:lvl w:ilvl="6" w:tentative="1">
+      <w:start w:val="1"/>
+      <w:numFmt w:val="bullet"/>
+      <w:lvlText w:val=""/>
+      <w:lvlJc w:val="left"/>
+      <w:pPr>
+        <w:tabs>
+          <w:tab w:val="num" w:pos="5040"/>
+        </w:tabs>
+        <w:ind w:left="5040" w:hanging="360"/>
+      </w:pPr>
+      <w:rPr>
+        <w:rFonts w:ascii="Wingdings" w:hAnsi="Wingdings" w:hint="default"/>
+        <w:sz w:val="20"/>
+      </w:rPr>
+    </w:lvl>
+    <w:lvl w:ilvl="7" w:tentative="1">
+      <w:start w:val="1"/>
+      <w:numFmt w:val="bullet"/>
+      <w:lvlText w:val=""/>
+      <w:lvlJc w:val="left"/>
+      <w:pPr>
+        <w:tabs>
+          <w:tab w:val="num" w:pos="5760"/>
+        </w:tabs>
+        <w:ind w:left="5760" w:hanging="360"/>
+      </w:pPr>
+      <w:rPr>
+        <w:rFonts w:ascii="Wingdings" w:hAnsi="Wingdings" w:hint="default"/>
+        <w:sz w:val="20"/>
+      </w:rPr>
+    </w:lvl>
+    <w:lvl w:ilvl="8" w:tentative="1">
+      <w:start w:val="1"/>
+      <w:numFmt w:val="bullet"/>
+      <w:lvlText w:val=""/>
+      <w:lvlJc w:val="left"/>
+      <w:pPr>
+        <w:tabs>
+          <w:tab w:val="num" w:pos="6480"/>
+        </w:tabs>
+        <w:ind w:left="6480" w:hanging="360"/>
+      </w:pPr>
+      <w:rPr>
+        <w:rFonts w:ascii="Wingdings" w:hAnsi="Wingdings" w:hint="default"/>
+        <w:sz w:val="20"/>
+      </w:rPr>
+    </w:lvl>
+  </w:abstractNum>
+  <w:abstractNum w:abstractNumId="29" w15:restartNumberingAfterBreak="0">
     <w:nsid w:val="1FF9523E"/>
     <w:multiLevelType w:val="multilevel"/>
     <w:tmpl w:val="A84043AE"/>
@@ -23177,7 +25873,7 @@
       </w:rPr>
     </w:lvl>
   </w:abstractNum>
-  <w:abstractNum w:abstractNumId="23" w15:restartNumberingAfterBreak="0">
+  <w:abstractNum w:abstractNumId="30" w15:restartNumberingAfterBreak="0">
     <w:nsid w:val="1FFA7335"/>
     <w:multiLevelType w:val="multilevel"/>
     <w:tmpl w:val="F746CC02"/>
@@ -23326,7 +26022,7 @@
       </w:rPr>
     </w:lvl>
   </w:abstractNum>
-  <w:abstractNum w:abstractNumId="24" w15:restartNumberingAfterBreak="0">
+  <w:abstractNum w:abstractNumId="31" w15:restartNumberingAfterBreak="0">
     <w:nsid w:val="24B573DD"/>
     <w:multiLevelType w:val="multilevel"/>
     <w:tmpl w:val="6A141EDC"/>
@@ -23475,7 +26171,7 @@
       </w:rPr>
     </w:lvl>
   </w:abstractNum>
-  <w:abstractNum w:abstractNumId="25" w15:restartNumberingAfterBreak="0">
+  <w:abstractNum w:abstractNumId="32" w15:restartNumberingAfterBreak="0">
     <w:nsid w:val="277F001C"/>
     <w:multiLevelType w:val="multilevel"/>
     <w:tmpl w:val="DD520D0A"/>
@@ -23624,7 +26320,7 @@
       </w:rPr>
     </w:lvl>
   </w:abstractNum>
-  <w:abstractNum w:abstractNumId="26" w15:restartNumberingAfterBreak="0">
+  <w:abstractNum w:abstractNumId="33" w15:restartNumberingAfterBreak="0">
     <w:nsid w:val="281F6B31"/>
     <w:multiLevelType w:val="multilevel"/>
     <w:tmpl w:val="1D141264"/>
@@ -23773,7 +26469,7 @@
       </w:rPr>
     </w:lvl>
   </w:abstractNum>
-  <w:abstractNum w:abstractNumId="27" w15:restartNumberingAfterBreak="0">
+  <w:abstractNum w:abstractNumId="34" w15:restartNumberingAfterBreak="0">
     <w:nsid w:val="28AA3B24"/>
     <w:multiLevelType w:val="multilevel"/>
     <w:tmpl w:val="32822732"/>
@@ -23922,7 +26618,7 @@
       </w:rPr>
     </w:lvl>
   </w:abstractNum>
-  <w:abstractNum w:abstractNumId="28" w15:restartNumberingAfterBreak="0">
+  <w:abstractNum w:abstractNumId="35" w15:restartNumberingAfterBreak="0">
     <w:nsid w:val="2C4213E1"/>
     <w:multiLevelType w:val="multilevel"/>
     <w:tmpl w:val="C2442892"/>
@@ -24071,7 +26767,7 @@
       </w:rPr>
     </w:lvl>
   </w:abstractNum>
-  <w:abstractNum w:abstractNumId="29" w15:restartNumberingAfterBreak="0">
+  <w:abstractNum w:abstractNumId="36" w15:restartNumberingAfterBreak="0">
     <w:nsid w:val="2C574A5E"/>
     <w:multiLevelType w:val="multilevel"/>
     <w:tmpl w:val="7A28EA68"/>
@@ -24220,7 +26916,7 @@
       </w:rPr>
     </w:lvl>
   </w:abstractNum>
-  <w:abstractNum w:abstractNumId="30" w15:restartNumberingAfterBreak="0">
+  <w:abstractNum w:abstractNumId="37" w15:restartNumberingAfterBreak="0">
     <w:nsid w:val="2CC54479"/>
     <w:multiLevelType w:val="multilevel"/>
     <w:tmpl w:val="1E7E449E"/>
@@ -24369,7 +27065,7 @@
       </w:rPr>
     </w:lvl>
   </w:abstractNum>
-  <w:abstractNum w:abstractNumId="31" w15:restartNumberingAfterBreak="0">
+  <w:abstractNum w:abstractNumId="38" w15:restartNumberingAfterBreak="0">
     <w:nsid w:val="2D875DB2"/>
     <w:multiLevelType w:val="multilevel"/>
     <w:tmpl w:val="6450BF7A"/>
@@ -24518,7 +27214,7 @@
       </w:rPr>
     </w:lvl>
   </w:abstractNum>
-  <w:abstractNum w:abstractNumId="32" w15:restartNumberingAfterBreak="0">
+  <w:abstractNum w:abstractNumId="39" w15:restartNumberingAfterBreak="0">
     <w:nsid w:val="2E19370C"/>
     <w:multiLevelType w:val="hybridMultilevel"/>
     <w:tmpl w:val="25684C34"/>
@@ -24631,7 +27327,7 @@
       </w:rPr>
     </w:lvl>
   </w:abstractNum>
-  <w:abstractNum w:abstractNumId="33" w15:restartNumberingAfterBreak="0">
+  <w:abstractNum w:abstractNumId="40" w15:restartNumberingAfterBreak="0">
     <w:nsid w:val="2EDC66D7"/>
     <w:multiLevelType w:val="multilevel"/>
     <w:tmpl w:val="484CDF84"/>
@@ -24780,7 +27476,7 @@
       </w:rPr>
     </w:lvl>
   </w:abstractNum>
-  <w:abstractNum w:abstractNumId="34" w15:restartNumberingAfterBreak="0">
+  <w:abstractNum w:abstractNumId="41" w15:restartNumberingAfterBreak="0">
     <w:nsid w:val="2F3960A5"/>
     <w:multiLevelType w:val="multilevel"/>
     <w:tmpl w:val="C5E2EACE"/>
@@ -24929,7 +27625,7 @@
       </w:rPr>
     </w:lvl>
   </w:abstractNum>
-  <w:abstractNum w:abstractNumId="35" w15:restartNumberingAfterBreak="0">
+  <w:abstractNum w:abstractNumId="42" w15:restartNumberingAfterBreak="0">
     <w:nsid w:val="329C39BB"/>
     <w:multiLevelType w:val="multilevel"/>
     <w:tmpl w:val="1696BB5C"/>
@@ -25078,7 +27774,7 @@
       </w:rPr>
     </w:lvl>
   </w:abstractNum>
-  <w:abstractNum w:abstractNumId="36" w15:restartNumberingAfterBreak="0">
+  <w:abstractNum w:abstractNumId="43" w15:restartNumberingAfterBreak="0">
     <w:nsid w:val="32A06D6E"/>
     <w:multiLevelType w:val="hybridMultilevel"/>
     <w:tmpl w:val="D6B8F840"/>
@@ -25191,7 +27887,7 @@
       </w:rPr>
     </w:lvl>
   </w:abstractNum>
-  <w:abstractNum w:abstractNumId="37" w15:restartNumberingAfterBreak="0">
+  <w:abstractNum w:abstractNumId="44" w15:restartNumberingAfterBreak="0">
     <w:nsid w:val="33FF6B03"/>
     <w:multiLevelType w:val="multilevel"/>
     <w:tmpl w:val="38D493B4"/>
@@ -25340,7 +28036,7 @@
       </w:rPr>
     </w:lvl>
   </w:abstractNum>
-  <w:abstractNum w:abstractNumId="38" w15:restartNumberingAfterBreak="0">
+  <w:abstractNum w:abstractNumId="45" w15:restartNumberingAfterBreak="0">
     <w:nsid w:val="37A57ED9"/>
     <w:multiLevelType w:val="hybridMultilevel"/>
     <w:tmpl w:val="1D00E346"/>
@@ -25453,7 +28149,7 @@
       </w:rPr>
     </w:lvl>
   </w:abstractNum>
-  <w:abstractNum w:abstractNumId="39" w15:restartNumberingAfterBreak="0">
+  <w:abstractNum w:abstractNumId="46" w15:restartNumberingAfterBreak="0">
     <w:nsid w:val="37DD4BC5"/>
     <w:multiLevelType w:val="multilevel"/>
     <w:tmpl w:val="36DC130E"/>
@@ -25602,7 +28298,156 @@
       </w:rPr>
     </w:lvl>
   </w:abstractNum>
-  <w:abstractNum w:abstractNumId="40" w15:restartNumberingAfterBreak="0">
+  <w:abstractNum w:abstractNumId="47" w15:restartNumberingAfterBreak="0">
+    <w:nsid w:val="380604AB"/>
+    <w:multiLevelType w:val="multilevel"/>
+    <w:tmpl w:val="6EFE9FBE"/>
+    <w:lvl w:ilvl="0">
+      <w:start w:val="1"/>
+      <w:numFmt w:val="bullet"/>
+      <w:lvlText w:val=""/>
+      <w:lvlJc w:val="left"/>
+      <w:pPr>
+        <w:tabs>
+          <w:tab w:val="num" w:pos="720"/>
+        </w:tabs>
+        <w:ind w:left="720" w:hanging="360"/>
+      </w:pPr>
+      <w:rPr>
+        <w:rFonts w:ascii="Symbol" w:hAnsi="Symbol" w:hint="default"/>
+        <w:sz w:val="20"/>
+      </w:rPr>
+    </w:lvl>
+    <w:lvl w:ilvl="1" w:tentative="1">
+      <w:start w:val="1"/>
+      <w:numFmt w:val="bullet"/>
+      <w:lvlText w:val="o"/>
+      <w:lvlJc w:val="left"/>
+      <w:pPr>
+        <w:tabs>
+          <w:tab w:val="num" w:pos="1440"/>
+        </w:tabs>
+        <w:ind w:left="1440" w:hanging="360"/>
+      </w:pPr>
+      <w:rPr>
+        <w:rFonts w:ascii="Courier New" w:hAnsi="Courier New" w:hint="default"/>
+        <w:sz w:val="20"/>
+      </w:rPr>
+    </w:lvl>
+    <w:lvl w:ilvl="2" w:tentative="1">
+      <w:start w:val="1"/>
+      <w:numFmt w:val="bullet"/>
+      <w:lvlText w:val=""/>
+      <w:lvlJc w:val="left"/>
+      <w:pPr>
+        <w:tabs>
+          <w:tab w:val="num" w:pos="2160"/>
+        </w:tabs>
+        <w:ind w:left="2160" w:hanging="360"/>
+      </w:pPr>
+      <w:rPr>
+        <w:rFonts w:ascii="Wingdings" w:hAnsi="Wingdings" w:hint="default"/>
+        <w:sz w:val="20"/>
+      </w:rPr>
+    </w:lvl>
+    <w:lvl w:ilvl="3" w:tentative="1">
+      <w:start w:val="1"/>
+      <w:numFmt w:val="bullet"/>
+      <w:lvlText w:val=""/>
+      <w:lvlJc w:val="left"/>
+      <w:pPr>
+        <w:tabs>
+          <w:tab w:val="num" w:pos="2880"/>
+        </w:tabs>
+        <w:ind w:left="2880" w:hanging="360"/>
+      </w:pPr>
+      <w:rPr>
+        <w:rFonts w:ascii="Wingdings" w:hAnsi="Wingdings" w:hint="default"/>
+        <w:sz w:val="20"/>
+      </w:rPr>
+    </w:lvl>
+    <w:lvl w:ilvl="4" w:tentative="1">
+      <w:start w:val="1"/>
+      <w:numFmt w:val="bullet"/>
+      <w:lvlText w:val=""/>
+      <w:lvlJc w:val="left"/>
+      <w:pPr>
+        <w:tabs>
+          <w:tab w:val="num" w:pos="3600"/>
+        </w:tabs>
+        <w:ind w:left="3600" w:hanging="360"/>
+      </w:pPr>
+      <w:rPr>
+        <w:rFonts w:ascii="Wingdings" w:hAnsi="Wingdings" w:hint="default"/>
+        <w:sz w:val="20"/>
+      </w:rPr>
+    </w:lvl>
+    <w:lvl w:ilvl="5" w:tentative="1">
+      <w:start w:val="1"/>
+      <w:numFmt w:val="bullet"/>
+      <w:lvlText w:val=""/>
+      <w:lvlJc w:val="left"/>
+      <w:pPr>
+        <w:tabs>
+          <w:tab w:val="num" w:pos="4320"/>
+        </w:tabs>
+        <w:ind w:left="4320" w:hanging="360"/>
+      </w:pPr>
+      <w:rPr>
+        <w:rFonts w:ascii="Wingdings" w:hAnsi="Wingdings" w:hint="default"/>
+        <w:sz w:val="20"/>
+      </w:rPr>
+    </w:lvl>
+    <w:lvl w:ilvl="6" w:tentative="1">
+      <w:start w:val="1"/>
+      <w:numFmt w:val="bullet"/>
+      <w:lvlText w:val=""/>
+      <w:lvlJc w:val="left"/>
+      <w:pPr>
+        <w:tabs>
+          <w:tab w:val="num" w:pos="5040"/>
+        </w:tabs>
+        <w:ind w:left="5040" w:hanging="360"/>
+      </w:pPr>
+      <w:rPr>
+        <w:rFonts w:ascii="Wingdings" w:hAnsi="Wingdings" w:hint="default"/>
+        <w:sz w:val="20"/>
+      </w:rPr>
+    </w:lvl>
+    <w:lvl w:ilvl="7" w:tentative="1">
+      <w:start w:val="1"/>
+      <w:numFmt w:val="bullet"/>
+      <w:lvlText w:val=""/>
+      <w:lvlJc w:val="left"/>
+      <w:pPr>
+        <w:tabs>
+          <w:tab w:val="num" w:pos="5760"/>
+        </w:tabs>
+        <w:ind w:left="5760" w:hanging="360"/>
+      </w:pPr>
+      <w:rPr>
+        <w:rFonts w:ascii="Wingdings" w:hAnsi="Wingdings" w:hint="default"/>
+        <w:sz w:val="20"/>
+      </w:rPr>
+    </w:lvl>
+    <w:lvl w:ilvl="8" w:tentative="1">
+      <w:start w:val="1"/>
+      <w:numFmt w:val="bullet"/>
+      <w:lvlText w:val=""/>
+      <w:lvlJc w:val="left"/>
+      <w:pPr>
+        <w:tabs>
+          <w:tab w:val="num" w:pos="6480"/>
+        </w:tabs>
+        <w:ind w:left="6480" w:hanging="360"/>
+      </w:pPr>
+      <w:rPr>
+        <w:rFonts w:ascii="Wingdings" w:hAnsi="Wingdings" w:hint="default"/>
+        <w:sz w:val="20"/>
+      </w:rPr>
+    </w:lvl>
+  </w:abstractNum>
+  <w:abstractNum w:abstractNumId="48" w15:restartNumberingAfterBreak="0">
     <w:nsid w:val="384D26CE"/>
     <w:multiLevelType w:val="hybridMultilevel"/>
     <w:tmpl w:val="D58605C2"/>
@@ -25715,7 +28560,7 @@
       </w:rPr>
     </w:lvl>
   </w:abstractNum>
-  <w:abstractNum w:abstractNumId="41" w15:restartNumberingAfterBreak="0">
+  <w:abstractNum w:abstractNumId="49" w15:restartNumberingAfterBreak="0">
     <w:nsid w:val="384E4741"/>
     <w:multiLevelType w:val="hybridMultilevel"/>
     <w:tmpl w:val="A41EA404"/>
@@ -25828,7 +28673,7 @@
       </w:rPr>
     </w:lvl>
   </w:abstractNum>
-  <w:abstractNum w:abstractNumId="42" w15:restartNumberingAfterBreak="0">
+  <w:abstractNum w:abstractNumId="50" w15:restartNumberingAfterBreak="0">
     <w:nsid w:val="391764DC"/>
     <w:multiLevelType w:val="multilevel"/>
     <w:tmpl w:val="31FAB04C"/>
@@ -25977,7 +28822,7 @@
       </w:rPr>
     </w:lvl>
   </w:abstractNum>
-  <w:abstractNum w:abstractNumId="43" w15:restartNumberingAfterBreak="0">
+  <w:abstractNum w:abstractNumId="51" w15:restartNumberingAfterBreak="0">
     <w:nsid w:val="392F72CA"/>
     <w:multiLevelType w:val="multilevel"/>
     <w:tmpl w:val="25B4DBF2"/>
@@ -26126,7 +28971,7 @@
       </w:rPr>
     </w:lvl>
   </w:abstractNum>
-  <w:abstractNum w:abstractNumId="44" w15:restartNumberingAfterBreak="0">
+  <w:abstractNum w:abstractNumId="52" w15:restartNumberingAfterBreak="0">
     <w:nsid w:val="39DA1D2E"/>
     <w:multiLevelType w:val="multilevel"/>
     <w:tmpl w:val="4D10BF44"/>
@@ -26275,7 +29120,7 @@
       </w:rPr>
     </w:lvl>
   </w:abstractNum>
-  <w:abstractNum w:abstractNumId="45" w15:restartNumberingAfterBreak="0">
+  <w:abstractNum w:abstractNumId="53" w15:restartNumberingAfterBreak="0">
     <w:nsid w:val="3B125DF7"/>
     <w:multiLevelType w:val="multilevel"/>
     <w:tmpl w:val="2DFA1608"/>
@@ -26424,7 +29269,7 @@
       </w:rPr>
     </w:lvl>
   </w:abstractNum>
-  <w:abstractNum w:abstractNumId="46" w15:restartNumberingAfterBreak="0">
+  <w:abstractNum w:abstractNumId="54" w15:restartNumberingAfterBreak="0">
     <w:nsid w:val="3BBD0916"/>
     <w:multiLevelType w:val="hybridMultilevel"/>
     <w:tmpl w:val="9D041C18"/>
@@ -26537,7 +29382,7 @@
       </w:rPr>
     </w:lvl>
   </w:abstractNum>
-  <w:abstractNum w:abstractNumId="47" w15:restartNumberingAfterBreak="0">
+  <w:abstractNum w:abstractNumId="55" w15:restartNumberingAfterBreak="0">
     <w:nsid w:val="3BD05342"/>
     <w:multiLevelType w:val="hybridMultilevel"/>
     <w:tmpl w:val="AA38D2AA"/>
@@ -26650,7 +29495,7 @@
       </w:rPr>
     </w:lvl>
   </w:abstractNum>
-  <w:abstractNum w:abstractNumId="48" w15:restartNumberingAfterBreak="0">
+  <w:abstractNum w:abstractNumId="56" w15:restartNumberingAfterBreak="0">
     <w:nsid w:val="3CEB3B07"/>
     <w:multiLevelType w:val="multilevel"/>
     <w:tmpl w:val="6C903DEA"/>
@@ -26799,7 +29644,7 @@
       </w:rPr>
     </w:lvl>
   </w:abstractNum>
-  <w:abstractNum w:abstractNumId="49" w15:restartNumberingAfterBreak="0">
+  <w:abstractNum w:abstractNumId="57" w15:restartNumberingAfterBreak="0">
     <w:nsid w:val="3D1E6C5B"/>
     <w:multiLevelType w:val="multilevel"/>
     <w:tmpl w:val="7D5A8D26"/>
@@ -26948,7 +29793,7 @@
       </w:rPr>
     </w:lvl>
   </w:abstractNum>
-  <w:abstractNum w:abstractNumId="50" w15:restartNumberingAfterBreak="0">
+  <w:abstractNum w:abstractNumId="58" w15:restartNumberingAfterBreak="0">
     <w:nsid w:val="3E75593D"/>
     <w:multiLevelType w:val="multilevel"/>
     <w:tmpl w:val="77E60D1C"/>
@@ -27097,7 +29942,7 @@
       </w:rPr>
     </w:lvl>
   </w:abstractNum>
-  <w:abstractNum w:abstractNumId="51" w15:restartNumberingAfterBreak="0">
+  <w:abstractNum w:abstractNumId="59" w15:restartNumberingAfterBreak="0">
     <w:nsid w:val="3FE16A64"/>
     <w:multiLevelType w:val="multilevel"/>
     <w:tmpl w:val="BAF6EC1C"/>
@@ -27246,7 +30091,7 @@
       </w:rPr>
     </w:lvl>
   </w:abstractNum>
-  <w:abstractNum w:abstractNumId="52" w15:restartNumberingAfterBreak="0">
+  <w:abstractNum w:abstractNumId="60" w15:restartNumberingAfterBreak="0">
     <w:nsid w:val="40D03BCD"/>
     <w:multiLevelType w:val="multilevel"/>
     <w:tmpl w:val="E53A8542"/>
@@ -27395,7 +30240,7 @@
       </w:rPr>
     </w:lvl>
   </w:abstractNum>
-  <w:abstractNum w:abstractNumId="53" w15:restartNumberingAfterBreak="0">
+  <w:abstractNum w:abstractNumId="61" w15:restartNumberingAfterBreak="0">
     <w:nsid w:val="41EC2FB8"/>
     <w:multiLevelType w:val="hybridMultilevel"/>
     <w:tmpl w:val="219E1B58"/>
@@ -27508,7 +30353,7 @@
       </w:rPr>
     </w:lvl>
   </w:abstractNum>
-  <w:abstractNum w:abstractNumId="54" w15:restartNumberingAfterBreak="0">
+  <w:abstractNum w:abstractNumId="62" w15:restartNumberingAfterBreak="0">
     <w:nsid w:val="424215F5"/>
     <w:multiLevelType w:val="hybridMultilevel"/>
     <w:tmpl w:val="0696247A"/>
@@ -27621,7 +30466,7 @@
       </w:rPr>
     </w:lvl>
   </w:abstractNum>
-  <w:abstractNum w:abstractNumId="55" w15:restartNumberingAfterBreak="0">
+  <w:abstractNum w:abstractNumId="63" w15:restartNumberingAfterBreak="0">
     <w:nsid w:val="45783CE4"/>
     <w:multiLevelType w:val="hybridMultilevel"/>
     <w:tmpl w:val="78DAA06C"/>
@@ -27734,7 +30579,7 @@
       </w:rPr>
     </w:lvl>
   </w:abstractNum>
-  <w:abstractNum w:abstractNumId="56" w15:restartNumberingAfterBreak="0">
+  <w:abstractNum w:abstractNumId="64" w15:restartNumberingAfterBreak="0">
     <w:nsid w:val="4B427678"/>
     <w:multiLevelType w:val="multilevel"/>
     <w:tmpl w:val="48E4A9FC"/>
@@ -27883,7 +30728,7 @@
       </w:rPr>
     </w:lvl>
   </w:abstractNum>
-  <w:abstractNum w:abstractNumId="57" w15:restartNumberingAfterBreak="0">
+  <w:abstractNum w:abstractNumId="65" w15:restartNumberingAfterBreak="0">
     <w:nsid w:val="4C465F49"/>
     <w:multiLevelType w:val="hybridMultilevel"/>
     <w:tmpl w:val="7AC2E18C"/>
@@ -27996,7 +30841,7 @@
       </w:rPr>
     </w:lvl>
   </w:abstractNum>
-  <w:abstractNum w:abstractNumId="58" w15:restartNumberingAfterBreak="0">
+  <w:abstractNum w:abstractNumId="66" w15:restartNumberingAfterBreak="0">
     <w:nsid w:val="4D6C676B"/>
     <w:multiLevelType w:val="multilevel"/>
     <w:tmpl w:val="864695D8"/>
@@ -28145,7 +30990,7 @@
       </w:rPr>
     </w:lvl>
   </w:abstractNum>
-  <w:abstractNum w:abstractNumId="59" w15:restartNumberingAfterBreak="0">
+  <w:abstractNum w:abstractNumId="67" w15:restartNumberingAfterBreak="0">
     <w:nsid w:val="4D905590"/>
     <w:multiLevelType w:val="hybridMultilevel"/>
     <w:tmpl w:val="A012729C"/>
@@ -28258,7 +31103,7 @@
       </w:rPr>
     </w:lvl>
   </w:abstractNum>
-  <w:abstractNum w:abstractNumId="60" w15:restartNumberingAfterBreak="0">
+  <w:abstractNum w:abstractNumId="68" w15:restartNumberingAfterBreak="0">
     <w:nsid w:val="4DF575B1"/>
     <w:multiLevelType w:val="hybridMultilevel"/>
     <w:tmpl w:val="C5C0F41A"/>
@@ -28371,7 +31216,7 @@
       </w:rPr>
     </w:lvl>
   </w:abstractNum>
-  <w:abstractNum w:abstractNumId="61" w15:restartNumberingAfterBreak="0">
+  <w:abstractNum w:abstractNumId="69" w15:restartNumberingAfterBreak="0">
     <w:nsid w:val="4EC51907"/>
     <w:multiLevelType w:val="multilevel"/>
     <w:tmpl w:val="B9D0FF78"/>
@@ -28520,7 +31365,7 @@
       </w:rPr>
     </w:lvl>
   </w:abstractNum>
-  <w:abstractNum w:abstractNumId="62" w15:restartNumberingAfterBreak="0">
+  <w:abstractNum w:abstractNumId="70" w15:restartNumberingAfterBreak="0">
     <w:nsid w:val="4F720D32"/>
     <w:multiLevelType w:val="multilevel"/>
     <w:tmpl w:val="C0FE42C6"/>
@@ -28669,7 +31514,7 @@
       </w:rPr>
     </w:lvl>
   </w:abstractNum>
-  <w:abstractNum w:abstractNumId="63" w15:restartNumberingAfterBreak="0">
+  <w:abstractNum w:abstractNumId="71" w15:restartNumberingAfterBreak="0">
     <w:nsid w:val="4F9C4D08"/>
     <w:multiLevelType w:val="multilevel"/>
     <w:tmpl w:val="D01EC1BA"/>
@@ -28818,7 +31663,7 @@
       </w:rPr>
     </w:lvl>
   </w:abstractNum>
-  <w:abstractNum w:abstractNumId="64" w15:restartNumberingAfterBreak="0">
+  <w:abstractNum w:abstractNumId="72" w15:restartNumberingAfterBreak="0">
     <w:nsid w:val="507F5705"/>
     <w:multiLevelType w:val="multilevel"/>
     <w:tmpl w:val="366AE6C4"/>
@@ -28967,7 +31812,7 @@
       </w:rPr>
     </w:lvl>
   </w:abstractNum>
-  <w:abstractNum w:abstractNumId="65" w15:restartNumberingAfterBreak="0">
+  <w:abstractNum w:abstractNumId="73" w15:restartNumberingAfterBreak="0">
     <w:nsid w:val="50C66FD1"/>
     <w:multiLevelType w:val="hybridMultilevel"/>
     <w:tmpl w:val="E0468BCE"/>
@@ -29080,7 +31925,7 @@
       </w:rPr>
     </w:lvl>
   </w:abstractNum>
-  <w:abstractNum w:abstractNumId="66" w15:restartNumberingAfterBreak="0">
+  <w:abstractNum w:abstractNumId="74" w15:restartNumberingAfterBreak="0">
     <w:nsid w:val="51CB0FFF"/>
     <w:multiLevelType w:val="multilevel"/>
     <w:tmpl w:val="C4269EBC"/>
@@ -29229,7 +32074,7 @@
       </w:rPr>
     </w:lvl>
   </w:abstractNum>
-  <w:abstractNum w:abstractNumId="67" w15:restartNumberingAfterBreak="0">
+  <w:abstractNum w:abstractNumId="75" w15:restartNumberingAfterBreak="0">
     <w:nsid w:val="51F43525"/>
     <w:multiLevelType w:val="multilevel"/>
     <w:tmpl w:val="17FC6A90"/>
@@ -29378,7 +32223,7 @@
       </w:rPr>
     </w:lvl>
   </w:abstractNum>
-  <w:abstractNum w:abstractNumId="68" w15:restartNumberingAfterBreak="0">
+  <w:abstractNum w:abstractNumId="76" w15:restartNumberingAfterBreak="0">
     <w:nsid w:val="520C5DD3"/>
     <w:multiLevelType w:val="multilevel"/>
     <w:tmpl w:val="753AC0D2"/>
@@ -29527,7 +32372,7 @@
       </w:rPr>
     </w:lvl>
   </w:abstractNum>
-  <w:abstractNum w:abstractNumId="69" w15:restartNumberingAfterBreak="0">
+  <w:abstractNum w:abstractNumId="77" w15:restartNumberingAfterBreak="0">
     <w:nsid w:val="53F5143F"/>
     <w:multiLevelType w:val="hybridMultilevel"/>
     <w:tmpl w:val="B2005722"/>
@@ -29640,7 +32485,7 @@
       </w:rPr>
     </w:lvl>
   </w:abstractNum>
-  <w:abstractNum w:abstractNumId="70" w15:restartNumberingAfterBreak="0">
+  <w:abstractNum w:abstractNumId="78" w15:restartNumberingAfterBreak="0">
     <w:nsid w:val="5418548D"/>
     <w:multiLevelType w:val="multilevel"/>
     <w:tmpl w:val="F3745D64"/>
@@ -29789,7 +32634,7 @@
       </w:rPr>
     </w:lvl>
   </w:abstractNum>
-  <w:abstractNum w:abstractNumId="71" w15:restartNumberingAfterBreak="0">
+  <w:abstractNum w:abstractNumId="79" w15:restartNumberingAfterBreak="0">
     <w:nsid w:val="54E51C22"/>
     <w:multiLevelType w:val="hybridMultilevel"/>
     <w:tmpl w:val="D9A89FBA"/>
@@ -29902,7 +32747,7 @@
       </w:rPr>
     </w:lvl>
   </w:abstractNum>
-  <w:abstractNum w:abstractNumId="72" w15:restartNumberingAfterBreak="0">
+  <w:abstractNum w:abstractNumId="80" w15:restartNumberingAfterBreak="0">
     <w:nsid w:val="56141124"/>
     <w:multiLevelType w:val="multilevel"/>
     <w:tmpl w:val="72CECC2A"/>
@@ -30051,7 +32896,7 @@
       </w:rPr>
     </w:lvl>
   </w:abstractNum>
-  <w:abstractNum w:abstractNumId="73" w15:restartNumberingAfterBreak="0">
+  <w:abstractNum w:abstractNumId="81" w15:restartNumberingAfterBreak="0">
     <w:nsid w:val="5668129C"/>
     <w:multiLevelType w:val="multilevel"/>
     <w:tmpl w:val="193EC38C"/>
@@ -30200,7 +33045,7 @@
       </w:rPr>
     </w:lvl>
   </w:abstractNum>
-  <w:abstractNum w:abstractNumId="74" w15:restartNumberingAfterBreak="0">
+  <w:abstractNum w:abstractNumId="82" w15:restartNumberingAfterBreak="0">
     <w:nsid w:val="5A98463C"/>
     <w:multiLevelType w:val="hybridMultilevel"/>
     <w:tmpl w:val="52C83094"/>
@@ -30313,7 +33158,156 @@
       </w:rPr>
     </w:lvl>
   </w:abstractNum>
-  <w:abstractNum w:abstractNumId="75" w15:restartNumberingAfterBreak="0">
+  <w:abstractNum w:abstractNumId="83" w15:restartNumberingAfterBreak="0">
+    <w:nsid w:val="5BB618A7"/>
+    <w:multiLevelType w:val="multilevel"/>
+    <w:tmpl w:val="ED00B0B2"/>
+    <w:lvl w:ilvl="0">
+      <w:start w:val="1"/>
+      <w:numFmt w:val="bullet"/>
+      <w:lvlText w:val=""/>
+      <w:lvlJc w:val="left"/>
+      <w:pPr>
+        <w:tabs>
+          <w:tab w:val="num" w:pos="720"/>
+        </w:tabs>
+        <w:ind w:left="720" w:hanging="360"/>
+      </w:pPr>
+      <w:rPr>
+        <w:rFonts w:ascii="Symbol" w:hAnsi="Symbol" w:hint="default"/>
+        <w:sz w:val="20"/>
+      </w:rPr>
+    </w:lvl>
+    <w:lvl w:ilvl="1" w:tentative="1">
+      <w:start w:val="1"/>
+      <w:numFmt w:val="bullet"/>
+      <w:lvlText w:val="o"/>
+      <w:lvlJc w:val="left"/>
+      <w:pPr>
+        <w:tabs>
+          <w:tab w:val="num" w:pos="1440"/>
+        </w:tabs>
+        <w:ind w:left="1440" w:hanging="360"/>
+      </w:pPr>
+      <w:rPr>
+        <w:rFonts w:ascii="Courier New" w:hAnsi="Courier New" w:hint="default"/>
+        <w:sz w:val="20"/>
+      </w:rPr>
+    </w:lvl>
+    <w:lvl w:ilvl="2" w:tentative="1">
+      <w:start w:val="1"/>
+      <w:numFmt w:val="bullet"/>
+      <w:lvlText w:val=""/>
+      <w:lvlJc w:val="left"/>
+      <w:pPr>
+        <w:tabs>
+          <w:tab w:val="num" w:pos="2160"/>
+        </w:tabs>
+        <w:ind w:left="2160" w:hanging="360"/>
+      </w:pPr>
+      <w:rPr>
+        <w:rFonts w:ascii="Wingdings" w:hAnsi="Wingdings" w:hint="default"/>
+        <w:sz w:val="20"/>
+      </w:rPr>
+    </w:lvl>
+    <w:lvl w:ilvl="3" w:tentative="1">
+      <w:start w:val="1"/>
+      <w:numFmt w:val="bullet"/>
+      <w:lvlText w:val=""/>
+      <w:lvlJc w:val="left"/>
+      <w:pPr>
+        <w:tabs>
+          <w:tab w:val="num" w:pos="2880"/>
+        </w:tabs>
+        <w:ind w:left="2880" w:hanging="360"/>
+      </w:pPr>
+      <w:rPr>
+        <w:rFonts w:ascii="Wingdings" w:hAnsi="Wingdings" w:hint="default"/>
+        <w:sz w:val="20"/>
+      </w:rPr>
+    </w:lvl>
+    <w:lvl w:ilvl="4" w:tentative="1">
+      <w:start w:val="1"/>
+      <w:numFmt w:val="bullet"/>
+      <w:lvlText w:val=""/>
+      <w:lvlJc w:val="left"/>
+      <w:pPr>
+        <w:tabs>
+          <w:tab w:val="num" w:pos="3600"/>
+        </w:tabs>
+        <w:ind w:left="3600" w:hanging="360"/>
+      </w:pPr>
+      <w:rPr>
+        <w:rFonts w:ascii="Wingdings" w:hAnsi="Wingdings" w:hint="default"/>
+        <w:sz w:val="20"/>
+      </w:rPr>
+    </w:lvl>
+    <w:lvl w:ilvl="5" w:tentative="1">
+      <w:start w:val="1"/>
+      <w:numFmt w:val="bullet"/>
+      <w:lvlText w:val=""/>
+      <w:lvlJc w:val="left"/>
+      <w:pPr>
+        <w:tabs>
+          <w:tab w:val="num" w:pos="4320"/>
+        </w:tabs>
+        <w:ind w:left="4320" w:hanging="360"/>
+      </w:pPr>
+      <w:rPr>
+        <w:rFonts w:ascii="Wingdings" w:hAnsi="Wingdings" w:hint="default"/>
+        <w:sz w:val="20"/>
+      </w:rPr>
+    </w:lvl>
+    <w:lvl w:ilvl="6" w:tentative="1">
+      <w:start w:val="1"/>
+      <w:numFmt w:val="bullet"/>
+      <w:lvlText w:val=""/>
+      <w:lvlJc w:val="left"/>
+      <w:pPr>
+        <w:tabs>
+          <w:tab w:val="num" w:pos="5040"/>
+        </w:tabs>
+        <w:ind w:left="5040" w:hanging="360"/>
+      </w:pPr>
+      <w:rPr>
+        <w:rFonts w:ascii="Wingdings" w:hAnsi="Wingdings" w:hint="default"/>
+        <w:sz w:val="20"/>
+      </w:rPr>
+    </w:lvl>
+    <w:lvl w:ilvl="7" w:tentative="1">
+      <w:start w:val="1"/>
+      <w:numFmt w:val="bullet"/>
+      <w:lvlText w:val=""/>
+      <w:lvlJc w:val="left"/>
+      <w:pPr>
+        <w:tabs>
+          <w:tab w:val="num" w:pos="5760"/>
+        </w:tabs>
+        <w:ind w:left="5760" w:hanging="360"/>
+      </w:pPr>
+      <w:rPr>
+        <w:rFonts w:ascii="Wingdings" w:hAnsi="Wingdings" w:hint="default"/>
+        <w:sz w:val="20"/>
+      </w:rPr>
+    </w:lvl>
+    <w:lvl w:ilvl="8" w:tentative="1">
+      <w:start w:val="1"/>
+      <w:numFmt w:val="bullet"/>
+      <w:lvlText w:val=""/>
+      <w:lvlJc w:val="left"/>
+      <w:pPr>
+        <w:tabs>
+          <w:tab w:val="num" w:pos="6480"/>
+        </w:tabs>
+        <w:ind w:left="6480" w:hanging="360"/>
+      </w:pPr>
+      <w:rPr>
+        <w:rFonts w:ascii="Wingdings" w:hAnsi="Wingdings" w:hint="default"/>
+        <w:sz w:val="20"/>
+      </w:rPr>
+    </w:lvl>
+  </w:abstractNum>
+  <w:abstractNum w:abstractNumId="84" w15:restartNumberingAfterBreak="0">
     <w:nsid w:val="5BD530F4"/>
     <w:multiLevelType w:val="multilevel"/>
     <w:tmpl w:val="85BE4242"/>
@@ -30462,7 +33456,7 @@
       </w:rPr>
     </w:lvl>
   </w:abstractNum>
-  <w:abstractNum w:abstractNumId="76" w15:restartNumberingAfterBreak="0">
+  <w:abstractNum w:abstractNumId="85" w15:restartNumberingAfterBreak="0">
     <w:nsid w:val="5F797678"/>
     <w:multiLevelType w:val="multilevel"/>
     <w:tmpl w:val="4BE291F8"/>
@@ -30611,7 +33605,7 @@
       </w:rPr>
     </w:lvl>
   </w:abstractNum>
-  <w:abstractNum w:abstractNumId="77" w15:restartNumberingAfterBreak="0">
+  <w:abstractNum w:abstractNumId="86" w15:restartNumberingAfterBreak="0">
     <w:nsid w:val="619D222B"/>
     <w:multiLevelType w:val="hybridMultilevel"/>
     <w:tmpl w:val="EE5E16D2"/>
@@ -30724,7 +33718,7 @@
       </w:rPr>
     </w:lvl>
   </w:abstractNum>
-  <w:abstractNum w:abstractNumId="78" w15:restartNumberingAfterBreak="0">
+  <w:abstractNum w:abstractNumId="87" w15:restartNumberingAfterBreak="0">
     <w:nsid w:val="64B00720"/>
     <w:multiLevelType w:val="multilevel"/>
     <w:tmpl w:val="ECA4E594"/>
@@ -30873,7 +33867,7 @@
       </w:rPr>
     </w:lvl>
   </w:abstractNum>
-  <w:abstractNum w:abstractNumId="79" w15:restartNumberingAfterBreak="0">
+  <w:abstractNum w:abstractNumId="88" w15:restartNumberingAfterBreak="0">
     <w:nsid w:val="64D8791F"/>
     <w:multiLevelType w:val="multilevel"/>
     <w:tmpl w:val="C818DFEE"/>
@@ -31022,7 +34016,7 @@
       </w:rPr>
     </w:lvl>
   </w:abstractNum>
-  <w:abstractNum w:abstractNumId="80" w15:restartNumberingAfterBreak="0">
+  <w:abstractNum w:abstractNumId="89" w15:restartNumberingAfterBreak="0">
     <w:nsid w:val="65220CC3"/>
     <w:multiLevelType w:val="multilevel"/>
     <w:tmpl w:val="8D34722E"/>
@@ -31171,7 +34165,7 @@
       </w:rPr>
     </w:lvl>
   </w:abstractNum>
-  <w:abstractNum w:abstractNumId="81" w15:restartNumberingAfterBreak="0">
+  <w:abstractNum w:abstractNumId="90" w15:restartNumberingAfterBreak="0">
     <w:nsid w:val="66383948"/>
     <w:multiLevelType w:val="hybridMultilevel"/>
     <w:tmpl w:val="938C0E22"/>
@@ -31284,7 +34278,7 @@
       </w:rPr>
     </w:lvl>
   </w:abstractNum>
-  <w:abstractNum w:abstractNumId="82" w15:restartNumberingAfterBreak="0">
+  <w:abstractNum w:abstractNumId="91" w15:restartNumberingAfterBreak="0">
     <w:nsid w:val="66801BE9"/>
     <w:multiLevelType w:val="hybridMultilevel"/>
     <w:tmpl w:val="CBB0A574"/>
@@ -31397,7 +34391,7 @@
       </w:rPr>
     </w:lvl>
   </w:abstractNum>
-  <w:abstractNum w:abstractNumId="83" w15:restartNumberingAfterBreak="0">
+  <w:abstractNum w:abstractNumId="92" w15:restartNumberingAfterBreak="0">
     <w:nsid w:val="673D59B7"/>
     <w:multiLevelType w:val="multilevel"/>
     <w:tmpl w:val="076E6504"/>
@@ -31546,7 +34540,7 @@
       </w:rPr>
     </w:lvl>
   </w:abstractNum>
-  <w:abstractNum w:abstractNumId="84" w15:restartNumberingAfterBreak="0">
+  <w:abstractNum w:abstractNumId="93" w15:restartNumberingAfterBreak="0">
     <w:nsid w:val="6CBD68F9"/>
     <w:multiLevelType w:val="hybridMultilevel"/>
     <w:tmpl w:val="D6145C82"/>
@@ -31659,7 +34653,7 @@
       </w:rPr>
     </w:lvl>
   </w:abstractNum>
-  <w:abstractNum w:abstractNumId="85" w15:restartNumberingAfterBreak="0">
+  <w:abstractNum w:abstractNumId="94" w15:restartNumberingAfterBreak="0">
     <w:nsid w:val="6D3E2179"/>
     <w:multiLevelType w:val="multilevel"/>
     <w:tmpl w:val="CAE0758E"/>
@@ -31808,7 +34802,156 @@
       </w:rPr>
     </w:lvl>
   </w:abstractNum>
-  <w:abstractNum w:abstractNumId="86" w15:restartNumberingAfterBreak="0">
+  <w:abstractNum w:abstractNumId="95" w15:restartNumberingAfterBreak="0">
+    <w:nsid w:val="6DE12C16"/>
+    <w:multiLevelType w:val="multilevel"/>
+    <w:tmpl w:val="0BDA262C"/>
+    <w:lvl w:ilvl="0">
+      <w:start w:val="1"/>
+      <w:numFmt w:val="bullet"/>
+      <w:lvlText w:val=""/>
+      <w:lvlJc w:val="left"/>
+      <w:pPr>
+        <w:tabs>
+          <w:tab w:val="num" w:pos="720"/>
+        </w:tabs>
+        <w:ind w:left="720" w:hanging="360"/>
+      </w:pPr>
+      <w:rPr>
+        <w:rFonts w:ascii="Symbol" w:hAnsi="Symbol" w:hint="default"/>
+        <w:sz w:val="20"/>
+      </w:rPr>
+    </w:lvl>
+    <w:lvl w:ilvl="1" w:tentative="1">
+      <w:start w:val="1"/>
+      <w:numFmt w:val="bullet"/>
+      <w:lvlText w:val="o"/>
+      <w:lvlJc w:val="left"/>
+      <w:pPr>
+        <w:tabs>
+          <w:tab w:val="num" w:pos="1440"/>
+        </w:tabs>
+        <w:ind w:left="1440" w:hanging="360"/>
+      </w:pPr>
+      <w:rPr>
+        <w:rFonts w:ascii="Courier New" w:hAnsi="Courier New" w:hint="default"/>
+        <w:sz w:val="20"/>
+      </w:rPr>
+    </w:lvl>
+    <w:lvl w:ilvl="2" w:tentative="1">
+      <w:start w:val="1"/>
+      <w:numFmt w:val="bullet"/>
+      <w:lvlText w:val=""/>
+      <w:lvlJc w:val="left"/>
+      <w:pPr>
+        <w:tabs>
+          <w:tab w:val="num" w:pos="2160"/>
+        </w:tabs>
+        <w:ind w:left="2160" w:hanging="360"/>
+      </w:pPr>
+      <w:rPr>
+        <w:rFonts w:ascii="Wingdings" w:hAnsi="Wingdings" w:hint="default"/>
+        <w:sz w:val="20"/>
+      </w:rPr>
+    </w:lvl>
+    <w:lvl w:ilvl="3" w:tentative="1">
+      <w:start w:val="1"/>
+      <w:numFmt w:val="bullet"/>
+      <w:lvlText w:val=""/>
+      <w:lvlJc w:val="left"/>
+      <w:pPr>
+        <w:tabs>
+          <w:tab w:val="num" w:pos="2880"/>
+        </w:tabs>
+        <w:ind w:left="2880" w:hanging="360"/>
+      </w:pPr>
+      <w:rPr>
+        <w:rFonts w:ascii="Wingdings" w:hAnsi="Wingdings" w:hint="default"/>
+        <w:sz w:val="20"/>
+      </w:rPr>
+    </w:lvl>
+    <w:lvl w:ilvl="4" w:tentative="1">
+      <w:start w:val="1"/>
+      <w:numFmt w:val="bullet"/>
+      <w:lvlText w:val=""/>
+      <w:lvlJc w:val="left"/>
+      <w:pPr>
+        <w:tabs>
+          <w:tab w:val="num" w:pos="3600"/>
+        </w:tabs>
+        <w:ind w:left="3600" w:hanging="360"/>
+      </w:pPr>
+      <w:rPr>
+        <w:rFonts w:ascii="Wingdings" w:hAnsi="Wingdings" w:hint="default"/>
+        <w:sz w:val="20"/>
+      </w:rPr>
+    </w:lvl>
+    <w:lvl w:ilvl="5" w:tentative="1">
+      <w:start w:val="1"/>
+      <w:numFmt w:val="bullet"/>
+      <w:lvlText w:val=""/>
+      <w:lvlJc w:val="left"/>
+      <w:pPr>
+        <w:tabs>
+          <w:tab w:val="num" w:pos="4320"/>
+        </w:tabs>
+        <w:ind w:left="4320" w:hanging="360"/>
+      </w:pPr>
+      <w:rPr>
+        <w:rFonts w:ascii="Wingdings" w:hAnsi="Wingdings" w:hint="default"/>
+        <w:sz w:val="20"/>
+      </w:rPr>
+    </w:lvl>
+    <w:lvl w:ilvl="6" w:tentative="1">
+      <w:start w:val="1"/>
+      <w:numFmt w:val="bullet"/>
+      <w:lvlText w:val=""/>
+      <w:lvlJc w:val="left"/>
+      <w:pPr>
+        <w:tabs>
+          <w:tab w:val="num" w:pos="5040"/>
+        </w:tabs>
+        <w:ind w:left="5040" w:hanging="360"/>
+      </w:pPr>
+      <w:rPr>
+        <w:rFonts w:ascii="Wingdings" w:hAnsi="Wingdings" w:hint="default"/>
+        <w:sz w:val="20"/>
+      </w:rPr>
+    </w:lvl>
+    <w:lvl w:ilvl="7" w:tentative="1">
+      <w:start w:val="1"/>
+      <w:numFmt w:val="bullet"/>
+      <w:lvlText w:val=""/>
+      <w:lvlJc w:val="left"/>
+      <w:pPr>
+        <w:tabs>
+          <w:tab w:val="num" w:pos="5760"/>
+        </w:tabs>
+        <w:ind w:left="5760" w:hanging="360"/>
+      </w:pPr>
+      <w:rPr>
+        <w:rFonts w:ascii="Wingdings" w:hAnsi="Wingdings" w:hint="default"/>
+        <w:sz w:val="20"/>
+      </w:rPr>
+    </w:lvl>
+    <w:lvl w:ilvl="8" w:tentative="1">
+      <w:start w:val="1"/>
+      <w:numFmt w:val="bullet"/>
+      <w:lvlText w:val=""/>
+      <w:lvlJc w:val="left"/>
+      <w:pPr>
+        <w:tabs>
+          <w:tab w:val="num" w:pos="6480"/>
+        </w:tabs>
+        <w:ind w:left="6480" w:hanging="360"/>
+      </w:pPr>
+      <w:rPr>
+        <w:rFonts w:ascii="Wingdings" w:hAnsi="Wingdings" w:hint="default"/>
+        <w:sz w:val="20"/>
+      </w:rPr>
+    </w:lvl>
+  </w:abstractNum>
+  <w:abstractNum w:abstractNumId="96" w15:restartNumberingAfterBreak="0">
     <w:nsid w:val="6E6A33B4"/>
     <w:multiLevelType w:val="multilevel"/>
     <w:tmpl w:val="95FC9004"/>
@@ -31957,7 +35100,7 @@
       </w:rPr>
     </w:lvl>
   </w:abstractNum>
-  <w:abstractNum w:abstractNumId="87" w15:restartNumberingAfterBreak="0">
+  <w:abstractNum w:abstractNumId="97" w15:restartNumberingAfterBreak="0">
     <w:nsid w:val="6F98587B"/>
     <w:multiLevelType w:val="hybridMultilevel"/>
     <w:tmpl w:val="4A96D6FA"/>
@@ -32070,7 +35213,7 @@
       </w:rPr>
     </w:lvl>
   </w:abstractNum>
-  <w:abstractNum w:abstractNumId="88" w15:restartNumberingAfterBreak="0">
+  <w:abstractNum w:abstractNumId="98" w15:restartNumberingAfterBreak="0">
     <w:nsid w:val="6FAB546B"/>
     <w:multiLevelType w:val="hybridMultilevel"/>
     <w:tmpl w:val="99DC22E6"/>
@@ -32183,7 +35326,7 @@
       </w:rPr>
     </w:lvl>
   </w:abstractNum>
-  <w:abstractNum w:abstractNumId="89" w15:restartNumberingAfterBreak="0">
+  <w:abstractNum w:abstractNumId="99" w15:restartNumberingAfterBreak="0">
     <w:nsid w:val="714D5569"/>
     <w:multiLevelType w:val="multilevel"/>
     <w:tmpl w:val="CD0AA0D6"/>
@@ -32332,7 +35475,7 @@
       </w:rPr>
     </w:lvl>
   </w:abstractNum>
-  <w:abstractNum w:abstractNumId="90" w15:restartNumberingAfterBreak="0">
+  <w:abstractNum w:abstractNumId="100" w15:restartNumberingAfterBreak="0">
     <w:nsid w:val="73042D32"/>
     <w:multiLevelType w:val="hybridMultilevel"/>
     <w:tmpl w:val="1EF05924"/>
@@ -32445,7 +35588,7 @@
       </w:rPr>
     </w:lvl>
   </w:abstractNum>
-  <w:abstractNum w:abstractNumId="91" w15:restartNumberingAfterBreak="0">
+  <w:abstractNum w:abstractNumId="101" w15:restartNumberingAfterBreak="0">
     <w:nsid w:val="7315484B"/>
     <w:multiLevelType w:val="hybridMultilevel"/>
     <w:tmpl w:val="AABA4838"/>
@@ -32558,7 +35701,156 @@
       </w:rPr>
     </w:lvl>
   </w:abstractNum>
-  <w:abstractNum w:abstractNumId="92" w15:restartNumberingAfterBreak="0">
+  <w:abstractNum w:abstractNumId="102" w15:restartNumberingAfterBreak="0">
+    <w:nsid w:val="73CE63CF"/>
+    <w:multiLevelType w:val="multilevel"/>
+    <w:tmpl w:val="A36AAC72"/>
+    <w:lvl w:ilvl="0">
+      <w:start w:val="1"/>
+      <w:numFmt w:val="bullet"/>
+      <w:lvlText w:val=""/>
+      <w:lvlJc w:val="left"/>
+      <w:pPr>
+        <w:tabs>
+          <w:tab w:val="num" w:pos="720"/>
+        </w:tabs>
+        <w:ind w:left="720" w:hanging="360"/>
+      </w:pPr>
+      <w:rPr>
+        <w:rFonts w:ascii="Symbol" w:hAnsi="Symbol" w:hint="default"/>
+        <w:sz w:val="20"/>
+      </w:rPr>
+    </w:lvl>
+    <w:lvl w:ilvl="1">
+      <w:start w:val="1"/>
+      <w:numFmt w:val="bullet"/>
+      <w:lvlText w:val="o"/>
+      <w:lvlJc w:val="left"/>
+      <w:pPr>
+        <w:tabs>
+          <w:tab w:val="num" w:pos="1440"/>
+        </w:tabs>
+        <w:ind w:left="1440" w:hanging="360"/>
+      </w:pPr>
+      <w:rPr>
+        <w:rFonts w:ascii="Courier New" w:hAnsi="Courier New" w:hint="default"/>
+        <w:sz w:val="20"/>
+      </w:rPr>
+    </w:lvl>
+    <w:lvl w:ilvl="2" w:tentative="1">
+      <w:start w:val="1"/>
+      <w:numFmt w:val="bullet"/>
+      <w:lvlText w:val=""/>
+      <w:lvlJc w:val="left"/>
+      <w:pPr>
+        <w:tabs>
+          <w:tab w:val="num" w:pos="2160"/>
+        </w:tabs>
+        <w:ind w:left="2160" w:hanging="360"/>
+      </w:pPr>
+      <w:rPr>
+        <w:rFonts w:ascii="Wingdings" w:hAnsi="Wingdings" w:hint="default"/>
+        <w:sz w:val="20"/>
+      </w:rPr>
+    </w:lvl>
+    <w:lvl w:ilvl="3" w:tentative="1">
+      <w:start w:val="1"/>
+      <w:numFmt w:val="bullet"/>
+      <w:lvlText w:val=""/>
+      <w:lvlJc w:val="left"/>
+      <w:pPr>
+        <w:tabs>
+          <w:tab w:val="num" w:pos="2880"/>
+        </w:tabs>
+        <w:ind w:left="2880" w:hanging="360"/>
+      </w:pPr>
+      <w:rPr>
+        <w:rFonts w:ascii="Wingdings" w:hAnsi="Wingdings" w:hint="default"/>
+        <w:sz w:val="20"/>
+      </w:rPr>
+    </w:lvl>
+    <w:lvl w:ilvl="4" w:tentative="1">
+      <w:start w:val="1"/>
+      <w:numFmt w:val="bullet"/>
+      <w:lvlText w:val=""/>
+      <w:lvlJc w:val="left"/>
+      <w:pPr>
+        <w:tabs>
+          <w:tab w:val="num" w:pos="3600"/>
+        </w:tabs>
+        <w:ind w:left="3600" w:hanging="360"/>
+      </w:pPr>
+      <w:rPr>
+        <w:rFonts w:ascii="Wingdings" w:hAnsi="Wingdings" w:hint="default"/>
+        <w:sz w:val="20"/>
+      </w:rPr>
+    </w:lvl>
+    <w:lvl w:ilvl="5" w:tentative="1">
+      <w:start w:val="1"/>
+      <w:numFmt w:val="bullet"/>
+      <w:lvlText w:val=""/>
+      <w:lvlJc w:val="left"/>
+      <w:pPr>
+        <w:tabs>
+          <w:tab w:val="num" w:pos="4320"/>
+        </w:tabs>
+        <w:ind w:left="4320" w:hanging="360"/>
+      </w:pPr>
+      <w:rPr>
+        <w:rFonts w:ascii="Wingdings" w:hAnsi="Wingdings" w:hint="default"/>
+        <w:sz w:val="20"/>
+      </w:rPr>
+    </w:lvl>
+    <w:lvl w:ilvl="6" w:tentative="1">
+      <w:start w:val="1"/>
+      <w:numFmt w:val="bullet"/>
+      <w:lvlText w:val=""/>
+      <w:lvlJc w:val="left"/>
+      <w:pPr>
+        <w:tabs>
+          <w:tab w:val="num" w:pos="5040"/>
+        </w:tabs>
+        <w:ind w:left="5040" w:hanging="360"/>
+      </w:pPr>
+      <w:rPr>
+        <w:rFonts w:ascii="Wingdings" w:hAnsi="Wingdings" w:hint="default"/>
+        <w:sz w:val="20"/>
+      </w:rPr>
+    </w:lvl>
+    <w:lvl w:ilvl="7" w:tentative="1">
+      <w:start w:val="1"/>
+      <w:numFmt w:val="bullet"/>
+      <w:lvlText w:val=""/>
+      <w:lvlJc w:val="left"/>
+      <w:pPr>
+        <w:tabs>
+          <w:tab w:val="num" w:pos="5760"/>
+        </w:tabs>
+        <w:ind w:left="5760" w:hanging="360"/>
+      </w:pPr>
+      <w:rPr>
+        <w:rFonts w:ascii="Wingdings" w:hAnsi="Wingdings" w:hint="default"/>
+        <w:sz w:val="20"/>
+      </w:rPr>
+    </w:lvl>
+    <w:lvl w:ilvl="8" w:tentative="1">
+      <w:start w:val="1"/>
+      <w:numFmt w:val="bullet"/>
+      <w:lvlText w:val=""/>
+      <w:lvlJc w:val="left"/>
+      <w:pPr>
+        <w:tabs>
+          <w:tab w:val="num" w:pos="6480"/>
+        </w:tabs>
+        <w:ind w:left="6480" w:hanging="360"/>
+      </w:pPr>
+      <w:rPr>
+        <w:rFonts w:ascii="Wingdings" w:hAnsi="Wingdings" w:hint="default"/>
+        <w:sz w:val="20"/>
+      </w:rPr>
+    </w:lvl>
+  </w:abstractNum>
+  <w:abstractNum w:abstractNumId="103" w15:restartNumberingAfterBreak="0">
     <w:nsid w:val="75355019"/>
     <w:multiLevelType w:val="multilevel"/>
     <w:tmpl w:val="33DE350A"/>
@@ -32707,7 +35999,7 @@
       </w:rPr>
     </w:lvl>
   </w:abstractNum>
-  <w:abstractNum w:abstractNumId="93" w15:restartNumberingAfterBreak="0">
+  <w:abstractNum w:abstractNumId="104" w15:restartNumberingAfterBreak="0">
     <w:nsid w:val="76501D39"/>
     <w:multiLevelType w:val="hybridMultilevel"/>
     <w:tmpl w:val="999456A0"/>
@@ -32820,7 +36112,7 @@
       </w:rPr>
     </w:lvl>
   </w:abstractNum>
-  <w:abstractNum w:abstractNumId="94" w15:restartNumberingAfterBreak="0">
+  <w:abstractNum w:abstractNumId="105" w15:restartNumberingAfterBreak="0">
     <w:nsid w:val="77152A3E"/>
     <w:multiLevelType w:val="hybridMultilevel"/>
     <w:tmpl w:val="87402410"/>
@@ -32933,7 +36225,7 @@
       </w:rPr>
     </w:lvl>
   </w:abstractNum>
-  <w:abstractNum w:abstractNumId="95" w15:restartNumberingAfterBreak="0">
+  <w:abstractNum w:abstractNumId="106" w15:restartNumberingAfterBreak="0">
     <w:nsid w:val="7736241E"/>
     <w:multiLevelType w:val="hybridMultilevel"/>
     <w:tmpl w:val="8566326A"/>
@@ -33046,7 +36338,7 @@
       </w:rPr>
     </w:lvl>
   </w:abstractNum>
-  <w:abstractNum w:abstractNumId="96" w15:restartNumberingAfterBreak="0">
+  <w:abstractNum w:abstractNumId="107" w15:restartNumberingAfterBreak="0">
     <w:nsid w:val="77AE223B"/>
     <w:multiLevelType w:val="multilevel"/>
     <w:tmpl w:val="E7AC683A"/>
@@ -33195,7 +36487,7 @@
       </w:rPr>
     </w:lvl>
   </w:abstractNum>
-  <w:abstractNum w:abstractNumId="97" w15:restartNumberingAfterBreak="0">
+  <w:abstractNum w:abstractNumId="108" w15:restartNumberingAfterBreak="0">
     <w:nsid w:val="788721AC"/>
     <w:multiLevelType w:val="hybridMultilevel"/>
     <w:tmpl w:val="30303298"/>
@@ -33308,7 +36600,7 @@
       </w:rPr>
     </w:lvl>
   </w:abstractNum>
-  <w:abstractNum w:abstractNumId="98" w15:restartNumberingAfterBreak="0">
+  <w:abstractNum w:abstractNumId="109" w15:restartNumberingAfterBreak="0">
     <w:nsid w:val="789D698A"/>
     <w:multiLevelType w:val="hybridMultilevel"/>
     <w:tmpl w:val="55260C64"/>
@@ -33421,7 +36713,7 @@
       </w:rPr>
     </w:lvl>
   </w:abstractNum>
-  <w:abstractNum w:abstractNumId="99" w15:restartNumberingAfterBreak="0">
+  <w:abstractNum w:abstractNumId="110" w15:restartNumberingAfterBreak="0">
     <w:nsid w:val="7C0070F8"/>
     <w:multiLevelType w:val="hybridMultilevel"/>
     <w:tmpl w:val="5E705DA0"/>
@@ -33534,7 +36826,7 @@
       </w:rPr>
     </w:lvl>
   </w:abstractNum>
-  <w:abstractNum w:abstractNumId="100" w15:restartNumberingAfterBreak="0">
+  <w:abstractNum w:abstractNumId="111" w15:restartNumberingAfterBreak="0">
     <w:nsid w:val="7C261037"/>
     <w:multiLevelType w:val="multilevel"/>
     <w:tmpl w:val="910E7076"/>
@@ -33683,7 +36975,7 @@
       </w:rPr>
     </w:lvl>
   </w:abstractNum>
-  <w:abstractNum w:abstractNumId="101" w15:restartNumberingAfterBreak="0">
+  <w:abstractNum w:abstractNumId="112" w15:restartNumberingAfterBreak="0">
     <w:nsid w:val="7C3B2547"/>
     <w:multiLevelType w:val="multilevel"/>
     <w:tmpl w:val="B18CE0AE"/>
@@ -33832,7 +37124,7 @@
       </w:rPr>
     </w:lvl>
   </w:abstractNum>
-  <w:abstractNum w:abstractNumId="102" w15:restartNumberingAfterBreak="0">
+  <w:abstractNum w:abstractNumId="113" w15:restartNumberingAfterBreak="0">
     <w:nsid w:val="7C495741"/>
     <w:multiLevelType w:val="multilevel"/>
     <w:tmpl w:val="31921748"/>
@@ -33945,7 +37237,7 @@
       </w:pPr>
     </w:lvl>
   </w:abstractNum>
-  <w:abstractNum w:abstractNumId="103" w15:restartNumberingAfterBreak="0">
+  <w:abstractNum w:abstractNumId="114" w15:restartNumberingAfterBreak="0">
     <w:nsid w:val="7C8305CC"/>
     <w:multiLevelType w:val="multilevel"/>
     <w:tmpl w:val="10D04C10"/>
@@ -34094,7 +37386,7 @@
       </w:rPr>
     </w:lvl>
   </w:abstractNum>
-  <w:abstractNum w:abstractNumId="104" w15:restartNumberingAfterBreak="0">
+  <w:abstractNum w:abstractNumId="115" w15:restartNumberingAfterBreak="0">
     <w:nsid w:val="7D050E13"/>
     <w:multiLevelType w:val="hybridMultilevel"/>
     <w:tmpl w:val="4410AC02"/>
@@ -34206,322 +37498,507 @@
       </w:rPr>
     </w:lvl>
   </w:abstractNum>
+  <w:abstractNum w:abstractNumId="116" w15:restartNumberingAfterBreak="0">
+    <w:nsid w:val="7D0869BB"/>
+    <w:multiLevelType w:val="multilevel"/>
+    <w:tmpl w:val="F4143242"/>
+    <w:lvl w:ilvl="0">
+      <w:start w:val="1"/>
+      <w:numFmt w:val="bullet"/>
+      <w:lvlText w:val=""/>
+      <w:lvlJc w:val="left"/>
+      <w:pPr>
+        <w:tabs>
+          <w:tab w:val="num" w:pos="720"/>
+        </w:tabs>
+        <w:ind w:left="720" w:hanging="360"/>
+      </w:pPr>
+      <w:rPr>
+        <w:rFonts w:ascii="Symbol" w:hAnsi="Symbol" w:hint="default"/>
+        <w:sz w:val="20"/>
+      </w:rPr>
+    </w:lvl>
+    <w:lvl w:ilvl="1" w:tentative="1">
+      <w:start w:val="1"/>
+      <w:numFmt w:val="bullet"/>
+      <w:lvlText w:val="o"/>
+      <w:lvlJc w:val="left"/>
+      <w:pPr>
+        <w:tabs>
+          <w:tab w:val="num" w:pos="1440"/>
+        </w:tabs>
+        <w:ind w:left="1440" w:hanging="360"/>
+      </w:pPr>
+      <w:rPr>
+        <w:rFonts w:ascii="Courier New" w:hAnsi="Courier New" w:hint="default"/>
+        <w:sz w:val="20"/>
+      </w:rPr>
+    </w:lvl>
+    <w:lvl w:ilvl="2" w:tentative="1">
+      <w:start w:val="1"/>
+      <w:numFmt w:val="bullet"/>
+      <w:lvlText w:val=""/>
+      <w:lvlJc w:val="left"/>
+      <w:pPr>
+        <w:tabs>
+          <w:tab w:val="num" w:pos="2160"/>
+        </w:tabs>
+        <w:ind w:left="2160" w:hanging="360"/>
+      </w:pPr>
+      <w:rPr>
+        <w:rFonts w:ascii="Wingdings" w:hAnsi="Wingdings" w:hint="default"/>
+        <w:sz w:val="20"/>
+      </w:rPr>
+    </w:lvl>
+    <w:lvl w:ilvl="3" w:tentative="1">
+      <w:start w:val="1"/>
+      <w:numFmt w:val="bullet"/>
+      <w:lvlText w:val=""/>
+      <w:lvlJc w:val="left"/>
+      <w:pPr>
+        <w:tabs>
+          <w:tab w:val="num" w:pos="2880"/>
+        </w:tabs>
+        <w:ind w:left="2880" w:hanging="360"/>
+      </w:pPr>
+      <w:rPr>
+        <w:rFonts w:ascii="Wingdings" w:hAnsi="Wingdings" w:hint="default"/>
+        <w:sz w:val="20"/>
+      </w:rPr>
+    </w:lvl>
+    <w:lvl w:ilvl="4" w:tentative="1">
+      <w:start w:val="1"/>
+      <w:numFmt w:val="bullet"/>
+      <w:lvlText w:val=""/>
+      <w:lvlJc w:val="left"/>
+      <w:pPr>
+        <w:tabs>
+          <w:tab w:val="num" w:pos="3600"/>
+        </w:tabs>
+        <w:ind w:left="3600" w:hanging="360"/>
+      </w:pPr>
+      <w:rPr>
+        <w:rFonts w:ascii="Wingdings" w:hAnsi="Wingdings" w:hint="default"/>
+        <w:sz w:val="20"/>
+      </w:rPr>
+    </w:lvl>
+    <w:lvl w:ilvl="5" w:tentative="1">
+      <w:start w:val="1"/>
+      <w:numFmt w:val="bullet"/>
+      <w:lvlText w:val=""/>
+      <w:lvlJc w:val="left"/>
+      <w:pPr>
+        <w:tabs>
+          <w:tab w:val="num" w:pos="4320"/>
+        </w:tabs>
+        <w:ind w:left="4320" w:hanging="360"/>
+      </w:pPr>
+      <w:rPr>
+        <w:rFonts w:ascii="Wingdings" w:hAnsi="Wingdings" w:hint="default"/>
+        <w:sz w:val="20"/>
+      </w:rPr>
+    </w:lvl>
+    <w:lvl w:ilvl="6" w:tentative="1">
+      <w:start w:val="1"/>
+      <w:numFmt w:val="bullet"/>
+      <w:lvlText w:val=""/>
+      <w:lvlJc w:val="left"/>
+      <w:pPr>
+        <w:tabs>
+          <w:tab w:val="num" w:pos="5040"/>
+        </w:tabs>
+        <w:ind w:left="5040" w:hanging="360"/>
+      </w:pPr>
+      <w:rPr>
+        <w:rFonts w:ascii="Wingdings" w:hAnsi="Wingdings" w:hint="default"/>
+        <w:sz w:val="20"/>
+      </w:rPr>
+    </w:lvl>
+    <w:lvl w:ilvl="7" w:tentative="1">
+      <w:start w:val="1"/>
+      <w:numFmt w:val="bullet"/>
+      <w:lvlText w:val=""/>
+      <w:lvlJc w:val="left"/>
+      <w:pPr>
+        <w:tabs>
+          <w:tab w:val="num" w:pos="5760"/>
+        </w:tabs>
+        <w:ind w:left="5760" w:hanging="360"/>
+      </w:pPr>
+      <w:rPr>
+        <w:rFonts w:ascii="Wingdings" w:hAnsi="Wingdings" w:hint="default"/>
+        <w:sz w:val="20"/>
+      </w:rPr>
+    </w:lvl>
+    <w:lvl w:ilvl="8" w:tentative="1">
+      <w:start w:val="1"/>
+      <w:numFmt w:val="bullet"/>
+      <w:lvlText w:val=""/>
+      <w:lvlJc w:val="left"/>
+      <w:pPr>
+        <w:tabs>
+          <w:tab w:val="num" w:pos="6480"/>
+        </w:tabs>
+        <w:ind w:left="6480" w:hanging="360"/>
+      </w:pPr>
+      <w:rPr>
+        <w:rFonts w:ascii="Wingdings" w:hAnsi="Wingdings" w:hint="default"/>
+        <w:sz w:val="20"/>
+      </w:rPr>
+    </w:lvl>
+  </w:abstractNum>
   <w:num w:numId="1">
-    <w:abstractNumId w:val="23"/>
+    <w:abstractNumId w:val="30"/>
   </w:num>
   <w:num w:numId="2">
-    <w:abstractNumId w:val="12"/>
+    <w:abstractNumId w:val="14"/>
   </w:num>
   <w:num w:numId="3">
-    <w:abstractNumId w:val="51"/>
+    <w:abstractNumId w:val="59"/>
   </w:num>
   <w:num w:numId="4">
-    <w:abstractNumId w:val="72"/>
+    <w:abstractNumId w:val="80"/>
   </w:num>
   <w:num w:numId="5">
     <w:abstractNumId w:val="4"/>
   </w:num>
   <w:num w:numId="6">
-    <w:abstractNumId w:val="100"/>
+    <w:abstractNumId w:val="111"/>
   </w:num>
   <w:num w:numId="7">
-    <w:abstractNumId w:val="101"/>
+    <w:abstractNumId w:val="112"/>
   </w:num>
   <w:num w:numId="8">
-    <w:abstractNumId w:val="96"/>
+    <w:abstractNumId w:val="107"/>
   </w:num>
   <w:num w:numId="9">
     <w:abstractNumId w:val="6"/>
   </w:num>
   <w:num w:numId="10">
-    <w:abstractNumId w:val="15"/>
+    <w:abstractNumId w:val="20"/>
   </w:num>
   <w:num w:numId="11">
-    <w:abstractNumId w:val="75"/>
+    <w:abstractNumId w:val="84"/>
   </w:num>
   <w:num w:numId="12">
-    <w:abstractNumId w:val="28"/>
+    <w:abstractNumId w:val="35"/>
   </w:num>
   <w:num w:numId="13">
-    <w:abstractNumId w:val="85"/>
+    <w:abstractNumId w:val="94"/>
   </w:num>
   <w:num w:numId="14">
-    <w:abstractNumId w:val="18"/>
+    <w:abstractNumId w:val="24"/>
   </w:num>
   <w:num w:numId="15">
-    <w:abstractNumId w:val="69"/>
+    <w:abstractNumId w:val="77"/>
   </w:num>
   <w:num w:numId="16">
-    <w:abstractNumId w:val="14"/>
+    <w:abstractNumId w:val="19"/>
   </w:num>
   <w:num w:numId="17">
-    <w:abstractNumId w:val="102"/>
+    <w:abstractNumId w:val="113"/>
   </w:num>
   <w:num w:numId="18">
-    <w:abstractNumId w:val="58"/>
+    <w:abstractNumId w:val="66"/>
   </w:num>
   <w:num w:numId="19">
     <w:abstractNumId w:val="2"/>
   </w:num>
   <w:num w:numId="20">
-    <w:abstractNumId w:val="61"/>
+    <w:abstractNumId w:val="69"/>
   </w:num>
   <w:num w:numId="21">
-    <w:abstractNumId w:val="79"/>
+    <w:abstractNumId w:val="88"/>
   </w:num>
   <w:num w:numId="22">
-    <w:abstractNumId w:val="49"/>
+    <w:abstractNumId w:val="57"/>
   </w:num>
   <w:num w:numId="23">
-    <w:abstractNumId w:val="33"/>
+    <w:abstractNumId w:val="40"/>
   </w:num>
   <w:num w:numId="24">
-    <w:abstractNumId w:val="70"/>
+    <w:abstractNumId w:val="78"/>
   </w:num>
   <w:num w:numId="25">
     <w:abstractNumId w:val="7"/>
   </w:num>
   <w:num w:numId="26">
-    <w:abstractNumId w:val="78"/>
+    <w:abstractNumId w:val="87"/>
   </w:num>
   <w:num w:numId="27">
-    <w:abstractNumId w:val="76"/>
+    <w:abstractNumId w:val="85"/>
   </w:num>
   <w:num w:numId="28">
-    <w:abstractNumId w:val="31"/>
+    <w:abstractNumId w:val="38"/>
   </w:num>
   <w:num w:numId="29">
-    <w:abstractNumId w:val="21"/>
+    <w:abstractNumId w:val="27"/>
   </w:num>
   <w:num w:numId="30">
+    <w:abstractNumId w:val="13"/>
+  </w:num>
+  <w:num w:numId="31">
+    <w:abstractNumId w:val="41"/>
+  </w:num>
+  <w:num w:numId="32">
+    <w:abstractNumId w:val="56"/>
+  </w:num>
+  <w:num w:numId="33">
+    <w:abstractNumId w:val="32"/>
+  </w:num>
+  <w:num w:numId="34">
+    <w:abstractNumId w:val="58"/>
+  </w:num>
+  <w:num w:numId="35">
+    <w:abstractNumId w:val="79"/>
+  </w:num>
+  <w:num w:numId="36">
+    <w:abstractNumId w:val="10"/>
+  </w:num>
+  <w:num w:numId="37">
+    <w:abstractNumId w:val="100"/>
+  </w:num>
+  <w:num w:numId="38">
     <w:abstractNumId w:val="11"/>
   </w:num>
-  <w:num w:numId="31">
-    <w:abstractNumId w:val="34"/>
-  </w:num>
-  <w:num w:numId="32">
-    <w:abstractNumId w:val="48"/>
-  </w:num>
-  <w:num w:numId="33">
-    <w:abstractNumId w:val="25"/>
-  </w:num>
-  <w:num w:numId="34">
-    <w:abstractNumId w:val="50"/>
-  </w:num>
-  <w:num w:numId="35">
-    <w:abstractNumId w:val="71"/>
-  </w:num>
-  <w:num w:numId="36">
-    <w:abstractNumId w:val="9"/>
-  </w:num>
-  <w:num w:numId="37">
-    <w:abstractNumId w:val="90"/>
-  </w:num>
-  <w:num w:numId="38">
-    <w:abstractNumId w:val="10"/>
-  </w:num>
   <w:num w:numId="39">
-    <w:abstractNumId w:val="89"/>
+    <w:abstractNumId w:val="99"/>
   </w:num>
   <w:num w:numId="40">
-    <w:abstractNumId w:val="62"/>
+    <w:abstractNumId w:val="70"/>
   </w:num>
   <w:num w:numId="41">
     <w:abstractNumId w:val="8"/>
   </w:num>
   <w:num w:numId="42">
-    <w:abstractNumId w:val="42"/>
+    <w:abstractNumId w:val="50"/>
   </w:num>
   <w:num w:numId="43">
-    <w:abstractNumId w:val="86"/>
+    <w:abstractNumId w:val="96"/>
   </w:num>
   <w:num w:numId="44">
-    <w:abstractNumId w:val="37"/>
+    <w:abstractNumId w:val="44"/>
   </w:num>
   <w:num w:numId="45">
-    <w:abstractNumId w:val="26"/>
+    <w:abstractNumId w:val="33"/>
   </w:num>
   <w:num w:numId="46">
-    <w:abstractNumId w:val="67"/>
+    <w:abstractNumId w:val="75"/>
   </w:num>
   <w:num w:numId="47">
-    <w:abstractNumId w:val="73"/>
+    <w:abstractNumId w:val="81"/>
   </w:num>
   <w:num w:numId="48">
-    <w:abstractNumId w:val="35"/>
+    <w:abstractNumId w:val="42"/>
   </w:num>
   <w:num w:numId="49">
     <w:abstractNumId w:val="1"/>
   </w:num>
   <w:num w:numId="50">
-    <w:abstractNumId w:val="20"/>
+    <w:abstractNumId w:val="26"/>
   </w:num>
   <w:num w:numId="51">
-    <w:abstractNumId w:val="45"/>
+    <w:abstractNumId w:val="53"/>
   </w:num>
   <w:num w:numId="52">
-    <w:abstractNumId w:val="52"/>
+    <w:abstractNumId w:val="60"/>
   </w:num>
   <w:num w:numId="53">
-    <w:abstractNumId w:val="66"/>
+    <w:abstractNumId w:val="74"/>
   </w:num>
   <w:num w:numId="54">
-    <w:abstractNumId w:val="19"/>
+    <w:abstractNumId w:val="25"/>
   </w:num>
   <w:num w:numId="55">
     <w:abstractNumId w:val="0"/>
   </w:num>
   <w:num w:numId="56">
-    <w:abstractNumId w:val="13"/>
+    <w:abstractNumId w:val="18"/>
   </w:num>
   <w:num w:numId="57">
+    <w:abstractNumId w:val="76"/>
+  </w:num>
+  <w:num w:numId="58">
+    <w:abstractNumId w:val="89"/>
+  </w:num>
+  <w:num w:numId="59">
+    <w:abstractNumId w:val="115"/>
+  </w:num>
+  <w:num w:numId="60">
+    <w:abstractNumId w:val="54"/>
+  </w:num>
+  <w:num w:numId="61">
+    <w:abstractNumId w:val="101"/>
+  </w:num>
+  <w:num w:numId="62">
+    <w:abstractNumId w:val="73"/>
+  </w:num>
+  <w:num w:numId="63">
+    <w:abstractNumId w:val="90"/>
+  </w:num>
+  <w:num w:numId="64">
+    <w:abstractNumId w:val="114"/>
+  </w:num>
+  <w:num w:numId="65">
+    <w:abstractNumId w:val="64"/>
+  </w:num>
+  <w:num w:numId="66">
+    <w:abstractNumId w:val="72"/>
+  </w:num>
+  <w:num w:numId="67">
+    <w:abstractNumId w:val="71"/>
+  </w:num>
+  <w:num w:numId="68">
+    <w:abstractNumId w:val="52"/>
+  </w:num>
+  <w:num w:numId="69">
+    <w:abstractNumId w:val="23"/>
+  </w:num>
+  <w:num w:numId="70">
+    <w:abstractNumId w:val="46"/>
+  </w:num>
+  <w:num w:numId="71">
+    <w:abstractNumId w:val="36"/>
+  </w:num>
+  <w:num w:numId="72">
+    <w:abstractNumId w:val="21"/>
+  </w:num>
+  <w:num w:numId="73">
+    <w:abstractNumId w:val="51"/>
+  </w:num>
+  <w:num w:numId="74">
+    <w:abstractNumId w:val="43"/>
+  </w:num>
+  <w:num w:numId="75">
+    <w:abstractNumId w:val="93"/>
+  </w:num>
+  <w:num w:numId="76">
+    <w:abstractNumId w:val="55"/>
+  </w:num>
+  <w:num w:numId="77">
+    <w:abstractNumId w:val="39"/>
+  </w:num>
+  <w:num w:numId="78">
+    <w:abstractNumId w:val="104"/>
+  </w:num>
+  <w:num w:numId="79">
+    <w:abstractNumId w:val="65"/>
+  </w:num>
+  <w:num w:numId="80">
+    <w:abstractNumId w:val="86"/>
+  </w:num>
+  <w:num w:numId="81">
+    <w:abstractNumId w:val="48"/>
+  </w:num>
+  <w:num w:numId="82">
+    <w:abstractNumId w:val="63"/>
+  </w:num>
+  <w:num w:numId="83">
+    <w:abstractNumId w:val="98"/>
+  </w:num>
+  <w:num w:numId="84">
     <w:abstractNumId w:val="68"/>
   </w:num>
-  <w:num w:numId="58">
-    <w:abstractNumId w:val="80"/>
-  </w:num>
-  <w:num w:numId="59">
-    <w:abstractNumId w:val="104"/>
-  </w:num>
-  <w:num w:numId="60">
-    <w:abstractNumId w:val="46"/>
-  </w:num>
-  <w:num w:numId="61">
-    <w:abstractNumId w:val="91"/>
-  </w:num>
-  <w:num w:numId="62">
-    <w:abstractNumId w:val="65"/>
-  </w:num>
-  <w:num w:numId="63">
-    <w:abstractNumId w:val="81"/>
-  </w:num>
-  <w:num w:numId="64">
-    <w:abstractNumId w:val="103"/>
-  </w:num>
-  <w:num w:numId="65">
-    <w:abstractNumId w:val="56"/>
-  </w:num>
-  <w:num w:numId="66">
-    <w:abstractNumId w:val="64"/>
-  </w:num>
-  <w:num w:numId="67">
-    <w:abstractNumId w:val="63"/>
-  </w:num>
-  <w:num w:numId="68">
-    <w:abstractNumId w:val="44"/>
-  </w:num>
-  <w:num w:numId="69">
-    <w:abstractNumId w:val="17"/>
-  </w:num>
-  <w:num w:numId="70">
-    <w:abstractNumId w:val="39"/>
-  </w:num>
-  <w:num w:numId="71">
-    <w:abstractNumId w:val="29"/>
-  </w:num>
-  <w:num w:numId="72">
-    <w:abstractNumId w:val="16"/>
-  </w:num>
-  <w:num w:numId="73">
-    <w:abstractNumId w:val="43"/>
-  </w:num>
-  <w:num w:numId="74">
-    <w:abstractNumId w:val="36"/>
-  </w:num>
-  <w:num w:numId="75">
-    <w:abstractNumId w:val="84"/>
-  </w:num>
-  <w:num w:numId="76">
-    <w:abstractNumId w:val="47"/>
-  </w:num>
-  <w:num w:numId="77">
-    <w:abstractNumId w:val="32"/>
-  </w:num>
-  <w:num w:numId="78">
-    <w:abstractNumId w:val="93"/>
-  </w:num>
-  <w:num w:numId="79">
-    <w:abstractNumId w:val="57"/>
-  </w:num>
-  <w:num w:numId="80">
-    <w:abstractNumId w:val="77"/>
-  </w:num>
-  <w:num w:numId="81">
-    <w:abstractNumId w:val="40"/>
-  </w:num>
-  <w:num w:numId="82">
-    <w:abstractNumId w:val="55"/>
-  </w:num>
-  <w:num w:numId="83">
-    <w:abstractNumId w:val="88"/>
-  </w:num>
-  <w:num w:numId="84">
-    <w:abstractNumId w:val="60"/>
-  </w:num>
   <w:num w:numId="85">
-    <w:abstractNumId w:val="59"/>
+    <w:abstractNumId w:val="67"/>
   </w:num>
   <w:num w:numId="86">
-    <w:abstractNumId w:val="87"/>
+    <w:abstractNumId w:val="97"/>
   </w:num>
   <w:num w:numId="87">
-    <w:abstractNumId w:val="99"/>
+    <w:abstractNumId w:val="110"/>
   </w:num>
   <w:num w:numId="88">
-    <w:abstractNumId w:val="95"/>
+    <w:abstractNumId w:val="106"/>
   </w:num>
   <w:num w:numId="89">
-    <w:abstractNumId w:val="54"/>
+    <w:abstractNumId w:val="62"/>
   </w:num>
   <w:num w:numId="90">
-    <w:abstractNumId w:val="74"/>
+    <w:abstractNumId w:val="82"/>
   </w:num>
   <w:num w:numId="91">
-    <w:abstractNumId w:val="97"/>
+    <w:abstractNumId w:val="108"/>
   </w:num>
   <w:num w:numId="92">
-    <w:abstractNumId w:val="94"/>
+    <w:abstractNumId w:val="105"/>
   </w:num>
   <w:num w:numId="93">
-    <w:abstractNumId w:val="53"/>
+    <w:abstractNumId w:val="61"/>
   </w:num>
   <w:num w:numId="94">
     <w:abstractNumId w:val="5"/>
   </w:num>
   <w:num w:numId="95">
-    <w:abstractNumId w:val="38"/>
+    <w:abstractNumId w:val="45"/>
   </w:num>
   <w:num w:numId="96">
-    <w:abstractNumId w:val="41"/>
+    <w:abstractNumId w:val="49"/>
   </w:num>
   <w:num w:numId="97">
-    <w:abstractNumId w:val="82"/>
+    <w:abstractNumId w:val="91"/>
   </w:num>
   <w:num w:numId="98">
-    <w:abstractNumId w:val="98"/>
+    <w:abstractNumId w:val="109"/>
   </w:num>
   <w:num w:numId="99">
-    <w:abstractNumId w:val="27"/>
+    <w:abstractNumId w:val="34"/>
   </w:num>
   <w:num w:numId="100">
     <w:abstractNumId w:val="3"/>
   </w:num>
   <w:num w:numId="101">
-    <w:abstractNumId w:val="24"/>
+    <w:abstractNumId w:val="31"/>
   </w:num>
   <w:num w:numId="102">
-    <w:abstractNumId w:val="30"/>
+    <w:abstractNumId w:val="37"/>
   </w:num>
   <w:num w:numId="103">
+    <w:abstractNumId w:val="92"/>
+  </w:num>
+  <w:num w:numId="104">
+    <w:abstractNumId w:val="103"/>
+  </w:num>
+  <w:num w:numId="105">
+    <w:abstractNumId w:val="29"/>
+  </w:num>
+  <w:num w:numId="106">
+    <w:abstractNumId w:val="47"/>
+  </w:num>
+  <w:num w:numId="107">
+    <w:abstractNumId w:val="102"/>
+  </w:num>
+  <w:num w:numId="108">
+    <w:abstractNumId w:val="22"/>
+  </w:num>
+  <w:num w:numId="109">
+    <w:abstractNumId w:val="16"/>
+  </w:num>
+  <w:num w:numId="110">
+    <w:abstractNumId w:val="95"/>
+  </w:num>
+  <w:num w:numId="111">
+    <w:abstractNumId w:val="15"/>
+  </w:num>
+  <w:num w:numId="112">
+    <w:abstractNumId w:val="17"/>
+  </w:num>
+  <w:num w:numId="113">
+    <w:abstractNumId w:val="9"/>
+  </w:num>
+  <w:num w:numId="114">
     <w:abstractNumId w:val="83"/>
   </w:num>
-  <w:num w:numId="104">
-    <w:abstractNumId w:val="92"/>
+  <w:num w:numId="115">
+    <w:abstractNumId w:val="28"/>
   </w:num>
-  <w:num w:numId="105">
-    <w:abstractNumId w:val="22"/>
+  <w:num w:numId="116">
+    <w:abstractNumId w:val="12"/>
   </w:num>
-  <w:numIdMacAtCleanup w:val="98"/>
+  <w:num w:numId="117">
+    <w:abstractNumId w:val="116"/>
+  </w:num>
+  <w:numIdMacAtCleanup w:val="117"/>
 </w:numbering>
 </file>
 
@@ -34918,7 +38395,7 @@
   <w:style w:type="paragraph" w:default="1" w:styleId="Normal">
     <w:name w:val="Normal"/>
     <w:qFormat/>
-    <w:rsid w:val="002425D0"/>
+    <w:rsid w:val="009063AC"/>
   </w:style>
   <w:style w:type="paragraph" w:styleId="Heading2">
     <w:name w:val="heading 2"/>
@@ -35332,7 +38809,7 @@
 </file>
 
 <file path=customXml/itemProps1.xml><?xml version="1.0" encoding="utf-8"?>
-<ds:datastoreItem xmlns:ds="http://schemas.openxmlformats.org/officeDocument/2006/customXml" ds:itemID="{B88536CD-20EB-42B2-80DD-785003AD7AB6}">
+<ds:datastoreItem xmlns:ds="http://schemas.openxmlformats.org/officeDocument/2006/customXml" ds:itemID="{B5D7EE6D-B65F-4D07-9847-51E7F39BADC8}">
   <ds:schemaRefs>
     <ds:schemaRef ds:uri="http://schemas.openxmlformats.org/officeDocument/2006/bibliography"/>
   </ds:schemaRefs>

</xml_diff>